<commit_message>
Backend + Documentação - Gerenciar prioridades
</commit_message>
<xml_diff>
--- a/Documentação/ERS.docx
+++ b/Documentação/ERS.docx
@@ -2768,7 +2768,23 @@
                 <w:sz w:val="18"/>
                 <w:szCs w:val="18"/>
               </w:rPr>
-              <w:t xml:space="preserve"> Gerenciar colaboradores</w:t>
+              <w:t xml:space="preserve"> </w:t>
+            </w:r>
+            <w:r>
+              <w:rPr>
+                <w:rFonts w:eastAsia="Calibri"/>
+                <w:sz w:val="18"/>
+                <w:szCs w:val="18"/>
+              </w:rPr>
+              <w:t>Gerenciar setores</w:t>
+            </w:r>
+            <w:r>
+              <w:rPr>
+                <w:rFonts w:eastAsia="Calibri"/>
+                <w:sz w:val="18"/>
+                <w:szCs w:val="18"/>
+              </w:rPr>
+              <w:t xml:space="preserve"> </w:t>
             </w:r>
           </w:p>
           <w:p>
@@ -2861,6 +2877,13 @@
                 <w:szCs w:val="18"/>
               </w:rPr>
             </w:pPr>
+            <w:r>
+              <w:rPr>
+                <w:sz w:val="18"/>
+                <w:szCs w:val="18"/>
+              </w:rPr>
+              <w:t>SP3</w:t>
+            </w:r>
           </w:p>
         </w:tc>
         <w:tc>
@@ -2926,42 +2949,26 @@
             <w:r>
               <w:rPr>
                 <w:rFonts w:eastAsia="Calibri"/>
-                <w:sz w:val="18"/>
-                <w:szCs w:val="18"/>
-              </w:rPr>
-              <w:t xml:space="preserve"> Gerenciar clientes</w:t>
-            </w:r>
-          </w:p>
-          <w:p>
-            <w:pPr>
-              <w:rPr>
-                <w:rFonts w:eastAsia="Calibri"/>
-                <w:sz w:val="18"/>
-                <w:szCs w:val="18"/>
-              </w:rPr>
-            </w:pPr>
-            <w:r>
-              <w:rPr>
-                <w:rFonts w:eastAsia="Calibri"/>
                 <w:b/>
                 <w:bCs/>
                 <w:sz w:val="18"/>
                 <w:szCs w:val="18"/>
               </w:rPr>
-              <w:t>Classificação:</w:t>
-            </w:r>
-            <w:r>
-              <w:rPr>
-                <w:rFonts w:eastAsia="Calibri"/>
-                <w:sz w:val="18"/>
-                <w:szCs w:val="18"/>
-              </w:rPr>
-              <w:t xml:space="preserve"> Básica</w:t>
-            </w:r>
-          </w:p>
-          <w:p>
-            <w:pPr>
-              <w:rPr>
+              <w:t xml:space="preserve"> </w:t>
+            </w:r>
+            <w:r>
+              <w:rPr>
+                <w:rFonts w:eastAsia="Calibri"/>
+                <w:sz w:val="18"/>
+                <w:szCs w:val="18"/>
+              </w:rPr>
+              <w:t>Gerenciar prioridades</w:t>
+            </w:r>
+          </w:p>
+          <w:p>
+            <w:pPr>
+              <w:rPr>
+                <w:rFonts w:eastAsia="Calibri"/>
                 <w:sz w:val="18"/>
                 <w:szCs w:val="18"/>
               </w:rPr>
@@ -2974,6 +2981,32 @@
                 <w:sz w:val="18"/>
                 <w:szCs w:val="18"/>
               </w:rPr>
+              <w:t>Classificação:</w:t>
+            </w:r>
+            <w:r>
+              <w:rPr>
+                <w:rFonts w:eastAsia="Calibri"/>
+                <w:sz w:val="18"/>
+                <w:szCs w:val="18"/>
+              </w:rPr>
+              <w:t xml:space="preserve"> Básica</w:t>
+            </w:r>
+          </w:p>
+          <w:p>
+            <w:pPr>
+              <w:rPr>
+                <w:sz w:val="18"/>
+                <w:szCs w:val="18"/>
+              </w:rPr>
+            </w:pPr>
+            <w:r>
+              <w:rPr>
+                <w:rFonts w:eastAsia="Calibri"/>
+                <w:b/>
+                <w:bCs/>
+                <w:sz w:val="18"/>
+                <w:szCs w:val="18"/>
+              </w:rPr>
               <w:t>Complexidade de Implementação:</w:t>
             </w:r>
             <w:r>
@@ -3020,6 +3053,13 @@
                 <w:szCs w:val="18"/>
               </w:rPr>
             </w:pPr>
+            <w:r>
+              <w:rPr>
+                <w:sz w:val="18"/>
+                <w:szCs w:val="18"/>
+              </w:rPr>
+              <w:t>SP3</w:t>
+            </w:r>
           </w:p>
         </w:tc>
         <w:tc>
@@ -3087,7 +3127,15 @@
                 <w:sz w:val="18"/>
                 <w:szCs w:val="18"/>
               </w:rPr>
-              <w:t xml:space="preserve"> Gerenciar prioridades da tarefa</w:t>
+              <w:t xml:space="preserve"> </w:t>
+            </w:r>
+            <w:r>
+              <w:rPr>
+                <w:rFonts w:eastAsia="Calibri"/>
+                <w:sz w:val="18"/>
+                <w:szCs w:val="18"/>
+              </w:rPr>
+              <w:t>Gerenciar etapas de desenvolvimento</w:t>
             </w:r>
           </w:p>
           <w:p>
@@ -3254,7 +3302,23 @@
                 <w:sz w:val="18"/>
                 <w:szCs w:val="18"/>
               </w:rPr>
-              <w:t xml:space="preserve"> Gerenciar etapas de desenvolvimento</w:t>
+              <w:t xml:space="preserve"> </w:t>
+            </w:r>
+            <w:r>
+              <w:rPr>
+                <w:rFonts w:eastAsia="Calibri"/>
+                <w:sz w:val="18"/>
+                <w:szCs w:val="18"/>
+              </w:rPr>
+              <w:t>Gerenciar colaboradores</w:t>
+            </w:r>
+            <w:r>
+              <w:rPr>
+                <w:rFonts w:eastAsia="Calibri"/>
+                <w:sz w:val="18"/>
+                <w:szCs w:val="18"/>
+              </w:rPr>
+              <w:t xml:space="preserve"> </w:t>
             </w:r>
           </w:p>
           <w:p>
@@ -3345,13 +3409,6 @@
                 <w:szCs w:val="18"/>
               </w:rPr>
             </w:pPr>
-            <w:r>
-              <w:rPr>
-                <w:sz w:val="18"/>
-                <w:szCs w:val="18"/>
-              </w:rPr>
-              <w:t>SP3</w:t>
-            </w:r>
           </w:p>
         </w:tc>
         <w:tc>
@@ -3419,7 +3476,15 @@
                 <w:sz w:val="18"/>
                 <w:szCs w:val="18"/>
               </w:rPr>
-              <w:t xml:space="preserve"> Gerenciar setores</w:t>
+              <w:t xml:space="preserve"> </w:t>
+            </w:r>
+            <w:r>
+              <w:rPr>
+                <w:rFonts w:eastAsia="Calibri"/>
+                <w:sz w:val="18"/>
+                <w:szCs w:val="18"/>
+              </w:rPr>
+              <w:t>Gerenciar clientes</w:t>
             </w:r>
           </w:p>
           <w:p>
@@ -3510,13 +3575,6 @@
                 <w:szCs w:val="18"/>
               </w:rPr>
             </w:pPr>
-            <w:r>
-              <w:rPr>
-                <w:sz w:val="18"/>
-                <w:szCs w:val="18"/>
-              </w:rPr>
-              <w:t>SP3</w:t>
-            </w:r>
           </w:p>
         </w:tc>
         <w:tc>
@@ -5817,7 +5875,27 @@
                 <w:sz w:val="20"/>
                 <w:szCs w:val="16"/>
               </w:rPr>
-              <w:t>Estória 5: Gerenciar setores</w:t>
+              <w:t xml:space="preserve">Estória </w:t>
+            </w:r>
+            <w:r>
+              <w:rPr>
+                <w:rFonts w:eastAsia="Calibri"/>
+                <w:b/>
+                <w:bCs/>
+                <w:sz w:val="20"/>
+                <w:szCs w:val="16"/>
+              </w:rPr>
+              <w:t>1</w:t>
+            </w:r>
+            <w:r>
+              <w:rPr>
+                <w:rFonts w:eastAsia="Calibri"/>
+                <w:b/>
+                <w:bCs/>
+                <w:sz w:val="20"/>
+                <w:szCs w:val="16"/>
+              </w:rPr>
+              <w:t>: Gerenciar setores</w:t>
             </w:r>
           </w:p>
           <w:p>
@@ -5885,7 +5963,23 @@
                 <w:sz w:val="20"/>
                 <w:szCs w:val="16"/>
               </w:rPr>
-              <w:t>Deve ser possível listar todos os setores cadastrados no sistema, com opção de busca por nome.</w:t>
+              <w:t>Deve ser possível listar todos os setores cadastrados no sistema, com opção de busca por nome</w:t>
+            </w:r>
+            <w:r>
+              <w:rPr>
+                <w:rFonts w:eastAsia="Calibri"/>
+                <w:sz w:val="20"/>
+                <w:szCs w:val="16"/>
+              </w:rPr>
+              <w:t>, descrição ou nome do responsável</w:t>
+            </w:r>
+            <w:r>
+              <w:rPr>
+                <w:rFonts w:eastAsia="Calibri"/>
+                <w:sz w:val="20"/>
+                <w:szCs w:val="16"/>
+              </w:rPr>
+              <w:t>.</w:t>
             </w:r>
           </w:p>
           <w:p>
@@ -5989,7 +6083,31 @@
                 <w:sz w:val="20"/>
                 <w:szCs w:val="16"/>
               </w:rPr>
-              <w:t>Responsável do Setor (FK de Colaborador)</w:t>
+              <w:t>Responsável do Setor (FK de Colaborador</w:t>
+            </w:r>
+            <w:r>
+              <w:rPr>
+                <w:rFonts w:eastAsia="Calibri"/>
+                <w:sz w:val="20"/>
+                <w:szCs w:val="16"/>
+              </w:rPr>
+              <w:t xml:space="preserve"> </w:t>
+            </w:r>
+            <w:r>
+              <w:rPr>
+                <w:rFonts w:eastAsia="Calibri"/>
+                <w:sz w:val="20"/>
+                <w:szCs w:val="16"/>
+              </w:rPr>
+              <w:t>e não ser vazio</w:t>
+            </w:r>
+            <w:r>
+              <w:rPr>
+                <w:rFonts w:eastAsia="Calibri"/>
+                <w:sz w:val="20"/>
+                <w:szCs w:val="16"/>
+              </w:rPr>
+              <w:t>)</w:t>
             </w:r>
           </w:p>
           <w:p>
@@ -6185,23 +6303,55 @@
                 <w:sz w:val="20"/>
                 <w:szCs w:val="16"/>
               </w:rPr>
-              <w:t>, permitindo clicar em cada item para abrir modal de edição</w:t>
-            </w:r>
-            <w:r>
-              <w:rPr>
-                <w:rFonts w:eastAsia="Calibri"/>
-                <w:sz w:val="20"/>
-                <w:szCs w:val="16"/>
-              </w:rPr>
-              <w:t>/exclusão</w:t>
-            </w:r>
-            <w:r>
-              <w:rPr>
-                <w:rFonts w:eastAsia="Calibri"/>
-                <w:sz w:val="20"/>
-                <w:szCs w:val="16"/>
-              </w:rPr>
-              <w:t xml:space="preserve">/visualização. </w:t>
+              <w:t xml:space="preserve">, permitindo clicar em cada item para abrir modal de </w:t>
+            </w:r>
+            <w:r>
+              <w:rPr>
+                <w:rFonts w:eastAsia="Calibri"/>
+                <w:sz w:val="20"/>
+                <w:szCs w:val="16"/>
+              </w:rPr>
+              <w:t>visualização</w:t>
+            </w:r>
+            <w:r>
+              <w:rPr>
+                <w:rFonts w:eastAsia="Calibri"/>
+                <w:sz w:val="20"/>
+                <w:szCs w:val="16"/>
+              </w:rPr>
+              <w:t>/</w:t>
+            </w:r>
+            <w:r>
+              <w:rPr>
+                <w:rFonts w:eastAsia="Calibri"/>
+                <w:sz w:val="20"/>
+                <w:szCs w:val="16"/>
+              </w:rPr>
+              <w:t>edição/</w:t>
+            </w:r>
+            <w:r>
+              <w:rPr>
+                <w:rFonts w:eastAsia="Calibri"/>
+                <w:sz w:val="20"/>
+                <w:szCs w:val="16"/>
+              </w:rPr>
+              <w:t>inativação</w:t>
+            </w:r>
+            <w:r>
+              <w:rPr>
+                <w:rFonts w:eastAsia="Calibri"/>
+                <w:sz w:val="20"/>
+                <w:szCs w:val="16"/>
+              </w:rPr>
+              <w:t>/reativação</w:t>
+            </w:r>
+            <w:r>
+              <w:rPr>
+                <w:rFonts w:eastAsia="Calibri"/>
+                <w:sz w:val="20"/>
+                <w:szCs w:val="16"/>
+              </w:rPr>
+              <w:t xml:space="preserve">. </w:t>
             </w:r>
           </w:p>
           <w:p>
@@ -6249,17 +6399,17 @@
             </w:pPr>
             <w:r>
               <w:rPr>
+                <w:rFonts w:eastAsia="Calibri"/>
                 <w:b/>
                 <w:bCs/>
-                <w:noProof/>
                 <w:sz w:val="20"/>
                 <w:szCs w:val="16"/>
               </w:rPr>
               <w:drawing>
-                <wp:inline distT="0" distB="0" distL="0" distR="0" wp14:anchorId="141AA143" wp14:editId="62FA58D4">
-                  <wp:extent cx="3657600" cy="2880000"/>
-                  <wp:effectExtent l="0" t="0" r="0" b="0"/>
-                  <wp:docPr id="2" name="Imagem 2"/>
+                <wp:inline distT="0" distB="0" distL="0" distR="0" wp14:anchorId="24073358" wp14:editId="73C75A99">
+                  <wp:extent cx="3430800" cy="2700000"/>
+                  <wp:effectExtent l="0" t="0" r="0" b="5715"/>
+                  <wp:docPr id="47" name="Imagem 47"/>
                   <wp:cNvGraphicFramePr>
                     <a:graphicFrameLocks xmlns:a="http://schemas.openxmlformats.org/drawingml/2006/main" noChangeAspect="1"/>
                   </wp:cNvGraphicFramePr>
@@ -6279,7 +6429,7 @@
                         <pic:spPr>
                           <a:xfrm>
                             <a:off x="0" y="0"/>
-                            <a:ext cx="3657600" cy="2880000"/>
+                            <a:ext cx="3430800" cy="2700000"/>
                           </a:xfrm>
                           <a:prstGeom prst="rect">
                             <a:avLst/>
@@ -6302,9 +6452,7 @@
                 <w:szCs w:val="16"/>
               </w:rPr>
             </w:pPr>
-          </w:p>
-          <w:p>
-            <w:pPr>
+            <w:r>
               <w:rPr>
                 <w:rFonts w:eastAsia="Calibri"/>
                 <w:b/>
@@ -6312,15 +6460,6 @@
                 <w:sz w:val="20"/>
                 <w:szCs w:val="16"/>
               </w:rPr>
-            </w:pPr>
-            <w:r>
-              <w:rPr>
-                <w:rFonts w:eastAsia="Calibri"/>
-                <w:b/>
-                <w:bCs/>
-                <w:sz w:val="20"/>
-                <w:szCs w:val="16"/>
-              </w:rPr>
               <w:lastRenderedPageBreak/>
               <w:t>Diagrama de ER do Contexto</w:t>
             </w:r>
@@ -6342,9 +6481,9 @@
                 <w:szCs w:val="16"/>
               </w:rPr>
               <w:drawing>
-                <wp:inline distT="0" distB="0" distL="0" distR="0" wp14:anchorId="3A54071A" wp14:editId="7B103FA9">
-                  <wp:extent cx="3844800" cy="2880000"/>
-                  <wp:effectExtent l="0" t="0" r="3810" b="0"/>
+                <wp:inline distT="0" distB="0" distL="0" distR="0" wp14:anchorId="3A54071A" wp14:editId="368E59EC">
+                  <wp:extent cx="3603600" cy="2700000"/>
+                  <wp:effectExtent l="0" t="0" r="0" b="5715"/>
                   <wp:docPr id="1" name="Imagem 1"/>
                   <wp:cNvGraphicFramePr>
                     <a:graphicFrameLocks xmlns:a="http://schemas.openxmlformats.org/drawingml/2006/main" noChangeAspect="1"/>
@@ -6365,7 +6504,7 @@
                         <pic:spPr>
                           <a:xfrm>
                             <a:off x="0" y="0"/>
-                            <a:ext cx="3844800" cy="2880000"/>
+                            <a:ext cx="3603600" cy="2700000"/>
                           </a:xfrm>
                           <a:prstGeom prst="rect">
                             <a:avLst/>
@@ -6450,9 +6589,9 @@
                 <w:szCs w:val="16"/>
               </w:rPr>
               <w:drawing>
-                <wp:inline distT="0" distB="0" distL="0" distR="0" wp14:anchorId="631554A8" wp14:editId="70642E52">
-                  <wp:extent cx="4230000" cy="2880000"/>
-                  <wp:effectExtent l="0" t="0" r="0" b="0"/>
+                <wp:inline distT="0" distB="0" distL="0" distR="0" wp14:anchorId="631554A8" wp14:editId="0E1C7E91">
+                  <wp:extent cx="3967200" cy="2700000"/>
+                  <wp:effectExtent l="0" t="0" r="0" b="5715"/>
                   <wp:docPr id="10" name="Imagem 10"/>
                   <wp:cNvGraphicFramePr>
                     <a:graphicFrameLocks xmlns:a="http://schemas.openxmlformats.org/drawingml/2006/main" noChangeAspect="1"/>
@@ -6473,7 +6612,7 @@
                         <pic:spPr>
                           <a:xfrm>
                             <a:off x="0" y="0"/>
-                            <a:ext cx="4230000" cy="2880000"/>
+                            <a:ext cx="3967200" cy="2700000"/>
                           </a:xfrm>
                           <a:prstGeom prst="rect">
                             <a:avLst/>
@@ -6588,6 +6727,17 @@
           <w:p>
             <w:pPr>
               <w:pStyle w:val="PargrafodaLista"/>
+              <w:jc w:val="center"/>
+              <w:rPr>
+                <w:rFonts w:eastAsia="Noto Sans Symbols"/>
+                <w:sz w:val="20"/>
+                <w:szCs w:val="16"/>
+              </w:rPr>
+            </w:pPr>
+          </w:p>
+          <w:p>
+            <w:pPr>
+              <w:pStyle w:val="PargrafodaLista"/>
               <w:numPr>
                 <w:ilvl w:val="0"/>
                 <w:numId w:val="8"/>
@@ -6626,9 +6776,9 @@
                 <w:szCs w:val="16"/>
               </w:rPr>
               <w:drawing>
-                <wp:inline distT="0" distB="0" distL="0" distR="0" wp14:anchorId="2660B147" wp14:editId="3B57DF20">
-                  <wp:extent cx="4942800" cy="2880000"/>
-                  <wp:effectExtent l="0" t="0" r="0" b="0"/>
+                <wp:inline distT="0" distB="0" distL="0" distR="0" wp14:anchorId="2660B147" wp14:editId="42F93CB4">
+                  <wp:extent cx="4633200" cy="2700000"/>
+                  <wp:effectExtent l="0" t="0" r="0" b="5715"/>
                   <wp:docPr id="11" name="Imagem 11"/>
                   <wp:cNvGraphicFramePr>
                     <a:graphicFrameLocks xmlns:a="http://schemas.openxmlformats.org/drawingml/2006/main" noChangeAspect="1"/>
@@ -6649,7 +6799,7 @@
                         <pic:spPr>
                           <a:xfrm>
                             <a:off x="0" y="0"/>
-                            <a:ext cx="4942800" cy="2880000"/>
+                            <a:ext cx="4633200" cy="2700000"/>
                           </a:xfrm>
                           <a:prstGeom prst="rect">
                             <a:avLst/>
@@ -6715,9 +6865,9 @@
                 <w:szCs w:val="16"/>
               </w:rPr>
               <w:drawing>
-                <wp:inline distT="0" distB="0" distL="0" distR="0" wp14:anchorId="5E9DB6E2" wp14:editId="3517AE62">
-                  <wp:extent cx="2955600" cy="2880000"/>
-                  <wp:effectExtent l="0" t="0" r="0" b="0"/>
+                <wp:inline distT="0" distB="0" distL="0" distR="0" wp14:anchorId="5E9DB6E2" wp14:editId="6E9AA572">
+                  <wp:extent cx="2772000" cy="2700000"/>
+                  <wp:effectExtent l="0" t="0" r="0" b="5715"/>
                   <wp:docPr id="17" name="Imagem 17"/>
                   <wp:cNvGraphicFramePr>
                     <a:graphicFrameLocks xmlns:a="http://schemas.openxmlformats.org/drawingml/2006/main" noChangeAspect="1"/>
@@ -6738,7 +6888,7 @@
                         <pic:spPr>
                           <a:xfrm>
                             <a:off x="0" y="0"/>
-                            <a:ext cx="2955600" cy="2880000"/>
+                            <a:ext cx="2772000" cy="2700000"/>
                           </a:xfrm>
                           <a:prstGeom prst="rect">
                             <a:avLst/>
@@ -6757,6 +6907,7 @@
               <w:jc w:val="center"/>
               <w:rPr>
                 <w:rFonts w:eastAsia="Noto Sans Symbols"/>
+                <w:color w:val="FF0000"/>
                 <w:sz w:val="20"/>
                 <w:szCs w:val="16"/>
               </w:rPr>
@@ -6768,6 +6919,7 @@
               <w:jc w:val="center"/>
               <w:rPr>
                 <w:rFonts w:eastAsia="Noto Sans Symbols"/>
+                <w:color w:val="FF0000"/>
                 <w:sz w:val="20"/>
                 <w:szCs w:val="16"/>
               </w:rPr>
@@ -6779,6 +6931,7 @@
               <w:jc w:val="center"/>
               <w:rPr>
                 <w:rFonts w:eastAsia="Noto Sans Symbols"/>
+                <w:color w:val="FF0000"/>
                 <w:sz w:val="20"/>
                 <w:szCs w:val="16"/>
               </w:rPr>
@@ -6790,6 +6943,7 @@
               <w:jc w:val="center"/>
               <w:rPr>
                 <w:rFonts w:eastAsia="Noto Sans Symbols"/>
+                <w:color w:val="FF0000"/>
                 <w:sz w:val="20"/>
                 <w:szCs w:val="16"/>
               </w:rPr>
@@ -6801,6 +6955,7 @@
               <w:jc w:val="center"/>
               <w:rPr>
                 <w:rFonts w:eastAsia="Noto Sans Symbols"/>
+                <w:color w:val="FF0000"/>
                 <w:sz w:val="20"/>
                 <w:szCs w:val="16"/>
               </w:rPr>
@@ -6812,6 +6967,7 @@
               <w:jc w:val="center"/>
               <w:rPr>
                 <w:rFonts w:eastAsia="Noto Sans Symbols"/>
+                <w:color w:val="FF0000"/>
                 <w:sz w:val="20"/>
                 <w:szCs w:val="16"/>
               </w:rPr>
@@ -6823,6 +6979,7 @@
               <w:jc w:val="center"/>
               <w:rPr>
                 <w:rFonts w:eastAsia="Noto Sans Symbols"/>
+                <w:color w:val="FF0000"/>
                 <w:sz w:val="20"/>
                 <w:szCs w:val="16"/>
               </w:rPr>
@@ -6834,6 +6991,7 @@
               <w:jc w:val="center"/>
               <w:rPr>
                 <w:rFonts w:eastAsia="Noto Sans Symbols"/>
+                <w:color w:val="FF0000"/>
                 <w:sz w:val="20"/>
                 <w:szCs w:val="16"/>
               </w:rPr>
@@ -6845,6 +7003,7 @@
               <w:jc w:val="center"/>
               <w:rPr>
                 <w:rFonts w:eastAsia="Noto Sans Symbols"/>
+                <w:color w:val="FF0000"/>
                 <w:sz w:val="20"/>
                 <w:szCs w:val="16"/>
               </w:rPr>
@@ -6856,6 +7015,19 @@
               <w:jc w:val="center"/>
               <w:rPr>
                 <w:rFonts w:eastAsia="Noto Sans Symbols"/>
+                <w:color w:val="FF0000"/>
+                <w:sz w:val="20"/>
+                <w:szCs w:val="16"/>
+              </w:rPr>
+            </w:pPr>
+          </w:p>
+          <w:p>
+            <w:pPr>
+              <w:pStyle w:val="PargrafodaLista"/>
+              <w:jc w:val="center"/>
+              <w:rPr>
+                <w:rFonts w:eastAsia="Noto Sans Symbols"/>
+                <w:color w:val="FF0000"/>
                 <w:sz w:val="20"/>
                 <w:szCs w:val="16"/>
               </w:rPr>
@@ -6918,9 +7090,9 @@
                 <w:szCs w:val="16"/>
               </w:rPr>
               <w:drawing>
-                <wp:inline distT="0" distB="0" distL="0" distR="0" wp14:anchorId="281B2076" wp14:editId="4DE23DF1">
-                  <wp:extent cx="2700000" cy="2880000"/>
-                  <wp:effectExtent l="0" t="0" r="5715" b="0"/>
+                <wp:inline distT="0" distB="0" distL="0" distR="0" wp14:anchorId="281B2076" wp14:editId="1E30E38F">
+                  <wp:extent cx="2530800" cy="2700000"/>
+                  <wp:effectExtent l="0" t="0" r="3175" b="5715"/>
                   <wp:docPr id="14" name="Imagem 14"/>
                   <wp:cNvGraphicFramePr>
                     <a:graphicFrameLocks xmlns:a="http://schemas.openxmlformats.org/drawingml/2006/main" noChangeAspect="1"/>
@@ -6941,7 +7113,7 @@
                         <pic:spPr>
                           <a:xfrm>
                             <a:off x="0" y="0"/>
-                            <a:ext cx="2700000" cy="2880000"/>
+                            <a:ext cx="2530800" cy="2700000"/>
                           </a:xfrm>
                           <a:prstGeom prst="rect">
                             <a:avLst/>
@@ -7007,9 +7179,9 @@
                 <w:szCs w:val="16"/>
               </w:rPr>
               <w:drawing>
-                <wp:inline distT="0" distB="0" distL="0" distR="0" wp14:anchorId="3E82E30A" wp14:editId="7B6F2EFF">
-                  <wp:extent cx="2966400" cy="2880000"/>
-                  <wp:effectExtent l="0" t="0" r="5715" b="0"/>
+                <wp:inline distT="0" distB="0" distL="0" distR="0" wp14:anchorId="3E82E30A" wp14:editId="5496B379">
+                  <wp:extent cx="2782800" cy="2700000"/>
+                  <wp:effectExtent l="0" t="0" r="0" b="5715"/>
                   <wp:docPr id="19" name="Imagem 19"/>
                   <wp:cNvGraphicFramePr>
                     <a:graphicFrameLocks xmlns:a="http://schemas.openxmlformats.org/drawingml/2006/main" noChangeAspect="1"/>
@@ -7030,7 +7202,7 @@
                         <pic:spPr>
                           <a:xfrm>
                             <a:off x="0" y="0"/>
-                            <a:ext cx="2966400" cy="2880000"/>
+                            <a:ext cx="2782800" cy="2700000"/>
                           </a:xfrm>
                           <a:prstGeom prst="rect">
                             <a:avLst/>
@@ -7156,6 +7328,17 @@
           <w:p>
             <w:pPr>
               <w:pStyle w:val="PargrafodaLista"/>
+              <w:jc w:val="center"/>
+              <w:rPr>
+                <w:rFonts w:eastAsia="Noto Sans Symbols"/>
+                <w:sz w:val="20"/>
+                <w:szCs w:val="16"/>
+              </w:rPr>
+            </w:pPr>
+          </w:p>
+          <w:p>
+            <w:pPr>
+              <w:pStyle w:val="PargrafodaLista"/>
               <w:numPr>
                 <w:ilvl w:val="0"/>
                 <w:numId w:val="8"/>
@@ -7193,9 +7376,9 @@
                 <w:szCs w:val="16"/>
               </w:rPr>
               <w:drawing>
-                <wp:inline distT="0" distB="0" distL="0" distR="0" wp14:anchorId="4C31E869" wp14:editId="3563530E">
-                  <wp:extent cx="5821200" cy="2520000"/>
-                  <wp:effectExtent l="0" t="0" r="8255" b="0"/>
+                <wp:inline distT="0" distB="0" distL="0" distR="0" wp14:anchorId="4C31E869" wp14:editId="769572BC">
+                  <wp:extent cx="5824800" cy="2520000"/>
+                  <wp:effectExtent l="0" t="0" r="5080" b="0"/>
                   <wp:docPr id="18" name="Imagem 18"/>
                   <wp:cNvGraphicFramePr>
                     <a:graphicFrameLocks xmlns:a="http://schemas.openxmlformats.org/drawingml/2006/main" noChangeAspect="1"/>
@@ -7216,7 +7399,7 @@
                         <pic:spPr>
                           <a:xfrm>
                             <a:off x="0" y="0"/>
-                            <a:ext cx="5821200" cy="2520000"/>
+                            <a:ext cx="5824800" cy="2520000"/>
                           </a:xfrm>
                           <a:prstGeom prst="rect">
                             <a:avLst/>
@@ -7269,9 +7452,9 @@
                 <w:szCs w:val="16"/>
               </w:rPr>
               <w:drawing>
-                <wp:inline distT="0" distB="0" distL="0" distR="0" wp14:anchorId="76CE1E02" wp14:editId="3E76126F">
-                  <wp:extent cx="4705200" cy="2880000"/>
-                  <wp:effectExtent l="0" t="0" r="635" b="0"/>
+                <wp:inline distT="0" distB="0" distL="0" distR="0" wp14:anchorId="76CE1E02" wp14:editId="24017724">
+                  <wp:extent cx="4118400" cy="2520000"/>
+                  <wp:effectExtent l="0" t="0" r="0" b="0"/>
                   <wp:docPr id="20" name="Imagem 20"/>
                   <wp:cNvGraphicFramePr>
                     <a:graphicFrameLocks xmlns:a="http://schemas.openxmlformats.org/drawingml/2006/main" noChangeAspect="1"/>
@@ -7292,7 +7475,7 @@
                         <pic:spPr>
                           <a:xfrm>
                             <a:off x="0" y="0"/>
-                            <a:ext cx="4705200" cy="2880000"/>
+                            <a:ext cx="4118400" cy="2520000"/>
                           </a:xfrm>
                           <a:prstGeom prst="rect">
                             <a:avLst/>
@@ -7310,10 +7493,955 @@
     </w:tbl>
     <w:p>
       <w:pPr>
+        <w:pStyle w:val="Ttulo2"/>
+        <w:rPr>
+          <w:u w:val="single"/>
+        </w:rPr>
+      </w:pPr>
+    </w:p>
+    <w:p>
+      <w:pPr>
+        <w:spacing w:after="240" w:line="259" w:lineRule="auto"/>
+        <w:rPr>
+          <w:u w:val="single"/>
+        </w:rPr>
+      </w:pPr>
+      <w:r>
+        <w:rPr>
+          <w:u w:val="single"/>
+        </w:rPr>
+        <w:br w:type="page"/>
+      </w:r>
+    </w:p>
+    <w:tbl>
+      <w:tblPr>
+        <w:tblStyle w:val="a2"/>
+        <w:tblW w:w="9627" w:type="dxa"/>
+        <w:tblInd w:w="0" w:type="dxa"/>
+        <w:tblBorders>
+          <w:top w:val="single" w:sz="4" w:space="0" w:color="000000"/>
+          <w:left w:val="single" w:sz="4" w:space="0" w:color="000000"/>
+          <w:bottom w:val="single" w:sz="4" w:space="0" w:color="000000"/>
+          <w:right w:val="single" w:sz="4" w:space="0" w:color="000000"/>
+          <w:insideH w:val="single" w:sz="4" w:space="0" w:color="000000"/>
+          <w:insideV w:val="single" w:sz="4" w:space="0" w:color="000000"/>
+        </w:tblBorders>
+        <w:tblLayout w:type="fixed"/>
+        <w:tblLook w:val="0400" w:firstRow="0" w:lastRow="0" w:firstColumn="0" w:lastColumn="0" w:noHBand="0" w:noVBand="1"/>
+      </w:tblPr>
+      <w:tblGrid>
+        <w:gridCol w:w="9627"/>
+      </w:tblGrid>
+      <w:tr>
+        <w:tc>
+          <w:tcPr>
+            <w:tcW w:w="9627" w:type="dxa"/>
+            <w:shd w:val="clear" w:color="auto" w:fill="F2F2F2"/>
+          </w:tcPr>
+          <w:p>
+            <w:pPr>
+              <w:rPr>
+                <w:rFonts w:eastAsia="Calibri"/>
+                <w:b/>
+                <w:bCs/>
+                <w:sz w:val="20"/>
+                <w:szCs w:val="16"/>
+              </w:rPr>
+            </w:pPr>
+            <w:r>
+              <w:rPr>
+                <w:rFonts w:eastAsia="Calibri"/>
+                <w:b/>
+                <w:bCs/>
+                <w:sz w:val="20"/>
+                <w:szCs w:val="16"/>
+              </w:rPr>
+              <w:lastRenderedPageBreak/>
+              <w:t xml:space="preserve">Estória </w:t>
+            </w:r>
+            <w:r>
+              <w:rPr>
+                <w:rFonts w:eastAsia="Calibri"/>
+                <w:b/>
+                <w:bCs/>
+                <w:sz w:val="20"/>
+                <w:szCs w:val="16"/>
+              </w:rPr>
+              <w:t>2</w:t>
+            </w:r>
+            <w:r>
+              <w:rPr>
+                <w:rFonts w:eastAsia="Calibri"/>
+                <w:b/>
+                <w:bCs/>
+                <w:sz w:val="20"/>
+                <w:szCs w:val="16"/>
+              </w:rPr>
+              <w:t>: Gerenciar Prioridades</w:t>
+            </w:r>
+          </w:p>
+          <w:p>
+            <w:pPr>
+              <w:rPr>
+                <w:rFonts w:eastAsia="Calibri"/>
+                <w:b/>
+                <w:sz w:val="20"/>
+                <w:szCs w:val="16"/>
+              </w:rPr>
+            </w:pPr>
+            <w:r>
+              <w:rPr>
+                <w:rFonts w:eastAsia="Calibri"/>
+                <w:sz w:val="20"/>
+                <w:szCs w:val="16"/>
+              </w:rPr>
+              <w:t>Como administrador do sistema,</w:t>
+            </w:r>
+            <w:r>
+              <w:rPr>
+                <w:rFonts w:eastAsia="Calibri"/>
+                <w:sz w:val="20"/>
+                <w:szCs w:val="16"/>
+              </w:rPr>
+              <w:t xml:space="preserve"> </w:t>
+            </w:r>
+            <w:r>
+              <w:rPr>
+                <w:rFonts w:eastAsia="Calibri"/>
+                <w:sz w:val="20"/>
+                <w:szCs w:val="16"/>
+              </w:rPr>
+              <w:t>quero gerenciar as prioridades das tarefas (listar, buscar, cadastrar, alterar e excluir),</w:t>
+            </w:r>
+            <w:r>
+              <w:rPr>
+                <w:rFonts w:eastAsia="Calibri"/>
+                <w:sz w:val="20"/>
+                <w:szCs w:val="16"/>
+              </w:rPr>
+              <w:t xml:space="preserve"> </w:t>
+            </w:r>
+            <w:r>
+              <w:rPr>
+                <w:rFonts w:eastAsia="Calibri"/>
+                <w:sz w:val="20"/>
+                <w:szCs w:val="16"/>
+              </w:rPr>
+              <w:t>para organizar os níveis de importância das atividades e facilitar a filtragem e visualização no quadro de tarefas.</w:t>
+            </w:r>
+          </w:p>
+        </w:tc>
+      </w:tr>
+      <w:tr>
+        <w:tc>
+          <w:tcPr>
+            <w:tcW w:w="9627" w:type="dxa"/>
+          </w:tcPr>
+          <w:p>
+            <w:pPr>
+              <w:rPr>
+                <w:rFonts w:eastAsia="Calibri"/>
+                <w:b/>
+                <w:bCs/>
+                <w:sz w:val="20"/>
+                <w:szCs w:val="16"/>
+              </w:rPr>
+            </w:pPr>
+            <w:r>
+              <w:rPr>
+                <w:rFonts w:eastAsia="Calibri"/>
+                <w:b/>
+                <w:bCs/>
+                <w:sz w:val="20"/>
+                <w:szCs w:val="16"/>
+              </w:rPr>
+              <w:t>Especificação do Requisito</w:t>
+            </w:r>
+          </w:p>
+          <w:p>
+            <w:pPr>
+              <w:pStyle w:val="PargrafodaLista"/>
+              <w:numPr>
+                <w:ilvl w:val="0"/>
+                <w:numId w:val="1"/>
+              </w:numPr>
+              <w:rPr>
+                <w:rFonts w:ascii="Noto Sans Symbols" w:eastAsia="Noto Sans Symbols" w:hAnsi="Noto Sans Symbols" w:cs="Noto Sans Symbols"/>
+                <w:sz w:val="20"/>
+                <w:szCs w:val="16"/>
+              </w:rPr>
+            </w:pPr>
+            <w:r>
+              <w:rPr>
+                <w:rFonts w:eastAsia="Calibri"/>
+                <w:sz w:val="20"/>
+                <w:szCs w:val="16"/>
+              </w:rPr>
+              <w:t>Deve ser possível listar</w:t>
+            </w:r>
+            <w:r>
+              <w:rPr>
+                <w:rFonts w:eastAsia="Calibri"/>
+                <w:sz w:val="20"/>
+                <w:szCs w:val="16"/>
+              </w:rPr>
+              <w:t xml:space="preserve"> </w:t>
+            </w:r>
+            <w:r>
+              <w:rPr>
+                <w:rFonts w:eastAsia="Calibri"/>
+                <w:sz w:val="20"/>
+                <w:szCs w:val="16"/>
+              </w:rPr>
+              <w:t>todas as prioridades cadastradas</w:t>
+            </w:r>
+            <w:r>
+              <w:rPr>
+                <w:rFonts w:eastAsia="Calibri"/>
+                <w:sz w:val="20"/>
+                <w:szCs w:val="16"/>
+              </w:rPr>
+              <w:t xml:space="preserve"> </w:t>
+            </w:r>
+            <w:r>
+              <w:rPr>
+                <w:rFonts w:eastAsia="Calibri"/>
+                <w:sz w:val="20"/>
+                <w:szCs w:val="16"/>
+              </w:rPr>
+              <w:t>no sistema, com opção de busca por nome</w:t>
+            </w:r>
+            <w:r>
+              <w:rPr>
+                <w:rFonts w:eastAsia="Calibri"/>
+                <w:sz w:val="20"/>
+                <w:szCs w:val="16"/>
+              </w:rPr>
+              <w:t xml:space="preserve"> ou descrição</w:t>
+            </w:r>
+            <w:r>
+              <w:rPr>
+                <w:rFonts w:eastAsia="Calibri"/>
+                <w:sz w:val="20"/>
+                <w:szCs w:val="16"/>
+              </w:rPr>
+              <w:t>.</w:t>
+            </w:r>
+          </w:p>
+          <w:p>
+            <w:pPr>
+              <w:pStyle w:val="PargrafodaLista"/>
+              <w:numPr>
+                <w:ilvl w:val="0"/>
+                <w:numId w:val="1"/>
+              </w:numPr>
+              <w:rPr>
+                <w:rFonts w:ascii="Noto Sans Symbols" w:eastAsia="Noto Sans Symbols" w:hAnsi="Noto Sans Symbols" w:cs="Noto Sans Symbols"/>
+                <w:sz w:val="20"/>
+                <w:szCs w:val="16"/>
+              </w:rPr>
+            </w:pPr>
+            <w:r>
+              <w:rPr>
+                <w:rFonts w:eastAsia="Calibri"/>
+                <w:sz w:val="20"/>
+                <w:szCs w:val="16"/>
+              </w:rPr>
+              <w:t>O sistema deve permitir o cadastro de novos setores, contendo os seguintes campos obrigatórios:</w:t>
+            </w:r>
+          </w:p>
+          <w:p>
+            <w:pPr>
+              <w:pStyle w:val="PargrafodaLista"/>
+              <w:numPr>
+                <w:ilvl w:val="1"/>
+                <w:numId w:val="1"/>
+              </w:numPr>
+              <w:rPr>
+                <w:rFonts w:ascii="Courier New" w:eastAsia="Courier New" w:hAnsi="Courier New" w:cs="Courier New"/>
+                <w:sz w:val="20"/>
+                <w:szCs w:val="16"/>
+              </w:rPr>
+            </w:pPr>
+            <w:r>
+              <w:rPr>
+                <w:rFonts w:eastAsia="Calibri"/>
+                <w:sz w:val="20"/>
+                <w:szCs w:val="16"/>
+              </w:rPr>
+              <w:t xml:space="preserve">Nome (não pode se repetir e não ser vazio) </w:t>
+            </w:r>
+          </w:p>
+          <w:p>
+            <w:pPr>
+              <w:pStyle w:val="PargrafodaLista"/>
+              <w:numPr>
+                <w:ilvl w:val="1"/>
+                <w:numId w:val="1"/>
+              </w:numPr>
+              <w:rPr>
+                <w:rFonts w:ascii="Courier New" w:eastAsia="Courier New" w:hAnsi="Courier New" w:cs="Courier New"/>
+                <w:sz w:val="20"/>
+                <w:szCs w:val="16"/>
+              </w:rPr>
+            </w:pPr>
+            <w:r>
+              <w:rPr>
+                <w:rFonts w:eastAsia="Calibri"/>
+                <w:sz w:val="20"/>
+                <w:szCs w:val="16"/>
+              </w:rPr>
+              <w:t>Descrição</w:t>
+            </w:r>
+          </w:p>
+          <w:p>
+            <w:pPr>
+              <w:pStyle w:val="PargrafodaLista"/>
+              <w:numPr>
+                <w:ilvl w:val="1"/>
+                <w:numId w:val="1"/>
+              </w:numPr>
+              <w:rPr>
+                <w:rFonts w:ascii="Courier New" w:eastAsia="Courier New" w:hAnsi="Courier New" w:cs="Courier New"/>
+                <w:sz w:val="20"/>
+                <w:szCs w:val="16"/>
+              </w:rPr>
+            </w:pPr>
+            <w:r>
+              <w:rPr>
+                <w:rFonts w:eastAsia="Calibri"/>
+                <w:sz w:val="20"/>
+                <w:szCs w:val="16"/>
+              </w:rPr>
+              <w:t>Cor</w:t>
+            </w:r>
+            <w:r>
+              <w:rPr>
+                <w:rFonts w:eastAsia="Calibri"/>
+                <w:sz w:val="20"/>
+                <w:szCs w:val="16"/>
+              </w:rPr>
+              <w:t xml:space="preserve"> (</w:t>
+            </w:r>
+            <w:r>
+              <w:rPr>
+                <w:rFonts w:eastAsia="Calibri"/>
+                <w:sz w:val="20"/>
+                <w:szCs w:val="16"/>
+              </w:rPr>
+              <w:t>Valor hexadecimal</w:t>
+            </w:r>
+            <w:r>
+              <w:rPr>
+                <w:rFonts w:eastAsia="Calibri"/>
+                <w:sz w:val="20"/>
+                <w:szCs w:val="16"/>
+              </w:rPr>
+              <w:t xml:space="preserve"> </w:t>
+            </w:r>
+            <w:r>
+              <w:rPr>
+                <w:rFonts w:eastAsia="Calibri"/>
+                <w:sz w:val="20"/>
+                <w:szCs w:val="16"/>
+              </w:rPr>
+              <w:t>e não ser vazio)</w:t>
+            </w:r>
+          </w:p>
+          <w:p>
+            <w:pPr>
+              <w:pStyle w:val="PargrafodaLista"/>
+              <w:numPr>
+                <w:ilvl w:val="0"/>
+                <w:numId w:val="1"/>
+              </w:numPr>
+              <w:rPr>
+                <w:rFonts w:ascii="Noto Sans Symbols" w:eastAsia="Noto Sans Symbols" w:hAnsi="Noto Sans Symbols" w:cs="Noto Sans Symbols"/>
+                <w:sz w:val="20"/>
+                <w:szCs w:val="16"/>
+              </w:rPr>
+            </w:pPr>
+            <w:r>
+              <w:rPr>
+                <w:rFonts w:eastAsia="Calibri"/>
+                <w:sz w:val="20"/>
+                <w:szCs w:val="16"/>
+              </w:rPr>
+              <w:t>O sistema deve permitir alterar os dados de um</w:t>
+            </w:r>
+            <w:r>
+              <w:rPr>
+                <w:rFonts w:eastAsia="Calibri"/>
+                <w:sz w:val="20"/>
+                <w:szCs w:val="16"/>
+              </w:rPr>
+              <w:t>a</w:t>
+            </w:r>
+            <w:r>
+              <w:rPr>
+                <w:rFonts w:eastAsia="Calibri"/>
+                <w:sz w:val="20"/>
+                <w:szCs w:val="16"/>
+              </w:rPr>
+              <w:t xml:space="preserve"> </w:t>
+            </w:r>
+            <w:r>
+              <w:rPr>
+                <w:rFonts w:eastAsia="Calibri"/>
+                <w:sz w:val="20"/>
+                <w:szCs w:val="16"/>
+              </w:rPr>
+              <w:t>prioridade</w:t>
+            </w:r>
+            <w:r>
+              <w:rPr>
+                <w:rFonts w:eastAsia="Calibri"/>
+                <w:sz w:val="20"/>
+                <w:szCs w:val="16"/>
+              </w:rPr>
+              <w:t xml:space="preserve"> já existente, observando as validações indicadas no item anterior.</w:t>
+            </w:r>
+          </w:p>
+          <w:p>
+            <w:pPr>
+              <w:pStyle w:val="PargrafodaLista"/>
+              <w:numPr>
+                <w:ilvl w:val="0"/>
+                <w:numId w:val="1"/>
+              </w:numPr>
+              <w:rPr>
+                <w:rFonts w:ascii="Noto Sans Symbols" w:eastAsia="Noto Sans Symbols" w:hAnsi="Noto Sans Symbols" w:cs="Noto Sans Symbols"/>
+                <w:sz w:val="20"/>
+                <w:szCs w:val="16"/>
+              </w:rPr>
+            </w:pPr>
+            <w:r>
+              <w:rPr>
+                <w:rFonts w:eastAsia="Calibri"/>
+                <w:sz w:val="20"/>
+                <w:szCs w:val="16"/>
+              </w:rPr>
+              <w:t>A exclusão de um</w:t>
+            </w:r>
+            <w:r>
+              <w:rPr>
+                <w:rFonts w:eastAsia="Calibri"/>
+                <w:sz w:val="20"/>
+                <w:szCs w:val="16"/>
+              </w:rPr>
+              <w:t>a</w:t>
+            </w:r>
+            <w:r>
+              <w:rPr>
+                <w:rFonts w:eastAsia="Calibri"/>
+                <w:sz w:val="20"/>
+                <w:szCs w:val="16"/>
+              </w:rPr>
+              <w:t xml:space="preserve"> </w:t>
+            </w:r>
+            <w:r>
+              <w:rPr>
+                <w:rFonts w:eastAsia="Calibri"/>
+                <w:sz w:val="20"/>
+                <w:szCs w:val="16"/>
+              </w:rPr>
+              <w:t>prioridade</w:t>
+            </w:r>
+            <w:r>
+              <w:rPr>
+                <w:rFonts w:eastAsia="Calibri"/>
+                <w:sz w:val="20"/>
+                <w:szCs w:val="16"/>
+              </w:rPr>
+              <w:t xml:space="preserve"> deve ser apenas lógica (inativação), para preservar o histórico de tarefas vinculadas.</w:t>
+            </w:r>
+          </w:p>
+          <w:p>
+            <w:pPr>
+              <w:pStyle w:val="PargrafodaLista"/>
+              <w:numPr>
+                <w:ilvl w:val="0"/>
+                <w:numId w:val="1"/>
+              </w:numPr>
+              <w:rPr>
+                <w:rFonts w:ascii="Noto Sans Symbols" w:eastAsia="Noto Sans Symbols" w:hAnsi="Noto Sans Symbols" w:cs="Noto Sans Symbols"/>
+                <w:sz w:val="20"/>
+                <w:szCs w:val="16"/>
+              </w:rPr>
+            </w:pPr>
+            <w:r>
+              <w:rPr>
+                <w:rFonts w:eastAsia="Calibri"/>
+                <w:sz w:val="20"/>
+                <w:szCs w:val="16"/>
+              </w:rPr>
+              <w:t>Ao tentar excluir um</w:t>
+            </w:r>
+            <w:r>
+              <w:rPr>
+                <w:rFonts w:eastAsia="Calibri"/>
+                <w:sz w:val="20"/>
+                <w:szCs w:val="16"/>
+              </w:rPr>
+              <w:t>a</w:t>
+            </w:r>
+            <w:r>
+              <w:rPr>
+                <w:rFonts w:eastAsia="Calibri"/>
+                <w:sz w:val="20"/>
+                <w:szCs w:val="16"/>
+              </w:rPr>
+              <w:t xml:space="preserve"> </w:t>
+            </w:r>
+            <w:r>
+              <w:rPr>
+                <w:rFonts w:eastAsia="Calibri"/>
+                <w:sz w:val="20"/>
+                <w:szCs w:val="16"/>
+              </w:rPr>
+              <w:t>prioridade</w:t>
+            </w:r>
+            <w:r>
+              <w:rPr>
+                <w:rFonts w:eastAsia="Calibri"/>
+                <w:sz w:val="20"/>
+                <w:szCs w:val="16"/>
+              </w:rPr>
+              <w:t xml:space="preserve"> que possua tarefas em andamento, o sistema deve impedir a exclusão e exibir mensagem de alerta ao usuário, para que tome ciência e realoque outr</w:t>
+            </w:r>
+            <w:r>
+              <w:rPr>
+                <w:rFonts w:eastAsia="Calibri"/>
+                <w:sz w:val="20"/>
+                <w:szCs w:val="16"/>
+              </w:rPr>
+              <w:t xml:space="preserve">a prioridade </w:t>
+            </w:r>
+            <w:r>
+              <w:rPr>
+                <w:rFonts w:eastAsia="Calibri"/>
+                <w:sz w:val="20"/>
+                <w:szCs w:val="16"/>
+              </w:rPr>
+              <w:t>para as tarefas que estão vinculadas.</w:t>
+            </w:r>
+          </w:p>
+          <w:p>
+            <w:pPr>
+              <w:pStyle w:val="PargrafodaLista"/>
+              <w:numPr>
+                <w:ilvl w:val="0"/>
+                <w:numId w:val="1"/>
+              </w:numPr>
+              <w:rPr>
+                <w:rFonts w:ascii="Noto Sans Symbols" w:eastAsia="Noto Sans Symbols" w:hAnsi="Noto Sans Symbols" w:cs="Noto Sans Symbols"/>
+                <w:sz w:val="20"/>
+                <w:szCs w:val="16"/>
+              </w:rPr>
+            </w:pPr>
+            <w:r>
+              <w:rPr>
+                <w:rFonts w:eastAsia="Calibri"/>
+                <w:sz w:val="20"/>
+                <w:szCs w:val="16"/>
+              </w:rPr>
+              <w:t>A interface deve conter:</w:t>
+            </w:r>
+          </w:p>
+          <w:p>
+            <w:pPr>
+              <w:pStyle w:val="PargrafodaLista"/>
+              <w:numPr>
+                <w:ilvl w:val="1"/>
+                <w:numId w:val="1"/>
+              </w:numPr>
+              <w:rPr>
+                <w:rFonts w:ascii="Courier New" w:eastAsia="Courier New" w:hAnsi="Courier New" w:cs="Courier New"/>
+                <w:sz w:val="20"/>
+                <w:szCs w:val="16"/>
+              </w:rPr>
+            </w:pPr>
+            <w:r>
+              <w:rPr>
+                <w:rFonts w:eastAsia="Calibri"/>
+                <w:sz w:val="20"/>
+                <w:szCs w:val="16"/>
+              </w:rPr>
+              <w:t>Um botão para cadastrar nov</w:t>
+            </w:r>
+            <w:r>
+              <w:rPr>
+                <w:rFonts w:eastAsia="Calibri"/>
+                <w:sz w:val="20"/>
+                <w:szCs w:val="16"/>
+              </w:rPr>
+              <w:t>a prioridade</w:t>
+            </w:r>
+            <w:r>
+              <w:rPr>
+                <w:rFonts w:eastAsia="Calibri"/>
+                <w:sz w:val="20"/>
+                <w:szCs w:val="16"/>
+              </w:rPr>
+              <w:t>, abrindo uma modal de cadastro, onde aparecerão os campos para preencher os dados.</w:t>
+            </w:r>
+          </w:p>
+          <w:p>
+            <w:pPr>
+              <w:pStyle w:val="PargrafodaLista"/>
+              <w:numPr>
+                <w:ilvl w:val="1"/>
+                <w:numId w:val="1"/>
+              </w:numPr>
+              <w:rPr>
+                <w:rFonts w:ascii="Courier New" w:eastAsia="Courier New" w:hAnsi="Courier New" w:cs="Courier New"/>
+                <w:sz w:val="20"/>
+                <w:szCs w:val="16"/>
+              </w:rPr>
+            </w:pPr>
+            <w:r>
+              <w:rPr>
+                <w:rFonts w:eastAsia="Calibri"/>
+                <w:sz w:val="20"/>
+                <w:szCs w:val="16"/>
+              </w:rPr>
+              <w:t>Uma listagem com tod</w:t>
+            </w:r>
+            <w:r>
+              <w:rPr>
+                <w:rFonts w:eastAsia="Calibri"/>
+                <w:sz w:val="20"/>
+                <w:szCs w:val="16"/>
+              </w:rPr>
+              <w:t>a</w:t>
+            </w:r>
+            <w:r>
+              <w:rPr>
+                <w:rFonts w:eastAsia="Calibri"/>
+                <w:sz w:val="20"/>
+                <w:szCs w:val="16"/>
+              </w:rPr>
+              <w:t xml:space="preserve">s </w:t>
+            </w:r>
+            <w:r>
+              <w:rPr>
+                <w:rFonts w:eastAsia="Calibri"/>
+                <w:sz w:val="20"/>
+                <w:szCs w:val="16"/>
+              </w:rPr>
+              <w:t>a</w:t>
+            </w:r>
+            <w:r>
+              <w:rPr>
+                <w:rFonts w:eastAsia="Calibri"/>
+                <w:sz w:val="20"/>
+                <w:szCs w:val="16"/>
+              </w:rPr>
+              <w:t xml:space="preserve">s </w:t>
+            </w:r>
+            <w:r>
+              <w:rPr>
+                <w:rFonts w:eastAsia="Calibri"/>
+                <w:sz w:val="20"/>
+                <w:szCs w:val="16"/>
+              </w:rPr>
+              <w:t>prioridades</w:t>
+            </w:r>
+            <w:r>
+              <w:rPr>
+                <w:rFonts w:eastAsia="Calibri"/>
+                <w:sz w:val="20"/>
+                <w:szCs w:val="16"/>
+              </w:rPr>
+              <w:t xml:space="preserve"> estará disponível de duas formas, sendo em lista ou cartões</w:t>
+            </w:r>
+            <w:r>
+              <w:rPr>
+                <w:rFonts w:eastAsia="Calibri"/>
+                <w:sz w:val="20"/>
+                <w:szCs w:val="16"/>
+              </w:rPr>
+              <w:t>, permitindo clicar em cada item para abrir modal de visualização/edição/</w:t>
+            </w:r>
+            <w:r>
+              <w:rPr>
+                <w:rFonts w:eastAsia="Calibri"/>
+                <w:sz w:val="20"/>
+                <w:szCs w:val="16"/>
+              </w:rPr>
+              <w:t>inativação</w:t>
+            </w:r>
+            <w:r>
+              <w:rPr>
+                <w:rFonts w:eastAsia="Calibri"/>
+                <w:sz w:val="20"/>
+                <w:szCs w:val="16"/>
+              </w:rPr>
+              <w:t>/rea</w:t>
+            </w:r>
+            <w:r>
+              <w:rPr>
+                <w:rFonts w:eastAsia="Calibri"/>
+                <w:sz w:val="20"/>
+                <w:szCs w:val="16"/>
+              </w:rPr>
+              <w:t xml:space="preserve">tivação. </w:t>
+            </w:r>
+          </w:p>
+          <w:p>
+            <w:pPr>
+              <w:pStyle w:val="PargrafodaLista"/>
+              <w:ind w:left="1440"/>
+              <w:rPr>
+                <w:rFonts w:ascii="Courier New" w:eastAsia="Courier New" w:hAnsi="Courier New" w:cs="Courier New"/>
+                <w:sz w:val="20"/>
+                <w:szCs w:val="16"/>
+              </w:rPr>
+            </w:pPr>
+          </w:p>
+          <w:p>
+            <w:pPr>
+              <w:rPr>
+                <w:rFonts w:eastAsia="Calibri"/>
+                <w:b/>
+                <w:bCs/>
+                <w:sz w:val="20"/>
+                <w:szCs w:val="16"/>
+              </w:rPr>
+            </w:pPr>
+            <w:r>
+              <w:rPr>
+                <w:rFonts w:eastAsia="Calibri"/>
+                <w:b/>
+                <w:bCs/>
+                <w:sz w:val="20"/>
+                <w:szCs w:val="16"/>
+              </w:rPr>
+              <w:t>Diagrama de Classe do Contexto</w:t>
+            </w:r>
+          </w:p>
+          <w:p>
+            <w:pPr>
+              <w:jc w:val="center"/>
+              <w:rPr>
+                <w:rFonts w:eastAsia="Calibri"/>
+                <w:b/>
+                <w:bCs/>
+                <w:sz w:val="20"/>
+                <w:szCs w:val="16"/>
+              </w:rPr>
+            </w:pPr>
+            <w:r>
+              <w:rPr>
+                <w:rFonts w:eastAsia="Calibri"/>
+                <w:b/>
+                <w:bCs/>
+                <w:sz w:val="20"/>
+                <w:szCs w:val="16"/>
+              </w:rPr>
+              <w:drawing>
+                <wp:inline distT="0" distB="0" distL="0" distR="0" wp14:anchorId="1C0E89A9" wp14:editId="1820284A">
+                  <wp:extent cx="5392800" cy="2700000"/>
+                  <wp:effectExtent l="0" t="0" r="0" b="5715"/>
+                  <wp:docPr id="46" name="Imagem 46"/>
+                  <wp:cNvGraphicFramePr>
+                    <a:graphicFrameLocks xmlns:a="http://schemas.openxmlformats.org/drawingml/2006/main" noChangeAspect="1"/>
+                  </wp:cNvGraphicFramePr>
+                  <a:graphic xmlns:a="http://schemas.openxmlformats.org/drawingml/2006/main">
+                    <a:graphicData uri="http://schemas.openxmlformats.org/drawingml/2006/picture">
+                      <pic:pic xmlns:pic="http://schemas.openxmlformats.org/drawingml/2006/picture">
+                        <pic:nvPicPr>
+                          <pic:cNvPr id="1" name=""/>
+                          <pic:cNvPicPr/>
+                        </pic:nvPicPr>
+                        <pic:blipFill>
+                          <a:blip r:embed="rId24"/>
+                          <a:stretch>
+                            <a:fillRect/>
+                          </a:stretch>
+                        </pic:blipFill>
+                        <pic:spPr>
+                          <a:xfrm>
+                            <a:off x="0" y="0"/>
+                            <a:ext cx="5392800" cy="2700000"/>
+                          </a:xfrm>
+                          <a:prstGeom prst="rect">
+                            <a:avLst/>
+                          </a:prstGeom>
+                        </pic:spPr>
+                      </pic:pic>
+                    </a:graphicData>
+                  </a:graphic>
+                </wp:inline>
+              </w:drawing>
+            </w:r>
+          </w:p>
+          <w:p>
+            <w:pPr>
+              <w:jc w:val="center"/>
+              <w:rPr>
+                <w:rFonts w:eastAsia="Calibri"/>
+                <w:b/>
+                <w:bCs/>
+                <w:sz w:val="20"/>
+                <w:szCs w:val="16"/>
+              </w:rPr>
+            </w:pPr>
+          </w:p>
+          <w:p>
+            <w:pPr>
+              <w:rPr>
+                <w:rFonts w:eastAsia="Calibri"/>
+                <w:b/>
+                <w:bCs/>
+                <w:sz w:val="20"/>
+                <w:szCs w:val="16"/>
+              </w:rPr>
+            </w:pPr>
+            <w:r>
+              <w:rPr>
+                <w:rFonts w:eastAsia="Calibri"/>
+                <w:b/>
+                <w:bCs/>
+                <w:sz w:val="20"/>
+                <w:szCs w:val="16"/>
+              </w:rPr>
+              <w:lastRenderedPageBreak/>
+              <w:t>Diagrama de ER do Contexto</w:t>
+            </w:r>
+          </w:p>
+          <w:p>
+            <w:pPr>
+              <w:jc w:val="center"/>
+              <w:rPr>
+                <w:rFonts w:eastAsia="Calibri"/>
+                <w:b/>
+                <w:bCs/>
+                <w:sz w:val="20"/>
+                <w:szCs w:val="16"/>
+              </w:rPr>
+            </w:pPr>
+            <w:r>
+              <w:rPr>
+                <w:rFonts w:eastAsia="Calibri"/>
+                <w:b/>
+                <w:bCs/>
+                <w:sz w:val="20"/>
+                <w:szCs w:val="16"/>
+              </w:rPr>
+              <w:drawing>
+                <wp:inline distT="0" distB="0" distL="0" distR="0" wp14:anchorId="0C514572" wp14:editId="06B610E7">
+                  <wp:extent cx="2196000" cy="2700000"/>
+                  <wp:effectExtent l="0" t="0" r="0" b="5715"/>
+                  <wp:docPr id="44" name="Imagem 44"/>
+                  <wp:cNvGraphicFramePr>
+                    <a:graphicFrameLocks xmlns:a="http://schemas.openxmlformats.org/drawingml/2006/main" noChangeAspect="1"/>
+                  </wp:cNvGraphicFramePr>
+                  <a:graphic xmlns:a="http://schemas.openxmlformats.org/drawingml/2006/main">
+                    <a:graphicData uri="http://schemas.openxmlformats.org/drawingml/2006/picture">
+                      <pic:pic xmlns:pic="http://schemas.openxmlformats.org/drawingml/2006/picture">
+                        <pic:nvPicPr>
+                          <pic:cNvPr id="1" name=""/>
+                          <pic:cNvPicPr/>
+                        </pic:nvPicPr>
+                        <pic:blipFill>
+                          <a:blip r:embed="rId25"/>
+                          <a:stretch>
+                            <a:fillRect/>
+                          </a:stretch>
+                        </pic:blipFill>
+                        <pic:spPr>
+                          <a:xfrm>
+                            <a:off x="0" y="0"/>
+                            <a:ext cx="2196000" cy="2700000"/>
+                          </a:xfrm>
+                          <a:prstGeom prst="rect">
+                            <a:avLst/>
+                          </a:prstGeom>
+                        </pic:spPr>
+                      </pic:pic>
+                    </a:graphicData>
+                  </a:graphic>
+                </wp:inline>
+              </w:drawing>
+            </w:r>
+          </w:p>
+          <w:p>
+            <w:pPr>
+              <w:jc w:val="center"/>
+              <w:rPr>
+                <w:rFonts w:eastAsia="Calibri"/>
+                <w:b/>
+                <w:bCs/>
+                <w:sz w:val="20"/>
+                <w:szCs w:val="16"/>
+              </w:rPr>
+            </w:pPr>
+          </w:p>
+          <w:p>
+            <w:pPr>
+              <w:rPr>
+                <w:rFonts w:eastAsia="Calibri"/>
+                <w:b/>
+                <w:bCs/>
+                <w:sz w:val="20"/>
+                <w:szCs w:val="16"/>
+              </w:rPr>
+            </w:pPr>
+            <w:r>
+              <w:rPr>
+                <w:rFonts w:eastAsia="Calibri"/>
+                <w:b/>
+                <w:bCs/>
+                <w:sz w:val="20"/>
+                <w:szCs w:val="16"/>
+              </w:rPr>
+              <w:t>Detalhamento com protótipo</w:t>
+            </w:r>
+          </w:p>
+          <w:p>
+            <w:pPr>
+              <w:rPr>
+                <w:rFonts w:eastAsia="Noto Sans Symbols"/>
+                <w:sz w:val="20"/>
+                <w:szCs w:val="16"/>
+              </w:rPr>
+            </w:pPr>
+          </w:p>
+        </w:tc>
+      </w:tr>
+    </w:tbl>
+    <w:p>
+      <w:pPr>
         <w:pStyle w:val="Ttulo1"/>
       </w:pPr>
-      <w:r>
-        <w:lastRenderedPageBreak/>
+    </w:p>
+    <w:p/>
+    <w:p>
+      <w:pPr>
+        <w:pStyle w:val="Ttulo1"/>
+      </w:pPr>
+    </w:p>
+    <w:p/>
+    <w:p/>
+    <w:p/>
+    <w:p/>
+    <w:p>
+      <w:pPr>
+        <w:pStyle w:val="Ttulo1"/>
+        <w:tabs>
+          <w:tab w:val="left" w:pos="948"/>
+        </w:tabs>
+      </w:pPr>
+      <w:r>
+        <w:tab/>
+      </w:r>
+    </w:p>
+    <w:p>
+      <w:pPr>
+        <w:pStyle w:val="Ttulo1"/>
+      </w:pPr>
+      <w:r>
         <w:br w:type="page"/>
       </w:r>
       <w:bookmarkStart w:id="13" w:name="_Toc209377801"/>
@@ -7399,7 +8527,7 @@
                     <pic:cNvPicPr preferRelativeResize="0"/>
                   </pic:nvPicPr>
                   <pic:blipFill>
-                    <a:blip r:embed="rId24"/>
+                    <a:blip r:embed="rId26"/>
                     <a:srcRect/>
                     <a:stretch>
                       <a:fillRect/>
@@ -7477,7 +8605,7 @@
                     <pic:cNvPicPr preferRelativeResize="0"/>
                   </pic:nvPicPr>
                   <pic:blipFill>
-                    <a:blip r:embed="rId25"/>
+                    <a:blip r:embed="rId27"/>
                     <a:srcRect/>
                     <a:stretch>
                       <a:fillRect/>
@@ -7721,7 +8849,7 @@
                     <pic:cNvPicPr preferRelativeResize="0"/>
                   </pic:nvPicPr>
                   <pic:blipFill>
-                    <a:blip r:embed="rId26"/>
+                    <a:blip r:embed="rId28"/>
                     <a:srcRect/>
                     <a:stretch>
                       <a:fillRect/>
@@ -7746,7 +8874,7 @@
     </w:p>
     <w:p/>
     <w:sectPr>
-      <w:footerReference w:type="first" r:id="rId27"/>
+      <w:footerReference w:type="first" r:id="rId29"/>
       <w:pgSz w:w="11906" w:h="16838"/>
       <w:pgMar w:top="1418" w:right="851" w:bottom="1418" w:left="1418" w:header="709" w:footer="709" w:gutter="0"/>
       <w:pgNumType w:start="1"/>

</xml_diff>

<commit_message>
Backend + Documentação - Gerenciar etapas
</commit_message>
<xml_diff>
--- a/Documentação/ERS.docx
+++ b/Documentação/ERS.docx
@@ -2776,15 +2776,7 @@
                 <w:sz w:val="18"/>
                 <w:szCs w:val="18"/>
               </w:rPr>
-              <w:t>Gerenciar setores</w:t>
-            </w:r>
-            <w:r>
-              <w:rPr>
-                <w:rFonts w:eastAsia="Calibri"/>
-                <w:sz w:val="18"/>
-                <w:szCs w:val="18"/>
-              </w:rPr>
-              <w:t xml:space="preserve"> </w:t>
+              <w:t xml:space="preserve">Gerenciar setores </w:t>
             </w:r>
           </w:p>
           <w:p>
@@ -3310,15 +3302,7 @@
                 <w:sz w:val="18"/>
                 <w:szCs w:val="18"/>
               </w:rPr>
-              <w:t>Gerenciar colaboradores</w:t>
-            </w:r>
-            <w:r>
-              <w:rPr>
-                <w:rFonts w:eastAsia="Calibri"/>
-                <w:sz w:val="18"/>
-                <w:szCs w:val="18"/>
-              </w:rPr>
-              <w:t xml:space="preserve"> </w:t>
+              <w:t xml:space="preserve">Gerenciar colaboradores </w:t>
             </w:r>
           </w:p>
           <w:p>
@@ -6399,9 +6383,9 @@
             </w:pPr>
             <w:r>
               <w:rPr>
-                <w:rFonts w:eastAsia="Calibri"/>
-                <w:b/>
-                <w:bCs/>
+                <w:b/>
+                <w:bCs/>
+                <w:noProof/>
                 <w:sz w:val="20"/>
                 <w:szCs w:val="16"/>
               </w:rPr>
@@ -7829,15 +7813,7 @@
                 <w:sz w:val="20"/>
                 <w:szCs w:val="16"/>
               </w:rPr>
-              <w:t>Valor hexadecimal</w:t>
-            </w:r>
-            <w:r>
-              <w:rPr>
-                <w:rFonts w:eastAsia="Calibri"/>
-                <w:sz w:val="20"/>
-                <w:szCs w:val="16"/>
-              </w:rPr>
-              <w:t xml:space="preserve"> </w:t>
+              <w:t xml:space="preserve">Valor hexadecimal </w:t>
             </w:r>
             <w:r>
               <w:rPr>
@@ -8145,15 +8121,7 @@
                 <w:sz w:val="20"/>
                 <w:szCs w:val="16"/>
               </w:rPr>
-              <w:t>prioridades</w:t>
-            </w:r>
-            <w:r>
-              <w:rPr>
-                <w:rFonts w:eastAsia="Calibri"/>
-                <w:sz w:val="20"/>
-                <w:szCs w:val="16"/>
-              </w:rPr>
-              <w:t xml:space="preserve"> estará disponível de duas formas, sendo em lista ou cartões</w:t>
+              <w:t>prioridades estará disponível de duas formas, sendo em lista ou cartões</w:t>
             </w:r>
             <w:r>
               <w:rPr>
@@ -8177,15 +8145,7 @@
                 <w:sz w:val="20"/>
                 <w:szCs w:val="16"/>
               </w:rPr>
-              <w:t>/rea</w:t>
-            </w:r>
-            <w:r>
-              <w:rPr>
-                <w:rFonts w:eastAsia="Calibri"/>
-                <w:sz w:val="20"/>
-                <w:szCs w:val="16"/>
-              </w:rPr>
-              <w:t xml:space="preserve">tivação. </w:t>
+              <w:t xml:space="preserve">/reativação. </w:t>
             </w:r>
           </w:p>
           <w:p>
@@ -8233,9 +8193,9 @@
             </w:pPr>
             <w:r>
               <w:rPr>
-                <w:rFonts w:eastAsia="Calibri"/>
-                <w:b/>
-                <w:bCs/>
+                <w:b/>
+                <w:bCs/>
+                <w:noProof/>
                 <w:sz w:val="20"/>
                 <w:szCs w:val="16"/>
               </w:rPr>
@@ -8323,9 +8283,9 @@
             </w:pPr>
             <w:r>
               <w:rPr>
-                <w:rFonts w:eastAsia="Calibri"/>
-                <w:b/>
-                <w:bCs/>
+                <w:b/>
+                <w:bCs/>
+                <w:noProof/>
                 <w:sz w:val="20"/>
                 <w:szCs w:val="16"/>
               </w:rPr>
@@ -8413,6 +8373,926 @@
     </w:tbl>
     <w:p>
       <w:pPr>
+        <w:spacing w:after="240" w:line="259" w:lineRule="auto"/>
+        <w:rPr>
+          <w:u w:val="single"/>
+        </w:rPr>
+      </w:pPr>
+    </w:p>
+    <w:p>
+      <w:pPr>
+        <w:spacing w:after="240" w:line="259" w:lineRule="auto"/>
+        <w:rPr>
+          <w:u w:val="single"/>
+        </w:rPr>
+      </w:pPr>
+      <w:r>
+        <w:rPr>
+          <w:u w:val="single"/>
+        </w:rPr>
+        <w:br w:type="page"/>
+      </w:r>
+    </w:p>
+    <w:tbl>
+      <w:tblPr>
+        <w:tblStyle w:val="a2"/>
+        <w:tblW w:w="9627" w:type="dxa"/>
+        <w:tblInd w:w="0" w:type="dxa"/>
+        <w:tblBorders>
+          <w:top w:val="single" w:sz="4" w:space="0" w:color="000000"/>
+          <w:left w:val="single" w:sz="4" w:space="0" w:color="000000"/>
+          <w:bottom w:val="single" w:sz="4" w:space="0" w:color="000000"/>
+          <w:right w:val="single" w:sz="4" w:space="0" w:color="000000"/>
+          <w:insideH w:val="single" w:sz="4" w:space="0" w:color="000000"/>
+          <w:insideV w:val="single" w:sz="4" w:space="0" w:color="000000"/>
+        </w:tblBorders>
+        <w:tblLayout w:type="fixed"/>
+        <w:tblLook w:val="0400" w:firstRow="0" w:lastRow="0" w:firstColumn="0" w:lastColumn="0" w:noHBand="0" w:noVBand="1"/>
+      </w:tblPr>
+      <w:tblGrid>
+        <w:gridCol w:w="9627"/>
+      </w:tblGrid>
+      <w:tr>
+        <w:tc>
+          <w:tcPr>
+            <w:tcW w:w="9627" w:type="dxa"/>
+            <w:shd w:val="clear" w:color="auto" w:fill="F2F2F2"/>
+          </w:tcPr>
+          <w:p>
+            <w:pPr>
+              <w:rPr>
+                <w:rFonts w:eastAsia="Calibri"/>
+                <w:b/>
+                <w:bCs/>
+                <w:sz w:val="20"/>
+                <w:szCs w:val="16"/>
+              </w:rPr>
+            </w:pPr>
+            <w:r>
+              <w:rPr>
+                <w:rFonts w:eastAsia="Calibri"/>
+                <w:b/>
+                <w:bCs/>
+                <w:sz w:val="20"/>
+                <w:szCs w:val="16"/>
+              </w:rPr>
+              <w:lastRenderedPageBreak/>
+              <w:t xml:space="preserve">Estória </w:t>
+            </w:r>
+            <w:r>
+              <w:rPr>
+                <w:rFonts w:eastAsia="Calibri"/>
+                <w:b/>
+                <w:bCs/>
+                <w:sz w:val="20"/>
+                <w:szCs w:val="16"/>
+              </w:rPr>
+              <w:t>3</w:t>
+            </w:r>
+            <w:r>
+              <w:rPr>
+                <w:rFonts w:eastAsia="Calibri"/>
+                <w:b/>
+                <w:bCs/>
+                <w:sz w:val="20"/>
+                <w:szCs w:val="16"/>
+              </w:rPr>
+              <w:t xml:space="preserve">: Gerenciar </w:t>
+            </w:r>
+            <w:r>
+              <w:rPr>
+                <w:rFonts w:eastAsia="Calibri"/>
+                <w:b/>
+                <w:bCs/>
+                <w:sz w:val="20"/>
+                <w:szCs w:val="16"/>
+              </w:rPr>
+              <w:t>etapas de desenvolvimento</w:t>
+            </w:r>
+          </w:p>
+          <w:p>
+            <w:pPr>
+              <w:rPr>
+                <w:rFonts w:eastAsia="Calibri"/>
+                <w:b/>
+                <w:sz w:val="20"/>
+                <w:szCs w:val="16"/>
+              </w:rPr>
+            </w:pPr>
+            <w:r>
+              <w:rPr>
+                <w:rFonts w:eastAsia="Calibri"/>
+                <w:sz w:val="20"/>
+                <w:szCs w:val="16"/>
+              </w:rPr>
+              <w:t>Como administrador do sistema,</w:t>
+            </w:r>
+            <w:r>
+              <w:rPr>
+                <w:rFonts w:eastAsia="Calibri"/>
+                <w:sz w:val="20"/>
+                <w:szCs w:val="16"/>
+              </w:rPr>
+              <w:t xml:space="preserve"> </w:t>
+            </w:r>
+            <w:r>
+              <w:rPr>
+                <w:rFonts w:eastAsia="Calibri"/>
+                <w:sz w:val="20"/>
+                <w:szCs w:val="16"/>
+              </w:rPr>
+              <w:t>quero gerenciar as etapas de desenvolvimento das tarefas (listar, buscar, cadastrar, alterar e excluir),</w:t>
+            </w:r>
+            <w:r>
+              <w:rPr>
+                <w:rFonts w:eastAsia="Calibri"/>
+                <w:sz w:val="20"/>
+                <w:szCs w:val="16"/>
+              </w:rPr>
+              <w:t xml:space="preserve"> </w:t>
+            </w:r>
+            <w:r>
+              <w:rPr>
+                <w:rFonts w:eastAsia="Calibri"/>
+                <w:sz w:val="20"/>
+                <w:szCs w:val="16"/>
+              </w:rPr>
+              <w:t>para estruturar o fluxo de trabalho dos projetos e permitir que as tarefas sejam organizadas e visualizadas de acordo com o seu progresso.</w:t>
+            </w:r>
+          </w:p>
+        </w:tc>
+      </w:tr>
+      <w:tr>
+        <w:tc>
+          <w:tcPr>
+            <w:tcW w:w="9627" w:type="dxa"/>
+          </w:tcPr>
+          <w:p>
+            <w:pPr>
+              <w:rPr>
+                <w:rFonts w:eastAsia="Calibri"/>
+                <w:b/>
+                <w:bCs/>
+                <w:sz w:val="20"/>
+                <w:szCs w:val="16"/>
+              </w:rPr>
+            </w:pPr>
+            <w:r>
+              <w:rPr>
+                <w:rFonts w:eastAsia="Calibri"/>
+                <w:b/>
+                <w:bCs/>
+                <w:sz w:val="20"/>
+                <w:szCs w:val="16"/>
+              </w:rPr>
+              <w:t>Especificação do Requisito</w:t>
+            </w:r>
+          </w:p>
+          <w:p>
+            <w:pPr>
+              <w:pStyle w:val="PargrafodaLista"/>
+              <w:rPr>
+                <w:rFonts w:ascii="Noto Sans Symbols" w:eastAsia="Noto Sans Symbols" w:hAnsi="Noto Sans Symbols" w:cs="Noto Sans Symbols"/>
+                <w:sz w:val="20"/>
+                <w:szCs w:val="16"/>
+              </w:rPr>
+            </w:pPr>
+            <w:r>
+              <w:rPr>
+                <w:rFonts w:eastAsia="Calibri"/>
+                <w:sz w:val="20"/>
+                <w:szCs w:val="16"/>
+              </w:rPr>
+              <w:t>Deve ser possível listar</w:t>
+            </w:r>
+            <w:r>
+              <w:rPr>
+                <w:rFonts w:eastAsia="Calibri"/>
+                <w:sz w:val="20"/>
+                <w:szCs w:val="16"/>
+              </w:rPr>
+              <w:t xml:space="preserve"> </w:t>
+            </w:r>
+            <w:r>
+              <w:rPr>
+                <w:rFonts w:eastAsia="Calibri"/>
+                <w:sz w:val="20"/>
+                <w:szCs w:val="16"/>
+              </w:rPr>
+              <w:t xml:space="preserve">todas as </w:t>
+            </w:r>
+            <w:r>
+              <w:rPr>
+                <w:rFonts w:eastAsia="Calibri"/>
+                <w:sz w:val="20"/>
+                <w:szCs w:val="16"/>
+              </w:rPr>
+              <w:t>etapas de desenvolvimento</w:t>
+            </w:r>
+            <w:r>
+              <w:rPr>
+                <w:rFonts w:eastAsia="Calibri"/>
+                <w:sz w:val="20"/>
+                <w:szCs w:val="16"/>
+              </w:rPr>
+              <w:t xml:space="preserve"> cadastradas</w:t>
+            </w:r>
+            <w:r>
+              <w:rPr>
+                <w:rFonts w:eastAsia="Calibri"/>
+                <w:sz w:val="20"/>
+                <w:szCs w:val="16"/>
+              </w:rPr>
+              <w:t xml:space="preserve"> </w:t>
+            </w:r>
+            <w:r>
+              <w:rPr>
+                <w:rFonts w:eastAsia="Calibri"/>
+                <w:sz w:val="20"/>
+                <w:szCs w:val="16"/>
+              </w:rPr>
+              <w:t>no sistema, com opção de busca por nome</w:t>
+            </w:r>
+            <w:r>
+              <w:rPr>
+                <w:rFonts w:eastAsia="Calibri"/>
+                <w:sz w:val="20"/>
+                <w:szCs w:val="16"/>
+              </w:rPr>
+              <w:t xml:space="preserve"> ou descrição</w:t>
+            </w:r>
+            <w:r>
+              <w:rPr>
+                <w:rFonts w:eastAsia="Calibri"/>
+                <w:sz w:val="20"/>
+                <w:szCs w:val="16"/>
+              </w:rPr>
+              <w:t>.</w:t>
+            </w:r>
+          </w:p>
+          <w:p>
+            <w:pPr>
+              <w:pStyle w:val="PargrafodaLista"/>
+              <w:numPr>
+                <w:ilvl w:val="0"/>
+                <w:numId w:val="1"/>
+              </w:numPr>
+              <w:rPr>
+                <w:rFonts w:ascii="Noto Sans Symbols" w:eastAsia="Noto Sans Symbols" w:hAnsi="Noto Sans Symbols" w:cs="Noto Sans Symbols"/>
+                <w:sz w:val="20"/>
+                <w:szCs w:val="16"/>
+              </w:rPr>
+            </w:pPr>
+            <w:r>
+              <w:rPr>
+                <w:rFonts w:eastAsia="Calibri"/>
+                <w:sz w:val="20"/>
+                <w:szCs w:val="16"/>
+              </w:rPr>
+              <w:t>O sistema deve permitir o cadastro de novos setores, contendo os seguintes campos obrigatórios:</w:t>
+            </w:r>
+          </w:p>
+          <w:p>
+            <w:pPr>
+              <w:pStyle w:val="PargrafodaLista"/>
+              <w:numPr>
+                <w:ilvl w:val="1"/>
+                <w:numId w:val="1"/>
+              </w:numPr>
+              <w:rPr>
+                <w:rFonts w:ascii="Courier New" w:eastAsia="Courier New" w:hAnsi="Courier New" w:cs="Courier New"/>
+                <w:sz w:val="20"/>
+                <w:szCs w:val="16"/>
+              </w:rPr>
+            </w:pPr>
+            <w:r>
+              <w:rPr>
+                <w:rFonts w:eastAsia="Calibri"/>
+                <w:sz w:val="20"/>
+                <w:szCs w:val="16"/>
+              </w:rPr>
+              <w:t xml:space="preserve">Nome (não pode se repetir e não ser vazio) </w:t>
+            </w:r>
+          </w:p>
+          <w:p>
+            <w:pPr>
+              <w:pStyle w:val="PargrafodaLista"/>
+              <w:numPr>
+                <w:ilvl w:val="1"/>
+                <w:numId w:val="1"/>
+              </w:numPr>
+              <w:rPr>
+                <w:rFonts w:ascii="Courier New" w:eastAsia="Courier New" w:hAnsi="Courier New" w:cs="Courier New"/>
+                <w:sz w:val="20"/>
+                <w:szCs w:val="16"/>
+              </w:rPr>
+            </w:pPr>
+            <w:r>
+              <w:rPr>
+                <w:rFonts w:eastAsia="Calibri"/>
+                <w:sz w:val="20"/>
+                <w:szCs w:val="16"/>
+              </w:rPr>
+              <w:t>Descrição</w:t>
+            </w:r>
+          </w:p>
+          <w:p>
+            <w:pPr>
+              <w:pStyle w:val="PargrafodaLista"/>
+              <w:numPr>
+                <w:ilvl w:val="0"/>
+                <w:numId w:val="1"/>
+              </w:numPr>
+              <w:rPr>
+                <w:rFonts w:ascii="Noto Sans Symbols" w:eastAsia="Noto Sans Symbols" w:hAnsi="Noto Sans Symbols" w:cs="Noto Sans Symbols"/>
+                <w:sz w:val="20"/>
+                <w:szCs w:val="16"/>
+              </w:rPr>
+            </w:pPr>
+            <w:r>
+              <w:rPr>
+                <w:rFonts w:eastAsia="Calibri"/>
+                <w:sz w:val="20"/>
+                <w:szCs w:val="16"/>
+              </w:rPr>
+              <w:t>O sistema deve permitir alterar os dados de um</w:t>
+            </w:r>
+            <w:r>
+              <w:rPr>
+                <w:rFonts w:eastAsia="Calibri"/>
+                <w:sz w:val="20"/>
+                <w:szCs w:val="16"/>
+              </w:rPr>
+              <w:t>a</w:t>
+            </w:r>
+            <w:r>
+              <w:rPr>
+                <w:rFonts w:eastAsia="Calibri"/>
+                <w:sz w:val="20"/>
+                <w:szCs w:val="16"/>
+              </w:rPr>
+              <w:t xml:space="preserve"> </w:t>
+            </w:r>
+            <w:r>
+              <w:rPr>
+                <w:rFonts w:eastAsia="Calibri"/>
+                <w:sz w:val="20"/>
+                <w:szCs w:val="16"/>
+              </w:rPr>
+              <w:t>etapa de desenvolvimento</w:t>
+            </w:r>
+            <w:r>
+              <w:rPr>
+                <w:rFonts w:eastAsia="Calibri"/>
+                <w:sz w:val="20"/>
+                <w:szCs w:val="16"/>
+              </w:rPr>
+              <w:t xml:space="preserve"> já existente, observando as validações indicadas no item anterior.</w:t>
+            </w:r>
+          </w:p>
+          <w:p>
+            <w:pPr>
+              <w:pStyle w:val="PargrafodaLista"/>
+              <w:numPr>
+                <w:ilvl w:val="0"/>
+                <w:numId w:val="1"/>
+              </w:numPr>
+              <w:rPr>
+                <w:rFonts w:ascii="Noto Sans Symbols" w:eastAsia="Noto Sans Symbols" w:hAnsi="Noto Sans Symbols" w:cs="Noto Sans Symbols"/>
+                <w:sz w:val="20"/>
+                <w:szCs w:val="16"/>
+              </w:rPr>
+            </w:pPr>
+            <w:r>
+              <w:rPr>
+                <w:rFonts w:eastAsia="Calibri"/>
+                <w:sz w:val="20"/>
+                <w:szCs w:val="16"/>
+              </w:rPr>
+              <w:t>A exclusão de um</w:t>
+            </w:r>
+            <w:r>
+              <w:rPr>
+                <w:rFonts w:eastAsia="Calibri"/>
+                <w:sz w:val="20"/>
+                <w:szCs w:val="16"/>
+              </w:rPr>
+              <w:t>a</w:t>
+            </w:r>
+            <w:r>
+              <w:rPr>
+                <w:rFonts w:eastAsia="Calibri"/>
+                <w:sz w:val="20"/>
+                <w:szCs w:val="16"/>
+              </w:rPr>
+              <w:t xml:space="preserve"> </w:t>
+            </w:r>
+            <w:r>
+              <w:rPr>
+                <w:rFonts w:eastAsia="Calibri"/>
+                <w:sz w:val="20"/>
+                <w:szCs w:val="16"/>
+              </w:rPr>
+              <w:t>etapa de desenvolvimento</w:t>
+            </w:r>
+            <w:r>
+              <w:rPr>
+                <w:rFonts w:eastAsia="Calibri"/>
+                <w:sz w:val="20"/>
+                <w:szCs w:val="16"/>
+              </w:rPr>
+              <w:t xml:space="preserve"> deve ser apenas lógica (inativação), para preservar o histórico de tarefas vinculadas.</w:t>
+            </w:r>
+          </w:p>
+          <w:p>
+            <w:pPr>
+              <w:pStyle w:val="PargrafodaLista"/>
+              <w:numPr>
+                <w:ilvl w:val="0"/>
+                <w:numId w:val="1"/>
+              </w:numPr>
+              <w:rPr>
+                <w:rFonts w:ascii="Noto Sans Symbols" w:eastAsia="Noto Sans Symbols" w:hAnsi="Noto Sans Symbols" w:cs="Noto Sans Symbols"/>
+                <w:sz w:val="20"/>
+                <w:szCs w:val="16"/>
+              </w:rPr>
+            </w:pPr>
+            <w:r>
+              <w:rPr>
+                <w:rFonts w:eastAsia="Calibri"/>
+                <w:sz w:val="20"/>
+                <w:szCs w:val="16"/>
+              </w:rPr>
+              <w:t>Ao tentar excluir um</w:t>
+            </w:r>
+            <w:r>
+              <w:rPr>
+                <w:rFonts w:eastAsia="Calibri"/>
+                <w:sz w:val="20"/>
+                <w:szCs w:val="16"/>
+              </w:rPr>
+              <w:t>a</w:t>
+            </w:r>
+            <w:r>
+              <w:rPr>
+                <w:rFonts w:eastAsia="Calibri"/>
+                <w:sz w:val="20"/>
+                <w:szCs w:val="16"/>
+              </w:rPr>
+              <w:t xml:space="preserve"> </w:t>
+            </w:r>
+            <w:r>
+              <w:rPr>
+                <w:rFonts w:eastAsia="Calibri"/>
+                <w:sz w:val="20"/>
+                <w:szCs w:val="16"/>
+              </w:rPr>
+              <w:t>etapa de desenvolvimento</w:t>
+            </w:r>
+            <w:r>
+              <w:rPr>
+                <w:rFonts w:eastAsia="Calibri"/>
+                <w:sz w:val="20"/>
+                <w:szCs w:val="16"/>
+              </w:rPr>
+              <w:t xml:space="preserve"> que possua tarefas em andamento, o sistema deve impedir a exclusão e exibir mensagem de alerta ao usuário, para que tome ciência e realoque outr</w:t>
+            </w:r>
+            <w:r>
+              <w:rPr>
+                <w:rFonts w:eastAsia="Calibri"/>
+                <w:sz w:val="20"/>
+                <w:szCs w:val="16"/>
+              </w:rPr>
+              <w:t xml:space="preserve">a </w:t>
+            </w:r>
+            <w:r>
+              <w:rPr>
+                <w:rFonts w:eastAsia="Calibri"/>
+                <w:sz w:val="20"/>
+                <w:szCs w:val="16"/>
+              </w:rPr>
+              <w:t>etapa de desenvolvimento</w:t>
+            </w:r>
+            <w:r>
+              <w:rPr>
+                <w:rFonts w:eastAsia="Calibri"/>
+                <w:sz w:val="20"/>
+                <w:szCs w:val="16"/>
+              </w:rPr>
+              <w:t xml:space="preserve"> </w:t>
+            </w:r>
+            <w:r>
+              <w:rPr>
+                <w:rFonts w:eastAsia="Calibri"/>
+                <w:sz w:val="20"/>
+                <w:szCs w:val="16"/>
+              </w:rPr>
+              <w:t>para as tarefas que estão vinculadas.</w:t>
+            </w:r>
+          </w:p>
+          <w:p>
+            <w:pPr>
+              <w:pStyle w:val="PargrafodaLista"/>
+              <w:numPr>
+                <w:ilvl w:val="0"/>
+                <w:numId w:val="1"/>
+              </w:numPr>
+              <w:rPr>
+                <w:rFonts w:ascii="Noto Sans Symbols" w:eastAsia="Noto Sans Symbols" w:hAnsi="Noto Sans Symbols" w:cs="Noto Sans Symbols"/>
+                <w:sz w:val="20"/>
+                <w:szCs w:val="16"/>
+              </w:rPr>
+            </w:pPr>
+            <w:r>
+              <w:rPr>
+                <w:rFonts w:eastAsia="Calibri"/>
+                <w:sz w:val="20"/>
+                <w:szCs w:val="16"/>
+              </w:rPr>
+              <w:t>A interface deve conter:</w:t>
+            </w:r>
+          </w:p>
+          <w:p>
+            <w:pPr>
+              <w:pStyle w:val="PargrafodaLista"/>
+              <w:numPr>
+                <w:ilvl w:val="1"/>
+                <w:numId w:val="1"/>
+              </w:numPr>
+              <w:rPr>
+                <w:rFonts w:ascii="Courier New" w:eastAsia="Courier New" w:hAnsi="Courier New" w:cs="Courier New"/>
+                <w:sz w:val="20"/>
+                <w:szCs w:val="16"/>
+              </w:rPr>
+            </w:pPr>
+            <w:r>
+              <w:rPr>
+                <w:rFonts w:eastAsia="Calibri"/>
+                <w:sz w:val="20"/>
+                <w:szCs w:val="16"/>
+              </w:rPr>
+              <w:t>Um botão para cadastrar nov</w:t>
+            </w:r>
+            <w:r>
+              <w:rPr>
+                <w:rFonts w:eastAsia="Calibri"/>
+                <w:sz w:val="20"/>
+                <w:szCs w:val="16"/>
+              </w:rPr>
+              <w:t xml:space="preserve">a </w:t>
+            </w:r>
+            <w:r>
+              <w:rPr>
+                <w:rFonts w:eastAsia="Calibri"/>
+                <w:sz w:val="20"/>
+                <w:szCs w:val="16"/>
+              </w:rPr>
+              <w:t>etapa de desenvolvimento</w:t>
+            </w:r>
+            <w:r>
+              <w:rPr>
+                <w:rFonts w:eastAsia="Calibri"/>
+                <w:sz w:val="20"/>
+                <w:szCs w:val="16"/>
+              </w:rPr>
+              <w:t>, abrindo uma modal de cadastro, onde aparecerão os campos para preencher os dados.</w:t>
+            </w:r>
+          </w:p>
+          <w:p>
+            <w:pPr>
+              <w:pStyle w:val="PargrafodaLista"/>
+              <w:numPr>
+                <w:ilvl w:val="1"/>
+                <w:numId w:val="1"/>
+              </w:numPr>
+              <w:rPr>
+                <w:rFonts w:ascii="Courier New" w:eastAsia="Courier New" w:hAnsi="Courier New" w:cs="Courier New"/>
+                <w:sz w:val="20"/>
+                <w:szCs w:val="16"/>
+              </w:rPr>
+            </w:pPr>
+            <w:r>
+              <w:rPr>
+                <w:rFonts w:eastAsia="Calibri"/>
+                <w:sz w:val="20"/>
+                <w:szCs w:val="16"/>
+              </w:rPr>
+              <w:t>Uma listagem com tod</w:t>
+            </w:r>
+            <w:r>
+              <w:rPr>
+                <w:rFonts w:eastAsia="Calibri"/>
+                <w:sz w:val="20"/>
+                <w:szCs w:val="16"/>
+              </w:rPr>
+              <w:t>a</w:t>
+            </w:r>
+            <w:r>
+              <w:rPr>
+                <w:rFonts w:eastAsia="Calibri"/>
+                <w:sz w:val="20"/>
+                <w:szCs w:val="16"/>
+              </w:rPr>
+              <w:t xml:space="preserve">s </w:t>
+            </w:r>
+            <w:r>
+              <w:rPr>
+                <w:rFonts w:eastAsia="Calibri"/>
+                <w:sz w:val="20"/>
+                <w:szCs w:val="16"/>
+              </w:rPr>
+              <w:t>a</w:t>
+            </w:r>
+            <w:r>
+              <w:rPr>
+                <w:rFonts w:eastAsia="Calibri"/>
+                <w:sz w:val="20"/>
+                <w:szCs w:val="16"/>
+              </w:rPr>
+              <w:t xml:space="preserve">s </w:t>
+            </w:r>
+            <w:r>
+              <w:rPr>
+                <w:rFonts w:eastAsia="Calibri"/>
+                <w:sz w:val="20"/>
+                <w:szCs w:val="16"/>
+              </w:rPr>
+              <w:t>etapas de desenvolvimento</w:t>
+            </w:r>
+            <w:r>
+              <w:rPr>
+                <w:rFonts w:eastAsia="Calibri"/>
+                <w:sz w:val="20"/>
+                <w:szCs w:val="16"/>
+              </w:rPr>
+              <w:t xml:space="preserve"> estará disponível de duas formas, sendo em lista ou cartões</w:t>
+            </w:r>
+            <w:r>
+              <w:rPr>
+                <w:rFonts w:eastAsia="Calibri"/>
+                <w:sz w:val="20"/>
+                <w:szCs w:val="16"/>
+              </w:rPr>
+              <w:t>, permitindo clicar em cada item para abrir modal de visualização/edição/</w:t>
+            </w:r>
+            <w:r>
+              <w:rPr>
+                <w:rFonts w:eastAsia="Calibri"/>
+                <w:sz w:val="20"/>
+                <w:szCs w:val="16"/>
+              </w:rPr>
+              <w:t>inativação</w:t>
+            </w:r>
+            <w:r>
+              <w:rPr>
+                <w:rFonts w:eastAsia="Calibri"/>
+                <w:sz w:val="20"/>
+                <w:szCs w:val="16"/>
+              </w:rPr>
+              <w:t xml:space="preserve">/reativação. </w:t>
+            </w:r>
+          </w:p>
+          <w:p>
+            <w:pPr>
+              <w:pStyle w:val="PargrafodaLista"/>
+              <w:ind w:left="1440"/>
+              <w:rPr>
+                <w:rFonts w:ascii="Courier New" w:eastAsia="Courier New" w:hAnsi="Courier New" w:cs="Courier New"/>
+                <w:sz w:val="20"/>
+                <w:szCs w:val="16"/>
+              </w:rPr>
+            </w:pPr>
+          </w:p>
+          <w:p>
+            <w:pPr>
+              <w:rPr>
+                <w:rFonts w:eastAsia="Calibri"/>
+                <w:b/>
+                <w:bCs/>
+                <w:sz w:val="20"/>
+                <w:szCs w:val="16"/>
+              </w:rPr>
+            </w:pPr>
+            <w:r>
+              <w:rPr>
+                <w:rFonts w:eastAsia="Calibri"/>
+                <w:b/>
+                <w:bCs/>
+                <w:sz w:val="20"/>
+                <w:szCs w:val="16"/>
+              </w:rPr>
+              <w:t>Diagrama de Classe do Contexto</w:t>
+            </w:r>
+          </w:p>
+          <w:p>
+            <w:pPr>
+              <w:jc w:val="center"/>
+              <w:rPr>
+                <w:rFonts w:eastAsia="Calibri"/>
+                <w:b/>
+                <w:bCs/>
+                <w:sz w:val="20"/>
+                <w:szCs w:val="16"/>
+              </w:rPr>
+            </w:pPr>
+            <w:r>
+              <w:rPr>
+                <w:rFonts w:eastAsia="Calibri"/>
+                <w:b/>
+                <w:bCs/>
+                <w:sz w:val="20"/>
+                <w:szCs w:val="16"/>
+              </w:rPr>
+              <w:drawing>
+                <wp:inline distT="0" distB="0" distL="0" distR="0" wp14:anchorId="2967724A" wp14:editId="6DBB1573">
+                  <wp:extent cx="5508000" cy="2700000"/>
+                  <wp:effectExtent l="0" t="0" r="0" b="5715"/>
+                  <wp:docPr id="2" name="Imagem 2"/>
+                  <wp:cNvGraphicFramePr>
+                    <a:graphicFrameLocks xmlns:a="http://schemas.openxmlformats.org/drawingml/2006/main" noChangeAspect="1"/>
+                  </wp:cNvGraphicFramePr>
+                  <a:graphic xmlns:a="http://schemas.openxmlformats.org/drawingml/2006/main">
+                    <a:graphicData uri="http://schemas.openxmlformats.org/drawingml/2006/picture">
+                      <pic:pic xmlns:pic="http://schemas.openxmlformats.org/drawingml/2006/picture">
+                        <pic:nvPicPr>
+                          <pic:cNvPr id="1" name=""/>
+                          <pic:cNvPicPr/>
+                        </pic:nvPicPr>
+                        <pic:blipFill>
+                          <a:blip r:embed="rId26"/>
+                          <a:stretch>
+                            <a:fillRect/>
+                          </a:stretch>
+                        </pic:blipFill>
+                        <pic:spPr>
+                          <a:xfrm>
+                            <a:off x="0" y="0"/>
+                            <a:ext cx="5508000" cy="2700000"/>
+                          </a:xfrm>
+                          <a:prstGeom prst="rect">
+                            <a:avLst/>
+                          </a:prstGeom>
+                        </pic:spPr>
+                      </pic:pic>
+                    </a:graphicData>
+                  </a:graphic>
+                </wp:inline>
+              </w:drawing>
+            </w:r>
+          </w:p>
+          <w:p>
+            <w:pPr>
+              <w:jc w:val="center"/>
+              <w:rPr>
+                <w:rFonts w:eastAsia="Calibri"/>
+                <w:b/>
+                <w:bCs/>
+                <w:sz w:val="20"/>
+                <w:szCs w:val="16"/>
+              </w:rPr>
+            </w:pPr>
+          </w:p>
+          <w:p>
+            <w:pPr>
+              <w:jc w:val="center"/>
+              <w:rPr>
+                <w:rFonts w:eastAsia="Calibri"/>
+                <w:b/>
+                <w:bCs/>
+                <w:sz w:val="20"/>
+                <w:szCs w:val="16"/>
+              </w:rPr>
+            </w:pPr>
+          </w:p>
+          <w:p>
+            <w:pPr>
+              <w:rPr>
+                <w:rFonts w:eastAsia="Calibri"/>
+                <w:b/>
+                <w:bCs/>
+                <w:sz w:val="20"/>
+                <w:szCs w:val="16"/>
+              </w:rPr>
+            </w:pPr>
+            <w:r>
+              <w:rPr>
+                <w:rFonts w:eastAsia="Calibri"/>
+                <w:b/>
+                <w:bCs/>
+                <w:sz w:val="20"/>
+                <w:szCs w:val="16"/>
+              </w:rPr>
+              <w:lastRenderedPageBreak/>
+              <w:t>Diagrama de ER do Contexto</w:t>
+            </w:r>
+          </w:p>
+          <w:p>
+            <w:pPr>
+              <w:jc w:val="center"/>
+              <w:rPr>
+                <w:rFonts w:eastAsia="Calibri"/>
+                <w:b/>
+                <w:bCs/>
+                <w:sz w:val="20"/>
+                <w:szCs w:val="16"/>
+              </w:rPr>
+            </w:pPr>
+            <w:r>
+              <w:rPr>
+                <w:b/>
+                <w:bCs/>
+                <w:noProof/>
+                <w:sz w:val="20"/>
+                <w:szCs w:val="16"/>
+              </w:rPr>
+              <w:drawing>
+                <wp:inline distT="0" distB="0" distL="0" distR="0" wp14:anchorId="2525AAA6" wp14:editId="5ED3BBFE">
+                  <wp:extent cx="3096000" cy="2700000"/>
+                  <wp:effectExtent l="0" t="0" r="0" b="5715"/>
+                  <wp:docPr id="12" name="Imagem 12"/>
+                  <wp:cNvGraphicFramePr>
+                    <a:graphicFrameLocks xmlns:a="http://schemas.openxmlformats.org/drawingml/2006/main" noChangeAspect="1"/>
+                  </wp:cNvGraphicFramePr>
+                  <a:graphic xmlns:a="http://schemas.openxmlformats.org/drawingml/2006/main">
+                    <a:graphicData uri="http://schemas.openxmlformats.org/drawingml/2006/picture">
+                      <pic:pic xmlns:pic="http://schemas.openxmlformats.org/drawingml/2006/picture">
+                        <pic:nvPicPr>
+                          <pic:cNvPr id="1" name=""/>
+                          <pic:cNvPicPr/>
+                        </pic:nvPicPr>
+                        <pic:blipFill>
+                          <a:blip r:embed="rId27"/>
+                          <a:stretch>
+                            <a:fillRect/>
+                          </a:stretch>
+                        </pic:blipFill>
+                        <pic:spPr>
+                          <a:xfrm>
+                            <a:off x="0" y="0"/>
+                            <a:ext cx="3096000" cy="2700000"/>
+                          </a:xfrm>
+                          <a:prstGeom prst="rect">
+                            <a:avLst/>
+                          </a:prstGeom>
+                        </pic:spPr>
+                      </pic:pic>
+                    </a:graphicData>
+                  </a:graphic>
+                </wp:inline>
+              </w:drawing>
+            </w:r>
+          </w:p>
+          <w:p>
+            <w:pPr>
+              <w:rPr>
+                <w:rFonts w:eastAsia="Calibri"/>
+                <w:b/>
+                <w:bCs/>
+                <w:sz w:val="20"/>
+                <w:szCs w:val="16"/>
+              </w:rPr>
+            </w:pPr>
+          </w:p>
+          <w:p>
+            <w:pPr>
+              <w:rPr>
+                <w:rFonts w:eastAsia="Calibri"/>
+                <w:b/>
+                <w:bCs/>
+                <w:sz w:val="20"/>
+                <w:szCs w:val="16"/>
+              </w:rPr>
+            </w:pPr>
+            <w:r>
+              <w:rPr>
+                <w:rFonts w:eastAsia="Calibri"/>
+                <w:b/>
+                <w:bCs/>
+                <w:sz w:val="20"/>
+                <w:szCs w:val="16"/>
+              </w:rPr>
+              <w:t>Detalhamento com protótipo</w:t>
+            </w:r>
+          </w:p>
+          <w:p>
+            <w:pPr>
+              <w:rPr>
+                <w:rFonts w:eastAsia="Noto Sans Symbols"/>
+                <w:sz w:val="20"/>
+                <w:szCs w:val="16"/>
+              </w:rPr>
+            </w:pPr>
+          </w:p>
+        </w:tc>
+      </w:tr>
+    </w:tbl>
+    <w:p>
+      <w:pPr>
+        <w:pStyle w:val="Ttulo1"/>
+      </w:pPr>
+    </w:p>
+    <w:p>
+      <w:pPr>
         <w:pStyle w:val="Ttulo1"/>
       </w:pPr>
     </w:p>
@@ -8527,7 +9407,7 @@
                     <pic:cNvPicPr preferRelativeResize="0"/>
                   </pic:nvPicPr>
                   <pic:blipFill>
-                    <a:blip r:embed="rId26"/>
+                    <a:blip r:embed="rId28"/>
                     <a:srcRect/>
                     <a:stretch>
                       <a:fillRect/>
@@ -8605,7 +9485,7 @@
                     <pic:cNvPicPr preferRelativeResize="0"/>
                   </pic:nvPicPr>
                   <pic:blipFill>
-                    <a:blip r:embed="rId27"/>
+                    <a:blip r:embed="rId29"/>
                     <a:srcRect/>
                     <a:stretch>
                       <a:fillRect/>
@@ -8849,7 +9729,7 @@
                     <pic:cNvPicPr preferRelativeResize="0"/>
                   </pic:nvPicPr>
                   <pic:blipFill>
-                    <a:blip r:embed="rId28"/>
+                    <a:blip r:embed="rId30"/>
                     <a:srcRect/>
                     <a:stretch>
                       <a:fillRect/>
@@ -8874,7 +9754,7 @@
     </w:p>
     <w:p/>
     <w:sectPr>
-      <w:footerReference w:type="first" r:id="rId29"/>
+      <w:footerReference w:type="first" r:id="rId31"/>
       <w:pgSz w:w="11906" w:h="16838"/>
       <w:pgMar w:top="1418" w:right="851" w:bottom="1418" w:left="1418" w:header="709" w:footer="709" w:gutter="0"/>
       <w:pgNumType w:start="1"/>

</xml_diff>

<commit_message>
Frontend + Prototipação - Gerenciar prioridades
</commit_message>
<xml_diff>
--- a/Documentação/ERS.docx
+++ b/Documentação/ERS.docx
@@ -5759,14 +5759,17 @@
       </w:r>
     </w:p>
     <w:p>
+      <w:pPr>
+        <w:jc w:val="center"/>
+      </w:pPr>
       <w:r>
         <w:rPr>
           <w:noProof/>
         </w:rPr>
         <w:drawing>
-          <wp:inline distT="0" distB="0" distL="0" distR="0" wp14:anchorId="6273F143" wp14:editId="7F1ACE24">
-            <wp:extent cx="6119495" cy="3545840"/>
-            <wp:effectExtent l="0" t="0" r="0" b="0"/>
+          <wp:inline distT="0" distB="0" distL="0" distR="0" wp14:anchorId="6273F143" wp14:editId="206BF4FE">
+            <wp:extent cx="5385600" cy="3121200"/>
+            <wp:effectExtent l="0" t="0" r="5715" b="3175"/>
             <wp:docPr id="13" name="Imagem 13"/>
             <wp:cNvGraphicFramePr>
               <a:graphicFrameLocks xmlns:a="http://schemas.openxmlformats.org/drawingml/2006/main" noChangeAspect="1"/>
@@ -5787,7 +5790,7 @@
                   <pic:spPr>
                     <a:xfrm>
                       <a:off x="0" y="0"/>
-                      <a:ext cx="6119495" cy="3545840"/>
+                      <a:ext cx="5385600" cy="3121200"/>
                     </a:xfrm>
                     <a:prstGeom prst="rect">
                       <a:avLst/>
@@ -5800,6 +5803,8 @@
         </w:drawing>
       </w:r>
     </w:p>
+    <w:p/>
+    <w:p/>
     <w:p/>
     <w:p/>
     <w:p>
@@ -6295,39 +6300,7 @@
                 <w:sz w:val="20"/>
                 <w:szCs w:val="16"/>
               </w:rPr>
-              <w:t>visualização</w:t>
-            </w:r>
-            <w:r>
-              <w:rPr>
-                <w:rFonts w:eastAsia="Calibri"/>
-                <w:sz w:val="20"/>
-                <w:szCs w:val="16"/>
-              </w:rPr>
-              <w:t>/</w:t>
-            </w:r>
-            <w:r>
-              <w:rPr>
-                <w:rFonts w:eastAsia="Calibri"/>
-                <w:sz w:val="20"/>
-                <w:szCs w:val="16"/>
-              </w:rPr>
-              <w:t>edição/</w:t>
-            </w:r>
-            <w:r>
-              <w:rPr>
-                <w:rFonts w:eastAsia="Calibri"/>
-                <w:sz w:val="20"/>
-                <w:szCs w:val="16"/>
-              </w:rPr>
-              <w:t>inativação</w:t>
-            </w:r>
-            <w:r>
-              <w:rPr>
-                <w:rFonts w:eastAsia="Calibri"/>
-                <w:sz w:val="20"/>
-                <w:szCs w:val="16"/>
-              </w:rPr>
-              <w:t>/reativação</w:t>
+              <w:t>visualização/edição/inativação/reativação</w:t>
             </w:r>
             <w:r>
               <w:rPr>
@@ -6340,8 +6313,123 @@
           </w:p>
           <w:p>
             <w:pPr>
-              <w:pStyle w:val="PargrafodaLista"/>
-              <w:ind w:left="1440"/>
+              <w:rPr>
+                <w:rFonts w:ascii="Courier New" w:eastAsia="Courier New" w:hAnsi="Courier New" w:cs="Courier New"/>
+                <w:sz w:val="20"/>
+                <w:szCs w:val="16"/>
+              </w:rPr>
+            </w:pPr>
+          </w:p>
+          <w:p>
+            <w:pPr>
+              <w:rPr>
+                <w:rFonts w:ascii="Courier New" w:eastAsia="Courier New" w:hAnsi="Courier New" w:cs="Courier New"/>
+                <w:sz w:val="20"/>
+                <w:szCs w:val="16"/>
+              </w:rPr>
+            </w:pPr>
+          </w:p>
+          <w:p>
+            <w:pPr>
+              <w:rPr>
+                <w:rFonts w:ascii="Courier New" w:eastAsia="Courier New" w:hAnsi="Courier New" w:cs="Courier New"/>
+                <w:sz w:val="20"/>
+                <w:szCs w:val="16"/>
+              </w:rPr>
+            </w:pPr>
+          </w:p>
+          <w:p>
+            <w:pPr>
+              <w:rPr>
+                <w:rFonts w:ascii="Courier New" w:eastAsia="Courier New" w:hAnsi="Courier New" w:cs="Courier New"/>
+                <w:sz w:val="20"/>
+                <w:szCs w:val="16"/>
+              </w:rPr>
+            </w:pPr>
+          </w:p>
+          <w:p>
+            <w:pPr>
+              <w:rPr>
+                <w:rFonts w:ascii="Courier New" w:eastAsia="Courier New" w:hAnsi="Courier New" w:cs="Courier New"/>
+                <w:sz w:val="20"/>
+                <w:szCs w:val="16"/>
+              </w:rPr>
+            </w:pPr>
+          </w:p>
+          <w:p>
+            <w:pPr>
+              <w:rPr>
+                <w:rFonts w:ascii="Courier New" w:eastAsia="Courier New" w:hAnsi="Courier New" w:cs="Courier New"/>
+                <w:sz w:val="20"/>
+                <w:szCs w:val="16"/>
+              </w:rPr>
+            </w:pPr>
+          </w:p>
+          <w:p>
+            <w:pPr>
+              <w:rPr>
+                <w:rFonts w:ascii="Courier New" w:eastAsia="Courier New" w:hAnsi="Courier New" w:cs="Courier New"/>
+                <w:sz w:val="20"/>
+                <w:szCs w:val="16"/>
+              </w:rPr>
+            </w:pPr>
+          </w:p>
+          <w:p>
+            <w:pPr>
+              <w:rPr>
+                <w:rFonts w:ascii="Courier New" w:eastAsia="Courier New" w:hAnsi="Courier New" w:cs="Courier New"/>
+                <w:sz w:val="20"/>
+                <w:szCs w:val="16"/>
+              </w:rPr>
+            </w:pPr>
+          </w:p>
+          <w:p>
+            <w:pPr>
+              <w:rPr>
+                <w:rFonts w:ascii="Courier New" w:eastAsia="Courier New" w:hAnsi="Courier New" w:cs="Courier New"/>
+                <w:sz w:val="20"/>
+                <w:szCs w:val="16"/>
+              </w:rPr>
+            </w:pPr>
+          </w:p>
+          <w:p>
+            <w:pPr>
+              <w:rPr>
+                <w:rFonts w:ascii="Courier New" w:eastAsia="Courier New" w:hAnsi="Courier New" w:cs="Courier New"/>
+                <w:sz w:val="20"/>
+                <w:szCs w:val="16"/>
+              </w:rPr>
+            </w:pPr>
+          </w:p>
+          <w:p>
+            <w:pPr>
+              <w:rPr>
+                <w:rFonts w:ascii="Courier New" w:eastAsia="Courier New" w:hAnsi="Courier New" w:cs="Courier New"/>
+                <w:sz w:val="20"/>
+                <w:szCs w:val="16"/>
+              </w:rPr>
+            </w:pPr>
+          </w:p>
+          <w:p>
+            <w:pPr>
+              <w:rPr>
+                <w:rFonts w:ascii="Courier New" w:eastAsia="Courier New" w:hAnsi="Courier New" w:cs="Courier New"/>
+                <w:sz w:val="20"/>
+                <w:szCs w:val="16"/>
+              </w:rPr>
+            </w:pPr>
+          </w:p>
+          <w:p>
+            <w:pPr>
+              <w:rPr>
+                <w:rFonts w:ascii="Courier New" w:eastAsia="Courier New" w:hAnsi="Courier New" w:cs="Courier New"/>
+                <w:sz w:val="20"/>
+                <w:szCs w:val="16"/>
+              </w:rPr>
+            </w:pPr>
+          </w:p>
+          <w:p>
+            <w:pPr>
               <w:rPr>
                 <w:rFonts w:ascii="Courier New" w:eastAsia="Courier New" w:hAnsi="Courier New" w:cs="Courier New"/>
                 <w:sz w:val="20"/>
@@ -6367,6 +6455,7 @@
                 <w:sz w:val="20"/>
                 <w:szCs w:val="16"/>
               </w:rPr>
+              <w:lastRenderedPageBreak/>
               <w:t>Diagrama de Classe do Contexto</w:t>
             </w:r>
           </w:p>
@@ -6390,9 +6479,9 @@
                 <w:szCs w:val="16"/>
               </w:rPr>
               <w:drawing>
-                <wp:inline distT="0" distB="0" distL="0" distR="0" wp14:anchorId="24073358" wp14:editId="73C75A99">
-                  <wp:extent cx="3430800" cy="2700000"/>
-                  <wp:effectExtent l="0" t="0" r="0" b="5715"/>
+                <wp:inline distT="0" distB="0" distL="0" distR="0" wp14:anchorId="24073358" wp14:editId="3CA514E4">
+                  <wp:extent cx="4525200" cy="3560400"/>
+                  <wp:effectExtent l="0" t="0" r="8890" b="2540"/>
                   <wp:docPr id="47" name="Imagem 47"/>
                   <wp:cNvGraphicFramePr>
                     <a:graphicFrameLocks xmlns:a="http://schemas.openxmlformats.org/drawingml/2006/main" noChangeAspect="1"/>
@@ -6413,7 +6502,7 @@
                         <pic:spPr>
                           <a:xfrm>
                             <a:off x="0" y="0"/>
-                            <a:ext cx="3430800" cy="2700000"/>
+                            <a:ext cx="4525200" cy="3560400"/>
                           </a:xfrm>
                           <a:prstGeom prst="rect">
                             <a:avLst/>
@@ -6436,7 +6525,9 @@
                 <w:szCs w:val="16"/>
               </w:rPr>
             </w:pPr>
-            <w:r>
+          </w:p>
+          <w:p>
+            <w:pPr>
               <w:rPr>
                 <w:rFonts w:eastAsia="Calibri"/>
                 <w:b/>
@@ -6444,7 +6535,15 @@
                 <w:sz w:val="20"/>
                 <w:szCs w:val="16"/>
               </w:rPr>
-              <w:lastRenderedPageBreak/>
+            </w:pPr>
+            <w:r>
+              <w:rPr>
+                <w:rFonts w:eastAsia="Calibri"/>
+                <w:b/>
+                <w:bCs/>
+                <w:sz w:val="20"/>
+                <w:szCs w:val="16"/>
+              </w:rPr>
               <w:t>Diagrama de ER do Contexto</w:t>
             </w:r>
           </w:p>
@@ -6465,9 +6564,9 @@
                 <w:szCs w:val="16"/>
               </w:rPr>
               <w:drawing>
-                <wp:inline distT="0" distB="0" distL="0" distR="0" wp14:anchorId="3A54071A" wp14:editId="368E59EC">
-                  <wp:extent cx="3603600" cy="2700000"/>
-                  <wp:effectExtent l="0" t="0" r="0" b="5715"/>
+                <wp:inline distT="0" distB="0" distL="0" distR="0" wp14:anchorId="3A54071A" wp14:editId="4C5BF42C">
+                  <wp:extent cx="4806000" cy="3600000"/>
+                  <wp:effectExtent l="0" t="0" r="0" b="635"/>
                   <wp:docPr id="1" name="Imagem 1"/>
                   <wp:cNvGraphicFramePr>
                     <a:graphicFrameLocks xmlns:a="http://schemas.openxmlformats.org/drawingml/2006/main" noChangeAspect="1"/>
@@ -6488,7 +6587,7 @@
                         <pic:spPr>
                           <a:xfrm>
                             <a:off x="0" y="0"/>
-                            <a:ext cx="3603600" cy="2700000"/>
+                            <a:ext cx="4806000" cy="3600000"/>
                           </a:xfrm>
                           <a:prstGeom prst="rect">
                             <a:avLst/>
@@ -6522,7 +6621,9 @@
                 <w:szCs w:val="16"/>
               </w:rPr>
             </w:pPr>
-            <w:r>
+          </w:p>
+          <w:p>
+            <w:pPr>
               <w:rPr>
                 <w:rFonts w:eastAsia="Calibri"/>
                 <w:b/>
@@ -6530,6 +6631,27 @@
                 <w:sz w:val="20"/>
                 <w:szCs w:val="16"/>
               </w:rPr>
+            </w:pPr>
+          </w:p>
+          <w:p>
+            <w:pPr>
+              <w:rPr>
+                <w:rFonts w:eastAsia="Calibri"/>
+                <w:b/>
+                <w:bCs/>
+                <w:sz w:val="20"/>
+                <w:szCs w:val="16"/>
+              </w:rPr>
+            </w:pPr>
+            <w:r>
+              <w:rPr>
+                <w:rFonts w:eastAsia="Calibri"/>
+                <w:b/>
+                <w:bCs/>
+                <w:sz w:val="20"/>
+                <w:szCs w:val="16"/>
+              </w:rPr>
+              <w:lastRenderedPageBreak/>
               <w:t>Detalhamento com protótipo</w:t>
             </w:r>
           </w:p>
@@ -6573,8 +6695,8 @@
                 <w:szCs w:val="16"/>
               </w:rPr>
               <w:drawing>
-                <wp:inline distT="0" distB="0" distL="0" distR="0" wp14:anchorId="631554A8" wp14:editId="0E1C7E91">
-                  <wp:extent cx="3967200" cy="2700000"/>
+                <wp:inline distT="0" distB="0" distL="0" distR="0" wp14:anchorId="631554A8" wp14:editId="4E06A72E">
+                  <wp:extent cx="5227200" cy="3556800"/>
                   <wp:effectExtent l="0" t="0" r="0" b="5715"/>
                   <wp:docPr id="10" name="Imagem 10"/>
                   <wp:cNvGraphicFramePr>
@@ -6596,7 +6718,7 @@
                         <pic:spPr>
                           <a:xfrm>
                             <a:off x="0" y="0"/>
-                            <a:ext cx="3967200" cy="2700000"/>
+                            <a:ext cx="5227200" cy="3556800"/>
                           </a:xfrm>
                           <a:prstGeom prst="rect">
                             <a:avLst/>
@@ -6623,105 +6745,6 @@
           <w:p>
             <w:pPr>
               <w:pStyle w:val="PargrafodaLista"/>
-              <w:jc w:val="center"/>
-              <w:rPr>
-                <w:rFonts w:eastAsia="Noto Sans Symbols"/>
-                <w:sz w:val="20"/>
-                <w:szCs w:val="16"/>
-              </w:rPr>
-            </w:pPr>
-          </w:p>
-          <w:p>
-            <w:pPr>
-              <w:pStyle w:val="PargrafodaLista"/>
-              <w:jc w:val="center"/>
-              <w:rPr>
-                <w:rFonts w:eastAsia="Noto Sans Symbols"/>
-                <w:sz w:val="20"/>
-                <w:szCs w:val="16"/>
-              </w:rPr>
-            </w:pPr>
-          </w:p>
-          <w:p>
-            <w:pPr>
-              <w:pStyle w:val="PargrafodaLista"/>
-              <w:jc w:val="center"/>
-              <w:rPr>
-                <w:rFonts w:eastAsia="Noto Sans Symbols"/>
-                <w:sz w:val="20"/>
-                <w:szCs w:val="16"/>
-              </w:rPr>
-            </w:pPr>
-          </w:p>
-          <w:p>
-            <w:pPr>
-              <w:pStyle w:val="PargrafodaLista"/>
-              <w:jc w:val="center"/>
-              <w:rPr>
-                <w:rFonts w:eastAsia="Noto Sans Symbols"/>
-                <w:sz w:val="20"/>
-                <w:szCs w:val="16"/>
-              </w:rPr>
-            </w:pPr>
-          </w:p>
-          <w:p>
-            <w:pPr>
-              <w:pStyle w:val="PargrafodaLista"/>
-              <w:jc w:val="center"/>
-              <w:rPr>
-                <w:rFonts w:eastAsia="Noto Sans Symbols"/>
-                <w:sz w:val="20"/>
-                <w:szCs w:val="16"/>
-              </w:rPr>
-            </w:pPr>
-          </w:p>
-          <w:p>
-            <w:pPr>
-              <w:pStyle w:val="PargrafodaLista"/>
-              <w:jc w:val="center"/>
-              <w:rPr>
-                <w:rFonts w:eastAsia="Noto Sans Symbols"/>
-                <w:sz w:val="20"/>
-                <w:szCs w:val="16"/>
-              </w:rPr>
-            </w:pPr>
-          </w:p>
-          <w:p>
-            <w:pPr>
-              <w:pStyle w:val="PargrafodaLista"/>
-              <w:jc w:val="center"/>
-              <w:rPr>
-                <w:rFonts w:eastAsia="Noto Sans Symbols"/>
-                <w:sz w:val="20"/>
-                <w:szCs w:val="16"/>
-              </w:rPr>
-            </w:pPr>
-          </w:p>
-          <w:p>
-            <w:pPr>
-              <w:pStyle w:val="PargrafodaLista"/>
-              <w:jc w:val="center"/>
-              <w:rPr>
-                <w:rFonts w:eastAsia="Noto Sans Symbols"/>
-                <w:sz w:val="20"/>
-                <w:szCs w:val="16"/>
-              </w:rPr>
-            </w:pPr>
-          </w:p>
-          <w:p>
-            <w:pPr>
-              <w:pStyle w:val="PargrafodaLista"/>
-              <w:jc w:val="center"/>
-              <w:rPr>
-                <w:rFonts w:eastAsia="Noto Sans Symbols"/>
-                <w:sz w:val="20"/>
-                <w:szCs w:val="16"/>
-              </w:rPr>
-            </w:pPr>
-          </w:p>
-          <w:p>
-            <w:pPr>
-              <w:pStyle w:val="PargrafodaLista"/>
               <w:numPr>
                 <w:ilvl w:val="0"/>
                 <w:numId w:val="8"/>
@@ -6738,7 +6761,6 @@
                 <w:sz w:val="20"/>
                 <w:szCs w:val="16"/>
               </w:rPr>
-              <w:lastRenderedPageBreak/>
               <w:t>Listagem de setores em forma de lista</w:t>
             </w:r>
           </w:p>
@@ -6760,9 +6782,9 @@
                 <w:szCs w:val="16"/>
               </w:rPr>
               <w:drawing>
-                <wp:inline distT="0" distB="0" distL="0" distR="0" wp14:anchorId="2660B147" wp14:editId="42F93CB4">
-                  <wp:extent cx="4633200" cy="2700000"/>
-                  <wp:effectExtent l="0" t="0" r="0" b="5715"/>
+                <wp:inline distT="0" distB="0" distL="0" distR="0" wp14:anchorId="2660B147" wp14:editId="2027CC2B">
+                  <wp:extent cx="5306400" cy="3092400"/>
+                  <wp:effectExtent l="0" t="0" r="0" b="0"/>
                   <wp:docPr id="11" name="Imagem 11"/>
                   <wp:cNvGraphicFramePr>
                     <a:graphicFrameLocks xmlns:a="http://schemas.openxmlformats.org/drawingml/2006/main" noChangeAspect="1"/>
@@ -6783,7 +6805,7 @@
                         <pic:spPr>
                           <a:xfrm>
                             <a:off x="0" y="0"/>
-                            <a:ext cx="4633200" cy="2700000"/>
+                            <a:ext cx="5306400" cy="3092400"/>
                           </a:xfrm>
                           <a:prstGeom prst="rect">
                             <a:avLst/>
@@ -6810,6 +6832,50 @@
           <w:p>
             <w:pPr>
               <w:pStyle w:val="PargrafodaLista"/>
+              <w:jc w:val="center"/>
+              <w:rPr>
+                <w:rFonts w:eastAsia="Noto Sans Symbols"/>
+                <w:sz w:val="20"/>
+                <w:szCs w:val="16"/>
+              </w:rPr>
+            </w:pPr>
+          </w:p>
+          <w:p>
+            <w:pPr>
+              <w:pStyle w:val="PargrafodaLista"/>
+              <w:jc w:val="center"/>
+              <w:rPr>
+                <w:rFonts w:eastAsia="Noto Sans Symbols"/>
+                <w:sz w:val="20"/>
+                <w:szCs w:val="16"/>
+              </w:rPr>
+            </w:pPr>
+          </w:p>
+          <w:p>
+            <w:pPr>
+              <w:pStyle w:val="PargrafodaLista"/>
+              <w:jc w:val="center"/>
+              <w:rPr>
+                <w:rFonts w:eastAsia="Noto Sans Symbols"/>
+                <w:sz w:val="20"/>
+                <w:szCs w:val="16"/>
+              </w:rPr>
+            </w:pPr>
+          </w:p>
+          <w:p>
+            <w:pPr>
+              <w:pStyle w:val="PargrafodaLista"/>
+              <w:jc w:val="center"/>
+              <w:rPr>
+                <w:rFonts w:eastAsia="Noto Sans Symbols"/>
+                <w:sz w:val="20"/>
+                <w:szCs w:val="16"/>
+              </w:rPr>
+            </w:pPr>
+          </w:p>
+          <w:p>
+            <w:pPr>
+              <w:pStyle w:val="PargrafodaLista"/>
               <w:numPr>
                 <w:ilvl w:val="0"/>
                 <w:numId w:val="8"/>
@@ -6826,6 +6892,7 @@
                 <w:sz w:val="20"/>
                 <w:szCs w:val="16"/>
               </w:rPr>
+              <w:lastRenderedPageBreak/>
               <w:t>Modal de cadastro do setor</w:t>
             </w:r>
           </w:p>
@@ -6849,9 +6916,9 @@
                 <w:szCs w:val="16"/>
               </w:rPr>
               <w:drawing>
-                <wp:inline distT="0" distB="0" distL="0" distR="0" wp14:anchorId="5E9DB6E2" wp14:editId="6E9AA572">
-                  <wp:extent cx="2772000" cy="2700000"/>
-                  <wp:effectExtent l="0" t="0" r="0" b="5715"/>
+                <wp:inline distT="0" distB="0" distL="0" distR="0" wp14:anchorId="5E9DB6E2" wp14:editId="1B8F6938">
+                  <wp:extent cx="3682800" cy="3585600"/>
+                  <wp:effectExtent l="0" t="0" r="0" b="0"/>
                   <wp:docPr id="17" name="Imagem 17"/>
                   <wp:cNvGraphicFramePr>
                     <a:graphicFrameLocks xmlns:a="http://schemas.openxmlformats.org/drawingml/2006/main" noChangeAspect="1"/>
@@ -6872,7 +6939,7 @@
                         <pic:spPr>
                           <a:xfrm>
                             <a:off x="0" y="0"/>
-                            <a:ext cx="2772000" cy="2700000"/>
+                            <a:ext cx="3682800" cy="3585600"/>
                           </a:xfrm>
                           <a:prstGeom prst="rect">
                             <a:avLst/>
@@ -6900,126 +6967,6 @@
           <w:p>
             <w:pPr>
               <w:pStyle w:val="PargrafodaLista"/>
-              <w:jc w:val="center"/>
-              <w:rPr>
-                <w:rFonts w:eastAsia="Noto Sans Symbols"/>
-                <w:color w:val="FF0000"/>
-                <w:sz w:val="20"/>
-                <w:szCs w:val="16"/>
-              </w:rPr>
-            </w:pPr>
-          </w:p>
-          <w:p>
-            <w:pPr>
-              <w:pStyle w:val="PargrafodaLista"/>
-              <w:jc w:val="center"/>
-              <w:rPr>
-                <w:rFonts w:eastAsia="Noto Sans Symbols"/>
-                <w:color w:val="FF0000"/>
-                <w:sz w:val="20"/>
-                <w:szCs w:val="16"/>
-              </w:rPr>
-            </w:pPr>
-          </w:p>
-          <w:p>
-            <w:pPr>
-              <w:pStyle w:val="PargrafodaLista"/>
-              <w:jc w:val="center"/>
-              <w:rPr>
-                <w:rFonts w:eastAsia="Noto Sans Symbols"/>
-                <w:color w:val="FF0000"/>
-                <w:sz w:val="20"/>
-                <w:szCs w:val="16"/>
-              </w:rPr>
-            </w:pPr>
-          </w:p>
-          <w:p>
-            <w:pPr>
-              <w:pStyle w:val="PargrafodaLista"/>
-              <w:jc w:val="center"/>
-              <w:rPr>
-                <w:rFonts w:eastAsia="Noto Sans Symbols"/>
-                <w:color w:val="FF0000"/>
-                <w:sz w:val="20"/>
-                <w:szCs w:val="16"/>
-              </w:rPr>
-            </w:pPr>
-          </w:p>
-          <w:p>
-            <w:pPr>
-              <w:pStyle w:val="PargrafodaLista"/>
-              <w:jc w:val="center"/>
-              <w:rPr>
-                <w:rFonts w:eastAsia="Noto Sans Symbols"/>
-                <w:color w:val="FF0000"/>
-                <w:sz w:val="20"/>
-                <w:szCs w:val="16"/>
-              </w:rPr>
-            </w:pPr>
-          </w:p>
-          <w:p>
-            <w:pPr>
-              <w:pStyle w:val="PargrafodaLista"/>
-              <w:jc w:val="center"/>
-              <w:rPr>
-                <w:rFonts w:eastAsia="Noto Sans Symbols"/>
-                <w:color w:val="FF0000"/>
-                <w:sz w:val="20"/>
-                <w:szCs w:val="16"/>
-              </w:rPr>
-            </w:pPr>
-          </w:p>
-          <w:p>
-            <w:pPr>
-              <w:pStyle w:val="PargrafodaLista"/>
-              <w:jc w:val="center"/>
-              <w:rPr>
-                <w:rFonts w:eastAsia="Noto Sans Symbols"/>
-                <w:color w:val="FF0000"/>
-                <w:sz w:val="20"/>
-                <w:szCs w:val="16"/>
-              </w:rPr>
-            </w:pPr>
-          </w:p>
-          <w:p>
-            <w:pPr>
-              <w:pStyle w:val="PargrafodaLista"/>
-              <w:jc w:val="center"/>
-              <w:rPr>
-                <w:rFonts w:eastAsia="Noto Sans Symbols"/>
-                <w:color w:val="FF0000"/>
-                <w:sz w:val="20"/>
-                <w:szCs w:val="16"/>
-              </w:rPr>
-            </w:pPr>
-          </w:p>
-          <w:p>
-            <w:pPr>
-              <w:pStyle w:val="PargrafodaLista"/>
-              <w:jc w:val="center"/>
-              <w:rPr>
-                <w:rFonts w:eastAsia="Noto Sans Symbols"/>
-                <w:color w:val="FF0000"/>
-                <w:sz w:val="20"/>
-                <w:szCs w:val="16"/>
-              </w:rPr>
-            </w:pPr>
-          </w:p>
-          <w:p>
-            <w:pPr>
-              <w:pStyle w:val="PargrafodaLista"/>
-              <w:jc w:val="center"/>
-              <w:rPr>
-                <w:rFonts w:eastAsia="Noto Sans Symbols"/>
-                <w:color w:val="FF0000"/>
-                <w:sz w:val="20"/>
-                <w:szCs w:val="16"/>
-              </w:rPr>
-            </w:pPr>
-          </w:p>
-          <w:p>
-            <w:pPr>
-              <w:pStyle w:val="PargrafodaLista"/>
               <w:numPr>
                 <w:ilvl w:val="0"/>
                 <w:numId w:val="8"/>
@@ -7036,7 +6983,6 @@
                 <w:sz w:val="20"/>
                 <w:szCs w:val="16"/>
               </w:rPr>
-              <w:lastRenderedPageBreak/>
               <w:t>Modal</w:t>
             </w:r>
             <w:r>
@@ -7074,9 +7020,9 @@
                 <w:szCs w:val="16"/>
               </w:rPr>
               <w:drawing>
-                <wp:inline distT="0" distB="0" distL="0" distR="0" wp14:anchorId="281B2076" wp14:editId="1E30E38F">
-                  <wp:extent cx="2530800" cy="2700000"/>
-                  <wp:effectExtent l="0" t="0" r="3175" b="5715"/>
+                <wp:inline distT="0" distB="0" distL="0" distR="0" wp14:anchorId="281B2076" wp14:editId="64F1F357">
+                  <wp:extent cx="3358800" cy="3582000"/>
+                  <wp:effectExtent l="0" t="0" r="0" b="0"/>
                   <wp:docPr id="14" name="Imagem 14"/>
                   <wp:cNvGraphicFramePr>
                     <a:graphicFrameLocks xmlns:a="http://schemas.openxmlformats.org/drawingml/2006/main" noChangeAspect="1"/>
@@ -7097,7 +7043,7 @@
                         <pic:spPr>
                           <a:xfrm>
                             <a:off x="0" y="0"/>
-                            <a:ext cx="2530800" cy="2700000"/>
+                            <a:ext cx="3358800" cy="3582000"/>
                           </a:xfrm>
                           <a:prstGeom prst="rect">
                             <a:avLst/>
@@ -7124,6 +7070,28 @@
           <w:p>
             <w:pPr>
               <w:pStyle w:val="PargrafodaLista"/>
+              <w:jc w:val="center"/>
+              <w:rPr>
+                <w:rFonts w:eastAsia="Noto Sans Symbols"/>
+                <w:sz w:val="20"/>
+                <w:szCs w:val="16"/>
+              </w:rPr>
+            </w:pPr>
+          </w:p>
+          <w:p>
+            <w:pPr>
+              <w:pStyle w:val="PargrafodaLista"/>
+              <w:jc w:val="center"/>
+              <w:rPr>
+                <w:rFonts w:eastAsia="Noto Sans Symbols"/>
+                <w:sz w:val="20"/>
+                <w:szCs w:val="16"/>
+              </w:rPr>
+            </w:pPr>
+          </w:p>
+          <w:p>
+            <w:pPr>
+              <w:pStyle w:val="PargrafodaLista"/>
               <w:numPr>
                 <w:ilvl w:val="0"/>
                 <w:numId w:val="8"/>
@@ -7140,6 +7108,7 @@
                 <w:sz w:val="20"/>
                 <w:szCs w:val="16"/>
               </w:rPr>
+              <w:lastRenderedPageBreak/>
               <w:t>Modal de alteração do cadastro do setor</w:t>
             </w:r>
           </w:p>
@@ -7163,9 +7132,9 @@
                 <w:szCs w:val="16"/>
               </w:rPr>
               <w:drawing>
-                <wp:inline distT="0" distB="0" distL="0" distR="0" wp14:anchorId="3E82E30A" wp14:editId="5496B379">
-                  <wp:extent cx="2782800" cy="2700000"/>
-                  <wp:effectExtent l="0" t="0" r="0" b="5715"/>
+                <wp:inline distT="0" distB="0" distL="0" distR="0" wp14:anchorId="3E82E30A" wp14:editId="382D2A53">
+                  <wp:extent cx="3682800" cy="3567600"/>
+                  <wp:effectExtent l="0" t="0" r="0" b="0"/>
                   <wp:docPr id="19" name="Imagem 19"/>
                   <wp:cNvGraphicFramePr>
                     <a:graphicFrameLocks xmlns:a="http://schemas.openxmlformats.org/drawingml/2006/main" noChangeAspect="1"/>
@@ -7177,20 +7146,27 @@
                           <pic:cNvPr id="1" name=""/>
                           <pic:cNvPicPr/>
                         </pic:nvPicPr>
-                        <pic:blipFill>
+                        <pic:blipFill rotWithShape="1">
                           <a:blip r:embed="rId21"/>
-                          <a:stretch>
-                            <a:fillRect/>
-                          </a:stretch>
+                          <a:srcRect l="3714" t="4038" r="2597" b="2428"/>
+                          <a:stretch/>
                         </pic:blipFill>
-                        <pic:spPr>
+                        <pic:spPr bwMode="auto">
                           <a:xfrm>
                             <a:off x="0" y="0"/>
-                            <a:ext cx="2782800" cy="2700000"/>
+                            <a:ext cx="3682800" cy="3567600"/>
                           </a:xfrm>
                           <a:prstGeom prst="rect">
                             <a:avLst/>
                           </a:prstGeom>
+                          <a:ln>
+                            <a:noFill/>
+                          </a:ln>
+                          <a:extLst>
+                            <a:ext uri="{53640926-AAD7-44D8-BBD7-CCE9431645EC}">
+                              <a14:shadowObscured xmlns:a14="http://schemas.microsoft.com/office/drawing/2010/main"/>
+                            </a:ext>
+                          </a:extLst>
                         </pic:spPr>
                       </pic:pic>
                     </a:graphicData>
@@ -7213,116 +7189,6 @@
           <w:p>
             <w:pPr>
               <w:pStyle w:val="PargrafodaLista"/>
-              <w:jc w:val="center"/>
-              <w:rPr>
-                <w:rFonts w:eastAsia="Noto Sans Symbols"/>
-                <w:sz w:val="20"/>
-                <w:szCs w:val="16"/>
-              </w:rPr>
-            </w:pPr>
-          </w:p>
-          <w:p>
-            <w:pPr>
-              <w:pStyle w:val="PargrafodaLista"/>
-              <w:jc w:val="center"/>
-              <w:rPr>
-                <w:rFonts w:eastAsia="Noto Sans Symbols"/>
-                <w:sz w:val="20"/>
-                <w:szCs w:val="16"/>
-              </w:rPr>
-            </w:pPr>
-          </w:p>
-          <w:p>
-            <w:pPr>
-              <w:pStyle w:val="PargrafodaLista"/>
-              <w:jc w:val="center"/>
-              <w:rPr>
-                <w:rFonts w:eastAsia="Noto Sans Symbols"/>
-                <w:sz w:val="20"/>
-                <w:szCs w:val="16"/>
-              </w:rPr>
-            </w:pPr>
-          </w:p>
-          <w:p>
-            <w:pPr>
-              <w:pStyle w:val="PargrafodaLista"/>
-              <w:jc w:val="center"/>
-              <w:rPr>
-                <w:rFonts w:eastAsia="Noto Sans Symbols"/>
-                <w:sz w:val="20"/>
-                <w:szCs w:val="16"/>
-              </w:rPr>
-            </w:pPr>
-          </w:p>
-          <w:p>
-            <w:pPr>
-              <w:pStyle w:val="PargrafodaLista"/>
-              <w:jc w:val="center"/>
-              <w:rPr>
-                <w:rFonts w:eastAsia="Noto Sans Symbols"/>
-                <w:sz w:val="20"/>
-                <w:szCs w:val="16"/>
-              </w:rPr>
-            </w:pPr>
-          </w:p>
-          <w:p>
-            <w:pPr>
-              <w:pStyle w:val="PargrafodaLista"/>
-              <w:jc w:val="center"/>
-              <w:rPr>
-                <w:rFonts w:eastAsia="Noto Sans Symbols"/>
-                <w:sz w:val="20"/>
-                <w:szCs w:val="16"/>
-              </w:rPr>
-            </w:pPr>
-          </w:p>
-          <w:p>
-            <w:pPr>
-              <w:pStyle w:val="PargrafodaLista"/>
-              <w:jc w:val="center"/>
-              <w:rPr>
-                <w:rFonts w:eastAsia="Noto Sans Symbols"/>
-                <w:sz w:val="20"/>
-                <w:szCs w:val="16"/>
-              </w:rPr>
-            </w:pPr>
-          </w:p>
-          <w:p>
-            <w:pPr>
-              <w:pStyle w:val="PargrafodaLista"/>
-              <w:jc w:val="center"/>
-              <w:rPr>
-                <w:rFonts w:eastAsia="Noto Sans Symbols"/>
-                <w:sz w:val="20"/>
-                <w:szCs w:val="16"/>
-              </w:rPr>
-            </w:pPr>
-          </w:p>
-          <w:p>
-            <w:pPr>
-              <w:pStyle w:val="PargrafodaLista"/>
-              <w:jc w:val="center"/>
-              <w:rPr>
-                <w:rFonts w:eastAsia="Noto Sans Symbols"/>
-                <w:sz w:val="20"/>
-                <w:szCs w:val="16"/>
-              </w:rPr>
-            </w:pPr>
-          </w:p>
-          <w:p>
-            <w:pPr>
-              <w:pStyle w:val="PargrafodaLista"/>
-              <w:jc w:val="center"/>
-              <w:rPr>
-                <w:rFonts w:eastAsia="Noto Sans Symbols"/>
-                <w:sz w:val="20"/>
-                <w:szCs w:val="16"/>
-              </w:rPr>
-            </w:pPr>
-          </w:p>
-          <w:p>
-            <w:pPr>
-              <w:pStyle w:val="PargrafodaLista"/>
               <w:numPr>
                 <w:ilvl w:val="0"/>
                 <w:numId w:val="8"/>
@@ -7339,7 +7205,6 @@
                 <w:sz w:val="20"/>
                 <w:szCs w:val="16"/>
               </w:rPr>
-              <w:lastRenderedPageBreak/>
               <w:t>Modal de confirmação de exclusão do cadastro do setor</w:t>
             </w:r>
           </w:p>
@@ -7348,6 +7213,17 @@
               <w:jc w:val="center"/>
               <w:rPr>
                 <w:rFonts w:eastAsia="Noto Sans Symbols"/>
+                <w:noProof/>
+                <w:sz w:val="20"/>
+                <w:szCs w:val="16"/>
+              </w:rPr>
+            </w:pPr>
+          </w:p>
+          <w:p>
+            <w:pPr>
+              <w:jc w:val="center"/>
+              <w:rPr>
+                <w:rFonts w:eastAsia="Noto Sans Symbols"/>
                 <w:sz w:val="20"/>
                 <w:szCs w:val="16"/>
               </w:rPr>
@@ -7360,9 +7236,9 @@
                 <w:szCs w:val="16"/>
               </w:rPr>
               <w:drawing>
-                <wp:inline distT="0" distB="0" distL="0" distR="0" wp14:anchorId="4C31E869" wp14:editId="769572BC">
-                  <wp:extent cx="5824800" cy="2520000"/>
-                  <wp:effectExtent l="0" t="0" r="5080" b="0"/>
+                <wp:inline distT="0" distB="0" distL="0" distR="0" wp14:anchorId="4C31E869" wp14:editId="01769249">
+                  <wp:extent cx="5356800" cy="2077200"/>
+                  <wp:effectExtent l="0" t="0" r="0" b="0"/>
                   <wp:docPr id="18" name="Imagem 18"/>
                   <wp:cNvGraphicFramePr>
                     <a:graphicFrameLocks xmlns:a="http://schemas.openxmlformats.org/drawingml/2006/main" noChangeAspect="1"/>
@@ -7374,20 +7250,27 @@
                           <pic:cNvPr id="1" name=""/>
                           <pic:cNvPicPr/>
                         </pic:nvPicPr>
-                        <pic:blipFill>
+                        <pic:blipFill rotWithShape="1">
                           <a:blip r:embed="rId22"/>
-                          <a:stretch>
-                            <a:fillRect/>
-                          </a:stretch>
+                          <a:srcRect l="1693" t="8809" r="3304" b="6037"/>
+                          <a:stretch/>
                         </pic:blipFill>
-                        <pic:spPr>
+                        <pic:spPr bwMode="auto">
                           <a:xfrm>
                             <a:off x="0" y="0"/>
-                            <a:ext cx="5824800" cy="2520000"/>
+                            <a:ext cx="5356800" cy="2077200"/>
                           </a:xfrm>
                           <a:prstGeom prst="rect">
                             <a:avLst/>
                           </a:prstGeom>
+                          <a:ln>
+                            <a:noFill/>
+                          </a:ln>
+                          <a:extLst>
+                            <a:ext uri="{53640926-AAD7-44D8-BBD7-CCE9431645EC}">
+                              <a14:shadowObscured xmlns:a14="http://schemas.microsoft.com/office/drawing/2010/main"/>
+                            </a:ext>
+                          </a:extLst>
                         </pic:spPr>
                       </pic:pic>
                     </a:graphicData>
@@ -7398,6 +7281,95 @@
           </w:p>
           <w:p>
             <w:pPr>
+              <w:jc w:val="center"/>
+              <w:rPr>
+                <w:rFonts w:eastAsia="Noto Sans Symbols"/>
+                <w:sz w:val="20"/>
+                <w:szCs w:val="16"/>
+              </w:rPr>
+            </w:pPr>
+          </w:p>
+          <w:p>
+            <w:pPr>
+              <w:jc w:val="center"/>
+              <w:rPr>
+                <w:rFonts w:eastAsia="Noto Sans Symbols"/>
+                <w:sz w:val="20"/>
+                <w:szCs w:val="16"/>
+              </w:rPr>
+            </w:pPr>
+          </w:p>
+          <w:p>
+            <w:pPr>
+              <w:jc w:val="center"/>
+              <w:rPr>
+                <w:rFonts w:eastAsia="Noto Sans Symbols"/>
+                <w:sz w:val="20"/>
+                <w:szCs w:val="16"/>
+              </w:rPr>
+            </w:pPr>
+          </w:p>
+          <w:p>
+            <w:pPr>
+              <w:jc w:val="center"/>
+              <w:rPr>
+                <w:rFonts w:eastAsia="Noto Sans Symbols"/>
+                <w:sz w:val="20"/>
+                <w:szCs w:val="16"/>
+              </w:rPr>
+            </w:pPr>
+          </w:p>
+          <w:p>
+            <w:pPr>
+              <w:jc w:val="center"/>
+              <w:rPr>
+                <w:rFonts w:eastAsia="Noto Sans Symbols"/>
+                <w:sz w:val="20"/>
+                <w:szCs w:val="16"/>
+              </w:rPr>
+            </w:pPr>
+          </w:p>
+          <w:p>
+            <w:pPr>
+              <w:jc w:val="center"/>
+              <w:rPr>
+                <w:rFonts w:eastAsia="Noto Sans Symbols"/>
+                <w:sz w:val="20"/>
+                <w:szCs w:val="16"/>
+              </w:rPr>
+            </w:pPr>
+          </w:p>
+          <w:p>
+            <w:pPr>
+              <w:jc w:val="center"/>
+              <w:rPr>
+                <w:rFonts w:eastAsia="Noto Sans Symbols"/>
+                <w:sz w:val="20"/>
+                <w:szCs w:val="16"/>
+              </w:rPr>
+            </w:pPr>
+          </w:p>
+          <w:p>
+            <w:pPr>
+              <w:jc w:val="center"/>
+              <w:rPr>
+                <w:rFonts w:eastAsia="Noto Sans Symbols"/>
+                <w:sz w:val="20"/>
+                <w:szCs w:val="16"/>
+              </w:rPr>
+            </w:pPr>
+          </w:p>
+          <w:p>
+            <w:pPr>
+              <w:rPr>
+                <w:rFonts w:eastAsia="Noto Sans Symbols"/>
+                <w:sz w:val="20"/>
+                <w:szCs w:val="16"/>
+              </w:rPr>
+            </w:pPr>
+          </w:p>
+          <w:p>
+            <w:pPr>
               <w:pStyle w:val="PargrafodaLista"/>
               <w:numPr>
                 <w:ilvl w:val="0"/>
@@ -7415,6 +7387,7 @@
                 <w:sz w:val="20"/>
                 <w:szCs w:val="16"/>
               </w:rPr>
+              <w:lastRenderedPageBreak/>
               <w:t>Modal de mensagem caso tente excluir um setor atribuído a uma tarefa ativa</w:t>
             </w:r>
           </w:p>
@@ -7436,9 +7409,9 @@
                 <w:szCs w:val="16"/>
               </w:rPr>
               <w:drawing>
-                <wp:inline distT="0" distB="0" distL="0" distR="0" wp14:anchorId="76CE1E02" wp14:editId="24017724">
-                  <wp:extent cx="4118400" cy="2520000"/>
-                  <wp:effectExtent l="0" t="0" r="0" b="0"/>
+                <wp:inline distT="0" distB="0" distL="0" distR="0" wp14:anchorId="76CE1E02" wp14:editId="4306DEA8">
+                  <wp:extent cx="5392800" cy="3078000"/>
+                  <wp:effectExtent l="0" t="0" r="0" b="8255"/>
                   <wp:docPr id="20" name="Imagem 20"/>
                   <wp:cNvGraphicFramePr>
                     <a:graphicFrameLocks xmlns:a="http://schemas.openxmlformats.org/drawingml/2006/main" noChangeAspect="1"/>
@@ -7450,20 +7423,27 @@
                           <pic:cNvPr id="1" name=""/>
                           <pic:cNvPicPr/>
                         </pic:nvPicPr>
-                        <pic:blipFill>
+                        <pic:blipFill rotWithShape="1">
                           <a:blip r:embed="rId23"/>
-                          <a:stretch>
-                            <a:fillRect/>
-                          </a:stretch>
+                          <a:srcRect l="2268" t="7182" r="2445" b="3937"/>
+                          <a:stretch/>
                         </pic:blipFill>
-                        <pic:spPr>
+                        <pic:spPr bwMode="auto">
                           <a:xfrm>
                             <a:off x="0" y="0"/>
-                            <a:ext cx="4118400" cy="2520000"/>
+                            <a:ext cx="5392800" cy="3078000"/>
                           </a:xfrm>
                           <a:prstGeom prst="rect">
                             <a:avLst/>
                           </a:prstGeom>
+                          <a:ln>
+                            <a:noFill/>
+                          </a:ln>
+                          <a:extLst>
+                            <a:ext uri="{53640926-AAD7-44D8-BBD7-CCE9431645EC}">
+                              <a14:shadowObscured xmlns:a14="http://schemas.microsoft.com/office/drawing/2010/main"/>
+                            </a:ext>
+                          </a:extLst>
                         </pic:spPr>
                       </pic:pic>
                     </a:graphicData>
@@ -8200,7 +8180,7 @@
                 <w:szCs w:val="16"/>
               </w:rPr>
               <w:drawing>
-                <wp:inline distT="0" distB="0" distL="0" distR="0" wp14:anchorId="1C0E89A9" wp14:editId="1820284A">
+                <wp:inline distT="0" distB="0" distL="0" distR="0" wp14:anchorId="1C0E89A9" wp14:editId="682398F6">
                   <wp:extent cx="5392800" cy="2700000"/>
                   <wp:effectExtent l="0" t="0" r="0" b="5715"/>
                   <wp:docPr id="46" name="Imagem 46"/>
@@ -8290,9 +8270,9 @@
                 <w:szCs w:val="16"/>
               </w:rPr>
               <w:drawing>
-                <wp:inline distT="0" distB="0" distL="0" distR="0" wp14:anchorId="0C514572" wp14:editId="06B610E7">
-                  <wp:extent cx="2196000" cy="2700000"/>
-                  <wp:effectExtent l="0" t="0" r="0" b="5715"/>
+                <wp:inline distT="0" distB="0" distL="0" distR="0" wp14:anchorId="0C514572" wp14:editId="38AFFD98">
+                  <wp:extent cx="2926800" cy="3600000"/>
+                  <wp:effectExtent l="0" t="0" r="6985" b="635"/>
                   <wp:docPr id="44" name="Imagem 44"/>
                   <wp:cNvGraphicFramePr>
                     <a:graphicFrameLocks xmlns:a="http://schemas.openxmlformats.org/drawingml/2006/main" noChangeAspect="1"/>
@@ -8313,7 +8293,7 @@
                         <pic:spPr>
                           <a:xfrm>
                             <a:off x="0" y="0"/>
-                            <a:ext cx="2196000" cy="2700000"/>
+                            <a:ext cx="2926800" cy="3600000"/>
                           </a:xfrm>
                           <a:prstGeom prst="rect">
                             <a:avLst/>
@@ -8357,6 +8337,868 @@
                 <w:szCs w:val="16"/>
               </w:rPr>
               <w:t>Detalhamento com protótipo</w:t>
+            </w:r>
+          </w:p>
+          <w:p>
+            <w:pPr>
+              <w:pStyle w:val="PargrafodaLista"/>
+              <w:numPr>
+                <w:ilvl w:val="0"/>
+                <w:numId w:val="10"/>
+              </w:numPr>
+              <w:rPr>
+                <w:rFonts w:eastAsia="Noto Sans Symbols"/>
+                <w:sz w:val="20"/>
+                <w:szCs w:val="16"/>
+              </w:rPr>
+            </w:pPr>
+            <w:r>
+              <w:rPr>
+                <w:rFonts w:eastAsia="Noto Sans Symbols"/>
+                <w:sz w:val="20"/>
+                <w:szCs w:val="16"/>
+              </w:rPr>
+              <w:t xml:space="preserve">Listagem de </w:t>
+            </w:r>
+            <w:r>
+              <w:rPr>
+                <w:rFonts w:eastAsia="Noto Sans Symbols"/>
+                <w:sz w:val="20"/>
+                <w:szCs w:val="16"/>
+              </w:rPr>
+              <w:t>prioridades</w:t>
+            </w:r>
+            <w:r>
+              <w:rPr>
+                <w:rFonts w:eastAsia="Noto Sans Symbols"/>
+                <w:sz w:val="20"/>
+                <w:szCs w:val="16"/>
+              </w:rPr>
+              <w:t xml:space="preserve"> em forma de cards</w:t>
+            </w:r>
+          </w:p>
+          <w:p>
+            <w:pPr>
+              <w:pStyle w:val="PargrafodaLista"/>
+              <w:jc w:val="center"/>
+              <w:rPr>
+                <w:rFonts w:eastAsia="Noto Sans Symbols"/>
+                <w:sz w:val="20"/>
+                <w:szCs w:val="16"/>
+              </w:rPr>
+            </w:pPr>
+            <w:r>
+              <w:rPr>
+                <w:rFonts w:eastAsia="Noto Sans Symbols"/>
+                <w:sz w:val="20"/>
+                <w:szCs w:val="16"/>
+              </w:rPr>
+              <w:drawing>
+                <wp:inline distT="0" distB="0" distL="0" distR="0" wp14:anchorId="4F315D8D" wp14:editId="52A07D18">
+                  <wp:extent cx="5378400" cy="2754000"/>
+                  <wp:effectExtent l="0" t="0" r="0" b="8255"/>
+                  <wp:docPr id="3" name="Imagem 3"/>
+                  <wp:cNvGraphicFramePr>
+                    <a:graphicFrameLocks xmlns:a="http://schemas.openxmlformats.org/drawingml/2006/main" noChangeAspect="1"/>
+                  </wp:cNvGraphicFramePr>
+                  <a:graphic xmlns:a="http://schemas.openxmlformats.org/drawingml/2006/main">
+                    <a:graphicData uri="http://schemas.openxmlformats.org/drawingml/2006/picture">
+                      <pic:pic xmlns:pic="http://schemas.openxmlformats.org/drawingml/2006/picture">
+                        <pic:nvPicPr>
+                          <pic:cNvPr id="1" name=""/>
+                          <pic:cNvPicPr/>
+                        </pic:nvPicPr>
+                        <pic:blipFill>
+                          <a:blip r:embed="rId26"/>
+                          <a:stretch>
+                            <a:fillRect/>
+                          </a:stretch>
+                        </pic:blipFill>
+                        <pic:spPr>
+                          <a:xfrm>
+                            <a:off x="0" y="0"/>
+                            <a:ext cx="5378400" cy="2754000"/>
+                          </a:xfrm>
+                          <a:prstGeom prst="rect">
+                            <a:avLst/>
+                          </a:prstGeom>
+                        </pic:spPr>
+                      </pic:pic>
+                    </a:graphicData>
+                  </a:graphic>
+                </wp:inline>
+              </w:drawing>
+            </w:r>
+          </w:p>
+          <w:p>
+            <w:pPr>
+              <w:pStyle w:val="PargrafodaLista"/>
+              <w:jc w:val="center"/>
+              <w:rPr>
+                <w:rFonts w:eastAsia="Noto Sans Symbols"/>
+                <w:sz w:val="20"/>
+                <w:szCs w:val="16"/>
+              </w:rPr>
+            </w:pPr>
+          </w:p>
+          <w:p>
+            <w:pPr>
+              <w:pStyle w:val="PargrafodaLista"/>
+              <w:jc w:val="center"/>
+              <w:rPr>
+                <w:rFonts w:eastAsia="Noto Sans Symbols"/>
+                <w:sz w:val="20"/>
+                <w:szCs w:val="16"/>
+              </w:rPr>
+            </w:pPr>
+          </w:p>
+          <w:p>
+            <w:pPr>
+              <w:pStyle w:val="PargrafodaLista"/>
+              <w:jc w:val="center"/>
+              <w:rPr>
+                <w:rFonts w:eastAsia="Noto Sans Symbols"/>
+                <w:sz w:val="20"/>
+                <w:szCs w:val="16"/>
+              </w:rPr>
+            </w:pPr>
+          </w:p>
+          <w:p>
+            <w:pPr>
+              <w:pStyle w:val="PargrafodaLista"/>
+              <w:jc w:val="center"/>
+              <w:rPr>
+                <w:rFonts w:eastAsia="Noto Sans Symbols"/>
+                <w:sz w:val="20"/>
+                <w:szCs w:val="16"/>
+              </w:rPr>
+            </w:pPr>
+          </w:p>
+          <w:p>
+            <w:pPr>
+              <w:pStyle w:val="PargrafodaLista"/>
+              <w:jc w:val="center"/>
+              <w:rPr>
+                <w:rFonts w:eastAsia="Noto Sans Symbols"/>
+                <w:sz w:val="20"/>
+                <w:szCs w:val="16"/>
+              </w:rPr>
+            </w:pPr>
+          </w:p>
+          <w:p>
+            <w:pPr>
+              <w:rPr>
+                <w:rFonts w:eastAsia="Noto Sans Symbols"/>
+                <w:sz w:val="20"/>
+                <w:szCs w:val="16"/>
+              </w:rPr>
+            </w:pPr>
+          </w:p>
+          <w:p>
+            <w:pPr>
+              <w:pStyle w:val="PargrafodaLista"/>
+              <w:numPr>
+                <w:ilvl w:val="0"/>
+                <w:numId w:val="10"/>
+              </w:numPr>
+              <w:rPr>
+                <w:rFonts w:eastAsia="Noto Sans Symbols"/>
+                <w:sz w:val="20"/>
+                <w:szCs w:val="16"/>
+              </w:rPr>
+            </w:pPr>
+            <w:r>
+              <w:rPr>
+                <w:rFonts w:eastAsia="Noto Sans Symbols"/>
+                <w:sz w:val="20"/>
+                <w:szCs w:val="16"/>
+              </w:rPr>
+              <w:lastRenderedPageBreak/>
+              <w:t xml:space="preserve">Listagem de </w:t>
+            </w:r>
+            <w:r>
+              <w:rPr>
+                <w:rFonts w:eastAsia="Noto Sans Symbols"/>
+                <w:sz w:val="20"/>
+                <w:szCs w:val="16"/>
+              </w:rPr>
+              <w:t>prioridades</w:t>
+            </w:r>
+            <w:r>
+              <w:rPr>
+                <w:rFonts w:eastAsia="Noto Sans Symbols"/>
+                <w:sz w:val="20"/>
+                <w:szCs w:val="16"/>
+              </w:rPr>
+              <w:t xml:space="preserve"> em forma de lista</w:t>
+            </w:r>
+          </w:p>
+          <w:p>
+            <w:pPr>
+              <w:pStyle w:val="PargrafodaLista"/>
+              <w:jc w:val="center"/>
+              <w:rPr>
+                <w:rFonts w:eastAsia="Noto Sans Symbols"/>
+                <w:sz w:val="20"/>
+                <w:szCs w:val="16"/>
+              </w:rPr>
+            </w:pPr>
+            <w:r>
+              <w:rPr>
+                <w:rFonts w:eastAsia="Noto Sans Symbols"/>
+                <w:sz w:val="20"/>
+                <w:szCs w:val="16"/>
+              </w:rPr>
+              <w:drawing>
+                <wp:inline distT="0" distB="0" distL="0" distR="0" wp14:anchorId="790DB953" wp14:editId="71EBE97E">
+                  <wp:extent cx="5335200" cy="2070000"/>
+                  <wp:effectExtent l="0" t="0" r="0" b="6985"/>
+                  <wp:docPr id="15" name="Imagem 15"/>
+                  <wp:cNvGraphicFramePr>
+                    <a:graphicFrameLocks xmlns:a="http://schemas.openxmlformats.org/drawingml/2006/main" noChangeAspect="1"/>
+                  </wp:cNvGraphicFramePr>
+                  <a:graphic xmlns:a="http://schemas.openxmlformats.org/drawingml/2006/main">
+                    <a:graphicData uri="http://schemas.openxmlformats.org/drawingml/2006/picture">
+                      <pic:pic xmlns:pic="http://schemas.openxmlformats.org/drawingml/2006/picture">
+                        <pic:nvPicPr>
+                          <pic:cNvPr id="1" name=""/>
+                          <pic:cNvPicPr/>
+                        </pic:nvPicPr>
+                        <pic:blipFill>
+                          <a:blip r:embed="rId27"/>
+                          <a:stretch>
+                            <a:fillRect/>
+                          </a:stretch>
+                        </pic:blipFill>
+                        <pic:spPr>
+                          <a:xfrm>
+                            <a:off x="0" y="0"/>
+                            <a:ext cx="5335200" cy="2070000"/>
+                          </a:xfrm>
+                          <a:prstGeom prst="rect">
+                            <a:avLst/>
+                          </a:prstGeom>
+                        </pic:spPr>
+                      </pic:pic>
+                    </a:graphicData>
+                  </a:graphic>
+                </wp:inline>
+              </w:drawing>
+            </w:r>
+          </w:p>
+          <w:p>
+            <w:pPr>
+              <w:pStyle w:val="PargrafodaLista"/>
+              <w:jc w:val="center"/>
+              <w:rPr>
+                <w:rFonts w:eastAsia="Noto Sans Symbols"/>
+                <w:sz w:val="20"/>
+                <w:szCs w:val="16"/>
+              </w:rPr>
+            </w:pPr>
+          </w:p>
+          <w:p>
+            <w:pPr>
+              <w:pStyle w:val="PargrafodaLista"/>
+              <w:numPr>
+                <w:ilvl w:val="0"/>
+                <w:numId w:val="10"/>
+              </w:numPr>
+              <w:rPr>
+                <w:rFonts w:eastAsia="Noto Sans Symbols"/>
+                <w:sz w:val="20"/>
+                <w:szCs w:val="16"/>
+              </w:rPr>
+            </w:pPr>
+            <w:r>
+              <w:rPr>
+                <w:rFonts w:eastAsia="Noto Sans Symbols"/>
+                <w:sz w:val="20"/>
+                <w:szCs w:val="16"/>
+              </w:rPr>
+              <w:t>Modal de cadastro d</w:t>
+            </w:r>
+            <w:r>
+              <w:rPr>
+                <w:rFonts w:eastAsia="Noto Sans Symbols"/>
+                <w:sz w:val="20"/>
+                <w:szCs w:val="16"/>
+              </w:rPr>
+              <w:t>a prioridade</w:t>
+            </w:r>
+          </w:p>
+          <w:p>
+            <w:pPr>
+              <w:jc w:val="center"/>
+              <w:rPr>
+                <w:rFonts w:eastAsia="Noto Sans Symbols"/>
+                <w:color w:val="FF0000"/>
+                <w:sz w:val="20"/>
+                <w:szCs w:val="16"/>
+              </w:rPr>
+            </w:pPr>
+            <w:r>
+              <w:rPr>
+                <w:rFonts w:eastAsia="Noto Sans Symbols"/>
+                <w:color w:val="FF0000"/>
+                <w:sz w:val="20"/>
+                <w:szCs w:val="16"/>
+              </w:rPr>
+              <w:drawing>
+                <wp:inline distT="0" distB="0" distL="0" distR="0" wp14:anchorId="46030F5D" wp14:editId="57BCC87B">
+                  <wp:extent cx="3668400" cy="3596400"/>
+                  <wp:effectExtent l="0" t="0" r="8255" b="4445"/>
+                  <wp:docPr id="16" name="Imagem 16"/>
+                  <wp:cNvGraphicFramePr>
+                    <a:graphicFrameLocks xmlns:a="http://schemas.openxmlformats.org/drawingml/2006/main" noChangeAspect="1"/>
+                  </wp:cNvGraphicFramePr>
+                  <a:graphic xmlns:a="http://schemas.openxmlformats.org/drawingml/2006/main">
+                    <a:graphicData uri="http://schemas.openxmlformats.org/drawingml/2006/picture">
+                      <pic:pic xmlns:pic="http://schemas.openxmlformats.org/drawingml/2006/picture">
+                        <pic:nvPicPr>
+                          <pic:cNvPr id="1" name=""/>
+                          <pic:cNvPicPr/>
+                        </pic:nvPicPr>
+                        <pic:blipFill>
+                          <a:blip r:embed="rId28"/>
+                          <a:stretch>
+                            <a:fillRect/>
+                          </a:stretch>
+                        </pic:blipFill>
+                        <pic:spPr>
+                          <a:xfrm>
+                            <a:off x="0" y="0"/>
+                            <a:ext cx="3668400" cy="3596400"/>
+                          </a:xfrm>
+                          <a:prstGeom prst="rect">
+                            <a:avLst/>
+                          </a:prstGeom>
+                        </pic:spPr>
+                      </pic:pic>
+                    </a:graphicData>
+                  </a:graphic>
+                </wp:inline>
+              </w:drawing>
+            </w:r>
+          </w:p>
+          <w:p>
+            <w:pPr>
+              <w:pStyle w:val="PargrafodaLista"/>
+              <w:jc w:val="center"/>
+              <w:rPr>
+                <w:rFonts w:eastAsia="Noto Sans Symbols"/>
+                <w:color w:val="FF0000"/>
+                <w:sz w:val="20"/>
+                <w:szCs w:val="16"/>
+              </w:rPr>
+            </w:pPr>
+          </w:p>
+          <w:p>
+            <w:pPr>
+              <w:pStyle w:val="PargrafodaLista"/>
+              <w:jc w:val="center"/>
+              <w:rPr>
+                <w:rFonts w:eastAsia="Noto Sans Symbols"/>
+                <w:color w:val="FF0000"/>
+                <w:sz w:val="20"/>
+                <w:szCs w:val="16"/>
+              </w:rPr>
+            </w:pPr>
+          </w:p>
+          <w:p>
+            <w:pPr>
+              <w:pStyle w:val="PargrafodaLista"/>
+              <w:jc w:val="center"/>
+              <w:rPr>
+                <w:rFonts w:eastAsia="Noto Sans Symbols"/>
+                <w:color w:val="FF0000"/>
+                <w:sz w:val="20"/>
+                <w:szCs w:val="16"/>
+              </w:rPr>
+            </w:pPr>
+          </w:p>
+          <w:p>
+            <w:pPr>
+              <w:pStyle w:val="PargrafodaLista"/>
+              <w:jc w:val="center"/>
+              <w:rPr>
+                <w:rFonts w:eastAsia="Noto Sans Symbols"/>
+                <w:color w:val="FF0000"/>
+                <w:sz w:val="20"/>
+                <w:szCs w:val="16"/>
+              </w:rPr>
+            </w:pPr>
+          </w:p>
+          <w:p>
+            <w:pPr>
+              <w:pStyle w:val="PargrafodaLista"/>
+              <w:jc w:val="center"/>
+              <w:rPr>
+                <w:rFonts w:eastAsia="Noto Sans Symbols"/>
+                <w:color w:val="FF0000"/>
+                <w:sz w:val="20"/>
+                <w:szCs w:val="16"/>
+              </w:rPr>
+            </w:pPr>
+          </w:p>
+          <w:p>
+            <w:pPr>
+              <w:pStyle w:val="PargrafodaLista"/>
+              <w:jc w:val="center"/>
+              <w:rPr>
+                <w:rFonts w:eastAsia="Noto Sans Symbols"/>
+                <w:color w:val="FF0000"/>
+                <w:sz w:val="20"/>
+                <w:szCs w:val="16"/>
+              </w:rPr>
+            </w:pPr>
+          </w:p>
+          <w:p>
+            <w:pPr>
+              <w:pStyle w:val="PargrafodaLista"/>
+              <w:jc w:val="center"/>
+              <w:rPr>
+                <w:rFonts w:eastAsia="Noto Sans Symbols"/>
+                <w:color w:val="FF0000"/>
+                <w:sz w:val="20"/>
+                <w:szCs w:val="16"/>
+              </w:rPr>
+            </w:pPr>
+          </w:p>
+          <w:p>
+            <w:pPr>
+              <w:pStyle w:val="PargrafodaLista"/>
+              <w:jc w:val="center"/>
+              <w:rPr>
+                <w:rFonts w:eastAsia="Noto Sans Symbols"/>
+                <w:color w:val="FF0000"/>
+                <w:sz w:val="20"/>
+                <w:szCs w:val="16"/>
+              </w:rPr>
+            </w:pPr>
+          </w:p>
+          <w:p>
+            <w:pPr>
+              <w:pStyle w:val="PargrafodaLista"/>
+              <w:jc w:val="center"/>
+              <w:rPr>
+                <w:rFonts w:eastAsia="Noto Sans Symbols"/>
+                <w:color w:val="FF0000"/>
+                <w:sz w:val="20"/>
+                <w:szCs w:val="16"/>
+              </w:rPr>
+            </w:pPr>
+          </w:p>
+          <w:p>
+            <w:pPr>
+              <w:pStyle w:val="PargrafodaLista"/>
+              <w:jc w:val="center"/>
+              <w:rPr>
+                <w:rFonts w:eastAsia="Noto Sans Symbols"/>
+                <w:color w:val="FF0000"/>
+                <w:sz w:val="20"/>
+                <w:szCs w:val="16"/>
+              </w:rPr>
+            </w:pPr>
+          </w:p>
+          <w:p>
+            <w:pPr>
+              <w:pStyle w:val="PargrafodaLista"/>
+              <w:numPr>
+                <w:ilvl w:val="0"/>
+                <w:numId w:val="10"/>
+              </w:numPr>
+              <w:rPr>
+                <w:rFonts w:eastAsia="Noto Sans Symbols"/>
+                <w:sz w:val="20"/>
+                <w:szCs w:val="16"/>
+              </w:rPr>
+            </w:pPr>
+            <w:r>
+              <w:rPr>
+                <w:rFonts w:eastAsia="Noto Sans Symbols"/>
+                <w:sz w:val="20"/>
+                <w:szCs w:val="16"/>
+              </w:rPr>
+              <w:lastRenderedPageBreak/>
+              <w:t>Modal de visualização do cadastro d</w:t>
+            </w:r>
+            <w:r>
+              <w:rPr>
+                <w:rFonts w:eastAsia="Noto Sans Symbols"/>
+                <w:sz w:val="20"/>
+                <w:szCs w:val="16"/>
+              </w:rPr>
+              <w:t>a prioridade</w:t>
+            </w:r>
+          </w:p>
+          <w:p>
+            <w:pPr>
+              <w:pStyle w:val="PargrafodaLista"/>
+              <w:jc w:val="center"/>
+              <w:rPr>
+                <w:rFonts w:eastAsia="Noto Sans Symbols"/>
+                <w:sz w:val="20"/>
+                <w:szCs w:val="16"/>
+              </w:rPr>
+            </w:pPr>
+            <w:r>
+              <w:rPr>
+                <w:rFonts w:eastAsia="Noto Sans Symbols"/>
+                <w:sz w:val="20"/>
+                <w:szCs w:val="16"/>
+              </w:rPr>
+              <w:drawing>
+                <wp:inline distT="0" distB="0" distL="0" distR="0" wp14:anchorId="47EECB3C" wp14:editId="692A361A">
+                  <wp:extent cx="2620800" cy="3560400"/>
+                  <wp:effectExtent l="0" t="0" r="8255" b="2540"/>
+                  <wp:docPr id="21" name="Imagem 21"/>
+                  <wp:cNvGraphicFramePr>
+                    <a:graphicFrameLocks xmlns:a="http://schemas.openxmlformats.org/drawingml/2006/main" noChangeAspect="1"/>
+                  </wp:cNvGraphicFramePr>
+                  <a:graphic xmlns:a="http://schemas.openxmlformats.org/drawingml/2006/main">
+                    <a:graphicData uri="http://schemas.openxmlformats.org/drawingml/2006/picture">
+                      <pic:pic xmlns:pic="http://schemas.openxmlformats.org/drawingml/2006/picture">
+                        <pic:nvPicPr>
+                          <pic:cNvPr id="1" name=""/>
+                          <pic:cNvPicPr/>
+                        </pic:nvPicPr>
+                        <pic:blipFill>
+                          <a:blip r:embed="rId29"/>
+                          <a:stretch>
+                            <a:fillRect/>
+                          </a:stretch>
+                        </pic:blipFill>
+                        <pic:spPr>
+                          <a:xfrm>
+                            <a:off x="0" y="0"/>
+                            <a:ext cx="2620800" cy="3560400"/>
+                          </a:xfrm>
+                          <a:prstGeom prst="rect">
+                            <a:avLst/>
+                          </a:prstGeom>
+                        </pic:spPr>
+                      </pic:pic>
+                    </a:graphicData>
+                  </a:graphic>
+                </wp:inline>
+              </w:drawing>
+            </w:r>
+          </w:p>
+          <w:p>
+            <w:pPr>
+              <w:pStyle w:val="PargrafodaLista"/>
+              <w:jc w:val="center"/>
+              <w:rPr>
+                <w:rFonts w:eastAsia="Noto Sans Symbols"/>
+                <w:sz w:val="20"/>
+                <w:szCs w:val="16"/>
+              </w:rPr>
+            </w:pPr>
+          </w:p>
+          <w:p>
+            <w:pPr>
+              <w:pStyle w:val="PargrafodaLista"/>
+              <w:numPr>
+                <w:ilvl w:val="0"/>
+                <w:numId w:val="10"/>
+              </w:numPr>
+              <w:rPr>
+                <w:rFonts w:eastAsia="Noto Sans Symbols"/>
+                <w:sz w:val="20"/>
+                <w:szCs w:val="16"/>
+              </w:rPr>
+            </w:pPr>
+            <w:r>
+              <w:rPr>
+                <w:rFonts w:eastAsia="Noto Sans Symbols"/>
+                <w:sz w:val="20"/>
+                <w:szCs w:val="16"/>
+              </w:rPr>
+              <w:t xml:space="preserve">Modal de alteração do cadastro </w:t>
+            </w:r>
+            <w:r>
+              <w:rPr>
+                <w:rFonts w:eastAsia="Noto Sans Symbols"/>
+                <w:sz w:val="20"/>
+                <w:szCs w:val="16"/>
+              </w:rPr>
+              <w:t>da</w:t>
+            </w:r>
+            <w:r>
+              <w:rPr>
+                <w:rFonts w:eastAsia="Noto Sans Symbols"/>
+                <w:sz w:val="20"/>
+                <w:szCs w:val="16"/>
+              </w:rPr>
+              <w:t xml:space="preserve"> </w:t>
+            </w:r>
+            <w:r>
+              <w:rPr>
+                <w:rFonts w:eastAsia="Noto Sans Symbols"/>
+                <w:sz w:val="20"/>
+                <w:szCs w:val="16"/>
+              </w:rPr>
+              <w:t>prioridade</w:t>
+            </w:r>
+          </w:p>
+          <w:p>
+            <w:pPr>
+              <w:pStyle w:val="PargrafodaLista"/>
+              <w:jc w:val="center"/>
+              <w:rPr>
+                <w:rFonts w:eastAsia="Noto Sans Symbols"/>
+                <w:color w:val="FF0000"/>
+                <w:sz w:val="20"/>
+                <w:szCs w:val="16"/>
+              </w:rPr>
+            </w:pPr>
+            <w:r>
+              <w:rPr>
+                <w:rFonts w:eastAsia="Noto Sans Symbols"/>
+                <w:color w:val="FF0000"/>
+                <w:sz w:val="20"/>
+                <w:szCs w:val="16"/>
+              </w:rPr>
+              <w:drawing>
+                <wp:inline distT="0" distB="0" distL="0" distR="0" wp14:anchorId="0A61C8A4" wp14:editId="10E4EE80">
+                  <wp:extent cx="3646800" cy="3589200"/>
+                  <wp:effectExtent l="0" t="0" r="0" b="0"/>
+                  <wp:docPr id="22" name="Imagem 22"/>
+                  <wp:cNvGraphicFramePr>
+                    <a:graphicFrameLocks xmlns:a="http://schemas.openxmlformats.org/drawingml/2006/main" noChangeAspect="1"/>
+                  </wp:cNvGraphicFramePr>
+                  <a:graphic xmlns:a="http://schemas.openxmlformats.org/drawingml/2006/main">
+                    <a:graphicData uri="http://schemas.openxmlformats.org/drawingml/2006/picture">
+                      <pic:pic xmlns:pic="http://schemas.openxmlformats.org/drawingml/2006/picture">
+                        <pic:nvPicPr>
+                          <pic:cNvPr id="1" name=""/>
+                          <pic:cNvPicPr/>
+                        </pic:nvPicPr>
+                        <pic:blipFill>
+                          <a:blip r:embed="rId30"/>
+                          <a:stretch>
+                            <a:fillRect/>
+                          </a:stretch>
+                        </pic:blipFill>
+                        <pic:spPr>
+                          <a:xfrm>
+                            <a:off x="0" y="0"/>
+                            <a:ext cx="3646800" cy="3589200"/>
+                          </a:xfrm>
+                          <a:prstGeom prst="rect">
+                            <a:avLst/>
+                          </a:prstGeom>
+                        </pic:spPr>
+                      </pic:pic>
+                    </a:graphicData>
+                  </a:graphic>
+                </wp:inline>
+              </w:drawing>
+            </w:r>
+          </w:p>
+          <w:p>
+            <w:pPr>
+              <w:pStyle w:val="PargrafodaLista"/>
+              <w:jc w:val="center"/>
+              <w:rPr>
+                <w:rFonts w:eastAsia="Noto Sans Symbols"/>
+                <w:sz w:val="20"/>
+                <w:szCs w:val="16"/>
+              </w:rPr>
+            </w:pPr>
+          </w:p>
+          <w:p>
+            <w:pPr>
+              <w:pStyle w:val="PargrafodaLista"/>
+              <w:jc w:val="center"/>
+              <w:rPr>
+                <w:rFonts w:eastAsia="Noto Sans Symbols"/>
+                <w:sz w:val="20"/>
+                <w:szCs w:val="16"/>
+              </w:rPr>
+            </w:pPr>
+          </w:p>
+          <w:p>
+            <w:pPr>
+              <w:pStyle w:val="PargrafodaLista"/>
+              <w:jc w:val="center"/>
+              <w:rPr>
+                <w:rFonts w:eastAsia="Noto Sans Symbols"/>
+                <w:sz w:val="20"/>
+                <w:szCs w:val="16"/>
+              </w:rPr>
+            </w:pPr>
+          </w:p>
+          <w:p>
+            <w:pPr>
+              <w:pStyle w:val="PargrafodaLista"/>
+              <w:numPr>
+                <w:ilvl w:val="0"/>
+                <w:numId w:val="10"/>
+              </w:numPr>
+              <w:rPr>
+                <w:rFonts w:eastAsia="Noto Sans Symbols"/>
+                <w:sz w:val="20"/>
+                <w:szCs w:val="16"/>
+              </w:rPr>
+            </w:pPr>
+            <w:r>
+              <w:rPr>
+                <w:rFonts w:eastAsia="Noto Sans Symbols"/>
+                <w:sz w:val="20"/>
+                <w:szCs w:val="16"/>
+              </w:rPr>
+              <w:lastRenderedPageBreak/>
+              <w:t>Modal de confirmação de exclusão do cadastro d</w:t>
+            </w:r>
+            <w:r>
+              <w:rPr>
+                <w:rFonts w:eastAsia="Noto Sans Symbols"/>
+                <w:sz w:val="20"/>
+                <w:szCs w:val="16"/>
+              </w:rPr>
+              <w:t>a prioridade</w:t>
+            </w:r>
+          </w:p>
+          <w:p>
+            <w:pPr>
+              <w:jc w:val="center"/>
+              <w:rPr>
+                <w:rFonts w:eastAsia="Noto Sans Symbols"/>
+                <w:sz w:val="20"/>
+                <w:szCs w:val="16"/>
+              </w:rPr>
+            </w:pPr>
+            <w:r>
+              <w:rPr>
+                <w:rFonts w:eastAsia="Noto Sans Symbols"/>
+                <w:sz w:val="20"/>
+                <w:szCs w:val="16"/>
+              </w:rPr>
+              <w:drawing>
+                <wp:inline distT="0" distB="0" distL="0" distR="0" wp14:anchorId="65DBFA19" wp14:editId="51B6E760">
+                  <wp:extent cx="5385600" cy="2167200"/>
+                  <wp:effectExtent l="0" t="0" r="5715" b="5080"/>
+                  <wp:docPr id="23" name="Imagem 23"/>
+                  <wp:cNvGraphicFramePr>
+                    <a:graphicFrameLocks xmlns:a="http://schemas.openxmlformats.org/drawingml/2006/main" noChangeAspect="1"/>
+                  </wp:cNvGraphicFramePr>
+                  <a:graphic xmlns:a="http://schemas.openxmlformats.org/drawingml/2006/main">
+                    <a:graphicData uri="http://schemas.openxmlformats.org/drawingml/2006/picture">
+                      <pic:pic xmlns:pic="http://schemas.openxmlformats.org/drawingml/2006/picture">
+                        <pic:nvPicPr>
+                          <pic:cNvPr id="1" name=""/>
+                          <pic:cNvPicPr/>
+                        </pic:nvPicPr>
+                        <pic:blipFill>
+                          <a:blip r:embed="rId31"/>
+                          <a:stretch>
+                            <a:fillRect/>
+                          </a:stretch>
+                        </pic:blipFill>
+                        <pic:spPr>
+                          <a:xfrm>
+                            <a:off x="0" y="0"/>
+                            <a:ext cx="5385600" cy="2167200"/>
+                          </a:xfrm>
+                          <a:prstGeom prst="rect">
+                            <a:avLst/>
+                          </a:prstGeom>
+                        </pic:spPr>
+                      </pic:pic>
+                    </a:graphicData>
+                  </a:graphic>
+                </wp:inline>
+              </w:drawing>
+            </w:r>
+          </w:p>
+          <w:p>
+            <w:pPr>
+              <w:jc w:val="center"/>
+              <w:rPr>
+                <w:rFonts w:eastAsia="Noto Sans Symbols"/>
+                <w:sz w:val="20"/>
+                <w:szCs w:val="16"/>
+              </w:rPr>
+            </w:pPr>
+          </w:p>
+          <w:p>
+            <w:pPr>
+              <w:pStyle w:val="PargrafodaLista"/>
+              <w:numPr>
+                <w:ilvl w:val="0"/>
+                <w:numId w:val="10"/>
+              </w:numPr>
+              <w:rPr>
+                <w:rFonts w:eastAsia="Noto Sans Symbols"/>
+                <w:sz w:val="20"/>
+                <w:szCs w:val="16"/>
+              </w:rPr>
+            </w:pPr>
+            <w:r>
+              <w:rPr>
+                <w:rFonts w:eastAsia="Noto Sans Symbols"/>
+                <w:sz w:val="20"/>
+                <w:szCs w:val="16"/>
+              </w:rPr>
+              <w:t>Modal de mensagem caso tente excluir uma prioridade atribuída a uma tarefa ativa</w:t>
+            </w:r>
+          </w:p>
+          <w:p>
+            <w:pPr>
+              <w:jc w:val="center"/>
+              <w:rPr>
+                <w:rFonts w:eastAsia="Calibri"/>
+                <w:b/>
+                <w:bCs/>
+                <w:sz w:val="20"/>
+                <w:szCs w:val="16"/>
+              </w:rPr>
+            </w:pPr>
+            <w:r>
+              <w:rPr>
+                <w:rFonts w:eastAsia="Calibri"/>
+                <w:b/>
+                <w:bCs/>
+                <w:sz w:val="20"/>
+                <w:szCs w:val="16"/>
+              </w:rPr>
+              <w:drawing>
+                <wp:inline distT="0" distB="0" distL="0" distR="0" wp14:anchorId="5167ED37" wp14:editId="0C0B0BDE">
+                  <wp:extent cx="5371200" cy="3099600"/>
+                  <wp:effectExtent l="0" t="0" r="1270" b="5715"/>
+                  <wp:docPr id="24" name="Imagem 24"/>
+                  <wp:cNvGraphicFramePr>
+                    <a:graphicFrameLocks xmlns:a="http://schemas.openxmlformats.org/drawingml/2006/main" noChangeAspect="1"/>
+                  </wp:cNvGraphicFramePr>
+                  <a:graphic xmlns:a="http://schemas.openxmlformats.org/drawingml/2006/main">
+                    <a:graphicData uri="http://schemas.openxmlformats.org/drawingml/2006/picture">
+                      <pic:pic xmlns:pic="http://schemas.openxmlformats.org/drawingml/2006/picture">
+                        <pic:nvPicPr>
+                          <pic:cNvPr id="1" name=""/>
+                          <pic:cNvPicPr/>
+                        </pic:nvPicPr>
+                        <pic:blipFill>
+                          <a:blip r:embed="rId32"/>
+                          <a:stretch>
+                            <a:fillRect/>
+                          </a:stretch>
+                        </pic:blipFill>
+                        <pic:spPr>
+                          <a:xfrm>
+                            <a:off x="0" y="0"/>
+                            <a:ext cx="5371200" cy="3099600"/>
+                          </a:xfrm>
+                          <a:prstGeom prst="rect">
+                            <a:avLst/>
+                          </a:prstGeom>
+                        </pic:spPr>
+                      </pic:pic>
+                    </a:graphicData>
+                  </a:graphic>
+                </wp:inline>
+              </w:drawing>
             </w:r>
           </w:p>
           <w:p>
@@ -9097,16 +9939,16 @@
             </w:pPr>
             <w:r>
               <w:rPr>
-                <w:rFonts w:eastAsia="Calibri"/>
                 <w:b/>
                 <w:bCs/>
+                <w:noProof/>
                 <w:sz w:val="20"/>
                 <w:szCs w:val="16"/>
               </w:rPr>
               <w:drawing>
-                <wp:inline distT="0" distB="0" distL="0" distR="0" wp14:anchorId="2967724A" wp14:editId="6DBB1573">
-                  <wp:extent cx="5508000" cy="2700000"/>
-                  <wp:effectExtent l="0" t="0" r="0" b="5715"/>
+                <wp:inline distT="0" distB="0" distL="0" distR="0" wp14:anchorId="2967724A" wp14:editId="22C57E51">
+                  <wp:extent cx="5338800" cy="2617200"/>
+                  <wp:effectExtent l="0" t="0" r="0" b="0"/>
                   <wp:docPr id="2" name="Imagem 2"/>
                   <wp:cNvGraphicFramePr>
                     <a:graphicFrameLocks xmlns:a="http://schemas.openxmlformats.org/drawingml/2006/main" noChangeAspect="1"/>
@@ -9119,7 +9961,7 @@
                           <pic:cNvPicPr/>
                         </pic:nvPicPr>
                         <pic:blipFill>
-                          <a:blip r:embed="rId26"/>
+                          <a:blip r:embed="rId33"/>
                           <a:stretch>
                             <a:fillRect/>
                           </a:stretch>
@@ -9127,7 +9969,7 @@
                         <pic:spPr>
                           <a:xfrm>
                             <a:off x="0" y="0"/>
-                            <a:ext cx="5508000" cy="2700000"/>
+                            <a:ext cx="5338800" cy="2617200"/>
                           </a:xfrm>
                           <a:prstGeom prst="rect">
                             <a:avLst/>
@@ -9206,10 +10048,10 @@
                 <w:szCs w:val="16"/>
               </w:rPr>
               <w:drawing>
-                <wp:inline distT="0" distB="0" distL="0" distR="0" wp14:anchorId="2525AAA6" wp14:editId="5ED3BBFE">
-                  <wp:extent cx="3096000" cy="2700000"/>
-                  <wp:effectExtent l="0" t="0" r="0" b="5715"/>
-                  <wp:docPr id="12" name="Imagem 12"/>
+                <wp:inline distT="0" distB="0" distL="0" distR="0" wp14:anchorId="528FE453" wp14:editId="5E2D4EF4">
+                  <wp:extent cx="4125600" cy="3585600"/>
+                  <wp:effectExtent l="0" t="0" r="8255" b="0"/>
+                  <wp:docPr id="25" name="Imagem 25"/>
                   <wp:cNvGraphicFramePr>
                     <a:graphicFrameLocks xmlns:a="http://schemas.openxmlformats.org/drawingml/2006/main" noChangeAspect="1"/>
                   </wp:cNvGraphicFramePr>
@@ -9221,7 +10063,7 @@
                           <pic:cNvPicPr/>
                         </pic:nvPicPr>
                         <pic:blipFill>
-                          <a:blip r:embed="rId27"/>
+                          <a:blip r:embed="rId34"/>
                           <a:stretch>
                             <a:fillRect/>
                           </a:stretch>
@@ -9229,7 +10071,7 @@
                         <pic:spPr>
                           <a:xfrm>
                             <a:off x="0" y="0"/>
-                            <a:ext cx="3096000" cy="2700000"/>
+                            <a:ext cx="4125600" cy="3585600"/>
                           </a:xfrm>
                           <a:prstGeom prst="rect">
                             <a:avLst/>
@@ -9276,6 +10118,298 @@
           </w:p>
           <w:p>
             <w:pPr>
+              <w:pStyle w:val="PargrafodaLista"/>
+              <w:numPr>
+                <w:ilvl w:val="0"/>
+                <w:numId w:val="11"/>
+              </w:numPr>
+              <w:jc w:val="left"/>
+              <w:rPr>
+                <w:rFonts w:eastAsia="Noto Sans Symbols"/>
+                <w:sz w:val="20"/>
+                <w:szCs w:val="16"/>
+              </w:rPr>
+            </w:pPr>
+            <w:r>
+              <w:rPr>
+                <w:rFonts w:eastAsia="Noto Sans Symbols"/>
+                <w:sz w:val="20"/>
+                <w:szCs w:val="16"/>
+              </w:rPr>
+              <w:t>Listagem de etapas em forma de cards</w:t>
+            </w:r>
+          </w:p>
+          <w:p>
+            <w:pPr>
+              <w:jc w:val="left"/>
+              <w:rPr>
+                <w:rFonts w:eastAsia="Noto Sans Symbols"/>
+                <w:sz w:val="20"/>
+                <w:szCs w:val="16"/>
+              </w:rPr>
+            </w:pPr>
+          </w:p>
+          <w:p>
+            <w:pPr>
+              <w:jc w:val="left"/>
+              <w:rPr>
+                <w:rFonts w:eastAsia="Noto Sans Symbols"/>
+                <w:sz w:val="20"/>
+                <w:szCs w:val="16"/>
+              </w:rPr>
+            </w:pPr>
+          </w:p>
+          <w:p>
+            <w:pPr>
+              <w:pStyle w:val="PargrafodaLista"/>
+              <w:numPr>
+                <w:ilvl w:val="0"/>
+                <w:numId w:val="11"/>
+              </w:numPr>
+              <w:jc w:val="left"/>
+              <w:rPr>
+                <w:rFonts w:eastAsia="Noto Sans Symbols"/>
+                <w:sz w:val="20"/>
+                <w:szCs w:val="16"/>
+              </w:rPr>
+            </w:pPr>
+            <w:r>
+              <w:rPr>
+                <w:rFonts w:eastAsia="Noto Sans Symbols"/>
+                <w:sz w:val="20"/>
+                <w:szCs w:val="16"/>
+              </w:rPr>
+              <w:t>Listagem de etapas em forma de lista</w:t>
+            </w:r>
+          </w:p>
+          <w:p>
+            <w:pPr>
+              <w:jc w:val="left"/>
+              <w:rPr>
+                <w:rFonts w:eastAsia="Noto Sans Symbols"/>
+                <w:sz w:val="20"/>
+                <w:szCs w:val="16"/>
+              </w:rPr>
+            </w:pPr>
+          </w:p>
+          <w:p>
+            <w:pPr>
+              <w:jc w:val="left"/>
+              <w:rPr>
+                <w:rFonts w:eastAsia="Noto Sans Symbols"/>
+                <w:sz w:val="20"/>
+                <w:szCs w:val="16"/>
+              </w:rPr>
+            </w:pPr>
+          </w:p>
+          <w:p>
+            <w:pPr>
+              <w:pStyle w:val="PargrafodaLista"/>
+              <w:numPr>
+                <w:ilvl w:val="0"/>
+                <w:numId w:val="11"/>
+              </w:numPr>
+              <w:jc w:val="left"/>
+              <w:rPr>
+                <w:rFonts w:eastAsia="Noto Sans Symbols"/>
+                <w:sz w:val="20"/>
+                <w:szCs w:val="16"/>
+              </w:rPr>
+            </w:pPr>
+            <w:r>
+              <w:rPr>
+                <w:rFonts w:eastAsia="Noto Sans Symbols"/>
+                <w:sz w:val="20"/>
+                <w:szCs w:val="16"/>
+              </w:rPr>
+              <w:t>Modal de cadastro da etapa</w:t>
+            </w:r>
+          </w:p>
+          <w:p>
+            <w:pPr>
+              <w:jc w:val="left"/>
+              <w:rPr>
+                <w:rFonts w:eastAsia="Noto Sans Symbols"/>
+                <w:sz w:val="20"/>
+                <w:szCs w:val="16"/>
+              </w:rPr>
+            </w:pPr>
+          </w:p>
+          <w:p>
+            <w:pPr>
+              <w:jc w:val="left"/>
+              <w:rPr>
+                <w:rFonts w:eastAsia="Noto Sans Symbols"/>
+                <w:sz w:val="20"/>
+                <w:szCs w:val="16"/>
+              </w:rPr>
+            </w:pPr>
+          </w:p>
+          <w:p>
+            <w:pPr>
+              <w:pStyle w:val="PargrafodaLista"/>
+              <w:numPr>
+                <w:ilvl w:val="0"/>
+                <w:numId w:val="11"/>
+              </w:numPr>
+              <w:jc w:val="left"/>
+              <w:rPr>
+                <w:rFonts w:eastAsia="Noto Sans Symbols"/>
+                <w:sz w:val="20"/>
+                <w:szCs w:val="16"/>
+              </w:rPr>
+            </w:pPr>
+            <w:r>
+              <w:rPr>
+                <w:rFonts w:eastAsia="Noto Sans Symbols"/>
+                <w:sz w:val="20"/>
+                <w:szCs w:val="16"/>
+              </w:rPr>
+              <w:t>Modal de visualização do cadastro da etapa</w:t>
+            </w:r>
+          </w:p>
+          <w:p>
+            <w:pPr>
+              <w:jc w:val="left"/>
+              <w:rPr>
+                <w:rFonts w:eastAsia="Noto Sans Symbols"/>
+                <w:sz w:val="20"/>
+                <w:szCs w:val="16"/>
+              </w:rPr>
+            </w:pPr>
+          </w:p>
+          <w:p>
+            <w:pPr>
+              <w:jc w:val="left"/>
+              <w:rPr>
+                <w:rFonts w:eastAsia="Noto Sans Symbols"/>
+                <w:sz w:val="20"/>
+                <w:szCs w:val="16"/>
+              </w:rPr>
+            </w:pPr>
+          </w:p>
+          <w:p>
+            <w:pPr>
+              <w:pStyle w:val="PargrafodaLista"/>
+              <w:numPr>
+                <w:ilvl w:val="0"/>
+                <w:numId w:val="11"/>
+              </w:numPr>
+              <w:jc w:val="left"/>
+              <w:rPr>
+                <w:rFonts w:eastAsia="Noto Sans Symbols"/>
+                <w:sz w:val="20"/>
+                <w:szCs w:val="16"/>
+              </w:rPr>
+            </w:pPr>
+            <w:r>
+              <w:rPr>
+                <w:rFonts w:eastAsia="Noto Sans Symbols"/>
+                <w:sz w:val="20"/>
+                <w:szCs w:val="16"/>
+              </w:rPr>
+              <w:t>Modal de alteração do cadastro da etapa</w:t>
+            </w:r>
+          </w:p>
+          <w:p>
+            <w:pPr>
+              <w:jc w:val="left"/>
+              <w:rPr>
+                <w:rFonts w:eastAsia="Noto Sans Symbols"/>
+                <w:sz w:val="20"/>
+                <w:szCs w:val="16"/>
+              </w:rPr>
+            </w:pPr>
+          </w:p>
+          <w:p>
+            <w:pPr>
+              <w:jc w:val="left"/>
+              <w:rPr>
+                <w:rFonts w:eastAsia="Noto Sans Symbols"/>
+                <w:sz w:val="20"/>
+                <w:szCs w:val="16"/>
+              </w:rPr>
+            </w:pPr>
+          </w:p>
+          <w:p>
+            <w:pPr>
+              <w:pStyle w:val="PargrafodaLista"/>
+              <w:numPr>
+                <w:ilvl w:val="0"/>
+                <w:numId w:val="11"/>
+              </w:numPr>
+              <w:jc w:val="left"/>
+              <w:rPr>
+                <w:rFonts w:eastAsia="Noto Sans Symbols"/>
+                <w:sz w:val="20"/>
+                <w:szCs w:val="16"/>
+              </w:rPr>
+            </w:pPr>
+            <w:r>
+              <w:rPr>
+                <w:rFonts w:eastAsia="Noto Sans Symbols"/>
+                <w:sz w:val="20"/>
+                <w:szCs w:val="16"/>
+              </w:rPr>
+              <w:t>Modal de confirmação de exclusão do cadastro da etapa</w:t>
+            </w:r>
+          </w:p>
+          <w:p>
+            <w:pPr>
+              <w:jc w:val="left"/>
+              <w:rPr>
+                <w:rFonts w:eastAsia="Noto Sans Symbols"/>
+                <w:sz w:val="20"/>
+                <w:szCs w:val="16"/>
+              </w:rPr>
+            </w:pPr>
+          </w:p>
+          <w:p>
+            <w:pPr>
+              <w:jc w:val="left"/>
+              <w:rPr>
+                <w:rFonts w:eastAsia="Noto Sans Symbols"/>
+                <w:sz w:val="20"/>
+                <w:szCs w:val="16"/>
+              </w:rPr>
+            </w:pPr>
+          </w:p>
+          <w:p>
+            <w:pPr>
+              <w:pStyle w:val="PargrafodaLista"/>
+              <w:numPr>
+                <w:ilvl w:val="0"/>
+                <w:numId w:val="11"/>
+              </w:numPr>
+              <w:jc w:val="left"/>
+              <w:rPr>
+                <w:rFonts w:eastAsia="Noto Sans Symbols"/>
+                <w:sz w:val="20"/>
+                <w:szCs w:val="16"/>
+              </w:rPr>
+            </w:pPr>
+            <w:r>
+              <w:rPr>
+                <w:rFonts w:eastAsia="Noto Sans Symbols"/>
+                <w:sz w:val="20"/>
+                <w:szCs w:val="16"/>
+              </w:rPr>
+              <w:t>Modal de mensagem caso tente excluir uma etapa atribuída a uma tarefa ativa</w:t>
+            </w:r>
+          </w:p>
+          <w:p>
+            <w:pPr>
+              <w:jc w:val="left"/>
+              <w:rPr>
+                <w:rFonts w:eastAsia="Noto Sans Symbols"/>
+                <w:sz w:val="20"/>
+                <w:szCs w:val="16"/>
+              </w:rPr>
+            </w:pPr>
+          </w:p>
+          <w:p>
+            <w:pPr>
+              <w:jc w:val="left"/>
               <w:rPr>
                 <w:rFonts w:eastAsia="Noto Sans Symbols"/>
                 <w:sz w:val="20"/>
@@ -9407,7 +10541,7 @@
                     <pic:cNvPicPr preferRelativeResize="0"/>
                   </pic:nvPicPr>
                   <pic:blipFill>
-                    <a:blip r:embed="rId28"/>
+                    <a:blip r:embed="rId35"/>
                     <a:srcRect/>
                     <a:stretch>
                       <a:fillRect/>
@@ -9485,7 +10619,7 @@
                     <pic:cNvPicPr preferRelativeResize="0"/>
                   </pic:nvPicPr>
                   <pic:blipFill>
-                    <a:blip r:embed="rId29"/>
+                    <a:blip r:embed="rId36"/>
                     <a:srcRect/>
                     <a:stretch>
                       <a:fillRect/>
@@ -9729,7 +10863,7 @@
                     <pic:cNvPicPr preferRelativeResize="0"/>
                   </pic:nvPicPr>
                   <pic:blipFill>
-                    <a:blip r:embed="rId30"/>
+                    <a:blip r:embed="rId37"/>
                     <a:srcRect/>
                     <a:stretch>
                       <a:fillRect/>
@@ -9754,7 +10888,7 @@
     </w:p>
     <w:p/>
     <w:sectPr>
-      <w:footerReference w:type="first" r:id="rId31"/>
+      <w:footerReference w:type="first" r:id="rId38"/>
       <w:pgSz w:w="11906" w:h="16838"/>
       <w:pgMar w:top="1418" w:right="851" w:bottom="1418" w:left="1418" w:header="709" w:footer="709" w:gutter="0"/>
       <w:pgNumType w:start="1"/>
@@ -10052,6 +11186,95 @@
     </w:lvl>
   </w:abstractNum>
   <w:abstractNum w:abstractNumId="2" w15:restartNumberingAfterBreak="0">
+    <w:nsid w:val="214A59A1"/>
+    <w:multiLevelType w:val="hybridMultilevel"/>
+    <w:tmpl w:val="065C76F4"/>
+    <w:lvl w:ilvl="0" w:tplc="072A4F64">
+      <w:start w:val="1"/>
+      <w:numFmt w:val="decimal"/>
+      <w:lvlText w:val="%1-"/>
+      <w:lvlJc w:val="left"/>
+      <w:pPr>
+        <w:ind w:left="720" w:hanging="360"/>
+      </w:pPr>
+      <w:rPr>
+        <w:rFonts w:hint="default"/>
+      </w:rPr>
+    </w:lvl>
+    <w:lvl w:ilvl="1" w:tplc="04160019" w:tentative="1">
+      <w:start w:val="1"/>
+      <w:numFmt w:val="lowerLetter"/>
+      <w:lvlText w:val="%2."/>
+      <w:lvlJc w:val="left"/>
+      <w:pPr>
+        <w:ind w:left="1440" w:hanging="360"/>
+      </w:pPr>
+    </w:lvl>
+    <w:lvl w:ilvl="2" w:tplc="0416001B" w:tentative="1">
+      <w:start w:val="1"/>
+      <w:numFmt w:val="lowerRoman"/>
+      <w:lvlText w:val="%3."/>
+      <w:lvlJc w:val="right"/>
+      <w:pPr>
+        <w:ind w:left="2160" w:hanging="180"/>
+      </w:pPr>
+    </w:lvl>
+    <w:lvl w:ilvl="3" w:tplc="0416000F" w:tentative="1">
+      <w:start w:val="1"/>
+      <w:numFmt w:val="decimal"/>
+      <w:lvlText w:val="%4."/>
+      <w:lvlJc w:val="left"/>
+      <w:pPr>
+        <w:ind w:left="2880" w:hanging="360"/>
+      </w:pPr>
+    </w:lvl>
+    <w:lvl w:ilvl="4" w:tplc="04160019" w:tentative="1">
+      <w:start w:val="1"/>
+      <w:numFmt w:val="lowerLetter"/>
+      <w:lvlText w:val="%5."/>
+      <w:lvlJc w:val="left"/>
+      <w:pPr>
+        <w:ind w:left="3600" w:hanging="360"/>
+      </w:pPr>
+    </w:lvl>
+    <w:lvl w:ilvl="5" w:tplc="0416001B" w:tentative="1">
+      <w:start w:val="1"/>
+      <w:numFmt w:val="lowerRoman"/>
+      <w:lvlText w:val="%6."/>
+      <w:lvlJc w:val="right"/>
+      <w:pPr>
+        <w:ind w:left="4320" w:hanging="180"/>
+      </w:pPr>
+    </w:lvl>
+    <w:lvl w:ilvl="6" w:tplc="0416000F" w:tentative="1">
+      <w:start w:val="1"/>
+      <w:numFmt w:val="decimal"/>
+      <w:lvlText w:val="%7."/>
+      <w:lvlJc w:val="left"/>
+      <w:pPr>
+        <w:ind w:left="5040" w:hanging="360"/>
+      </w:pPr>
+    </w:lvl>
+    <w:lvl w:ilvl="7" w:tplc="04160019" w:tentative="1">
+      <w:start w:val="1"/>
+      <w:numFmt w:val="lowerLetter"/>
+      <w:lvlText w:val="%8."/>
+      <w:lvlJc w:val="left"/>
+      <w:pPr>
+        <w:ind w:left="5760" w:hanging="360"/>
+      </w:pPr>
+    </w:lvl>
+    <w:lvl w:ilvl="8" w:tplc="0416001B" w:tentative="1">
+      <w:start w:val="1"/>
+      <w:numFmt w:val="lowerRoman"/>
+      <w:lvlText w:val="%9."/>
+      <w:lvlJc w:val="right"/>
+      <w:pPr>
+        <w:ind w:left="6480" w:hanging="180"/>
+      </w:pPr>
+    </w:lvl>
+  </w:abstractNum>
+  <w:abstractNum w:abstractNumId="3" w15:restartNumberingAfterBreak="0">
     <w:nsid w:val="2F8F3E6A"/>
     <w:multiLevelType w:val="multilevel"/>
     <w:tmpl w:val="4BB0FF58"/>
@@ -10164,7 +11387,96 @@
       </w:rPr>
     </w:lvl>
   </w:abstractNum>
-  <w:abstractNum w:abstractNumId="3" w15:restartNumberingAfterBreak="0">
+  <w:abstractNum w:abstractNumId="4" w15:restartNumberingAfterBreak="0">
+    <w:nsid w:val="35E13893"/>
+    <w:multiLevelType w:val="hybridMultilevel"/>
+    <w:tmpl w:val="67CC8AE4"/>
+    <w:lvl w:ilvl="0" w:tplc="7B48E6B6">
+      <w:start w:val="1"/>
+      <w:numFmt w:val="decimal"/>
+      <w:lvlText w:val="%1-"/>
+      <w:lvlJc w:val="left"/>
+      <w:pPr>
+        <w:ind w:left="720" w:hanging="360"/>
+      </w:pPr>
+      <w:rPr>
+        <w:rFonts w:hint="default"/>
+      </w:rPr>
+    </w:lvl>
+    <w:lvl w:ilvl="1" w:tplc="04160019" w:tentative="1">
+      <w:start w:val="1"/>
+      <w:numFmt w:val="lowerLetter"/>
+      <w:lvlText w:val="%2."/>
+      <w:lvlJc w:val="left"/>
+      <w:pPr>
+        <w:ind w:left="1440" w:hanging="360"/>
+      </w:pPr>
+    </w:lvl>
+    <w:lvl w:ilvl="2" w:tplc="0416001B" w:tentative="1">
+      <w:start w:val="1"/>
+      <w:numFmt w:val="lowerRoman"/>
+      <w:lvlText w:val="%3."/>
+      <w:lvlJc w:val="right"/>
+      <w:pPr>
+        <w:ind w:left="2160" w:hanging="180"/>
+      </w:pPr>
+    </w:lvl>
+    <w:lvl w:ilvl="3" w:tplc="0416000F" w:tentative="1">
+      <w:start w:val="1"/>
+      <w:numFmt w:val="decimal"/>
+      <w:lvlText w:val="%4."/>
+      <w:lvlJc w:val="left"/>
+      <w:pPr>
+        <w:ind w:left="2880" w:hanging="360"/>
+      </w:pPr>
+    </w:lvl>
+    <w:lvl w:ilvl="4" w:tplc="04160019" w:tentative="1">
+      <w:start w:val="1"/>
+      <w:numFmt w:val="lowerLetter"/>
+      <w:lvlText w:val="%5."/>
+      <w:lvlJc w:val="left"/>
+      <w:pPr>
+        <w:ind w:left="3600" w:hanging="360"/>
+      </w:pPr>
+    </w:lvl>
+    <w:lvl w:ilvl="5" w:tplc="0416001B" w:tentative="1">
+      <w:start w:val="1"/>
+      <w:numFmt w:val="lowerRoman"/>
+      <w:lvlText w:val="%6."/>
+      <w:lvlJc w:val="right"/>
+      <w:pPr>
+        <w:ind w:left="4320" w:hanging="180"/>
+      </w:pPr>
+    </w:lvl>
+    <w:lvl w:ilvl="6" w:tplc="0416000F" w:tentative="1">
+      <w:start w:val="1"/>
+      <w:numFmt w:val="decimal"/>
+      <w:lvlText w:val="%7."/>
+      <w:lvlJc w:val="left"/>
+      <w:pPr>
+        <w:ind w:left="5040" w:hanging="360"/>
+      </w:pPr>
+    </w:lvl>
+    <w:lvl w:ilvl="7" w:tplc="04160019" w:tentative="1">
+      <w:start w:val="1"/>
+      <w:numFmt w:val="lowerLetter"/>
+      <w:lvlText w:val="%8."/>
+      <w:lvlJc w:val="left"/>
+      <w:pPr>
+        <w:ind w:left="5760" w:hanging="360"/>
+      </w:pPr>
+    </w:lvl>
+    <w:lvl w:ilvl="8" w:tplc="0416001B" w:tentative="1">
+      <w:start w:val="1"/>
+      <w:numFmt w:val="lowerRoman"/>
+      <w:lvlText w:val="%9."/>
+      <w:lvlJc w:val="right"/>
+      <w:pPr>
+        <w:ind w:left="6480" w:hanging="180"/>
+      </w:pPr>
+    </w:lvl>
+  </w:abstractNum>
+  <w:abstractNum w:abstractNumId="5" w15:restartNumberingAfterBreak="0">
     <w:nsid w:val="38332BFF"/>
     <w:multiLevelType w:val="hybridMultilevel"/>
     <w:tmpl w:val="29F4CB18"/>
@@ -10277,7 +11589,7 @@
       </w:rPr>
     </w:lvl>
   </w:abstractNum>
-  <w:abstractNum w:abstractNumId="4" w15:restartNumberingAfterBreak="0">
+  <w:abstractNum w:abstractNumId="6" w15:restartNumberingAfterBreak="0">
     <w:nsid w:val="40083289"/>
     <w:multiLevelType w:val="hybridMultilevel"/>
     <w:tmpl w:val="E30AB254"/>
@@ -10390,7 +11702,7 @@
       </w:rPr>
     </w:lvl>
   </w:abstractNum>
-  <w:abstractNum w:abstractNumId="5" w15:restartNumberingAfterBreak="0">
+  <w:abstractNum w:abstractNumId="7" w15:restartNumberingAfterBreak="0">
     <w:nsid w:val="46B666FB"/>
     <w:multiLevelType w:val="multilevel"/>
     <w:tmpl w:val="F27AE70C"/>
@@ -10503,7 +11815,7 @@
       </w:rPr>
     </w:lvl>
   </w:abstractNum>
-  <w:abstractNum w:abstractNumId="6" w15:restartNumberingAfterBreak="0">
+  <w:abstractNum w:abstractNumId="8" w15:restartNumberingAfterBreak="0">
     <w:nsid w:val="481C1346"/>
     <w:multiLevelType w:val="hybridMultilevel"/>
     <w:tmpl w:val="67CC8AE4"/>
@@ -10592,7 +11904,7 @@
       </w:pPr>
     </w:lvl>
   </w:abstractNum>
-  <w:abstractNum w:abstractNumId="7" w15:restartNumberingAfterBreak="0">
+  <w:abstractNum w:abstractNumId="9" w15:restartNumberingAfterBreak="0">
     <w:nsid w:val="5C3E105D"/>
     <w:multiLevelType w:val="multilevel"/>
     <w:tmpl w:val="09AC6DA8"/>
@@ -10705,7 +12017,7 @@
       </w:rPr>
     </w:lvl>
   </w:abstractNum>
-  <w:abstractNum w:abstractNumId="8" w15:restartNumberingAfterBreak="0">
+  <w:abstractNum w:abstractNumId="10" w15:restartNumberingAfterBreak="0">
     <w:nsid w:val="5E0375AD"/>
     <w:multiLevelType w:val="hybridMultilevel"/>
     <w:tmpl w:val="67CC8AE4"/>
@@ -10795,31 +12107,37 @@
     </w:lvl>
   </w:abstractNum>
   <w:num w:numId="1">
-    <w:abstractNumId w:val="7"/>
+    <w:abstractNumId w:val="9"/>
   </w:num>
   <w:num w:numId="2">
     <w:abstractNumId w:val="0"/>
   </w:num>
   <w:num w:numId="3">
-    <w:abstractNumId w:val="2"/>
+    <w:abstractNumId w:val="3"/>
   </w:num>
   <w:num w:numId="4">
-    <w:abstractNumId w:val="5"/>
+    <w:abstractNumId w:val="7"/>
   </w:num>
   <w:num w:numId="5">
     <w:abstractNumId w:val="1"/>
   </w:num>
   <w:num w:numId="6">
+    <w:abstractNumId w:val="6"/>
+  </w:num>
+  <w:num w:numId="7">
+    <w:abstractNumId w:val="5"/>
+  </w:num>
+  <w:num w:numId="8">
+    <w:abstractNumId w:val="10"/>
+  </w:num>
+  <w:num w:numId="9">
+    <w:abstractNumId w:val="8"/>
+  </w:num>
+  <w:num w:numId="10">
     <w:abstractNumId w:val="4"/>
   </w:num>
-  <w:num w:numId="7">
-    <w:abstractNumId w:val="3"/>
-  </w:num>
-  <w:num w:numId="8">
-    <w:abstractNumId w:val="8"/>
-  </w:num>
-  <w:num w:numId="9">
-    <w:abstractNumId w:val="6"/>
+  <w:num w:numId="11">
+    <w:abstractNumId w:val="2"/>
   </w:num>
 </w:numbering>
 </file>

</xml_diff>

<commit_message>
Frontend + Prototipação - Gerenciar etapas
</commit_message>
<xml_diff>
--- a/Documentação/ERS.docx
+++ b/Documentação/ERS.docx
@@ -8390,6 +8390,7 @@
             <w:r>
               <w:rPr>
                 <w:rFonts w:eastAsia="Noto Sans Symbols"/>
+                <w:noProof/>
                 <w:sz w:val="20"/>
                 <w:szCs w:val="16"/>
               </w:rPr>
@@ -8546,6 +8547,7 @@
             <w:r>
               <w:rPr>
                 <w:rFonts w:eastAsia="Noto Sans Symbols"/>
+                <w:noProof/>
                 <w:sz w:val="20"/>
                 <w:szCs w:val="16"/>
               </w:rPr>
@@ -8640,6 +8642,7 @@
             <w:r>
               <w:rPr>
                 <w:rFonts w:eastAsia="Noto Sans Symbols"/>
+                <w:noProof/>
                 <w:color w:val="FF0000"/>
                 <w:sz w:val="20"/>
                 <w:szCs w:val="16"/>
@@ -8845,6 +8848,7 @@
             <w:r>
               <w:rPr>
                 <w:rFonts w:eastAsia="Noto Sans Symbols"/>
+                <w:noProof/>
                 <w:sz w:val="20"/>
                 <w:szCs w:val="16"/>
               </w:rPr>
@@ -8956,6 +8960,7 @@
             <w:r>
               <w:rPr>
                 <w:rFonts w:eastAsia="Noto Sans Symbols"/>
+                <w:noProof/>
                 <w:color w:val="FF0000"/>
                 <w:sz w:val="20"/>
                 <w:szCs w:val="16"/>
@@ -9073,6 +9078,7 @@
             <w:r>
               <w:rPr>
                 <w:rFonts w:eastAsia="Noto Sans Symbols"/>
+                <w:noProof/>
                 <w:sz w:val="20"/>
                 <w:szCs w:val="16"/>
               </w:rPr>
@@ -9158,9 +9164,9 @@
             </w:pPr>
             <w:r>
               <w:rPr>
-                <w:rFonts w:eastAsia="Calibri"/>
                 <w:b/>
                 <w:bCs/>
+                <w:noProof/>
                 <w:sz w:val="20"/>
                 <w:szCs w:val="16"/>
               </w:rPr>
@@ -10141,6 +10147,108 @@
           </w:p>
           <w:p>
             <w:pPr>
+              <w:jc w:val="center"/>
+              <w:rPr>
+                <w:rFonts w:eastAsia="Noto Sans Symbols"/>
+                <w:sz w:val="20"/>
+                <w:szCs w:val="16"/>
+              </w:rPr>
+            </w:pPr>
+            <w:r>
+              <w:rPr>
+                <w:rFonts w:eastAsia="Noto Sans Symbols"/>
+                <w:sz w:val="20"/>
+                <w:szCs w:val="16"/>
+              </w:rPr>
+              <w:drawing>
+                <wp:inline distT="0" distB="0" distL="0" distR="0" wp14:anchorId="3E25A681" wp14:editId="2F7903AA">
+                  <wp:extent cx="5328000" cy="2574000"/>
+                  <wp:effectExtent l="0" t="0" r="6350" b="0"/>
+                  <wp:docPr id="12" name="Imagem 12"/>
+                  <wp:cNvGraphicFramePr>
+                    <a:graphicFrameLocks xmlns:a="http://schemas.openxmlformats.org/drawingml/2006/main" noChangeAspect="1"/>
+                  </wp:cNvGraphicFramePr>
+                  <a:graphic xmlns:a="http://schemas.openxmlformats.org/drawingml/2006/main">
+                    <a:graphicData uri="http://schemas.openxmlformats.org/drawingml/2006/picture">
+                      <pic:pic xmlns:pic="http://schemas.openxmlformats.org/drawingml/2006/picture">
+                        <pic:nvPicPr>
+                          <pic:cNvPr id="1" name=""/>
+                          <pic:cNvPicPr/>
+                        </pic:nvPicPr>
+                        <pic:blipFill>
+                          <a:blip r:embed="rId35"/>
+                          <a:stretch>
+                            <a:fillRect/>
+                          </a:stretch>
+                        </pic:blipFill>
+                        <pic:spPr>
+                          <a:xfrm>
+                            <a:off x="0" y="0"/>
+                            <a:ext cx="5328000" cy="2574000"/>
+                          </a:xfrm>
+                          <a:prstGeom prst="rect">
+                            <a:avLst/>
+                          </a:prstGeom>
+                        </pic:spPr>
+                      </pic:pic>
+                    </a:graphicData>
+                  </a:graphic>
+                </wp:inline>
+              </w:drawing>
+            </w:r>
+          </w:p>
+          <w:p>
+            <w:pPr>
+              <w:jc w:val="left"/>
+              <w:rPr>
+                <w:rFonts w:eastAsia="Noto Sans Symbols"/>
+                <w:sz w:val="20"/>
+                <w:szCs w:val="16"/>
+              </w:rPr>
+            </w:pPr>
+          </w:p>
+          <w:p>
+            <w:pPr>
+              <w:jc w:val="left"/>
+              <w:rPr>
+                <w:rFonts w:eastAsia="Noto Sans Symbols"/>
+                <w:sz w:val="20"/>
+                <w:szCs w:val="16"/>
+              </w:rPr>
+            </w:pPr>
+          </w:p>
+          <w:p>
+            <w:pPr>
+              <w:jc w:val="left"/>
+              <w:rPr>
+                <w:rFonts w:eastAsia="Noto Sans Symbols"/>
+                <w:sz w:val="20"/>
+                <w:szCs w:val="16"/>
+              </w:rPr>
+            </w:pPr>
+          </w:p>
+          <w:p>
+            <w:pPr>
+              <w:jc w:val="left"/>
+              <w:rPr>
+                <w:rFonts w:eastAsia="Noto Sans Symbols"/>
+                <w:sz w:val="20"/>
+                <w:szCs w:val="16"/>
+              </w:rPr>
+            </w:pPr>
+          </w:p>
+          <w:p>
+            <w:pPr>
+              <w:jc w:val="left"/>
+              <w:rPr>
+                <w:rFonts w:eastAsia="Noto Sans Symbols"/>
+                <w:sz w:val="20"/>
+                <w:szCs w:val="16"/>
+              </w:rPr>
+            </w:pPr>
+          </w:p>
+          <w:p>
+            <w:pPr>
               <w:jc w:val="left"/>
               <w:rPr>
                 <w:rFonts w:eastAsia="Noto Sans Symbols"/>
@@ -10179,18 +10287,61 @@
                 <w:sz w:val="20"/>
                 <w:szCs w:val="16"/>
               </w:rPr>
+              <w:lastRenderedPageBreak/>
               <w:t>Listagem de etapas em forma de lista</w:t>
             </w:r>
           </w:p>
           <w:p>
             <w:pPr>
-              <w:jc w:val="left"/>
-              <w:rPr>
-                <w:rFonts w:eastAsia="Noto Sans Symbols"/>
-                <w:sz w:val="20"/>
-                <w:szCs w:val="16"/>
-              </w:rPr>
-            </w:pPr>
+              <w:jc w:val="center"/>
+              <w:rPr>
+                <w:rFonts w:eastAsia="Noto Sans Symbols"/>
+                <w:sz w:val="20"/>
+                <w:szCs w:val="16"/>
+              </w:rPr>
+            </w:pPr>
+            <w:r>
+              <w:rPr>
+                <w:rFonts w:eastAsia="Noto Sans Symbols"/>
+                <w:sz w:val="20"/>
+                <w:szCs w:val="16"/>
+              </w:rPr>
+              <w:drawing>
+                <wp:inline distT="0" distB="0" distL="0" distR="0" wp14:anchorId="6F0AA081" wp14:editId="263AC916">
+                  <wp:extent cx="5324400" cy="2401200"/>
+                  <wp:effectExtent l="0" t="0" r="0" b="0"/>
+                  <wp:docPr id="26" name="Imagem 26"/>
+                  <wp:cNvGraphicFramePr>
+                    <a:graphicFrameLocks xmlns:a="http://schemas.openxmlformats.org/drawingml/2006/main" noChangeAspect="1"/>
+                  </wp:cNvGraphicFramePr>
+                  <a:graphic xmlns:a="http://schemas.openxmlformats.org/drawingml/2006/main">
+                    <a:graphicData uri="http://schemas.openxmlformats.org/drawingml/2006/picture">
+                      <pic:pic xmlns:pic="http://schemas.openxmlformats.org/drawingml/2006/picture">
+                        <pic:nvPicPr>
+                          <pic:cNvPr id="1" name=""/>
+                          <pic:cNvPicPr/>
+                        </pic:nvPicPr>
+                        <pic:blipFill>
+                          <a:blip r:embed="rId36"/>
+                          <a:stretch>
+                            <a:fillRect/>
+                          </a:stretch>
+                        </pic:blipFill>
+                        <pic:spPr>
+                          <a:xfrm>
+                            <a:off x="0" y="0"/>
+                            <a:ext cx="5324400" cy="2401200"/>
+                          </a:xfrm>
+                          <a:prstGeom prst="rect">
+                            <a:avLst/>
+                          </a:prstGeom>
+                        </pic:spPr>
+                      </pic:pic>
+                    </a:graphicData>
+                  </a:graphic>
+                </wp:inline>
+              </w:drawing>
+            </w:r>
           </w:p>
           <w:p>
             <w:pPr>
@@ -10227,6 +10378,128 @@
           </w:p>
           <w:p>
             <w:pPr>
+              <w:jc w:val="center"/>
+              <w:rPr>
+                <w:rFonts w:eastAsia="Noto Sans Symbols"/>
+                <w:sz w:val="20"/>
+                <w:szCs w:val="16"/>
+              </w:rPr>
+            </w:pPr>
+            <w:r>
+              <w:rPr>
+                <w:rFonts w:eastAsia="Noto Sans Symbols"/>
+                <w:sz w:val="20"/>
+                <w:szCs w:val="16"/>
+              </w:rPr>
+              <w:drawing>
+                <wp:inline distT="0" distB="0" distL="0" distR="0" wp14:anchorId="287ECA17" wp14:editId="78162469">
+                  <wp:extent cx="4514400" cy="3582000"/>
+                  <wp:effectExtent l="0" t="0" r="635" b="0"/>
+                  <wp:docPr id="27" name="Imagem 27"/>
+                  <wp:cNvGraphicFramePr>
+                    <a:graphicFrameLocks xmlns:a="http://schemas.openxmlformats.org/drawingml/2006/main" noChangeAspect="1"/>
+                  </wp:cNvGraphicFramePr>
+                  <a:graphic xmlns:a="http://schemas.openxmlformats.org/drawingml/2006/main">
+                    <a:graphicData uri="http://schemas.openxmlformats.org/drawingml/2006/picture">
+                      <pic:pic xmlns:pic="http://schemas.openxmlformats.org/drawingml/2006/picture">
+                        <pic:nvPicPr>
+                          <pic:cNvPr id="1" name=""/>
+                          <pic:cNvPicPr/>
+                        </pic:nvPicPr>
+                        <pic:blipFill>
+                          <a:blip r:embed="rId37"/>
+                          <a:stretch>
+                            <a:fillRect/>
+                          </a:stretch>
+                        </pic:blipFill>
+                        <pic:spPr>
+                          <a:xfrm>
+                            <a:off x="0" y="0"/>
+                            <a:ext cx="4514400" cy="3582000"/>
+                          </a:xfrm>
+                          <a:prstGeom prst="rect">
+                            <a:avLst/>
+                          </a:prstGeom>
+                        </pic:spPr>
+                      </pic:pic>
+                    </a:graphicData>
+                  </a:graphic>
+                </wp:inline>
+              </w:drawing>
+            </w:r>
+          </w:p>
+          <w:p>
+            <w:pPr>
+              <w:jc w:val="left"/>
+              <w:rPr>
+                <w:rFonts w:eastAsia="Noto Sans Symbols"/>
+                <w:sz w:val="20"/>
+                <w:szCs w:val="16"/>
+              </w:rPr>
+            </w:pPr>
+          </w:p>
+          <w:p>
+            <w:pPr>
+              <w:jc w:val="left"/>
+              <w:rPr>
+                <w:rFonts w:eastAsia="Noto Sans Symbols"/>
+                <w:sz w:val="20"/>
+                <w:szCs w:val="16"/>
+              </w:rPr>
+            </w:pPr>
+          </w:p>
+          <w:p>
+            <w:pPr>
+              <w:jc w:val="left"/>
+              <w:rPr>
+                <w:rFonts w:eastAsia="Noto Sans Symbols"/>
+                <w:sz w:val="20"/>
+                <w:szCs w:val="16"/>
+              </w:rPr>
+            </w:pPr>
+          </w:p>
+          <w:p>
+            <w:pPr>
+              <w:jc w:val="left"/>
+              <w:rPr>
+                <w:rFonts w:eastAsia="Noto Sans Symbols"/>
+                <w:sz w:val="20"/>
+                <w:szCs w:val="16"/>
+              </w:rPr>
+            </w:pPr>
+          </w:p>
+          <w:p>
+            <w:pPr>
+              <w:jc w:val="left"/>
+              <w:rPr>
+                <w:rFonts w:eastAsia="Noto Sans Symbols"/>
+                <w:sz w:val="20"/>
+                <w:szCs w:val="16"/>
+              </w:rPr>
+            </w:pPr>
+          </w:p>
+          <w:p>
+            <w:pPr>
+              <w:jc w:val="left"/>
+              <w:rPr>
+                <w:rFonts w:eastAsia="Noto Sans Symbols"/>
+                <w:sz w:val="20"/>
+                <w:szCs w:val="16"/>
+              </w:rPr>
+            </w:pPr>
+          </w:p>
+          <w:p>
+            <w:pPr>
+              <w:jc w:val="left"/>
+              <w:rPr>
+                <w:rFonts w:eastAsia="Noto Sans Symbols"/>
+                <w:sz w:val="20"/>
+                <w:szCs w:val="16"/>
+              </w:rPr>
+            </w:pPr>
+          </w:p>
+          <w:p>
+            <w:pPr>
               <w:jc w:val="left"/>
               <w:rPr>
                 <w:rFonts w:eastAsia="Noto Sans Symbols"/>
@@ -10265,18 +10538,61 @@
                 <w:sz w:val="20"/>
                 <w:szCs w:val="16"/>
               </w:rPr>
+              <w:lastRenderedPageBreak/>
               <w:t>Modal de visualização do cadastro da etapa</w:t>
             </w:r>
           </w:p>
           <w:p>
             <w:pPr>
-              <w:jc w:val="left"/>
-              <w:rPr>
-                <w:rFonts w:eastAsia="Noto Sans Symbols"/>
-                <w:sz w:val="20"/>
-                <w:szCs w:val="16"/>
-              </w:rPr>
-            </w:pPr>
+              <w:jc w:val="center"/>
+              <w:rPr>
+                <w:rFonts w:eastAsia="Noto Sans Symbols"/>
+                <w:sz w:val="20"/>
+                <w:szCs w:val="16"/>
+              </w:rPr>
+            </w:pPr>
+            <w:r>
+              <w:rPr>
+                <w:rFonts w:eastAsia="Noto Sans Symbols"/>
+                <w:sz w:val="20"/>
+                <w:szCs w:val="16"/>
+              </w:rPr>
+              <w:drawing>
+                <wp:inline distT="0" distB="0" distL="0" distR="0" wp14:anchorId="643C0669" wp14:editId="32D0CEBC">
+                  <wp:extent cx="3099600" cy="3600000"/>
+                  <wp:effectExtent l="0" t="0" r="5715" b="635"/>
+                  <wp:docPr id="28" name="Imagem 28"/>
+                  <wp:cNvGraphicFramePr>
+                    <a:graphicFrameLocks xmlns:a="http://schemas.openxmlformats.org/drawingml/2006/main" noChangeAspect="1"/>
+                  </wp:cNvGraphicFramePr>
+                  <a:graphic xmlns:a="http://schemas.openxmlformats.org/drawingml/2006/main">
+                    <a:graphicData uri="http://schemas.openxmlformats.org/drawingml/2006/picture">
+                      <pic:pic xmlns:pic="http://schemas.openxmlformats.org/drawingml/2006/picture">
+                        <pic:nvPicPr>
+                          <pic:cNvPr id="1" name=""/>
+                          <pic:cNvPicPr/>
+                        </pic:nvPicPr>
+                        <pic:blipFill>
+                          <a:blip r:embed="rId38"/>
+                          <a:stretch>
+                            <a:fillRect/>
+                          </a:stretch>
+                        </pic:blipFill>
+                        <pic:spPr>
+                          <a:xfrm>
+                            <a:off x="0" y="0"/>
+                            <a:ext cx="3099600" cy="3600000"/>
+                          </a:xfrm>
+                          <a:prstGeom prst="rect">
+                            <a:avLst/>
+                          </a:prstGeom>
+                        </pic:spPr>
+                      </pic:pic>
+                    </a:graphicData>
+                  </a:graphic>
+                </wp:inline>
+              </w:drawing>
+            </w:r>
           </w:p>
           <w:p>
             <w:pPr>
@@ -10313,6 +10629,68 @@
           </w:p>
           <w:p>
             <w:pPr>
+              <w:jc w:val="center"/>
+              <w:rPr>
+                <w:rFonts w:eastAsia="Noto Sans Symbols"/>
+                <w:sz w:val="20"/>
+                <w:szCs w:val="16"/>
+              </w:rPr>
+            </w:pPr>
+            <w:r>
+              <w:rPr>
+                <w:rFonts w:eastAsia="Noto Sans Symbols"/>
+                <w:sz w:val="20"/>
+                <w:szCs w:val="16"/>
+              </w:rPr>
+              <w:drawing>
+                <wp:inline distT="0" distB="0" distL="0" distR="0" wp14:anchorId="70E5A044" wp14:editId="6B69712B">
+                  <wp:extent cx="4140000" cy="3578400"/>
+                  <wp:effectExtent l="0" t="0" r="0" b="3175"/>
+                  <wp:docPr id="29" name="Imagem 29"/>
+                  <wp:cNvGraphicFramePr>
+                    <a:graphicFrameLocks xmlns:a="http://schemas.openxmlformats.org/drawingml/2006/main" noChangeAspect="1"/>
+                  </wp:cNvGraphicFramePr>
+                  <a:graphic xmlns:a="http://schemas.openxmlformats.org/drawingml/2006/main">
+                    <a:graphicData uri="http://schemas.openxmlformats.org/drawingml/2006/picture">
+                      <pic:pic xmlns:pic="http://schemas.openxmlformats.org/drawingml/2006/picture">
+                        <pic:nvPicPr>
+                          <pic:cNvPr id="1" name=""/>
+                          <pic:cNvPicPr/>
+                        </pic:nvPicPr>
+                        <pic:blipFill>
+                          <a:blip r:embed="rId39"/>
+                          <a:stretch>
+                            <a:fillRect/>
+                          </a:stretch>
+                        </pic:blipFill>
+                        <pic:spPr>
+                          <a:xfrm>
+                            <a:off x="0" y="0"/>
+                            <a:ext cx="4140000" cy="3578400"/>
+                          </a:xfrm>
+                          <a:prstGeom prst="rect">
+                            <a:avLst/>
+                          </a:prstGeom>
+                        </pic:spPr>
+                      </pic:pic>
+                    </a:graphicData>
+                  </a:graphic>
+                </wp:inline>
+              </w:drawing>
+            </w:r>
+          </w:p>
+          <w:p>
+            <w:pPr>
+              <w:jc w:val="left"/>
+              <w:rPr>
+                <w:rFonts w:eastAsia="Noto Sans Symbols"/>
+                <w:sz w:val="20"/>
+                <w:szCs w:val="16"/>
+              </w:rPr>
+            </w:pPr>
+          </w:p>
+          <w:p>
+            <w:pPr>
               <w:jc w:val="left"/>
               <w:rPr>
                 <w:rFonts w:eastAsia="Noto Sans Symbols"/>
@@ -10351,22 +10729,65 @@
                 <w:sz w:val="20"/>
                 <w:szCs w:val="16"/>
               </w:rPr>
+              <w:lastRenderedPageBreak/>
               <w:t>Modal de confirmação de exclusão do cadastro da etapa</w:t>
             </w:r>
           </w:p>
           <w:p>
             <w:pPr>
-              <w:jc w:val="left"/>
-              <w:rPr>
-                <w:rFonts w:eastAsia="Noto Sans Symbols"/>
-                <w:sz w:val="20"/>
-                <w:szCs w:val="16"/>
-              </w:rPr>
-            </w:pPr>
-          </w:p>
-          <w:p>
-            <w:pPr>
-              <w:jc w:val="left"/>
+              <w:jc w:val="center"/>
+              <w:rPr>
+                <w:rFonts w:eastAsia="Noto Sans Symbols"/>
+                <w:sz w:val="20"/>
+                <w:szCs w:val="16"/>
+              </w:rPr>
+            </w:pPr>
+            <w:r>
+              <w:rPr>
+                <w:rFonts w:eastAsia="Noto Sans Symbols"/>
+                <w:sz w:val="20"/>
+                <w:szCs w:val="16"/>
+              </w:rPr>
+              <w:drawing>
+                <wp:inline distT="0" distB="0" distL="0" distR="0" wp14:anchorId="0C09D363" wp14:editId="348F0DF3">
+                  <wp:extent cx="5396400" cy="2311200"/>
+                  <wp:effectExtent l="0" t="0" r="0" b="0"/>
+                  <wp:docPr id="30" name="Imagem 30"/>
+                  <wp:cNvGraphicFramePr>
+                    <a:graphicFrameLocks xmlns:a="http://schemas.openxmlformats.org/drawingml/2006/main" noChangeAspect="1"/>
+                  </wp:cNvGraphicFramePr>
+                  <a:graphic xmlns:a="http://schemas.openxmlformats.org/drawingml/2006/main">
+                    <a:graphicData uri="http://schemas.openxmlformats.org/drawingml/2006/picture">
+                      <pic:pic xmlns:pic="http://schemas.openxmlformats.org/drawingml/2006/picture">
+                        <pic:nvPicPr>
+                          <pic:cNvPr id="1" name=""/>
+                          <pic:cNvPicPr/>
+                        </pic:nvPicPr>
+                        <pic:blipFill>
+                          <a:blip r:embed="rId40"/>
+                          <a:stretch>
+                            <a:fillRect/>
+                          </a:stretch>
+                        </pic:blipFill>
+                        <pic:spPr>
+                          <a:xfrm>
+                            <a:off x="0" y="0"/>
+                            <a:ext cx="5396400" cy="2311200"/>
+                          </a:xfrm>
+                          <a:prstGeom prst="rect">
+                            <a:avLst/>
+                          </a:prstGeom>
+                        </pic:spPr>
+                      </pic:pic>
+                    </a:graphicData>
+                  </a:graphic>
+                </wp:inline>
+              </w:drawing>
+            </w:r>
+          </w:p>
+          <w:p>
+            <w:pPr>
+              <w:jc w:val="center"/>
               <w:rPr>
                 <w:rFonts w:eastAsia="Noto Sans Symbols"/>
                 <w:sz w:val="20"/>
@@ -10399,13 +10820,55 @@
           </w:p>
           <w:p>
             <w:pPr>
-              <w:jc w:val="left"/>
-              <w:rPr>
-                <w:rFonts w:eastAsia="Noto Sans Symbols"/>
-                <w:sz w:val="20"/>
-                <w:szCs w:val="16"/>
-              </w:rPr>
-            </w:pPr>
+              <w:jc w:val="center"/>
+              <w:rPr>
+                <w:rFonts w:eastAsia="Noto Sans Symbols"/>
+                <w:sz w:val="20"/>
+                <w:szCs w:val="16"/>
+              </w:rPr>
+            </w:pPr>
+            <w:r>
+              <w:rPr>
+                <w:rFonts w:eastAsia="Noto Sans Symbols"/>
+                <w:sz w:val="20"/>
+                <w:szCs w:val="16"/>
+              </w:rPr>
+              <w:drawing>
+                <wp:inline distT="0" distB="0" distL="0" distR="0" wp14:anchorId="416FB8C4" wp14:editId="60D52B64">
+                  <wp:extent cx="5374800" cy="3168000"/>
+                  <wp:effectExtent l="0" t="0" r="0" b="0"/>
+                  <wp:docPr id="31" name="Imagem 31"/>
+                  <wp:cNvGraphicFramePr>
+                    <a:graphicFrameLocks xmlns:a="http://schemas.openxmlformats.org/drawingml/2006/main" noChangeAspect="1"/>
+                  </wp:cNvGraphicFramePr>
+                  <a:graphic xmlns:a="http://schemas.openxmlformats.org/drawingml/2006/main">
+                    <a:graphicData uri="http://schemas.openxmlformats.org/drawingml/2006/picture">
+                      <pic:pic xmlns:pic="http://schemas.openxmlformats.org/drawingml/2006/picture">
+                        <pic:nvPicPr>
+                          <pic:cNvPr id="1" name=""/>
+                          <pic:cNvPicPr/>
+                        </pic:nvPicPr>
+                        <pic:blipFill>
+                          <a:blip r:embed="rId41"/>
+                          <a:stretch>
+                            <a:fillRect/>
+                          </a:stretch>
+                        </pic:blipFill>
+                        <pic:spPr>
+                          <a:xfrm>
+                            <a:off x="0" y="0"/>
+                            <a:ext cx="5374800" cy="3168000"/>
+                          </a:xfrm>
+                          <a:prstGeom prst="rect">
+                            <a:avLst/>
+                          </a:prstGeom>
+                        </pic:spPr>
+                      </pic:pic>
+                    </a:graphicData>
+                  </a:graphic>
+                </wp:inline>
+              </w:drawing>
+            </w:r>
           </w:p>
           <w:p>
             <w:pPr>
@@ -10424,38 +10887,8 @@
       <w:pPr>
         <w:pStyle w:val="Ttulo1"/>
       </w:pPr>
-    </w:p>
-    <w:p>
-      <w:pPr>
-        <w:pStyle w:val="Ttulo1"/>
-      </w:pPr>
-    </w:p>
-    <w:p/>
-    <w:p>
-      <w:pPr>
-        <w:pStyle w:val="Ttulo1"/>
-      </w:pPr>
-    </w:p>
-    <w:p/>
-    <w:p/>
-    <w:p/>
-    <w:p/>
-    <w:p>
-      <w:pPr>
-        <w:pStyle w:val="Ttulo1"/>
-        <w:tabs>
-          <w:tab w:val="left" w:pos="948"/>
-        </w:tabs>
-      </w:pPr>
-      <w:r>
-        <w:tab/>
-      </w:r>
-    </w:p>
-    <w:p>
-      <w:pPr>
-        <w:pStyle w:val="Ttulo1"/>
-      </w:pPr>
-      <w:r>
+      <w:r>
+        <w:lastRenderedPageBreak/>
         <w:br w:type="page"/>
       </w:r>
       <w:bookmarkStart w:id="13" w:name="_Toc209377801"/>
@@ -10541,7 +10974,7 @@
                     <pic:cNvPicPr preferRelativeResize="0"/>
                   </pic:nvPicPr>
                   <pic:blipFill>
-                    <a:blip r:embed="rId35"/>
+                    <a:blip r:embed="rId42"/>
                     <a:srcRect/>
                     <a:stretch>
                       <a:fillRect/>
@@ -10619,7 +11052,7 @@
                     <pic:cNvPicPr preferRelativeResize="0"/>
                   </pic:nvPicPr>
                   <pic:blipFill>
-                    <a:blip r:embed="rId36"/>
+                    <a:blip r:embed="rId43"/>
                     <a:srcRect/>
                     <a:stretch>
                       <a:fillRect/>
@@ -10835,8 +11268,12 @@
       </w:r>
     </w:p>
     <w:p/>
+    <w:p/>
+    <w:p/>
+    <w:p/>
     <w:p>
       <w:r>
+        <w:lastRenderedPageBreak/>
         <w:t>Figura 1 –</w:t>
       </w:r>
       <w:r>
@@ -10848,7 +11285,6 @@
         <w:rPr>
           <w:noProof/>
         </w:rPr>
-        <w:lastRenderedPageBreak/>
         <w:drawing>
           <wp:inline distT="114300" distB="114300" distL="114300" distR="114300" wp14:anchorId="7F31F383" wp14:editId="3A57F7EE">
             <wp:extent cx="6119185" cy="3302000"/>
@@ -10863,7 +11299,7 @@
                     <pic:cNvPicPr preferRelativeResize="0"/>
                   </pic:nvPicPr>
                   <pic:blipFill>
-                    <a:blip r:embed="rId37"/>
+                    <a:blip r:embed="rId44"/>
                     <a:srcRect/>
                     <a:stretch>
                       <a:fillRect/>
@@ -10888,7 +11324,7 @@
     </w:p>
     <w:p/>
     <w:sectPr>
-      <w:footerReference w:type="first" r:id="rId38"/>
+      <w:footerReference w:type="first" r:id="rId45"/>
       <w:pgSz w:w="11906" w:h="16838"/>
       <w:pgMar w:top="1418" w:right="851" w:bottom="1418" w:left="1418" w:header="709" w:footer="709" w:gutter="0"/>
       <w:pgNumType w:start="1"/>

</xml_diff>

<commit_message>
Corrigindo Cadastro e Alteração - Gerenciar Etapas
Correção das funções criarEtapa e atualizarEtapa para usar o parâmetro 'data' correto no corpo da solicitação, garantindo a comunicação adequada com a API.
</commit_message>
<xml_diff>
--- a/Documentação/ERS.docx
+++ b/Documentação/ERS.docx
@@ -212,17 +212,8 @@
           <w:sz w:val="28"/>
           <w:szCs w:val="24"/>
         </w:rPr>
-        <w:t xml:space="preserve">ASM </w:t>
+        <w:t>ASM Tasks</w:t>
       </w:r>
-      <w:proofErr w:type="spellStart"/>
-      <w:r>
-        <w:rPr>
-          <w:sz w:val="28"/>
-          <w:szCs w:val="24"/>
-        </w:rPr>
-        <w:t>Tasks</w:t>
-      </w:r>
-      <w:proofErr w:type="spellEnd"/>
     </w:p>
     <w:p>
       <w:pPr>
@@ -1741,15 +1732,7 @@
     </w:p>
     <w:p>
       <w:r>
-        <w:t xml:space="preserve">A finalidade desta Especificação de Requisitos de Software (ERS) é definir de forma clara e precisa as funcionalidades, restrições e características técnicas do sistema ASM </w:t>
-      </w:r>
-      <w:proofErr w:type="spellStart"/>
-      <w:r>
-        <w:t>Tasks</w:t>
-      </w:r>
-      <w:proofErr w:type="spellEnd"/>
-      <w:r>
-        <w:t>. Este documento serve como base para o entendimento compartilhado entre todas as partes envolvidas no projeto: desenvolvedor, empresa Always System Manager e instituição de ensino UNOESTE.</w:t>
+        <w:t>A finalidade desta Especificação de Requisitos de Software (ERS) é definir de forma clara e precisa as funcionalidades, restrições e características técnicas do sistema ASM Tasks. Este documento serve como base para o entendimento compartilhado entre todas as partes envolvidas no projeto: desenvolvedor, empresa Always System Manager e instituição de ensino UNOESTE.</w:t>
       </w:r>
     </w:p>
     <w:p>
@@ -1770,36 +1753,12 @@
     </w:p>
     <w:p>
       <w:r>
-        <w:t xml:space="preserve">O ASM </w:t>
-      </w:r>
-      <w:proofErr w:type="spellStart"/>
-      <w:r>
-        <w:t>Tasks</w:t>
-      </w:r>
-      <w:proofErr w:type="spellEnd"/>
-      <w:r>
-        <w:t xml:space="preserve"> é um sistema voltado para a gestão e acompanhamento de tarefas internas da Always System Manager, abrangendo os setores de desenvolvimento de software e suporte de hardware. Ele permitirá o gerenciamento de tarefas em um quadro </w:t>
-      </w:r>
-      <w:proofErr w:type="spellStart"/>
-      <w:r>
-        <w:t>Kanban</w:t>
-      </w:r>
-      <w:proofErr w:type="spellEnd"/>
-      <w:r>
-        <w:t xml:space="preserve"> com etapas personalizáveis, a utilização de filtros avançados de acordo com prioridade, responsável ou setor, bem como a criação de lembretes por meio de uma agenda integrada, tanto pessoais quanto atribuídos a outros colaboradores. Também contará com funcionalidades de histórico de movimentações e controle de usuários, garantindo rastreabilidade e segurança no uso.</w:t>
+        <w:t>O ASM Tasks é um sistema voltado para a gestão e acompanhamento de tarefas internas da Always System Manager, abrangendo os setores de desenvolvimento de software e suporte de hardware. Ele permitirá o gerenciamento de tarefas em um quadro Kanban com etapas personalizáveis, a utilização de filtros avançados de acordo com prioridade, responsável ou setor, bem como a criação de lembretes por meio de uma agenda integrada, tanto pessoais quanto atribuídos a outros colaboradores. Também contará com funcionalidades de histórico de movimentações e controle de usuários, garantindo rastreabilidade e segurança no uso.</w:t>
       </w:r>
     </w:p>
     <w:p>
       <w:r>
-        <w:t xml:space="preserve">Além das funcionalidades gerais descritas, o ASM </w:t>
-      </w:r>
-      <w:proofErr w:type="spellStart"/>
-      <w:r>
-        <w:t>Tasks</w:t>
-      </w:r>
-      <w:proofErr w:type="spellEnd"/>
-      <w:r>
-        <w:t xml:space="preserve"> contará com funções básicas como gerenciar colaboradores, clientes, prioridades de tarefa, etapas de desenvolvimento e setores. Essas operações são essenciais para estruturar os dados internos da empresa, permitindo que o sistema mantenha consistência na organização de informações e forneça suporte às funcionalidades mais avançadas.</w:t>
+        <w:t>Além das funcionalidades gerais descritas, o ASM Tasks contará com funções básicas como gerenciar colaboradores, clientes, prioridades de tarefa, etapas de desenvolvimento e setores. Essas operações são essenciais para estruturar os dados internos da empresa, permitindo que o sistema mantenha consistência na organização de informações e forneça suporte às funcionalidades mais avançadas.</w:t>
       </w:r>
     </w:p>
     <w:p>
@@ -1813,15 +1772,7 @@
       </w:r>
       <w:r>
         <w:lastRenderedPageBreak/>
-        <w:t xml:space="preserve">das demandas. As datas das tarefas devem ser validadas no momento do agendamento para evitar </w:t>
-      </w:r>
-      <w:proofErr w:type="spellStart"/>
-      <w:r>
-        <w:t>superalocação</w:t>
-      </w:r>
-      <w:proofErr w:type="spellEnd"/>
-      <w:r>
-        <w:t xml:space="preserve"> de atividades para um mesmo colaborador.</w:t>
+        <w:t>das demandas. As datas das tarefas devem ser validadas no momento do agendamento para evitar superalocação de atividades para um mesmo colaborador.</w:t>
       </w:r>
     </w:p>
     <w:p>
@@ -1916,15 +1867,7 @@
         </w:numPr>
       </w:pPr>
       <w:r>
-        <w:t xml:space="preserve">ERP: Enterprise </w:t>
-      </w:r>
-      <w:proofErr w:type="spellStart"/>
-      <w:r>
-        <w:t>Resource</w:t>
-      </w:r>
-      <w:proofErr w:type="spellEnd"/>
-      <w:r>
-        <w:t xml:space="preserve"> Planning (Sistema Integrado de Gestão).</w:t>
+        <w:t>ERP: Enterprise Resource Planning (Sistema Integrado de Gestão).</w:t>
       </w:r>
     </w:p>
     <w:p>
@@ -1935,13 +1878,8 @@
           <w:numId w:val="6"/>
         </w:numPr>
       </w:pPr>
-      <w:proofErr w:type="spellStart"/>
       <w:r>
-        <w:t>Kanban</w:t>
-      </w:r>
-      <w:proofErr w:type="spellEnd"/>
-      <w:r>
-        <w:t>: Método de organização de tarefas baseado em quadros e cartões.</w:t>
+        <w:t>Kanban: Método de organização de tarefas baseado em quadros e cartões.</w:t>
       </w:r>
     </w:p>
     <w:p>
@@ -2322,15 +2260,7 @@
     </w:p>
     <w:p>
       <w:r>
-        <w:t xml:space="preserve">Endereço: Rua José </w:t>
-      </w:r>
-      <w:proofErr w:type="spellStart"/>
-      <w:r>
-        <w:t>Bongiovani</w:t>
-      </w:r>
-      <w:proofErr w:type="spellEnd"/>
-      <w:r>
-        <w:t>, 700 – Cidade Universitária – Presidente Prudente – SP</w:t>
+        <w:t>Endereço: Rua José Bongiovani, 700 – Cidade Universitária – Presidente Prudente – SP</w:t>
       </w:r>
     </w:p>
     <w:p>
@@ -2408,23 +2338,7 @@
         <w:t>, 520</w:t>
       </w:r>
       <w:r>
-        <w:t xml:space="preserve">), no estado de São Paulo, a empresa tem como proprietário </w:t>
-      </w:r>
-      <w:proofErr w:type="spellStart"/>
-      <w:r>
-        <w:t>Alvaro</w:t>
-      </w:r>
-      <w:proofErr w:type="spellEnd"/>
-      <w:r>
-        <w:t xml:space="preserve"> </w:t>
-      </w:r>
-      <w:proofErr w:type="spellStart"/>
-      <w:r>
-        <w:t>Shioji</w:t>
-      </w:r>
-      <w:proofErr w:type="spellEnd"/>
-      <w:r>
-        <w:t xml:space="preserve"> Matsuda e consolidou-se como uma parceira estratégica para diferentes segmentos, como granjas, transportadoras, distribuidoras e comércio em geral.</w:t>
+        <w:t>), no estado de São Paulo, a empresa tem como proprietário Alvaro Shioji Matsuda e consolidou-se como uma parceira estratégica para diferentes segmentos, como granjas, transportadoras, distribuidoras e comércio em geral.</w:t>
       </w:r>
     </w:p>
     <w:p>
@@ -2433,15 +2347,7 @@
       </w:r>
       <w:r>
         <w:lastRenderedPageBreak/>
-        <w:t xml:space="preserve">diversificada que integra áreas de gerência e BI, financeiro, desenvolvimento mobile, desenvolvimento </w:t>
-      </w:r>
-      <w:proofErr w:type="spellStart"/>
-      <w:r>
-        <w:t>fullstack</w:t>
-      </w:r>
-      <w:proofErr w:type="spellEnd"/>
-      <w:r>
-        <w:t xml:space="preserve"> em VB6 e suporte técnico.</w:t>
+        <w:t>diversificada que integra áreas de gerência e BI, financeiro, desenvolvimento mobile, desenvolvimento fullstack em VB6 e suporte técnico.</w:t>
       </w:r>
     </w:p>
     <w:p>
@@ -6472,17 +6378,17 @@
             </w:pPr>
             <w:r>
               <w:rPr>
+                <w:rFonts w:eastAsia="Calibri"/>
                 <w:b/>
                 <w:bCs/>
-                <w:noProof/>
                 <w:sz w:val="20"/>
                 <w:szCs w:val="16"/>
               </w:rPr>
               <w:drawing>
-                <wp:inline distT="0" distB="0" distL="0" distR="0" wp14:anchorId="24073358" wp14:editId="3CA514E4">
-                  <wp:extent cx="4525200" cy="3560400"/>
-                  <wp:effectExtent l="0" t="0" r="8890" b="2540"/>
-                  <wp:docPr id="47" name="Imagem 47"/>
+                <wp:inline distT="0" distB="0" distL="0" distR="0" wp14:anchorId="059F5915" wp14:editId="41E89BD0">
+                  <wp:extent cx="5364000" cy="4219200"/>
+                  <wp:effectExtent l="0" t="0" r="8255" b="0"/>
+                  <wp:docPr id="33" name="Imagem 33"/>
                   <wp:cNvGraphicFramePr>
                     <a:graphicFrameLocks xmlns:a="http://schemas.openxmlformats.org/drawingml/2006/main" noChangeAspect="1"/>
                   </wp:cNvGraphicFramePr>
@@ -6502,7 +6408,7 @@
                         <pic:spPr>
                           <a:xfrm>
                             <a:off x="0" y="0"/>
-                            <a:ext cx="4525200" cy="3560400"/>
+                            <a:ext cx="5364000" cy="4219200"/>
                           </a:xfrm>
                           <a:prstGeom prst="rect">
                             <a:avLst/>
@@ -6651,7 +6557,6 @@
                 <w:sz w:val="20"/>
                 <w:szCs w:val="16"/>
               </w:rPr>
-              <w:lastRenderedPageBreak/>
               <w:t>Detalhamento com protótipo</w:t>
             </w:r>
           </w:p>
@@ -6892,7 +6797,6 @@
                 <w:sz w:val="20"/>
                 <w:szCs w:val="16"/>
               </w:rPr>
-              <w:lastRenderedPageBreak/>
               <w:t>Modal de cadastro do setor</w:t>
             </w:r>
           </w:p>
@@ -7108,7 +7012,6 @@
                 <w:sz w:val="20"/>
                 <w:szCs w:val="16"/>
               </w:rPr>
-              <w:lastRenderedPageBreak/>
               <w:t>Modal de alteração do cadastro do setor</w:t>
             </w:r>
           </w:p>
@@ -7387,7 +7290,6 @@
                 <w:sz w:val="20"/>
                 <w:szCs w:val="16"/>
               </w:rPr>
-              <w:lastRenderedPageBreak/>
               <w:t>Modal de mensagem caso tente excluir um setor atribuído a uma tarefa ativa</w:t>
             </w:r>
           </w:p>
@@ -8180,10 +8082,10 @@
                 <w:szCs w:val="16"/>
               </w:rPr>
               <w:drawing>
-                <wp:inline distT="0" distB="0" distL="0" distR="0" wp14:anchorId="1C0E89A9" wp14:editId="682398F6">
-                  <wp:extent cx="5392800" cy="2700000"/>
-                  <wp:effectExtent l="0" t="0" r="0" b="5715"/>
-                  <wp:docPr id="46" name="Imagem 46"/>
+                <wp:inline distT="0" distB="0" distL="0" distR="0" wp14:anchorId="0EE82788" wp14:editId="13C9156B">
+                  <wp:extent cx="5371200" cy="2685600"/>
+                  <wp:effectExtent l="0" t="0" r="1270" b="635"/>
+                  <wp:docPr id="34" name="Imagem 34"/>
                   <wp:cNvGraphicFramePr>
                     <a:graphicFrameLocks xmlns:a="http://schemas.openxmlformats.org/drawingml/2006/main" noChangeAspect="1"/>
                   </wp:cNvGraphicFramePr>
@@ -8203,7 +8105,7 @@
                         <pic:spPr>
                           <a:xfrm>
                             <a:off x="0" y="0"/>
-                            <a:ext cx="5392800" cy="2700000"/>
+                            <a:ext cx="5371200" cy="2685600"/>
                           </a:xfrm>
                           <a:prstGeom prst="rect">
                             <a:avLst/>
@@ -9952,10 +9854,10 @@
                 <w:szCs w:val="16"/>
               </w:rPr>
               <w:drawing>
-                <wp:inline distT="0" distB="0" distL="0" distR="0" wp14:anchorId="2967724A" wp14:editId="22C57E51">
-                  <wp:extent cx="5338800" cy="2617200"/>
-                  <wp:effectExtent l="0" t="0" r="0" b="0"/>
-                  <wp:docPr id="2" name="Imagem 2"/>
+                <wp:inline distT="0" distB="0" distL="0" distR="0" wp14:anchorId="75B3578D" wp14:editId="3F59EB74">
+                  <wp:extent cx="5400000" cy="2664000"/>
+                  <wp:effectExtent l="0" t="0" r="0" b="3175"/>
+                  <wp:docPr id="35" name="Imagem 35"/>
                   <wp:cNvGraphicFramePr>
                     <a:graphicFrameLocks xmlns:a="http://schemas.openxmlformats.org/drawingml/2006/main" noChangeAspect="1"/>
                   </wp:cNvGraphicFramePr>
@@ -9975,7 +9877,7 @@
                         <pic:spPr>
                           <a:xfrm>
                             <a:off x="0" y="0"/>
-                            <a:ext cx="5338800" cy="2617200"/>
+                            <a:ext cx="5400000" cy="2664000"/>
                           </a:xfrm>
                           <a:prstGeom prst="rect">
                             <a:avLst/>
@@ -10157,6 +10059,7 @@
             <w:r>
               <w:rPr>
                 <w:rFonts w:eastAsia="Noto Sans Symbols"/>
+                <w:noProof/>
                 <w:sz w:val="20"/>
                 <w:szCs w:val="16"/>
               </w:rPr>
@@ -10303,6 +10206,7 @@
             <w:r>
               <w:rPr>
                 <w:rFonts w:eastAsia="Noto Sans Symbols"/>
+                <w:noProof/>
                 <w:sz w:val="20"/>
                 <w:szCs w:val="16"/>
               </w:rPr>
@@ -10388,6 +10292,7 @@
             <w:r>
               <w:rPr>
                 <w:rFonts w:eastAsia="Noto Sans Symbols"/>
+                <w:noProof/>
                 <w:sz w:val="20"/>
                 <w:szCs w:val="16"/>
               </w:rPr>
@@ -10554,6 +10459,7 @@
             <w:r>
               <w:rPr>
                 <w:rFonts w:eastAsia="Noto Sans Symbols"/>
+                <w:noProof/>
                 <w:sz w:val="20"/>
                 <w:szCs w:val="16"/>
               </w:rPr>
@@ -10639,6 +10545,7 @@
             <w:r>
               <w:rPr>
                 <w:rFonts w:eastAsia="Noto Sans Symbols"/>
+                <w:noProof/>
                 <w:sz w:val="20"/>
                 <w:szCs w:val="16"/>
               </w:rPr>
@@ -10745,6 +10652,7 @@
             <w:r>
               <w:rPr>
                 <w:rFonts w:eastAsia="Noto Sans Symbols"/>
+                <w:noProof/>
                 <w:sz w:val="20"/>
                 <w:szCs w:val="16"/>
               </w:rPr>
@@ -10830,6 +10738,7 @@
             <w:r>
               <w:rPr>
                 <w:rFonts w:eastAsia="Noto Sans Symbols"/>
+                <w:noProof/>
                 <w:sz w:val="20"/>
                 <w:szCs w:val="16"/>
               </w:rPr>
@@ -11169,15 +11078,7 @@
     </w:p>
     <w:p>
       <w:r>
-        <w:t xml:space="preserve">Documento disponibilizado pela UNOESTE, utilizado como guia para estruturar a Especificação de Requisitos de Software (ERS) do ASM </w:t>
-      </w:r>
-      <w:proofErr w:type="spellStart"/>
-      <w:r>
-        <w:t>Tasks</w:t>
-      </w:r>
-      <w:proofErr w:type="spellEnd"/>
-      <w:r>
-        <w:t>. Este modelo serviu como base para definir o formato, tópicos e detalhamento das funcionalidades e artefatos apresentados ao longo do documento.</w:t>
+        <w:t>Documento disponibilizado pela UNOESTE, utilizado como guia para estruturar a Especificação de Requisitos de Software (ERS) do ASM Tasks. Este modelo serviu como base para definir o formato, tópicos e detalhamento das funcionalidades e artefatos apresentados ao longo do documento.</w:t>
       </w:r>
     </w:p>
     <w:p/>
@@ -11211,15 +11112,7 @@
         <w:t>tarefas</w:t>
       </w:r>
       <w:r>
-        <w:t xml:space="preserve">. Nela é possível observar alguns elementos relevantes que serviram de inspiração para o levantamento de requisitos do ASM </w:t>
-      </w:r>
-      <w:proofErr w:type="spellStart"/>
-      <w:r>
-        <w:t>Tasks</w:t>
-      </w:r>
-      <w:proofErr w:type="spellEnd"/>
-      <w:r>
-        <w:t>.</w:t>
+        <w:t>. Nela é possível observar alguns elementos relevantes que serviram de inspiração para o levantamento de requisitos do ASM Tasks.</w:t>
       </w:r>
     </w:p>
     <w:p>
@@ -11256,15 +11149,7 @@
     </w:p>
     <w:p>
       <w:r>
-        <w:t xml:space="preserve">Essa interface exemplifica práticas comuns em sistemas de gestão empresarial, como o uso de filtros, acompanhamento por etapas e histórico de execução, que foram consideradas no processo de especificação de requisitos do ASM </w:t>
-      </w:r>
-      <w:proofErr w:type="spellStart"/>
-      <w:r>
-        <w:t>Tasks</w:t>
-      </w:r>
-      <w:proofErr w:type="spellEnd"/>
-      <w:r>
-        <w:t>.</w:t>
+        <w:t>Essa interface exemplifica práticas comuns em sistemas de gestão empresarial, como o uso de filtros, acompanhamento por etapas e histórico de execução, que foram consideradas no processo de especificação de requisitos do ASM Tasks.</w:t>
       </w:r>
     </w:p>
     <w:p/>

</xml_diff>

<commit_message>
Backend + Documentação - Gerenciar cargos
</commit_message>
<xml_diff>
--- a/Documentação/ERS.docx
+++ b/Documentação/ERS.docx
@@ -212,8 +212,17 @@
           <w:sz w:val="28"/>
           <w:szCs w:val="24"/>
         </w:rPr>
-        <w:t>ASM Tasks</w:t>
-      </w:r>
+        <w:t xml:space="preserve">ASM </w:t>
+      </w:r>
+      <w:proofErr w:type="spellStart"/>
+      <w:r>
+        <w:rPr>
+          <w:sz w:val="28"/>
+          <w:szCs w:val="24"/>
+        </w:rPr>
+        <w:t>Tasks</w:t>
+      </w:r>
+      <w:proofErr w:type="spellEnd"/>
     </w:p>
     <w:p>
       <w:pPr>
@@ -1732,7 +1741,15 @@
     </w:p>
     <w:p>
       <w:r>
-        <w:t>A finalidade desta Especificação de Requisitos de Software (ERS) é definir de forma clara e precisa as funcionalidades, restrições e características técnicas do sistema ASM Tasks. Este documento serve como base para o entendimento compartilhado entre todas as partes envolvidas no projeto: desenvolvedor, empresa Always System Manager e instituição de ensino UNOESTE.</w:t>
+        <w:t xml:space="preserve">A finalidade desta Especificação de Requisitos de Software (ERS) é definir de forma clara e precisa as funcionalidades, restrições e características técnicas do sistema ASM </w:t>
+      </w:r>
+      <w:proofErr w:type="spellStart"/>
+      <w:r>
+        <w:t>Tasks</w:t>
+      </w:r>
+      <w:proofErr w:type="spellEnd"/>
+      <w:r>
+        <w:t>. Este documento serve como base para o entendimento compartilhado entre todas as partes envolvidas no projeto: desenvolvedor, empresa Always System Manager e instituição de ensino UNOESTE.</w:t>
       </w:r>
     </w:p>
     <w:p>
@@ -1753,12 +1770,36 @@
     </w:p>
     <w:p>
       <w:r>
-        <w:t>O ASM Tasks é um sistema voltado para a gestão e acompanhamento de tarefas internas da Always System Manager, abrangendo os setores de desenvolvimento de software e suporte de hardware. Ele permitirá o gerenciamento de tarefas em um quadro Kanban com etapas personalizáveis, a utilização de filtros avançados de acordo com prioridade, responsável ou setor, bem como a criação de lembretes por meio de uma agenda integrada, tanto pessoais quanto atribuídos a outros colaboradores. Também contará com funcionalidades de histórico de movimentações e controle de usuários, garantindo rastreabilidade e segurança no uso.</w:t>
+        <w:t xml:space="preserve">O ASM </w:t>
+      </w:r>
+      <w:proofErr w:type="spellStart"/>
+      <w:r>
+        <w:t>Tasks</w:t>
+      </w:r>
+      <w:proofErr w:type="spellEnd"/>
+      <w:r>
+        <w:t xml:space="preserve"> é um sistema voltado para a gestão e acompanhamento de tarefas internas da Always System Manager, abrangendo os setores de desenvolvimento de software e suporte de hardware. Ele permitirá o gerenciamento de tarefas em um quadro </w:t>
+      </w:r>
+      <w:proofErr w:type="spellStart"/>
+      <w:r>
+        <w:t>Kanban</w:t>
+      </w:r>
+      <w:proofErr w:type="spellEnd"/>
+      <w:r>
+        <w:t xml:space="preserve"> com etapas personalizáveis, a utilização de filtros avançados de acordo com prioridade, responsável ou setor, bem como a criação de lembretes por meio de uma agenda integrada, tanto pessoais quanto atribuídos a outros colaboradores. Também contará com funcionalidades de histórico de movimentações e controle de usuários, garantindo rastreabilidade e segurança no uso.</w:t>
       </w:r>
     </w:p>
     <w:p>
       <w:r>
-        <w:t>Além das funcionalidades gerais descritas, o ASM Tasks contará com funções básicas como gerenciar colaboradores, clientes, prioridades de tarefa, etapas de desenvolvimento e setores. Essas operações são essenciais para estruturar os dados internos da empresa, permitindo que o sistema mantenha consistência na organização de informações e forneça suporte às funcionalidades mais avançadas.</w:t>
+        <w:t xml:space="preserve">Além das funcionalidades gerais descritas, o ASM </w:t>
+      </w:r>
+      <w:proofErr w:type="spellStart"/>
+      <w:r>
+        <w:t>Tasks</w:t>
+      </w:r>
+      <w:proofErr w:type="spellEnd"/>
+      <w:r>
+        <w:t xml:space="preserve"> contará com funções básicas como gerenciar colaboradores, clientes, prioridades de tarefa, etapas de desenvolvimento e setores. Essas operações são essenciais para estruturar os dados internos da empresa, permitindo que o sistema mantenha consistência na organização de informações e forneça suporte às funcionalidades mais avançadas.</w:t>
       </w:r>
     </w:p>
     <w:p>
@@ -1772,7 +1813,15 @@
       </w:r>
       <w:r>
         <w:lastRenderedPageBreak/>
-        <w:t>das demandas. As datas das tarefas devem ser validadas no momento do agendamento para evitar superalocação de atividades para um mesmo colaborador.</w:t>
+        <w:t xml:space="preserve">das demandas. As datas das tarefas devem ser validadas no momento do agendamento para evitar </w:t>
+      </w:r>
+      <w:proofErr w:type="spellStart"/>
+      <w:r>
+        <w:t>superalocação</w:t>
+      </w:r>
+      <w:proofErr w:type="spellEnd"/>
+      <w:r>
+        <w:t xml:space="preserve"> de atividades para um mesmo colaborador.</w:t>
       </w:r>
     </w:p>
     <w:p>
@@ -1867,7 +1916,15 @@
         </w:numPr>
       </w:pPr>
       <w:r>
-        <w:t>ERP: Enterprise Resource Planning (Sistema Integrado de Gestão).</w:t>
+        <w:t xml:space="preserve">ERP: Enterprise </w:t>
+      </w:r>
+      <w:proofErr w:type="spellStart"/>
+      <w:r>
+        <w:t>Resource</w:t>
+      </w:r>
+      <w:proofErr w:type="spellEnd"/>
+      <w:r>
+        <w:t xml:space="preserve"> Planning (Sistema Integrado de Gestão).</w:t>
       </w:r>
     </w:p>
     <w:p>
@@ -1878,8 +1935,13 @@
           <w:numId w:val="6"/>
         </w:numPr>
       </w:pPr>
-      <w:r>
-        <w:t>Kanban: Método de organização de tarefas baseado em quadros e cartões.</w:t>
+      <w:proofErr w:type="spellStart"/>
+      <w:r>
+        <w:t>Kanban</w:t>
+      </w:r>
+      <w:proofErr w:type="spellEnd"/>
+      <w:r>
+        <w:t>: Método de organização de tarefas baseado em quadros e cartões.</w:t>
       </w:r>
     </w:p>
     <w:p>
@@ -2260,7 +2322,15 @@
     </w:p>
     <w:p>
       <w:r>
-        <w:t>Endereço: Rua José Bongiovani, 700 – Cidade Universitária – Presidente Prudente – SP</w:t>
+        <w:t xml:space="preserve">Endereço: Rua José </w:t>
+      </w:r>
+      <w:proofErr w:type="spellStart"/>
+      <w:r>
+        <w:t>Bongiovani</w:t>
+      </w:r>
+      <w:proofErr w:type="spellEnd"/>
+      <w:r>
+        <w:t>, 700 – Cidade Universitária – Presidente Prudente – SP</w:t>
       </w:r>
     </w:p>
     <w:p>
@@ -2338,7 +2408,23 @@
         <w:t>, 520</w:t>
       </w:r>
       <w:r>
-        <w:t>), no estado de São Paulo, a empresa tem como proprietário Alvaro Shioji Matsuda e consolidou-se como uma parceira estratégica para diferentes segmentos, como granjas, transportadoras, distribuidoras e comércio em geral.</w:t>
+        <w:t xml:space="preserve">), no estado de São Paulo, a empresa tem como proprietário </w:t>
+      </w:r>
+      <w:proofErr w:type="spellStart"/>
+      <w:r>
+        <w:t>Alvaro</w:t>
+      </w:r>
+      <w:proofErr w:type="spellEnd"/>
+      <w:r>
+        <w:t xml:space="preserve"> </w:t>
+      </w:r>
+      <w:proofErr w:type="spellStart"/>
+      <w:r>
+        <w:t>Shioji</w:t>
+      </w:r>
+      <w:proofErr w:type="spellEnd"/>
+      <w:r>
+        <w:t xml:space="preserve"> Matsuda e consolidou-se como uma parceira estratégica para diferentes segmentos, como granjas, transportadoras, distribuidoras e comércio em geral.</w:t>
       </w:r>
     </w:p>
     <w:p>
@@ -2347,7 +2433,15 @@
       </w:r>
       <w:r>
         <w:lastRenderedPageBreak/>
-        <w:t>diversificada que integra áreas de gerência e BI, financeiro, desenvolvimento mobile, desenvolvimento fullstack em VB6 e suporte técnico.</w:t>
+        <w:t xml:space="preserve">diversificada que integra áreas de gerência e BI, financeiro, desenvolvimento mobile, desenvolvimento </w:t>
+      </w:r>
+      <w:proofErr w:type="spellStart"/>
+      <w:r>
+        <w:t>fullstack</w:t>
+      </w:r>
+      <w:proofErr w:type="spellEnd"/>
+      <w:r>
+        <w:t xml:space="preserve"> em VB6 e suporte técnico.</w:t>
       </w:r>
     </w:p>
     <w:p>
@@ -3208,7 +3302,23 @@
                 <w:sz w:val="18"/>
                 <w:szCs w:val="18"/>
               </w:rPr>
-              <w:t xml:space="preserve">Gerenciar colaboradores </w:t>
+              <w:t>Gerenciar</w:t>
+            </w:r>
+            <w:r>
+              <w:rPr>
+                <w:rFonts w:eastAsia="Calibri"/>
+                <w:sz w:val="18"/>
+                <w:szCs w:val="18"/>
+              </w:rPr>
+              <w:t xml:space="preserve"> </w:t>
+            </w:r>
+            <w:r>
+              <w:rPr>
+                <w:rFonts w:eastAsia="Calibri"/>
+                <w:sz w:val="18"/>
+                <w:szCs w:val="18"/>
+              </w:rPr>
+              <w:t>cargos</w:t>
             </w:r>
           </w:p>
           <w:p>
@@ -3299,6 +3409,13 @@
                 <w:szCs w:val="18"/>
               </w:rPr>
             </w:pPr>
+            <w:r>
+              <w:rPr>
+                <w:sz w:val="18"/>
+                <w:szCs w:val="18"/>
+              </w:rPr>
+              <w:t>SP4</w:t>
+            </w:r>
           </w:p>
         </w:tc>
         <w:tc>
@@ -3374,7 +3491,7 @@
                 <w:sz w:val="18"/>
                 <w:szCs w:val="18"/>
               </w:rPr>
-              <w:t>Gerenciar clientes</w:t>
+              <w:t>Gerenciar colaboradores</w:t>
             </w:r>
           </w:p>
           <w:p>
@@ -3463,8 +3580,16 @@
               <w:rPr>
                 <w:sz w:val="18"/>
                 <w:szCs w:val="18"/>
-              </w:rPr>
-            </w:pPr>
+                <w:u w:val="single"/>
+              </w:rPr>
+            </w:pPr>
+            <w:r>
+              <w:rPr>
+                <w:sz w:val="18"/>
+                <w:szCs w:val="18"/>
+              </w:rPr>
+              <w:t>SP4</w:t>
+            </w:r>
           </w:p>
         </w:tc>
         <w:tc>
@@ -3540,23 +3665,7 @@
                 <w:sz w:val="18"/>
                 <w:szCs w:val="18"/>
               </w:rPr>
-              <w:t>Gerenciar</w:t>
-            </w:r>
-            <w:r>
-              <w:rPr>
-                <w:rFonts w:eastAsia="Calibri"/>
-                <w:sz w:val="18"/>
-                <w:szCs w:val="18"/>
-              </w:rPr>
-              <w:t xml:space="preserve"> </w:t>
-            </w:r>
-            <w:r>
-              <w:rPr>
-                <w:rFonts w:eastAsia="Calibri"/>
-                <w:sz w:val="18"/>
-                <w:szCs w:val="18"/>
-              </w:rPr>
-              <w:t>cargos</w:t>
+              <w:t>Gerenciar clientes</w:t>
             </w:r>
           </w:p>
           <w:p>
@@ -6084,23 +6193,59 @@
                 <w:sz w:val="20"/>
                 <w:szCs w:val="16"/>
               </w:rPr>
-              <w:t>Ao tentar excluir um setor que possua tarefas em andamento, o sistema deve impedir a exclusão e exibir mensagem de alerta ao usuário</w:t>
-            </w:r>
-            <w:r>
-              <w:rPr>
-                <w:rFonts w:eastAsia="Calibri"/>
-                <w:sz w:val="20"/>
-                <w:szCs w:val="16"/>
-              </w:rPr>
-              <w:t>, para que tome ciência e realoque outro setor para as tarefas que estão vinculadas</w:t>
-            </w:r>
-            <w:r>
-              <w:rPr>
-                <w:rFonts w:eastAsia="Calibri"/>
-                <w:sz w:val="20"/>
-                <w:szCs w:val="16"/>
-              </w:rPr>
-              <w:t>.</w:t>
+              <w:t>Ao tentar excluir (inativar) um setor, o sistema deve impedir a operação e exibir uma mensagem de alerta ao usuário caso qualquer uma das seguintes dependências ativas seja encontrada</w:t>
+            </w:r>
+            <w:r>
+              <w:rPr>
+                <w:rFonts w:eastAsia="Calibri"/>
+                <w:sz w:val="20"/>
+                <w:szCs w:val="16"/>
+              </w:rPr>
+              <w:t>:</w:t>
+            </w:r>
+          </w:p>
+          <w:p>
+            <w:pPr>
+              <w:pStyle w:val="PargrafodaLista"/>
+              <w:numPr>
+                <w:ilvl w:val="0"/>
+                <w:numId w:val="13"/>
+              </w:numPr>
+              <w:rPr>
+                <w:rFonts w:eastAsia="Noto Sans Symbols" w:cs="Arial"/>
+                <w:sz w:val="20"/>
+                <w:szCs w:val="16"/>
+              </w:rPr>
+            </w:pPr>
+            <w:r>
+              <w:rPr>
+                <w:rFonts w:eastAsia="Noto Sans Symbols" w:cs="Arial"/>
+                <w:sz w:val="20"/>
+                <w:szCs w:val="16"/>
+              </w:rPr>
+              <w:t>Tarefas em Andamento: Se o setor possuir tarefas com status em andamento diretamente vinculadas a ele</w:t>
+            </w:r>
+          </w:p>
+          <w:p>
+            <w:pPr>
+              <w:pStyle w:val="PargrafodaLista"/>
+              <w:numPr>
+                <w:ilvl w:val="0"/>
+                <w:numId w:val="13"/>
+              </w:numPr>
+              <w:rPr>
+                <w:rFonts w:eastAsia="Noto Sans Symbols" w:cs="Arial"/>
+                <w:sz w:val="20"/>
+                <w:szCs w:val="16"/>
+              </w:rPr>
+            </w:pPr>
+            <w:r>
+              <w:rPr>
+                <w:rFonts w:eastAsia="Noto Sans Symbols" w:cs="Arial"/>
+                <w:sz w:val="20"/>
+                <w:szCs w:val="16"/>
+              </w:rPr>
+              <w:t>Colaboradores Ativos Vinculados: Se houver colaboradores com status ativo no sistema que ainda estejam com a FK de Setor apontando para o setor a ser inativado.</w:t>
             </w:r>
           </w:p>
           <w:p>
@@ -6319,33 +6464,6 @@
           <w:p>
             <w:pPr>
               <w:rPr>
-                <w:rFonts w:ascii="Courier New" w:eastAsia="Courier New" w:hAnsi="Courier New" w:cs="Courier New"/>
-                <w:sz w:val="20"/>
-                <w:szCs w:val="16"/>
-              </w:rPr>
-            </w:pPr>
-          </w:p>
-          <w:p>
-            <w:pPr>
-              <w:rPr>
-                <w:rFonts w:ascii="Courier New" w:eastAsia="Courier New" w:hAnsi="Courier New" w:cs="Courier New"/>
-                <w:sz w:val="20"/>
-                <w:szCs w:val="16"/>
-              </w:rPr>
-            </w:pPr>
-          </w:p>
-          <w:p>
-            <w:pPr>
-              <w:rPr>
-                <w:rFonts w:ascii="Courier New" w:eastAsia="Courier New" w:hAnsi="Courier New" w:cs="Courier New"/>
-                <w:sz w:val="20"/>
-                <w:szCs w:val="16"/>
-              </w:rPr>
-            </w:pPr>
-          </w:p>
-          <w:p>
-            <w:pPr>
-              <w:rPr>
                 <w:rFonts w:eastAsia="Calibri"/>
                 <w:b/>
                 <w:bCs/>
@@ -6378,9 +6496,9 @@
             </w:pPr>
             <w:r>
               <w:rPr>
-                <w:rFonts w:eastAsia="Calibri"/>
                 <w:b/>
                 <w:bCs/>
+                <w:noProof/>
                 <w:sz w:val="20"/>
                 <w:szCs w:val="16"/>
               </w:rPr>
@@ -6464,15 +6582,14 @@
             </w:pPr>
             <w:r>
               <w:rPr>
-                <w:rFonts w:ascii="Calibri" w:hAnsi="Calibri"/>
-                <w:noProof/>
+                <w:rFonts w:ascii="Calibri" w:eastAsia="Calibri" w:hAnsi="Calibri" w:cs="Calibri"/>
                 <w:sz w:val="20"/>
                 <w:szCs w:val="16"/>
               </w:rPr>
               <w:drawing>
-                <wp:inline distT="0" distB="0" distL="0" distR="0" wp14:anchorId="3A54071A" wp14:editId="4C5BF42C">
-                  <wp:extent cx="4806000" cy="3600000"/>
-                  <wp:effectExtent l="0" t="0" r="0" b="635"/>
+                <wp:inline distT="0" distB="0" distL="0" distR="0" wp14:anchorId="5AA8247F" wp14:editId="5FB3B33F">
+                  <wp:extent cx="4708800" cy="3574800"/>
+                  <wp:effectExtent l="0" t="0" r="0" b="6985"/>
                   <wp:docPr id="1" name="Imagem 1"/>
                   <wp:cNvGraphicFramePr>
                     <a:graphicFrameLocks xmlns:a="http://schemas.openxmlformats.org/drawingml/2006/main" noChangeAspect="1"/>
@@ -6493,7 +6610,7 @@
                         <pic:spPr>
                           <a:xfrm>
                             <a:off x="0" y="0"/>
-                            <a:ext cx="4806000" cy="3600000"/>
+                            <a:ext cx="4708800" cy="3574800"/>
                           </a:xfrm>
                           <a:prstGeom prst="rect">
                             <a:avLst/>
@@ -6516,9 +6633,7 @@
                 <w:szCs w:val="16"/>
               </w:rPr>
             </w:pPr>
-          </w:p>
-          <w:p>
-            <w:pPr>
+            <w:r>
               <w:rPr>
                 <w:rFonts w:eastAsia="Calibri"/>
                 <w:b/>
@@ -6526,37 +6641,7 @@
                 <w:sz w:val="20"/>
                 <w:szCs w:val="16"/>
               </w:rPr>
-            </w:pPr>
-          </w:p>
-          <w:p>
-            <w:pPr>
-              <w:rPr>
-                <w:rFonts w:eastAsia="Calibri"/>
-                <w:b/>
-                <w:bCs/>
-                <w:sz w:val="20"/>
-                <w:szCs w:val="16"/>
-              </w:rPr>
-            </w:pPr>
-          </w:p>
-          <w:p>
-            <w:pPr>
-              <w:rPr>
-                <w:rFonts w:eastAsia="Calibri"/>
-                <w:b/>
-                <w:bCs/>
-                <w:sz w:val="20"/>
-                <w:szCs w:val="16"/>
-              </w:rPr>
-            </w:pPr>
-            <w:r>
-              <w:rPr>
-                <w:rFonts w:eastAsia="Calibri"/>
-                <w:b/>
-                <w:bCs/>
-                <w:sz w:val="20"/>
-                <w:szCs w:val="16"/>
-              </w:rPr>
+              <w:lastRenderedPageBreak/>
               <w:t>Detalhamento com protótipo</w:t>
             </w:r>
           </w:p>
@@ -6797,6 +6882,7 @@
                 <w:sz w:val="20"/>
                 <w:szCs w:val="16"/>
               </w:rPr>
+              <w:lastRenderedPageBreak/>
               <w:t>Modal de cadastro do setor</w:t>
             </w:r>
           </w:p>
@@ -7012,6 +7098,7 @@
                 <w:sz w:val="20"/>
                 <w:szCs w:val="16"/>
               </w:rPr>
+              <w:lastRenderedPageBreak/>
               <w:t>Modal de alteração do cadastro do setor</w:t>
             </w:r>
           </w:p>
@@ -7290,6 +7377,7 @@
                 <w:sz w:val="20"/>
                 <w:szCs w:val="16"/>
               </w:rPr>
+              <w:lastRenderedPageBreak/>
               <w:t>Modal de mensagem caso tente excluir um setor atribuído a uma tarefa ativa</w:t>
             </w:r>
           </w:p>
@@ -8165,17 +8253,17 @@
             </w:pPr>
             <w:r>
               <w:rPr>
+                <w:rFonts w:eastAsia="Calibri"/>
                 <w:b/>
                 <w:bCs/>
-                <w:noProof/>
                 <w:sz w:val="20"/>
                 <w:szCs w:val="16"/>
               </w:rPr>
               <w:drawing>
-                <wp:inline distT="0" distB="0" distL="0" distR="0" wp14:anchorId="0C514572" wp14:editId="38AFFD98">
-                  <wp:extent cx="2926800" cy="3600000"/>
-                  <wp:effectExtent l="0" t="0" r="6985" b="635"/>
-                  <wp:docPr id="44" name="Imagem 44"/>
+                <wp:inline distT="0" distB="0" distL="0" distR="0" wp14:anchorId="449A1507" wp14:editId="492C27BF">
+                  <wp:extent cx="2822400" cy="3589200"/>
+                  <wp:effectExtent l="0" t="0" r="0" b="0"/>
+                  <wp:docPr id="25" name="Imagem 25"/>
                   <wp:cNvGraphicFramePr>
                     <a:graphicFrameLocks xmlns:a="http://schemas.openxmlformats.org/drawingml/2006/main" noChangeAspect="1"/>
                   </wp:cNvGraphicFramePr>
@@ -8195,7 +8283,7 @@
                         <pic:spPr>
                           <a:xfrm>
                             <a:off x="0" y="0"/>
-                            <a:ext cx="2926800" cy="3600000"/>
+                            <a:ext cx="2822400" cy="3589200"/>
                           </a:xfrm>
                           <a:prstGeom prst="rect">
                             <a:avLst/>
@@ -9949,17 +10037,17 @@
             </w:pPr>
             <w:r>
               <w:rPr>
+                <w:rFonts w:eastAsia="Calibri"/>
                 <w:b/>
                 <w:bCs/>
-                <w:noProof/>
                 <w:sz w:val="20"/>
                 <w:szCs w:val="16"/>
               </w:rPr>
               <w:drawing>
-                <wp:inline distT="0" distB="0" distL="0" distR="0" wp14:anchorId="528FE453" wp14:editId="5E2D4EF4">
-                  <wp:extent cx="4125600" cy="3585600"/>
-                  <wp:effectExtent l="0" t="0" r="8255" b="0"/>
-                  <wp:docPr id="25" name="Imagem 25"/>
+                <wp:inline distT="0" distB="0" distL="0" distR="0" wp14:anchorId="2DC4C2FD" wp14:editId="760F02BF">
+                  <wp:extent cx="3150000" cy="3589200"/>
+                  <wp:effectExtent l="0" t="0" r="0" b="0"/>
+                  <wp:docPr id="45" name="Imagem 45"/>
                   <wp:cNvGraphicFramePr>
                     <a:graphicFrameLocks xmlns:a="http://schemas.openxmlformats.org/drawingml/2006/main" noChangeAspect="1"/>
                   </wp:cNvGraphicFramePr>
@@ -9979,7 +10067,7 @@
                         <pic:spPr>
                           <a:xfrm>
                             <a:off x="0" y="0"/>
-                            <a:ext cx="4125600" cy="3585600"/>
+                            <a:ext cx="3150000" cy="3589200"/>
                           </a:xfrm>
                           <a:prstGeom prst="rect">
                             <a:avLst/>
@@ -10796,8 +10884,1126 @@
       <w:pPr>
         <w:pStyle w:val="Ttulo1"/>
       </w:pPr>
-      <w:r>
-        <w:lastRenderedPageBreak/>
+    </w:p>
+    <w:p>
+      <w:pPr>
+        <w:pStyle w:val="Ttulo1"/>
+      </w:pPr>
+    </w:p>
+    <w:p>
+      <w:pPr>
+        <w:spacing w:after="240" w:line="259" w:lineRule="auto"/>
+        <w:rPr>
+          <w:b/>
+          <w:caps/>
+          <w:color w:val="2E75B5"/>
+          <w:sz w:val="32"/>
+          <w:szCs w:val="32"/>
+        </w:rPr>
+      </w:pPr>
+      <w:r>
+        <w:br w:type="page"/>
+      </w:r>
+    </w:p>
+    <w:tbl>
+      <w:tblPr>
+        <w:tblStyle w:val="a2"/>
+        <w:tblW w:w="9627" w:type="dxa"/>
+        <w:tblInd w:w="0" w:type="dxa"/>
+        <w:tblBorders>
+          <w:top w:val="single" w:sz="4" w:space="0" w:color="000000"/>
+          <w:left w:val="single" w:sz="4" w:space="0" w:color="000000"/>
+          <w:bottom w:val="single" w:sz="4" w:space="0" w:color="000000"/>
+          <w:right w:val="single" w:sz="4" w:space="0" w:color="000000"/>
+          <w:insideH w:val="single" w:sz="4" w:space="0" w:color="000000"/>
+          <w:insideV w:val="single" w:sz="4" w:space="0" w:color="000000"/>
+        </w:tblBorders>
+        <w:tblLayout w:type="fixed"/>
+        <w:tblLook w:val="0400" w:firstRow="0" w:lastRow="0" w:firstColumn="0" w:lastColumn="0" w:noHBand="0" w:noVBand="1"/>
+      </w:tblPr>
+      <w:tblGrid>
+        <w:gridCol w:w="9627"/>
+      </w:tblGrid>
+      <w:tr>
+        <w:tc>
+          <w:tcPr>
+            <w:tcW w:w="9627" w:type="dxa"/>
+            <w:shd w:val="clear" w:color="auto" w:fill="F2F2F2"/>
+          </w:tcPr>
+          <w:p>
+            <w:pPr>
+              <w:rPr>
+                <w:rFonts w:eastAsia="Calibri"/>
+                <w:b/>
+                <w:bCs/>
+                <w:sz w:val="20"/>
+                <w:szCs w:val="16"/>
+              </w:rPr>
+            </w:pPr>
+            <w:r>
+              <w:rPr>
+                <w:rFonts w:eastAsia="Calibri"/>
+                <w:b/>
+                <w:bCs/>
+                <w:sz w:val="20"/>
+                <w:szCs w:val="16"/>
+              </w:rPr>
+              <w:lastRenderedPageBreak/>
+              <w:t xml:space="preserve">Estória </w:t>
+            </w:r>
+            <w:r>
+              <w:rPr>
+                <w:rFonts w:eastAsia="Calibri"/>
+                <w:b/>
+                <w:bCs/>
+                <w:sz w:val="20"/>
+                <w:szCs w:val="16"/>
+              </w:rPr>
+              <w:t>4</w:t>
+            </w:r>
+            <w:r>
+              <w:rPr>
+                <w:rFonts w:eastAsia="Calibri"/>
+                <w:b/>
+                <w:bCs/>
+                <w:sz w:val="20"/>
+                <w:szCs w:val="16"/>
+              </w:rPr>
+              <w:t xml:space="preserve">: </w:t>
+            </w:r>
+            <w:r>
+              <w:rPr>
+                <w:rFonts w:eastAsia="Calibri"/>
+                <w:b/>
+                <w:bCs/>
+                <w:sz w:val="20"/>
+                <w:szCs w:val="16"/>
+              </w:rPr>
+              <w:t>Gerenciar cargos</w:t>
+            </w:r>
+          </w:p>
+          <w:p>
+            <w:pPr>
+              <w:rPr>
+                <w:rFonts w:eastAsia="Calibri"/>
+                <w:b/>
+                <w:sz w:val="20"/>
+                <w:szCs w:val="16"/>
+              </w:rPr>
+            </w:pPr>
+            <w:r>
+              <w:rPr>
+                <w:rFonts w:eastAsia="Calibri"/>
+                <w:sz w:val="20"/>
+                <w:szCs w:val="16"/>
+              </w:rPr>
+              <w:t>Como administrador do sistema, quero gerenciar os cargos (listar, buscar, cadastrar, alterar e excluir), para estruturar a hierarquia organizacional e permitir que os colaboradores sejam vinculados corretamente de acordo com suas funções.</w:t>
+            </w:r>
+          </w:p>
+        </w:tc>
+      </w:tr>
+      <w:tr>
+        <w:tc>
+          <w:tcPr>
+            <w:tcW w:w="9627" w:type="dxa"/>
+          </w:tcPr>
+          <w:p>
+            <w:pPr>
+              <w:rPr>
+                <w:rFonts w:eastAsia="Calibri"/>
+                <w:b/>
+                <w:bCs/>
+                <w:sz w:val="20"/>
+                <w:szCs w:val="16"/>
+              </w:rPr>
+            </w:pPr>
+            <w:r>
+              <w:rPr>
+                <w:rFonts w:eastAsia="Calibri"/>
+                <w:b/>
+                <w:bCs/>
+                <w:sz w:val="20"/>
+                <w:szCs w:val="16"/>
+              </w:rPr>
+              <w:t>Especificação do Requisito</w:t>
+            </w:r>
+          </w:p>
+          <w:p>
+            <w:pPr>
+              <w:pStyle w:val="PargrafodaLista"/>
+              <w:numPr>
+                <w:ilvl w:val="0"/>
+                <w:numId w:val="12"/>
+              </w:numPr>
+              <w:rPr>
+                <w:rFonts w:ascii="Noto Sans Symbols" w:eastAsia="Noto Sans Symbols" w:hAnsi="Noto Sans Symbols" w:cs="Noto Sans Symbols"/>
+                <w:sz w:val="20"/>
+                <w:szCs w:val="16"/>
+              </w:rPr>
+            </w:pPr>
+            <w:r>
+              <w:rPr>
+                <w:rFonts w:eastAsia="Calibri"/>
+                <w:sz w:val="20"/>
+                <w:szCs w:val="16"/>
+              </w:rPr>
+              <w:t>Deve ser possível listar todos os cargos cadastrados no sistema, com opção de busca por nome ou descrição.</w:t>
+            </w:r>
+          </w:p>
+          <w:p>
+            <w:pPr>
+              <w:pStyle w:val="PargrafodaLista"/>
+              <w:numPr>
+                <w:ilvl w:val="0"/>
+                <w:numId w:val="12"/>
+              </w:numPr>
+              <w:rPr>
+                <w:rFonts w:ascii="Noto Sans Symbols" w:eastAsia="Noto Sans Symbols" w:hAnsi="Noto Sans Symbols" w:cs="Noto Sans Symbols"/>
+                <w:sz w:val="20"/>
+                <w:szCs w:val="16"/>
+              </w:rPr>
+            </w:pPr>
+            <w:r>
+              <w:rPr>
+                <w:rFonts w:eastAsia="Calibri"/>
+                <w:sz w:val="20"/>
+                <w:szCs w:val="16"/>
+              </w:rPr>
+              <w:t>O sistema deve permitir o cadastro de novos cargos, contendo os seguintes campos obrigatórios:</w:t>
+            </w:r>
+          </w:p>
+          <w:p>
+            <w:pPr>
+              <w:pStyle w:val="PargrafodaLista"/>
+              <w:numPr>
+                <w:ilvl w:val="1"/>
+                <w:numId w:val="1"/>
+              </w:numPr>
+              <w:rPr>
+                <w:rFonts w:ascii="Courier New" w:eastAsia="Courier New" w:hAnsi="Courier New" w:cs="Courier New"/>
+                <w:sz w:val="20"/>
+                <w:szCs w:val="16"/>
+              </w:rPr>
+            </w:pPr>
+            <w:r>
+              <w:rPr>
+                <w:rFonts w:eastAsia="Calibri"/>
+                <w:sz w:val="20"/>
+                <w:szCs w:val="16"/>
+              </w:rPr>
+              <w:t xml:space="preserve">Nome (não pode se repetir e não ser vazio) </w:t>
+            </w:r>
+          </w:p>
+          <w:p>
+            <w:pPr>
+              <w:pStyle w:val="PargrafodaLista"/>
+              <w:numPr>
+                <w:ilvl w:val="1"/>
+                <w:numId w:val="1"/>
+              </w:numPr>
+              <w:rPr>
+                <w:rFonts w:ascii="Courier New" w:eastAsia="Courier New" w:hAnsi="Courier New" w:cs="Courier New"/>
+                <w:sz w:val="20"/>
+                <w:szCs w:val="16"/>
+              </w:rPr>
+            </w:pPr>
+            <w:r>
+              <w:rPr>
+                <w:rFonts w:eastAsia="Calibri"/>
+                <w:sz w:val="20"/>
+                <w:szCs w:val="16"/>
+              </w:rPr>
+              <w:t>Descrição</w:t>
+            </w:r>
+          </w:p>
+          <w:p>
+            <w:pPr>
+              <w:pStyle w:val="PargrafodaLista"/>
+              <w:numPr>
+                <w:ilvl w:val="0"/>
+                <w:numId w:val="1"/>
+              </w:numPr>
+              <w:rPr>
+                <w:rFonts w:ascii="Noto Sans Symbols" w:eastAsia="Noto Sans Symbols" w:hAnsi="Noto Sans Symbols" w:cs="Noto Sans Symbols"/>
+                <w:sz w:val="20"/>
+                <w:szCs w:val="16"/>
+              </w:rPr>
+            </w:pPr>
+            <w:r>
+              <w:rPr>
+                <w:rFonts w:eastAsia="Calibri"/>
+                <w:sz w:val="20"/>
+                <w:szCs w:val="16"/>
+              </w:rPr>
+              <w:t>O sistema deve permitir alterar os dados de um cargo já existente, observando as mesmas validações acima.</w:t>
+            </w:r>
+          </w:p>
+          <w:p>
+            <w:pPr>
+              <w:pStyle w:val="PargrafodaLista"/>
+              <w:numPr>
+                <w:ilvl w:val="0"/>
+                <w:numId w:val="1"/>
+              </w:numPr>
+              <w:rPr>
+                <w:rFonts w:ascii="Noto Sans Symbols" w:eastAsia="Noto Sans Symbols" w:hAnsi="Noto Sans Symbols" w:cs="Noto Sans Symbols"/>
+                <w:sz w:val="20"/>
+                <w:szCs w:val="16"/>
+              </w:rPr>
+            </w:pPr>
+            <w:r>
+              <w:rPr>
+                <w:rFonts w:eastAsia="Calibri"/>
+                <w:sz w:val="20"/>
+                <w:szCs w:val="16"/>
+              </w:rPr>
+              <w:t>A exclusão de um cargo deve ser apenas lógica (inativação), para preservar o histórico de colaboradores vinculados.</w:t>
+            </w:r>
+          </w:p>
+          <w:p>
+            <w:pPr>
+              <w:pStyle w:val="PargrafodaLista"/>
+              <w:numPr>
+                <w:ilvl w:val="0"/>
+                <w:numId w:val="1"/>
+              </w:numPr>
+              <w:rPr>
+                <w:rFonts w:ascii="Noto Sans Symbols" w:eastAsia="Noto Sans Symbols" w:hAnsi="Noto Sans Symbols" w:cs="Noto Sans Symbols"/>
+                <w:sz w:val="20"/>
+                <w:szCs w:val="16"/>
+              </w:rPr>
+            </w:pPr>
+            <w:r>
+              <w:rPr>
+                <w:rFonts w:eastAsia="Calibri"/>
+                <w:sz w:val="20"/>
+                <w:szCs w:val="16"/>
+              </w:rPr>
+              <w:t>Ao tentar excluir um cargo que possua colaboradores ativos, o sistema deve impedir a exclusão e exibir uma mensagem de alerta, informando que é necessário realocar esses colaboradores para outro cargo antes de prosseguir.</w:t>
+            </w:r>
+          </w:p>
+          <w:p>
+            <w:pPr>
+              <w:pStyle w:val="PargrafodaLista"/>
+              <w:numPr>
+                <w:ilvl w:val="0"/>
+                <w:numId w:val="1"/>
+              </w:numPr>
+              <w:rPr>
+                <w:rFonts w:ascii="Noto Sans Symbols" w:eastAsia="Noto Sans Symbols" w:hAnsi="Noto Sans Symbols" w:cs="Noto Sans Symbols"/>
+                <w:sz w:val="20"/>
+                <w:szCs w:val="16"/>
+              </w:rPr>
+            </w:pPr>
+            <w:r>
+              <w:rPr>
+                <w:rFonts w:eastAsia="Calibri"/>
+                <w:sz w:val="20"/>
+                <w:szCs w:val="16"/>
+              </w:rPr>
+              <w:t>A interface deve conter:</w:t>
+            </w:r>
+          </w:p>
+          <w:p>
+            <w:pPr>
+              <w:pStyle w:val="PargrafodaLista"/>
+              <w:numPr>
+                <w:ilvl w:val="1"/>
+                <w:numId w:val="1"/>
+              </w:numPr>
+              <w:rPr>
+                <w:rFonts w:ascii="Courier New" w:eastAsia="Courier New" w:hAnsi="Courier New" w:cs="Courier New"/>
+                <w:sz w:val="20"/>
+                <w:szCs w:val="16"/>
+              </w:rPr>
+            </w:pPr>
+            <w:r>
+              <w:rPr>
+                <w:rFonts w:eastAsia="Calibri"/>
+                <w:sz w:val="20"/>
+                <w:szCs w:val="16"/>
+              </w:rPr>
+              <w:t>Um botão para cadastrar novo cargo, abrindo uma modal de cadastro, onde aparecerão os campos para preencher os dados.</w:t>
+            </w:r>
+          </w:p>
+          <w:p>
+            <w:pPr>
+              <w:pStyle w:val="PargrafodaLista"/>
+              <w:numPr>
+                <w:ilvl w:val="1"/>
+                <w:numId w:val="1"/>
+              </w:numPr>
+              <w:rPr>
+                <w:rFonts w:ascii="Courier New" w:eastAsia="Courier New" w:hAnsi="Courier New" w:cs="Courier New"/>
+                <w:sz w:val="20"/>
+                <w:szCs w:val="16"/>
+              </w:rPr>
+            </w:pPr>
+            <w:r>
+              <w:rPr>
+                <w:rFonts w:eastAsia="Calibri"/>
+                <w:sz w:val="20"/>
+                <w:szCs w:val="16"/>
+              </w:rPr>
+              <w:t>Uma listagem com todos os cargos estará disponível de duas formas, sendo em lista ou cartões, permitindo clicar em cada item para abrir modal de visualização/edição/inativação/reativação.</w:t>
+            </w:r>
+            <w:r>
+              <w:rPr>
+                <w:rFonts w:eastAsia="Calibri"/>
+                <w:sz w:val="20"/>
+                <w:szCs w:val="16"/>
+              </w:rPr>
+              <w:t xml:space="preserve"> </w:t>
+            </w:r>
+          </w:p>
+          <w:p>
+            <w:pPr>
+              <w:pStyle w:val="PargrafodaLista"/>
+              <w:ind w:left="1440"/>
+              <w:rPr>
+                <w:rFonts w:ascii="Courier New" w:eastAsia="Courier New" w:hAnsi="Courier New" w:cs="Courier New"/>
+                <w:sz w:val="20"/>
+                <w:szCs w:val="16"/>
+              </w:rPr>
+            </w:pPr>
+          </w:p>
+          <w:p>
+            <w:pPr>
+              <w:rPr>
+                <w:rFonts w:eastAsia="Calibri"/>
+                <w:b/>
+                <w:bCs/>
+                <w:sz w:val="20"/>
+                <w:szCs w:val="16"/>
+              </w:rPr>
+            </w:pPr>
+            <w:r>
+              <w:rPr>
+                <w:rFonts w:eastAsia="Calibri"/>
+                <w:b/>
+                <w:bCs/>
+                <w:sz w:val="20"/>
+                <w:szCs w:val="16"/>
+              </w:rPr>
+              <w:t>Diagrama de Classe do Contexto</w:t>
+            </w:r>
+          </w:p>
+          <w:p>
+            <w:pPr>
+              <w:jc w:val="center"/>
+              <w:rPr>
+                <w:rFonts w:eastAsia="Calibri"/>
+                <w:b/>
+                <w:bCs/>
+                <w:sz w:val="20"/>
+                <w:szCs w:val="16"/>
+              </w:rPr>
+            </w:pPr>
+            <w:r>
+              <w:rPr>
+                <w:rFonts w:eastAsia="Calibri"/>
+                <w:b/>
+                <w:bCs/>
+                <w:sz w:val="20"/>
+                <w:szCs w:val="16"/>
+              </w:rPr>
+              <w:drawing>
+                <wp:inline distT="0" distB="0" distL="0" distR="0" wp14:anchorId="212E1CC1" wp14:editId="24D89937">
+                  <wp:extent cx="5378400" cy="2782800"/>
+                  <wp:effectExtent l="0" t="0" r="0" b="0"/>
+                  <wp:docPr id="48" name="Imagem 48"/>
+                  <wp:cNvGraphicFramePr>
+                    <a:graphicFrameLocks xmlns:a="http://schemas.openxmlformats.org/drawingml/2006/main" noChangeAspect="1"/>
+                  </wp:cNvGraphicFramePr>
+                  <a:graphic xmlns:a="http://schemas.openxmlformats.org/drawingml/2006/main">
+                    <a:graphicData uri="http://schemas.openxmlformats.org/drawingml/2006/picture">
+                      <pic:pic xmlns:pic="http://schemas.openxmlformats.org/drawingml/2006/picture">
+                        <pic:nvPicPr>
+                          <pic:cNvPr id="1" name=""/>
+                          <pic:cNvPicPr/>
+                        </pic:nvPicPr>
+                        <pic:blipFill>
+                          <a:blip r:embed="rId42"/>
+                          <a:stretch>
+                            <a:fillRect/>
+                          </a:stretch>
+                        </pic:blipFill>
+                        <pic:spPr>
+                          <a:xfrm>
+                            <a:off x="0" y="0"/>
+                            <a:ext cx="5378400" cy="2782800"/>
+                          </a:xfrm>
+                          <a:prstGeom prst="rect">
+                            <a:avLst/>
+                          </a:prstGeom>
+                        </pic:spPr>
+                      </pic:pic>
+                    </a:graphicData>
+                  </a:graphic>
+                </wp:inline>
+              </w:drawing>
+            </w:r>
+          </w:p>
+          <w:p>
+            <w:pPr>
+              <w:jc w:val="center"/>
+              <w:rPr>
+                <w:rFonts w:eastAsia="Calibri"/>
+                <w:b/>
+                <w:bCs/>
+                <w:sz w:val="20"/>
+                <w:szCs w:val="16"/>
+              </w:rPr>
+            </w:pPr>
+          </w:p>
+          <w:p>
+            <w:pPr>
+              <w:rPr>
+                <w:rFonts w:eastAsia="Calibri"/>
+                <w:b/>
+                <w:bCs/>
+                <w:sz w:val="20"/>
+                <w:szCs w:val="16"/>
+              </w:rPr>
+            </w:pPr>
+            <w:r>
+              <w:rPr>
+                <w:rFonts w:eastAsia="Calibri"/>
+                <w:b/>
+                <w:bCs/>
+                <w:sz w:val="20"/>
+                <w:szCs w:val="16"/>
+              </w:rPr>
+              <w:lastRenderedPageBreak/>
+              <w:t>Diagrama de ER do Contexto</w:t>
+            </w:r>
+          </w:p>
+          <w:p>
+            <w:pPr>
+              <w:jc w:val="center"/>
+              <w:rPr>
+                <w:rFonts w:eastAsia="Calibri"/>
+                <w:b/>
+                <w:bCs/>
+                <w:sz w:val="20"/>
+                <w:szCs w:val="16"/>
+              </w:rPr>
+            </w:pPr>
+            <w:r>
+              <w:rPr>
+                <w:rFonts w:eastAsia="Calibri"/>
+                <w:b/>
+                <w:bCs/>
+                <w:sz w:val="20"/>
+                <w:szCs w:val="16"/>
+              </w:rPr>
+              <w:drawing>
+                <wp:inline distT="0" distB="0" distL="0" distR="0" wp14:anchorId="2D02AE30" wp14:editId="0ED42F7E">
+                  <wp:extent cx="3160800" cy="3589200"/>
+                  <wp:effectExtent l="0" t="0" r="1905" b="0"/>
+                  <wp:docPr id="46" name="Imagem 46"/>
+                  <wp:cNvGraphicFramePr>
+                    <a:graphicFrameLocks xmlns:a="http://schemas.openxmlformats.org/drawingml/2006/main" noChangeAspect="1"/>
+                  </wp:cNvGraphicFramePr>
+                  <a:graphic xmlns:a="http://schemas.openxmlformats.org/drawingml/2006/main">
+                    <a:graphicData uri="http://schemas.openxmlformats.org/drawingml/2006/picture">
+                      <pic:pic xmlns:pic="http://schemas.openxmlformats.org/drawingml/2006/picture">
+                        <pic:nvPicPr>
+                          <pic:cNvPr id="1" name=""/>
+                          <pic:cNvPicPr/>
+                        </pic:nvPicPr>
+                        <pic:blipFill>
+                          <a:blip r:embed="rId43"/>
+                          <a:stretch>
+                            <a:fillRect/>
+                          </a:stretch>
+                        </pic:blipFill>
+                        <pic:spPr>
+                          <a:xfrm>
+                            <a:off x="0" y="0"/>
+                            <a:ext cx="3160800" cy="3589200"/>
+                          </a:xfrm>
+                          <a:prstGeom prst="rect">
+                            <a:avLst/>
+                          </a:prstGeom>
+                        </pic:spPr>
+                      </pic:pic>
+                    </a:graphicData>
+                  </a:graphic>
+                </wp:inline>
+              </w:drawing>
+            </w:r>
+          </w:p>
+          <w:p>
+            <w:pPr>
+              <w:rPr>
+                <w:rFonts w:eastAsia="Calibri"/>
+                <w:b/>
+                <w:bCs/>
+                <w:sz w:val="20"/>
+                <w:szCs w:val="16"/>
+              </w:rPr>
+            </w:pPr>
+          </w:p>
+          <w:p>
+            <w:pPr>
+              <w:rPr>
+                <w:rFonts w:eastAsia="Calibri"/>
+                <w:b/>
+                <w:bCs/>
+                <w:sz w:val="20"/>
+                <w:szCs w:val="16"/>
+              </w:rPr>
+            </w:pPr>
+            <w:r>
+              <w:rPr>
+                <w:rFonts w:eastAsia="Calibri"/>
+                <w:b/>
+                <w:bCs/>
+                <w:sz w:val="20"/>
+                <w:szCs w:val="16"/>
+              </w:rPr>
+              <w:t>Detalhamento com protótipo</w:t>
+            </w:r>
+          </w:p>
+          <w:p>
+            <w:pPr>
+              <w:pStyle w:val="PargrafodaLista"/>
+              <w:numPr>
+                <w:ilvl w:val="0"/>
+                <w:numId w:val="14"/>
+              </w:numPr>
+              <w:jc w:val="left"/>
+              <w:rPr>
+                <w:rFonts w:eastAsia="Noto Sans Symbols"/>
+                <w:sz w:val="20"/>
+                <w:szCs w:val="16"/>
+              </w:rPr>
+            </w:pPr>
+            <w:r>
+              <w:rPr>
+                <w:rFonts w:eastAsia="Noto Sans Symbols"/>
+                <w:sz w:val="20"/>
+                <w:szCs w:val="16"/>
+              </w:rPr>
+              <w:t xml:space="preserve">Listagem de </w:t>
+            </w:r>
+            <w:r>
+              <w:rPr>
+                <w:rFonts w:eastAsia="Noto Sans Symbols"/>
+                <w:sz w:val="20"/>
+                <w:szCs w:val="16"/>
+              </w:rPr>
+              <w:t>cargos</w:t>
+            </w:r>
+            <w:r>
+              <w:rPr>
+                <w:rFonts w:eastAsia="Noto Sans Symbols"/>
+                <w:sz w:val="20"/>
+                <w:szCs w:val="16"/>
+              </w:rPr>
+              <w:t xml:space="preserve"> em forma de cards</w:t>
+            </w:r>
+          </w:p>
+          <w:p>
+            <w:pPr>
+              <w:jc w:val="center"/>
+              <w:rPr>
+                <w:rFonts w:eastAsia="Noto Sans Symbols"/>
+                <w:sz w:val="20"/>
+                <w:szCs w:val="16"/>
+              </w:rPr>
+            </w:pPr>
+          </w:p>
+          <w:p>
+            <w:pPr>
+              <w:jc w:val="left"/>
+              <w:rPr>
+                <w:rFonts w:eastAsia="Noto Sans Symbols"/>
+                <w:sz w:val="20"/>
+                <w:szCs w:val="16"/>
+              </w:rPr>
+            </w:pPr>
+          </w:p>
+          <w:p>
+            <w:pPr>
+              <w:jc w:val="left"/>
+              <w:rPr>
+                <w:rFonts w:eastAsia="Noto Sans Symbols"/>
+                <w:sz w:val="20"/>
+                <w:szCs w:val="16"/>
+              </w:rPr>
+            </w:pPr>
+          </w:p>
+          <w:p>
+            <w:pPr>
+              <w:jc w:val="left"/>
+              <w:rPr>
+                <w:rFonts w:eastAsia="Noto Sans Symbols"/>
+                <w:sz w:val="20"/>
+                <w:szCs w:val="16"/>
+              </w:rPr>
+            </w:pPr>
+          </w:p>
+          <w:p>
+            <w:pPr>
+              <w:jc w:val="left"/>
+              <w:rPr>
+                <w:rFonts w:eastAsia="Noto Sans Symbols"/>
+                <w:sz w:val="20"/>
+                <w:szCs w:val="16"/>
+              </w:rPr>
+            </w:pPr>
+          </w:p>
+          <w:p>
+            <w:pPr>
+              <w:jc w:val="left"/>
+              <w:rPr>
+                <w:rFonts w:eastAsia="Noto Sans Symbols"/>
+                <w:sz w:val="20"/>
+                <w:szCs w:val="16"/>
+              </w:rPr>
+            </w:pPr>
+          </w:p>
+          <w:p>
+            <w:pPr>
+              <w:jc w:val="left"/>
+              <w:rPr>
+                <w:rFonts w:eastAsia="Noto Sans Symbols"/>
+                <w:sz w:val="20"/>
+                <w:szCs w:val="16"/>
+              </w:rPr>
+            </w:pPr>
+          </w:p>
+          <w:p>
+            <w:pPr>
+              <w:jc w:val="left"/>
+              <w:rPr>
+                <w:rFonts w:eastAsia="Noto Sans Symbols"/>
+                <w:sz w:val="20"/>
+                <w:szCs w:val="16"/>
+              </w:rPr>
+            </w:pPr>
+          </w:p>
+          <w:p>
+            <w:pPr>
+              <w:pStyle w:val="PargrafodaLista"/>
+              <w:numPr>
+                <w:ilvl w:val="0"/>
+                <w:numId w:val="14"/>
+              </w:numPr>
+              <w:jc w:val="left"/>
+              <w:rPr>
+                <w:rFonts w:eastAsia="Noto Sans Symbols"/>
+                <w:sz w:val="20"/>
+                <w:szCs w:val="16"/>
+              </w:rPr>
+            </w:pPr>
+            <w:r>
+              <w:rPr>
+                <w:rFonts w:eastAsia="Noto Sans Symbols"/>
+                <w:sz w:val="20"/>
+                <w:szCs w:val="16"/>
+              </w:rPr>
+              <w:t xml:space="preserve">Listagem de </w:t>
+            </w:r>
+            <w:r>
+              <w:rPr>
+                <w:rFonts w:eastAsia="Noto Sans Symbols"/>
+                <w:sz w:val="20"/>
+                <w:szCs w:val="16"/>
+              </w:rPr>
+              <w:t>cargos</w:t>
+            </w:r>
+            <w:r>
+              <w:rPr>
+                <w:rFonts w:eastAsia="Noto Sans Symbols"/>
+                <w:sz w:val="20"/>
+                <w:szCs w:val="16"/>
+              </w:rPr>
+              <w:t xml:space="preserve"> </w:t>
+            </w:r>
+            <w:r>
+              <w:rPr>
+                <w:rFonts w:eastAsia="Noto Sans Symbols"/>
+                <w:sz w:val="20"/>
+                <w:szCs w:val="16"/>
+              </w:rPr>
+              <w:t>em forma de lista</w:t>
+            </w:r>
+          </w:p>
+          <w:p>
+            <w:pPr>
+              <w:jc w:val="center"/>
+              <w:rPr>
+                <w:rFonts w:eastAsia="Noto Sans Symbols"/>
+                <w:sz w:val="20"/>
+                <w:szCs w:val="16"/>
+              </w:rPr>
+            </w:pPr>
+          </w:p>
+          <w:p>
+            <w:pPr>
+              <w:jc w:val="left"/>
+              <w:rPr>
+                <w:rFonts w:eastAsia="Noto Sans Symbols"/>
+                <w:sz w:val="20"/>
+                <w:szCs w:val="16"/>
+              </w:rPr>
+            </w:pPr>
+          </w:p>
+          <w:p>
+            <w:pPr>
+              <w:pStyle w:val="PargrafodaLista"/>
+              <w:numPr>
+                <w:ilvl w:val="0"/>
+                <w:numId w:val="14"/>
+              </w:numPr>
+              <w:jc w:val="left"/>
+              <w:rPr>
+                <w:rFonts w:eastAsia="Noto Sans Symbols"/>
+                <w:sz w:val="20"/>
+                <w:szCs w:val="16"/>
+              </w:rPr>
+            </w:pPr>
+            <w:r>
+              <w:rPr>
+                <w:rFonts w:eastAsia="Noto Sans Symbols"/>
+                <w:sz w:val="20"/>
+                <w:szCs w:val="16"/>
+              </w:rPr>
+              <w:t>Modal de cadastro d</w:t>
+            </w:r>
+            <w:r>
+              <w:rPr>
+                <w:rFonts w:eastAsia="Noto Sans Symbols"/>
+                <w:sz w:val="20"/>
+                <w:szCs w:val="16"/>
+              </w:rPr>
+              <w:t>o cargo</w:t>
+            </w:r>
+          </w:p>
+          <w:p>
+            <w:pPr>
+              <w:jc w:val="center"/>
+              <w:rPr>
+                <w:rFonts w:eastAsia="Noto Sans Symbols"/>
+                <w:sz w:val="20"/>
+                <w:szCs w:val="16"/>
+              </w:rPr>
+            </w:pPr>
+          </w:p>
+          <w:p>
+            <w:pPr>
+              <w:jc w:val="left"/>
+              <w:rPr>
+                <w:rFonts w:eastAsia="Noto Sans Symbols"/>
+                <w:sz w:val="20"/>
+                <w:szCs w:val="16"/>
+              </w:rPr>
+            </w:pPr>
+          </w:p>
+          <w:p>
+            <w:pPr>
+              <w:jc w:val="left"/>
+              <w:rPr>
+                <w:rFonts w:eastAsia="Noto Sans Symbols"/>
+                <w:sz w:val="20"/>
+                <w:szCs w:val="16"/>
+              </w:rPr>
+            </w:pPr>
+          </w:p>
+          <w:p>
+            <w:pPr>
+              <w:jc w:val="left"/>
+              <w:rPr>
+                <w:rFonts w:eastAsia="Noto Sans Symbols"/>
+                <w:sz w:val="20"/>
+                <w:szCs w:val="16"/>
+              </w:rPr>
+            </w:pPr>
+          </w:p>
+          <w:p>
+            <w:pPr>
+              <w:jc w:val="left"/>
+              <w:rPr>
+                <w:rFonts w:eastAsia="Noto Sans Symbols"/>
+                <w:sz w:val="20"/>
+                <w:szCs w:val="16"/>
+              </w:rPr>
+            </w:pPr>
+          </w:p>
+          <w:p>
+            <w:pPr>
+              <w:jc w:val="left"/>
+              <w:rPr>
+                <w:rFonts w:eastAsia="Noto Sans Symbols"/>
+                <w:sz w:val="20"/>
+                <w:szCs w:val="16"/>
+              </w:rPr>
+            </w:pPr>
+          </w:p>
+          <w:p>
+            <w:pPr>
+              <w:jc w:val="left"/>
+              <w:rPr>
+                <w:rFonts w:eastAsia="Noto Sans Symbols"/>
+                <w:sz w:val="20"/>
+                <w:szCs w:val="16"/>
+              </w:rPr>
+            </w:pPr>
+          </w:p>
+          <w:p>
+            <w:pPr>
+              <w:jc w:val="left"/>
+              <w:rPr>
+                <w:rFonts w:eastAsia="Noto Sans Symbols"/>
+                <w:sz w:val="20"/>
+                <w:szCs w:val="16"/>
+              </w:rPr>
+            </w:pPr>
+          </w:p>
+          <w:p>
+            <w:pPr>
+              <w:jc w:val="left"/>
+              <w:rPr>
+                <w:rFonts w:eastAsia="Noto Sans Symbols"/>
+                <w:sz w:val="20"/>
+                <w:szCs w:val="16"/>
+              </w:rPr>
+            </w:pPr>
+          </w:p>
+          <w:p>
+            <w:pPr>
+              <w:jc w:val="left"/>
+              <w:rPr>
+                <w:rFonts w:eastAsia="Noto Sans Symbols"/>
+                <w:sz w:val="20"/>
+                <w:szCs w:val="16"/>
+              </w:rPr>
+            </w:pPr>
+          </w:p>
+          <w:p>
+            <w:pPr>
+              <w:pStyle w:val="PargrafodaLista"/>
+              <w:numPr>
+                <w:ilvl w:val="0"/>
+                <w:numId w:val="14"/>
+              </w:numPr>
+              <w:jc w:val="left"/>
+              <w:rPr>
+                <w:rFonts w:eastAsia="Noto Sans Symbols"/>
+                <w:sz w:val="20"/>
+                <w:szCs w:val="16"/>
+              </w:rPr>
+            </w:pPr>
+            <w:r>
+              <w:rPr>
+                <w:rFonts w:eastAsia="Noto Sans Symbols"/>
+                <w:sz w:val="20"/>
+                <w:szCs w:val="16"/>
+              </w:rPr>
+              <w:t>Modal de visualização do cadastro da etapa</w:t>
+            </w:r>
+          </w:p>
+          <w:p>
+            <w:pPr>
+              <w:jc w:val="center"/>
+              <w:rPr>
+                <w:rFonts w:eastAsia="Noto Sans Symbols"/>
+                <w:sz w:val="20"/>
+                <w:szCs w:val="16"/>
+              </w:rPr>
+            </w:pPr>
+          </w:p>
+          <w:p>
+            <w:pPr>
+              <w:jc w:val="left"/>
+              <w:rPr>
+                <w:rFonts w:eastAsia="Noto Sans Symbols"/>
+                <w:sz w:val="20"/>
+                <w:szCs w:val="16"/>
+              </w:rPr>
+            </w:pPr>
+          </w:p>
+          <w:p>
+            <w:pPr>
+              <w:pStyle w:val="PargrafodaLista"/>
+              <w:numPr>
+                <w:ilvl w:val="0"/>
+                <w:numId w:val="14"/>
+              </w:numPr>
+              <w:jc w:val="left"/>
+              <w:rPr>
+                <w:rFonts w:eastAsia="Noto Sans Symbols"/>
+                <w:sz w:val="20"/>
+                <w:szCs w:val="16"/>
+              </w:rPr>
+            </w:pPr>
+            <w:r>
+              <w:rPr>
+                <w:rFonts w:eastAsia="Noto Sans Symbols"/>
+                <w:sz w:val="20"/>
+                <w:szCs w:val="16"/>
+              </w:rPr>
+              <w:t>Modal de alteração do cadastro da etapa</w:t>
+            </w:r>
+          </w:p>
+          <w:p>
+            <w:pPr>
+              <w:jc w:val="center"/>
+              <w:rPr>
+                <w:rFonts w:eastAsia="Noto Sans Symbols"/>
+                <w:sz w:val="20"/>
+                <w:szCs w:val="16"/>
+              </w:rPr>
+            </w:pPr>
+          </w:p>
+          <w:p>
+            <w:pPr>
+              <w:jc w:val="left"/>
+              <w:rPr>
+                <w:rFonts w:eastAsia="Noto Sans Symbols"/>
+                <w:sz w:val="20"/>
+                <w:szCs w:val="16"/>
+              </w:rPr>
+            </w:pPr>
+          </w:p>
+          <w:p>
+            <w:pPr>
+              <w:jc w:val="left"/>
+              <w:rPr>
+                <w:rFonts w:eastAsia="Noto Sans Symbols"/>
+                <w:sz w:val="20"/>
+                <w:szCs w:val="16"/>
+              </w:rPr>
+            </w:pPr>
+          </w:p>
+          <w:p>
+            <w:pPr>
+              <w:jc w:val="left"/>
+              <w:rPr>
+                <w:rFonts w:eastAsia="Noto Sans Symbols"/>
+                <w:sz w:val="20"/>
+                <w:szCs w:val="16"/>
+              </w:rPr>
+            </w:pPr>
+          </w:p>
+          <w:p>
+            <w:pPr>
+              <w:pStyle w:val="PargrafodaLista"/>
+              <w:numPr>
+                <w:ilvl w:val="0"/>
+                <w:numId w:val="14"/>
+              </w:numPr>
+              <w:jc w:val="left"/>
+              <w:rPr>
+                <w:rFonts w:eastAsia="Noto Sans Symbols"/>
+                <w:sz w:val="20"/>
+                <w:szCs w:val="16"/>
+              </w:rPr>
+            </w:pPr>
+            <w:r>
+              <w:rPr>
+                <w:rFonts w:eastAsia="Noto Sans Symbols"/>
+                <w:sz w:val="20"/>
+                <w:szCs w:val="16"/>
+              </w:rPr>
+              <w:t>Modal de confirmação de exclusão do cadastro da etapa</w:t>
+            </w:r>
+          </w:p>
+          <w:p>
+            <w:pPr>
+              <w:jc w:val="center"/>
+              <w:rPr>
+                <w:rFonts w:eastAsia="Noto Sans Symbols"/>
+                <w:sz w:val="20"/>
+                <w:szCs w:val="16"/>
+              </w:rPr>
+            </w:pPr>
+          </w:p>
+          <w:p>
+            <w:pPr>
+              <w:jc w:val="center"/>
+              <w:rPr>
+                <w:rFonts w:eastAsia="Noto Sans Symbols"/>
+                <w:sz w:val="20"/>
+                <w:szCs w:val="16"/>
+              </w:rPr>
+            </w:pPr>
+          </w:p>
+          <w:p>
+            <w:pPr>
+              <w:pStyle w:val="PargrafodaLista"/>
+              <w:numPr>
+                <w:ilvl w:val="0"/>
+                <w:numId w:val="14"/>
+              </w:numPr>
+              <w:jc w:val="left"/>
+              <w:rPr>
+                <w:rFonts w:eastAsia="Noto Sans Symbols"/>
+                <w:sz w:val="20"/>
+                <w:szCs w:val="16"/>
+              </w:rPr>
+            </w:pPr>
+            <w:r>
+              <w:rPr>
+                <w:rFonts w:eastAsia="Noto Sans Symbols"/>
+                <w:sz w:val="20"/>
+                <w:szCs w:val="16"/>
+              </w:rPr>
+              <w:t>Modal de mensagem caso tente excluir uma etapa atribuída a uma tarefa ativa</w:t>
+            </w:r>
+          </w:p>
+          <w:p>
+            <w:pPr>
+              <w:jc w:val="center"/>
+              <w:rPr>
+                <w:rFonts w:eastAsia="Noto Sans Symbols"/>
+                <w:sz w:val="20"/>
+                <w:szCs w:val="16"/>
+              </w:rPr>
+            </w:pPr>
+          </w:p>
+          <w:p>
+            <w:pPr>
+              <w:jc w:val="left"/>
+              <w:rPr>
+                <w:rFonts w:eastAsia="Noto Sans Symbols"/>
+                <w:sz w:val="20"/>
+                <w:szCs w:val="16"/>
+              </w:rPr>
+            </w:pPr>
+          </w:p>
+        </w:tc>
+      </w:tr>
+    </w:tbl>
+    <w:p>
+      <w:pPr>
+        <w:pStyle w:val="Ttulo1"/>
+      </w:pPr>
+    </w:p>
+    <w:p>
+      <w:pPr>
+        <w:pStyle w:val="Ttulo1"/>
+      </w:pPr>
+    </w:p>
+    <w:p>
+      <w:pPr>
+        <w:pStyle w:val="Ttulo1"/>
+        <w:tabs>
+          <w:tab w:val="left" w:pos="8815"/>
+        </w:tabs>
+      </w:pPr>
+      <w:r>
+        <w:tab/>
+      </w:r>
+    </w:p>
+    <w:p>
+      <w:pPr>
+        <w:pStyle w:val="Ttulo1"/>
+      </w:pPr>
+      <w:r>
         <w:br w:type="page"/>
       </w:r>
       <w:bookmarkStart w:id="13" w:name="_Toc209377801"/>
@@ -10883,7 +12089,7 @@
                     <pic:cNvPicPr preferRelativeResize="0"/>
                   </pic:nvPicPr>
                   <pic:blipFill>
-                    <a:blip r:embed="rId42"/>
+                    <a:blip r:embed="rId44"/>
                     <a:srcRect/>
                     <a:stretch>
                       <a:fillRect/>
@@ -10961,7 +12167,7 @@
                     <pic:cNvPicPr preferRelativeResize="0"/>
                   </pic:nvPicPr>
                   <pic:blipFill>
-                    <a:blip r:embed="rId43"/>
+                    <a:blip r:embed="rId45"/>
                     <a:srcRect/>
                     <a:stretch>
                       <a:fillRect/>
@@ -11078,7 +12284,15 @@
     </w:p>
     <w:p>
       <w:r>
-        <w:t>Documento disponibilizado pela UNOESTE, utilizado como guia para estruturar a Especificação de Requisitos de Software (ERS) do ASM Tasks. Este modelo serviu como base para definir o formato, tópicos e detalhamento das funcionalidades e artefatos apresentados ao longo do documento.</w:t>
+        <w:t xml:space="preserve">Documento disponibilizado pela UNOESTE, utilizado como guia para estruturar a Especificação de Requisitos de Software (ERS) do ASM </w:t>
+      </w:r>
+      <w:proofErr w:type="spellStart"/>
+      <w:r>
+        <w:t>Tasks</w:t>
+      </w:r>
+      <w:proofErr w:type="spellEnd"/>
+      <w:r>
+        <w:t>. Este modelo serviu como base para definir o formato, tópicos e detalhamento das funcionalidades e artefatos apresentados ao longo do documento.</w:t>
       </w:r>
     </w:p>
     <w:p/>
@@ -11112,7 +12326,15 @@
         <w:t>tarefas</w:t>
       </w:r>
       <w:r>
-        <w:t>. Nela é possível observar alguns elementos relevantes que serviram de inspiração para o levantamento de requisitos do ASM Tasks.</w:t>
+        <w:t xml:space="preserve">. Nela é possível observar alguns elementos relevantes que serviram de inspiração para o levantamento de requisitos do ASM </w:t>
+      </w:r>
+      <w:proofErr w:type="spellStart"/>
+      <w:r>
+        <w:t>Tasks</w:t>
+      </w:r>
+      <w:proofErr w:type="spellEnd"/>
+      <w:r>
+        <w:t>.</w:t>
       </w:r>
     </w:p>
     <w:p>
@@ -11149,7 +12371,15 @@
     </w:p>
     <w:p>
       <w:r>
-        <w:t>Essa interface exemplifica práticas comuns em sistemas de gestão empresarial, como o uso de filtros, acompanhamento por etapas e histórico de execução, que foram consideradas no processo de especificação de requisitos do ASM Tasks.</w:t>
+        <w:t xml:space="preserve">Essa interface exemplifica práticas comuns em sistemas de gestão empresarial, como o uso de filtros, acompanhamento por etapas e histórico de execução, que foram consideradas no processo de especificação de requisitos do ASM </w:t>
+      </w:r>
+      <w:proofErr w:type="spellStart"/>
+      <w:r>
+        <w:t>Tasks</w:t>
+      </w:r>
+      <w:proofErr w:type="spellEnd"/>
+      <w:r>
+        <w:t>.</w:t>
       </w:r>
     </w:p>
     <w:p/>
@@ -11184,7 +12414,7 @@
                     <pic:cNvPicPr preferRelativeResize="0"/>
                   </pic:nvPicPr>
                   <pic:blipFill>
-                    <a:blip r:embed="rId44"/>
+                    <a:blip r:embed="rId46"/>
                     <a:srcRect/>
                     <a:stretch>
                       <a:fillRect/>
@@ -11209,7 +12439,7 @@
     </w:p>
     <w:p/>
     <w:sectPr>
-      <w:footerReference w:type="first" r:id="rId45"/>
+      <w:footerReference w:type="first" r:id="rId47"/>
       <w:pgSz w:w="11906" w:h="16838"/>
       <w:pgMar w:top="1418" w:right="851" w:bottom="1418" w:left="1418" w:header="709" w:footer="709" w:gutter="0"/>
       <w:pgNumType w:start="1"/>
@@ -11281,6 +12511,208 @@
 <file path=word/numbering.xml><?xml version="1.0" encoding="utf-8"?>
 <w:numbering xmlns:wpc="http://schemas.microsoft.com/office/word/2010/wordprocessingCanvas" xmlns:cx="http://schemas.microsoft.com/office/drawing/2014/chartex" xmlns:cx1="http://schemas.microsoft.com/office/drawing/2015/9/8/chartex" xmlns:cx2="http://schemas.microsoft.com/office/drawing/2015/10/21/chartex" xmlns:cx3="http://schemas.microsoft.com/office/drawing/2016/5/9/chartex" xmlns:cx4="http://schemas.microsoft.com/office/drawing/2016/5/10/chartex" xmlns:cx5="http://schemas.microsoft.com/office/drawing/2016/5/11/chartex" xmlns:cx6="http://schemas.microsoft.com/office/drawing/2016/5/12/chartex" xmlns:cx7="http://schemas.microsoft.com/office/drawing/2016/5/13/chartex" xmlns:cx8="http://schemas.microsoft.com/office/drawing/2016/5/14/chartex" xmlns:mc="http://schemas.openxmlformats.org/markup-compatibility/2006" xmlns:aink="http://schemas.microsoft.com/office/drawing/2016/ink" xmlns:am3d="http://schemas.microsoft.com/office/drawing/2017/model3d" xmlns:o="urn:schemas-microsoft-com:office:office" xmlns:r="http://schemas.openxmlformats.org/officeDocument/2006/relationships" xmlns:m="http://schemas.openxmlformats.org/officeDocument/2006/math" xmlns:v="urn:schemas-microsoft-com:vml" xmlns:wp14="http://schemas.microsoft.com/office/word/2010/wordprocessingDrawing" xmlns:wp="http://schemas.openxmlformats.org/drawingml/2006/wordprocessingDrawing" xmlns:w10="urn:schemas-microsoft-com:office:word" xmlns:w="http://schemas.openxmlformats.org/wordprocessingml/2006/main" xmlns:w14="http://schemas.microsoft.com/office/word/2010/wordml" xmlns:w15="http://schemas.microsoft.com/office/word/2012/wordml" xmlns:w16cex="http://schemas.microsoft.com/office/word/2018/wordml/cex" xmlns:w16cid="http://schemas.microsoft.com/office/word/2016/wordml/cid" xmlns:w16="http://schemas.microsoft.com/office/word/2018/wordml" xmlns:w16sdtdh="http://schemas.microsoft.com/office/word/2020/wordml/sdtdatahash" xmlns:w16se="http://schemas.microsoft.com/office/word/2015/wordml/symex" xmlns:wpg="http://schemas.microsoft.com/office/word/2010/wordprocessingGroup" xmlns:wpi="http://schemas.microsoft.com/office/word/2010/wordprocessingInk" xmlns:wne="http://schemas.microsoft.com/office/word/2006/wordml" xmlns:wps="http://schemas.microsoft.com/office/word/2010/wordprocessingShape" mc:Ignorable="w14 w15 w16se w16cid w16 w16cex w16sdtdh wp14">
   <w:abstractNum w:abstractNumId="0" w15:restartNumberingAfterBreak="0">
+    <w:nsid w:val="08782360"/>
+    <w:multiLevelType w:val="hybridMultilevel"/>
+    <w:tmpl w:val="67CC8AE4"/>
+    <w:lvl w:ilvl="0" w:tplc="7B48E6B6">
+      <w:start w:val="1"/>
+      <w:numFmt w:val="decimal"/>
+      <w:lvlText w:val="%1-"/>
+      <w:lvlJc w:val="left"/>
+      <w:pPr>
+        <w:ind w:left="720" w:hanging="360"/>
+      </w:pPr>
+      <w:rPr>
+        <w:rFonts w:hint="default"/>
+      </w:rPr>
+    </w:lvl>
+    <w:lvl w:ilvl="1" w:tplc="04160019" w:tentative="1">
+      <w:start w:val="1"/>
+      <w:numFmt w:val="lowerLetter"/>
+      <w:lvlText w:val="%2."/>
+      <w:lvlJc w:val="left"/>
+      <w:pPr>
+        <w:ind w:left="1440" w:hanging="360"/>
+      </w:pPr>
+    </w:lvl>
+    <w:lvl w:ilvl="2" w:tplc="0416001B" w:tentative="1">
+      <w:start w:val="1"/>
+      <w:numFmt w:val="lowerRoman"/>
+      <w:lvlText w:val="%3."/>
+      <w:lvlJc w:val="right"/>
+      <w:pPr>
+        <w:ind w:left="2160" w:hanging="180"/>
+      </w:pPr>
+    </w:lvl>
+    <w:lvl w:ilvl="3" w:tplc="0416000F" w:tentative="1">
+      <w:start w:val="1"/>
+      <w:numFmt w:val="decimal"/>
+      <w:lvlText w:val="%4."/>
+      <w:lvlJc w:val="left"/>
+      <w:pPr>
+        <w:ind w:left="2880" w:hanging="360"/>
+      </w:pPr>
+    </w:lvl>
+    <w:lvl w:ilvl="4" w:tplc="04160019" w:tentative="1">
+      <w:start w:val="1"/>
+      <w:numFmt w:val="lowerLetter"/>
+      <w:lvlText w:val="%5."/>
+      <w:lvlJc w:val="left"/>
+      <w:pPr>
+        <w:ind w:left="3600" w:hanging="360"/>
+      </w:pPr>
+    </w:lvl>
+    <w:lvl w:ilvl="5" w:tplc="0416001B" w:tentative="1">
+      <w:start w:val="1"/>
+      <w:numFmt w:val="lowerRoman"/>
+      <w:lvlText w:val="%6."/>
+      <w:lvlJc w:val="right"/>
+      <w:pPr>
+        <w:ind w:left="4320" w:hanging="180"/>
+      </w:pPr>
+    </w:lvl>
+    <w:lvl w:ilvl="6" w:tplc="0416000F" w:tentative="1">
+      <w:start w:val="1"/>
+      <w:numFmt w:val="decimal"/>
+      <w:lvlText w:val="%7."/>
+      <w:lvlJc w:val="left"/>
+      <w:pPr>
+        <w:ind w:left="5040" w:hanging="360"/>
+      </w:pPr>
+    </w:lvl>
+    <w:lvl w:ilvl="7" w:tplc="04160019" w:tentative="1">
+      <w:start w:val="1"/>
+      <w:numFmt w:val="lowerLetter"/>
+      <w:lvlText w:val="%8."/>
+      <w:lvlJc w:val="left"/>
+      <w:pPr>
+        <w:ind w:left="5760" w:hanging="360"/>
+      </w:pPr>
+    </w:lvl>
+    <w:lvl w:ilvl="8" w:tplc="0416001B" w:tentative="1">
+      <w:start w:val="1"/>
+      <w:numFmt w:val="lowerRoman"/>
+      <w:lvlText w:val="%9."/>
+      <w:lvlJc w:val="right"/>
+      <w:pPr>
+        <w:ind w:left="6480" w:hanging="180"/>
+      </w:pPr>
+    </w:lvl>
+  </w:abstractNum>
+  <w:abstractNum w:abstractNumId="1" w15:restartNumberingAfterBreak="0">
+    <w:nsid w:val="12AE40C4"/>
+    <w:multiLevelType w:val="hybridMultilevel"/>
+    <w:tmpl w:val="DE4458E6"/>
+    <w:lvl w:ilvl="0" w:tplc="04160001">
+      <w:start w:val="1"/>
+      <w:numFmt w:val="bullet"/>
+      <w:lvlText w:val=""/>
+      <w:lvlJc w:val="left"/>
+      <w:pPr>
+        <w:ind w:left="720" w:hanging="360"/>
+      </w:pPr>
+      <w:rPr>
+        <w:rFonts w:ascii="Symbol" w:hAnsi="Symbol" w:hint="default"/>
+      </w:rPr>
+    </w:lvl>
+    <w:lvl w:ilvl="1" w:tplc="04160003" w:tentative="1">
+      <w:start w:val="1"/>
+      <w:numFmt w:val="bullet"/>
+      <w:lvlText w:val="o"/>
+      <w:lvlJc w:val="left"/>
+      <w:pPr>
+        <w:ind w:left="1440" w:hanging="360"/>
+      </w:pPr>
+      <w:rPr>
+        <w:rFonts w:ascii="Courier New" w:hAnsi="Courier New" w:cs="Courier New" w:hint="default"/>
+      </w:rPr>
+    </w:lvl>
+    <w:lvl w:ilvl="2" w:tplc="04160005" w:tentative="1">
+      <w:start w:val="1"/>
+      <w:numFmt w:val="bullet"/>
+      <w:lvlText w:val=""/>
+      <w:lvlJc w:val="left"/>
+      <w:pPr>
+        <w:ind w:left="2160" w:hanging="360"/>
+      </w:pPr>
+      <w:rPr>
+        <w:rFonts w:ascii="Wingdings" w:hAnsi="Wingdings" w:hint="default"/>
+      </w:rPr>
+    </w:lvl>
+    <w:lvl w:ilvl="3" w:tplc="04160001" w:tentative="1">
+      <w:start w:val="1"/>
+      <w:numFmt w:val="bullet"/>
+      <w:lvlText w:val=""/>
+      <w:lvlJc w:val="left"/>
+      <w:pPr>
+        <w:ind w:left="2880" w:hanging="360"/>
+      </w:pPr>
+      <w:rPr>
+        <w:rFonts w:ascii="Symbol" w:hAnsi="Symbol" w:hint="default"/>
+      </w:rPr>
+    </w:lvl>
+    <w:lvl w:ilvl="4" w:tplc="04160003" w:tentative="1">
+      <w:start w:val="1"/>
+      <w:numFmt w:val="bullet"/>
+      <w:lvlText w:val="o"/>
+      <w:lvlJc w:val="left"/>
+      <w:pPr>
+        <w:ind w:left="3600" w:hanging="360"/>
+      </w:pPr>
+      <w:rPr>
+        <w:rFonts w:ascii="Courier New" w:hAnsi="Courier New" w:cs="Courier New" w:hint="default"/>
+      </w:rPr>
+    </w:lvl>
+    <w:lvl w:ilvl="5" w:tplc="04160005" w:tentative="1">
+      <w:start w:val="1"/>
+      <w:numFmt w:val="bullet"/>
+      <w:lvlText w:val=""/>
+      <w:lvlJc w:val="left"/>
+      <w:pPr>
+        <w:ind w:left="4320" w:hanging="360"/>
+      </w:pPr>
+      <w:rPr>
+        <w:rFonts w:ascii="Wingdings" w:hAnsi="Wingdings" w:hint="default"/>
+      </w:rPr>
+    </w:lvl>
+    <w:lvl w:ilvl="6" w:tplc="04160001" w:tentative="1">
+      <w:start w:val="1"/>
+      <w:numFmt w:val="bullet"/>
+      <w:lvlText w:val=""/>
+      <w:lvlJc w:val="left"/>
+      <w:pPr>
+        <w:ind w:left="5040" w:hanging="360"/>
+      </w:pPr>
+      <w:rPr>
+        <w:rFonts w:ascii="Symbol" w:hAnsi="Symbol" w:hint="default"/>
+      </w:rPr>
+    </w:lvl>
+    <w:lvl w:ilvl="7" w:tplc="04160003" w:tentative="1">
+      <w:start w:val="1"/>
+      <w:numFmt w:val="bullet"/>
+      <w:lvlText w:val="o"/>
+      <w:lvlJc w:val="left"/>
+      <w:pPr>
+        <w:ind w:left="5760" w:hanging="360"/>
+      </w:pPr>
+      <w:rPr>
+        <w:rFonts w:ascii="Courier New" w:hAnsi="Courier New" w:cs="Courier New" w:hint="default"/>
+      </w:rPr>
+    </w:lvl>
+    <w:lvl w:ilvl="8" w:tplc="04160005" w:tentative="1">
+      <w:start w:val="1"/>
+      <w:numFmt w:val="bullet"/>
+      <w:lvlText w:val=""/>
+      <w:lvlJc w:val="left"/>
+      <w:pPr>
+        <w:ind w:left="6480" w:hanging="360"/>
+      </w:pPr>
+      <w:rPr>
+        <w:rFonts w:ascii="Wingdings" w:hAnsi="Wingdings" w:hint="default"/>
+      </w:rPr>
+    </w:lvl>
+  </w:abstractNum>
+  <w:abstractNum w:abstractNumId="2" w15:restartNumberingAfterBreak="0">
     <w:nsid w:val="1E782583"/>
     <w:multiLevelType w:val="multilevel"/>
     <w:tmpl w:val="8304CE92"/>
@@ -11393,7 +12825,7 @@
       </w:rPr>
     </w:lvl>
   </w:abstractNum>
-  <w:abstractNum w:abstractNumId="1" w15:restartNumberingAfterBreak="0">
+  <w:abstractNum w:abstractNumId="3" w15:restartNumberingAfterBreak="0">
     <w:nsid w:val="1FB7610C"/>
     <w:multiLevelType w:val="multilevel"/>
     <w:tmpl w:val="CBC8764A"/>
@@ -11506,7 +12938,7 @@
       </w:rPr>
     </w:lvl>
   </w:abstractNum>
-  <w:abstractNum w:abstractNumId="2" w15:restartNumberingAfterBreak="0">
+  <w:abstractNum w:abstractNumId="4" w15:restartNumberingAfterBreak="0">
     <w:nsid w:val="214A59A1"/>
     <w:multiLevelType w:val="hybridMultilevel"/>
     <w:tmpl w:val="065C76F4"/>
@@ -11595,7 +13027,7 @@
       </w:pPr>
     </w:lvl>
   </w:abstractNum>
-  <w:abstractNum w:abstractNumId="3" w15:restartNumberingAfterBreak="0">
+  <w:abstractNum w:abstractNumId="5" w15:restartNumberingAfterBreak="0">
     <w:nsid w:val="2F8F3E6A"/>
     <w:multiLevelType w:val="multilevel"/>
     <w:tmpl w:val="4BB0FF58"/>
@@ -11708,7 +13140,7 @@
       </w:rPr>
     </w:lvl>
   </w:abstractNum>
-  <w:abstractNum w:abstractNumId="4" w15:restartNumberingAfterBreak="0">
+  <w:abstractNum w:abstractNumId="6" w15:restartNumberingAfterBreak="0">
     <w:nsid w:val="35E13893"/>
     <w:multiLevelType w:val="hybridMultilevel"/>
     <w:tmpl w:val="67CC8AE4"/>
@@ -11797,7 +13229,7 @@
       </w:pPr>
     </w:lvl>
   </w:abstractNum>
-  <w:abstractNum w:abstractNumId="5" w15:restartNumberingAfterBreak="0">
+  <w:abstractNum w:abstractNumId="7" w15:restartNumberingAfterBreak="0">
     <w:nsid w:val="38332BFF"/>
     <w:multiLevelType w:val="hybridMultilevel"/>
     <w:tmpl w:val="29F4CB18"/>
@@ -11910,7 +13342,7 @@
       </w:rPr>
     </w:lvl>
   </w:abstractNum>
-  <w:abstractNum w:abstractNumId="6" w15:restartNumberingAfterBreak="0">
+  <w:abstractNum w:abstractNumId="8" w15:restartNumberingAfterBreak="0">
     <w:nsid w:val="40083289"/>
     <w:multiLevelType w:val="hybridMultilevel"/>
     <w:tmpl w:val="E30AB254"/>
@@ -12023,7 +13455,7 @@
       </w:rPr>
     </w:lvl>
   </w:abstractNum>
-  <w:abstractNum w:abstractNumId="7" w15:restartNumberingAfterBreak="0">
+  <w:abstractNum w:abstractNumId="9" w15:restartNumberingAfterBreak="0">
     <w:nsid w:val="46B666FB"/>
     <w:multiLevelType w:val="multilevel"/>
     <w:tmpl w:val="F27AE70C"/>
@@ -12136,7 +13568,7 @@
       </w:rPr>
     </w:lvl>
   </w:abstractNum>
-  <w:abstractNum w:abstractNumId="8" w15:restartNumberingAfterBreak="0">
+  <w:abstractNum w:abstractNumId="10" w15:restartNumberingAfterBreak="0">
     <w:nsid w:val="481C1346"/>
     <w:multiLevelType w:val="hybridMultilevel"/>
     <w:tmpl w:val="67CC8AE4"/>
@@ -12225,19 +13657,133 @@
       </w:pPr>
     </w:lvl>
   </w:abstractNum>
-  <w:abstractNum w:abstractNumId="9" w15:restartNumberingAfterBreak="0">
+  <w:abstractNum w:abstractNumId="11" w15:restartNumberingAfterBreak="0">
+    <w:nsid w:val="51A4545A"/>
+    <w:multiLevelType w:val="hybridMultilevel"/>
+    <w:tmpl w:val="A050AF5C"/>
+    <w:lvl w:ilvl="0" w:tplc="04160003">
+      <w:start w:val="1"/>
+      <w:numFmt w:val="bullet"/>
+      <w:lvlText w:val="o"/>
+      <w:lvlJc w:val="left"/>
+      <w:pPr>
+        <w:ind w:left="1440" w:hanging="360"/>
+      </w:pPr>
+      <w:rPr>
+        <w:rFonts w:ascii="Courier New" w:hAnsi="Courier New" w:cs="Courier New" w:hint="default"/>
+      </w:rPr>
+    </w:lvl>
+    <w:lvl w:ilvl="1" w:tplc="04160003" w:tentative="1">
+      <w:start w:val="1"/>
+      <w:numFmt w:val="bullet"/>
+      <w:lvlText w:val="o"/>
+      <w:lvlJc w:val="left"/>
+      <w:pPr>
+        <w:ind w:left="2160" w:hanging="360"/>
+      </w:pPr>
+      <w:rPr>
+        <w:rFonts w:ascii="Courier New" w:hAnsi="Courier New" w:cs="Courier New" w:hint="default"/>
+      </w:rPr>
+    </w:lvl>
+    <w:lvl w:ilvl="2" w:tplc="04160005" w:tentative="1">
+      <w:start w:val="1"/>
+      <w:numFmt w:val="bullet"/>
+      <w:lvlText w:val=""/>
+      <w:lvlJc w:val="left"/>
+      <w:pPr>
+        <w:ind w:left="2880" w:hanging="360"/>
+      </w:pPr>
+      <w:rPr>
+        <w:rFonts w:ascii="Wingdings" w:hAnsi="Wingdings" w:hint="default"/>
+      </w:rPr>
+    </w:lvl>
+    <w:lvl w:ilvl="3" w:tplc="04160001" w:tentative="1">
+      <w:start w:val="1"/>
+      <w:numFmt w:val="bullet"/>
+      <w:lvlText w:val=""/>
+      <w:lvlJc w:val="left"/>
+      <w:pPr>
+        <w:ind w:left="3600" w:hanging="360"/>
+      </w:pPr>
+      <w:rPr>
+        <w:rFonts w:ascii="Symbol" w:hAnsi="Symbol" w:hint="default"/>
+      </w:rPr>
+    </w:lvl>
+    <w:lvl w:ilvl="4" w:tplc="04160003" w:tentative="1">
+      <w:start w:val="1"/>
+      <w:numFmt w:val="bullet"/>
+      <w:lvlText w:val="o"/>
+      <w:lvlJc w:val="left"/>
+      <w:pPr>
+        <w:ind w:left="4320" w:hanging="360"/>
+      </w:pPr>
+      <w:rPr>
+        <w:rFonts w:ascii="Courier New" w:hAnsi="Courier New" w:cs="Courier New" w:hint="default"/>
+      </w:rPr>
+    </w:lvl>
+    <w:lvl w:ilvl="5" w:tplc="04160005" w:tentative="1">
+      <w:start w:val="1"/>
+      <w:numFmt w:val="bullet"/>
+      <w:lvlText w:val=""/>
+      <w:lvlJc w:val="left"/>
+      <w:pPr>
+        <w:ind w:left="5040" w:hanging="360"/>
+      </w:pPr>
+      <w:rPr>
+        <w:rFonts w:ascii="Wingdings" w:hAnsi="Wingdings" w:hint="default"/>
+      </w:rPr>
+    </w:lvl>
+    <w:lvl w:ilvl="6" w:tplc="04160001" w:tentative="1">
+      <w:start w:val="1"/>
+      <w:numFmt w:val="bullet"/>
+      <w:lvlText w:val=""/>
+      <w:lvlJc w:val="left"/>
+      <w:pPr>
+        <w:ind w:left="5760" w:hanging="360"/>
+      </w:pPr>
+      <w:rPr>
+        <w:rFonts w:ascii="Symbol" w:hAnsi="Symbol" w:hint="default"/>
+      </w:rPr>
+    </w:lvl>
+    <w:lvl w:ilvl="7" w:tplc="04160003" w:tentative="1">
+      <w:start w:val="1"/>
+      <w:numFmt w:val="bullet"/>
+      <w:lvlText w:val="o"/>
+      <w:lvlJc w:val="left"/>
+      <w:pPr>
+        <w:ind w:left="6480" w:hanging="360"/>
+      </w:pPr>
+      <w:rPr>
+        <w:rFonts w:ascii="Courier New" w:hAnsi="Courier New" w:cs="Courier New" w:hint="default"/>
+      </w:rPr>
+    </w:lvl>
+    <w:lvl w:ilvl="8" w:tplc="04160005" w:tentative="1">
+      <w:start w:val="1"/>
+      <w:numFmt w:val="bullet"/>
+      <w:lvlText w:val=""/>
+      <w:lvlJc w:val="left"/>
+      <w:pPr>
+        <w:ind w:left="7200" w:hanging="360"/>
+      </w:pPr>
+      <w:rPr>
+        <w:rFonts w:ascii="Wingdings" w:hAnsi="Wingdings" w:hint="default"/>
+      </w:rPr>
+    </w:lvl>
+  </w:abstractNum>
+  <w:abstractNum w:abstractNumId="12" w15:restartNumberingAfterBreak="0">
     <w:nsid w:val="5C3E105D"/>
     <w:multiLevelType w:val="multilevel"/>
-    <w:tmpl w:val="09AC6DA8"/>
+    <w:tmpl w:val="DAACB48E"/>
     <w:lvl w:ilvl="0">
       <w:start w:val="1"/>
       <w:numFmt w:val="bullet"/>
-      <w:lvlText w:val="●"/>
+      <w:lvlText w:val=""/>
       <w:lvlJc w:val="left"/>
       <w:pPr>
         <w:ind w:left="720" w:hanging="360"/>
       </w:pPr>
       <w:rPr>
+        <w:rFonts w:ascii="Symbol" w:hAnsi="Symbol" w:hint="default"/>
         <w:u w:val="none"/>
       </w:rPr>
     </w:lvl>
@@ -12250,6 +13796,7 @@
         <w:ind w:left="1440" w:hanging="360"/>
       </w:pPr>
       <w:rPr>
+        <w:rFonts w:ascii="Courier New" w:hAnsi="Courier New" w:cs="Courier New" w:hint="default"/>
         <w:u w:val="none"/>
       </w:rPr>
     </w:lvl>
@@ -12338,7 +13885,7 @@
       </w:rPr>
     </w:lvl>
   </w:abstractNum>
-  <w:abstractNum w:abstractNumId="10" w15:restartNumberingAfterBreak="0">
+  <w:abstractNum w:abstractNumId="13" w15:restartNumberingAfterBreak="0">
     <w:nsid w:val="5E0375AD"/>
     <w:multiLevelType w:val="hybridMultilevel"/>
     <w:tmpl w:val="67CC8AE4"/>
@@ -12428,37 +13975,46 @@
     </w:lvl>
   </w:abstractNum>
   <w:num w:numId="1">
+    <w:abstractNumId w:val="12"/>
+  </w:num>
+  <w:num w:numId="2">
+    <w:abstractNumId w:val="2"/>
+  </w:num>
+  <w:num w:numId="3">
+    <w:abstractNumId w:val="5"/>
+  </w:num>
+  <w:num w:numId="4">
     <w:abstractNumId w:val="9"/>
   </w:num>
-  <w:num w:numId="2">
-    <w:abstractNumId w:val="0"/>
-  </w:num>
-  <w:num w:numId="3">
+  <w:num w:numId="5">
     <w:abstractNumId w:val="3"/>
   </w:num>
-  <w:num w:numId="4">
+  <w:num w:numId="6">
+    <w:abstractNumId w:val="8"/>
+  </w:num>
+  <w:num w:numId="7">
     <w:abstractNumId w:val="7"/>
   </w:num>
-  <w:num w:numId="5">
+  <w:num w:numId="8">
+    <w:abstractNumId w:val="13"/>
+  </w:num>
+  <w:num w:numId="9">
+    <w:abstractNumId w:val="10"/>
+  </w:num>
+  <w:num w:numId="10">
+    <w:abstractNumId w:val="6"/>
+  </w:num>
+  <w:num w:numId="11">
+    <w:abstractNumId w:val="4"/>
+  </w:num>
+  <w:num w:numId="12">
     <w:abstractNumId w:val="1"/>
   </w:num>
-  <w:num w:numId="6">
-    <w:abstractNumId w:val="6"/>
+  <w:num w:numId="13">
+    <w:abstractNumId w:val="11"/>
   </w:num>
-  <w:num w:numId="7">
-    <w:abstractNumId w:val="5"/>
-  </w:num>
-  <w:num w:numId="8">
-    <w:abstractNumId w:val="10"/>
-  </w:num>
-  <w:num w:numId="9">
-    <w:abstractNumId w:val="8"/>
-  </w:num>
-  <w:num w:numId="10">
-    <w:abstractNumId w:val="4"/>
-  </w:num>
-  <w:num w:numId="11">
-    <w:abstractNumId w:val="2"/>
+  <w:num w:numId="14">
+    <w:abstractNumId w:val="0"/>
   </w:num>
 </w:numbering>
 </file>

</xml_diff>

<commit_message>
Frontend + Prototipação - Gerenciar cargos
</commit_message>
<xml_diff>
--- a/Documentação/ERS.docx
+++ b/Documentação/ERS.docx
@@ -212,17 +212,8 @@
           <w:sz w:val="28"/>
           <w:szCs w:val="24"/>
         </w:rPr>
-        <w:t xml:space="preserve">ASM </w:t>
+        <w:t>ASM Tasks</w:t>
       </w:r>
-      <w:proofErr w:type="spellStart"/>
-      <w:r>
-        <w:rPr>
-          <w:sz w:val="28"/>
-          <w:szCs w:val="24"/>
-        </w:rPr>
-        <w:t>Tasks</w:t>
-      </w:r>
-      <w:proofErr w:type="spellEnd"/>
     </w:p>
     <w:p>
       <w:pPr>
@@ -1741,15 +1732,7 @@
     </w:p>
     <w:p>
       <w:r>
-        <w:t xml:space="preserve">A finalidade desta Especificação de Requisitos de Software (ERS) é definir de forma clara e precisa as funcionalidades, restrições e características técnicas do sistema ASM </w:t>
-      </w:r>
-      <w:proofErr w:type="spellStart"/>
-      <w:r>
-        <w:t>Tasks</w:t>
-      </w:r>
-      <w:proofErr w:type="spellEnd"/>
-      <w:r>
-        <w:t>. Este documento serve como base para o entendimento compartilhado entre todas as partes envolvidas no projeto: desenvolvedor, empresa Always System Manager e instituição de ensino UNOESTE.</w:t>
+        <w:t>A finalidade desta Especificação de Requisitos de Software (ERS) é definir de forma clara e precisa as funcionalidades, restrições e características técnicas do sistema ASM Tasks. Este documento serve como base para o entendimento compartilhado entre todas as partes envolvidas no projeto: desenvolvedor, empresa Always System Manager e instituição de ensino UNOESTE.</w:t>
       </w:r>
     </w:p>
     <w:p>
@@ -1770,36 +1753,12 @@
     </w:p>
     <w:p>
       <w:r>
-        <w:t xml:space="preserve">O ASM </w:t>
-      </w:r>
-      <w:proofErr w:type="spellStart"/>
-      <w:r>
-        <w:t>Tasks</w:t>
-      </w:r>
-      <w:proofErr w:type="spellEnd"/>
-      <w:r>
-        <w:t xml:space="preserve"> é um sistema voltado para a gestão e acompanhamento de tarefas internas da Always System Manager, abrangendo os setores de desenvolvimento de software e suporte de hardware. Ele permitirá o gerenciamento de tarefas em um quadro </w:t>
-      </w:r>
-      <w:proofErr w:type="spellStart"/>
-      <w:r>
-        <w:t>Kanban</w:t>
-      </w:r>
-      <w:proofErr w:type="spellEnd"/>
-      <w:r>
-        <w:t xml:space="preserve"> com etapas personalizáveis, a utilização de filtros avançados de acordo com prioridade, responsável ou setor, bem como a criação de lembretes por meio de uma agenda integrada, tanto pessoais quanto atribuídos a outros colaboradores. Também contará com funcionalidades de histórico de movimentações e controle de usuários, garantindo rastreabilidade e segurança no uso.</w:t>
+        <w:t>O ASM Tasks é um sistema voltado para a gestão e acompanhamento de tarefas internas da Always System Manager, abrangendo os setores de desenvolvimento de software e suporte de hardware. Ele permitirá o gerenciamento de tarefas em um quadro Kanban com etapas personalizáveis, a utilização de filtros avançados de acordo com prioridade, responsável ou setor, bem como a criação de lembretes por meio de uma agenda integrada, tanto pessoais quanto atribuídos a outros colaboradores. Também contará com funcionalidades de histórico de movimentações e controle de usuários, garantindo rastreabilidade e segurança no uso.</w:t>
       </w:r>
     </w:p>
     <w:p>
       <w:r>
-        <w:t xml:space="preserve">Além das funcionalidades gerais descritas, o ASM </w:t>
-      </w:r>
-      <w:proofErr w:type="spellStart"/>
-      <w:r>
-        <w:t>Tasks</w:t>
-      </w:r>
-      <w:proofErr w:type="spellEnd"/>
-      <w:r>
-        <w:t xml:space="preserve"> contará com funções básicas como gerenciar colaboradores, clientes, prioridades de tarefa, etapas de desenvolvimento e setores. Essas operações são essenciais para estruturar os dados internos da empresa, permitindo que o sistema mantenha consistência na organização de informações e forneça suporte às funcionalidades mais avançadas.</w:t>
+        <w:t>Além das funcionalidades gerais descritas, o ASM Tasks contará com funções básicas como gerenciar colaboradores, clientes, prioridades de tarefa, etapas de desenvolvimento e setores. Essas operações são essenciais para estruturar os dados internos da empresa, permitindo que o sistema mantenha consistência na organização de informações e forneça suporte às funcionalidades mais avançadas.</w:t>
       </w:r>
     </w:p>
     <w:p>
@@ -1813,15 +1772,7 @@
       </w:r>
       <w:r>
         <w:lastRenderedPageBreak/>
-        <w:t xml:space="preserve">das demandas. As datas das tarefas devem ser validadas no momento do agendamento para evitar </w:t>
-      </w:r>
-      <w:proofErr w:type="spellStart"/>
-      <w:r>
-        <w:t>superalocação</w:t>
-      </w:r>
-      <w:proofErr w:type="spellEnd"/>
-      <w:r>
-        <w:t xml:space="preserve"> de atividades para um mesmo colaborador.</w:t>
+        <w:t>das demandas. As datas das tarefas devem ser validadas no momento do agendamento para evitar superalocação de atividades para um mesmo colaborador.</w:t>
       </w:r>
     </w:p>
     <w:p>
@@ -1916,15 +1867,7 @@
         </w:numPr>
       </w:pPr>
       <w:r>
-        <w:t xml:space="preserve">ERP: Enterprise </w:t>
-      </w:r>
-      <w:proofErr w:type="spellStart"/>
-      <w:r>
-        <w:t>Resource</w:t>
-      </w:r>
-      <w:proofErr w:type="spellEnd"/>
-      <w:r>
-        <w:t xml:space="preserve"> Planning (Sistema Integrado de Gestão).</w:t>
+        <w:t>ERP: Enterprise Resource Planning (Sistema Integrado de Gestão).</w:t>
       </w:r>
     </w:p>
     <w:p>
@@ -1935,13 +1878,8 @@
           <w:numId w:val="6"/>
         </w:numPr>
       </w:pPr>
-      <w:proofErr w:type="spellStart"/>
       <w:r>
-        <w:t>Kanban</w:t>
-      </w:r>
-      <w:proofErr w:type="spellEnd"/>
-      <w:r>
-        <w:t>: Método de organização de tarefas baseado em quadros e cartões.</w:t>
+        <w:t>Kanban: Método de organização de tarefas baseado em quadros e cartões.</w:t>
       </w:r>
     </w:p>
     <w:p>
@@ -2322,15 +2260,7 @@
     </w:p>
     <w:p>
       <w:r>
-        <w:t xml:space="preserve">Endereço: Rua José </w:t>
-      </w:r>
-      <w:proofErr w:type="spellStart"/>
-      <w:r>
-        <w:t>Bongiovani</w:t>
-      </w:r>
-      <w:proofErr w:type="spellEnd"/>
-      <w:r>
-        <w:t>, 700 – Cidade Universitária – Presidente Prudente – SP</w:t>
+        <w:t>Endereço: Rua José Bongiovani, 700 – Cidade Universitária – Presidente Prudente – SP</w:t>
       </w:r>
     </w:p>
     <w:p>
@@ -2408,23 +2338,7 @@
         <w:t>, 520</w:t>
       </w:r>
       <w:r>
-        <w:t xml:space="preserve">), no estado de São Paulo, a empresa tem como proprietário </w:t>
-      </w:r>
-      <w:proofErr w:type="spellStart"/>
-      <w:r>
-        <w:t>Alvaro</w:t>
-      </w:r>
-      <w:proofErr w:type="spellEnd"/>
-      <w:r>
-        <w:t xml:space="preserve"> </w:t>
-      </w:r>
-      <w:proofErr w:type="spellStart"/>
-      <w:r>
-        <w:t>Shioji</w:t>
-      </w:r>
-      <w:proofErr w:type="spellEnd"/>
-      <w:r>
-        <w:t xml:space="preserve"> Matsuda e consolidou-se como uma parceira estratégica para diferentes segmentos, como granjas, transportadoras, distribuidoras e comércio em geral.</w:t>
+        <w:t>), no estado de São Paulo, a empresa tem como proprietário Alvaro Shioji Matsuda e consolidou-se como uma parceira estratégica para diferentes segmentos, como granjas, transportadoras, distribuidoras e comércio em geral.</w:t>
       </w:r>
     </w:p>
     <w:p>
@@ -2433,15 +2347,7 @@
       </w:r>
       <w:r>
         <w:lastRenderedPageBreak/>
-        <w:t xml:space="preserve">diversificada que integra áreas de gerência e BI, financeiro, desenvolvimento mobile, desenvolvimento </w:t>
-      </w:r>
-      <w:proofErr w:type="spellStart"/>
-      <w:r>
-        <w:t>fullstack</w:t>
-      </w:r>
-      <w:proofErr w:type="spellEnd"/>
-      <w:r>
-        <w:t xml:space="preserve"> em VB6 e suporte técnico.</w:t>
+        <w:t>diversificada que integra áreas de gerência e BI, financeiro, desenvolvimento mobile, desenvolvimento fullstack em VB6 e suporte técnico.</w:t>
       </w:r>
     </w:p>
     <w:p>
@@ -6582,7 +6488,8 @@
             </w:pPr>
             <w:r>
               <w:rPr>
-                <w:rFonts w:ascii="Calibri" w:eastAsia="Calibri" w:hAnsi="Calibri" w:cs="Calibri"/>
+                <w:rFonts w:ascii="Calibri" w:hAnsi="Calibri"/>
+                <w:noProof/>
                 <w:sz w:val="20"/>
                 <w:szCs w:val="16"/>
               </w:rPr>
@@ -8253,9 +8160,9 @@
             </w:pPr>
             <w:r>
               <w:rPr>
-                <w:rFonts w:eastAsia="Calibri"/>
                 <w:b/>
                 <w:bCs/>
+                <w:noProof/>
                 <w:sz w:val="20"/>
                 <w:szCs w:val="16"/>
               </w:rPr>
@@ -10037,9 +9944,9 @@
             </w:pPr>
             <w:r>
               <w:rPr>
-                <w:rFonts w:eastAsia="Calibri"/>
                 <w:b/>
                 <w:bCs/>
+                <w:noProof/>
                 <w:sz w:val="20"/>
                 <w:szCs w:val="16"/>
               </w:rPr>
@@ -11301,9 +11208,9 @@
             </w:pPr>
             <w:r>
               <w:rPr>
-                <w:rFonts w:eastAsia="Calibri"/>
                 <w:b/>
                 <w:bCs/>
+                <w:noProof/>
                 <w:sz w:val="20"/>
                 <w:szCs w:val="16"/>
               </w:rPr>
@@ -11391,9 +11298,9 @@
             </w:pPr>
             <w:r>
               <w:rPr>
-                <w:rFonts w:eastAsia="Calibri"/>
                 <w:b/>
                 <w:bCs/>
+                <w:noProof/>
                 <w:sz w:val="20"/>
                 <w:szCs w:val="16"/>
               </w:rPr>
@@ -11514,6 +11421,48 @@
                 <w:szCs w:val="16"/>
               </w:rPr>
             </w:pPr>
+            <w:r>
+              <w:rPr>
+                <w:rFonts w:eastAsia="Noto Sans Symbols"/>
+                <w:sz w:val="20"/>
+                <w:szCs w:val="16"/>
+              </w:rPr>
+              <w:drawing>
+                <wp:inline distT="0" distB="0" distL="0" distR="0" wp14:anchorId="496E5C0C" wp14:editId="6146C414">
+                  <wp:extent cx="5367600" cy="2581200"/>
+                  <wp:effectExtent l="0" t="0" r="5080" b="0"/>
+                  <wp:docPr id="2" name="Imagem 2"/>
+                  <wp:cNvGraphicFramePr>
+                    <a:graphicFrameLocks xmlns:a="http://schemas.openxmlformats.org/drawingml/2006/main" noChangeAspect="1"/>
+                  </wp:cNvGraphicFramePr>
+                  <a:graphic xmlns:a="http://schemas.openxmlformats.org/drawingml/2006/main">
+                    <a:graphicData uri="http://schemas.openxmlformats.org/drawingml/2006/picture">
+                      <pic:pic xmlns:pic="http://schemas.openxmlformats.org/drawingml/2006/picture">
+                        <pic:nvPicPr>
+                          <pic:cNvPr id="1" name=""/>
+                          <pic:cNvPicPr/>
+                        </pic:nvPicPr>
+                        <pic:blipFill>
+                          <a:blip r:embed="rId44"/>
+                          <a:stretch>
+                            <a:fillRect/>
+                          </a:stretch>
+                        </pic:blipFill>
+                        <pic:spPr>
+                          <a:xfrm>
+                            <a:off x="0" y="0"/>
+                            <a:ext cx="5367600" cy="2581200"/>
+                          </a:xfrm>
+                          <a:prstGeom prst="rect">
+                            <a:avLst/>
+                          </a:prstGeom>
+                        </pic:spPr>
+                      </pic:pic>
+                    </a:graphicData>
+                  </a:graphic>
+                </wp:inline>
+              </w:drawing>
+            </w:r>
           </w:p>
           <w:p>
             <w:pPr>
@@ -11605,6 +11554,7 @@
                 <w:sz w:val="20"/>
                 <w:szCs w:val="16"/>
               </w:rPr>
+              <w:lastRenderedPageBreak/>
               <w:t xml:space="preserve">Listagem de </w:t>
             </w:r>
             <w:r>
@@ -11641,6 +11591,48 @@
                 <w:szCs w:val="16"/>
               </w:rPr>
             </w:pPr>
+            <w:r>
+              <w:rPr>
+                <w:rFonts w:eastAsia="Noto Sans Symbols"/>
+                <w:sz w:val="20"/>
+                <w:szCs w:val="16"/>
+              </w:rPr>
+              <w:drawing>
+                <wp:inline distT="0" distB="0" distL="0" distR="0" wp14:anchorId="2218600D" wp14:editId="048BF079">
+                  <wp:extent cx="5367600" cy="2188800"/>
+                  <wp:effectExtent l="0" t="0" r="5080" b="2540"/>
+                  <wp:docPr id="32" name="Imagem 32"/>
+                  <wp:cNvGraphicFramePr>
+                    <a:graphicFrameLocks xmlns:a="http://schemas.openxmlformats.org/drawingml/2006/main" noChangeAspect="1"/>
+                  </wp:cNvGraphicFramePr>
+                  <a:graphic xmlns:a="http://schemas.openxmlformats.org/drawingml/2006/main">
+                    <a:graphicData uri="http://schemas.openxmlformats.org/drawingml/2006/picture">
+                      <pic:pic xmlns:pic="http://schemas.openxmlformats.org/drawingml/2006/picture">
+                        <pic:nvPicPr>
+                          <pic:cNvPr id="1" name=""/>
+                          <pic:cNvPicPr/>
+                        </pic:nvPicPr>
+                        <pic:blipFill>
+                          <a:blip r:embed="rId45"/>
+                          <a:stretch>
+                            <a:fillRect/>
+                          </a:stretch>
+                        </pic:blipFill>
+                        <pic:spPr>
+                          <a:xfrm>
+                            <a:off x="0" y="0"/>
+                            <a:ext cx="5367600" cy="2188800"/>
+                          </a:xfrm>
+                          <a:prstGeom prst="rect">
+                            <a:avLst/>
+                          </a:prstGeom>
+                        </pic:spPr>
+                      </pic:pic>
+                    </a:graphicData>
+                  </a:graphic>
+                </wp:inline>
+              </w:drawing>
+            </w:r>
           </w:p>
           <w:p>
             <w:pPr>
@@ -11692,6 +11684,58 @@
                 <w:szCs w:val="16"/>
               </w:rPr>
             </w:pPr>
+            <w:r>
+              <w:rPr>
+                <w:rFonts w:eastAsia="Noto Sans Symbols"/>
+                <w:sz w:val="20"/>
+                <w:szCs w:val="16"/>
+              </w:rPr>
+              <w:drawing>
+                <wp:inline distT="0" distB="0" distL="0" distR="0" wp14:anchorId="7FF7141D" wp14:editId="52E4096C">
+                  <wp:extent cx="4582800" cy="3578400"/>
+                  <wp:effectExtent l="0" t="0" r="8255" b="3175"/>
+                  <wp:docPr id="36" name="Imagem 36"/>
+                  <wp:cNvGraphicFramePr>
+                    <a:graphicFrameLocks xmlns:a="http://schemas.openxmlformats.org/drawingml/2006/main" noChangeAspect="1"/>
+                  </wp:cNvGraphicFramePr>
+                  <a:graphic xmlns:a="http://schemas.openxmlformats.org/drawingml/2006/main">
+                    <a:graphicData uri="http://schemas.openxmlformats.org/drawingml/2006/picture">
+                      <pic:pic xmlns:pic="http://schemas.openxmlformats.org/drawingml/2006/picture">
+                        <pic:nvPicPr>
+                          <pic:cNvPr id="1" name=""/>
+                          <pic:cNvPicPr/>
+                        </pic:nvPicPr>
+                        <pic:blipFill>
+                          <a:blip r:embed="rId46"/>
+                          <a:stretch>
+                            <a:fillRect/>
+                          </a:stretch>
+                        </pic:blipFill>
+                        <pic:spPr>
+                          <a:xfrm>
+                            <a:off x="0" y="0"/>
+                            <a:ext cx="4582800" cy="3578400"/>
+                          </a:xfrm>
+                          <a:prstGeom prst="rect">
+                            <a:avLst/>
+                          </a:prstGeom>
+                        </pic:spPr>
+                      </pic:pic>
+                    </a:graphicData>
+                  </a:graphic>
+                </wp:inline>
+              </w:drawing>
+            </w:r>
+          </w:p>
+          <w:p>
+            <w:pPr>
+              <w:jc w:val="left"/>
+              <w:rPr>
+                <w:rFonts w:eastAsia="Noto Sans Symbols"/>
+                <w:sz w:val="20"/>
+                <w:szCs w:val="16"/>
+              </w:rPr>
+            </w:pPr>
           </w:p>
           <w:p>
             <w:pPr>
@@ -11803,6 +11847,7 @@
                 <w:sz w:val="20"/>
                 <w:szCs w:val="16"/>
               </w:rPr>
+              <w:lastRenderedPageBreak/>
               <w:t>Modal de visualização do cadastro da etapa</w:t>
             </w:r>
           </w:p>
@@ -11815,6 +11860,48 @@
                 <w:szCs w:val="16"/>
               </w:rPr>
             </w:pPr>
+            <w:r>
+              <w:rPr>
+                <w:rFonts w:eastAsia="Noto Sans Symbols"/>
+                <w:sz w:val="20"/>
+                <w:szCs w:val="16"/>
+              </w:rPr>
+              <w:drawing>
+                <wp:inline distT="0" distB="0" distL="0" distR="0" wp14:anchorId="738969B5" wp14:editId="6E7694C9">
+                  <wp:extent cx="3344400" cy="3592800"/>
+                  <wp:effectExtent l="0" t="0" r="8890" b="8255"/>
+                  <wp:docPr id="37" name="Imagem 37"/>
+                  <wp:cNvGraphicFramePr>
+                    <a:graphicFrameLocks xmlns:a="http://schemas.openxmlformats.org/drawingml/2006/main" noChangeAspect="1"/>
+                  </wp:cNvGraphicFramePr>
+                  <a:graphic xmlns:a="http://schemas.openxmlformats.org/drawingml/2006/main">
+                    <a:graphicData uri="http://schemas.openxmlformats.org/drawingml/2006/picture">
+                      <pic:pic xmlns:pic="http://schemas.openxmlformats.org/drawingml/2006/picture">
+                        <pic:nvPicPr>
+                          <pic:cNvPr id="1" name=""/>
+                          <pic:cNvPicPr/>
+                        </pic:nvPicPr>
+                        <pic:blipFill>
+                          <a:blip r:embed="rId47"/>
+                          <a:stretch>
+                            <a:fillRect/>
+                          </a:stretch>
+                        </pic:blipFill>
+                        <pic:spPr>
+                          <a:xfrm>
+                            <a:off x="0" y="0"/>
+                            <a:ext cx="3344400" cy="3592800"/>
+                          </a:xfrm>
+                          <a:prstGeom prst="rect">
+                            <a:avLst/>
+                          </a:prstGeom>
+                        </pic:spPr>
+                      </pic:pic>
+                    </a:graphicData>
+                  </a:graphic>
+                </wp:inline>
+              </w:drawing>
+            </w:r>
           </w:p>
           <w:p>
             <w:pPr>
@@ -11858,6 +11945,48 @@
                 <w:szCs w:val="16"/>
               </w:rPr>
             </w:pPr>
+            <w:r>
+              <w:rPr>
+                <w:rFonts w:eastAsia="Noto Sans Symbols"/>
+                <w:sz w:val="20"/>
+                <w:szCs w:val="16"/>
+              </w:rPr>
+              <w:drawing>
+                <wp:inline distT="0" distB="0" distL="0" distR="0" wp14:anchorId="421B42AA" wp14:editId="6BDC2B43">
+                  <wp:extent cx="4478400" cy="3585600"/>
+                  <wp:effectExtent l="0" t="0" r="0" b="0"/>
+                  <wp:docPr id="38" name="Imagem 38"/>
+                  <wp:cNvGraphicFramePr>
+                    <a:graphicFrameLocks xmlns:a="http://schemas.openxmlformats.org/drawingml/2006/main" noChangeAspect="1"/>
+                  </wp:cNvGraphicFramePr>
+                  <a:graphic xmlns:a="http://schemas.openxmlformats.org/drawingml/2006/main">
+                    <a:graphicData uri="http://schemas.openxmlformats.org/drawingml/2006/picture">
+                      <pic:pic xmlns:pic="http://schemas.openxmlformats.org/drawingml/2006/picture">
+                        <pic:nvPicPr>
+                          <pic:cNvPr id="1" name=""/>
+                          <pic:cNvPicPr/>
+                        </pic:nvPicPr>
+                        <pic:blipFill>
+                          <a:blip r:embed="rId48"/>
+                          <a:stretch>
+                            <a:fillRect/>
+                          </a:stretch>
+                        </pic:blipFill>
+                        <pic:spPr>
+                          <a:xfrm>
+                            <a:off x="0" y="0"/>
+                            <a:ext cx="4478400" cy="3585600"/>
+                          </a:xfrm>
+                          <a:prstGeom prst="rect">
+                            <a:avLst/>
+                          </a:prstGeom>
+                        </pic:spPr>
+                      </pic:pic>
+                    </a:graphicData>
+                  </a:graphic>
+                </wp:inline>
+              </w:drawing>
+            </w:r>
           </w:p>
           <w:p>
             <w:pPr>
@@ -11909,6 +12038,7 @@
                 <w:sz w:val="20"/>
                 <w:szCs w:val="16"/>
               </w:rPr>
+              <w:lastRenderedPageBreak/>
               <w:t>Modal de confirmação de exclusão do cadastro da etapa</w:t>
             </w:r>
           </w:p>
@@ -11921,6 +12051,48 @@
                 <w:szCs w:val="16"/>
               </w:rPr>
             </w:pPr>
+            <w:r>
+              <w:rPr>
+                <w:rFonts w:eastAsia="Noto Sans Symbols"/>
+                <w:sz w:val="20"/>
+                <w:szCs w:val="16"/>
+              </w:rPr>
+              <w:drawing>
+                <wp:inline distT="0" distB="0" distL="0" distR="0" wp14:anchorId="449BB44B" wp14:editId="227BE265">
+                  <wp:extent cx="5378400" cy="2347200"/>
+                  <wp:effectExtent l="0" t="0" r="0" b="0"/>
+                  <wp:docPr id="39" name="Imagem 39"/>
+                  <wp:cNvGraphicFramePr>
+                    <a:graphicFrameLocks xmlns:a="http://schemas.openxmlformats.org/drawingml/2006/main" noChangeAspect="1"/>
+                  </wp:cNvGraphicFramePr>
+                  <a:graphic xmlns:a="http://schemas.openxmlformats.org/drawingml/2006/main">
+                    <a:graphicData uri="http://schemas.openxmlformats.org/drawingml/2006/picture">
+                      <pic:pic xmlns:pic="http://schemas.openxmlformats.org/drawingml/2006/picture">
+                        <pic:nvPicPr>
+                          <pic:cNvPr id="1" name=""/>
+                          <pic:cNvPicPr/>
+                        </pic:nvPicPr>
+                        <pic:blipFill>
+                          <a:blip r:embed="rId49"/>
+                          <a:stretch>
+                            <a:fillRect/>
+                          </a:stretch>
+                        </pic:blipFill>
+                        <pic:spPr>
+                          <a:xfrm>
+                            <a:off x="0" y="0"/>
+                            <a:ext cx="5378400" cy="2347200"/>
+                          </a:xfrm>
+                          <a:prstGeom prst="rect">
+                            <a:avLst/>
+                          </a:prstGeom>
+                        </pic:spPr>
+                      </pic:pic>
+                    </a:graphicData>
+                  </a:graphic>
+                </wp:inline>
+              </w:drawing>
+            </w:r>
           </w:p>
           <w:p>
             <w:pPr>
@@ -11964,6 +12136,48 @@
                 <w:szCs w:val="16"/>
               </w:rPr>
             </w:pPr>
+            <w:r>
+              <w:rPr>
+                <w:rFonts w:eastAsia="Noto Sans Symbols"/>
+                <w:sz w:val="20"/>
+                <w:szCs w:val="16"/>
+              </w:rPr>
+              <w:drawing>
+                <wp:inline distT="0" distB="0" distL="0" distR="0" wp14:anchorId="72693FD3" wp14:editId="230ADF96">
+                  <wp:extent cx="5378400" cy="3175200"/>
+                  <wp:effectExtent l="0" t="0" r="0" b="6350"/>
+                  <wp:docPr id="40" name="Imagem 40"/>
+                  <wp:cNvGraphicFramePr>
+                    <a:graphicFrameLocks xmlns:a="http://schemas.openxmlformats.org/drawingml/2006/main" noChangeAspect="1"/>
+                  </wp:cNvGraphicFramePr>
+                  <a:graphic xmlns:a="http://schemas.openxmlformats.org/drawingml/2006/main">
+                    <a:graphicData uri="http://schemas.openxmlformats.org/drawingml/2006/picture">
+                      <pic:pic xmlns:pic="http://schemas.openxmlformats.org/drawingml/2006/picture">
+                        <pic:nvPicPr>
+                          <pic:cNvPr id="1" name=""/>
+                          <pic:cNvPicPr/>
+                        </pic:nvPicPr>
+                        <pic:blipFill>
+                          <a:blip r:embed="rId50"/>
+                          <a:stretch>
+                            <a:fillRect/>
+                          </a:stretch>
+                        </pic:blipFill>
+                        <pic:spPr>
+                          <a:xfrm>
+                            <a:off x="0" y="0"/>
+                            <a:ext cx="5378400" cy="3175200"/>
+                          </a:xfrm>
+                          <a:prstGeom prst="rect">
+                            <a:avLst/>
+                          </a:prstGeom>
+                        </pic:spPr>
+                      </pic:pic>
+                    </a:graphicData>
+                  </a:graphic>
+                </wp:inline>
+              </w:drawing>
+            </w:r>
           </w:p>
           <w:p>
             <w:pPr>
@@ -12089,7 +12303,7 @@
                     <pic:cNvPicPr preferRelativeResize="0"/>
                   </pic:nvPicPr>
                   <pic:blipFill>
-                    <a:blip r:embed="rId44"/>
+                    <a:blip r:embed="rId51"/>
                     <a:srcRect/>
                     <a:stretch>
                       <a:fillRect/>
@@ -12167,7 +12381,7 @@
                     <pic:cNvPicPr preferRelativeResize="0"/>
                   </pic:nvPicPr>
                   <pic:blipFill>
-                    <a:blip r:embed="rId45"/>
+                    <a:blip r:embed="rId52"/>
                     <a:srcRect/>
                     <a:stretch>
                       <a:fillRect/>
@@ -12284,15 +12498,7 @@
     </w:p>
     <w:p>
       <w:r>
-        <w:t xml:space="preserve">Documento disponibilizado pela UNOESTE, utilizado como guia para estruturar a Especificação de Requisitos de Software (ERS) do ASM </w:t>
-      </w:r>
-      <w:proofErr w:type="spellStart"/>
-      <w:r>
-        <w:t>Tasks</w:t>
-      </w:r>
-      <w:proofErr w:type="spellEnd"/>
-      <w:r>
-        <w:t>. Este modelo serviu como base para definir o formato, tópicos e detalhamento das funcionalidades e artefatos apresentados ao longo do documento.</w:t>
+        <w:t>Documento disponibilizado pela UNOESTE, utilizado como guia para estruturar a Especificação de Requisitos de Software (ERS) do ASM Tasks. Este modelo serviu como base para definir o formato, tópicos e detalhamento das funcionalidades e artefatos apresentados ao longo do documento.</w:t>
       </w:r>
     </w:p>
     <w:p/>
@@ -12326,15 +12532,7 @@
         <w:t>tarefas</w:t>
       </w:r>
       <w:r>
-        <w:t xml:space="preserve">. Nela é possível observar alguns elementos relevantes que serviram de inspiração para o levantamento de requisitos do ASM </w:t>
-      </w:r>
-      <w:proofErr w:type="spellStart"/>
-      <w:r>
-        <w:t>Tasks</w:t>
-      </w:r>
-      <w:proofErr w:type="spellEnd"/>
-      <w:r>
-        <w:t>.</w:t>
+        <w:t>. Nela é possível observar alguns elementos relevantes que serviram de inspiração para o levantamento de requisitos do ASM Tasks.</w:t>
       </w:r>
     </w:p>
     <w:p>
@@ -12371,15 +12569,7 @@
     </w:p>
     <w:p>
       <w:r>
-        <w:t xml:space="preserve">Essa interface exemplifica práticas comuns em sistemas de gestão empresarial, como o uso de filtros, acompanhamento por etapas e histórico de execução, que foram consideradas no processo de especificação de requisitos do ASM </w:t>
-      </w:r>
-      <w:proofErr w:type="spellStart"/>
-      <w:r>
-        <w:t>Tasks</w:t>
-      </w:r>
-      <w:proofErr w:type="spellEnd"/>
-      <w:r>
-        <w:t>.</w:t>
+        <w:t>Essa interface exemplifica práticas comuns em sistemas de gestão empresarial, como o uso de filtros, acompanhamento por etapas e histórico de execução, que foram consideradas no processo de especificação de requisitos do ASM Tasks.</w:t>
       </w:r>
     </w:p>
     <w:p/>
@@ -12414,7 +12604,7 @@
                     <pic:cNvPicPr preferRelativeResize="0"/>
                   </pic:nvPicPr>
                   <pic:blipFill>
-                    <a:blip r:embed="rId46"/>
+                    <a:blip r:embed="rId53"/>
                     <a:srcRect/>
                     <a:stretch>
                       <a:fillRect/>
@@ -12439,7 +12629,7 @@
     </w:p>
     <w:p/>
     <w:sectPr>
-      <w:footerReference w:type="first" r:id="rId47"/>
+      <w:footerReference w:type="first" r:id="rId54"/>
       <w:pgSz w:w="11906" w:h="16838"/>
       <w:pgMar w:top="1418" w:right="851" w:bottom="1418" w:left="1418" w:header="709" w:footer="709" w:gutter="0"/>
       <w:pgNumType w:start="1"/>

</xml_diff>

<commit_message>
Backend + Documentação - Gerenciar colaboradores
</commit_message>
<xml_diff>
--- a/Documentação/ERS.docx
+++ b/Documentação/ERS.docx
@@ -3680,6 +3680,13 @@
                 <w:szCs w:val="18"/>
               </w:rPr>
             </w:pPr>
+            <w:r>
+              <w:rPr>
+                <w:sz w:val="18"/>
+                <w:szCs w:val="18"/>
+              </w:rPr>
+              <w:t>SP5</w:t>
+            </w:r>
           </w:p>
         </w:tc>
         <w:tc>
@@ -5110,6 +5117,13 @@
                 <w:szCs w:val="18"/>
               </w:rPr>
             </w:pPr>
+            <w:r>
+              <w:rPr>
+                <w:sz w:val="18"/>
+                <w:szCs w:val="18"/>
+              </w:rPr>
+              <w:t>SP5</w:t>
+            </w:r>
           </w:p>
         </w:tc>
         <w:tc>
@@ -5276,6 +5290,13 @@
                 <w:szCs w:val="18"/>
               </w:rPr>
             </w:pPr>
+            <w:r>
+              <w:rPr>
+                <w:sz w:val="18"/>
+                <w:szCs w:val="18"/>
+              </w:rPr>
+              <w:t>SP5</w:t>
+            </w:r>
           </w:p>
         </w:tc>
         <w:tc>
@@ -6409,10 +6430,10 @@
                 <w:szCs w:val="16"/>
               </w:rPr>
               <w:drawing>
-                <wp:inline distT="0" distB="0" distL="0" distR="0" wp14:anchorId="49766FE9" wp14:editId="5A943244">
-                  <wp:extent cx="5378400" cy="4208400"/>
-                  <wp:effectExtent l="0" t="0" r="0" b="1905"/>
-                  <wp:docPr id="41" name="Imagem 41"/>
+                <wp:inline distT="0" distB="0" distL="0" distR="0" wp14:anchorId="39F1D6B6" wp14:editId="216EAF7B">
+                  <wp:extent cx="5094000" cy="3556800"/>
+                  <wp:effectExtent l="0" t="0" r="0" b="5715"/>
+                  <wp:docPr id="78" name="Imagem 78"/>
                   <wp:cNvGraphicFramePr>
                     <a:graphicFrameLocks xmlns:a="http://schemas.openxmlformats.org/drawingml/2006/main" noChangeAspect="1"/>
                   </wp:cNvGraphicFramePr>
@@ -6432,7 +6453,7 @@
                         <pic:spPr>
                           <a:xfrm>
                             <a:off x="0" y="0"/>
-                            <a:ext cx="5378400" cy="4208400"/>
+                            <a:ext cx="5094000" cy="3556800"/>
                           </a:xfrm>
                           <a:prstGeom prst="rect">
                             <a:avLst/>
@@ -6447,6 +6468,7 @@
           </w:p>
           <w:p>
             <w:pPr>
+              <w:jc w:val="center"/>
               <w:rPr>
                 <w:rFonts w:eastAsia="Calibri"/>
                 <w:b/>
@@ -6488,7 +6510,8 @@
             </w:pPr>
             <w:r>
               <w:rPr>
-                <w:rFonts w:ascii="Calibri" w:eastAsia="Calibri" w:hAnsi="Calibri" w:cs="Calibri"/>
+                <w:rFonts w:ascii="Calibri" w:hAnsi="Calibri"/>
+                <w:noProof/>
                 <w:sz w:val="20"/>
                 <w:szCs w:val="16"/>
               </w:rPr>
@@ -6539,6 +6562,39 @@
                 <w:szCs w:val="16"/>
               </w:rPr>
             </w:pPr>
+          </w:p>
+          <w:p>
+            <w:pPr>
+              <w:rPr>
+                <w:rFonts w:eastAsia="Calibri"/>
+                <w:b/>
+                <w:bCs/>
+                <w:sz w:val="20"/>
+                <w:szCs w:val="16"/>
+              </w:rPr>
+            </w:pPr>
+          </w:p>
+          <w:p>
+            <w:pPr>
+              <w:rPr>
+                <w:rFonts w:eastAsia="Calibri"/>
+                <w:b/>
+                <w:bCs/>
+                <w:sz w:val="20"/>
+                <w:szCs w:val="16"/>
+              </w:rPr>
+            </w:pPr>
+          </w:p>
+          <w:p>
+            <w:pPr>
+              <w:rPr>
+                <w:rFonts w:eastAsia="Calibri"/>
+                <w:b/>
+                <w:bCs/>
+                <w:sz w:val="20"/>
+                <w:szCs w:val="16"/>
+              </w:rPr>
+            </w:pPr>
             <w:r>
               <w:rPr>
                 <w:rFonts w:eastAsia="Calibri"/>
@@ -6586,15 +6642,14 @@
             <w:r>
               <w:rPr>
                 <w:rFonts w:eastAsia="Noto Sans Symbols"/>
-                <w:noProof/>
                 <w:sz w:val="20"/>
                 <w:szCs w:val="16"/>
               </w:rPr>
               <w:drawing>
-                <wp:inline distT="0" distB="0" distL="0" distR="0" wp14:anchorId="631554A8" wp14:editId="4E06A72E">
-                  <wp:extent cx="5227200" cy="3556800"/>
-                  <wp:effectExtent l="0" t="0" r="0" b="5715"/>
-                  <wp:docPr id="10" name="Imagem 10"/>
+                <wp:inline distT="0" distB="0" distL="0" distR="0" wp14:anchorId="49CEDFF7" wp14:editId="7069265E">
+                  <wp:extent cx="5367600" cy="2613600"/>
+                  <wp:effectExtent l="0" t="0" r="5080" b="0"/>
+                  <wp:docPr id="33" name="Imagem 33"/>
                   <wp:cNvGraphicFramePr>
                     <a:graphicFrameLocks xmlns:a="http://schemas.openxmlformats.org/drawingml/2006/main" noChangeAspect="1"/>
                   </wp:cNvGraphicFramePr>
@@ -6614,7 +6669,7 @@
                         <pic:spPr>
                           <a:xfrm>
                             <a:off x="0" y="0"/>
-                            <a:ext cx="5227200" cy="3556800"/>
+                            <a:ext cx="5367600" cy="2613600"/>
                           </a:xfrm>
                           <a:prstGeom prst="rect">
                             <a:avLst/>
@@ -6673,15 +6728,14 @@
             <w:r>
               <w:rPr>
                 <w:rFonts w:eastAsia="Noto Sans Symbols"/>
-                <w:noProof/>
                 <w:sz w:val="20"/>
                 <w:szCs w:val="16"/>
               </w:rPr>
               <w:drawing>
-                <wp:inline distT="0" distB="0" distL="0" distR="0" wp14:anchorId="2660B147" wp14:editId="2027CC2B">
-                  <wp:extent cx="5306400" cy="3092400"/>
-                  <wp:effectExtent l="0" t="0" r="0" b="0"/>
-                  <wp:docPr id="11" name="Imagem 11"/>
+                <wp:inline distT="0" distB="0" distL="0" distR="0" wp14:anchorId="022E8137" wp14:editId="5A2BBA10">
+                  <wp:extent cx="5371200" cy="2012400"/>
+                  <wp:effectExtent l="0" t="0" r="1270" b="6985"/>
+                  <wp:docPr id="42" name="Imagem 42"/>
                   <wp:cNvGraphicFramePr>
                     <a:graphicFrameLocks xmlns:a="http://schemas.openxmlformats.org/drawingml/2006/main" noChangeAspect="1"/>
                   </wp:cNvGraphicFramePr>
@@ -6701,7 +6755,7 @@
                         <pic:spPr>
                           <a:xfrm>
                             <a:off x="0" y="0"/>
-                            <a:ext cx="5306400" cy="3092400"/>
+                            <a:ext cx="5371200" cy="2012400"/>
                           </a:xfrm>
                           <a:prstGeom prst="rect">
                             <a:avLst/>
@@ -6713,6 +6767,105 @@
                 </wp:inline>
               </w:drawing>
             </w:r>
+          </w:p>
+          <w:p>
+            <w:pPr>
+              <w:pStyle w:val="PargrafodaLista"/>
+              <w:jc w:val="center"/>
+              <w:rPr>
+                <w:rFonts w:eastAsia="Noto Sans Symbols"/>
+                <w:sz w:val="20"/>
+                <w:szCs w:val="16"/>
+              </w:rPr>
+            </w:pPr>
+          </w:p>
+          <w:p>
+            <w:pPr>
+              <w:pStyle w:val="PargrafodaLista"/>
+              <w:jc w:val="center"/>
+              <w:rPr>
+                <w:rFonts w:eastAsia="Noto Sans Symbols"/>
+                <w:sz w:val="20"/>
+                <w:szCs w:val="16"/>
+              </w:rPr>
+            </w:pPr>
+          </w:p>
+          <w:p>
+            <w:pPr>
+              <w:pStyle w:val="PargrafodaLista"/>
+              <w:jc w:val="center"/>
+              <w:rPr>
+                <w:rFonts w:eastAsia="Noto Sans Symbols"/>
+                <w:sz w:val="20"/>
+                <w:szCs w:val="16"/>
+              </w:rPr>
+            </w:pPr>
+          </w:p>
+          <w:p>
+            <w:pPr>
+              <w:pStyle w:val="PargrafodaLista"/>
+              <w:jc w:val="center"/>
+              <w:rPr>
+                <w:rFonts w:eastAsia="Noto Sans Symbols"/>
+                <w:sz w:val="20"/>
+                <w:szCs w:val="16"/>
+              </w:rPr>
+            </w:pPr>
+          </w:p>
+          <w:p>
+            <w:pPr>
+              <w:pStyle w:val="PargrafodaLista"/>
+              <w:jc w:val="center"/>
+              <w:rPr>
+                <w:rFonts w:eastAsia="Noto Sans Symbols"/>
+                <w:sz w:val="20"/>
+                <w:szCs w:val="16"/>
+              </w:rPr>
+            </w:pPr>
+          </w:p>
+          <w:p>
+            <w:pPr>
+              <w:pStyle w:val="PargrafodaLista"/>
+              <w:jc w:val="center"/>
+              <w:rPr>
+                <w:rFonts w:eastAsia="Noto Sans Symbols"/>
+                <w:sz w:val="20"/>
+                <w:szCs w:val="16"/>
+              </w:rPr>
+            </w:pPr>
+          </w:p>
+          <w:p>
+            <w:pPr>
+              <w:pStyle w:val="PargrafodaLista"/>
+              <w:jc w:val="center"/>
+              <w:rPr>
+                <w:rFonts w:eastAsia="Noto Sans Symbols"/>
+                <w:sz w:val="20"/>
+                <w:szCs w:val="16"/>
+              </w:rPr>
+            </w:pPr>
+          </w:p>
+          <w:p>
+            <w:pPr>
+              <w:pStyle w:val="PargrafodaLista"/>
+              <w:jc w:val="center"/>
+              <w:rPr>
+                <w:rFonts w:eastAsia="Noto Sans Symbols"/>
+                <w:sz w:val="20"/>
+                <w:szCs w:val="16"/>
+              </w:rPr>
+            </w:pPr>
+          </w:p>
+          <w:p>
+            <w:pPr>
+              <w:pStyle w:val="PargrafodaLista"/>
+              <w:jc w:val="center"/>
+              <w:rPr>
+                <w:rFonts w:eastAsia="Noto Sans Symbols"/>
+                <w:sz w:val="20"/>
+                <w:szCs w:val="16"/>
+              </w:rPr>
+            </w:pPr>
           </w:p>
           <w:p>
             <w:pPr>
@@ -6911,15 +7064,14 @@
             <w:r>
               <w:rPr>
                 <w:rFonts w:eastAsia="Noto Sans Symbols"/>
-                <w:noProof/>
                 <w:sz w:val="20"/>
                 <w:szCs w:val="16"/>
               </w:rPr>
               <w:drawing>
-                <wp:inline distT="0" distB="0" distL="0" distR="0" wp14:anchorId="281B2076" wp14:editId="64F1F357">
-                  <wp:extent cx="3358800" cy="3582000"/>
-                  <wp:effectExtent l="0" t="0" r="0" b="0"/>
-                  <wp:docPr id="14" name="Imagem 14"/>
+                <wp:inline distT="0" distB="0" distL="0" distR="0" wp14:anchorId="1F8AEDD6" wp14:editId="4C8C0380">
+                  <wp:extent cx="3301200" cy="3560400"/>
+                  <wp:effectExtent l="0" t="0" r="0" b="2540"/>
+                  <wp:docPr id="43" name="Imagem 43"/>
                   <wp:cNvGraphicFramePr>
                     <a:graphicFrameLocks xmlns:a="http://schemas.openxmlformats.org/drawingml/2006/main" noChangeAspect="1"/>
                   </wp:cNvGraphicFramePr>
@@ -6939,7 +7091,7 @@
                         <pic:spPr>
                           <a:xfrm>
                             <a:off x="0" y="0"/>
-                            <a:ext cx="3358800" cy="3582000"/>
+                            <a:ext cx="3301200" cy="3560400"/>
                           </a:xfrm>
                           <a:prstGeom prst="rect">
                             <a:avLst/>
@@ -7300,15 +7452,14 @@
             <w:r>
               <w:rPr>
                 <w:rFonts w:eastAsia="Noto Sans Symbols"/>
-                <w:noProof/>
                 <w:sz w:val="20"/>
                 <w:szCs w:val="16"/>
               </w:rPr>
               <w:drawing>
-                <wp:inline distT="0" distB="0" distL="0" distR="0" wp14:anchorId="76CE1E02" wp14:editId="4306DEA8">
-                  <wp:extent cx="5392800" cy="3078000"/>
-                  <wp:effectExtent l="0" t="0" r="0" b="8255"/>
-                  <wp:docPr id="20" name="Imagem 20"/>
+                <wp:inline distT="0" distB="0" distL="0" distR="0" wp14:anchorId="546F0FFB" wp14:editId="75BCE98E">
+                  <wp:extent cx="5320800" cy="3589200"/>
+                  <wp:effectExtent l="0" t="0" r="0" b="0"/>
+                  <wp:docPr id="49" name="Imagem 49"/>
                   <wp:cNvGraphicFramePr>
                     <a:graphicFrameLocks xmlns:a="http://schemas.openxmlformats.org/drawingml/2006/main" noChangeAspect="1"/>
                   </wp:cNvGraphicFramePr>
@@ -7319,27 +7470,20 @@
                           <pic:cNvPr id="1" name=""/>
                           <pic:cNvPicPr/>
                         </pic:nvPicPr>
-                        <pic:blipFill rotWithShape="1">
+                        <pic:blipFill>
                           <a:blip r:embed="rId23"/>
-                          <a:srcRect l="2268" t="7182" r="2445" b="3937"/>
-                          <a:stretch/>
+                          <a:stretch>
+                            <a:fillRect/>
+                          </a:stretch>
                         </pic:blipFill>
-                        <pic:spPr bwMode="auto">
+                        <pic:spPr>
                           <a:xfrm>
                             <a:off x="0" y="0"/>
-                            <a:ext cx="5392800" cy="3078000"/>
+                            <a:ext cx="5320800" cy="3589200"/>
                           </a:xfrm>
                           <a:prstGeom prst="rect">
                             <a:avLst/>
                           </a:prstGeom>
-                          <a:ln>
-                            <a:noFill/>
-                          </a:ln>
-                          <a:extLst>
-                            <a:ext uri="{53640926-AAD7-44D8-BBD7-CCE9431645EC}">
-                              <a14:shadowObscured xmlns:a14="http://schemas.microsoft.com/office/drawing/2010/main"/>
-                            </a:ext>
-                          </a:extLst>
                         </pic:spPr>
                       </pic:pic>
                     </a:graphicData>
@@ -8069,17 +8213,17 @@
             </w:pPr>
             <w:r>
               <w:rPr>
+                <w:rFonts w:eastAsia="Calibri"/>
                 <w:b/>
                 <w:bCs/>
-                <w:noProof/>
                 <w:sz w:val="20"/>
                 <w:szCs w:val="16"/>
               </w:rPr>
               <w:drawing>
-                <wp:inline distT="0" distB="0" distL="0" distR="0" wp14:anchorId="0EE82788" wp14:editId="13C9156B">
-                  <wp:extent cx="5371200" cy="2685600"/>
-                  <wp:effectExtent l="0" t="0" r="1270" b="635"/>
-                  <wp:docPr id="34" name="Imagem 34"/>
+                <wp:inline distT="0" distB="0" distL="0" distR="0" wp14:anchorId="2E05C02F" wp14:editId="030D3EA5">
+                  <wp:extent cx="5389200" cy="2649600"/>
+                  <wp:effectExtent l="0" t="0" r="2540" b="0"/>
+                  <wp:docPr id="47" name="Imagem 47"/>
                   <wp:cNvGraphicFramePr>
                     <a:graphicFrameLocks xmlns:a="http://schemas.openxmlformats.org/drawingml/2006/main" noChangeAspect="1"/>
                   </wp:cNvGraphicFramePr>
@@ -8099,7 +8243,7 @@
                         <pic:spPr>
                           <a:xfrm>
                             <a:off x="0" y="0"/>
-                            <a:ext cx="5371200" cy="2685600"/>
+                            <a:ext cx="5389200" cy="2649600"/>
                           </a:xfrm>
                           <a:prstGeom prst="rect">
                             <a:avLst/>
@@ -8159,17 +8303,17 @@
             </w:pPr>
             <w:r>
               <w:rPr>
+                <w:rFonts w:eastAsia="Calibri"/>
                 <w:b/>
                 <w:bCs/>
-                <w:noProof/>
                 <w:sz w:val="20"/>
                 <w:szCs w:val="16"/>
               </w:rPr>
               <w:drawing>
-                <wp:inline distT="0" distB="0" distL="0" distR="0" wp14:anchorId="449A1507" wp14:editId="492C27BF">
-                  <wp:extent cx="2822400" cy="3589200"/>
+                <wp:inline distT="0" distB="0" distL="0" distR="0" wp14:anchorId="30A5299C" wp14:editId="0DC10E52">
+                  <wp:extent cx="3200400" cy="3582000"/>
                   <wp:effectExtent l="0" t="0" r="0" b="0"/>
-                  <wp:docPr id="25" name="Imagem 25"/>
+                  <wp:docPr id="50" name="Imagem 50"/>
                   <wp:cNvGraphicFramePr>
                     <a:graphicFrameLocks xmlns:a="http://schemas.openxmlformats.org/drawingml/2006/main" noChangeAspect="1"/>
                   </wp:cNvGraphicFramePr>
@@ -8189,7 +8333,7 @@
                         <pic:spPr>
                           <a:xfrm>
                             <a:off x="0" y="0"/>
-                            <a:ext cx="2822400" cy="3589200"/>
+                            <a:ext cx="3200400" cy="3582000"/>
                           </a:xfrm>
                           <a:prstGeom prst="rect">
                             <a:avLst/>
@@ -8286,15 +8430,14 @@
             <w:r>
               <w:rPr>
                 <w:rFonts w:eastAsia="Noto Sans Symbols"/>
-                <w:noProof/>
                 <w:sz w:val="20"/>
                 <w:szCs w:val="16"/>
               </w:rPr>
               <w:drawing>
-                <wp:inline distT="0" distB="0" distL="0" distR="0" wp14:anchorId="4F315D8D" wp14:editId="52A07D18">
-                  <wp:extent cx="5378400" cy="2754000"/>
-                  <wp:effectExtent l="0" t="0" r="0" b="8255"/>
-                  <wp:docPr id="3" name="Imagem 3"/>
+                <wp:inline distT="0" distB="0" distL="0" distR="0" wp14:anchorId="0295DA8E" wp14:editId="5309BC0D">
+                  <wp:extent cx="5367600" cy="2610000"/>
+                  <wp:effectExtent l="0" t="0" r="5080" b="0"/>
+                  <wp:docPr id="51" name="Imagem 51"/>
                   <wp:cNvGraphicFramePr>
                     <a:graphicFrameLocks xmlns:a="http://schemas.openxmlformats.org/drawingml/2006/main" noChangeAspect="1"/>
                   </wp:cNvGraphicFramePr>
@@ -8314,7 +8457,7 @@
                         <pic:spPr>
                           <a:xfrm>
                             <a:off x="0" y="0"/>
-                            <a:ext cx="5378400" cy="2754000"/>
+                            <a:ext cx="5367600" cy="2610000"/>
                           </a:xfrm>
                           <a:prstGeom prst="rect">
                             <a:avLst/>
@@ -8384,6 +8527,17 @@
           </w:p>
           <w:p>
             <w:pPr>
+              <w:pStyle w:val="PargrafodaLista"/>
+              <w:jc w:val="center"/>
+              <w:rPr>
+                <w:rFonts w:eastAsia="Noto Sans Symbols"/>
+                <w:sz w:val="20"/>
+                <w:szCs w:val="16"/>
+              </w:rPr>
+            </w:pPr>
+          </w:p>
+          <w:p>
+            <w:pPr>
               <w:rPr>
                 <w:rFonts w:eastAsia="Noto Sans Symbols"/>
                 <w:sz w:val="20"/>
@@ -8448,10 +8602,10 @@
                 <w:szCs w:val="16"/>
               </w:rPr>
               <w:drawing>
-                <wp:inline distT="0" distB="0" distL="0" distR="0" wp14:anchorId="790DB953" wp14:editId="71EBE97E">
-                  <wp:extent cx="5335200" cy="2070000"/>
-                  <wp:effectExtent l="0" t="0" r="0" b="6985"/>
-                  <wp:docPr id="15" name="Imagem 15"/>
+                <wp:inline distT="0" distB="0" distL="0" distR="0" wp14:anchorId="21B0BECE" wp14:editId="2613CAAC">
+                  <wp:extent cx="5367600" cy="2005200"/>
+                  <wp:effectExtent l="0" t="0" r="5080" b="0"/>
+                  <wp:docPr id="52" name="Imagem 52"/>
                   <wp:cNvGraphicFramePr>
                     <a:graphicFrameLocks xmlns:a="http://schemas.openxmlformats.org/drawingml/2006/main" noChangeAspect="1"/>
                   </wp:cNvGraphicFramePr>
@@ -8471,7 +8625,7 @@
                         <pic:spPr>
                           <a:xfrm>
                             <a:off x="0" y="0"/>
-                            <a:ext cx="5335200" cy="2070000"/>
+                            <a:ext cx="5367600" cy="2005200"/>
                           </a:xfrm>
                           <a:prstGeom prst="rect">
                             <a:avLst/>
@@ -8744,15 +8898,14 @@
             <w:r>
               <w:rPr>
                 <w:rFonts w:eastAsia="Noto Sans Symbols"/>
-                <w:noProof/>
                 <w:sz w:val="20"/>
                 <w:szCs w:val="16"/>
               </w:rPr>
               <w:drawing>
-                <wp:inline distT="0" distB="0" distL="0" distR="0" wp14:anchorId="47EECB3C" wp14:editId="692A361A">
-                  <wp:extent cx="2620800" cy="3560400"/>
-                  <wp:effectExtent l="0" t="0" r="8255" b="2540"/>
-                  <wp:docPr id="21" name="Imagem 21"/>
+                <wp:inline distT="0" distB="0" distL="0" distR="0" wp14:anchorId="4DC1DD51" wp14:editId="37FBDD2E">
+                  <wp:extent cx="3110400" cy="3578400"/>
+                  <wp:effectExtent l="0" t="0" r="0" b="3175"/>
+                  <wp:docPr id="53" name="Imagem 53"/>
                   <wp:cNvGraphicFramePr>
                     <a:graphicFrameLocks xmlns:a="http://schemas.openxmlformats.org/drawingml/2006/main" noChangeAspect="1"/>
                   </wp:cNvGraphicFramePr>
@@ -8772,7 +8925,7 @@
                         <pic:spPr>
                           <a:xfrm>
                             <a:off x="0" y="0"/>
-                            <a:ext cx="2620800" cy="3560400"/>
+                            <a:ext cx="3110400" cy="3578400"/>
                           </a:xfrm>
                           <a:prstGeom prst="rect">
                             <a:avLst/>
@@ -9060,17 +9213,17 @@
             </w:pPr>
             <w:r>
               <w:rPr>
+                <w:rFonts w:eastAsia="Calibri"/>
                 <w:b/>
                 <w:bCs/>
-                <w:noProof/>
                 <w:sz w:val="20"/>
                 <w:szCs w:val="16"/>
               </w:rPr>
               <w:drawing>
-                <wp:inline distT="0" distB="0" distL="0" distR="0" wp14:anchorId="5167ED37" wp14:editId="0C0B0BDE">
-                  <wp:extent cx="5371200" cy="3099600"/>
-                  <wp:effectExtent l="0" t="0" r="1270" b="5715"/>
-                  <wp:docPr id="24" name="Imagem 24"/>
+                <wp:inline distT="0" distB="0" distL="0" distR="0" wp14:anchorId="615594BD" wp14:editId="1ECCB0BF">
+                  <wp:extent cx="5367600" cy="3240000"/>
+                  <wp:effectExtent l="0" t="0" r="5080" b="0"/>
+                  <wp:docPr id="54" name="Imagem 54"/>
                   <wp:cNvGraphicFramePr>
                     <a:graphicFrameLocks xmlns:a="http://schemas.openxmlformats.org/drawingml/2006/main" noChangeAspect="1"/>
                   </wp:cNvGraphicFramePr>
@@ -9090,7 +9243,7 @@
                         <pic:spPr>
                           <a:xfrm>
                             <a:off x="0" y="0"/>
-                            <a:ext cx="5371200" cy="3099600"/>
+                            <a:ext cx="5367600" cy="3240000"/>
                           </a:xfrm>
                           <a:prstGeom prst="rect">
                             <a:avLst/>
@@ -9848,10 +10001,10 @@
                 <w:szCs w:val="16"/>
               </w:rPr>
               <w:drawing>
-                <wp:inline distT="0" distB="0" distL="0" distR="0" wp14:anchorId="75B3578D" wp14:editId="3F59EB74">
-                  <wp:extent cx="5400000" cy="2664000"/>
-                  <wp:effectExtent l="0" t="0" r="0" b="3175"/>
-                  <wp:docPr id="35" name="Imagem 35"/>
+                <wp:inline distT="0" distB="0" distL="0" distR="0" wp14:anchorId="203C4205" wp14:editId="7BF93B2B">
+                  <wp:extent cx="5331600" cy="2602800"/>
+                  <wp:effectExtent l="0" t="0" r="2540" b="7620"/>
+                  <wp:docPr id="56" name="Imagem 56"/>
                   <wp:cNvGraphicFramePr>
                     <a:graphicFrameLocks xmlns:a="http://schemas.openxmlformats.org/drawingml/2006/main" noChangeAspect="1"/>
                   </wp:cNvGraphicFramePr>
@@ -9871,7 +10024,7 @@
                         <pic:spPr>
                           <a:xfrm>
                             <a:off x="0" y="0"/>
-                            <a:ext cx="5400000" cy="2664000"/>
+                            <a:ext cx="5331600" cy="2602800"/>
                           </a:xfrm>
                           <a:prstGeom prst="rect">
                             <a:avLst/>
@@ -9950,10 +10103,10 @@
                 <w:szCs w:val="16"/>
               </w:rPr>
               <w:drawing>
-                <wp:inline distT="0" distB="0" distL="0" distR="0" wp14:anchorId="2DC4C2FD" wp14:editId="760F02BF">
-                  <wp:extent cx="3150000" cy="3589200"/>
-                  <wp:effectExtent l="0" t="0" r="0" b="0"/>
-                  <wp:docPr id="45" name="Imagem 45"/>
+                <wp:inline distT="0" distB="0" distL="0" distR="0" wp14:anchorId="178DCA33" wp14:editId="5B2430F2">
+                  <wp:extent cx="3664800" cy="3592800"/>
+                  <wp:effectExtent l="0" t="0" r="0" b="8255"/>
+                  <wp:docPr id="57" name="Imagem 57"/>
                   <wp:cNvGraphicFramePr>
                     <a:graphicFrameLocks xmlns:a="http://schemas.openxmlformats.org/drawingml/2006/main" noChangeAspect="1"/>
                   </wp:cNvGraphicFramePr>
@@ -9973,7 +10126,7 @@
                         <pic:spPr>
                           <a:xfrm>
                             <a:off x="0" y="0"/>
-                            <a:ext cx="3150000" cy="3589200"/>
+                            <a:ext cx="3664800" cy="3592800"/>
                           </a:xfrm>
                           <a:prstGeom prst="rect">
                             <a:avLst/>
@@ -10058,10 +10211,10 @@
                 <w:szCs w:val="16"/>
               </w:rPr>
               <w:drawing>
-                <wp:inline distT="0" distB="0" distL="0" distR="0" wp14:anchorId="3E25A681" wp14:editId="2F7903AA">
-                  <wp:extent cx="5328000" cy="2574000"/>
-                  <wp:effectExtent l="0" t="0" r="6350" b="0"/>
-                  <wp:docPr id="12" name="Imagem 12"/>
+                <wp:inline distT="0" distB="0" distL="0" distR="0" wp14:anchorId="4F8E62BC" wp14:editId="4685E7E8">
+                  <wp:extent cx="5364000" cy="2386800"/>
+                  <wp:effectExtent l="0" t="0" r="8255" b="0"/>
+                  <wp:docPr id="58" name="Imagem 58"/>
                   <wp:cNvGraphicFramePr>
                     <a:graphicFrameLocks xmlns:a="http://schemas.openxmlformats.org/drawingml/2006/main" noChangeAspect="1"/>
                   </wp:cNvGraphicFramePr>
@@ -10081,7 +10234,7 @@
                         <pic:spPr>
                           <a:xfrm>
                             <a:off x="0" y="0"/>
-                            <a:ext cx="5328000" cy="2574000"/>
+                            <a:ext cx="5364000" cy="2386800"/>
                           </a:xfrm>
                           <a:prstGeom prst="rect">
                             <a:avLst/>
@@ -10166,6 +10319,16 @@
           </w:p>
           <w:p>
             <w:pPr>
+              <w:jc w:val="left"/>
+              <w:rPr>
+                <w:rFonts w:eastAsia="Noto Sans Symbols"/>
+                <w:sz w:val="20"/>
+                <w:szCs w:val="16"/>
+              </w:rPr>
+            </w:pPr>
+          </w:p>
+          <w:p>
+            <w:pPr>
               <w:pStyle w:val="PargrafodaLista"/>
               <w:numPr>
                 <w:ilvl w:val="0"/>
@@ -10205,10 +10368,10 @@
                 <w:szCs w:val="16"/>
               </w:rPr>
               <w:drawing>
-                <wp:inline distT="0" distB="0" distL="0" distR="0" wp14:anchorId="6F0AA081" wp14:editId="263AC916">
-                  <wp:extent cx="5324400" cy="2401200"/>
-                  <wp:effectExtent l="0" t="0" r="0" b="0"/>
-                  <wp:docPr id="26" name="Imagem 26"/>
+                <wp:inline distT="0" distB="0" distL="0" distR="0" wp14:anchorId="1C2AA5F9" wp14:editId="1CA74BAC">
+                  <wp:extent cx="5367600" cy="2016000"/>
+                  <wp:effectExtent l="0" t="0" r="5080" b="3810"/>
+                  <wp:docPr id="59" name="Imagem 59"/>
                   <wp:cNvGraphicFramePr>
                     <a:graphicFrameLocks xmlns:a="http://schemas.openxmlformats.org/drawingml/2006/main" noChangeAspect="1"/>
                   </wp:cNvGraphicFramePr>
@@ -10228,7 +10391,7 @@
                         <pic:spPr>
                           <a:xfrm>
                             <a:off x="0" y="0"/>
-                            <a:ext cx="5324400" cy="2401200"/>
+                            <a:ext cx="5367600" cy="2016000"/>
                           </a:xfrm>
                           <a:prstGeom prst="rect">
                             <a:avLst/>
@@ -10419,6 +10582,16 @@
           </w:p>
           <w:p>
             <w:pPr>
+              <w:jc w:val="left"/>
+              <w:rPr>
+                <w:rFonts w:eastAsia="Noto Sans Symbols"/>
+                <w:sz w:val="20"/>
+                <w:szCs w:val="16"/>
+              </w:rPr>
+            </w:pPr>
+          </w:p>
+          <w:p>
+            <w:pPr>
               <w:pStyle w:val="PargrafodaLista"/>
               <w:numPr>
                 <w:ilvl w:val="0"/>
@@ -10458,10 +10631,10 @@
                 <w:szCs w:val="16"/>
               </w:rPr>
               <w:drawing>
-                <wp:inline distT="0" distB="0" distL="0" distR="0" wp14:anchorId="643C0669" wp14:editId="32D0CEBC">
-                  <wp:extent cx="3099600" cy="3600000"/>
-                  <wp:effectExtent l="0" t="0" r="5715" b="635"/>
-                  <wp:docPr id="28" name="Imagem 28"/>
+                <wp:inline distT="0" distB="0" distL="0" distR="0" wp14:anchorId="5FC99D5F" wp14:editId="2CFCD3C1">
+                  <wp:extent cx="3884400" cy="3582000"/>
+                  <wp:effectExtent l="0" t="0" r="1905" b="0"/>
+                  <wp:docPr id="60" name="Imagem 60"/>
                   <wp:cNvGraphicFramePr>
                     <a:graphicFrameLocks xmlns:a="http://schemas.openxmlformats.org/drawingml/2006/main" noChangeAspect="1"/>
                   </wp:cNvGraphicFramePr>
@@ -10481,7 +10654,7 @@
                         <pic:spPr>
                           <a:xfrm>
                             <a:off x="0" y="0"/>
-                            <a:ext cx="3099600" cy="3600000"/>
+                            <a:ext cx="3884400" cy="3582000"/>
                           </a:xfrm>
                           <a:prstGeom prst="rect">
                             <a:avLst/>
@@ -10732,15 +10905,14 @@
             <w:r>
               <w:rPr>
                 <w:rFonts w:eastAsia="Noto Sans Symbols"/>
-                <w:noProof/>
                 <w:sz w:val="20"/>
                 <w:szCs w:val="16"/>
               </w:rPr>
               <w:drawing>
-                <wp:inline distT="0" distB="0" distL="0" distR="0" wp14:anchorId="416FB8C4" wp14:editId="60D52B64">
-                  <wp:extent cx="5374800" cy="3168000"/>
-                  <wp:effectExtent l="0" t="0" r="0" b="0"/>
-                  <wp:docPr id="31" name="Imagem 31"/>
+                <wp:inline distT="0" distB="0" distL="0" distR="0" wp14:anchorId="2291E77E" wp14:editId="5DC0A6A6">
+                  <wp:extent cx="5364000" cy="3178800"/>
+                  <wp:effectExtent l="0" t="0" r="8255" b="3175"/>
+                  <wp:docPr id="61" name="Imagem 61"/>
                   <wp:cNvGraphicFramePr>
                     <a:graphicFrameLocks xmlns:a="http://schemas.openxmlformats.org/drawingml/2006/main" noChangeAspect="1"/>
                   </wp:cNvGraphicFramePr>
@@ -10760,7 +10932,7 @@
                         <pic:spPr>
                           <a:xfrm>
                             <a:off x="0" y="0"/>
-                            <a:ext cx="5374800" cy="3168000"/>
+                            <a:ext cx="5364000" cy="3178800"/>
                           </a:xfrm>
                           <a:prstGeom prst="rect">
                             <a:avLst/>
@@ -11214,10 +11386,10 @@
                 <w:szCs w:val="16"/>
               </w:rPr>
               <w:drawing>
-                <wp:inline distT="0" distB="0" distL="0" distR="0" wp14:anchorId="212E1CC1" wp14:editId="24D89937">
-                  <wp:extent cx="5378400" cy="2782800"/>
-                  <wp:effectExtent l="0" t="0" r="0" b="0"/>
-                  <wp:docPr id="48" name="Imagem 48"/>
+                <wp:inline distT="0" distB="0" distL="0" distR="0" wp14:anchorId="3E6E200A" wp14:editId="3F890C53">
+                  <wp:extent cx="5328000" cy="2653200"/>
+                  <wp:effectExtent l="0" t="0" r="6350" b="0"/>
+                  <wp:docPr id="62" name="Imagem 62"/>
                   <wp:cNvGraphicFramePr>
                     <a:graphicFrameLocks xmlns:a="http://schemas.openxmlformats.org/drawingml/2006/main" noChangeAspect="1"/>
                   </wp:cNvGraphicFramePr>
@@ -11237,7 +11409,7 @@
                         <pic:spPr>
                           <a:xfrm>
                             <a:off x="0" y="0"/>
-                            <a:ext cx="5378400" cy="2782800"/>
+                            <a:ext cx="5328000" cy="2653200"/>
                           </a:xfrm>
                           <a:prstGeom prst="rect">
                             <a:avLst/>
@@ -11264,6 +11436,18 @@
           </w:p>
           <w:p>
             <w:pPr>
+              <w:jc w:val="center"/>
+              <w:rPr>
+                <w:rFonts w:eastAsia="Calibri"/>
+                <w:b/>
+                <w:bCs/>
+                <w:sz w:val="20"/>
+                <w:szCs w:val="16"/>
+              </w:rPr>
+            </w:pPr>
+          </w:p>
+          <w:p>
+            <w:pPr>
               <w:rPr>
                 <w:rFonts w:eastAsia="Calibri"/>
                 <w:b/>
@@ -11297,17 +11481,17 @@
             </w:pPr>
             <w:r>
               <w:rPr>
+                <w:rFonts w:eastAsia="Calibri"/>
                 <w:b/>
                 <w:bCs/>
-                <w:noProof/>
                 <w:sz w:val="20"/>
                 <w:szCs w:val="16"/>
               </w:rPr>
               <w:drawing>
-                <wp:inline distT="0" distB="0" distL="0" distR="0" wp14:anchorId="2D02AE30" wp14:editId="0ED42F7E">
-                  <wp:extent cx="3160800" cy="3589200"/>
-                  <wp:effectExtent l="0" t="0" r="1905" b="0"/>
-                  <wp:docPr id="46" name="Imagem 46"/>
+                <wp:inline distT="0" distB="0" distL="0" distR="0" wp14:anchorId="2CCDE583" wp14:editId="50EEC044">
+                  <wp:extent cx="3585600" cy="3585600"/>
+                  <wp:effectExtent l="0" t="0" r="0" b="0"/>
+                  <wp:docPr id="63" name="Imagem 63"/>
                   <wp:cNvGraphicFramePr>
                     <a:graphicFrameLocks xmlns:a="http://schemas.openxmlformats.org/drawingml/2006/main" noChangeAspect="1"/>
                   </wp:cNvGraphicFramePr>
@@ -11327,7 +11511,7 @@
                         <pic:spPr>
                           <a:xfrm>
                             <a:off x="0" y="0"/>
-                            <a:ext cx="3160800" cy="3589200"/>
+                            <a:ext cx="3585600" cy="3585600"/>
                           </a:xfrm>
                           <a:prstGeom prst="rect">
                             <a:avLst/>
@@ -11428,10 +11612,10 @@
                 <w:szCs w:val="16"/>
               </w:rPr>
               <w:drawing>
-                <wp:inline distT="0" distB="0" distL="0" distR="0" wp14:anchorId="496E5C0C" wp14:editId="6146C414">
-                  <wp:extent cx="5367600" cy="2581200"/>
-                  <wp:effectExtent l="0" t="0" r="5080" b="0"/>
-                  <wp:docPr id="2" name="Imagem 2"/>
+                <wp:inline distT="0" distB="0" distL="0" distR="0" wp14:anchorId="4B3B2644" wp14:editId="77919A9A">
+                  <wp:extent cx="5400000" cy="2977200"/>
+                  <wp:effectExtent l="0" t="0" r="0" b="0"/>
+                  <wp:docPr id="64" name="Imagem 64"/>
                   <wp:cNvGraphicFramePr>
                     <a:graphicFrameLocks xmlns:a="http://schemas.openxmlformats.org/drawingml/2006/main" noChangeAspect="1"/>
                   </wp:cNvGraphicFramePr>
@@ -11451,7 +11635,7 @@
                         <pic:spPr>
                           <a:xfrm>
                             <a:off x="0" y="0"/>
-                            <a:ext cx="5367600" cy="2581200"/>
+                            <a:ext cx="5400000" cy="2977200"/>
                           </a:xfrm>
                           <a:prstGeom prst="rect">
                             <a:avLst/>
@@ -11516,26 +11700,6 @@
           </w:p>
           <w:p>
             <w:pPr>
-              <w:jc w:val="left"/>
-              <w:rPr>
-                <w:rFonts w:eastAsia="Noto Sans Symbols"/>
-                <w:sz w:val="20"/>
-                <w:szCs w:val="16"/>
-              </w:rPr>
-            </w:pPr>
-          </w:p>
-          <w:p>
-            <w:pPr>
-              <w:jc w:val="left"/>
-              <w:rPr>
-                <w:rFonts w:eastAsia="Noto Sans Symbols"/>
-                <w:sz w:val="20"/>
-                <w:szCs w:val="16"/>
-              </w:rPr>
-            </w:pPr>
-          </w:p>
-          <w:p>
-            <w:pPr>
               <w:pStyle w:val="PargrafodaLista"/>
               <w:numPr>
                 <w:ilvl w:val="0"/>
@@ -11599,10 +11763,10 @@
                 <w:szCs w:val="16"/>
               </w:rPr>
               <w:drawing>
-                <wp:inline distT="0" distB="0" distL="0" distR="0" wp14:anchorId="2218600D" wp14:editId="048BF079">
-                  <wp:extent cx="5367600" cy="2188800"/>
-                  <wp:effectExtent l="0" t="0" r="5080" b="2540"/>
-                  <wp:docPr id="32" name="Imagem 32"/>
+                <wp:inline distT="0" distB="0" distL="0" distR="0" wp14:anchorId="788EA9B7" wp14:editId="08083688">
+                  <wp:extent cx="5400000" cy="2106000"/>
+                  <wp:effectExtent l="0" t="0" r="0" b="8890"/>
+                  <wp:docPr id="65" name="Imagem 65"/>
                   <wp:cNvGraphicFramePr>
                     <a:graphicFrameLocks xmlns:a="http://schemas.openxmlformats.org/drawingml/2006/main" noChangeAspect="1"/>
                   </wp:cNvGraphicFramePr>
@@ -11622,7 +11786,7 @@
                         <pic:spPr>
                           <a:xfrm>
                             <a:off x="0" y="0"/>
-                            <a:ext cx="5367600" cy="2188800"/>
+                            <a:ext cx="5400000" cy="2106000"/>
                           </a:xfrm>
                           <a:prstGeom prst="rect">
                             <a:avLst/>
@@ -11870,10 +12034,10 @@
                 <w:szCs w:val="16"/>
               </w:rPr>
               <w:drawing>
-                <wp:inline distT="0" distB="0" distL="0" distR="0" wp14:anchorId="738969B5" wp14:editId="6E7694C9">
-                  <wp:extent cx="3344400" cy="3592800"/>
-                  <wp:effectExtent l="0" t="0" r="8890" b="8255"/>
-                  <wp:docPr id="37" name="Imagem 37"/>
+                <wp:inline distT="0" distB="0" distL="0" distR="0" wp14:anchorId="6D611607" wp14:editId="7ABB3334">
+                  <wp:extent cx="3924000" cy="3578400"/>
+                  <wp:effectExtent l="0" t="0" r="635" b="3175"/>
+                  <wp:docPr id="66" name="Imagem 66"/>
                   <wp:cNvGraphicFramePr>
                     <a:graphicFrameLocks xmlns:a="http://schemas.openxmlformats.org/drawingml/2006/main" noChangeAspect="1"/>
                   </wp:cNvGraphicFramePr>
@@ -11893,7 +12057,7 @@
                         <pic:spPr>
                           <a:xfrm>
                             <a:off x="0" y="0"/>
-                            <a:ext cx="3344400" cy="3592800"/>
+                            <a:ext cx="3924000" cy="3578400"/>
                           </a:xfrm>
                           <a:prstGeom prst="rect">
                             <a:avLst/>
@@ -12149,10 +12313,10 @@
                 <w:szCs w:val="16"/>
               </w:rPr>
               <w:drawing>
-                <wp:inline distT="0" distB="0" distL="0" distR="0" wp14:anchorId="72693FD3" wp14:editId="230ADF96">
-                  <wp:extent cx="5378400" cy="3175200"/>
-                  <wp:effectExtent l="0" t="0" r="0" b="6350"/>
-                  <wp:docPr id="40" name="Imagem 40"/>
+                <wp:inline distT="0" distB="0" distL="0" distR="0" wp14:anchorId="366B16BE" wp14:editId="4E41C4DF">
+                  <wp:extent cx="5367600" cy="3214800"/>
+                  <wp:effectExtent l="0" t="0" r="5080" b="5080"/>
+                  <wp:docPr id="67" name="Imagem 67"/>
                   <wp:cNvGraphicFramePr>
                     <a:graphicFrameLocks xmlns:a="http://schemas.openxmlformats.org/drawingml/2006/main" noChangeAspect="1"/>
                   </wp:cNvGraphicFramePr>
@@ -12172,7 +12336,7 @@
                         <pic:spPr>
                           <a:xfrm>
                             <a:off x="0" y="0"/>
-                            <a:ext cx="5378400" cy="3175200"/>
+                            <a:ext cx="5367600" cy="3214800"/>
                           </a:xfrm>
                           <a:prstGeom prst="rect">
                             <a:avLst/>
@@ -12210,14 +12374,1153 @@
     </w:p>
     <w:p>
       <w:pPr>
+        <w:spacing w:after="240" w:line="259" w:lineRule="auto"/>
+        <w:rPr>
+          <w:b/>
+          <w:caps/>
+          <w:color w:val="2E75B5"/>
+          <w:sz w:val="32"/>
+          <w:szCs w:val="32"/>
+        </w:rPr>
+      </w:pPr>
+      <w:r>
+        <w:br w:type="page"/>
+      </w:r>
+    </w:p>
+    <w:tbl>
+      <w:tblPr>
+        <w:tblStyle w:val="a2"/>
+        <w:tblW w:w="9627" w:type="dxa"/>
+        <w:tblInd w:w="0" w:type="dxa"/>
+        <w:tblBorders>
+          <w:top w:val="single" w:sz="4" w:space="0" w:color="000000"/>
+          <w:left w:val="single" w:sz="4" w:space="0" w:color="000000"/>
+          <w:bottom w:val="single" w:sz="4" w:space="0" w:color="000000"/>
+          <w:right w:val="single" w:sz="4" w:space="0" w:color="000000"/>
+          <w:insideH w:val="single" w:sz="4" w:space="0" w:color="000000"/>
+          <w:insideV w:val="single" w:sz="4" w:space="0" w:color="000000"/>
+        </w:tblBorders>
+        <w:tblLayout w:type="fixed"/>
+        <w:tblLook w:val="0400" w:firstRow="0" w:lastRow="0" w:firstColumn="0" w:lastColumn="0" w:noHBand="0" w:noVBand="1"/>
+      </w:tblPr>
+      <w:tblGrid>
+        <w:gridCol w:w="9627"/>
+      </w:tblGrid>
+      <w:tr>
+        <w:tc>
+          <w:tcPr>
+            <w:tcW w:w="9627" w:type="dxa"/>
+            <w:shd w:val="clear" w:color="auto" w:fill="F2F2F2"/>
+          </w:tcPr>
+          <w:p>
+            <w:pPr>
+              <w:rPr>
+                <w:rFonts w:eastAsia="Calibri"/>
+                <w:b/>
+                <w:bCs/>
+                <w:sz w:val="20"/>
+                <w:szCs w:val="16"/>
+              </w:rPr>
+            </w:pPr>
+            <w:r>
+              <w:rPr>
+                <w:rFonts w:eastAsia="Calibri"/>
+                <w:b/>
+                <w:bCs/>
+                <w:sz w:val="20"/>
+                <w:szCs w:val="16"/>
+              </w:rPr>
+              <w:lastRenderedPageBreak/>
+              <w:t xml:space="preserve">Estória </w:t>
+            </w:r>
+            <w:r>
+              <w:rPr>
+                <w:rFonts w:eastAsia="Calibri"/>
+                <w:b/>
+                <w:bCs/>
+                <w:sz w:val="20"/>
+                <w:szCs w:val="16"/>
+              </w:rPr>
+              <w:t>5</w:t>
+            </w:r>
+            <w:r>
+              <w:rPr>
+                <w:rFonts w:eastAsia="Calibri"/>
+                <w:b/>
+                <w:bCs/>
+                <w:sz w:val="20"/>
+                <w:szCs w:val="16"/>
+              </w:rPr>
+              <w:t xml:space="preserve">: </w:t>
+            </w:r>
+            <w:r>
+              <w:rPr>
+                <w:rFonts w:eastAsia="Calibri"/>
+                <w:b/>
+                <w:bCs/>
+                <w:sz w:val="20"/>
+                <w:szCs w:val="16"/>
+              </w:rPr>
+              <w:t xml:space="preserve">Gerenciar </w:t>
+            </w:r>
+            <w:r>
+              <w:rPr>
+                <w:rFonts w:eastAsia="Calibri"/>
+                <w:b/>
+                <w:bCs/>
+                <w:sz w:val="20"/>
+                <w:szCs w:val="16"/>
+              </w:rPr>
+              <w:t>colaboradores</w:t>
+            </w:r>
+          </w:p>
+          <w:p>
+            <w:pPr>
+              <w:rPr>
+                <w:rFonts w:eastAsia="Calibri"/>
+                <w:b/>
+                <w:sz w:val="20"/>
+                <w:szCs w:val="16"/>
+              </w:rPr>
+            </w:pPr>
+            <w:r>
+              <w:rPr>
+                <w:rFonts w:eastAsia="Calibri"/>
+                <w:sz w:val="20"/>
+                <w:szCs w:val="16"/>
+              </w:rPr>
+              <w:t>Como administrador do sistema,</w:t>
+            </w:r>
+            <w:r>
+              <w:rPr>
+                <w:rFonts w:eastAsia="Calibri"/>
+                <w:sz w:val="20"/>
+                <w:szCs w:val="16"/>
+              </w:rPr>
+              <w:t xml:space="preserve"> </w:t>
+            </w:r>
+            <w:r>
+              <w:rPr>
+                <w:rFonts w:eastAsia="Calibri"/>
+                <w:sz w:val="20"/>
+                <w:szCs w:val="16"/>
+              </w:rPr>
+              <w:t>quero gerenciar os colaboradores</w:t>
+            </w:r>
+            <w:r>
+              <w:rPr>
+                <w:rFonts w:eastAsia="Calibri"/>
+                <w:sz w:val="20"/>
+                <w:szCs w:val="16"/>
+              </w:rPr>
+              <w:t xml:space="preserve"> (listar, buscar, cadastrar, alterar e excluir), </w:t>
+            </w:r>
+            <w:r>
+              <w:rPr>
+                <w:rFonts w:eastAsia="Calibri"/>
+                <w:sz w:val="20"/>
+                <w:szCs w:val="16"/>
+              </w:rPr>
+              <w:t>para manter o controle de quem faz parte da organização e garantir que cada colaborador esteja corretamente vinculado ao setor e cargo correspondentes.</w:t>
+            </w:r>
+          </w:p>
+        </w:tc>
+      </w:tr>
+      <w:tr>
+        <w:tc>
+          <w:tcPr>
+            <w:tcW w:w="9627" w:type="dxa"/>
+          </w:tcPr>
+          <w:p>
+            <w:pPr>
+              <w:rPr>
+                <w:rFonts w:eastAsia="Calibri"/>
+                <w:b/>
+                <w:bCs/>
+                <w:sz w:val="20"/>
+                <w:szCs w:val="16"/>
+              </w:rPr>
+            </w:pPr>
+            <w:r>
+              <w:rPr>
+                <w:rFonts w:eastAsia="Calibri"/>
+                <w:b/>
+                <w:bCs/>
+                <w:sz w:val="20"/>
+                <w:szCs w:val="16"/>
+              </w:rPr>
+              <w:t>Especificação do Requisito</w:t>
+            </w:r>
+          </w:p>
+          <w:p>
+            <w:pPr>
+              <w:pStyle w:val="PargrafodaLista"/>
+              <w:numPr>
+                <w:ilvl w:val="0"/>
+                <w:numId w:val="12"/>
+              </w:numPr>
+              <w:rPr>
+                <w:rFonts w:ascii="Noto Sans Symbols" w:eastAsia="Noto Sans Symbols" w:hAnsi="Noto Sans Symbols" w:cs="Noto Sans Symbols"/>
+                <w:sz w:val="20"/>
+                <w:szCs w:val="16"/>
+              </w:rPr>
+            </w:pPr>
+            <w:r>
+              <w:rPr>
+                <w:rFonts w:eastAsia="Calibri"/>
+                <w:sz w:val="20"/>
+                <w:szCs w:val="16"/>
+              </w:rPr>
+              <w:t>Deve ser possível listar todos os colaboradores cadastrados no sistema, com opção de busca por nome, CPF ou e-mail.</w:t>
+            </w:r>
+          </w:p>
+          <w:p>
+            <w:pPr>
+              <w:pStyle w:val="PargrafodaLista"/>
+              <w:numPr>
+                <w:ilvl w:val="0"/>
+                <w:numId w:val="12"/>
+              </w:numPr>
+              <w:rPr>
+                <w:rFonts w:eastAsia="Noto Sans Symbols" w:cs="Arial"/>
+                <w:sz w:val="20"/>
+                <w:szCs w:val="16"/>
+              </w:rPr>
+            </w:pPr>
+            <w:r>
+              <w:rPr>
+                <w:rFonts w:eastAsia="Calibri"/>
+                <w:sz w:val="20"/>
+                <w:szCs w:val="16"/>
+              </w:rPr>
+              <w:t>O sistema deve permitir o cadastro de novos colaboradores, contendo os seguintes campos obrigatórios:</w:t>
+            </w:r>
+          </w:p>
+          <w:p>
+            <w:pPr>
+              <w:pStyle w:val="PargrafodaLista"/>
+              <w:numPr>
+                <w:ilvl w:val="1"/>
+                <w:numId w:val="1"/>
+              </w:numPr>
+              <w:rPr>
+                <w:rFonts w:eastAsia="Courier New" w:cs="Arial"/>
+                <w:sz w:val="20"/>
+                <w:szCs w:val="16"/>
+              </w:rPr>
+            </w:pPr>
+            <w:r>
+              <w:rPr>
+                <w:rFonts w:eastAsia="Calibri" w:cs="Arial"/>
+                <w:sz w:val="20"/>
+                <w:szCs w:val="16"/>
+              </w:rPr>
+              <w:t>Nome (não pode ser vazio)</w:t>
+            </w:r>
+            <w:r>
+              <w:rPr>
+                <w:rFonts w:eastAsia="Calibri" w:cs="Arial"/>
+                <w:sz w:val="20"/>
+                <w:szCs w:val="16"/>
+              </w:rPr>
+              <w:t xml:space="preserve"> </w:t>
+            </w:r>
+          </w:p>
+          <w:p>
+            <w:pPr>
+              <w:pStyle w:val="PargrafodaLista"/>
+              <w:numPr>
+                <w:ilvl w:val="1"/>
+                <w:numId w:val="1"/>
+              </w:numPr>
+              <w:rPr>
+                <w:rFonts w:eastAsia="Courier New" w:cs="Arial"/>
+                <w:sz w:val="20"/>
+                <w:szCs w:val="16"/>
+              </w:rPr>
+            </w:pPr>
+            <w:r>
+              <w:rPr>
+                <w:rFonts w:eastAsia="Calibri" w:cs="Arial"/>
+                <w:sz w:val="20"/>
+                <w:szCs w:val="16"/>
+              </w:rPr>
+              <w:t>CPF (não pode ser vazio e não pode se repetir)</w:t>
+            </w:r>
+          </w:p>
+          <w:p>
+            <w:pPr>
+              <w:pStyle w:val="PargrafodaLista"/>
+              <w:numPr>
+                <w:ilvl w:val="1"/>
+                <w:numId w:val="1"/>
+              </w:numPr>
+              <w:rPr>
+                <w:rFonts w:eastAsia="Courier New" w:cs="Arial"/>
+                <w:sz w:val="20"/>
+                <w:szCs w:val="16"/>
+              </w:rPr>
+            </w:pPr>
+            <w:r>
+              <w:rPr>
+                <w:rFonts w:eastAsia="Courier New" w:cs="Arial"/>
+                <w:sz w:val="20"/>
+                <w:szCs w:val="16"/>
+              </w:rPr>
+              <w:t>Data de Nascimento</w:t>
+            </w:r>
+          </w:p>
+          <w:p>
+            <w:pPr>
+              <w:pStyle w:val="PargrafodaLista"/>
+              <w:numPr>
+                <w:ilvl w:val="1"/>
+                <w:numId w:val="1"/>
+              </w:numPr>
+              <w:rPr>
+                <w:rFonts w:eastAsia="Courier New" w:cs="Arial"/>
+                <w:sz w:val="20"/>
+                <w:szCs w:val="16"/>
+              </w:rPr>
+            </w:pPr>
+            <w:r>
+              <w:rPr>
+                <w:rFonts w:eastAsia="Courier New" w:cs="Arial"/>
+                <w:sz w:val="20"/>
+                <w:szCs w:val="16"/>
+              </w:rPr>
+              <w:t>Data de Admissão (definida automaticamente no momento do cadastro)</w:t>
+            </w:r>
+          </w:p>
+          <w:p>
+            <w:pPr>
+              <w:pStyle w:val="PargrafodaLista"/>
+              <w:numPr>
+                <w:ilvl w:val="1"/>
+                <w:numId w:val="1"/>
+              </w:numPr>
+              <w:rPr>
+                <w:rFonts w:eastAsia="Courier New" w:cs="Arial"/>
+                <w:sz w:val="20"/>
+                <w:szCs w:val="16"/>
+              </w:rPr>
+            </w:pPr>
+            <w:r>
+              <w:rPr>
+                <w:rFonts w:eastAsia="Courier New" w:cs="Arial"/>
+                <w:sz w:val="20"/>
+                <w:szCs w:val="16"/>
+              </w:rPr>
+              <w:t>Cargo (deve existir e estar ativo)</w:t>
+            </w:r>
+          </w:p>
+          <w:p>
+            <w:pPr>
+              <w:pStyle w:val="PargrafodaLista"/>
+              <w:numPr>
+                <w:ilvl w:val="1"/>
+                <w:numId w:val="1"/>
+              </w:numPr>
+              <w:rPr>
+                <w:rFonts w:eastAsia="Courier New" w:cs="Arial"/>
+                <w:sz w:val="20"/>
+                <w:szCs w:val="16"/>
+              </w:rPr>
+            </w:pPr>
+            <w:r>
+              <w:rPr>
+                <w:rFonts w:eastAsia="Courier New" w:cs="Arial"/>
+                <w:sz w:val="20"/>
+                <w:szCs w:val="16"/>
+              </w:rPr>
+              <w:t>Setor (deve existir e estar ativo)</w:t>
+            </w:r>
+          </w:p>
+          <w:p>
+            <w:pPr>
+              <w:pStyle w:val="PargrafodaLista"/>
+              <w:numPr>
+                <w:ilvl w:val="0"/>
+                <w:numId w:val="1"/>
+              </w:numPr>
+              <w:rPr>
+                <w:rFonts w:ascii="Noto Sans Symbols" w:eastAsia="Noto Sans Symbols" w:hAnsi="Noto Sans Symbols" w:cs="Noto Sans Symbols"/>
+                <w:sz w:val="20"/>
+                <w:szCs w:val="16"/>
+              </w:rPr>
+            </w:pPr>
+            <w:r>
+              <w:rPr>
+                <w:rFonts w:eastAsia="Calibri"/>
+                <w:sz w:val="20"/>
+                <w:szCs w:val="16"/>
+              </w:rPr>
+              <w:t>Os campos adicionais opcionais são: E-mail, Telefone, Endereço (CEP, Cidade, UF, Logradouro, Bairro, Número).</w:t>
+            </w:r>
+          </w:p>
+          <w:p>
+            <w:pPr>
+              <w:pStyle w:val="PargrafodaLista"/>
+              <w:numPr>
+                <w:ilvl w:val="0"/>
+                <w:numId w:val="1"/>
+              </w:numPr>
+              <w:rPr>
+                <w:rFonts w:ascii="Noto Sans Symbols" w:eastAsia="Noto Sans Symbols" w:hAnsi="Noto Sans Symbols" w:cs="Noto Sans Symbols"/>
+                <w:sz w:val="20"/>
+                <w:szCs w:val="16"/>
+              </w:rPr>
+            </w:pPr>
+            <w:r>
+              <w:rPr>
+                <w:rFonts w:eastAsia="Calibri"/>
+                <w:sz w:val="20"/>
+                <w:szCs w:val="16"/>
+              </w:rPr>
+              <w:t>O sistema deve permitir alterar os dados de um colaborador existente, aplicando as mesmas validações acima.</w:t>
+            </w:r>
+          </w:p>
+          <w:p>
+            <w:pPr>
+              <w:pStyle w:val="PargrafodaLista"/>
+              <w:numPr>
+                <w:ilvl w:val="0"/>
+                <w:numId w:val="1"/>
+              </w:numPr>
+              <w:rPr>
+                <w:rFonts w:ascii="Noto Sans Symbols" w:eastAsia="Noto Sans Symbols" w:hAnsi="Noto Sans Symbols" w:cs="Noto Sans Symbols"/>
+                <w:sz w:val="20"/>
+                <w:szCs w:val="16"/>
+              </w:rPr>
+            </w:pPr>
+            <w:r>
+              <w:rPr>
+                <w:rFonts w:eastAsia="Calibri"/>
+                <w:sz w:val="20"/>
+                <w:szCs w:val="16"/>
+              </w:rPr>
+              <w:t>O sistema deve permitir inativar um colaborador, mantendo o registro no histórico e impedindo sua exclusão física do banco de dados.</w:t>
+            </w:r>
+          </w:p>
+          <w:p>
+            <w:pPr>
+              <w:pStyle w:val="PargrafodaLista"/>
+              <w:numPr>
+                <w:ilvl w:val="0"/>
+                <w:numId w:val="1"/>
+              </w:numPr>
+              <w:rPr>
+                <w:rFonts w:eastAsia="Courier New" w:cs="Arial"/>
+                <w:sz w:val="20"/>
+                <w:szCs w:val="16"/>
+              </w:rPr>
+            </w:pPr>
+            <w:r>
+              <w:rPr>
+                <w:rFonts w:eastAsia="Calibri"/>
+                <w:sz w:val="20"/>
+                <w:szCs w:val="16"/>
+              </w:rPr>
+              <w:t>Caso o colaborador seja responsável por um setor ativo, o sistema deve impedir a inativação, exibindo uma mensagem de alerta informando que é necessário transferir essa responsabilidade antes de prosseguir.</w:t>
+            </w:r>
+          </w:p>
+          <w:p>
+            <w:pPr>
+              <w:pStyle w:val="PargrafodaLista"/>
+              <w:numPr>
+                <w:ilvl w:val="0"/>
+                <w:numId w:val="1"/>
+              </w:numPr>
+              <w:rPr>
+                <w:rFonts w:eastAsia="Courier New" w:cs="Arial"/>
+                <w:sz w:val="20"/>
+                <w:szCs w:val="16"/>
+              </w:rPr>
+            </w:pPr>
+            <w:r>
+              <w:rPr>
+                <w:rFonts w:eastAsia="Courier New" w:cs="Arial"/>
+                <w:sz w:val="20"/>
+                <w:szCs w:val="16"/>
+              </w:rPr>
+              <w:t>Deve ser possível reativar um colaborador previamente inativado, caso ele retorne à organização.</w:t>
+            </w:r>
+          </w:p>
+          <w:p>
+            <w:pPr>
+              <w:pStyle w:val="PargrafodaLista"/>
+              <w:rPr>
+                <w:rFonts w:eastAsia="Courier New" w:cs="Arial"/>
+                <w:sz w:val="20"/>
+                <w:szCs w:val="16"/>
+              </w:rPr>
+            </w:pPr>
+          </w:p>
+          <w:p>
+            <w:pPr>
+              <w:pStyle w:val="PargrafodaLista"/>
+              <w:rPr>
+                <w:rFonts w:eastAsia="Courier New" w:cs="Arial"/>
+                <w:sz w:val="20"/>
+                <w:szCs w:val="16"/>
+              </w:rPr>
+            </w:pPr>
+          </w:p>
+          <w:p>
+            <w:pPr>
+              <w:pStyle w:val="PargrafodaLista"/>
+              <w:rPr>
+                <w:rFonts w:eastAsia="Courier New" w:cs="Arial"/>
+                <w:sz w:val="20"/>
+                <w:szCs w:val="16"/>
+              </w:rPr>
+            </w:pPr>
+          </w:p>
+          <w:p>
+            <w:pPr>
+              <w:pStyle w:val="PargrafodaLista"/>
+              <w:rPr>
+                <w:rFonts w:eastAsia="Courier New" w:cs="Arial"/>
+                <w:sz w:val="20"/>
+                <w:szCs w:val="16"/>
+              </w:rPr>
+            </w:pPr>
+          </w:p>
+          <w:p>
+            <w:pPr>
+              <w:pStyle w:val="PargrafodaLista"/>
+              <w:rPr>
+                <w:rFonts w:eastAsia="Courier New" w:cs="Arial"/>
+                <w:sz w:val="20"/>
+                <w:szCs w:val="16"/>
+              </w:rPr>
+            </w:pPr>
+          </w:p>
+          <w:p>
+            <w:pPr>
+              <w:pStyle w:val="PargrafodaLista"/>
+              <w:rPr>
+                <w:rFonts w:eastAsia="Courier New" w:cs="Arial"/>
+                <w:sz w:val="20"/>
+                <w:szCs w:val="16"/>
+              </w:rPr>
+            </w:pPr>
+          </w:p>
+          <w:p>
+            <w:pPr>
+              <w:pStyle w:val="PargrafodaLista"/>
+              <w:rPr>
+                <w:rFonts w:eastAsia="Courier New" w:cs="Arial"/>
+                <w:sz w:val="20"/>
+                <w:szCs w:val="16"/>
+              </w:rPr>
+            </w:pPr>
+          </w:p>
+          <w:p>
+            <w:pPr>
+              <w:pStyle w:val="PargrafodaLista"/>
+              <w:rPr>
+                <w:rFonts w:eastAsia="Courier New" w:cs="Arial"/>
+                <w:sz w:val="20"/>
+                <w:szCs w:val="16"/>
+              </w:rPr>
+            </w:pPr>
+          </w:p>
+          <w:p>
+            <w:pPr>
+              <w:pStyle w:val="PargrafodaLista"/>
+              <w:rPr>
+                <w:rFonts w:eastAsia="Courier New" w:cs="Arial"/>
+                <w:sz w:val="20"/>
+                <w:szCs w:val="16"/>
+              </w:rPr>
+            </w:pPr>
+          </w:p>
+          <w:p>
+            <w:pPr>
+              <w:pStyle w:val="PargrafodaLista"/>
+              <w:rPr>
+                <w:rFonts w:eastAsia="Courier New" w:cs="Arial"/>
+                <w:sz w:val="20"/>
+                <w:szCs w:val="16"/>
+              </w:rPr>
+            </w:pPr>
+          </w:p>
+          <w:p>
+            <w:pPr>
+              <w:pStyle w:val="PargrafodaLista"/>
+              <w:rPr>
+                <w:rFonts w:eastAsia="Courier New" w:cs="Arial"/>
+                <w:sz w:val="20"/>
+                <w:szCs w:val="16"/>
+              </w:rPr>
+            </w:pPr>
+          </w:p>
+          <w:p>
+            <w:pPr>
+              <w:pStyle w:val="PargrafodaLista"/>
+              <w:rPr>
+                <w:rFonts w:eastAsia="Courier New" w:cs="Arial"/>
+                <w:sz w:val="20"/>
+                <w:szCs w:val="16"/>
+              </w:rPr>
+            </w:pPr>
+          </w:p>
+          <w:p>
+            <w:pPr>
+              <w:pStyle w:val="PargrafodaLista"/>
+              <w:rPr>
+                <w:rFonts w:eastAsia="Courier New" w:cs="Arial"/>
+                <w:sz w:val="20"/>
+                <w:szCs w:val="16"/>
+              </w:rPr>
+            </w:pPr>
+          </w:p>
+          <w:p>
+            <w:pPr>
+              <w:pStyle w:val="PargrafodaLista"/>
+              <w:rPr>
+                <w:rFonts w:eastAsia="Courier New" w:cs="Arial"/>
+                <w:sz w:val="20"/>
+                <w:szCs w:val="16"/>
+              </w:rPr>
+            </w:pPr>
+          </w:p>
+          <w:p>
+            <w:pPr>
+              <w:rPr>
+                <w:rFonts w:eastAsia="Calibri"/>
+                <w:b/>
+                <w:bCs/>
+                <w:sz w:val="20"/>
+                <w:szCs w:val="16"/>
+              </w:rPr>
+            </w:pPr>
+            <w:r>
+              <w:rPr>
+                <w:rFonts w:eastAsia="Calibri"/>
+                <w:b/>
+                <w:bCs/>
+                <w:sz w:val="20"/>
+                <w:szCs w:val="16"/>
+              </w:rPr>
+              <w:lastRenderedPageBreak/>
+              <w:t>Diagrama de Classe do Contexto</w:t>
+            </w:r>
+          </w:p>
+          <w:p>
+            <w:pPr>
+              <w:jc w:val="center"/>
+              <w:rPr>
+                <w:rFonts w:eastAsia="Calibri"/>
+                <w:b/>
+                <w:bCs/>
+                <w:sz w:val="20"/>
+                <w:szCs w:val="16"/>
+              </w:rPr>
+            </w:pPr>
+            <w:r>
+              <w:rPr>
+                <w:rFonts w:eastAsia="Calibri"/>
+                <w:b/>
+                <w:bCs/>
+                <w:sz w:val="20"/>
+                <w:szCs w:val="16"/>
+              </w:rPr>
+              <w:drawing>
+                <wp:inline distT="0" distB="0" distL="0" distR="0" wp14:anchorId="61DF6E8A" wp14:editId="51C80BB4">
+                  <wp:extent cx="4003200" cy="3585600"/>
+                  <wp:effectExtent l="0" t="0" r="0" b="0"/>
+                  <wp:docPr id="79" name="Imagem 79"/>
+                  <wp:cNvGraphicFramePr>
+                    <a:graphicFrameLocks xmlns:a="http://schemas.openxmlformats.org/drawingml/2006/main" noChangeAspect="1"/>
+                  </wp:cNvGraphicFramePr>
+                  <a:graphic xmlns:a="http://schemas.openxmlformats.org/drawingml/2006/main">
+                    <a:graphicData uri="http://schemas.openxmlformats.org/drawingml/2006/picture">
+                      <pic:pic xmlns:pic="http://schemas.openxmlformats.org/drawingml/2006/picture">
+                        <pic:nvPicPr>
+                          <pic:cNvPr id="1" name=""/>
+                          <pic:cNvPicPr/>
+                        </pic:nvPicPr>
+                        <pic:blipFill>
+                          <a:blip r:embed="rId51"/>
+                          <a:stretch>
+                            <a:fillRect/>
+                          </a:stretch>
+                        </pic:blipFill>
+                        <pic:spPr>
+                          <a:xfrm>
+                            <a:off x="0" y="0"/>
+                            <a:ext cx="4003200" cy="3585600"/>
+                          </a:xfrm>
+                          <a:prstGeom prst="rect">
+                            <a:avLst/>
+                          </a:prstGeom>
+                        </pic:spPr>
+                      </pic:pic>
+                    </a:graphicData>
+                  </a:graphic>
+                </wp:inline>
+              </w:drawing>
+            </w:r>
+          </w:p>
+          <w:p>
+            <w:pPr>
+              <w:jc w:val="center"/>
+              <w:rPr>
+                <w:rFonts w:eastAsia="Calibri"/>
+                <w:b/>
+                <w:bCs/>
+                <w:sz w:val="20"/>
+                <w:szCs w:val="16"/>
+              </w:rPr>
+            </w:pPr>
+          </w:p>
+          <w:p>
+            <w:pPr>
+              <w:rPr>
+                <w:rFonts w:eastAsia="Calibri"/>
+                <w:b/>
+                <w:bCs/>
+                <w:sz w:val="20"/>
+                <w:szCs w:val="16"/>
+              </w:rPr>
+            </w:pPr>
+            <w:r>
+              <w:rPr>
+                <w:rFonts w:eastAsia="Calibri"/>
+                <w:b/>
+                <w:bCs/>
+                <w:sz w:val="20"/>
+                <w:szCs w:val="16"/>
+              </w:rPr>
+              <w:t>Diagrama de ER do Contexto</w:t>
+            </w:r>
+          </w:p>
+          <w:p>
+            <w:pPr>
+              <w:jc w:val="center"/>
+              <w:rPr>
+                <w:rFonts w:eastAsia="Calibri"/>
+                <w:b/>
+                <w:bCs/>
+                <w:sz w:val="20"/>
+                <w:szCs w:val="16"/>
+              </w:rPr>
+            </w:pPr>
+            <w:r>
+              <w:rPr>
+                <w:rFonts w:eastAsia="Calibri"/>
+                <w:b/>
+                <w:bCs/>
+                <w:sz w:val="20"/>
+                <w:szCs w:val="16"/>
+              </w:rPr>
+              <w:drawing>
+                <wp:inline distT="0" distB="0" distL="0" distR="0" wp14:anchorId="488113B6" wp14:editId="5597D5D3">
+                  <wp:extent cx="5385600" cy="2660400"/>
+                  <wp:effectExtent l="0" t="0" r="5715" b="6985"/>
+                  <wp:docPr id="80" name="Imagem 80"/>
+                  <wp:cNvGraphicFramePr>
+                    <a:graphicFrameLocks xmlns:a="http://schemas.openxmlformats.org/drawingml/2006/main" noChangeAspect="1"/>
+                  </wp:cNvGraphicFramePr>
+                  <a:graphic xmlns:a="http://schemas.openxmlformats.org/drawingml/2006/main">
+                    <a:graphicData uri="http://schemas.openxmlformats.org/drawingml/2006/picture">
+                      <pic:pic xmlns:pic="http://schemas.openxmlformats.org/drawingml/2006/picture">
+                        <pic:nvPicPr>
+                          <pic:cNvPr id="1" name=""/>
+                          <pic:cNvPicPr/>
+                        </pic:nvPicPr>
+                        <pic:blipFill>
+                          <a:blip r:embed="rId52"/>
+                          <a:stretch>
+                            <a:fillRect/>
+                          </a:stretch>
+                        </pic:blipFill>
+                        <pic:spPr>
+                          <a:xfrm>
+                            <a:off x="0" y="0"/>
+                            <a:ext cx="5385600" cy="2660400"/>
+                          </a:xfrm>
+                          <a:prstGeom prst="rect">
+                            <a:avLst/>
+                          </a:prstGeom>
+                        </pic:spPr>
+                      </pic:pic>
+                    </a:graphicData>
+                  </a:graphic>
+                </wp:inline>
+              </w:drawing>
+            </w:r>
+          </w:p>
+          <w:p>
+            <w:pPr>
+              <w:jc w:val="center"/>
+              <w:rPr>
+                <w:rFonts w:eastAsia="Calibri"/>
+                <w:b/>
+                <w:bCs/>
+                <w:sz w:val="20"/>
+                <w:szCs w:val="16"/>
+              </w:rPr>
+            </w:pPr>
+          </w:p>
+          <w:p>
+            <w:pPr>
+              <w:rPr>
+                <w:rFonts w:eastAsia="Calibri"/>
+                <w:b/>
+                <w:bCs/>
+                <w:sz w:val="20"/>
+                <w:szCs w:val="16"/>
+              </w:rPr>
+            </w:pPr>
+            <w:r>
+              <w:rPr>
+                <w:rFonts w:eastAsia="Calibri"/>
+                <w:b/>
+                <w:bCs/>
+                <w:sz w:val="20"/>
+                <w:szCs w:val="16"/>
+              </w:rPr>
+              <w:t>Detalhamento com protótipo</w:t>
+            </w:r>
+          </w:p>
+          <w:p>
+            <w:pPr>
+              <w:pStyle w:val="PargrafodaLista"/>
+              <w:numPr>
+                <w:ilvl w:val="0"/>
+                <w:numId w:val="15"/>
+              </w:numPr>
+              <w:jc w:val="left"/>
+              <w:rPr>
+                <w:rFonts w:eastAsia="Noto Sans Symbols"/>
+                <w:sz w:val="20"/>
+                <w:szCs w:val="16"/>
+              </w:rPr>
+            </w:pPr>
+            <w:r>
+              <w:rPr>
+                <w:rFonts w:eastAsia="Noto Sans Symbols"/>
+                <w:sz w:val="20"/>
+                <w:szCs w:val="16"/>
+              </w:rPr>
+              <w:t>Listagem de cargos em forma de cards</w:t>
+            </w:r>
+          </w:p>
+          <w:p>
+            <w:pPr>
+              <w:jc w:val="center"/>
+              <w:rPr>
+                <w:rFonts w:eastAsia="Noto Sans Symbols"/>
+                <w:sz w:val="20"/>
+                <w:szCs w:val="16"/>
+              </w:rPr>
+            </w:pPr>
+          </w:p>
+          <w:p>
+            <w:pPr>
+              <w:jc w:val="center"/>
+              <w:rPr>
+                <w:rFonts w:eastAsia="Noto Sans Symbols"/>
+                <w:sz w:val="20"/>
+                <w:szCs w:val="16"/>
+              </w:rPr>
+            </w:pPr>
+          </w:p>
+          <w:p>
+            <w:pPr>
+              <w:pStyle w:val="PargrafodaLista"/>
+              <w:numPr>
+                <w:ilvl w:val="0"/>
+                <w:numId w:val="15"/>
+              </w:numPr>
+              <w:jc w:val="left"/>
+              <w:rPr>
+                <w:rFonts w:eastAsia="Noto Sans Symbols"/>
+                <w:sz w:val="20"/>
+                <w:szCs w:val="16"/>
+              </w:rPr>
+            </w:pPr>
+            <w:r>
+              <w:rPr>
+                <w:rFonts w:eastAsia="Noto Sans Symbols"/>
+                <w:sz w:val="20"/>
+                <w:szCs w:val="16"/>
+              </w:rPr>
+              <w:t xml:space="preserve">Listagem de </w:t>
+            </w:r>
+            <w:r>
+              <w:rPr>
+                <w:rFonts w:eastAsia="Noto Sans Symbols"/>
+                <w:sz w:val="20"/>
+                <w:szCs w:val="16"/>
+              </w:rPr>
+              <w:t>cargos</w:t>
+            </w:r>
+            <w:r>
+              <w:rPr>
+                <w:rFonts w:eastAsia="Noto Sans Symbols"/>
+                <w:sz w:val="20"/>
+                <w:szCs w:val="16"/>
+              </w:rPr>
+              <w:t xml:space="preserve"> em forma de lista</w:t>
+            </w:r>
+          </w:p>
+          <w:p>
+            <w:pPr>
+              <w:jc w:val="center"/>
+              <w:rPr>
+                <w:rFonts w:eastAsia="Noto Sans Symbols"/>
+                <w:sz w:val="20"/>
+                <w:szCs w:val="16"/>
+              </w:rPr>
+            </w:pPr>
+          </w:p>
+          <w:p>
+            <w:pPr>
+              <w:jc w:val="center"/>
+              <w:rPr>
+                <w:rFonts w:eastAsia="Noto Sans Symbols"/>
+                <w:sz w:val="20"/>
+                <w:szCs w:val="16"/>
+              </w:rPr>
+            </w:pPr>
+          </w:p>
+          <w:p>
+            <w:pPr>
+              <w:pStyle w:val="PargrafodaLista"/>
+              <w:numPr>
+                <w:ilvl w:val="0"/>
+                <w:numId w:val="15"/>
+              </w:numPr>
+              <w:jc w:val="left"/>
+              <w:rPr>
+                <w:rFonts w:eastAsia="Noto Sans Symbols"/>
+                <w:sz w:val="20"/>
+                <w:szCs w:val="16"/>
+              </w:rPr>
+            </w:pPr>
+            <w:r>
+              <w:rPr>
+                <w:rFonts w:eastAsia="Noto Sans Symbols"/>
+                <w:sz w:val="20"/>
+                <w:szCs w:val="16"/>
+              </w:rPr>
+              <w:t>Modal de cadastro d</w:t>
+            </w:r>
+            <w:r>
+              <w:rPr>
+                <w:rFonts w:eastAsia="Noto Sans Symbols"/>
+                <w:sz w:val="20"/>
+                <w:szCs w:val="16"/>
+              </w:rPr>
+              <w:t>o cargo</w:t>
+            </w:r>
+          </w:p>
+          <w:p>
+            <w:pPr>
+              <w:jc w:val="center"/>
+              <w:rPr>
+                <w:rFonts w:eastAsia="Noto Sans Symbols"/>
+                <w:sz w:val="20"/>
+                <w:szCs w:val="16"/>
+              </w:rPr>
+            </w:pPr>
+          </w:p>
+          <w:p>
+            <w:pPr>
+              <w:jc w:val="center"/>
+              <w:rPr>
+                <w:rFonts w:eastAsia="Noto Sans Symbols"/>
+                <w:sz w:val="20"/>
+                <w:szCs w:val="16"/>
+              </w:rPr>
+            </w:pPr>
+          </w:p>
+          <w:p>
+            <w:pPr>
+              <w:pStyle w:val="PargrafodaLista"/>
+              <w:numPr>
+                <w:ilvl w:val="0"/>
+                <w:numId w:val="15"/>
+              </w:numPr>
+              <w:jc w:val="left"/>
+              <w:rPr>
+                <w:rFonts w:eastAsia="Noto Sans Symbols"/>
+                <w:sz w:val="20"/>
+                <w:szCs w:val="16"/>
+              </w:rPr>
+            </w:pPr>
+            <w:r>
+              <w:rPr>
+                <w:rFonts w:eastAsia="Noto Sans Symbols"/>
+                <w:sz w:val="20"/>
+                <w:szCs w:val="16"/>
+              </w:rPr>
+              <w:t>Modal de visualização do cadastro da etapa</w:t>
+            </w:r>
+          </w:p>
+          <w:p>
+            <w:pPr>
+              <w:jc w:val="center"/>
+              <w:rPr>
+                <w:rFonts w:eastAsia="Noto Sans Symbols"/>
+                <w:sz w:val="20"/>
+                <w:szCs w:val="16"/>
+              </w:rPr>
+            </w:pPr>
+          </w:p>
+          <w:p>
+            <w:pPr>
+              <w:jc w:val="center"/>
+              <w:rPr>
+                <w:rFonts w:eastAsia="Noto Sans Symbols"/>
+                <w:sz w:val="20"/>
+                <w:szCs w:val="16"/>
+              </w:rPr>
+            </w:pPr>
+          </w:p>
+          <w:p>
+            <w:pPr>
+              <w:pStyle w:val="PargrafodaLista"/>
+              <w:numPr>
+                <w:ilvl w:val="0"/>
+                <w:numId w:val="15"/>
+              </w:numPr>
+              <w:jc w:val="left"/>
+              <w:rPr>
+                <w:rFonts w:eastAsia="Noto Sans Symbols"/>
+                <w:sz w:val="20"/>
+                <w:szCs w:val="16"/>
+              </w:rPr>
+            </w:pPr>
+            <w:r>
+              <w:rPr>
+                <w:rFonts w:eastAsia="Noto Sans Symbols"/>
+                <w:sz w:val="20"/>
+                <w:szCs w:val="16"/>
+              </w:rPr>
+              <w:t>Modal de alteração do cadastro da etapa</w:t>
+            </w:r>
+          </w:p>
+          <w:p>
+            <w:pPr>
+              <w:jc w:val="center"/>
+              <w:rPr>
+                <w:rFonts w:eastAsia="Noto Sans Symbols"/>
+                <w:sz w:val="20"/>
+                <w:szCs w:val="16"/>
+              </w:rPr>
+            </w:pPr>
+          </w:p>
+          <w:p>
+            <w:pPr>
+              <w:jc w:val="center"/>
+              <w:rPr>
+                <w:rFonts w:eastAsia="Noto Sans Symbols"/>
+                <w:sz w:val="20"/>
+                <w:szCs w:val="16"/>
+              </w:rPr>
+            </w:pPr>
+          </w:p>
+          <w:p>
+            <w:pPr>
+              <w:pStyle w:val="PargrafodaLista"/>
+              <w:numPr>
+                <w:ilvl w:val="0"/>
+                <w:numId w:val="15"/>
+              </w:numPr>
+              <w:jc w:val="left"/>
+              <w:rPr>
+                <w:rFonts w:eastAsia="Noto Sans Symbols"/>
+                <w:sz w:val="20"/>
+                <w:szCs w:val="16"/>
+              </w:rPr>
+            </w:pPr>
+            <w:r>
+              <w:rPr>
+                <w:rFonts w:eastAsia="Noto Sans Symbols"/>
+                <w:sz w:val="20"/>
+                <w:szCs w:val="16"/>
+              </w:rPr>
+              <w:t>Modal de confirmação de exclusão do cadastro da etapa</w:t>
+            </w:r>
+          </w:p>
+          <w:p>
+            <w:pPr>
+              <w:jc w:val="center"/>
+              <w:rPr>
+                <w:rFonts w:eastAsia="Noto Sans Symbols"/>
+                <w:sz w:val="20"/>
+                <w:szCs w:val="16"/>
+              </w:rPr>
+            </w:pPr>
+          </w:p>
+          <w:p>
+            <w:pPr>
+              <w:jc w:val="center"/>
+              <w:rPr>
+                <w:rFonts w:eastAsia="Noto Sans Symbols"/>
+                <w:sz w:val="20"/>
+                <w:szCs w:val="16"/>
+              </w:rPr>
+            </w:pPr>
+          </w:p>
+          <w:p>
+            <w:pPr>
+              <w:pStyle w:val="PargrafodaLista"/>
+              <w:numPr>
+                <w:ilvl w:val="0"/>
+                <w:numId w:val="15"/>
+              </w:numPr>
+              <w:jc w:val="left"/>
+              <w:rPr>
+                <w:rFonts w:eastAsia="Noto Sans Symbols"/>
+                <w:sz w:val="20"/>
+                <w:szCs w:val="16"/>
+              </w:rPr>
+            </w:pPr>
+            <w:r>
+              <w:rPr>
+                <w:rFonts w:eastAsia="Noto Sans Symbols"/>
+                <w:sz w:val="20"/>
+                <w:szCs w:val="16"/>
+              </w:rPr>
+              <w:t>Modal de mensagem caso tente excluir uma etapa atribuída a uma tarefa ativa</w:t>
+            </w:r>
+          </w:p>
+          <w:p>
+            <w:pPr>
+              <w:jc w:val="center"/>
+              <w:rPr>
+                <w:rFonts w:eastAsia="Noto Sans Symbols"/>
+                <w:sz w:val="20"/>
+                <w:szCs w:val="16"/>
+              </w:rPr>
+            </w:pPr>
+          </w:p>
+          <w:p>
+            <w:pPr>
+              <w:jc w:val="left"/>
+              <w:rPr>
+                <w:rFonts w:eastAsia="Noto Sans Symbols"/>
+                <w:sz w:val="20"/>
+                <w:szCs w:val="16"/>
+              </w:rPr>
+            </w:pPr>
+          </w:p>
+        </w:tc>
+      </w:tr>
+    </w:tbl>
+    <w:p>
+      <w:pPr>
         <w:pStyle w:val="Ttulo1"/>
         <w:tabs>
           <w:tab w:val="left" w:pos="8815"/>
         </w:tabs>
       </w:pPr>
-      <w:r>
-        <w:tab/>
-      </w:r>
     </w:p>
     <w:p>
       <w:pPr>
@@ -12309,7 +13612,7 @@
                     <pic:cNvPicPr preferRelativeResize="0"/>
                   </pic:nvPicPr>
                   <pic:blipFill>
-                    <a:blip r:embed="rId51"/>
+                    <a:blip r:embed="rId53"/>
                     <a:srcRect/>
                     <a:stretch>
                       <a:fillRect/>
@@ -12387,7 +13690,7 @@
                     <pic:cNvPicPr preferRelativeResize="0"/>
                   </pic:nvPicPr>
                   <pic:blipFill>
-                    <a:blip r:embed="rId52"/>
+                    <a:blip r:embed="rId54"/>
                     <a:srcRect/>
                     <a:stretch>
                       <a:fillRect/>
@@ -12610,7 +13913,7 @@
                     <pic:cNvPicPr preferRelativeResize="0"/>
                   </pic:nvPicPr>
                   <pic:blipFill>
-                    <a:blip r:embed="rId53"/>
+                    <a:blip r:embed="rId55"/>
                     <a:srcRect/>
                     <a:stretch>
                       <a:fillRect/>
@@ -12635,7 +13938,7 @@
     </w:p>
     <w:p/>
     <w:sectPr>
-      <w:footerReference w:type="first" r:id="rId54"/>
+      <w:footerReference w:type="first" r:id="rId56"/>
       <w:pgSz w:w="11906" w:h="16838"/>
       <w:pgMar w:top="1418" w:right="851" w:bottom="1418" w:left="1418" w:header="709" w:footer="709" w:gutter="0"/>
       <w:pgNumType w:start="1"/>
@@ -12796,6 +14099,95 @@
     </w:lvl>
   </w:abstractNum>
   <w:abstractNum w:abstractNumId="1" w15:restartNumberingAfterBreak="0">
+    <w:nsid w:val="0B113C9C"/>
+    <w:multiLevelType w:val="hybridMultilevel"/>
+    <w:tmpl w:val="67CC8AE4"/>
+    <w:lvl w:ilvl="0" w:tplc="7B48E6B6">
+      <w:start w:val="1"/>
+      <w:numFmt w:val="decimal"/>
+      <w:lvlText w:val="%1-"/>
+      <w:lvlJc w:val="left"/>
+      <w:pPr>
+        <w:ind w:left="720" w:hanging="360"/>
+      </w:pPr>
+      <w:rPr>
+        <w:rFonts w:hint="default"/>
+      </w:rPr>
+    </w:lvl>
+    <w:lvl w:ilvl="1" w:tplc="04160019" w:tentative="1">
+      <w:start w:val="1"/>
+      <w:numFmt w:val="lowerLetter"/>
+      <w:lvlText w:val="%2."/>
+      <w:lvlJc w:val="left"/>
+      <w:pPr>
+        <w:ind w:left="1440" w:hanging="360"/>
+      </w:pPr>
+    </w:lvl>
+    <w:lvl w:ilvl="2" w:tplc="0416001B" w:tentative="1">
+      <w:start w:val="1"/>
+      <w:numFmt w:val="lowerRoman"/>
+      <w:lvlText w:val="%3."/>
+      <w:lvlJc w:val="right"/>
+      <w:pPr>
+        <w:ind w:left="2160" w:hanging="180"/>
+      </w:pPr>
+    </w:lvl>
+    <w:lvl w:ilvl="3" w:tplc="0416000F" w:tentative="1">
+      <w:start w:val="1"/>
+      <w:numFmt w:val="decimal"/>
+      <w:lvlText w:val="%4."/>
+      <w:lvlJc w:val="left"/>
+      <w:pPr>
+        <w:ind w:left="2880" w:hanging="360"/>
+      </w:pPr>
+    </w:lvl>
+    <w:lvl w:ilvl="4" w:tplc="04160019" w:tentative="1">
+      <w:start w:val="1"/>
+      <w:numFmt w:val="lowerLetter"/>
+      <w:lvlText w:val="%5."/>
+      <w:lvlJc w:val="left"/>
+      <w:pPr>
+        <w:ind w:left="3600" w:hanging="360"/>
+      </w:pPr>
+    </w:lvl>
+    <w:lvl w:ilvl="5" w:tplc="0416001B" w:tentative="1">
+      <w:start w:val="1"/>
+      <w:numFmt w:val="lowerRoman"/>
+      <w:lvlText w:val="%6."/>
+      <w:lvlJc w:val="right"/>
+      <w:pPr>
+        <w:ind w:left="4320" w:hanging="180"/>
+      </w:pPr>
+    </w:lvl>
+    <w:lvl w:ilvl="6" w:tplc="0416000F" w:tentative="1">
+      <w:start w:val="1"/>
+      <w:numFmt w:val="decimal"/>
+      <w:lvlText w:val="%7."/>
+      <w:lvlJc w:val="left"/>
+      <w:pPr>
+        <w:ind w:left="5040" w:hanging="360"/>
+      </w:pPr>
+    </w:lvl>
+    <w:lvl w:ilvl="7" w:tplc="04160019" w:tentative="1">
+      <w:start w:val="1"/>
+      <w:numFmt w:val="lowerLetter"/>
+      <w:lvlText w:val="%8."/>
+      <w:lvlJc w:val="left"/>
+      <w:pPr>
+        <w:ind w:left="5760" w:hanging="360"/>
+      </w:pPr>
+    </w:lvl>
+    <w:lvl w:ilvl="8" w:tplc="0416001B" w:tentative="1">
+      <w:start w:val="1"/>
+      <w:numFmt w:val="lowerRoman"/>
+      <w:lvlText w:val="%9."/>
+      <w:lvlJc w:val="right"/>
+      <w:pPr>
+        <w:ind w:left="6480" w:hanging="180"/>
+      </w:pPr>
+    </w:lvl>
+  </w:abstractNum>
+  <w:abstractNum w:abstractNumId="2" w15:restartNumberingAfterBreak="0">
     <w:nsid w:val="12AE40C4"/>
     <w:multiLevelType w:val="hybridMultilevel"/>
     <w:tmpl w:val="DE4458E6"/>
@@ -12908,7 +14300,7 @@
       </w:rPr>
     </w:lvl>
   </w:abstractNum>
-  <w:abstractNum w:abstractNumId="2" w15:restartNumberingAfterBreak="0">
+  <w:abstractNum w:abstractNumId="3" w15:restartNumberingAfterBreak="0">
     <w:nsid w:val="1E782583"/>
     <w:multiLevelType w:val="multilevel"/>
     <w:tmpl w:val="8304CE92"/>
@@ -13021,7 +14413,7 @@
       </w:rPr>
     </w:lvl>
   </w:abstractNum>
-  <w:abstractNum w:abstractNumId="3" w15:restartNumberingAfterBreak="0">
+  <w:abstractNum w:abstractNumId="4" w15:restartNumberingAfterBreak="0">
     <w:nsid w:val="1FB7610C"/>
     <w:multiLevelType w:val="multilevel"/>
     <w:tmpl w:val="CBC8764A"/>
@@ -13134,7 +14526,7 @@
       </w:rPr>
     </w:lvl>
   </w:abstractNum>
-  <w:abstractNum w:abstractNumId="4" w15:restartNumberingAfterBreak="0">
+  <w:abstractNum w:abstractNumId="5" w15:restartNumberingAfterBreak="0">
     <w:nsid w:val="214A59A1"/>
     <w:multiLevelType w:val="hybridMultilevel"/>
     <w:tmpl w:val="065C76F4"/>
@@ -13223,7 +14615,7 @@
       </w:pPr>
     </w:lvl>
   </w:abstractNum>
-  <w:abstractNum w:abstractNumId="5" w15:restartNumberingAfterBreak="0">
+  <w:abstractNum w:abstractNumId="6" w15:restartNumberingAfterBreak="0">
     <w:nsid w:val="2F8F3E6A"/>
     <w:multiLevelType w:val="multilevel"/>
     <w:tmpl w:val="4BB0FF58"/>
@@ -13336,7 +14728,7 @@
       </w:rPr>
     </w:lvl>
   </w:abstractNum>
-  <w:abstractNum w:abstractNumId="6" w15:restartNumberingAfterBreak="0">
+  <w:abstractNum w:abstractNumId="7" w15:restartNumberingAfterBreak="0">
     <w:nsid w:val="35E13893"/>
     <w:multiLevelType w:val="hybridMultilevel"/>
     <w:tmpl w:val="67CC8AE4"/>
@@ -13425,7 +14817,7 @@
       </w:pPr>
     </w:lvl>
   </w:abstractNum>
-  <w:abstractNum w:abstractNumId="7" w15:restartNumberingAfterBreak="0">
+  <w:abstractNum w:abstractNumId="8" w15:restartNumberingAfterBreak="0">
     <w:nsid w:val="38332BFF"/>
     <w:multiLevelType w:val="hybridMultilevel"/>
     <w:tmpl w:val="29F4CB18"/>
@@ -13538,7 +14930,7 @@
       </w:rPr>
     </w:lvl>
   </w:abstractNum>
-  <w:abstractNum w:abstractNumId="8" w15:restartNumberingAfterBreak="0">
+  <w:abstractNum w:abstractNumId="9" w15:restartNumberingAfterBreak="0">
     <w:nsid w:val="40083289"/>
     <w:multiLevelType w:val="hybridMultilevel"/>
     <w:tmpl w:val="E30AB254"/>
@@ -13651,7 +15043,7 @@
       </w:rPr>
     </w:lvl>
   </w:abstractNum>
-  <w:abstractNum w:abstractNumId="9" w15:restartNumberingAfterBreak="0">
+  <w:abstractNum w:abstractNumId="10" w15:restartNumberingAfterBreak="0">
     <w:nsid w:val="46B666FB"/>
     <w:multiLevelType w:val="multilevel"/>
     <w:tmpl w:val="F27AE70C"/>
@@ -13764,7 +15156,7 @@
       </w:rPr>
     </w:lvl>
   </w:abstractNum>
-  <w:abstractNum w:abstractNumId="10" w15:restartNumberingAfterBreak="0">
+  <w:abstractNum w:abstractNumId="11" w15:restartNumberingAfterBreak="0">
     <w:nsid w:val="481C1346"/>
     <w:multiLevelType w:val="hybridMultilevel"/>
     <w:tmpl w:val="67CC8AE4"/>
@@ -13853,7 +15245,7 @@
       </w:pPr>
     </w:lvl>
   </w:abstractNum>
-  <w:abstractNum w:abstractNumId="11" w15:restartNumberingAfterBreak="0">
+  <w:abstractNum w:abstractNumId="12" w15:restartNumberingAfterBreak="0">
     <w:nsid w:val="51A4545A"/>
     <w:multiLevelType w:val="hybridMultilevel"/>
     <w:tmpl w:val="A050AF5C"/>
@@ -13966,7 +15358,7 @@
       </w:rPr>
     </w:lvl>
   </w:abstractNum>
-  <w:abstractNum w:abstractNumId="12" w15:restartNumberingAfterBreak="0">
+  <w:abstractNum w:abstractNumId="13" w15:restartNumberingAfterBreak="0">
     <w:nsid w:val="5C3E105D"/>
     <w:multiLevelType w:val="multilevel"/>
     <w:tmpl w:val="DAACB48E"/>
@@ -14081,7 +15473,7 @@
       </w:rPr>
     </w:lvl>
   </w:abstractNum>
-  <w:abstractNum w:abstractNumId="13" w15:restartNumberingAfterBreak="0">
+  <w:abstractNum w:abstractNumId="14" w15:restartNumberingAfterBreak="0">
     <w:nsid w:val="5E0375AD"/>
     <w:multiLevelType w:val="hybridMultilevel"/>
     <w:tmpl w:val="67CC8AE4"/>
@@ -14171,46 +15563,49 @@
     </w:lvl>
   </w:abstractNum>
   <w:num w:numId="1">
-    <w:abstractNumId w:val="12"/>
+    <w:abstractNumId w:val="13"/>
   </w:num>
   <w:num w:numId="2">
+    <w:abstractNumId w:val="3"/>
+  </w:num>
+  <w:num w:numId="3">
+    <w:abstractNumId w:val="6"/>
+  </w:num>
+  <w:num w:numId="4">
+    <w:abstractNumId w:val="10"/>
+  </w:num>
+  <w:num w:numId="5">
+    <w:abstractNumId w:val="4"/>
+  </w:num>
+  <w:num w:numId="6">
+    <w:abstractNumId w:val="9"/>
+  </w:num>
+  <w:num w:numId="7">
+    <w:abstractNumId w:val="8"/>
+  </w:num>
+  <w:num w:numId="8">
+    <w:abstractNumId w:val="14"/>
+  </w:num>
+  <w:num w:numId="9">
+    <w:abstractNumId w:val="11"/>
+  </w:num>
+  <w:num w:numId="10">
+    <w:abstractNumId w:val="7"/>
+  </w:num>
+  <w:num w:numId="11">
+    <w:abstractNumId w:val="5"/>
+  </w:num>
+  <w:num w:numId="12">
     <w:abstractNumId w:val="2"/>
   </w:num>
-  <w:num w:numId="3">
-    <w:abstractNumId w:val="5"/>
-  </w:num>
-  <w:num w:numId="4">
-    <w:abstractNumId w:val="9"/>
-  </w:num>
-  <w:num w:numId="5">
-    <w:abstractNumId w:val="3"/>
-  </w:num>
-  <w:num w:numId="6">
-    <w:abstractNumId w:val="8"/>
-  </w:num>
-  <w:num w:numId="7">
-    <w:abstractNumId w:val="7"/>
-  </w:num>
-  <w:num w:numId="8">
-    <w:abstractNumId w:val="13"/>
-  </w:num>
-  <w:num w:numId="9">
-    <w:abstractNumId w:val="10"/>
-  </w:num>
-  <w:num w:numId="10">
-    <w:abstractNumId w:val="6"/>
-  </w:num>
-  <w:num w:numId="11">
-    <w:abstractNumId w:val="4"/>
-  </w:num>
-  <w:num w:numId="12">
-    <w:abstractNumId w:val="1"/>
-  </w:num>
   <w:num w:numId="13">
-    <w:abstractNumId w:val="11"/>
+    <w:abstractNumId w:val="12"/>
   </w:num>
   <w:num w:numId="14">
     <w:abstractNumId w:val="0"/>
+  </w:num>
+  <w:num w:numId="15">
+    <w:abstractNumId w:val="1"/>
   </w:num>
 </w:numbering>
 </file>

</xml_diff>

<commit_message>
Frontend + Prototipação - Gerenciar  colaboradores
</commit_message>
<xml_diff>
--- a/Documentação/ERS.docx
+++ b/Documentação/ERS.docx
@@ -212,8 +212,17 @@
           <w:sz w:val="28"/>
           <w:szCs w:val="24"/>
         </w:rPr>
-        <w:t>ASM Tasks</w:t>
+        <w:t xml:space="preserve">ASM </w:t>
       </w:r>
+      <w:proofErr w:type="spellStart"/>
+      <w:r>
+        <w:rPr>
+          <w:sz w:val="28"/>
+          <w:szCs w:val="24"/>
+        </w:rPr>
+        <w:t>Tasks</w:t>
+      </w:r>
+      <w:proofErr w:type="spellEnd"/>
     </w:p>
     <w:p>
       <w:pPr>
@@ -1732,7 +1741,15 @@
     </w:p>
     <w:p>
       <w:r>
-        <w:t>A finalidade desta Especificação de Requisitos de Software (ERS) é definir de forma clara e precisa as funcionalidades, restrições e características técnicas do sistema ASM Tasks. Este documento serve como base para o entendimento compartilhado entre todas as partes envolvidas no projeto: desenvolvedor, empresa Always System Manager e instituição de ensino UNOESTE.</w:t>
+        <w:t xml:space="preserve">A finalidade desta Especificação de Requisitos de Software (ERS) é definir de forma clara e precisa as funcionalidades, restrições e características técnicas do sistema ASM </w:t>
+      </w:r>
+      <w:proofErr w:type="spellStart"/>
+      <w:r>
+        <w:t>Tasks</w:t>
+      </w:r>
+      <w:proofErr w:type="spellEnd"/>
+      <w:r>
+        <w:t>. Este documento serve como base para o entendimento compartilhado entre todas as partes envolvidas no projeto: desenvolvedor, empresa Always System Manager e instituição de ensino UNOESTE.</w:t>
       </w:r>
     </w:p>
     <w:p>
@@ -1753,12 +1770,36 @@
     </w:p>
     <w:p>
       <w:r>
-        <w:t>O ASM Tasks é um sistema voltado para a gestão e acompanhamento de tarefas internas da Always System Manager, abrangendo os setores de desenvolvimento de software e suporte de hardware. Ele permitirá o gerenciamento de tarefas em um quadro Kanban com etapas personalizáveis, a utilização de filtros avançados de acordo com prioridade, responsável ou setor, bem como a criação de lembretes por meio de uma agenda integrada, tanto pessoais quanto atribuídos a outros colaboradores. Também contará com funcionalidades de histórico de movimentações e controle de usuários, garantindo rastreabilidade e segurança no uso.</w:t>
+        <w:t xml:space="preserve">O ASM </w:t>
+      </w:r>
+      <w:proofErr w:type="spellStart"/>
+      <w:r>
+        <w:t>Tasks</w:t>
+      </w:r>
+      <w:proofErr w:type="spellEnd"/>
+      <w:r>
+        <w:t xml:space="preserve"> é um sistema voltado para a gestão e acompanhamento de tarefas internas da Always System Manager, abrangendo os setores de desenvolvimento de software e suporte de hardware. Ele permitirá o gerenciamento de tarefas em um quadro </w:t>
+      </w:r>
+      <w:proofErr w:type="spellStart"/>
+      <w:r>
+        <w:t>Kanban</w:t>
+      </w:r>
+      <w:proofErr w:type="spellEnd"/>
+      <w:r>
+        <w:t xml:space="preserve"> com etapas personalizáveis, a utilização de filtros avançados de acordo com prioridade, responsável ou setor, bem como a criação de lembretes por meio de uma agenda integrada, tanto pessoais quanto atribuídos a outros colaboradores. Também contará com funcionalidades de histórico de movimentações e controle de usuários, garantindo rastreabilidade e segurança no uso.</w:t>
       </w:r>
     </w:p>
     <w:p>
       <w:r>
-        <w:t>Além das funcionalidades gerais descritas, o ASM Tasks contará com funções básicas como gerenciar colaboradores, clientes, prioridades de tarefa, etapas de desenvolvimento e setores. Essas operações são essenciais para estruturar os dados internos da empresa, permitindo que o sistema mantenha consistência na organização de informações e forneça suporte às funcionalidades mais avançadas.</w:t>
+        <w:t xml:space="preserve">Além das funcionalidades gerais descritas, o ASM </w:t>
+      </w:r>
+      <w:proofErr w:type="spellStart"/>
+      <w:r>
+        <w:t>Tasks</w:t>
+      </w:r>
+      <w:proofErr w:type="spellEnd"/>
+      <w:r>
+        <w:t xml:space="preserve"> contará com funções básicas como gerenciar colaboradores, clientes, prioridades de tarefa, etapas de desenvolvimento e setores. Essas operações são essenciais para estruturar os dados internos da empresa, permitindo que o sistema mantenha consistência na organização de informações e forneça suporte às funcionalidades mais avançadas.</w:t>
       </w:r>
     </w:p>
     <w:p>
@@ -1772,7 +1813,15 @@
       </w:r>
       <w:r>
         <w:lastRenderedPageBreak/>
-        <w:t>das demandas. As datas das tarefas devem ser validadas no momento do agendamento para evitar superalocação de atividades para um mesmo colaborador.</w:t>
+        <w:t xml:space="preserve">das demandas. As datas das tarefas devem ser validadas no momento do agendamento para evitar </w:t>
+      </w:r>
+      <w:proofErr w:type="spellStart"/>
+      <w:r>
+        <w:t>superalocação</w:t>
+      </w:r>
+      <w:proofErr w:type="spellEnd"/>
+      <w:r>
+        <w:t xml:space="preserve"> de atividades para um mesmo colaborador.</w:t>
       </w:r>
     </w:p>
     <w:p>
@@ -1867,7 +1916,15 @@
         </w:numPr>
       </w:pPr>
       <w:r>
-        <w:t>ERP: Enterprise Resource Planning (Sistema Integrado de Gestão).</w:t>
+        <w:t xml:space="preserve">ERP: Enterprise </w:t>
+      </w:r>
+      <w:proofErr w:type="spellStart"/>
+      <w:r>
+        <w:t>Resource</w:t>
+      </w:r>
+      <w:proofErr w:type="spellEnd"/>
+      <w:r>
+        <w:t xml:space="preserve"> Planning (Sistema Integrado de Gestão).</w:t>
       </w:r>
     </w:p>
     <w:p>
@@ -1878,8 +1935,13 @@
           <w:numId w:val="6"/>
         </w:numPr>
       </w:pPr>
+      <w:proofErr w:type="spellStart"/>
       <w:r>
-        <w:t>Kanban: Método de organização de tarefas baseado em quadros e cartões.</w:t>
+        <w:t>Kanban</w:t>
+      </w:r>
+      <w:proofErr w:type="spellEnd"/>
+      <w:r>
+        <w:t>: Método de organização de tarefas baseado em quadros e cartões.</w:t>
       </w:r>
     </w:p>
     <w:p>
@@ -2260,7 +2322,15 @@
     </w:p>
     <w:p>
       <w:r>
-        <w:t>Endereço: Rua José Bongiovani, 700 – Cidade Universitária – Presidente Prudente – SP</w:t>
+        <w:t xml:space="preserve">Endereço: Rua José </w:t>
+      </w:r>
+      <w:proofErr w:type="spellStart"/>
+      <w:r>
+        <w:t>Bongiovani</w:t>
+      </w:r>
+      <w:proofErr w:type="spellEnd"/>
+      <w:r>
+        <w:t>, 700 – Cidade Universitária – Presidente Prudente – SP</w:t>
       </w:r>
     </w:p>
     <w:p>
@@ -2338,7 +2408,23 @@
         <w:t>, 520</w:t>
       </w:r>
       <w:r>
-        <w:t>), no estado de São Paulo, a empresa tem como proprietário Alvaro Shioji Matsuda e consolidou-se como uma parceira estratégica para diferentes segmentos, como granjas, transportadoras, distribuidoras e comércio em geral.</w:t>
+        <w:t xml:space="preserve">), no estado de São Paulo, a empresa tem como proprietário </w:t>
+      </w:r>
+      <w:proofErr w:type="spellStart"/>
+      <w:r>
+        <w:t>Alvaro</w:t>
+      </w:r>
+      <w:proofErr w:type="spellEnd"/>
+      <w:r>
+        <w:t xml:space="preserve"> </w:t>
+      </w:r>
+      <w:proofErr w:type="spellStart"/>
+      <w:r>
+        <w:t>Shioji</w:t>
+      </w:r>
+      <w:proofErr w:type="spellEnd"/>
+      <w:r>
+        <w:t xml:space="preserve"> Matsuda e consolidou-se como uma parceira estratégica para diferentes segmentos, como granjas, transportadoras, distribuidoras e comércio em geral.</w:t>
       </w:r>
     </w:p>
     <w:p>
@@ -2347,7 +2433,15 @@
       </w:r>
       <w:r>
         <w:lastRenderedPageBreak/>
-        <w:t>diversificada que integra áreas de gerência e BI, financeiro, desenvolvimento mobile, desenvolvimento fullstack em VB6 e suporte técnico.</w:t>
+        <w:t xml:space="preserve">diversificada que integra áreas de gerência e BI, financeiro, desenvolvimento mobile, desenvolvimento </w:t>
+      </w:r>
+      <w:proofErr w:type="spellStart"/>
+      <w:r>
+        <w:t>fullstack</w:t>
+      </w:r>
+      <w:proofErr w:type="spellEnd"/>
+      <w:r>
+        <w:t xml:space="preserve"> em VB6 e suporte técnico.</w:t>
       </w:r>
     </w:p>
     <w:p>
@@ -12014,7 +12108,15 @@
                 <w:szCs w:val="16"/>
               </w:rPr>
               <w:lastRenderedPageBreak/>
-              <w:t>Modal de visualização do cadastro da etapa</w:t>
+              <w:t>Modal de visualização do cadastro d</w:t>
+            </w:r>
+            <w:r>
+              <w:rPr>
+                <w:rFonts w:eastAsia="Noto Sans Symbols"/>
+                <w:sz w:val="20"/>
+                <w:szCs w:val="16"/>
+              </w:rPr>
+              <w:t>o cargo</w:t>
             </w:r>
           </w:p>
           <w:p>
@@ -12100,7 +12202,31 @@
                 <w:sz w:val="20"/>
                 <w:szCs w:val="16"/>
               </w:rPr>
-              <w:t>Modal de alteração do cadastro da etapa</w:t>
+              <w:t xml:space="preserve">Modal de alteração do cadastro </w:t>
+            </w:r>
+            <w:r>
+              <w:rPr>
+                <w:rFonts w:eastAsia="Noto Sans Symbols"/>
+                <w:sz w:val="20"/>
+                <w:szCs w:val="16"/>
+              </w:rPr>
+              <w:t>do</w:t>
+            </w:r>
+            <w:r>
+              <w:rPr>
+                <w:rFonts w:eastAsia="Noto Sans Symbols"/>
+                <w:sz w:val="20"/>
+                <w:szCs w:val="16"/>
+              </w:rPr>
+              <w:t xml:space="preserve"> </w:t>
+            </w:r>
+            <w:r>
+              <w:rPr>
+                <w:rFonts w:eastAsia="Noto Sans Symbols"/>
+                <w:sz w:val="20"/>
+                <w:szCs w:val="16"/>
+              </w:rPr>
+              <w:t>cargo</w:t>
             </w:r>
           </w:p>
           <w:p>
@@ -12207,7 +12333,31 @@
                 <w:szCs w:val="16"/>
               </w:rPr>
               <w:lastRenderedPageBreak/>
-              <w:t>Modal de confirmação de exclusão do cadastro da etapa</w:t>
+              <w:t xml:space="preserve">Modal de confirmação de exclusão do cadastro </w:t>
+            </w:r>
+            <w:r>
+              <w:rPr>
+                <w:rFonts w:eastAsia="Noto Sans Symbols"/>
+                <w:sz w:val="20"/>
+                <w:szCs w:val="16"/>
+              </w:rPr>
+              <w:t>do</w:t>
+            </w:r>
+            <w:r>
+              <w:rPr>
+                <w:rFonts w:eastAsia="Noto Sans Symbols"/>
+                <w:sz w:val="20"/>
+                <w:szCs w:val="16"/>
+              </w:rPr>
+              <w:t xml:space="preserve"> </w:t>
+            </w:r>
+            <w:r>
+              <w:rPr>
+                <w:rFonts w:eastAsia="Noto Sans Symbols"/>
+                <w:sz w:val="20"/>
+                <w:szCs w:val="16"/>
+              </w:rPr>
+              <w:t>cargo</w:t>
             </w:r>
           </w:p>
           <w:p>
@@ -12293,7 +12443,31 @@
                 <w:sz w:val="20"/>
                 <w:szCs w:val="16"/>
               </w:rPr>
-              <w:t>Modal de mensagem caso tente excluir uma etapa atribuída a uma tarefa ativa</w:t>
+              <w:t xml:space="preserve">Modal de mensagem caso tente excluir um </w:t>
+            </w:r>
+            <w:r>
+              <w:rPr>
+                <w:rFonts w:eastAsia="Noto Sans Symbols"/>
+                <w:sz w:val="20"/>
+                <w:szCs w:val="16"/>
+              </w:rPr>
+              <w:t>cargo</w:t>
+            </w:r>
+            <w:r>
+              <w:rPr>
+                <w:rFonts w:eastAsia="Noto Sans Symbols"/>
+                <w:sz w:val="20"/>
+                <w:szCs w:val="16"/>
+              </w:rPr>
+              <w:t xml:space="preserve"> atribuída a </w:t>
+            </w:r>
+            <w:r>
+              <w:rPr>
+                <w:rFonts w:eastAsia="Noto Sans Symbols"/>
+                <w:sz w:val="20"/>
+                <w:szCs w:val="16"/>
+              </w:rPr>
+              <w:t>um colaborador ativo</w:t>
             </w:r>
           </w:p>
           <w:p>
@@ -13167,6 +13341,7 @@
           </w:p>
           <w:p>
             <w:pPr>
+              <w:jc w:val="center"/>
               <w:rPr>
                 <w:rFonts w:eastAsia="Calibri"/>
                 <w:b/>
@@ -13175,7 +13350,10 @@
                 <w:szCs w:val="16"/>
               </w:rPr>
             </w:pPr>
-            <w:r>
+          </w:p>
+          <w:p>
+            <w:pPr>
+              <w:jc w:val="center"/>
               <w:rPr>
                 <w:rFonts w:eastAsia="Calibri"/>
                 <w:b/>
@@ -13183,6 +13361,75 @@
                 <w:sz w:val="20"/>
                 <w:szCs w:val="16"/>
               </w:rPr>
+            </w:pPr>
+          </w:p>
+          <w:p>
+            <w:pPr>
+              <w:jc w:val="center"/>
+              <w:rPr>
+                <w:rFonts w:eastAsia="Calibri"/>
+                <w:b/>
+                <w:bCs/>
+                <w:sz w:val="20"/>
+                <w:szCs w:val="16"/>
+              </w:rPr>
+            </w:pPr>
+          </w:p>
+          <w:p>
+            <w:pPr>
+              <w:jc w:val="center"/>
+              <w:rPr>
+                <w:rFonts w:eastAsia="Calibri"/>
+                <w:b/>
+                <w:bCs/>
+                <w:sz w:val="20"/>
+                <w:szCs w:val="16"/>
+              </w:rPr>
+            </w:pPr>
+          </w:p>
+          <w:p>
+            <w:pPr>
+              <w:jc w:val="center"/>
+              <w:rPr>
+                <w:rFonts w:eastAsia="Calibri"/>
+                <w:b/>
+                <w:bCs/>
+                <w:sz w:val="20"/>
+                <w:szCs w:val="16"/>
+              </w:rPr>
+            </w:pPr>
+          </w:p>
+          <w:p>
+            <w:pPr>
+              <w:jc w:val="center"/>
+              <w:rPr>
+                <w:rFonts w:eastAsia="Calibri"/>
+                <w:b/>
+                <w:bCs/>
+                <w:sz w:val="20"/>
+                <w:szCs w:val="16"/>
+              </w:rPr>
+            </w:pPr>
+          </w:p>
+          <w:p>
+            <w:pPr>
+              <w:rPr>
+                <w:rFonts w:eastAsia="Calibri"/>
+                <w:b/>
+                <w:bCs/>
+                <w:sz w:val="20"/>
+                <w:szCs w:val="16"/>
+              </w:rPr>
+            </w:pPr>
+            <w:r>
+              <w:rPr>
+                <w:rFonts w:eastAsia="Calibri"/>
+                <w:b/>
+                <w:bCs/>
+                <w:sz w:val="20"/>
+                <w:szCs w:val="16"/>
+              </w:rPr>
+              <w:lastRenderedPageBreak/>
               <w:t>Detalhamento com protótipo</w:t>
             </w:r>
           </w:p>
@@ -13206,18 +13453,76 @@
                 <w:sz w:val="20"/>
                 <w:szCs w:val="16"/>
               </w:rPr>
-              <w:t>Listagem de cargos em forma de cards</w:t>
-            </w:r>
-          </w:p>
-          <w:p>
-            <w:pPr>
-              <w:jc w:val="center"/>
-              <w:rPr>
-                <w:rFonts w:eastAsia="Noto Sans Symbols"/>
-                <w:sz w:val="20"/>
-                <w:szCs w:val="16"/>
-              </w:rPr>
-            </w:pPr>
+              <w:t xml:space="preserve">Listagem de </w:t>
+            </w:r>
+            <w:r>
+              <w:rPr>
+                <w:rFonts w:eastAsia="Noto Sans Symbols"/>
+                <w:sz w:val="20"/>
+                <w:szCs w:val="16"/>
+              </w:rPr>
+              <w:t>colaboradores</w:t>
+            </w:r>
+            <w:r>
+              <w:rPr>
+                <w:rFonts w:eastAsia="Noto Sans Symbols"/>
+                <w:sz w:val="20"/>
+                <w:szCs w:val="16"/>
+              </w:rPr>
+              <w:t xml:space="preserve"> em forma de cards</w:t>
+            </w:r>
+          </w:p>
+          <w:p>
+            <w:pPr>
+              <w:jc w:val="center"/>
+              <w:rPr>
+                <w:rFonts w:eastAsia="Noto Sans Symbols"/>
+                <w:sz w:val="20"/>
+                <w:szCs w:val="16"/>
+              </w:rPr>
+            </w:pPr>
+            <w:r>
+              <w:rPr>
+                <w:rFonts w:eastAsia="Noto Sans Symbols"/>
+                <w:sz w:val="20"/>
+                <w:szCs w:val="16"/>
+              </w:rPr>
+              <w:drawing>
+                <wp:inline distT="0" distB="0" distL="0" distR="0" wp14:anchorId="28D67E8C" wp14:editId="678CAB64">
+                  <wp:extent cx="5288400" cy="2620800"/>
+                  <wp:effectExtent l="0" t="0" r="7620" b="8255"/>
+                  <wp:docPr id="81" name="Imagem 81"/>
+                  <wp:cNvGraphicFramePr>
+                    <a:graphicFrameLocks xmlns:a="http://schemas.openxmlformats.org/drawingml/2006/main" noChangeAspect="1"/>
+                  </wp:cNvGraphicFramePr>
+                  <a:graphic xmlns:a="http://schemas.openxmlformats.org/drawingml/2006/main">
+                    <a:graphicData uri="http://schemas.openxmlformats.org/drawingml/2006/picture">
+                      <pic:pic xmlns:pic="http://schemas.openxmlformats.org/drawingml/2006/picture">
+                        <pic:nvPicPr>
+                          <pic:cNvPr id="1" name=""/>
+                          <pic:cNvPicPr/>
+                        </pic:nvPicPr>
+                        <pic:blipFill>
+                          <a:blip r:embed="rId53"/>
+                          <a:stretch>
+                            <a:fillRect/>
+                          </a:stretch>
+                        </pic:blipFill>
+                        <pic:spPr>
+                          <a:xfrm>
+                            <a:off x="0" y="0"/>
+                            <a:ext cx="5288400" cy="2620800"/>
+                          </a:xfrm>
+                          <a:prstGeom prst="rect">
+                            <a:avLst/>
+                          </a:prstGeom>
+                        </pic:spPr>
+                      </pic:pic>
+                    </a:graphicData>
+                  </a:graphic>
+                </wp:inline>
+              </w:drawing>
+            </w:r>
           </w:p>
           <w:p>
             <w:pPr>
@@ -13257,16 +13562,196 @@
                 <w:sz w:val="20"/>
                 <w:szCs w:val="16"/>
               </w:rPr>
-              <w:t>cargos</w:t>
-            </w:r>
-            <w:r>
-              <w:rPr>
-                <w:rFonts w:eastAsia="Noto Sans Symbols"/>
-                <w:sz w:val="20"/>
-                <w:szCs w:val="16"/>
-              </w:rPr>
-              <w:t xml:space="preserve"> em forma de lista</w:t>
-            </w:r>
+              <w:t>colaboradores</w:t>
+            </w:r>
+            <w:r>
+              <w:rPr>
+                <w:rFonts w:eastAsia="Noto Sans Symbols"/>
+                <w:sz w:val="20"/>
+                <w:szCs w:val="16"/>
+              </w:rPr>
+              <w:t xml:space="preserve"> </w:t>
+            </w:r>
+            <w:r>
+              <w:rPr>
+                <w:rFonts w:eastAsia="Noto Sans Symbols"/>
+                <w:sz w:val="20"/>
+                <w:szCs w:val="16"/>
+              </w:rPr>
+              <w:t>em forma de lista</w:t>
+            </w:r>
+          </w:p>
+          <w:p>
+            <w:pPr>
+              <w:jc w:val="center"/>
+              <w:rPr>
+                <w:rFonts w:eastAsia="Noto Sans Symbols"/>
+                <w:sz w:val="20"/>
+                <w:szCs w:val="16"/>
+              </w:rPr>
+            </w:pPr>
+            <w:r>
+              <w:rPr>
+                <w:rFonts w:eastAsia="Noto Sans Symbols"/>
+                <w:sz w:val="20"/>
+                <w:szCs w:val="16"/>
+              </w:rPr>
+              <w:drawing>
+                <wp:inline distT="0" distB="0" distL="0" distR="0" wp14:anchorId="6797F297" wp14:editId="51090533">
+                  <wp:extent cx="5284800" cy="2044800"/>
+                  <wp:effectExtent l="0" t="0" r="0" b="0"/>
+                  <wp:docPr id="82" name="Imagem 82"/>
+                  <wp:cNvGraphicFramePr>
+                    <a:graphicFrameLocks xmlns:a="http://schemas.openxmlformats.org/drawingml/2006/main" noChangeAspect="1"/>
+                  </wp:cNvGraphicFramePr>
+                  <a:graphic xmlns:a="http://schemas.openxmlformats.org/drawingml/2006/main">
+                    <a:graphicData uri="http://schemas.openxmlformats.org/drawingml/2006/picture">
+                      <pic:pic xmlns:pic="http://schemas.openxmlformats.org/drawingml/2006/picture">
+                        <pic:nvPicPr>
+                          <pic:cNvPr id="1" name=""/>
+                          <pic:cNvPicPr/>
+                        </pic:nvPicPr>
+                        <pic:blipFill>
+                          <a:blip r:embed="rId54"/>
+                          <a:stretch>
+                            <a:fillRect/>
+                          </a:stretch>
+                        </pic:blipFill>
+                        <pic:spPr>
+                          <a:xfrm>
+                            <a:off x="0" y="0"/>
+                            <a:ext cx="5284800" cy="2044800"/>
+                          </a:xfrm>
+                          <a:prstGeom prst="rect">
+                            <a:avLst/>
+                          </a:prstGeom>
+                        </pic:spPr>
+                      </pic:pic>
+                    </a:graphicData>
+                  </a:graphic>
+                </wp:inline>
+              </w:drawing>
+            </w:r>
+          </w:p>
+          <w:p>
+            <w:pPr>
+              <w:jc w:val="center"/>
+              <w:rPr>
+                <w:rFonts w:eastAsia="Noto Sans Symbols"/>
+                <w:sz w:val="20"/>
+                <w:szCs w:val="16"/>
+              </w:rPr>
+            </w:pPr>
+          </w:p>
+          <w:p>
+            <w:pPr>
+              <w:jc w:val="center"/>
+              <w:rPr>
+                <w:rFonts w:eastAsia="Noto Sans Symbols"/>
+                <w:sz w:val="20"/>
+                <w:szCs w:val="16"/>
+              </w:rPr>
+            </w:pPr>
+          </w:p>
+          <w:p>
+            <w:pPr>
+              <w:jc w:val="center"/>
+              <w:rPr>
+                <w:rFonts w:eastAsia="Noto Sans Symbols"/>
+                <w:sz w:val="20"/>
+                <w:szCs w:val="16"/>
+              </w:rPr>
+            </w:pPr>
+          </w:p>
+          <w:p>
+            <w:pPr>
+              <w:jc w:val="center"/>
+              <w:rPr>
+                <w:rFonts w:eastAsia="Noto Sans Symbols"/>
+                <w:sz w:val="20"/>
+                <w:szCs w:val="16"/>
+              </w:rPr>
+            </w:pPr>
+          </w:p>
+          <w:p>
+            <w:pPr>
+              <w:jc w:val="center"/>
+              <w:rPr>
+                <w:rFonts w:eastAsia="Noto Sans Symbols"/>
+                <w:sz w:val="20"/>
+                <w:szCs w:val="16"/>
+              </w:rPr>
+            </w:pPr>
+          </w:p>
+          <w:p>
+            <w:pPr>
+              <w:jc w:val="center"/>
+              <w:rPr>
+                <w:rFonts w:eastAsia="Noto Sans Symbols"/>
+                <w:sz w:val="20"/>
+                <w:szCs w:val="16"/>
+              </w:rPr>
+            </w:pPr>
+          </w:p>
+          <w:p>
+            <w:pPr>
+              <w:jc w:val="center"/>
+              <w:rPr>
+                <w:rFonts w:eastAsia="Noto Sans Symbols"/>
+                <w:sz w:val="20"/>
+                <w:szCs w:val="16"/>
+              </w:rPr>
+            </w:pPr>
+          </w:p>
+          <w:p>
+            <w:pPr>
+              <w:jc w:val="center"/>
+              <w:rPr>
+                <w:rFonts w:eastAsia="Noto Sans Symbols"/>
+                <w:sz w:val="20"/>
+                <w:szCs w:val="16"/>
+              </w:rPr>
+            </w:pPr>
+          </w:p>
+          <w:p>
+            <w:pPr>
+              <w:jc w:val="center"/>
+              <w:rPr>
+                <w:rFonts w:eastAsia="Noto Sans Symbols"/>
+                <w:sz w:val="20"/>
+                <w:szCs w:val="16"/>
+              </w:rPr>
+            </w:pPr>
+          </w:p>
+          <w:p>
+            <w:pPr>
+              <w:jc w:val="center"/>
+              <w:rPr>
+                <w:rFonts w:eastAsia="Noto Sans Symbols"/>
+                <w:sz w:val="20"/>
+                <w:szCs w:val="16"/>
+              </w:rPr>
+            </w:pPr>
+          </w:p>
+          <w:p>
+            <w:pPr>
+              <w:jc w:val="center"/>
+              <w:rPr>
+                <w:rFonts w:eastAsia="Noto Sans Symbols"/>
+                <w:sz w:val="20"/>
+                <w:szCs w:val="16"/>
+              </w:rPr>
+            </w:pPr>
+          </w:p>
+          <w:p>
+            <w:pPr>
+              <w:jc w:val="center"/>
+              <w:rPr>
+                <w:rFonts w:eastAsia="Noto Sans Symbols"/>
+                <w:sz w:val="20"/>
+                <w:szCs w:val="16"/>
+              </w:rPr>
+            </w:pPr>
           </w:p>
           <w:p>
             <w:pPr>
@@ -13308,6 +13793,7 @@
                 <w:sz w:val="20"/>
                 <w:szCs w:val="16"/>
               </w:rPr>
+              <w:lastRenderedPageBreak/>
               <w:t>Modal de cadastro d</w:t>
             </w:r>
             <w:r>
@@ -13316,18 +13802,68 @@
                 <w:sz w:val="20"/>
                 <w:szCs w:val="16"/>
               </w:rPr>
-              <w:t>o cargo</w:t>
-            </w:r>
-          </w:p>
-          <w:p>
-            <w:pPr>
-              <w:jc w:val="center"/>
-              <w:rPr>
-                <w:rFonts w:eastAsia="Noto Sans Symbols"/>
-                <w:sz w:val="20"/>
-                <w:szCs w:val="16"/>
-              </w:rPr>
-            </w:pPr>
+              <w:t xml:space="preserve">o </w:t>
+            </w:r>
+            <w:r>
+              <w:rPr>
+                <w:rFonts w:eastAsia="Noto Sans Symbols"/>
+                <w:sz w:val="20"/>
+                <w:szCs w:val="16"/>
+              </w:rPr>
+              <w:t>colaborador</w:t>
+            </w:r>
+          </w:p>
+          <w:p>
+            <w:pPr>
+              <w:jc w:val="center"/>
+              <w:rPr>
+                <w:rFonts w:eastAsia="Noto Sans Symbols"/>
+                <w:sz w:val="20"/>
+                <w:szCs w:val="16"/>
+              </w:rPr>
+            </w:pPr>
+            <w:r>
+              <w:rPr>
+                <w:rFonts w:eastAsia="Noto Sans Symbols"/>
+                <w:sz w:val="20"/>
+                <w:szCs w:val="16"/>
+              </w:rPr>
+              <w:drawing>
+                <wp:inline distT="0" distB="0" distL="0" distR="0" wp14:anchorId="2F215965" wp14:editId="1ED4AB68">
+                  <wp:extent cx="2595600" cy="3560400"/>
+                  <wp:effectExtent l="0" t="0" r="0" b="2540"/>
+                  <wp:docPr id="83" name="Imagem 83"/>
+                  <wp:cNvGraphicFramePr>
+                    <a:graphicFrameLocks xmlns:a="http://schemas.openxmlformats.org/drawingml/2006/main" noChangeAspect="1"/>
+                  </wp:cNvGraphicFramePr>
+                  <a:graphic xmlns:a="http://schemas.openxmlformats.org/drawingml/2006/main">
+                    <a:graphicData uri="http://schemas.openxmlformats.org/drawingml/2006/picture">
+                      <pic:pic xmlns:pic="http://schemas.openxmlformats.org/drawingml/2006/picture">
+                        <pic:nvPicPr>
+                          <pic:cNvPr id="1" name=""/>
+                          <pic:cNvPicPr/>
+                        </pic:nvPicPr>
+                        <pic:blipFill>
+                          <a:blip r:embed="rId55"/>
+                          <a:stretch>
+                            <a:fillRect/>
+                          </a:stretch>
+                        </pic:blipFill>
+                        <pic:spPr>
+                          <a:xfrm>
+                            <a:off x="0" y="0"/>
+                            <a:ext cx="2595600" cy="3560400"/>
+                          </a:xfrm>
+                          <a:prstGeom prst="rect">
+                            <a:avLst/>
+                          </a:prstGeom>
+                        </pic:spPr>
+                      </pic:pic>
+                    </a:graphicData>
+                  </a:graphic>
+                </wp:inline>
+              </w:drawing>
+            </w:r>
           </w:p>
           <w:p>
             <w:pPr>
@@ -13359,8 +13895,94 @@
                 <w:sz w:val="20"/>
                 <w:szCs w:val="16"/>
               </w:rPr>
-              <w:t>Modal de visualização do cadastro da etapa</w:t>
-            </w:r>
+              <w:t xml:space="preserve">Modal de visualização do cadastro </w:t>
+            </w:r>
+            <w:r>
+              <w:rPr>
+                <w:rFonts w:eastAsia="Noto Sans Symbols"/>
+                <w:sz w:val="20"/>
+                <w:szCs w:val="16"/>
+              </w:rPr>
+              <w:t>do</w:t>
+            </w:r>
+            <w:r>
+              <w:rPr>
+                <w:rFonts w:eastAsia="Noto Sans Symbols"/>
+                <w:sz w:val="20"/>
+                <w:szCs w:val="16"/>
+              </w:rPr>
+              <w:t xml:space="preserve"> </w:t>
+            </w:r>
+            <w:r>
+              <w:rPr>
+                <w:rFonts w:eastAsia="Noto Sans Symbols"/>
+                <w:sz w:val="20"/>
+                <w:szCs w:val="16"/>
+              </w:rPr>
+              <w:t>colaborador</w:t>
+            </w:r>
+          </w:p>
+          <w:p>
+            <w:pPr>
+              <w:jc w:val="center"/>
+              <w:rPr>
+                <w:rFonts w:eastAsia="Noto Sans Symbols"/>
+                <w:sz w:val="20"/>
+                <w:szCs w:val="16"/>
+              </w:rPr>
+            </w:pPr>
+            <w:r>
+              <w:rPr>
+                <w:rFonts w:eastAsia="Noto Sans Symbols"/>
+                <w:sz w:val="20"/>
+                <w:szCs w:val="16"/>
+              </w:rPr>
+              <w:drawing>
+                <wp:inline distT="0" distB="0" distL="0" distR="0" wp14:anchorId="1E59548D" wp14:editId="70BFC94C">
+                  <wp:extent cx="3045600" cy="3585600"/>
+                  <wp:effectExtent l="0" t="0" r="2540" b="0"/>
+                  <wp:docPr id="84" name="Imagem 84"/>
+                  <wp:cNvGraphicFramePr>
+                    <a:graphicFrameLocks xmlns:a="http://schemas.openxmlformats.org/drawingml/2006/main" noChangeAspect="1"/>
+                  </wp:cNvGraphicFramePr>
+                  <a:graphic xmlns:a="http://schemas.openxmlformats.org/drawingml/2006/main">
+                    <a:graphicData uri="http://schemas.openxmlformats.org/drawingml/2006/picture">
+                      <pic:pic xmlns:pic="http://schemas.openxmlformats.org/drawingml/2006/picture">
+                        <pic:nvPicPr>
+                          <pic:cNvPr id="1" name=""/>
+                          <pic:cNvPicPr/>
+                        </pic:nvPicPr>
+                        <pic:blipFill>
+                          <a:blip r:embed="rId56"/>
+                          <a:stretch>
+                            <a:fillRect/>
+                          </a:stretch>
+                        </pic:blipFill>
+                        <pic:spPr>
+                          <a:xfrm>
+                            <a:off x="0" y="0"/>
+                            <a:ext cx="3045600" cy="3585600"/>
+                          </a:xfrm>
+                          <a:prstGeom prst="rect">
+                            <a:avLst/>
+                          </a:prstGeom>
+                        </pic:spPr>
+                      </pic:pic>
+                    </a:graphicData>
+                  </a:graphic>
+                </wp:inline>
+              </w:drawing>
+            </w:r>
+          </w:p>
+          <w:p>
+            <w:pPr>
+              <w:jc w:val="center"/>
+              <w:rPr>
+                <w:rFonts w:eastAsia="Noto Sans Symbols"/>
+                <w:sz w:val="20"/>
+                <w:szCs w:val="16"/>
+              </w:rPr>
+            </w:pPr>
           </w:p>
           <w:p>
             <w:pPr>
@@ -13402,18 +14024,77 @@
                 <w:sz w:val="20"/>
                 <w:szCs w:val="16"/>
               </w:rPr>
-              <w:t>Modal de alteração do cadastro da etapa</w:t>
-            </w:r>
-          </w:p>
-          <w:p>
-            <w:pPr>
-              <w:jc w:val="center"/>
-              <w:rPr>
-                <w:rFonts w:eastAsia="Noto Sans Symbols"/>
-                <w:sz w:val="20"/>
-                <w:szCs w:val="16"/>
-              </w:rPr>
-            </w:pPr>
+              <w:lastRenderedPageBreak/>
+              <w:t>Modal de alteração do cadastro d</w:t>
+            </w:r>
+            <w:r>
+              <w:rPr>
+                <w:rFonts w:eastAsia="Noto Sans Symbols"/>
+                <w:sz w:val="20"/>
+                <w:szCs w:val="16"/>
+              </w:rPr>
+              <w:t xml:space="preserve">o </w:t>
+            </w:r>
+            <w:r>
+              <w:rPr>
+                <w:rFonts w:eastAsia="Noto Sans Symbols"/>
+                <w:sz w:val="20"/>
+                <w:szCs w:val="16"/>
+              </w:rPr>
+              <w:t>colaborador</w:t>
+            </w:r>
+          </w:p>
+          <w:p>
+            <w:pPr>
+              <w:jc w:val="center"/>
+              <w:rPr>
+                <w:rFonts w:eastAsia="Noto Sans Symbols"/>
+                <w:sz w:val="20"/>
+                <w:szCs w:val="16"/>
+              </w:rPr>
+            </w:pPr>
+            <w:r>
+              <w:rPr>
+                <w:rFonts w:eastAsia="Noto Sans Symbols"/>
+                <w:sz w:val="20"/>
+                <w:szCs w:val="16"/>
+              </w:rPr>
+              <w:drawing>
+                <wp:inline distT="0" distB="0" distL="0" distR="0" wp14:anchorId="4B549ABB" wp14:editId="0D16B544">
+                  <wp:extent cx="2577600" cy="3560400"/>
+                  <wp:effectExtent l="0" t="0" r="0" b="2540"/>
+                  <wp:docPr id="85" name="Imagem 85"/>
+                  <wp:cNvGraphicFramePr>
+                    <a:graphicFrameLocks xmlns:a="http://schemas.openxmlformats.org/drawingml/2006/main" noChangeAspect="1"/>
+                  </wp:cNvGraphicFramePr>
+                  <a:graphic xmlns:a="http://schemas.openxmlformats.org/drawingml/2006/main">
+                    <a:graphicData uri="http://schemas.openxmlformats.org/drawingml/2006/picture">
+                      <pic:pic xmlns:pic="http://schemas.openxmlformats.org/drawingml/2006/picture">
+                        <pic:nvPicPr>
+                          <pic:cNvPr id="1" name=""/>
+                          <pic:cNvPicPr/>
+                        </pic:nvPicPr>
+                        <pic:blipFill>
+                          <a:blip r:embed="rId57"/>
+                          <a:stretch>
+                            <a:fillRect/>
+                          </a:stretch>
+                        </pic:blipFill>
+                        <pic:spPr>
+                          <a:xfrm>
+                            <a:off x="0" y="0"/>
+                            <a:ext cx="2577600" cy="3560400"/>
+                          </a:xfrm>
+                          <a:prstGeom prst="rect">
+                            <a:avLst/>
+                          </a:prstGeom>
+                        </pic:spPr>
+                      </pic:pic>
+                    </a:graphicData>
+                  </a:graphic>
+                </wp:inline>
+              </w:drawing>
+            </w:r>
           </w:p>
           <w:p>
             <w:pPr>
@@ -13445,8 +14126,136 @@
                 <w:sz w:val="20"/>
                 <w:szCs w:val="16"/>
               </w:rPr>
-              <w:t>Modal de confirmação de exclusão do cadastro da etapa</w:t>
-            </w:r>
+              <w:t xml:space="preserve">Modal de confirmação de exclusão do cadastro </w:t>
+            </w:r>
+            <w:r>
+              <w:rPr>
+                <w:rFonts w:eastAsia="Noto Sans Symbols"/>
+                <w:sz w:val="20"/>
+                <w:szCs w:val="16"/>
+              </w:rPr>
+              <w:t>d</w:t>
+            </w:r>
+            <w:r>
+              <w:rPr>
+                <w:rFonts w:eastAsia="Noto Sans Symbols"/>
+                <w:sz w:val="20"/>
+                <w:szCs w:val="16"/>
+              </w:rPr>
+              <w:t>o colaborador</w:t>
+            </w:r>
+          </w:p>
+          <w:p>
+            <w:pPr>
+              <w:jc w:val="center"/>
+              <w:rPr>
+                <w:rFonts w:eastAsia="Noto Sans Symbols"/>
+                <w:sz w:val="20"/>
+                <w:szCs w:val="16"/>
+              </w:rPr>
+            </w:pPr>
+            <w:r>
+              <w:rPr>
+                <w:rFonts w:eastAsia="Noto Sans Symbols"/>
+                <w:sz w:val="20"/>
+                <w:szCs w:val="16"/>
+              </w:rPr>
+              <w:drawing>
+                <wp:inline distT="0" distB="0" distL="0" distR="0" wp14:anchorId="5947A424" wp14:editId="7FAE8F29">
+                  <wp:extent cx="5378400" cy="2286000"/>
+                  <wp:effectExtent l="0" t="0" r="0" b="0"/>
+                  <wp:docPr id="86" name="Imagem 86"/>
+                  <wp:cNvGraphicFramePr>
+                    <a:graphicFrameLocks xmlns:a="http://schemas.openxmlformats.org/drawingml/2006/main" noChangeAspect="1"/>
+                  </wp:cNvGraphicFramePr>
+                  <a:graphic xmlns:a="http://schemas.openxmlformats.org/drawingml/2006/main">
+                    <a:graphicData uri="http://schemas.openxmlformats.org/drawingml/2006/picture">
+                      <pic:pic xmlns:pic="http://schemas.openxmlformats.org/drawingml/2006/picture">
+                        <pic:nvPicPr>
+                          <pic:cNvPr id="1" name=""/>
+                          <pic:cNvPicPr/>
+                        </pic:nvPicPr>
+                        <pic:blipFill>
+                          <a:blip r:embed="rId58"/>
+                          <a:stretch>
+                            <a:fillRect/>
+                          </a:stretch>
+                        </pic:blipFill>
+                        <pic:spPr>
+                          <a:xfrm>
+                            <a:off x="0" y="0"/>
+                            <a:ext cx="5378400" cy="2286000"/>
+                          </a:xfrm>
+                          <a:prstGeom prst="rect">
+                            <a:avLst/>
+                          </a:prstGeom>
+                        </pic:spPr>
+                      </pic:pic>
+                    </a:graphicData>
+                  </a:graphic>
+                </wp:inline>
+              </w:drawing>
+            </w:r>
+          </w:p>
+          <w:p>
+            <w:pPr>
+              <w:jc w:val="center"/>
+              <w:rPr>
+                <w:rFonts w:eastAsia="Noto Sans Symbols"/>
+                <w:sz w:val="20"/>
+                <w:szCs w:val="16"/>
+              </w:rPr>
+            </w:pPr>
+          </w:p>
+          <w:p>
+            <w:pPr>
+              <w:jc w:val="center"/>
+              <w:rPr>
+                <w:rFonts w:eastAsia="Noto Sans Symbols"/>
+                <w:sz w:val="20"/>
+                <w:szCs w:val="16"/>
+              </w:rPr>
+            </w:pPr>
+          </w:p>
+          <w:p>
+            <w:pPr>
+              <w:jc w:val="center"/>
+              <w:rPr>
+                <w:rFonts w:eastAsia="Noto Sans Symbols"/>
+                <w:sz w:val="20"/>
+                <w:szCs w:val="16"/>
+              </w:rPr>
+            </w:pPr>
+          </w:p>
+          <w:p>
+            <w:pPr>
+              <w:jc w:val="center"/>
+              <w:rPr>
+                <w:rFonts w:eastAsia="Noto Sans Symbols"/>
+                <w:sz w:val="20"/>
+                <w:szCs w:val="16"/>
+              </w:rPr>
+            </w:pPr>
+          </w:p>
+          <w:p>
+            <w:pPr>
+              <w:jc w:val="center"/>
+              <w:rPr>
+                <w:rFonts w:eastAsia="Noto Sans Symbols"/>
+                <w:sz w:val="20"/>
+                <w:szCs w:val="16"/>
+              </w:rPr>
+            </w:pPr>
+          </w:p>
+          <w:p>
+            <w:pPr>
+              <w:jc w:val="center"/>
+              <w:rPr>
+                <w:rFonts w:eastAsia="Noto Sans Symbols"/>
+                <w:sz w:val="20"/>
+                <w:szCs w:val="16"/>
+              </w:rPr>
+            </w:pPr>
           </w:p>
           <w:p>
             <w:pPr>
@@ -13488,28 +14297,101 @@
                 <w:sz w:val="20"/>
                 <w:szCs w:val="16"/>
               </w:rPr>
-              <w:t>Modal de mensagem caso tente excluir uma etapa atribuída a uma tarefa ativa</w:t>
-            </w:r>
-          </w:p>
-          <w:p>
-            <w:pPr>
-              <w:jc w:val="center"/>
-              <w:rPr>
-                <w:rFonts w:eastAsia="Noto Sans Symbols"/>
-                <w:sz w:val="20"/>
-                <w:szCs w:val="16"/>
-              </w:rPr>
-            </w:pPr>
-          </w:p>
-          <w:p>
-            <w:pPr>
-              <w:jc w:val="left"/>
-              <w:rPr>
-                <w:rFonts w:eastAsia="Noto Sans Symbols"/>
-                <w:sz w:val="20"/>
-                <w:szCs w:val="16"/>
-              </w:rPr>
-            </w:pPr>
+              <w:lastRenderedPageBreak/>
+              <w:t>Modal de mensagem caso tente excluir um</w:t>
+            </w:r>
+            <w:r>
+              <w:rPr>
+                <w:rFonts w:eastAsia="Noto Sans Symbols"/>
+                <w:sz w:val="20"/>
+                <w:szCs w:val="16"/>
+              </w:rPr>
+              <w:t xml:space="preserve"> colaborador </w:t>
+            </w:r>
+            <w:r>
+              <w:rPr>
+                <w:rFonts w:eastAsia="Noto Sans Symbols"/>
+                <w:sz w:val="20"/>
+                <w:szCs w:val="16"/>
+              </w:rPr>
+              <w:t>atribuíd</w:t>
+            </w:r>
+            <w:r>
+              <w:rPr>
+                <w:rFonts w:eastAsia="Noto Sans Symbols"/>
+                <w:sz w:val="20"/>
+                <w:szCs w:val="16"/>
+              </w:rPr>
+              <w:t>o</w:t>
+            </w:r>
+            <w:r>
+              <w:rPr>
+                <w:rFonts w:eastAsia="Noto Sans Symbols"/>
+                <w:sz w:val="20"/>
+                <w:szCs w:val="16"/>
+              </w:rPr>
+              <w:t xml:space="preserve"> a uma tarefa ativa</w:t>
+            </w:r>
+            <w:r>
+              <w:rPr>
+                <w:rFonts w:eastAsia="Noto Sans Symbols"/>
+                <w:sz w:val="20"/>
+                <w:szCs w:val="16"/>
+              </w:rPr>
+              <w:t xml:space="preserve"> ou responsável por um setor</w:t>
+            </w:r>
+          </w:p>
+          <w:p>
+            <w:pPr>
+              <w:jc w:val="center"/>
+              <w:rPr>
+                <w:rFonts w:eastAsia="Noto Sans Symbols"/>
+                <w:sz w:val="20"/>
+                <w:szCs w:val="16"/>
+              </w:rPr>
+            </w:pPr>
+            <w:r>
+              <w:rPr>
+                <w:rFonts w:eastAsia="Noto Sans Symbols"/>
+                <w:sz w:val="20"/>
+                <w:szCs w:val="16"/>
+              </w:rPr>
+              <w:drawing>
+                <wp:inline distT="0" distB="0" distL="0" distR="0" wp14:anchorId="515BD0D9" wp14:editId="65C9BB0A">
+                  <wp:extent cx="5378400" cy="3589200"/>
+                  <wp:effectExtent l="0" t="0" r="0" b="0"/>
+                  <wp:docPr id="87" name="Imagem 87"/>
+                  <wp:cNvGraphicFramePr>
+                    <a:graphicFrameLocks xmlns:a="http://schemas.openxmlformats.org/drawingml/2006/main" noChangeAspect="1"/>
+                  </wp:cNvGraphicFramePr>
+                  <a:graphic xmlns:a="http://schemas.openxmlformats.org/drawingml/2006/main">
+                    <a:graphicData uri="http://schemas.openxmlformats.org/drawingml/2006/picture">
+                      <pic:pic xmlns:pic="http://schemas.openxmlformats.org/drawingml/2006/picture">
+                        <pic:nvPicPr>
+                          <pic:cNvPr id="1" name=""/>
+                          <pic:cNvPicPr/>
+                        </pic:nvPicPr>
+                        <pic:blipFill>
+                          <a:blip r:embed="rId59"/>
+                          <a:stretch>
+                            <a:fillRect/>
+                          </a:stretch>
+                        </pic:blipFill>
+                        <pic:spPr>
+                          <a:xfrm>
+                            <a:off x="0" y="0"/>
+                            <a:ext cx="5378400" cy="3589200"/>
+                          </a:xfrm>
+                          <a:prstGeom prst="rect">
+                            <a:avLst/>
+                          </a:prstGeom>
+                        </pic:spPr>
+                      </pic:pic>
+                    </a:graphicData>
+                  </a:graphic>
+                </wp:inline>
+              </w:drawing>
+            </w:r>
           </w:p>
         </w:tc>
       </w:tr>
@@ -13612,7 +14494,7 @@
                     <pic:cNvPicPr preferRelativeResize="0"/>
                   </pic:nvPicPr>
                   <pic:blipFill>
-                    <a:blip r:embed="rId53"/>
+                    <a:blip r:embed="rId60"/>
                     <a:srcRect/>
                     <a:stretch>
                       <a:fillRect/>
@@ -13690,7 +14572,7 @@
                     <pic:cNvPicPr preferRelativeResize="0"/>
                   </pic:nvPicPr>
                   <pic:blipFill>
-                    <a:blip r:embed="rId54"/>
+                    <a:blip r:embed="rId61"/>
                     <a:srcRect/>
                     <a:stretch>
                       <a:fillRect/>
@@ -13807,7 +14689,15 @@
     </w:p>
     <w:p>
       <w:r>
-        <w:t>Documento disponibilizado pela UNOESTE, utilizado como guia para estruturar a Especificação de Requisitos de Software (ERS) do ASM Tasks. Este modelo serviu como base para definir o formato, tópicos e detalhamento das funcionalidades e artefatos apresentados ao longo do documento.</w:t>
+        <w:t xml:space="preserve">Documento disponibilizado pela UNOESTE, utilizado como guia para estruturar a Especificação de Requisitos de Software (ERS) do ASM </w:t>
+      </w:r>
+      <w:proofErr w:type="spellStart"/>
+      <w:r>
+        <w:t>Tasks</w:t>
+      </w:r>
+      <w:proofErr w:type="spellEnd"/>
+      <w:r>
+        <w:t>. Este modelo serviu como base para definir o formato, tópicos e detalhamento das funcionalidades e artefatos apresentados ao longo do documento.</w:t>
       </w:r>
     </w:p>
     <w:p/>
@@ -13841,7 +14731,15 @@
         <w:t>tarefas</w:t>
       </w:r>
       <w:r>
-        <w:t>. Nela é possível observar alguns elementos relevantes que serviram de inspiração para o levantamento de requisitos do ASM Tasks.</w:t>
+        <w:t xml:space="preserve">. Nela é possível observar alguns elementos relevantes que serviram de inspiração para o levantamento de requisitos do ASM </w:t>
+      </w:r>
+      <w:proofErr w:type="spellStart"/>
+      <w:r>
+        <w:t>Tasks</w:t>
+      </w:r>
+      <w:proofErr w:type="spellEnd"/>
+      <w:r>
+        <w:t>.</w:t>
       </w:r>
     </w:p>
     <w:p>
@@ -13878,7 +14776,15 @@
     </w:p>
     <w:p>
       <w:r>
-        <w:t>Essa interface exemplifica práticas comuns em sistemas de gestão empresarial, como o uso de filtros, acompanhamento por etapas e histórico de execução, que foram consideradas no processo de especificação de requisitos do ASM Tasks.</w:t>
+        <w:t xml:space="preserve">Essa interface exemplifica práticas comuns em sistemas de gestão empresarial, como o uso de filtros, acompanhamento por etapas e histórico de execução, que foram consideradas no processo de especificação de requisitos do ASM </w:t>
+      </w:r>
+      <w:proofErr w:type="spellStart"/>
+      <w:r>
+        <w:t>Tasks</w:t>
+      </w:r>
+      <w:proofErr w:type="spellEnd"/>
+      <w:r>
+        <w:t>.</w:t>
       </w:r>
     </w:p>
     <w:p/>
@@ -13913,7 +14819,7 @@
                     <pic:cNvPicPr preferRelativeResize="0"/>
                   </pic:nvPicPr>
                   <pic:blipFill>
-                    <a:blip r:embed="rId55"/>
+                    <a:blip r:embed="rId62"/>
                     <a:srcRect/>
                     <a:stretch>
                       <a:fillRect/>
@@ -13938,7 +14844,7 @@
     </w:p>
     <w:p/>
     <w:sectPr>
-      <w:footerReference w:type="first" r:id="rId56"/>
+      <w:footerReference w:type="first" r:id="rId63"/>
       <w:pgSz w:w="11906" w:h="16838"/>
       <w:pgMar w:top="1418" w:right="851" w:bottom="1418" w:left="1418" w:header="709" w:footer="709" w:gutter="0"/>
       <w:pgNumType w:start="1"/>

</xml_diff>

<commit_message>
Validar dados de funcionários (front e back-end)
Implementamos uma validação completa dos dados dos funcionários tanto no backend (Colaborador.cs) quanto no frontend (EmployeeForm.js). O backend agora valida o formato do CPF, nome (requer nome e sobrenome), data de nascimento (não pode ser futura e o funcionário deve ter pelo menos 18 anos) e data de admissão (não pode ser futura). O frontend adiciona mascaramento de entrada para CPF, CEP e telefone, e espelha as regras de validação do backend para feedback do usuário. Refatoramos o layout do formulário para uma melhor experiência do usuário e removemos o componente genérico InputField em favor do tratamento explícito dos campos.
</commit_message>
<xml_diff>
--- a/Documentação/ERS.docx
+++ b/Documentação/ERS.docx
@@ -212,17 +212,8 @@
           <w:sz w:val="28"/>
           <w:szCs w:val="24"/>
         </w:rPr>
-        <w:t xml:space="preserve">ASM </w:t>
+        <w:t>ASM Tasks</w:t>
       </w:r>
-      <w:proofErr w:type="spellStart"/>
-      <w:r>
-        <w:rPr>
-          <w:sz w:val="28"/>
-          <w:szCs w:val="24"/>
-        </w:rPr>
-        <w:t>Tasks</w:t>
-      </w:r>
-      <w:proofErr w:type="spellEnd"/>
     </w:p>
     <w:p>
       <w:pPr>
@@ -1741,15 +1732,7 @@
     </w:p>
     <w:p>
       <w:r>
-        <w:t xml:space="preserve">A finalidade desta Especificação de Requisitos de Software (ERS) é definir de forma clara e precisa as funcionalidades, restrições e características técnicas do sistema ASM </w:t>
-      </w:r>
-      <w:proofErr w:type="spellStart"/>
-      <w:r>
-        <w:t>Tasks</w:t>
-      </w:r>
-      <w:proofErr w:type="spellEnd"/>
-      <w:r>
-        <w:t>. Este documento serve como base para o entendimento compartilhado entre todas as partes envolvidas no projeto: desenvolvedor, empresa Always System Manager e instituição de ensino UNOESTE.</w:t>
+        <w:t>A finalidade desta Especificação de Requisitos de Software (ERS) é definir de forma clara e precisa as funcionalidades, restrições e características técnicas do sistema ASM Tasks. Este documento serve como base para o entendimento compartilhado entre todas as partes envolvidas no projeto: desenvolvedor, empresa Always System Manager e instituição de ensino UNOESTE.</w:t>
       </w:r>
     </w:p>
     <w:p>
@@ -1770,36 +1753,12 @@
     </w:p>
     <w:p>
       <w:r>
-        <w:t xml:space="preserve">O ASM </w:t>
-      </w:r>
-      <w:proofErr w:type="spellStart"/>
-      <w:r>
-        <w:t>Tasks</w:t>
-      </w:r>
-      <w:proofErr w:type="spellEnd"/>
-      <w:r>
-        <w:t xml:space="preserve"> é um sistema voltado para a gestão e acompanhamento de tarefas internas da Always System Manager, abrangendo os setores de desenvolvimento de software e suporte de hardware. Ele permitirá o gerenciamento de tarefas em um quadro </w:t>
-      </w:r>
-      <w:proofErr w:type="spellStart"/>
-      <w:r>
-        <w:t>Kanban</w:t>
-      </w:r>
-      <w:proofErr w:type="spellEnd"/>
-      <w:r>
-        <w:t xml:space="preserve"> com etapas personalizáveis, a utilização de filtros avançados de acordo com prioridade, responsável ou setor, bem como a criação de lembretes por meio de uma agenda integrada, tanto pessoais quanto atribuídos a outros colaboradores. Também contará com funcionalidades de histórico de movimentações e controle de usuários, garantindo rastreabilidade e segurança no uso.</w:t>
+        <w:t>O ASM Tasks é um sistema voltado para a gestão e acompanhamento de tarefas internas da Always System Manager, abrangendo os setores de desenvolvimento de software e suporte de hardware. Ele permitirá o gerenciamento de tarefas em um quadro Kanban com etapas personalizáveis, a utilização de filtros avançados de acordo com prioridade, responsável ou setor, bem como a criação de lembretes por meio de uma agenda integrada, tanto pessoais quanto atribuídos a outros colaboradores. Também contará com funcionalidades de histórico de movimentações e controle de usuários, garantindo rastreabilidade e segurança no uso.</w:t>
       </w:r>
     </w:p>
     <w:p>
       <w:r>
-        <w:t xml:space="preserve">Além das funcionalidades gerais descritas, o ASM </w:t>
-      </w:r>
-      <w:proofErr w:type="spellStart"/>
-      <w:r>
-        <w:t>Tasks</w:t>
-      </w:r>
-      <w:proofErr w:type="spellEnd"/>
-      <w:r>
-        <w:t xml:space="preserve"> contará com funções básicas como gerenciar colaboradores, clientes, prioridades de tarefa, etapas de desenvolvimento e setores. Essas operações são essenciais para estruturar os dados internos da empresa, permitindo que o sistema mantenha consistência na organização de informações e forneça suporte às funcionalidades mais avançadas.</w:t>
+        <w:t>Além das funcionalidades gerais descritas, o ASM Tasks contará com funções básicas como gerenciar colaboradores, clientes, prioridades de tarefa, etapas de desenvolvimento e setores. Essas operações são essenciais para estruturar os dados internos da empresa, permitindo que o sistema mantenha consistência na organização de informações e forneça suporte às funcionalidades mais avançadas.</w:t>
       </w:r>
     </w:p>
     <w:p>
@@ -1813,15 +1772,7 @@
       </w:r>
       <w:r>
         <w:lastRenderedPageBreak/>
-        <w:t xml:space="preserve">das demandas. As datas das tarefas devem ser validadas no momento do agendamento para evitar </w:t>
-      </w:r>
-      <w:proofErr w:type="spellStart"/>
-      <w:r>
-        <w:t>superalocação</w:t>
-      </w:r>
-      <w:proofErr w:type="spellEnd"/>
-      <w:r>
-        <w:t xml:space="preserve"> de atividades para um mesmo colaborador.</w:t>
+        <w:t>das demandas. As datas das tarefas devem ser validadas no momento do agendamento para evitar superalocação de atividades para um mesmo colaborador.</w:t>
       </w:r>
     </w:p>
     <w:p>
@@ -1916,15 +1867,7 @@
         </w:numPr>
       </w:pPr>
       <w:r>
-        <w:t xml:space="preserve">ERP: Enterprise </w:t>
-      </w:r>
-      <w:proofErr w:type="spellStart"/>
-      <w:r>
-        <w:t>Resource</w:t>
-      </w:r>
-      <w:proofErr w:type="spellEnd"/>
-      <w:r>
-        <w:t xml:space="preserve"> Planning (Sistema Integrado de Gestão).</w:t>
+        <w:t>ERP: Enterprise Resource Planning (Sistema Integrado de Gestão).</w:t>
       </w:r>
     </w:p>
     <w:p>
@@ -1935,13 +1878,8 @@
           <w:numId w:val="6"/>
         </w:numPr>
       </w:pPr>
-      <w:proofErr w:type="spellStart"/>
       <w:r>
-        <w:t>Kanban</w:t>
-      </w:r>
-      <w:proofErr w:type="spellEnd"/>
-      <w:r>
-        <w:t>: Método de organização de tarefas baseado em quadros e cartões.</w:t>
+        <w:t>Kanban: Método de organização de tarefas baseado em quadros e cartões.</w:t>
       </w:r>
     </w:p>
     <w:p>
@@ -2322,15 +2260,7 @@
     </w:p>
     <w:p>
       <w:r>
-        <w:t xml:space="preserve">Endereço: Rua José </w:t>
-      </w:r>
-      <w:proofErr w:type="spellStart"/>
-      <w:r>
-        <w:t>Bongiovani</w:t>
-      </w:r>
-      <w:proofErr w:type="spellEnd"/>
-      <w:r>
-        <w:t>, 700 – Cidade Universitária – Presidente Prudente – SP</w:t>
+        <w:t>Endereço: Rua José Bongiovani, 700 – Cidade Universitária – Presidente Prudente – SP</w:t>
       </w:r>
     </w:p>
     <w:p>
@@ -2408,23 +2338,7 @@
         <w:t>, 520</w:t>
       </w:r>
       <w:r>
-        <w:t xml:space="preserve">), no estado de São Paulo, a empresa tem como proprietário </w:t>
-      </w:r>
-      <w:proofErr w:type="spellStart"/>
-      <w:r>
-        <w:t>Alvaro</w:t>
-      </w:r>
-      <w:proofErr w:type="spellEnd"/>
-      <w:r>
-        <w:t xml:space="preserve"> </w:t>
-      </w:r>
-      <w:proofErr w:type="spellStart"/>
-      <w:r>
-        <w:t>Shioji</w:t>
-      </w:r>
-      <w:proofErr w:type="spellEnd"/>
-      <w:r>
-        <w:t xml:space="preserve"> Matsuda e consolidou-se como uma parceira estratégica para diferentes segmentos, como granjas, transportadoras, distribuidoras e comércio em geral.</w:t>
+        <w:t>), no estado de São Paulo, a empresa tem como proprietário Alvaro Shioji Matsuda e consolidou-se como uma parceira estratégica para diferentes segmentos, como granjas, transportadoras, distribuidoras e comércio em geral.</w:t>
       </w:r>
     </w:p>
     <w:p>
@@ -2433,15 +2347,7 @@
       </w:r>
       <w:r>
         <w:lastRenderedPageBreak/>
-        <w:t xml:space="preserve">diversificada que integra áreas de gerência e BI, financeiro, desenvolvimento mobile, desenvolvimento </w:t>
-      </w:r>
-      <w:proofErr w:type="spellStart"/>
-      <w:r>
-        <w:t>fullstack</w:t>
-      </w:r>
-      <w:proofErr w:type="spellEnd"/>
-      <w:r>
-        <w:t xml:space="preserve"> em VB6 e suporte técnico.</w:t>
+        <w:t>diversificada que integra áreas de gerência e BI, financeiro, desenvolvimento mobile, desenvolvimento fullstack em VB6 e suporte técnico.</w:t>
       </w:r>
     </w:p>
     <w:p>
@@ -6517,17 +6423,17 @@
             </w:pPr>
             <w:r>
               <w:rPr>
-                <w:rFonts w:eastAsia="Calibri"/>
                 <w:b/>
                 <w:bCs/>
+                <w:noProof/>
                 <w:sz w:val="20"/>
                 <w:szCs w:val="16"/>
               </w:rPr>
               <w:drawing>
-                <wp:inline distT="0" distB="0" distL="0" distR="0" wp14:anchorId="39F1D6B6" wp14:editId="216EAF7B">
-                  <wp:extent cx="5094000" cy="3556800"/>
-                  <wp:effectExtent l="0" t="0" r="0" b="5715"/>
-                  <wp:docPr id="78" name="Imagem 78"/>
+                <wp:inline distT="0" distB="0" distL="0" distR="0" wp14:anchorId="702F03ED" wp14:editId="372002C2">
+                  <wp:extent cx="5112000" cy="3596400"/>
+                  <wp:effectExtent l="0" t="0" r="0" b="4445"/>
+                  <wp:docPr id="2" name="Imagem 2"/>
                   <wp:cNvGraphicFramePr>
                     <a:graphicFrameLocks xmlns:a="http://schemas.openxmlformats.org/drawingml/2006/main" noChangeAspect="1"/>
                   </wp:cNvGraphicFramePr>
@@ -6547,7 +6453,7 @@
                         <pic:spPr>
                           <a:xfrm>
                             <a:off x="0" y="0"/>
-                            <a:ext cx="5094000" cy="3556800"/>
+                            <a:ext cx="5112000" cy="3596400"/>
                           </a:xfrm>
                           <a:prstGeom prst="rect">
                             <a:avLst/>
@@ -6736,6 +6642,7 @@
             <w:r>
               <w:rPr>
                 <w:rFonts w:eastAsia="Noto Sans Symbols"/>
+                <w:noProof/>
                 <w:sz w:val="20"/>
                 <w:szCs w:val="16"/>
               </w:rPr>
@@ -6822,6 +6729,7 @@
             <w:r>
               <w:rPr>
                 <w:rFonts w:eastAsia="Noto Sans Symbols"/>
+                <w:noProof/>
                 <w:sz w:val="20"/>
                 <w:szCs w:val="16"/>
               </w:rPr>
@@ -7158,6 +7066,7 @@
             <w:r>
               <w:rPr>
                 <w:rFonts w:eastAsia="Noto Sans Symbols"/>
+                <w:noProof/>
                 <w:sz w:val="20"/>
                 <w:szCs w:val="16"/>
               </w:rPr>
@@ -7546,6 +7455,7 @@
             <w:r>
               <w:rPr>
                 <w:rFonts w:eastAsia="Noto Sans Symbols"/>
+                <w:noProof/>
                 <w:sz w:val="20"/>
                 <w:szCs w:val="16"/>
               </w:rPr>
@@ -8307,9 +8217,9 @@
             </w:pPr>
             <w:r>
               <w:rPr>
-                <w:rFonts w:eastAsia="Calibri"/>
                 <w:b/>
                 <w:bCs/>
+                <w:noProof/>
                 <w:sz w:val="20"/>
                 <w:szCs w:val="16"/>
               </w:rPr>
@@ -8397,9 +8307,9 @@
             </w:pPr>
             <w:r>
               <w:rPr>
-                <w:rFonts w:eastAsia="Calibri"/>
                 <w:b/>
                 <w:bCs/>
+                <w:noProof/>
                 <w:sz w:val="20"/>
                 <w:szCs w:val="16"/>
               </w:rPr>
@@ -8524,6 +8434,7 @@
             <w:r>
               <w:rPr>
                 <w:rFonts w:eastAsia="Noto Sans Symbols"/>
+                <w:noProof/>
                 <w:sz w:val="20"/>
                 <w:szCs w:val="16"/>
               </w:rPr>
@@ -8992,6 +8903,7 @@
             <w:r>
               <w:rPr>
                 <w:rFonts w:eastAsia="Noto Sans Symbols"/>
+                <w:noProof/>
                 <w:sz w:val="20"/>
                 <w:szCs w:val="16"/>
               </w:rPr>
@@ -9307,9 +9219,9 @@
             </w:pPr>
             <w:r>
               <w:rPr>
-                <w:rFonts w:eastAsia="Calibri"/>
                 <w:b/>
                 <w:bCs/>
+                <w:noProof/>
                 <w:sz w:val="20"/>
                 <w:szCs w:val="16"/>
               </w:rPr>
@@ -10999,6 +10911,7 @@
             <w:r>
               <w:rPr>
                 <w:rFonts w:eastAsia="Noto Sans Symbols"/>
+                <w:noProof/>
                 <w:sz w:val="20"/>
                 <w:szCs w:val="16"/>
               </w:rPr>
@@ -11575,9 +11488,9 @@
             </w:pPr>
             <w:r>
               <w:rPr>
-                <w:rFonts w:eastAsia="Calibri"/>
                 <w:b/>
                 <w:bCs/>
+                <w:noProof/>
                 <w:sz w:val="20"/>
                 <w:szCs w:val="16"/>
               </w:rPr>
@@ -12745,7 +12658,23 @@
                 <w:sz w:val="20"/>
                 <w:szCs w:val="16"/>
               </w:rPr>
-              <w:t>Deve ser possível listar todos os colaboradores cadastrados no sistema, com opção de busca por nome, CPF ou e-mail.</w:t>
+              <w:t>Deve ser possível listar todos os colaboradores cadastrados no sistema, com opção de busca por nome, CPF</w:t>
+            </w:r>
+            <w:r>
+              <w:rPr>
+                <w:rFonts w:eastAsia="Calibri"/>
+                <w:sz w:val="20"/>
+                <w:szCs w:val="16"/>
+              </w:rPr>
+              <w:t>, cargo ou setor</w:t>
+            </w:r>
+            <w:r>
+              <w:rPr>
+                <w:rFonts w:eastAsia="Calibri"/>
+                <w:sz w:val="20"/>
+                <w:szCs w:val="16"/>
+              </w:rPr>
+              <w:t>.</w:t>
             </w:r>
           </w:p>
           <w:p>
@@ -13195,17 +13124,17 @@
             </w:pPr>
             <w:r>
               <w:rPr>
-                <w:rFonts w:eastAsia="Calibri"/>
                 <w:b/>
                 <w:bCs/>
+                <w:noProof/>
                 <w:sz w:val="20"/>
                 <w:szCs w:val="16"/>
               </w:rPr>
               <w:drawing>
-                <wp:inline distT="0" distB="0" distL="0" distR="0" wp14:anchorId="61DF6E8A" wp14:editId="51C80BB4">
-                  <wp:extent cx="4003200" cy="3585600"/>
-                  <wp:effectExtent l="0" t="0" r="0" b="0"/>
-                  <wp:docPr id="79" name="Imagem 79"/>
+                <wp:inline distT="0" distB="0" distL="0" distR="0" wp14:anchorId="5AE749CB" wp14:editId="7DECEA48">
+                  <wp:extent cx="3970800" cy="3553200"/>
+                  <wp:effectExtent l="0" t="0" r="0" b="9525"/>
+                  <wp:docPr id="3" name="Imagem 3"/>
                   <wp:cNvGraphicFramePr>
                     <a:graphicFrameLocks xmlns:a="http://schemas.openxmlformats.org/drawingml/2006/main" noChangeAspect="1"/>
                   </wp:cNvGraphicFramePr>
@@ -13225,7 +13154,7 @@
                         <pic:spPr>
                           <a:xfrm>
                             <a:off x="0" y="0"/>
-                            <a:ext cx="4003200" cy="3585600"/>
+                            <a:ext cx="3970800" cy="3553200"/>
                           </a:xfrm>
                           <a:prstGeom prst="rect">
                             <a:avLst/>
@@ -13284,9 +13213,9 @@
             </w:pPr>
             <w:r>
               <w:rPr>
-                <w:rFonts w:eastAsia="Calibri"/>
                 <w:b/>
                 <w:bCs/>
+                <w:noProof/>
                 <w:sz w:val="20"/>
                 <w:szCs w:val="16"/>
               </w:rPr>
@@ -13429,7 +13358,6 @@
                 <w:sz w:val="20"/>
                 <w:szCs w:val="16"/>
               </w:rPr>
-              <w:lastRenderedPageBreak/>
               <w:t>Detalhamento com protótipo</w:t>
             </w:r>
           </w:p>
@@ -13453,6 +13381,7 @@
                 <w:sz w:val="20"/>
                 <w:szCs w:val="16"/>
               </w:rPr>
+              <w:lastRenderedPageBreak/>
               <w:t xml:space="preserve">Listagem de </w:t>
             </w:r>
             <w:r>
@@ -13484,6 +13413,7 @@
             <w:r>
               <w:rPr>
                 <w:rFonts w:eastAsia="Noto Sans Symbols"/>
+                <w:noProof/>
                 <w:sz w:val="20"/>
                 <w:szCs w:val="16"/>
               </w:rPr>
@@ -13593,6 +13523,7 @@
             <w:r>
               <w:rPr>
                 <w:rFonts w:eastAsia="Noto Sans Symbols"/>
+                <w:noProof/>
                 <w:sz w:val="20"/>
                 <w:szCs w:val="16"/>
               </w:rPr>
@@ -13793,41 +13724,42 @@
                 <w:sz w:val="20"/>
                 <w:szCs w:val="16"/>
               </w:rPr>
+              <w:t>Modal de cadastro d</w:t>
+            </w:r>
+            <w:r>
+              <w:rPr>
+                <w:rFonts w:eastAsia="Noto Sans Symbols"/>
+                <w:sz w:val="20"/>
+                <w:szCs w:val="16"/>
+              </w:rPr>
+              <w:t xml:space="preserve">o </w:t>
+            </w:r>
+            <w:r>
+              <w:rPr>
+                <w:rFonts w:eastAsia="Noto Sans Symbols"/>
+                <w:sz w:val="20"/>
+                <w:szCs w:val="16"/>
+              </w:rPr>
+              <w:t>colaborador</w:t>
+            </w:r>
+          </w:p>
+          <w:p>
+            <w:pPr>
+              <w:jc w:val="center"/>
+              <w:rPr>
+                <w:rFonts w:eastAsia="Noto Sans Symbols"/>
+                <w:sz w:val="20"/>
+                <w:szCs w:val="16"/>
+              </w:rPr>
+            </w:pPr>
+            <w:r>
+              <w:rPr>
+                <w:rFonts w:eastAsia="Noto Sans Symbols"/>
+                <w:noProof/>
+                <w:sz w:val="20"/>
+                <w:szCs w:val="16"/>
+              </w:rPr>
               <w:lastRenderedPageBreak/>
-              <w:t>Modal de cadastro d</w:t>
-            </w:r>
-            <w:r>
-              <w:rPr>
-                <w:rFonts w:eastAsia="Noto Sans Symbols"/>
-                <w:sz w:val="20"/>
-                <w:szCs w:val="16"/>
-              </w:rPr>
-              <w:t xml:space="preserve">o </w:t>
-            </w:r>
-            <w:r>
-              <w:rPr>
-                <w:rFonts w:eastAsia="Noto Sans Symbols"/>
-                <w:sz w:val="20"/>
-                <w:szCs w:val="16"/>
-              </w:rPr>
-              <w:t>colaborador</w:t>
-            </w:r>
-          </w:p>
-          <w:p>
-            <w:pPr>
-              <w:jc w:val="center"/>
-              <w:rPr>
-                <w:rFonts w:eastAsia="Noto Sans Symbols"/>
-                <w:sz w:val="20"/>
-                <w:szCs w:val="16"/>
-              </w:rPr>
-            </w:pPr>
-            <w:r>
-              <w:rPr>
-                <w:rFonts w:eastAsia="Noto Sans Symbols"/>
-                <w:sz w:val="20"/>
-                <w:szCs w:val="16"/>
-              </w:rPr>
               <w:drawing>
                 <wp:inline distT="0" distB="0" distL="0" distR="0" wp14:anchorId="2F215965" wp14:editId="1ED4AB68">
                   <wp:extent cx="2595600" cy="3560400"/>
@@ -13934,6 +13866,7 @@
             <w:r>
               <w:rPr>
                 <w:rFonts w:eastAsia="Noto Sans Symbols"/>
+                <w:noProof/>
                 <w:sz w:val="20"/>
                 <w:szCs w:val="16"/>
               </w:rPr>
@@ -14024,41 +13957,34 @@
                 <w:sz w:val="20"/>
                 <w:szCs w:val="16"/>
               </w:rPr>
+              <w:t>Modal de alteração do cadastro d</w:t>
+            </w:r>
+            <w:r>
+              <w:rPr>
+                <w:rFonts w:eastAsia="Noto Sans Symbols"/>
+                <w:sz w:val="20"/>
+                <w:szCs w:val="16"/>
+              </w:rPr>
+              <w:t>o colaborador</w:t>
+            </w:r>
+          </w:p>
+          <w:p>
+            <w:pPr>
+              <w:jc w:val="center"/>
+              <w:rPr>
+                <w:rFonts w:eastAsia="Noto Sans Symbols"/>
+                <w:sz w:val="20"/>
+                <w:szCs w:val="16"/>
+              </w:rPr>
+            </w:pPr>
+            <w:r>
+              <w:rPr>
+                <w:rFonts w:eastAsia="Noto Sans Symbols"/>
+                <w:noProof/>
+                <w:sz w:val="20"/>
+                <w:szCs w:val="16"/>
+              </w:rPr>
               <w:lastRenderedPageBreak/>
-              <w:t>Modal de alteração do cadastro d</w:t>
-            </w:r>
-            <w:r>
-              <w:rPr>
-                <w:rFonts w:eastAsia="Noto Sans Symbols"/>
-                <w:sz w:val="20"/>
-                <w:szCs w:val="16"/>
-              </w:rPr>
-              <w:t xml:space="preserve">o </w:t>
-            </w:r>
-            <w:r>
-              <w:rPr>
-                <w:rFonts w:eastAsia="Noto Sans Symbols"/>
-                <w:sz w:val="20"/>
-                <w:szCs w:val="16"/>
-              </w:rPr>
-              <w:t>colaborador</w:t>
-            </w:r>
-          </w:p>
-          <w:p>
-            <w:pPr>
-              <w:jc w:val="center"/>
-              <w:rPr>
-                <w:rFonts w:eastAsia="Noto Sans Symbols"/>
-                <w:sz w:val="20"/>
-                <w:szCs w:val="16"/>
-              </w:rPr>
-            </w:pPr>
-            <w:r>
-              <w:rPr>
-                <w:rFonts w:eastAsia="Noto Sans Symbols"/>
-                <w:sz w:val="20"/>
-                <w:szCs w:val="16"/>
-              </w:rPr>
               <w:drawing>
                 <wp:inline distT="0" distB="0" distL="0" distR="0" wp14:anchorId="4B549ABB" wp14:editId="0D16B544">
                   <wp:extent cx="2577600" cy="3560400"/>
@@ -14157,6 +14083,7 @@
             <w:r>
               <w:rPr>
                 <w:rFonts w:eastAsia="Noto Sans Symbols"/>
+                <w:noProof/>
                 <w:sz w:val="20"/>
                 <w:szCs w:val="16"/>
               </w:rPr>
@@ -14297,65 +14224,66 @@
                 <w:sz w:val="20"/>
                 <w:szCs w:val="16"/>
               </w:rPr>
+              <w:t>Modal de mensagem caso tente excluir um</w:t>
+            </w:r>
+            <w:r>
+              <w:rPr>
+                <w:rFonts w:eastAsia="Noto Sans Symbols"/>
+                <w:sz w:val="20"/>
+                <w:szCs w:val="16"/>
+              </w:rPr>
+              <w:t xml:space="preserve"> colaborador </w:t>
+            </w:r>
+            <w:r>
+              <w:rPr>
+                <w:rFonts w:eastAsia="Noto Sans Symbols"/>
+                <w:sz w:val="20"/>
+                <w:szCs w:val="16"/>
+              </w:rPr>
+              <w:t>atribuíd</w:t>
+            </w:r>
+            <w:r>
+              <w:rPr>
+                <w:rFonts w:eastAsia="Noto Sans Symbols"/>
+                <w:sz w:val="20"/>
+                <w:szCs w:val="16"/>
+              </w:rPr>
+              <w:t>o</w:t>
+            </w:r>
+            <w:r>
+              <w:rPr>
+                <w:rFonts w:eastAsia="Noto Sans Symbols"/>
+                <w:sz w:val="20"/>
+                <w:szCs w:val="16"/>
+              </w:rPr>
+              <w:t xml:space="preserve"> a uma tarefa ativa</w:t>
+            </w:r>
+            <w:r>
+              <w:rPr>
+                <w:rFonts w:eastAsia="Noto Sans Symbols"/>
+                <w:sz w:val="20"/>
+                <w:szCs w:val="16"/>
+              </w:rPr>
+              <w:t xml:space="preserve"> ou responsável por um setor</w:t>
+            </w:r>
+          </w:p>
+          <w:p>
+            <w:pPr>
+              <w:jc w:val="center"/>
+              <w:rPr>
+                <w:rFonts w:eastAsia="Noto Sans Symbols"/>
+                <w:sz w:val="20"/>
+                <w:szCs w:val="16"/>
+              </w:rPr>
+            </w:pPr>
+            <w:r>
+              <w:rPr>
+                <w:rFonts w:eastAsia="Noto Sans Symbols"/>
+                <w:noProof/>
+                <w:sz w:val="20"/>
+                <w:szCs w:val="16"/>
+              </w:rPr>
               <w:lastRenderedPageBreak/>
-              <w:t>Modal de mensagem caso tente excluir um</w:t>
-            </w:r>
-            <w:r>
-              <w:rPr>
-                <w:rFonts w:eastAsia="Noto Sans Symbols"/>
-                <w:sz w:val="20"/>
-                <w:szCs w:val="16"/>
-              </w:rPr>
-              <w:t xml:space="preserve"> colaborador </w:t>
-            </w:r>
-            <w:r>
-              <w:rPr>
-                <w:rFonts w:eastAsia="Noto Sans Symbols"/>
-                <w:sz w:val="20"/>
-                <w:szCs w:val="16"/>
-              </w:rPr>
-              <w:t>atribuíd</w:t>
-            </w:r>
-            <w:r>
-              <w:rPr>
-                <w:rFonts w:eastAsia="Noto Sans Symbols"/>
-                <w:sz w:val="20"/>
-                <w:szCs w:val="16"/>
-              </w:rPr>
-              <w:t>o</w:t>
-            </w:r>
-            <w:r>
-              <w:rPr>
-                <w:rFonts w:eastAsia="Noto Sans Symbols"/>
-                <w:sz w:val="20"/>
-                <w:szCs w:val="16"/>
-              </w:rPr>
-              <w:t xml:space="preserve"> a uma tarefa ativa</w:t>
-            </w:r>
-            <w:r>
-              <w:rPr>
-                <w:rFonts w:eastAsia="Noto Sans Symbols"/>
-                <w:sz w:val="20"/>
-                <w:szCs w:val="16"/>
-              </w:rPr>
-              <w:t xml:space="preserve"> ou responsável por um setor</w:t>
-            </w:r>
-          </w:p>
-          <w:p>
-            <w:pPr>
-              <w:jc w:val="center"/>
-              <w:rPr>
-                <w:rFonts w:eastAsia="Noto Sans Symbols"/>
-                <w:sz w:val="20"/>
-                <w:szCs w:val="16"/>
-              </w:rPr>
-            </w:pPr>
-            <w:r>
-              <w:rPr>
-                <w:rFonts w:eastAsia="Noto Sans Symbols"/>
-                <w:sz w:val="20"/>
-                <w:szCs w:val="16"/>
-              </w:rPr>
               <w:drawing>
                 <wp:inline distT="0" distB="0" distL="0" distR="0" wp14:anchorId="515BD0D9" wp14:editId="65C9BB0A">
                   <wp:extent cx="5378400" cy="3589200"/>
@@ -14689,15 +14617,7 @@
     </w:p>
     <w:p>
       <w:r>
-        <w:t xml:space="preserve">Documento disponibilizado pela UNOESTE, utilizado como guia para estruturar a Especificação de Requisitos de Software (ERS) do ASM </w:t>
-      </w:r>
-      <w:proofErr w:type="spellStart"/>
-      <w:r>
-        <w:t>Tasks</w:t>
-      </w:r>
-      <w:proofErr w:type="spellEnd"/>
-      <w:r>
-        <w:t>. Este modelo serviu como base para definir o formato, tópicos e detalhamento das funcionalidades e artefatos apresentados ao longo do documento.</w:t>
+        <w:t>Documento disponibilizado pela UNOESTE, utilizado como guia para estruturar a Especificação de Requisitos de Software (ERS) do ASM Tasks. Este modelo serviu como base para definir o formato, tópicos e detalhamento das funcionalidades e artefatos apresentados ao longo do documento.</w:t>
       </w:r>
     </w:p>
     <w:p/>
@@ -14731,15 +14651,7 @@
         <w:t>tarefas</w:t>
       </w:r>
       <w:r>
-        <w:t xml:space="preserve">. Nela é possível observar alguns elementos relevantes que serviram de inspiração para o levantamento de requisitos do ASM </w:t>
-      </w:r>
-      <w:proofErr w:type="spellStart"/>
-      <w:r>
-        <w:t>Tasks</w:t>
-      </w:r>
-      <w:proofErr w:type="spellEnd"/>
-      <w:r>
-        <w:t>.</w:t>
+        <w:t>. Nela é possível observar alguns elementos relevantes que serviram de inspiração para o levantamento de requisitos do ASM Tasks.</w:t>
       </w:r>
     </w:p>
     <w:p>
@@ -14776,15 +14688,7 @@
     </w:p>
     <w:p>
       <w:r>
-        <w:t xml:space="preserve">Essa interface exemplifica práticas comuns em sistemas de gestão empresarial, como o uso de filtros, acompanhamento por etapas e histórico de execução, que foram consideradas no processo de especificação de requisitos do ASM </w:t>
-      </w:r>
-      <w:proofErr w:type="spellStart"/>
-      <w:r>
-        <w:t>Tasks</w:t>
-      </w:r>
-      <w:proofErr w:type="spellEnd"/>
-      <w:r>
-        <w:t>.</w:t>
+        <w:t>Essa interface exemplifica práticas comuns em sistemas de gestão empresarial, como o uso de filtros, acompanhamento por etapas e histórico de execução, que foram consideradas no processo de especificação de requisitos do ASM Tasks.</w:t>
       </w:r>
     </w:p>
     <w:p/>

</xml_diff>

<commit_message>
Adicionar endpoints CRUD para a entidade Clientes
Implementei o ClientesController com endpoints para criar, atualizar, inativar, reativar e recuperar clientes. Adicionei DTOs, DAOs e um modelo de suporte para Clientes. Também foram introduzidos componentes de frontend e integração de API para gerenciamento de clientes.
</commit_message>
<xml_diff>
--- a/Documentação/ERS.docx
+++ b/Documentação/ERS.docx
@@ -212,8 +212,17 @@
           <w:sz w:val="28"/>
           <w:szCs w:val="24"/>
         </w:rPr>
-        <w:t>ASM Tasks</w:t>
+        <w:t xml:space="preserve">ASM </w:t>
       </w:r>
+      <w:proofErr w:type="spellStart"/>
+      <w:r>
+        <w:rPr>
+          <w:sz w:val="28"/>
+          <w:szCs w:val="24"/>
+        </w:rPr>
+        <w:t>Tasks</w:t>
+      </w:r>
+      <w:proofErr w:type="spellEnd"/>
     </w:p>
     <w:p>
       <w:pPr>
@@ -1732,7 +1741,15 @@
     </w:p>
     <w:p>
       <w:r>
-        <w:t>A finalidade desta Especificação de Requisitos de Software (ERS) é definir de forma clara e precisa as funcionalidades, restrições e características técnicas do sistema ASM Tasks. Este documento serve como base para o entendimento compartilhado entre todas as partes envolvidas no projeto: desenvolvedor, empresa Always System Manager e instituição de ensino UNOESTE.</w:t>
+        <w:t xml:space="preserve">A finalidade desta Especificação de Requisitos de Software (ERS) é definir de forma clara e precisa as funcionalidades, restrições e características técnicas do sistema ASM </w:t>
+      </w:r>
+      <w:proofErr w:type="spellStart"/>
+      <w:r>
+        <w:t>Tasks</w:t>
+      </w:r>
+      <w:proofErr w:type="spellEnd"/>
+      <w:r>
+        <w:t>. Este documento serve como base para o entendimento compartilhado entre todas as partes envolvidas no projeto: desenvolvedor, empresa Always System Manager e instituição de ensino UNOESTE.</w:t>
       </w:r>
     </w:p>
     <w:p>
@@ -1753,12 +1770,36 @@
     </w:p>
     <w:p>
       <w:r>
-        <w:t>O ASM Tasks é um sistema voltado para a gestão e acompanhamento de tarefas internas da Always System Manager, abrangendo os setores de desenvolvimento de software e suporte de hardware. Ele permitirá o gerenciamento de tarefas em um quadro Kanban com etapas personalizáveis, a utilização de filtros avançados de acordo com prioridade, responsável ou setor, bem como a criação de lembretes por meio de uma agenda integrada, tanto pessoais quanto atribuídos a outros colaboradores. Também contará com funcionalidades de histórico de movimentações e controle de usuários, garantindo rastreabilidade e segurança no uso.</w:t>
+        <w:t xml:space="preserve">O ASM </w:t>
+      </w:r>
+      <w:proofErr w:type="spellStart"/>
+      <w:r>
+        <w:t>Tasks</w:t>
+      </w:r>
+      <w:proofErr w:type="spellEnd"/>
+      <w:r>
+        <w:t xml:space="preserve"> é um sistema voltado para a gestão e acompanhamento de tarefas internas da Always System Manager, abrangendo os setores de desenvolvimento de software e suporte de hardware. Ele permitirá o gerenciamento de tarefas em um quadro </w:t>
+      </w:r>
+      <w:proofErr w:type="spellStart"/>
+      <w:r>
+        <w:t>Kanban</w:t>
+      </w:r>
+      <w:proofErr w:type="spellEnd"/>
+      <w:r>
+        <w:t xml:space="preserve"> com etapas personalizáveis, a utilização de filtros avançados de acordo com prioridade, responsável ou setor, bem como a criação de lembretes por meio de uma agenda integrada, tanto pessoais quanto atribuídos a outros colaboradores. Também contará com funcionalidades de histórico de movimentações e controle de usuários, garantindo rastreabilidade e segurança no uso.</w:t>
       </w:r>
     </w:p>
     <w:p>
       <w:r>
-        <w:t>Além das funcionalidades gerais descritas, o ASM Tasks contará com funções básicas como gerenciar colaboradores, clientes, prioridades de tarefa, etapas de desenvolvimento e setores. Essas operações são essenciais para estruturar os dados internos da empresa, permitindo que o sistema mantenha consistência na organização de informações e forneça suporte às funcionalidades mais avançadas.</w:t>
+        <w:t xml:space="preserve">Além das funcionalidades gerais descritas, o ASM </w:t>
+      </w:r>
+      <w:proofErr w:type="spellStart"/>
+      <w:r>
+        <w:t>Tasks</w:t>
+      </w:r>
+      <w:proofErr w:type="spellEnd"/>
+      <w:r>
+        <w:t xml:space="preserve"> contará com funções básicas como gerenciar colaboradores, clientes, prioridades de tarefa, etapas de desenvolvimento e setores. Essas operações são essenciais para estruturar os dados internos da empresa, permitindo que o sistema mantenha consistência na organização de informações e forneça suporte às funcionalidades mais avançadas.</w:t>
       </w:r>
     </w:p>
     <w:p>
@@ -1772,7 +1813,15 @@
       </w:r>
       <w:r>
         <w:lastRenderedPageBreak/>
-        <w:t>das demandas. As datas das tarefas devem ser validadas no momento do agendamento para evitar superalocação de atividades para um mesmo colaborador.</w:t>
+        <w:t xml:space="preserve">das demandas. As datas das tarefas devem ser validadas no momento do agendamento para evitar </w:t>
+      </w:r>
+      <w:proofErr w:type="spellStart"/>
+      <w:r>
+        <w:t>superalocação</w:t>
+      </w:r>
+      <w:proofErr w:type="spellEnd"/>
+      <w:r>
+        <w:t xml:space="preserve"> de atividades para um mesmo colaborador.</w:t>
       </w:r>
     </w:p>
     <w:p>
@@ -1867,7 +1916,15 @@
         </w:numPr>
       </w:pPr>
       <w:r>
-        <w:t>ERP: Enterprise Resource Planning (Sistema Integrado de Gestão).</w:t>
+        <w:t xml:space="preserve">ERP: Enterprise </w:t>
+      </w:r>
+      <w:proofErr w:type="spellStart"/>
+      <w:r>
+        <w:t>Resource</w:t>
+      </w:r>
+      <w:proofErr w:type="spellEnd"/>
+      <w:r>
+        <w:t xml:space="preserve"> Planning (Sistema Integrado de Gestão).</w:t>
       </w:r>
     </w:p>
     <w:p>
@@ -1878,8 +1935,13 @@
           <w:numId w:val="6"/>
         </w:numPr>
       </w:pPr>
+      <w:proofErr w:type="spellStart"/>
       <w:r>
-        <w:t>Kanban: Método de organização de tarefas baseado em quadros e cartões.</w:t>
+        <w:t>Kanban</w:t>
+      </w:r>
+      <w:proofErr w:type="spellEnd"/>
+      <w:r>
+        <w:t>: Método de organização de tarefas baseado em quadros e cartões.</w:t>
       </w:r>
     </w:p>
     <w:p>
@@ -2260,7 +2322,15 @@
     </w:p>
     <w:p>
       <w:r>
-        <w:t>Endereço: Rua José Bongiovani, 700 – Cidade Universitária – Presidente Prudente – SP</w:t>
+        <w:t xml:space="preserve">Endereço: Rua José </w:t>
+      </w:r>
+      <w:proofErr w:type="spellStart"/>
+      <w:r>
+        <w:t>Bongiovani</w:t>
+      </w:r>
+      <w:proofErr w:type="spellEnd"/>
+      <w:r>
+        <w:t>, 700 – Cidade Universitária – Presidente Prudente – SP</w:t>
       </w:r>
     </w:p>
     <w:p>
@@ -2338,7 +2408,23 @@
         <w:t>, 520</w:t>
       </w:r>
       <w:r>
-        <w:t>), no estado de São Paulo, a empresa tem como proprietário Alvaro Shioji Matsuda e consolidou-se como uma parceira estratégica para diferentes segmentos, como granjas, transportadoras, distribuidoras e comércio em geral.</w:t>
+        <w:t xml:space="preserve">), no estado de São Paulo, a empresa tem como proprietário </w:t>
+      </w:r>
+      <w:proofErr w:type="spellStart"/>
+      <w:r>
+        <w:t>Alvaro</w:t>
+      </w:r>
+      <w:proofErr w:type="spellEnd"/>
+      <w:r>
+        <w:t xml:space="preserve"> </w:t>
+      </w:r>
+      <w:proofErr w:type="spellStart"/>
+      <w:r>
+        <w:t>Shioji</w:t>
+      </w:r>
+      <w:proofErr w:type="spellEnd"/>
+      <w:r>
+        <w:t xml:space="preserve"> Matsuda e consolidou-se como uma parceira estratégica para diferentes segmentos, como granjas, transportadoras, distribuidoras e comércio em geral.</w:t>
       </w:r>
     </w:p>
     <w:p>
@@ -2347,7 +2433,15 @@
       </w:r>
       <w:r>
         <w:lastRenderedPageBreak/>
-        <w:t>diversificada que integra áreas de gerência e BI, financeiro, desenvolvimento mobile, desenvolvimento fullstack em VB6 e suporte técnico.</w:t>
+        <w:t xml:space="preserve">diversificada que integra áreas de gerência e BI, financeiro, desenvolvimento mobile, desenvolvimento </w:t>
+      </w:r>
+      <w:proofErr w:type="spellStart"/>
+      <w:r>
+        <w:t>fullstack</w:t>
+      </w:r>
+      <w:proofErr w:type="spellEnd"/>
+      <w:r>
+        <w:t xml:space="preserve"> em VB6 e suporte técnico.</w:t>
       </w:r>
     </w:p>
     <w:p>
@@ -13131,10 +13225,10 @@
                 <w:szCs w:val="16"/>
               </w:rPr>
               <w:drawing>
-                <wp:inline distT="0" distB="0" distL="0" distR="0" wp14:anchorId="5AE749CB" wp14:editId="7DECEA48">
-                  <wp:extent cx="3970800" cy="3553200"/>
-                  <wp:effectExtent l="0" t="0" r="0" b="9525"/>
-                  <wp:docPr id="3" name="Imagem 3"/>
+                <wp:inline distT="0" distB="0" distL="0" distR="0" wp14:anchorId="6EA8503A" wp14:editId="7FDFC750">
+                  <wp:extent cx="3870000" cy="3592800"/>
+                  <wp:effectExtent l="0" t="0" r="0" b="8255"/>
+                  <wp:docPr id="10" name="Imagem 10"/>
                   <wp:cNvGraphicFramePr>
                     <a:graphicFrameLocks xmlns:a="http://schemas.openxmlformats.org/drawingml/2006/main" noChangeAspect="1"/>
                   </wp:cNvGraphicFramePr>
@@ -13154,7 +13248,7 @@
                         <pic:spPr>
                           <a:xfrm>
                             <a:off x="0" y="0"/>
-                            <a:ext cx="3970800" cy="3553200"/>
+                            <a:ext cx="3870000" cy="3592800"/>
                           </a:xfrm>
                           <a:prstGeom prst="rect">
                             <a:avLst/>
@@ -13358,6 +13452,7 @@
                 <w:sz w:val="20"/>
                 <w:szCs w:val="16"/>
               </w:rPr>
+              <w:lastRenderedPageBreak/>
               <w:t>Detalhamento com protótipo</w:t>
             </w:r>
           </w:p>
@@ -13381,7 +13476,6 @@
                 <w:sz w:val="20"/>
                 <w:szCs w:val="16"/>
               </w:rPr>
-              <w:lastRenderedPageBreak/>
               <w:t xml:space="preserve">Listagem de </w:t>
             </w:r>
             <w:r>
@@ -13724,6 +13818,7 @@
                 <w:sz w:val="20"/>
                 <w:szCs w:val="16"/>
               </w:rPr>
+              <w:lastRenderedPageBreak/>
               <w:t>Modal de cadastro d</w:t>
             </w:r>
             <w:r>
@@ -13759,7 +13854,6 @@
                 <w:sz w:val="20"/>
                 <w:szCs w:val="16"/>
               </w:rPr>
-              <w:lastRenderedPageBreak/>
               <w:drawing>
                 <wp:inline distT="0" distB="0" distL="0" distR="0" wp14:anchorId="2F215965" wp14:editId="1ED4AB68">
                   <wp:extent cx="2595600" cy="3560400"/>
@@ -13957,6 +14051,7 @@
                 <w:sz w:val="20"/>
                 <w:szCs w:val="16"/>
               </w:rPr>
+              <w:lastRenderedPageBreak/>
               <w:t>Modal de alteração do cadastro d</w:t>
             </w:r>
             <w:r>
@@ -13984,7 +14079,6 @@
                 <w:sz w:val="20"/>
                 <w:szCs w:val="16"/>
               </w:rPr>
-              <w:lastRenderedPageBreak/>
               <w:drawing>
                 <wp:inline distT="0" distB="0" distL="0" distR="0" wp14:anchorId="4B549ABB" wp14:editId="0D16B544">
                   <wp:extent cx="2577600" cy="3560400"/>
@@ -14224,6 +14318,7 @@
                 <w:sz w:val="20"/>
                 <w:szCs w:val="16"/>
               </w:rPr>
+              <w:lastRenderedPageBreak/>
               <w:t>Modal de mensagem caso tente excluir um</w:t>
             </w:r>
             <w:r>
@@ -14283,7 +14378,6 @@
                 <w:sz w:val="20"/>
                 <w:szCs w:val="16"/>
               </w:rPr>
-              <w:lastRenderedPageBreak/>
               <w:drawing>
                 <wp:inline distT="0" distB="0" distL="0" distR="0" wp14:anchorId="515BD0D9" wp14:editId="65C9BB0A">
                   <wp:extent cx="5378400" cy="3589200"/>
@@ -14617,7 +14711,15 @@
     </w:p>
     <w:p>
       <w:r>
-        <w:t>Documento disponibilizado pela UNOESTE, utilizado como guia para estruturar a Especificação de Requisitos de Software (ERS) do ASM Tasks. Este modelo serviu como base para definir o formato, tópicos e detalhamento das funcionalidades e artefatos apresentados ao longo do documento.</w:t>
+        <w:t xml:space="preserve">Documento disponibilizado pela UNOESTE, utilizado como guia para estruturar a Especificação de Requisitos de Software (ERS) do ASM </w:t>
+      </w:r>
+      <w:proofErr w:type="spellStart"/>
+      <w:r>
+        <w:t>Tasks</w:t>
+      </w:r>
+      <w:proofErr w:type="spellEnd"/>
+      <w:r>
+        <w:t>. Este modelo serviu como base para definir o formato, tópicos e detalhamento das funcionalidades e artefatos apresentados ao longo do documento.</w:t>
       </w:r>
     </w:p>
     <w:p/>
@@ -14651,7 +14753,15 @@
         <w:t>tarefas</w:t>
       </w:r>
       <w:r>
-        <w:t>. Nela é possível observar alguns elementos relevantes que serviram de inspiração para o levantamento de requisitos do ASM Tasks.</w:t>
+        <w:t xml:space="preserve">. Nela é possível observar alguns elementos relevantes que serviram de inspiração para o levantamento de requisitos do ASM </w:t>
+      </w:r>
+      <w:proofErr w:type="spellStart"/>
+      <w:r>
+        <w:t>Tasks</w:t>
+      </w:r>
+      <w:proofErr w:type="spellEnd"/>
+      <w:r>
+        <w:t>.</w:t>
       </w:r>
     </w:p>
     <w:p>
@@ -14688,7 +14798,15 @@
     </w:p>
     <w:p>
       <w:r>
-        <w:t>Essa interface exemplifica práticas comuns em sistemas de gestão empresarial, como o uso de filtros, acompanhamento por etapas e histórico de execução, que foram consideradas no processo de especificação de requisitos do ASM Tasks.</w:t>
+        <w:t xml:space="preserve">Essa interface exemplifica práticas comuns em sistemas de gestão empresarial, como o uso de filtros, acompanhamento por etapas e histórico de execução, que foram consideradas no processo de especificação de requisitos do ASM </w:t>
+      </w:r>
+      <w:proofErr w:type="spellStart"/>
+      <w:r>
+        <w:t>Tasks</w:t>
+      </w:r>
+      <w:proofErr w:type="spellEnd"/>
+      <w:r>
+        <w:t>.</w:t>
       </w:r>
     </w:p>
     <w:p/>

</xml_diff>

<commit_message>
Ajustando layout dos relatórios e documentação dos mesmos
</commit_message>
<xml_diff>
--- a/Documentação/ERS.docx
+++ b/Documentação/ERS.docx
@@ -15323,9 +15323,9 @@
             </w:pPr>
             <w:r>
               <w:rPr>
-                <w:rFonts w:eastAsia="Calibri"/>
                 <w:b/>
                 <w:bCs/>
+                <w:noProof/>
                 <w:sz w:val="20"/>
                 <w:szCs w:val="16"/>
               </w:rPr>
@@ -17148,6 +17148,273 @@
           <w:p>
             <w:pPr>
               <w:pStyle w:val="PargrafodaLista"/>
+              <w:rPr>
+                <w:rFonts w:eastAsia="Courier New" w:cs="Arial"/>
+                <w:sz w:val="20"/>
+                <w:szCs w:val="16"/>
+              </w:rPr>
+            </w:pPr>
+            <w:r>
+              <w:rPr>
+                <w:rFonts w:eastAsia="Courier New" w:cs="Arial"/>
+                <w:sz w:val="20"/>
+                <w:szCs w:val="16"/>
+              </w:rPr>
+              <w:t>O arquivo exportado (Excel ou PDF) deve conter automaticamente no cabeçalho:</w:t>
+            </w:r>
+          </w:p>
+          <w:p>
+            <w:pPr>
+              <w:pStyle w:val="PargrafodaLista"/>
+              <w:numPr>
+                <w:ilvl w:val="0"/>
+                <w:numId w:val="26"/>
+              </w:numPr>
+              <w:rPr>
+                <w:rFonts w:eastAsia="Courier New" w:cs="Arial"/>
+                <w:sz w:val="20"/>
+                <w:szCs w:val="16"/>
+              </w:rPr>
+            </w:pPr>
+            <w:r>
+              <w:rPr>
+                <w:rFonts w:eastAsia="Courier New" w:cs="Arial"/>
+                <w:sz w:val="20"/>
+                <w:szCs w:val="16"/>
+              </w:rPr>
+              <w:t>Título do relatório: “Relatório de Colaboradores”</w:t>
+            </w:r>
+          </w:p>
+          <w:p>
+            <w:pPr>
+              <w:pStyle w:val="PargrafodaLista"/>
+              <w:numPr>
+                <w:ilvl w:val="0"/>
+                <w:numId w:val="26"/>
+              </w:numPr>
+              <w:rPr>
+                <w:rFonts w:eastAsia="Courier New" w:cs="Arial"/>
+                <w:sz w:val="20"/>
+                <w:szCs w:val="16"/>
+              </w:rPr>
+            </w:pPr>
+            <w:r>
+              <w:rPr>
+                <w:rFonts w:eastAsia="Courier New" w:cs="Arial"/>
+                <w:sz w:val="20"/>
+                <w:szCs w:val="16"/>
+              </w:rPr>
+              <w:t>Filtros aplicados: todos os filtros ativos no momento da exportação</w:t>
+            </w:r>
+          </w:p>
+          <w:p>
+            <w:pPr>
+              <w:pStyle w:val="PargrafodaLista"/>
+              <w:numPr>
+                <w:ilvl w:val="0"/>
+                <w:numId w:val="26"/>
+              </w:numPr>
+              <w:rPr>
+                <w:rFonts w:eastAsia="Courier New" w:cs="Arial"/>
+                <w:sz w:val="20"/>
+                <w:szCs w:val="16"/>
+              </w:rPr>
+            </w:pPr>
+            <w:r>
+              <w:rPr>
+                <w:rFonts w:eastAsia="Courier New" w:cs="Arial"/>
+                <w:sz w:val="20"/>
+                <w:szCs w:val="16"/>
+              </w:rPr>
+              <w:t>Data e hora de emissão do relatório</w:t>
+            </w:r>
+          </w:p>
+          <w:p>
+            <w:pPr>
+              <w:pStyle w:val="PargrafodaLista"/>
+              <w:numPr>
+                <w:ilvl w:val="0"/>
+                <w:numId w:val="23"/>
+              </w:numPr>
+              <w:rPr>
+                <w:rFonts w:eastAsia="Courier New" w:cs="Arial"/>
+                <w:sz w:val="20"/>
+                <w:szCs w:val="16"/>
+              </w:rPr>
+            </w:pPr>
+            <w:r>
+              <w:rPr>
+                <w:rFonts w:eastAsia="Courier New" w:cs="Arial"/>
+                <w:sz w:val="20"/>
+                <w:szCs w:val="16"/>
+              </w:rPr>
+              <w:t>Logotipo da empresa (</w:t>
+            </w:r>
+            <w:r>
+              <w:rPr>
+                <w:rFonts w:eastAsia="Courier New" w:cs="Arial"/>
+                <w:sz w:val="20"/>
+                <w:szCs w:val="16"/>
+              </w:rPr>
+              <w:t xml:space="preserve">somente no PDF, </w:t>
+            </w:r>
+            <w:r>
+              <w:rPr>
+                <w:rFonts w:eastAsia="Courier New" w:cs="Arial"/>
+                <w:sz w:val="20"/>
+                <w:szCs w:val="16"/>
+              </w:rPr>
+              <w:t>a imagem fornecida será exibida no canto superior esquerdo ou direito, conforme padrão de layout)</w:t>
+            </w:r>
+          </w:p>
+          <w:p>
+            <w:pPr>
+              <w:pStyle w:val="PargrafodaLista"/>
+              <w:rPr>
+                <w:rFonts w:eastAsia="Courier New" w:cs="Arial"/>
+                <w:sz w:val="20"/>
+                <w:szCs w:val="16"/>
+              </w:rPr>
+            </w:pPr>
+            <w:r>
+              <w:rPr>
+                <w:rFonts w:eastAsia="Courier New" w:cs="Arial"/>
+                <w:sz w:val="20"/>
+                <w:szCs w:val="16"/>
+              </w:rPr>
+              <w:lastRenderedPageBreak/>
+              <w:t>O rodapé do arquivo exportado deve conter obrigatoriamente:</w:t>
+            </w:r>
+          </w:p>
+          <w:p>
+            <w:pPr>
+              <w:pStyle w:val="PargrafodaLista"/>
+              <w:numPr>
+                <w:ilvl w:val="0"/>
+                <w:numId w:val="26"/>
+              </w:numPr>
+              <w:rPr>
+                <w:rFonts w:eastAsia="Courier New" w:cs="Arial"/>
+                <w:sz w:val="20"/>
+                <w:szCs w:val="16"/>
+              </w:rPr>
+            </w:pPr>
+            <w:r>
+              <w:rPr>
+                <w:rFonts w:eastAsia="Courier New" w:cs="Arial"/>
+                <w:sz w:val="20"/>
+                <w:szCs w:val="16"/>
+              </w:rPr>
+              <w:t xml:space="preserve">Razão Social: </w:t>
+            </w:r>
+            <w:proofErr w:type="spellStart"/>
+            <w:r>
+              <w:rPr>
+                <w:rFonts w:eastAsia="Courier New" w:cs="Arial"/>
+                <w:sz w:val="20"/>
+                <w:szCs w:val="16"/>
+              </w:rPr>
+              <w:t>Alvaro</w:t>
+            </w:r>
+            <w:proofErr w:type="spellEnd"/>
+            <w:r>
+              <w:rPr>
+                <w:rFonts w:eastAsia="Courier New" w:cs="Arial"/>
+                <w:sz w:val="20"/>
+                <w:szCs w:val="16"/>
+              </w:rPr>
+              <w:t xml:space="preserve"> </w:t>
+            </w:r>
+            <w:proofErr w:type="spellStart"/>
+            <w:r>
+              <w:rPr>
+                <w:rFonts w:eastAsia="Courier New" w:cs="Arial"/>
+                <w:sz w:val="20"/>
+                <w:szCs w:val="16"/>
+              </w:rPr>
+              <w:t>Shioji</w:t>
+            </w:r>
+            <w:proofErr w:type="spellEnd"/>
+            <w:r>
+              <w:rPr>
+                <w:rFonts w:eastAsia="Courier New" w:cs="Arial"/>
+                <w:sz w:val="20"/>
+                <w:szCs w:val="16"/>
+              </w:rPr>
+              <w:t xml:space="preserve"> Matsuda</w:t>
+            </w:r>
+          </w:p>
+          <w:p>
+            <w:pPr>
+              <w:pStyle w:val="PargrafodaLista"/>
+              <w:numPr>
+                <w:ilvl w:val="0"/>
+                <w:numId w:val="26"/>
+              </w:numPr>
+              <w:rPr>
+                <w:rFonts w:eastAsia="Courier New" w:cs="Arial"/>
+                <w:sz w:val="20"/>
+                <w:szCs w:val="16"/>
+              </w:rPr>
+            </w:pPr>
+            <w:r>
+              <w:rPr>
+                <w:rFonts w:eastAsia="Courier New" w:cs="Arial"/>
+                <w:sz w:val="20"/>
+                <w:szCs w:val="16"/>
+              </w:rPr>
+              <w:t>Nome Fantasia: Always System Manager</w:t>
+            </w:r>
+          </w:p>
+          <w:p>
+            <w:pPr>
+              <w:pStyle w:val="PargrafodaLista"/>
+              <w:numPr>
+                <w:ilvl w:val="0"/>
+                <w:numId w:val="26"/>
+              </w:numPr>
+              <w:rPr>
+                <w:rFonts w:eastAsia="Courier New" w:cs="Arial"/>
+                <w:sz w:val="20"/>
+                <w:szCs w:val="16"/>
+              </w:rPr>
+            </w:pPr>
+            <w:r>
+              <w:rPr>
+                <w:rFonts w:eastAsia="Courier New" w:cs="Arial"/>
+                <w:sz w:val="20"/>
+                <w:szCs w:val="16"/>
+              </w:rPr>
+              <w:t>Número da página</w:t>
+            </w:r>
+            <w:r>
+              <w:rPr>
+                <w:rFonts w:eastAsia="Courier New" w:cs="Arial"/>
+                <w:sz w:val="20"/>
+                <w:szCs w:val="16"/>
+              </w:rPr>
+              <w:t xml:space="preserve"> (</w:t>
+            </w:r>
+            <w:r>
+              <w:rPr>
+                <w:rFonts w:eastAsia="Courier New" w:cs="Arial"/>
+                <w:sz w:val="20"/>
+                <w:szCs w:val="16"/>
+              </w:rPr>
+              <w:t xml:space="preserve">somente no </w:t>
+            </w:r>
+            <w:r>
+              <w:rPr>
+                <w:rFonts w:eastAsia="Courier New" w:cs="Arial"/>
+                <w:sz w:val="20"/>
+                <w:szCs w:val="16"/>
+              </w:rPr>
+              <w:t>PDF)</w:t>
+            </w:r>
+          </w:p>
+          <w:p>
+            <w:pPr>
+              <w:pStyle w:val="PargrafodaLista"/>
               <w:numPr>
                 <w:ilvl w:val="0"/>
                 <w:numId w:val="20"/>
@@ -17260,7 +17527,6 @@
                 <w:sz w:val="20"/>
                 <w:szCs w:val="16"/>
               </w:rPr>
-              <w:lastRenderedPageBreak/>
               <w:t>Detalhamento com protótipo</w:t>
             </w:r>
           </w:p>
@@ -17299,14 +17565,15 @@
             <w:r>
               <w:rPr>
                 <w:rFonts w:eastAsia="Noto Sans Symbols"/>
+                <w:noProof/>
                 <w:sz w:val="20"/>
                 <w:szCs w:val="16"/>
               </w:rPr>
               <w:drawing>
-                <wp:inline distT="0" distB="0" distL="0" distR="0" wp14:anchorId="792A674A" wp14:editId="4F739908">
-                  <wp:extent cx="5400000" cy="2296800"/>
-                  <wp:effectExtent l="0" t="0" r="0" b="8255"/>
-                  <wp:docPr id="69" name="Imagem 69"/>
+                <wp:inline distT="0" distB="0" distL="0" distR="0" wp14:anchorId="11571159" wp14:editId="639303DF">
+                  <wp:extent cx="5367600" cy="2779200"/>
+                  <wp:effectExtent l="0" t="0" r="5080" b="2540"/>
+                  <wp:docPr id="46" name="Imagem 46"/>
                   <wp:cNvGraphicFramePr>
                     <a:graphicFrameLocks xmlns:a="http://schemas.openxmlformats.org/drawingml/2006/main" noChangeAspect="1"/>
                   </wp:cNvGraphicFramePr>
@@ -17326,6 +17593,1490 @@
                         <pic:spPr>
                           <a:xfrm>
                             <a:off x="0" y="0"/>
+                            <a:ext cx="5367600" cy="2779200"/>
+                          </a:xfrm>
+                          <a:prstGeom prst="rect">
+                            <a:avLst/>
+                          </a:prstGeom>
+                        </pic:spPr>
+                      </pic:pic>
+                    </a:graphicData>
+                  </a:graphic>
+                </wp:inline>
+              </w:drawing>
+            </w:r>
+          </w:p>
+          <w:p>
+            <w:pPr>
+              <w:pStyle w:val="PargrafodaLista"/>
+              <w:jc w:val="center"/>
+              <w:rPr>
+                <w:rFonts w:eastAsia="Noto Sans Symbols"/>
+                <w:sz w:val="20"/>
+                <w:szCs w:val="16"/>
+              </w:rPr>
+            </w:pPr>
+          </w:p>
+          <w:p>
+            <w:pPr>
+              <w:pStyle w:val="PargrafodaLista"/>
+              <w:numPr>
+                <w:ilvl w:val="0"/>
+                <w:numId w:val="25"/>
+              </w:numPr>
+              <w:rPr>
+                <w:rFonts w:eastAsia="Noto Sans Symbols"/>
+                <w:sz w:val="20"/>
+                <w:szCs w:val="16"/>
+              </w:rPr>
+            </w:pPr>
+            <w:r>
+              <w:rPr>
+                <w:rFonts w:eastAsia="Noto Sans Symbols"/>
+                <w:sz w:val="20"/>
+                <w:szCs w:val="16"/>
+              </w:rPr>
+              <w:t>Exportação para Excel</w:t>
+            </w:r>
+          </w:p>
+          <w:p>
+            <w:pPr>
+              <w:jc w:val="center"/>
+              <w:rPr>
+                <w:rFonts w:eastAsia="Noto Sans Symbols"/>
+                <w:sz w:val="20"/>
+                <w:szCs w:val="16"/>
+              </w:rPr>
+            </w:pPr>
+            <w:r>
+              <w:rPr>
+                <w:rFonts w:eastAsia="Noto Sans Symbols"/>
+                <w:noProof/>
+                <w:sz w:val="20"/>
+                <w:szCs w:val="16"/>
+              </w:rPr>
+              <w:drawing>
+                <wp:inline distT="0" distB="0" distL="0" distR="0" wp14:anchorId="54A4D2F4" wp14:editId="23F6E7B8">
+                  <wp:extent cx="5360400" cy="1105200"/>
+                  <wp:effectExtent l="0" t="0" r="0" b="0"/>
+                  <wp:docPr id="24" name="Imagem 24"/>
+                  <wp:cNvGraphicFramePr>
+                    <a:graphicFrameLocks xmlns:a="http://schemas.openxmlformats.org/drawingml/2006/main" noChangeAspect="1"/>
+                  </wp:cNvGraphicFramePr>
+                  <a:graphic xmlns:a="http://schemas.openxmlformats.org/drawingml/2006/main">
+                    <a:graphicData uri="http://schemas.openxmlformats.org/drawingml/2006/picture">
+                      <pic:pic xmlns:pic="http://schemas.openxmlformats.org/drawingml/2006/picture">
+                        <pic:nvPicPr>
+                          <pic:cNvPr id="1" name=""/>
+                          <pic:cNvPicPr/>
+                        </pic:nvPicPr>
+                        <pic:blipFill>
+                          <a:blip r:embed="rId70"/>
+                          <a:stretch>
+                            <a:fillRect/>
+                          </a:stretch>
+                        </pic:blipFill>
+                        <pic:spPr>
+                          <a:xfrm>
+                            <a:off x="0" y="0"/>
+                            <a:ext cx="5360400" cy="1105200"/>
+                          </a:xfrm>
+                          <a:prstGeom prst="rect">
+                            <a:avLst/>
+                          </a:prstGeom>
+                        </pic:spPr>
+                      </pic:pic>
+                    </a:graphicData>
+                  </a:graphic>
+                </wp:inline>
+              </w:drawing>
+            </w:r>
+          </w:p>
+          <w:p>
+            <w:pPr>
+              <w:jc w:val="center"/>
+              <w:rPr>
+                <w:rFonts w:eastAsia="Noto Sans Symbols"/>
+                <w:sz w:val="20"/>
+                <w:szCs w:val="16"/>
+              </w:rPr>
+            </w:pPr>
+          </w:p>
+          <w:p>
+            <w:pPr>
+              <w:jc w:val="center"/>
+              <w:rPr>
+                <w:rFonts w:eastAsia="Noto Sans Symbols"/>
+                <w:sz w:val="20"/>
+                <w:szCs w:val="16"/>
+              </w:rPr>
+            </w:pPr>
+          </w:p>
+          <w:p>
+            <w:pPr>
+              <w:jc w:val="center"/>
+              <w:rPr>
+                <w:rFonts w:eastAsia="Noto Sans Symbols"/>
+                <w:sz w:val="20"/>
+                <w:szCs w:val="16"/>
+              </w:rPr>
+            </w:pPr>
+          </w:p>
+          <w:p>
+            <w:pPr>
+              <w:jc w:val="center"/>
+              <w:rPr>
+                <w:rFonts w:eastAsia="Noto Sans Symbols"/>
+                <w:sz w:val="20"/>
+                <w:szCs w:val="16"/>
+              </w:rPr>
+            </w:pPr>
+          </w:p>
+          <w:p>
+            <w:pPr>
+              <w:jc w:val="center"/>
+              <w:rPr>
+                <w:rFonts w:eastAsia="Noto Sans Symbols"/>
+                <w:sz w:val="20"/>
+                <w:szCs w:val="16"/>
+              </w:rPr>
+            </w:pPr>
+          </w:p>
+          <w:p>
+            <w:pPr>
+              <w:jc w:val="center"/>
+              <w:rPr>
+                <w:rFonts w:eastAsia="Noto Sans Symbols"/>
+                <w:sz w:val="20"/>
+                <w:szCs w:val="16"/>
+              </w:rPr>
+            </w:pPr>
+          </w:p>
+          <w:p>
+            <w:pPr>
+              <w:jc w:val="center"/>
+              <w:rPr>
+                <w:rFonts w:eastAsia="Noto Sans Symbols"/>
+                <w:sz w:val="20"/>
+                <w:szCs w:val="16"/>
+              </w:rPr>
+            </w:pPr>
+          </w:p>
+          <w:p>
+            <w:pPr>
+              <w:jc w:val="center"/>
+              <w:rPr>
+                <w:rFonts w:eastAsia="Noto Sans Symbols"/>
+                <w:sz w:val="20"/>
+                <w:szCs w:val="16"/>
+              </w:rPr>
+            </w:pPr>
+          </w:p>
+          <w:p>
+            <w:pPr>
+              <w:jc w:val="center"/>
+              <w:rPr>
+                <w:rFonts w:eastAsia="Noto Sans Symbols"/>
+                <w:sz w:val="20"/>
+                <w:szCs w:val="16"/>
+              </w:rPr>
+            </w:pPr>
+          </w:p>
+          <w:p>
+            <w:pPr>
+              <w:pStyle w:val="PargrafodaLista"/>
+              <w:numPr>
+                <w:ilvl w:val="0"/>
+                <w:numId w:val="25"/>
+              </w:numPr>
+              <w:rPr>
+                <w:rFonts w:eastAsia="Noto Sans Symbols"/>
+                <w:sz w:val="20"/>
+                <w:szCs w:val="16"/>
+              </w:rPr>
+            </w:pPr>
+            <w:r>
+              <w:rPr>
+                <w:rFonts w:eastAsia="Noto Sans Symbols"/>
+                <w:sz w:val="20"/>
+                <w:szCs w:val="16"/>
+              </w:rPr>
+              <w:t>Exportação para PDF</w:t>
+            </w:r>
+          </w:p>
+          <w:p>
+            <w:pPr>
+              <w:pStyle w:val="PargrafodaLista"/>
+              <w:jc w:val="center"/>
+              <w:rPr>
+                <w:rFonts w:eastAsia="Noto Sans Symbols"/>
+                <w:sz w:val="20"/>
+                <w:szCs w:val="16"/>
+              </w:rPr>
+            </w:pPr>
+            <w:r>
+              <w:rPr>
+                <w:rFonts w:eastAsia="Noto Sans Symbols"/>
+                <w:noProof/>
+                <w:sz w:val="20"/>
+                <w:szCs w:val="16"/>
+              </w:rPr>
+              <w:drawing>
+                <wp:inline distT="0" distB="0" distL="0" distR="0" wp14:anchorId="38AA227D" wp14:editId="1D5EF049">
+                  <wp:extent cx="4766400" cy="3567600"/>
+                  <wp:effectExtent l="0" t="0" r="0" b="0"/>
+                  <wp:docPr id="21" name="Imagem 21"/>
+                  <wp:cNvGraphicFramePr>
+                    <a:graphicFrameLocks xmlns:a="http://schemas.openxmlformats.org/drawingml/2006/main" noChangeAspect="1"/>
+                  </wp:cNvGraphicFramePr>
+                  <a:graphic xmlns:a="http://schemas.openxmlformats.org/drawingml/2006/main">
+                    <a:graphicData uri="http://schemas.openxmlformats.org/drawingml/2006/picture">
+                      <pic:pic xmlns:pic="http://schemas.openxmlformats.org/drawingml/2006/picture">
+                        <pic:nvPicPr>
+                          <pic:cNvPr id="1" name=""/>
+                          <pic:cNvPicPr/>
+                        </pic:nvPicPr>
+                        <pic:blipFill>
+                          <a:blip r:embed="rId71"/>
+                          <a:stretch>
+                            <a:fillRect/>
+                          </a:stretch>
+                        </pic:blipFill>
+                        <pic:spPr>
+                          <a:xfrm>
+                            <a:off x="0" y="0"/>
+                            <a:ext cx="4766400" cy="3567600"/>
+                          </a:xfrm>
+                          <a:prstGeom prst="rect">
+                            <a:avLst/>
+                          </a:prstGeom>
+                        </pic:spPr>
+                      </pic:pic>
+                    </a:graphicData>
+                  </a:graphic>
+                </wp:inline>
+              </w:drawing>
+            </w:r>
+          </w:p>
+          <w:p>
+            <w:pPr>
+              <w:rPr>
+                <w:rFonts w:eastAsia="Noto Sans Symbols"/>
+                <w:sz w:val="20"/>
+                <w:szCs w:val="16"/>
+              </w:rPr>
+            </w:pPr>
+          </w:p>
+        </w:tc>
+      </w:tr>
+    </w:tbl>
+    <w:p>
+      <w:pPr>
+        <w:pStyle w:val="Ttulo1"/>
+      </w:pPr>
+      <w:bookmarkStart w:id="13" w:name="_Toc209377801"/>
+    </w:p>
+    <w:p>
+      <w:pPr>
+        <w:spacing w:after="240" w:line="259" w:lineRule="auto"/>
+        <w:rPr>
+          <w:b/>
+          <w:caps/>
+          <w:color w:val="2E75B5"/>
+          <w:sz w:val="32"/>
+          <w:szCs w:val="32"/>
+        </w:rPr>
+      </w:pPr>
+      <w:r>
+        <w:br w:type="page"/>
+      </w:r>
+    </w:p>
+    <w:tbl>
+      <w:tblPr>
+        <w:tblStyle w:val="a2"/>
+        <w:tblW w:w="9627" w:type="dxa"/>
+        <w:tblInd w:w="0" w:type="dxa"/>
+        <w:tblBorders>
+          <w:top w:val="single" w:sz="4" w:space="0" w:color="000000"/>
+          <w:left w:val="single" w:sz="4" w:space="0" w:color="000000"/>
+          <w:bottom w:val="single" w:sz="4" w:space="0" w:color="000000"/>
+          <w:right w:val="single" w:sz="4" w:space="0" w:color="000000"/>
+          <w:insideH w:val="single" w:sz="4" w:space="0" w:color="000000"/>
+          <w:insideV w:val="single" w:sz="4" w:space="0" w:color="000000"/>
+        </w:tblBorders>
+        <w:tblLayout w:type="fixed"/>
+        <w:tblLook w:val="0400" w:firstRow="0" w:lastRow="0" w:firstColumn="0" w:lastColumn="0" w:noHBand="0" w:noVBand="1"/>
+      </w:tblPr>
+      <w:tblGrid>
+        <w:gridCol w:w="9627"/>
+      </w:tblGrid>
+      <w:tr>
+        <w:tc>
+          <w:tcPr>
+            <w:tcW w:w="9627" w:type="dxa"/>
+            <w:shd w:val="clear" w:color="auto" w:fill="F2F2F2"/>
+          </w:tcPr>
+          <w:p>
+            <w:pPr>
+              <w:rPr>
+                <w:rFonts w:eastAsia="Calibri"/>
+                <w:b/>
+                <w:bCs/>
+                <w:sz w:val="20"/>
+                <w:szCs w:val="16"/>
+              </w:rPr>
+            </w:pPr>
+            <w:r>
+              <w:rPr>
+                <w:rFonts w:eastAsia="Calibri"/>
+                <w:b/>
+                <w:bCs/>
+                <w:sz w:val="20"/>
+                <w:szCs w:val="16"/>
+              </w:rPr>
+              <w:lastRenderedPageBreak/>
+              <w:t>Estória 16: Emitir relatório de clientes</w:t>
+            </w:r>
+          </w:p>
+          <w:p>
+            <w:pPr>
+              <w:rPr>
+                <w:rFonts w:eastAsia="Calibri"/>
+                <w:bCs/>
+                <w:sz w:val="20"/>
+                <w:szCs w:val="16"/>
+              </w:rPr>
+            </w:pPr>
+            <w:r>
+              <w:rPr>
+                <w:rFonts w:eastAsia="Calibri"/>
+                <w:bCs/>
+                <w:sz w:val="20"/>
+                <w:szCs w:val="16"/>
+              </w:rPr>
+              <w:t>Como administrador do sistema, quero emitir um relatório de clientes (com filtros, visualização e opções de exportação), para obter rapidamente uma listagem organizada das pessoas físicas e jurídicas cadastradas, facilitando consultas, auditorias e apoio à tomada de decisão.</w:t>
+            </w:r>
+          </w:p>
+        </w:tc>
+      </w:tr>
+      <w:tr>
+        <w:tc>
+          <w:tcPr>
+            <w:tcW w:w="9627" w:type="dxa"/>
+          </w:tcPr>
+          <w:p>
+            <w:pPr>
+              <w:rPr>
+                <w:rFonts w:eastAsia="Calibri"/>
+                <w:b/>
+                <w:bCs/>
+                <w:sz w:val="20"/>
+                <w:szCs w:val="16"/>
+              </w:rPr>
+            </w:pPr>
+            <w:r>
+              <w:rPr>
+                <w:rFonts w:eastAsia="Calibri"/>
+                <w:b/>
+                <w:bCs/>
+                <w:sz w:val="20"/>
+                <w:szCs w:val="16"/>
+              </w:rPr>
+              <w:t>Especificação do Requisito</w:t>
+            </w:r>
+          </w:p>
+          <w:p>
+            <w:pPr>
+              <w:rPr>
+                <w:rFonts w:eastAsia="Courier New" w:cs="Arial"/>
+                <w:sz w:val="20"/>
+                <w:szCs w:val="16"/>
+              </w:rPr>
+            </w:pPr>
+            <w:r>
+              <w:rPr>
+                <w:rFonts w:eastAsia="Courier New" w:cs="Arial"/>
+                <w:sz w:val="20"/>
+                <w:szCs w:val="16"/>
+              </w:rPr>
+              <w:t>O sistema deve permitir a emissão de um relatório contendo informações dos clientes cadastrados, possibilitando filtrar, visualizar e exportar os dados conforme necessidade do usuário.</w:t>
+            </w:r>
+          </w:p>
+          <w:p>
+            <w:pPr>
+              <w:rPr>
+                <w:rFonts w:eastAsia="Courier New" w:cs="Arial"/>
+                <w:sz w:val="20"/>
+                <w:szCs w:val="16"/>
+              </w:rPr>
+            </w:pPr>
+            <w:r>
+              <w:rPr>
+                <w:rFonts w:eastAsia="Courier New" w:cs="Arial"/>
+                <w:sz w:val="20"/>
+                <w:szCs w:val="16"/>
+              </w:rPr>
+              <w:t>Requisitos Funcionais</w:t>
+            </w:r>
+            <w:r>
+              <w:rPr>
+                <w:rFonts w:eastAsia="Courier New" w:cs="Arial"/>
+                <w:sz w:val="20"/>
+                <w:szCs w:val="16"/>
+              </w:rPr>
+              <w:t>:</w:t>
+            </w:r>
+          </w:p>
+          <w:p>
+            <w:pPr>
+              <w:pStyle w:val="PargrafodaLista"/>
+              <w:numPr>
+                <w:ilvl w:val="0"/>
+                <w:numId w:val="20"/>
+              </w:numPr>
+              <w:rPr>
+                <w:rFonts w:eastAsia="Courier New" w:cs="Arial"/>
+                <w:sz w:val="20"/>
+                <w:szCs w:val="16"/>
+              </w:rPr>
+            </w:pPr>
+            <w:r>
+              <w:rPr>
+                <w:rFonts w:eastAsia="Courier New" w:cs="Arial"/>
+                <w:sz w:val="20"/>
+                <w:szCs w:val="16"/>
+              </w:rPr>
+              <w:t>Filtros</w:t>
+            </w:r>
+          </w:p>
+          <w:p>
+            <w:pPr>
+              <w:pStyle w:val="PargrafodaLista"/>
+              <w:rPr>
+                <w:rFonts w:eastAsia="Courier New" w:cs="Arial"/>
+                <w:sz w:val="20"/>
+                <w:szCs w:val="16"/>
+              </w:rPr>
+            </w:pPr>
+            <w:r>
+              <w:rPr>
+                <w:rFonts w:eastAsia="Courier New" w:cs="Arial"/>
+                <w:sz w:val="20"/>
+                <w:szCs w:val="16"/>
+              </w:rPr>
+              <w:t>Deve ser possível filtrar os clientes pelos seguintes critérios:</w:t>
+            </w:r>
+          </w:p>
+          <w:p>
+            <w:pPr>
+              <w:pStyle w:val="PargrafodaLista"/>
+              <w:numPr>
+                <w:ilvl w:val="0"/>
+                <w:numId w:val="21"/>
+              </w:numPr>
+              <w:rPr>
+                <w:rFonts w:eastAsia="Courier New" w:cs="Arial"/>
+                <w:sz w:val="20"/>
+                <w:szCs w:val="16"/>
+              </w:rPr>
+            </w:pPr>
+            <w:r>
+              <w:rPr>
+                <w:rFonts w:eastAsia="Courier New" w:cs="Arial"/>
+                <w:sz w:val="20"/>
+                <w:szCs w:val="16"/>
+              </w:rPr>
+              <w:t>Nome</w:t>
+            </w:r>
+            <w:r>
+              <w:rPr>
+                <w:rFonts w:eastAsia="Courier New" w:cs="Arial"/>
+                <w:sz w:val="20"/>
+                <w:szCs w:val="16"/>
+              </w:rPr>
+              <w:t>/Razão Social</w:t>
+            </w:r>
+            <w:r>
+              <w:rPr>
+                <w:rFonts w:eastAsia="Courier New" w:cs="Arial"/>
+                <w:sz w:val="20"/>
+                <w:szCs w:val="16"/>
+              </w:rPr>
+              <w:t xml:space="preserve"> ou </w:t>
+            </w:r>
+            <w:r>
+              <w:rPr>
+                <w:rFonts w:eastAsia="Courier New" w:cs="Arial"/>
+                <w:sz w:val="20"/>
+                <w:szCs w:val="16"/>
+              </w:rPr>
+              <w:t>CPF/CNPJ</w:t>
+            </w:r>
+            <w:r>
+              <w:rPr>
+                <w:rFonts w:eastAsia="Courier New" w:cs="Arial"/>
+                <w:sz w:val="20"/>
+                <w:szCs w:val="16"/>
+              </w:rPr>
+              <w:t xml:space="preserve"> </w:t>
+            </w:r>
+            <w:r>
+              <w:rPr>
+                <w:rFonts w:eastAsia="Courier New" w:cs="Arial"/>
+                <w:sz w:val="20"/>
+                <w:szCs w:val="16"/>
+              </w:rPr>
+              <w:t>(campo de busca textual)</w:t>
+            </w:r>
+          </w:p>
+          <w:p>
+            <w:pPr>
+              <w:pStyle w:val="PargrafodaLista"/>
+              <w:numPr>
+                <w:ilvl w:val="0"/>
+                <w:numId w:val="21"/>
+              </w:numPr>
+              <w:rPr>
+                <w:rFonts w:eastAsia="Courier New" w:cs="Arial"/>
+                <w:sz w:val="20"/>
+                <w:szCs w:val="16"/>
+              </w:rPr>
+            </w:pPr>
+            <w:r>
+              <w:rPr>
+                <w:rFonts w:eastAsia="Courier New" w:cs="Arial"/>
+                <w:sz w:val="20"/>
+                <w:szCs w:val="16"/>
+              </w:rPr>
+              <w:t xml:space="preserve">Status: Ativo, </w:t>
+            </w:r>
+            <w:proofErr w:type="gramStart"/>
+            <w:r>
+              <w:rPr>
+                <w:rFonts w:eastAsia="Courier New" w:cs="Arial"/>
+                <w:sz w:val="20"/>
+                <w:szCs w:val="16"/>
+              </w:rPr>
+              <w:t>Inativo</w:t>
+            </w:r>
+            <w:proofErr w:type="gramEnd"/>
+            <w:r>
+              <w:rPr>
+                <w:rFonts w:eastAsia="Courier New" w:cs="Arial"/>
+                <w:sz w:val="20"/>
+                <w:szCs w:val="16"/>
+              </w:rPr>
+              <w:t xml:space="preserve"> ou Todos</w:t>
+            </w:r>
+          </w:p>
+          <w:p>
+            <w:pPr>
+              <w:pStyle w:val="PargrafodaLista"/>
+              <w:numPr>
+                <w:ilvl w:val="0"/>
+                <w:numId w:val="20"/>
+              </w:numPr>
+              <w:rPr>
+                <w:rFonts w:eastAsia="Courier New" w:cs="Arial"/>
+                <w:sz w:val="20"/>
+                <w:szCs w:val="16"/>
+              </w:rPr>
+            </w:pPr>
+            <w:r>
+              <w:rPr>
+                <w:rFonts w:eastAsia="Courier New" w:cs="Arial"/>
+                <w:sz w:val="20"/>
+                <w:szCs w:val="16"/>
+              </w:rPr>
+              <w:t>Configuração de Colunas</w:t>
+            </w:r>
+          </w:p>
+          <w:p>
+            <w:pPr>
+              <w:pStyle w:val="PargrafodaLista"/>
+              <w:rPr>
+                <w:rFonts w:eastAsia="Courier New" w:cs="Arial"/>
+                <w:sz w:val="20"/>
+                <w:szCs w:val="16"/>
+              </w:rPr>
+            </w:pPr>
+            <w:r>
+              <w:rPr>
+                <w:rFonts w:eastAsia="Courier New" w:cs="Arial"/>
+                <w:sz w:val="20"/>
+                <w:szCs w:val="16"/>
+              </w:rPr>
+              <w:t>O usuário deve poder selecionar quais colunas deseja exibir no relatório. As opções são:</w:t>
+            </w:r>
+          </w:p>
+          <w:p>
+            <w:pPr>
+              <w:pStyle w:val="PargrafodaLista"/>
+              <w:numPr>
+                <w:ilvl w:val="0"/>
+                <w:numId w:val="22"/>
+              </w:numPr>
+              <w:rPr>
+                <w:rFonts w:eastAsia="Courier New" w:cs="Arial"/>
+                <w:sz w:val="20"/>
+                <w:szCs w:val="16"/>
+              </w:rPr>
+            </w:pPr>
+            <w:r>
+              <w:rPr>
+                <w:rFonts w:eastAsia="Courier New" w:cs="Arial"/>
+                <w:sz w:val="20"/>
+                <w:szCs w:val="16"/>
+              </w:rPr>
+              <w:t>Nome/Razão Social</w:t>
+            </w:r>
+          </w:p>
+          <w:p>
+            <w:pPr>
+              <w:pStyle w:val="PargrafodaLista"/>
+              <w:numPr>
+                <w:ilvl w:val="0"/>
+                <w:numId w:val="22"/>
+              </w:numPr>
+              <w:rPr>
+                <w:rFonts w:eastAsia="Courier New" w:cs="Arial"/>
+                <w:sz w:val="20"/>
+                <w:szCs w:val="16"/>
+              </w:rPr>
+            </w:pPr>
+            <w:r>
+              <w:rPr>
+                <w:rFonts w:eastAsia="Courier New" w:cs="Arial"/>
+                <w:sz w:val="20"/>
+                <w:szCs w:val="16"/>
+              </w:rPr>
+              <w:t>CPF/CNPJ</w:t>
+            </w:r>
+          </w:p>
+          <w:p>
+            <w:pPr>
+              <w:pStyle w:val="PargrafodaLista"/>
+              <w:numPr>
+                <w:ilvl w:val="0"/>
+                <w:numId w:val="22"/>
+              </w:numPr>
+              <w:rPr>
+                <w:rFonts w:eastAsia="Courier New" w:cs="Arial"/>
+                <w:sz w:val="20"/>
+                <w:szCs w:val="16"/>
+              </w:rPr>
+            </w:pPr>
+            <w:r>
+              <w:rPr>
+                <w:rFonts w:eastAsia="Courier New" w:cs="Arial"/>
+                <w:sz w:val="20"/>
+                <w:szCs w:val="16"/>
+              </w:rPr>
+              <w:t>Tipo</w:t>
+            </w:r>
+          </w:p>
+          <w:p>
+            <w:pPr>
+              <w:pStyle w:val="PargrafodaLista"/>
+              <w:numPr>
+                <w:ilvl w:val="0"/>
+                <w:numId w:val="22"/>
+              </w:numPr>
+              <w:rPr>
+                <w:rFonts w:eastAsia="Courier New" w:cs="Arial"/>
+                <w:sz w:val="20"/>
+                <w:szCs w:val="16"/>
+              </w:rPr>
+            </w:pPr>
+            <w:r>
+              <w:rPr>
+                <w:rFonts w:eastAsia="Courier New" w:cs="Arial"/>
+                <w:sz w:val="20"/>
+                <w:szCs w:val="16"/>
+              </w:rPr>
+              <w:t>Status</w:t>
+            </w:r>
+          </w:p>
+          <w:p>
+            <w:pPr>
+              <w:pStyle w:val="PargrafodaLista"/>
+              <w:numPr>
+                <w:ilvl w:val="0"/>
+                <w:numId w:val="22"/>
+              </w:numPr>
+              <w:rPr>
+                <w:rFonts w:eastAsia="Courier New" w:cs="Arial"/>
+                <w:sz w:val="20"/>
+                <w:szCs w:val="16"/>
+              </w:rPr>
+            </w:pPr>
+            <w:r>
+              <w:rPr>
+                <w:rFonts w:eastAsia="Courier New" w:cs="Arial"/>
+                <w:sz w:val="20"/>
+                <w:szCs w:val="16"/>
+              </w:rPr>
+              <w:t>Data de Nascimento / Data de Inauguração</w:t>
+            </w:r>
+          </w:p>
+          <w:p>
+            <w:pPr>
+              <w:pStyle w:val="PargrafodaLista"/>
+              <w:numPr>
+                <w:ilvl w:val="0"/>
+                <w:numId w:val="22"/>
+              </w:numPr>
+              <w:rPr>
+                <w:rFonts w:eastAsia="Courier New" w:cs="Arial"/>
+                <w:sz w:val="20"/>
+                <w:szCs w:val="16"/>
+              </w:rPr>
+            </w:pPr>
+            <w:r>
+              <w:rPr>
+                <w:rFonts w:eastAsia="Courier New" w:cs="Arial"/>
+                <w:sz w:val="20"/>
+                <w:szCs w:val="16"/>
+              </w:rPr>
+              <w:t>E-mail</w:t>
+            </w:r>
+          </w:p>
+          <w:p>
+            <w:pPr>
+              <w:pStyle w:val="PargrafodaLista"/>
+              <w:numPr>
+                <w:ilvl w:val="0"/>
+                <w:numId w:val="22"/>
+              </w:numPr>
+              <w:rPr>
+                <w:rFonts w:eastAsia="Courier New" w:cs="Arial"/>
+                <w:sz w:val="20"/>
+                <w:szCs w:val="16"/>
+              </w:rPr>
+            </w:pPr>
+            <w:r>
+              <w:rPr>
+                <w:rFonts w:eastAsia="Courier New" w:cs="Arial"/>
+                <w:sz w:val="20"/>
+                <w:szCs w:val="16"/>
+              </w:rPr>
+              <w:t>Telefone</w:t>
+            </w:r>
+          </w:p>
+          <w:p>
+            <w:pPr>
+              <w:pStyle w:val="PargrafodaLista"/>
+              <w:numPr>
+                <w:ilvl w:val="0"/>
+                <w:numId w:val="22"/>
+              </w:numPr>
+              <w:rPr>
+                <w:rFonts w:eastAsia="Courier New" w:cs="Arial"/>
+                <w:sz w:val="20"/>
+                <w:szCs w:val="16"/>
+              </w:rPr>
+            </w:pPr>
+            <w:r>
+              <w:rPr>
+                <w:rFonts w:eastAsia="Courier New" w:cs="Arial"/>
+                <w:sz w:val="20"/>
+                <w:szCs w:val="16"/>
+              </w:rPr>
+              <w:t>Site</w:t>
+            </w:r>
+          </w:p>
+          <w:p>
+            <w:pPr>
+              <w:pStyle w:val="PargrafodaLista"/>
+              <w:numPr>
+                <w:ilvl w:val="0"/>
+                <w:numId w:val="22"/>
+              </w:numPr>
+              <w:rPr>
+                <w:rFonts w:eastAsia="Courier New" w:cs="Arial"/>
+                <w:sz w:val="20"/>
+                <w:szCs w:val="16"/>
+              </w:rPr>
+            </w:pPr>
+            <w:r>
+              <w:rPr>
+                <w:rFonts w:eastAsia="Courier New" w:cs="Arial"/>
+                <w:sz w:val="20"/>
+                <w:szCs w:val="16"/>
+              </w:rPr>
+              <w:t>Cidade</w:t>
+            </w:r>
+          </w:p>
+          <w:p>
+            <w:pPr>
+              <w:pStyle w:val="PargrafodaLista"/>
+              <w:numPr>
+                <w:ilvl w:val="0"/>
+                <w:numId w:val="22"/>
+              </w:numPr>
+              <w:rPr>
+                <w:rFonts w:eastAsia="Courier New" w:cs="Arial"/>
+                <w:sz w:val="20"/>
+                <w:szCs w:val="16"/>
+              </w:rPr>
+            </w:pPr>
+            <w:r>
+              <w:rPr>
+                <w:rFonts w:eastAsia="Courier New" w:cs="Arial"/>
+                <w:sz w:val="20"/>
+                <w:szCs w:val="16"/>
+              </w:rPr>
+              <w:t>UF</w:t>
+            </w:r>
+          </w:p>
+          <w:p>
+            <w:pPr>
+              <w:pStyle w:val="PargrafodaLista"/>
+              <w:numPr>
+                <w:ilvl w:val="0"/>
+                <w:numId w:val="20"/>
+              </w:numPr>
+              <w:rPr>
+                <w:rFonts w:eastAsia="Courier New" w:cs="Arial"/>
+                <w:sz w:val="20"/>
+                <w:szCs w:val="16"/>
+              </w:rPr>
+            </w:pPr>
+            <w:r>
+              <w:rPr>
+                <w:rFonts w:eastAsia="Courier New" w:cs="Arial"/>
+                <w:sz w:val="20"/>
+                <w:szCs w:val="16"/>
+              </w:rPr>
+              <w:t>Listagem</w:t>
+            </w:r>
+          </w:p>
+          <w:p>
+            <w:pPr>
+              <w:pStyle w:val="PargrafodaLista"/>
+              <w:rPr>
+                <w:rFonts w:eastAsia="Courier New" w:cs="Arial"/>
+                <w:sz w:val="20"/>
+                <w:szCs w:val="16"/>
+              </w:rPr>
+            </w:pPr>
+            <w:r>
+              <w:rPr>
+                <w:rFonts w:eastAsia="Courier New" w:cs="Arial"/>
+                <w:sz w:val="20"/>
+                <w:szCs w:val="16"/>
+              </w:rPr>
+              <w:t xml:space="preserve">O sistema deve apresentar a listagem de </w:t>
+            </w:r>
+            <w:r>
+              <w:rPr>
+                <w:rFonts w:eastAsia="Courier New" w:cs="Arial"/>
+                <w:sz w:val="20"/>
+                <w:szCs w:val="16"/>
+              </w:rPr>
+              <w:t xml:space="preserve">clientes </w:t>
+            </w:r>
+            <w:r>
+              <w:rPr>
+                <w:rFonts w:eastAsia="Courier New" w:cs="Arial"/>
+                <w:sz w:val="20"/>
+                <w:szCs w:val="16"/>
+              </w:rPr>
+              <w:t>de acordo com os filtros aplicados e colunas selecionadas, exibindo o total de resultados encontrados.</w:t>
+            </w:r>
+          </w:p>
+          <w:p>
+            <w:pPr>
+              <w:pStyle w:val="PargrafodaLista"/>
+              <w:numPr>
+                <w:ilvl w:val="0"/>
+                <w:numId w:val="20"/>
+              </w:numPr>
+              <w:rPr>
+                <w:rFonts w:eastAsia="Courier New" w:cs="Arial"/>
+                <w:sz w:val="20"/>
+                <w:szCs w:val="16"/>
+              </w:rPr>
+            </w:pPr>
+            <w:r>
+              <w:rPr>
+                <w:rFonts w:eastAsia="Courier New" w:cs="Arial"/>
+                <w:sz w:val="20"/>
+                <w:szCs w:val="16"/>
+              </w:rPr>
+              <w:t>Exportações</w:t>
+            </w:r>
+          </w:p>
+          <w:p>
+            <w:pPr>
+              <w:pStyle w:val="PargrafodaLista"/>
+              <w:rPr>
+                <w:rFonts w:eastAsia="Courier New" w:cs="Arial"/>
+                <w:sz w:val="20"/>
+                <w:szCs w:val="16"/>
+              </w:rPr>
+            </w:pPr>
+            <w:r>
+              <w:rPr>
+                <w:rFonts w:eastAsia="Courier New" w:cs="Arial"/>
+                <w:sz w:val="20"/>
+                <w:szCs w:val="16"/>
+              </w:rPr>
+              <w:t>O relatório deve permitir exportação nos formatos:</w:t>
+            </w:r>
+          </w:p>
+          <w:p>
+            <w:pPr>
+              <w:pStyle w:val="PargrafodaLista"/>
+              <w:numPr>
+                <w:ilvl w:val="0"/>
+                <w:numId w:val="23"/>
+              </w:numPr>
+              <w:rPr>
+                <w:rFonts w:eastAsia="Courier New" w:cs="Arial"/>
+                <w:sz w:val="20"/>
+                <w:szCs w:val="16"/>
+              </w:rPr>
+            </w:pPr>
+            <w:r>
+              <w:rPr>
+                <w:rFonts w:eastAsia="Courier New" w:cs="Arial"/>
+                <w:sz w:val="20"/>
+                <w:szCs w:val="16"/>
+              </w:rPr>
+              <w:t>Excel (.</w:t>
+            </w:r>
+            <w:proofErr w:type="spellStart"/>
+            <w:r>
+              <w:rPr>
+                <w:rFonts w:eastAsia="Courier New" w:cs="Arial"/>
+                <w:sz w:val="20"/>
+                <w:szCs w:val="16"/>
+              </w:rPr>
+              <w:t>xlsx</w:t>
+            </w:r>
+            <w:proofErr w:type="spellEnd"/>
+            <w:r>
+              <w:rPr>
+                <w:rFonts w:eastAsia="Courier New" w:cs="Arial"/>
+                <w:sz w:val="20"/>
+                <w:szCs w:val="16"/>
+              </w:rPr>
+              <w:t>)</w:t>
+            </w:r>
+          </w:p>
+          <w:p>
+            <w:pPr>
+              <w:pStyle w:val="PargrafodaLista"/>
+              <w:numPr>
+                <w:ilvl w:val="0"/>
+                <w:numId w:val="23"/>
+              </w:numPr>
+              <w:rPr>
+                <w:rFonts w:eastAsia="Courier New" w:cs="Arial"/>
+                <w:sz w:val="20"/>
+                <w:szCs w:val="16"/>
+              </w:rPr>
+            </w:pPr>
+            <w:r>
+              <w:rPr>
+                <w:rFonts w:eastAsia="Courier New" w:cs="Arial"/>
+                <w:sz w:val="20"/>
+                <w:szCs w:val="16"/>
+              </w:rPr>
+              <w:t>PDF (.</w:t>
+            </w:r>
+            <w:proofErr w:type="spellStart"/>
+            <w:r>
+              <w:rPr>
+                <w:rFonts w:eastAsia="Courier New" w:cs="Arial"/>
+                <w:sz w:val="20"/>
+                <w:szCs w:val="16"/>
+              </w:rPr>
+              <w:t>pdf</w:t>
+            </w:r>
+            <w:proofErr w:type="spellEnd"/>
+            <w:r>
+              <w:rPr>
+                <w:rFonts w:eastAsia="Courier New" w:cs="Arial"/>
+                <w:sz w:val="20"/>
+                <w:szCs w:val="16"/>
+              </w:rPr>
+              <w:t>)</w:t>
+            </w:r>
+          </w:p>
+          <w:p>
+            <w:pPr>
+              <w:pStyle w:val="PargrafodaLista"/>
+              <w:rPr>
+                <w:rFonts w:eastAsia="Courier New" w:cs="Arial"/>
+                <w:sz w:val="20"/>
+                <w:szCs w:val="16"/>
+              </w:rPr>
+            </w:pPr>
+            <w:r>
+              <w:rPr>
+                <w:rFonts w:eastAsia="Courier New" w:cs="Arial"/>
+                <w:sz w:val="20"/>
+                <w:szCs w:val="16"/>
+              </w:rPr>
+              <w:t>O arquivo exportado (Excel ou PDF) deve conter automaticamente no cabeçalho:</w:t>
+            </w:r>
+          </w:p>
+          <w:p>
+            <w:pPr>
+              <w:pStyle w:val="PargrafodaLista"/>
+              <w:numPr>
+                <w:ilvl w:val="0"/>
+                <w:numId w:val="26"/>
+              </w:numPr>
+              <w:rPr>
+                <w:rFonts w:eastAsia="Courier New" w:cs="Arial"/>
+                <w:sz w:val="20"/>
+                <w:szCs w:val="16"/>
+              </w:rPr>
+            </w:pPr>
+            <w:r>
+              <w:rPr>
+                <w:rFonts w:eastAsia="Courier New" w:cs="Arial"/>
+                <w:sz w:val="20"/>
+                <w:szCs w:val="16"/>
+              </w:rPr>
+              <w:t xml:space="preserve">Título do relatório: “Relatório de </w:t>
+            </w:r>
+            <w:r>
+              <w:rPr>
+                <w:rFonts w:eastAsia="Courier New" w:cs="Arial"/>
+                <w:sz w:val="20"/>
+                <w:szCs w:val="16"/>
+              </w:rPr>
+              <w:t>Clientes</w:t>
+            </w:r>
+            <w:r>
+              <w:rPr>
+                <w:rFonts w:eastAsia="Courier New" w:cs="Arial"/>
+                <w:sz w:val="20"/>
+                <w:szCs w:val="16"/>
+              </w:rPr>
+              <w:t>”</w:t>
+            </w:r>
+          </w:p>
+          <w:p>
+            <w:pPr>
+              <w:pStyle w:val="PargrafodaLista"/>
+              <w:numPr>
+                <w:ilvl w:val="0"/>
+                <w:numId w:val="26"/>
+              </w:numPr>
+              <w:rPr>
+                <w:rFonts w:eastAsia="Courier New" w:cs="Arial"/>
+                <w:sz w:val="20"/>
+                <w:szCs w:val="16"/>
+              </w:rPr>
+            </w:pPr>
+            <w:r>
+              <w:rPr>
+                <w:rFonts w:eastAsia="Courier New" w:cs="Arial"/>
+                <w:sz w:val="20"/>
+                <w:szCs w:val="16"/>
+              </w:rPr>
+              <w:t>Filtros aplicados: todos os filtros ativos no momento da exportação</w:t>
+            </w:r>
+          </w:p>
+          <w:p>
+            <w:pPr>
+              <w:pStyle w:val="PargrafodaLista"/>
+              <w:numPr>
+                <w:ilvl w:val="0"/>
+                <w:numId w:val="26"/>
+              </w:numPr>
+              <w:rPr>
+                <w:rFonts w:eastAsia="Courier New" w:cs="Arial"/>
+                <w:sz w:val="20"/>
+                <w:szCs w:val="16"/>
+              </w:rPr>
+            </w:pPr>
+            <w:r>
+              <w:rPr>
+                <w:rFonts w:eastAsia="Courier New" w:cs="Arial"/>
+                <w:sz w:val="20"/>
+                <w:szCs w:val="16"/>
+              </w:rPr>
+              <w:t>Data e hora de emissão do relatório</w:t>
+            </w:r>
+          </w:p>
+          <w:p>
+            <w:pPr>
+              <w:pStyle w:val="PargrafodaLista"/>
+              <w:numPr>
+                <w:ilvl w:val="0"/>
+                <w:numId w:val="23"/>
+              </w:numPr>
+              <w:rPr>
+                <w:rFonts w:eastAsia="Courier New" w:cs="Arial"/>
+                <w:sz w:val="20"/>
+                <w:szCs w:val="16"/>
+              </w:rPr>
+            </w:pPr>
+            <w:r>
+              <w:rPr>
+                <w:rFonts w:eastAsia="Courier New" w:cs="Arial"/>
+                <w:sz w:val="20"/>
+                <w:szCs w:val="16"/>
+              </w:rPr>
+              <w:t>Logotipo da empresa (</w:t>
+            </w:r>
+            <w:r>
+              <w:rPr>
+                <w:rFonts w:eastAsia="Courier New" w:cs="Arial"/>
+                <w:sz w:val="20"/>
+                <w:szCs w:val="16"/>
+              </w:rPr>
+              <w:t xml:space="preserve">somente no PDF, </w:t>
+            </w:r>
+            <w:r>
+              <w:rPr>
+                <w:rFonts w:eastAsia="Courier New" w:cs="Arial"/>
+                <w:sz w:val="20"/>
+                <w:szCs w:val="16"/>
+              </w:rPr>
+              <w:t>a imagem fornecida será exibida no canto superior esquerdo ou direito, conforme padrão de layout)</w:t>
+            </w:r>
+          </w:p>
+          <w:p>
+            <w:pPr>
+              <w:pStyle w:val="PargrafodaLista"/>
+              <w:rPr>
+                <w:rFonts w:eastAsia="Courier New" w:cs="Arial"/>
+                <w:sz w:val="20"/>
+                <w:szCs w:val="16"/>
+              </w:rPr>
+            </w:pPr>
+            <w:r>
+              <w:rPr>
+                <w:rFonts w:eastAsia="Courier New" w:cs="Arial"/>
+                <w:sz w:val="20"/>
+                <w:szCs w:val="16"/>
+              </w:rPr>
+              <w:t>O rodapé do arquivo exportado deve conter obrigatoriamente:</w:t>
+            </w:r>
+          </w:p>
+          <w:p>
+            <w:pPr>
+              <w:pStyle w:val="PargrafodaLista"/>
+              <w:numPr>
+                <w:ilvl w:val="0"/>
+                <w:numId w:val="26"/>
+              </w:numPr>
+              <w:rPr>
+                <w:rFonts w:eastAsia="Courier New" w:cs="Arial"/>
+                <w:sz w:val="20"/>
+                <w:szCs w:val="16"/>
+              </w:rPr>
+            </w:pPr>
+            <w:r>
+              <w:rPr>
+                <w:rFonts w:eastAsia="Courier New" w:cs="Arial"/>
+                <w:sz w:val="20"/>
+                <w:szCs w:val="16"/>
+              </w:rPr>
+              <w:t xml:space="preserve">Razão Social: </w:t>
+            </w:r>
+            <w:proofErr w:type="spellStart"/>
+            <w:r>
+              <w:rPr>
+                <w:rFonts w:eastAsia="Courier New" w:cs="Arial"/>
+                <w:sz w:val="20"/>
+                <w:szCs w:val="16"/>
+              </w:rPr>
+              <w:t>Alvaro</w:t>
+            </w:r>
+            <w:proofErr w:type="spellEnd"/>
+            <w:r>
+              <w:rPr>
+                <w:rFonts w:eastAsia="Courier New" w:cs="Arial"/>
+                <w:sz w:val="20"/>
+                <w:szCs w:val="16"/>
+              </w:rPr>
+              <w:t xml:space="preserve"> </w:t>
+            </w:r>
+            <w:proofErr w:type="spellStart"/>
+            <w:r>
+              <w:rPr>
+                <w:rFonts w:eastAsia="Courier New" w:cs="Arial"/>
+                <w:sz w:val="20"/>
+                <w:szCs w:val="16"/>
+              </w:rPr>
+              <w:t>Shioji</w:t>
+            </w:r>
+            <w:proofErr w:type="spellEnd"/>
+            <w:r>
+              <w:rPr>
+                <w:rFonts w:eastAsia="Courier New" w:cs="Arial"/>
+                <w:sz w:val="20"/>
+                <w:szCs w:val="16"/>
+              </w:rPr>
+              <w:t xml:space="preserve"> Matsuda</w:t>
+            </w:r>
+          </w:p>
+          <w:p>
+            <w:pPr>
+              <w:pStyle w:val="PargrafodaLista"/>
+              <w:numPr>
+                <w:ilvl w:val="0"/>
+                <w:numId w:val="26"/>
+              </w:numPr>
+              <w:rPr>
+                <w:rFonts w:eastAsia="Courier New" w:cs="Arial"/>
+                <w:sz w:val="20"/>
+                <w:szCs w:val="16"/>
+              </w:rPr>
+            </w:pPr>
+            <w:r>
+              <w:rPr>
+                <w:rFonts w:eastAsia="Courier New" w:cs="Arial"/>
+                <w:sz w:val="20"/>
+                <w:szCs w:val="16"/>
+              </w:rPr>
+              <w:t>Nome Fantasia: Always System Manager</w:t>
+            </w:r>
+          </w:p>
+          <w:p>
+            <w:pPr>
+              <w:pStyle w:val="PargrafodaLista"/>
+              <w:numPr>
+                <w:ilvl w:val="0"/>
+                <w:numId w:val="26"/>
+              </w:numPr>
+              <w:rPr>
+                <w:rFonts w:eastAsia="Courier New" w:cs="Arial"/>
+                <w:sz w:val="20"/>
+                <w:szCs w:val="16"/>
+              </w:rPr>
+            </w:pPr>
+            <w:r>
+              <w:rPr>
+                <w:rFonts w:eastAsia="Courier New" w:cs="Arial"/>
+                <w:sz w:val="20"/>
+                <w:szCs w:val="16"/>
+              </w:rPr>
+              <w:lastRenderedPageBreak/>
+              <w:t>Número da página</w:t>
+            </w:r>
+            <w:r>
+              <w:rPr>
+                <w:rFonts w:eastAsia="Courier New" w:cs="Arial"/>
+                <w:sz w:val="20"/>
+                <w:szCs w:val="16"/>
+              </w:rPr>
+              <w:t xml:space="preserve"> (somente no PDF)</w:t>
+            </w:r>
+          </w:p>
+          <w:p>
+            <w:pPr>
+              <w:pStyle w:val="PargrafodaLista"/>
+              <w:numPr>
+                <w:ilvl w:val="0"/>
+                <w:numId w:val="20"/>
+              </w:numPr>
+              <w:rPr>
+                <w:rFonts w:eastAsia="Courier New" w:cs="Arial"/>
+                <w:sz w:val="20"/>
+                <w:szCs w:val="16"/>
+              </w:rPr>
+            </w:pPr>
+            <w:r>
+              <w:rPr>
+                <w:rFonts w:eastAsia="Courier New" w:cs="Arial"/>
+                <w:sz w:val="20"/>
+                <w:szCs w:val="16"/>
+              </w:rPr>
+              <w:t>Restrições</w:t>
+            </w:r>
+          </w:p>
+          <w:p>
+            <w:pPr>
+              <w:pStyle w:val="PargrafodaLista"/>
+              <w:numPr>
+                <w:ilvl w:val="0"/>
+                <w:numId w:val="24"/>
+              </w:numPr>
+              <w:rPr>
+                <w:rFonts w:eastAsia="Courier New" w:cs="Arial"/>
+                <w:sz w:val="20"/>
+                <w:szCs w:val="16"/>
+              </w:rPr>
+            </w:pPr>
+            <w:r>
+              <w:rPr>
+                <w:rFonts w:eastAsia="Courier New" w:cs="Arial"/>
+                <w:sz w:val="20"/>
+                <w:szCs w:val="16"/>
+              </w:rPr>
+              <w:t xml:space="preserve">Não é possível editar ou excluir </w:t>
+            </w:r>
+            <w:r>
+              <w:rPr>
+                <w:rFonts w:eastAsia="Courier New" w:cs="Arial"/>
+                <w:sz w:val="20"/>
+                <w:szCs w:val="16"/>
+              </w:rPr>
+              <w:t>clientes</w:t>
+            </w:r>
+            <w:r>
+              <w:rPr>
+                <w:rFonts w:eastAsia="Courier New" w:cs="Arial"/>
+                <w:sz w:val="20"/>
+                <w:szCs w:val="16"/>
+              </w:rPr>
+              <w:t xml:space="preserve"> nesta tela.</w:t>
+            </w:r>
+          </w:p>
+          <w:p>
+            <w:pPr>
+              <w:pStyle w:val="PargrafodaLista"/>
+              <w:numPr>
+                <w:ilvl w:val="0"/>
+                <w:numId w:val="24"/>
+              </w:numPr>
+              <w:rPr>
+                <w:rFonts w:eastAsia="Courier New" w:cs="Arial"/>
+                <w:sz w:val="20"/>
+                <w:szCs w:val="16"/>
+              </w:rPr>
+            </w:pPr>
+            <w:r>
+              <w:rPr>
+                <w:rFonts w:eastAsia="Courier New" w:cs="Arial"/>
+                <w:sz w:val="20"/>
+                <w:szCs w:val="16"/>
+              </w:rPr>
+              <w:t>Caso nenhum resultado seja encontrado, o sistema deve informar o usuário.</w:t>
+            </w:r>
+          </w:p>
+          <w:p>
+            <w:pPr>
+              <w:pStyle w:val="PargrafodaLista"/>
+              <w:numPr>
+                <w:ilvl w:val="0"/>
+                <w:numId w:val="24"/>
+              </w:numPr>
+              <w:rPr>
+                <w:rFonts w:eastAsia="Courier New" w:cs="Arial"/>
+                <w:sz w:val="20"/>
+                <w:szCs w:val="16"/>
+              </w:rPr>
+            </w:pPr>
+            <w:r>
+              <w:rPr>
+                <w:rFonts w:eastAsia="Courier New" w:cs="Arial"/>
+                <w:sz w:val="20"/>
+                <w:szCs w:val="16"/>
+              </w:rPr>
+              <w:t>A exportação deve respeitar filtros e colunas selecionadas no momento da ação.</w:t>
+            </w:r>
+          </w:p>
+          <w:p>
+            <w:pPr>
+              <w:rPr>
+                <w:rFonts w:eastAsia="Courier New" w:cs="Arial"/>
+                <w:sz w:val="20"/>
+                <w:szCs w:val="16"/>
+              </w:rPr>
+            </w:pPr>
+          </w:p>
+          <w:p>
+            <w:pPr>
+              <w:rPr>
+                <w:rFonts w:eastAsia="Calibri"/>
+                <w:b/>
+                <w:bCs/>
+                <w:sz w:val="20"/>
+                <w:szCs w:val="16"/>
+              </w:rPr>
+            </w:pPr>
+            <w:r>
+              <w:rPr>
+                <w:rFonts w:eastAsia="Calibri"/>
+                <w:b/>
+                <w:bCs/>
+                <w:sz w:val="20"/>
+                <w:szCs w:val="16"/>
+              </w:rPr>
+              <w:t>Detalhamento com protótipo</w:t>
+            </w:r>
+          </w:p>
+          <w:p>
+            <w:pPr>
+              <w:pStyle w:val="PargrafodaLista"/>
+              <w:numPr>
+                <w:ilvl w:val="0"/>
+                <w:numId w:val="25"/>
+              </w:numPr>
+              <w:rPr>
+                <w:rFonts w:eastAsia="Noto Sans Symbols"/>
+                <w:sz w:val="20"/>
+                <w:szCs w:val="16"/>
+              </w:rPr>
+            </w:pPr>
+            <w:r>
+              <w:rPr>
+                <w:rFonts w:eastAsia="Noto Sans Symbols"/>
+                <w:sz w:val="20"/>
+                <w:szCs w:val="16"/>
+              </w:rPr>
+              <w:t xml:space="preserve">Tela do Relatório de </w:t>
+            </w:r>
+            <w:r>
+              <w:rPr>
+                <w:rFonts w:eastAsia="Noto Sans Symbols"/>
+                <w:sz w:val="20"/>
+                <w:szCs w:val="16"/>
+              </w:rPr>
+              <w:t>Clientes</w:t>
+            </w:r>
+          </w:p>
+          <w:p>
+            <w:pPr>
+              <w:pStyle w:val="PargrafodaLista"/>
+              <w:jc w:val="center"/>
+              <w:rPr>
+                <w:rFonts w:eastAsia="Noto Sans Symbols"/>
+                <w:sz w:val="20"/>
+                <w:szCs w:val="16"/>
+              </w:rPr>
+            </w:pPr>
+            <w:r>
+              <w:rPr>
+                <w:rFonts w:eastAsia="Noto Sans Symbols"/>
+                <w:noProof/>
+                <w:sz w:val="20"/>
+                <w:szCs w:val="16"/>
+              </w:rPr>
+              <w:drawing>
+                <wp:inline distT="0" distB="0" distL="0" distR="0" wp14:anchorId="75F60EAD" wp14:editId="7B9E0658">
+                  <wp:extent cx="5400000" cy="2296800"/>
+                  <wp:effectExtent l="0" t="0" r="0" b="8255"/>
+                  <wp:docPr id="25" name="Imagem 25"/>
+                  <wp:cNvGraphicFramePr>
+                    <a:graphicFrameLocks xmlns:a="http://schemas.openxmlformats.org/drawingml/2006/main" noChangeAspect="1"/>
+                  </wp:cNvGraphicFramePr>
+                  <a:graphic xmlns:a="http://schemas.openxmlformats.org/drawingml/2006/main">
+                    <a:graphicData uri="http://schemas.openxmlformats.org/drawingml/2006/picture">
+                      <pic:pic xmlns:pic="http://schemas.openxmlformats.org/drawingml/2006/picture">
+                        <pic:nvPicPr>
+                          <pic:cNvPr id="1" name=""/>
+                          <pic:cNvPicPr/>
+                        </pic:nvPicPr>
+                        <pic:blipFill>
+                          <a:blip r:embed="rId72"/>
+                          <a:stretch>
+                            <a:fillRect/>
+                          </a:stretch>
+                        </pic:blipFill>
+                        <pic:spPr>
+                          <a:xfrm>
+                            <a:off x="0" y="0"/>
                             <a:ext cx="5400000" cy="2296800"/>
                           </a:xfrm>
                           <a:prstGeom prst="rect">
@@ -17389,10 +19140,10 @@
                 <w:szCs w:val="16"/>
               </w:rPr>
               <w:drawing>
-                <wp:inline distT="0" distB="0" distL="0" distR="0" wp14:anchorId="50040120" wp14:editId="34971309">
-                  <wp:extent cx="5349600" cy="554400"/>
-                  <wp:effectExtent l="0" t="0" r="3810" b="0"/>
-                  <wp:docPr id="71" name="Imagem 71"/>
+                <wp:inline distT="0" distB="0" distL="0" distR="0" wp14:anchorId="1275F11A" wp14:editId="4AE67706">
+                  <wp:extent cx="5389200" cy="979200"/>
+                  <wp:effectExtent l="0" t="0" r="2540" b="0"/>
+                  <wp:docPr id="48" name="Imagem 48"/>
                   <wp:cNvGraphicFramePr>
                     <a:graphicFrameLocks xmlns:a="http://schemas.openxmlformats.org/drawingml/2006/main" noChangeAspect="1"/>
                   </wp:cNvGraphicFramePr>
@@ -17400,33 +19151,23 @@
                     <a:graphicData uri="http://schemas.openxmlformats.org/drawingml/2006/picture">
                       <pic:pic xmlns:pic="http://schemas.openxmlformats.org/drawingml/2006/picture">
                         <pic:nvPicPr>
-                          <pic:cNvPr id="0" name="Picture 3"/>
-                          <pic:cNvPicPr>
-                            <a:picLocks noChangeAspect="1" noChangeArrowheads="1"/>
-                          </pic:cNvPicPr>
+                          <pic:cNvPr id="1" name=""/>
+                          <pic:cNvPicPr/>
                         </pic:nvPicPr>
                         <pic:blipFill>
-                          <a:blip r:embed="rId70" cstate="print">
-                            <a:extLst>
-                              <a:ext uri="{28A0092B-C50C-407E-A947-70E740481C1C}">
-                                <a14:useLocalDpi xmlns:a14="http://schemas.microsoft.com/office/drawing/2010/main" val="0"/>
-                              </a:ext>
-                            </a:extLst>
-                          </a:blip>
-                          <a:srcRect/>
+                          <a:blip r:embed="rId73"/>
                           <a:stretch>
                             <a:fillRect/>
                           </a:stretch>
                         </pic:blipFill>
-                        <pic:spPr bwMode="auto">
+                        <pic:spPr>
                           <a:xfrm>
                             <a:off x="0" y="0"/>
-                            <a:ext cx="5349600" cy="554400"/>
+                            <a:ext cx="5389200" cy="979200"/>
                           </a:xfrm>
                           <a:prstGeom prst="rect">
                             <a:avLst/>
                           </a:prstGeom>
-                          <a:noFill/>
                         </pic:spPr>
                       </pic:pic>
                     </a:graphicData>
@@ -17447,6 +19188,131 @@
           </w:p>
           <w:p>
             <w:pPr>
+              <w:jc w:val="center"/>
+              <w:rPr>
+                <w:rFonts w:eastAsia="Noto Sans Symbols"/>
+                <w:sz w:val="20"/>
+                <w:szCs w:val="16"/>
+              </w:rPr>
+            </w:pPr>
+          </w:p>
+          <w:p>
+            <w:pPr>
+              <w:jc w:val="center"/>
+              <w:rPr>
+                <w:rFonts w:eastAsia="Noto Sans Symbols"/>
+                <w:sz w:val="20"/>
+                <w:szCs w:val="16"/>
+              </w:rPr>
+            </w:pPr>
+          </w:p>
+          <w:p>
+            <w:pPr>
+              <w:jc w:val="center"/>
+              <w:rPr>
+                <w:rFonts w:eastAsia="Noto Sans Symbols"/>
+                <w:sz w:val="20"/>
+                <w:szCs w:val="16"/>
+              </w:rPr>
+            </w:pPr>
+          </w:p>
+          <w:p>
+            <w:pPr>
+              <w:jc w:val="center"/>
+              <w:rPr>
+                <w:rFonts w:eastAsia="Noto Sans Symbols"/>
+                <w:sz w:val="20"/>
+                <w:szCs w:val="16"/>
+              </w:rPr>
+            </w:pPr>
+          </w:p>
+          <w:p>
+            <w:pPr>
+              <w:jc w:val="center"/>
+              <w:rPr>
+                <w:rFonts w:eastAsia="Noto Sans Symbols"/>
+                <w:sz w:val="20"/>
+                <w:szCs w:val="16"/>
+              </w:rPr>
+            </w:pPr>
+          </w:p>
+          <w:p>
+            <w:pPr>
+              <w:jc w:val="center"/>
+              <w:rPr>
+                <w:rFonts w:eastAsia="Noto Sans Symbols"/>
+                <w:sz w:val="20"/>
+                <w:szCs w:val="16"/>
+              </w:rPr>
+            </w:pPr>
+          </w:p>
+          <w:p>
+            <w:pPr>
+              <w:jc w:val="center"/>
+              <w:rPr>
+                <w:rFonts w:eastAsia="Noto Sans Symbols"/>
+                <w:sz w:val="20"/>
+                <w:szCs w:val="16"/>
+              </w:rPr>
+            </w:pPr>
+          </w:p>
+          <w:p>
+            <w:pPr>
+              <w:jc w:val="center"/>
+              <w:rPr>
+                <w:rFonts w:eastAsia="Noto Sans Symbols"/>
+                <w:sz w:val="20"/>
+                <w:szCs w:val="16"/>
+              </w:rPr>
+            </w:pPr>
+          </w:p>
+          <w:p>
+            <w:pPr>
+              <w:rPr>
+                <w:rFonts w:eastAsia="Noto Sans Symbols"/>
+                <w:sz w:val="20"/>
+                <w:szCs w:val="16"/>
+              </w:rPr>
+            </w:pPr>
+          </w:p>
+          <w:p>
+            <w:pPr>
+              <w:rPr>
+                <w:rFonts w:eastAsia="Noto Sans Symbols"/>
+                <w:sz w:val="20"/>
+                <w:szCs w:val="16"/>
+              </w:rPr>
+            </w:pPr>
+          </w:p>
+          <w:p>
+            <w:pPr>
+              <w:rPr>
+                <w:rFonts w:eastAsia="Noto Sans Symbols"/>
+                <w:sz w:val="20"/>
+                <w:szCs w:val="16"/>
+              </w:rPr>
+            </w:pPr>
+          </w:p>
+          <w:p>
+            <w:pPr>
+              <w:rPr>
+                <w:rFonts w:eastAsia="Noto Sans Symbols"/>
+                <w:sz w:val="20"/>
+                <w:szCs w:val="16"/>
+              </w:rPr>
+            </w:pPr>
+          </w:p>
+          <w:p>
+            <w:pPr>
+              <w:rPr>
+                <w:rFonts w:eastAsia="Noto Sans Symbols"/>
+                <w:sz w:val="20"/>
+                <w:szCs w:val="16"/>
+              </w:rPr>
+            </w:pPr>
+          </w:p>
+          <w:p>
+            <w:pPr>
               <w:pStyle w:val="PargrafodaLista"/>
               <w:numPr>
                 <w:ilvl w:val="0"/>
@@ -17464,6 +19330,7 @@
                 <w:sz w:val="20"/>
                 <w:szCs w:val="16"/>
               </w:rPr>
+              <w:lastRenderedPageBreak/>
               <w:t>Exportação para PDF</w:t>
             </w:r>
           </w:p>
@@ -17485,10 +19352,10 @@
                 <w:szCs w:val="16"/>
               </w:rPr>
               <w:drawing>
-                <wp:inline distT="0" distB="0" distL="0" distR="0" wp14:anchorId="7DB3FA1B" wp14:editId="0E6C62A0">
-                  <wp:extent cx="5331600" cy="2376000"/>
-                  <wp:effectExtent l="0" t="0" r="2540" b="5715"/>
-                  <wp:docPr id="70" name="Imagem 70"/>
+                <wp:inline distT="0" distB="0" distL="0" distR="0" wp14:anchorId="66251F15" wp14:editId="1079B199">
+                  <wp:extent cx="5382000" cy="3344400"/>
+                  <wp:effectExtent l="0" t="0" r="0" b="8890"/>
+                  <wp:docPr id="55" name="Imagem 55"/>
                   <wp:cNvGraphicFramePr>
                     <a:graphicFrameLocks xmlns:a="http://schemas.openxmlformats.org/drawingml/2006/main" noChangeAspect="1"/>
                   </wp:cNvGraphicFramePr>
@@ -17496,33 +19363,23 @@
                     <a:graphicData uri="http://schemas.openxmlformats.org/drawingml/2006/picture">
                       <pic:pic xmlns:pic="http://schemas.openxmlformats.org/drawingml/2006/picture">
                         <pic:nvPicPr>
-                          <pic:cNvPr id="0" name="Picture 2"/>
-                          <pic:cNvPicPr>
-                            <a:picLocks noChangeAspect="1" noChangeArrowheads="1"/>
-                          </pic:cNvPicPr>
+                          <pic:cNvPr id="1" name=""/>
+                          <pic:cNvPicPr/>
                         </pic:nvPicPr>
                         <pic:blipFill>
-                          <a:blip r:embed="rId71">
-                            <a:extLst>
-                              <a:ext uri="{28A0092B-C50C-407E-A947-70E740481C1C}">
-                                <a14:useLocalDpi xmlns:a14="http://schemas.microsoft.com/office/drawing/2010/main" val="0"/>
-                              </a:ext>
-                            </a:extLst>
-                          </a:blip>
-                          <a:srcRect/>
+                          <a:blip r:embed="rId74"/>
                           <a:stretch>
                             <a:fillRect/>
                           </a:stretch>
                         </pic:blipFill>
-                        <pic:spPr bwMode="auto">
+                        <pic:spPr>
                           <a:xfrm>
                             <a:off x="0" y="0"/>
-                            <a:ext cx="5331600" cy="2376000"/>
+                            <a:ext cx="5382000" cy="3344400"/>
                           </a:xfrm>
                           <a:prstGeom prst="rect">
                             <a:avLst/>
                           </a:prstGeom>
-                          <a:noFill/>
                         </pic:spPr>
                       </pic:pic>
                     </a:graphicData>
@@ -17545,20 +19402,42 @@
     </w:tbl>
     <w:p>
       <w:pPr>
-        <w:pStyle w:val="Ttulo1"/>
-        <w:tabs>
-          <w:tab w:val="left" w:pos="2738"/>
-        </w:tabs>
+        <w:spacing w:after="240" w:line="259" w:lineRule="auto"/>
+        <w:rPr>
+          <w:b/>
+          <w:caps/>
+          <w:color w:val="2E75B5"/>
+          <w:sz w:val="32"/>
+          <w:szCs w:val="32"/>
+        </w:rPr>
       </w:pPr>
     </w:p>
     <w:p>
       <w:pPr>
-        <w:pStyle w:val="Ttulo1"/>
+        <w:spacing w:after="240" w:line="259" w:lineRule="auto"/>
+        <w:rPr>
+          <w:b/>
+          <w:caps/>
+          <w:color w:val="2E75B5"/>
+          <w:sz w:val="32"/>
+          <w:szCs w:val="32"/>
+        </w:rPr>
       </w:pPr>
       <w:r>
+        <w:rPr>
+          <w:b/>
+          <w:caps/>
+          <w:color w:val="2E75B5"/>
+          <w:sz w:val="32"/>
+          <w:szCs w:val="32"/>
+        </w:rPr>
         <w:br w:type="page"/>
       </w:r>
-      <w:bookmarkStart w:id="13" w:name="_Toc209377801"/>
+    </w:p>
+    <w:p>
+      <w:pPr>
+        <w:pStyle w:val="Ttulo1"/>
+      </w:pPr>
       <w:r>
         <w:lastRenderedPageBreak/>
         <w:t>3. PROJETO DE SOFTWARE</w:t>
@@ -17641,7 +19520,7 @@
                     <pic:cNvPicPr preferRelativeResize="0"/>
                   </pic:nvPicPr>
                   <pic:blipFill>
-                    <a:blip r:embed="rId72"/>
+                    <a:blip r:embed="rId75"/>
                     <a:srcRect/>
                     <a:stretch>
                       <a:fillRect/>
@@ -17719,7 +19598,7 @@
                     <pic:cNvPicPr preferRelativeResize="0"/>
                   </pic:nvPicPr>
                   <pic:blipFill>
-                    <a:blip r:embed="rId73"/>
+                    <a:blip r:embed="rId76"/>
                     <a:srcRect/>
                     <a:stretch>
                       <a:fillRect/>
@@ -17966,7 +19845,7 @@
                     <pic:cNvPicPr preferRelativeResize="0"/>
                   </pic:nvPicPr>
                   <pic:blipFill>
-                    <a:blip r:embed="rId74"/>
+                    <a:blip r:embed="rId77"/>
                     <a:srcRect/>
                     <a:stretch>
                       <a:fillRect/>
@@ -17991,7 +19870,7 @@
     </w:p>
     <w:p/>
     <w:sectPr>
-      <w:footerReference w:type="first" r:id="rId75"/>
+      <w:footerReference w:type="first" r:id="rId78"/>
       <w:pgSz w:w="11906" w:h="16838"/>
       <w:pgMar w:top="1418" w:right="851" w:bottom="1418" w:left="1418" w:header="709" w:footer="709" w:gutter="0"/>
       <w:pgNumType w:start="1"/>
@@ -18531,7 +20410,7 @@
   <w:abstractNum w:abstractNumId="5" w15:restartNumberingAfterBreak="0">
     <w:nsid w:val="1B9428DF"/>
     <w:multiLevelType w:val="hybridMultilevel"/>
-    <w:tmpl w:val="6B563C44"/>
+    <w:tmpl w:val="6ADE3F78"/>
     <w:lvl w:ilvl="0" w:tplc="04160003">
       <w:start w:val="1"/>
       <w:numFmt w:val="bullet"/>
@@ -19498,6 +21377,119 @@
     </w:lvl>
   </w:abstractNum>
   <w:abstractNum w:abstractNumId="14" w15:restartNumberingAfterBreak="0">
+    <w:nsid w:val="3AD54295"/>
+    <w:multiLevelType w:val="hybridMultilevel"/>
+    <w:tmpl w:val="FCC01CF8"/>
+    <w:lvl w:ilvl="0" w:tplc="04160003">
+      <w:start w:val="1"/>
+      <w:numFmt w:val="bullet"/>
+      <w:lvlText w:val="o"/>
+      <w:lvlJc w:val="left"/>
+      <w:pPr>
+        <w:ind w:left="1440" w:hanging="360"/>
+      </w:pPr>
+      <w:rPr>
+        <w:rFonts w:ascii="Courier New" w:hAnsi="Courier New" w:cs="Courier New" w:hint="default"/>
+      </w:rPr>
+    </w:lvl>
+    <w:lvl w:ilvl="1" w:tplc="04160003" w:tentative="1">
+      <w:start w:val="1"/>
+      <w:numFmt w:val="bullet"/>
+      <w:lvlText w:val="o"/>
+      <w:lvlJc w:val="left"/>
+      <w:pPr>
+        <w:ind w:left="2160" w:hanging="360"/>
+      </w:pPr>
+      <w:rPr>
+        <w:rFonts w:ascii="Courier New" w:hAnsi="Courier New" w:cs="Courier New" w:hint="default"/>
+      </w:rPr>
+    </w:lvl>
+    <w:lvl w:ilvl="2" w:tplc="04160005" w:tentative="1">
+      <w:start w:val="1"/>
+      <w:numFmt w:val="bullet"/>
+      <w:lvlText w:val=""/>
+      <w:lvlJc w:val="left"/>
+      <w:pPr>
+        <w:ind w:left="2880" w:hanging="360"/>
+      </w:pPr>
+      <w:rPr>
+        <w:rFonts w:ascii="Wingdings" w:hAnsi="Wingdings" w:hint="default"/>
+      </w:rPr>
+    </w:lvl>
+    <w:lvl w:ilvl="3" w:tplc="04160001" w:tentative="1">
+      <w:start w:val="1"/>
+      <w:numFmt w:val="bullet"/>
+      <w:lvlText w:val=""/>
+      <w:lvlJc w:val="left"/>
+      <w:pPr>
+        <w:ind w:left="3600" w:hanging="360"/>
+      </w:pPr>
+      <w:rPr>
+        <w:rFonts w:ascii="Symbol" w:hAnsi="Symbol" w:hint="default"/>
+      </w:rPr>
+    </w:lvl>
+    <w:lvl w:ilvl="4" w:tplc="04160003" w:tentative="1">
+      <w:start w:val="1"/>
+      <w:numFmt w:val="bullet"/>
+      <w:lvlText w:val="o"/>
+      <w:lvlJc w:val="left"/>
+      <w:pPr>
+        <w:ind w:left="4320" w:hanging="360"/>
+      </w:pPr>
+      <w:rPr>
+        <w:rFonts w:ascii="Courier New" w:hAnsi="Courier New" w:cs="Courier New" w:hint="default"/>
+      </w:rPr>
+    </w:lvl>
+    <w:lvl w:ilvl="5" w:tplc="04160005" w:tentative="1">
+      <w:start w:val="1"/>
+      <w:numFmt w:val="bullet"/>
+      <w:lvlText w:val=""/>
+      <w:lvlJc w:val="left"/>
+      <w:pPr>
+        <w:ind w:left="5040" w:hanging="360"/>
+      </w:pPr>
+      <w:rPr>
+        <w:rFonts w:ascii="Wingdings" w:hAnsi="Wingdings" w:hint="default"/>
+      </w:rPr>
+    </w:lvl>
+    <w:lvl w:ilvl="6" w:tplc="04160001" w:tentative="1">
+      <w:start w:val="1"/>
+      <w:numFmt w:val="bullet"/>
+      <w:lvlText w:val=""/>
+      <w:lvlJc w:val="left"/>
+      <w:pPr>
+        <w:ind w:left="5760" w:hanging="360"/>
+      </w:pPr>
+      <w:rPr>
+        <w:rFonts w:ascii="Symbol" w:hAnsi="Symbol" w:hint="default"/>
+      </w:rPr>
+    </w:lvl>
+    <w:lvl w:ilvl="7" w:tplc="04160003" w:tentative="1">
+      <w:start w:val="1"/>
+      <w:numFmt w:val="bullet"/>
+      <w:lvlText w:val="o"/>
+      <w:lvlJc w:val="left"/>
+      <w:pPr>
+        <w:ind w:left="6480" w:hanging="360"/>
+      </w:pPr>
+      <w:rPr>
+        <w:rFonts w:ascii="Courier New" w:hAnsi="Courier New" w:cs="Courier New" w:hint="default"/>
+      </w:rPr>
+    </w:lvl>
+    <w:lvl w:ilvl="8" w:tplc="04160005" w:tentative="1">
+      <w:start w:val="1"/>
+      <w:numFmt w:val="bullet"/>
+      <w:lvlText w:val=""/>
+      <w:lvlJc w:val="left"/>
+      <w:pPr>
+        <w:ind w:left="7200" w:hanging="360"/>
+      </w:pPr>
+      <w:rPr>
+        <w:rFonts w:ascii="Wingdings" w:hAnsi="Wingdings" w:hint="default"/>
+      </w:rPr>
+    </w:lvl>
+  </w:abstractNum>
+  <w:abstractNum w:abstractNumId="15" w15:restartNumberingAfterBreak="0">
     <w:nsid w:val="40083289"/>
     <w:multiLevelType w:val="hybridMultilevel"/>
     <w:tmpl w:val="E30AB254"/>
@@ -19610,7 +21602,7 @@
       </w:rPr>
     </w:lvl>
   </w:abstractNum>
-  <w:abstractNum w:abstractNumId="15" w15:restartNumberingAfterBreak="0">
+  <w:abstractNum w:abstractNumId="16" w15:restartNumberingAfterBreak="0">
     <w:nsid w:val="46B666FB"/>
     <w:multiLevelType w:val="multilevel"/>
     <w:tmpl w:val="F27AE70C"/>
@@ -19723,7 +21715,7 @@
       </w:rPr>
     </w:lvl>
   </w:abstractNum>
-  <w:abstractNum w:abstractNumId="16" w15:restartNumberingAfterBreak="0">
+  <w:abstractNum w:abstractNumId="17" w15:restartNumberingAfterBreak="0">
     <w:nsid w:val="481C1346"/>
     <w:multiLevelType w:val="hybridMultilevel"/>
     <w:tmpl w:val="67CC8AE4"/>
@@ -19812,7 +21804,7 @@
       </w:pPr>
     </w:lvl>
   </w:abstractNum>
-  <w:abstractNum w:abstractNumId="17" w15:restartNumberingAfterBreak="0">
+  <w:abstractNum w:abstractNumId="18" w15:restartNumberingAfterBreak="0">
     <w:nsid w:val="51A4545A"/>
     <w:multiLevelType w:val="hybridMultilevel"/>
     <w:tmpl w:val="A050AF5C"/>
@@ -19925,7 +21917,7 @@
       </w:rPr>
     </w:lvl>
   </w:abstractNum>
-  <w:abstractNum w:abstractNumId="18" w15:restartNumberingAfterBreak="0">
+  <w:abstractNum w:abstractNumId="19" w15:restartNumberingAfterBreak="0">
     <w:nsid w:val="5C3E105D"/>
     <w:multiLevelType w:val="multilevel"/>
     <w:tmpl w:val="0402F8FC"/>
@@ -20041,7 +22033,7 @@
       </w:rPr>
     </w:lvl>
   </w:abstractNum>
-  <w:abstractNum w:abstractNumId="19" w15:restartNumberingAfterBreak="0">
+  <w:abstractNum w:abstractNumId="20" w15:restartNumberingAfterBreak="0">
     <w:nsid w:val="5CB42BDA"/>
     <w:multiLevelType w:val="hybridMultilevel"/>
     <w:tmpl w:val="04A2F63E"/>
@@ -20154,7 +22146,7 @@
       </w:rPr>
     </w:lvl>
   </w:abstractNum>
-  <w:abstractNum w:abstractNumId="20" w15:restartNumberingAfterBreak="0">
+  <w:abstractNum w:abstractNumId="21" w15:restartNumberingAfterBreak="0">
     <w:nsid w:val="5E0375AD"/>
     <w:multiLevelType w:val="hybridMultilevel"/>
     <w:tmpl w:val="67CC8AE4"/>
@@ -20243,7 +22235,7 @@
       </w:pPr>
     </w:lvl>
   </w:abstractNum>
-  <w:abstractNum w:abstractNumId="21" w15:restartNumberingAfterBreak="0">
+  <w:abstractNum w:abstractNumId="22" w15:restartNumberingAfterBreak="0">
     <w:nsid w:val="61582B86"/>
     <w:multiLevelType w:val="hybridMultilevel"/>
     <w:tmpl w:val="ECF8AC3E"/>
@@ -20356,7 +22348,7 @@
       </w:rPr>
     </w:lvl>
   </w:abstractNum>
-  <w:abstractNum w:abstractNumId="22" w15:restartNumberingAfterBreak="0">
+  <w:abstractNum w:abstractNumId="23" w15:restartNumberingAfterBreak="0">
     <w:nsid w:val="64DE5D5D"/>
     <w:multiLevelType w:val="hybridMultilevel"/>
     <w:tmpl w:val="E0384724"/>
@@ -20469,7 +22461,7 @@
       </w:rPr>
     </w:lvl>
   </w:abstractNum>
-  <w:abstractNum w:abstractNumId="23" w15:restartNumberingAfterBreak="0">
+  <w:abstractNum w:abstractNumId="24" w15:restartNumberingAfterBreak="0">
     <w:nsid w:val="74F07A27"/>
     <w:multiLevelType w:val="hybridMultilevel"/>
     <w:tmpl w:val="1D8245D8"/>
@@ -20582,7 +22574,7 @@
       </w:rPr>
     </w:lvl>
   </w:abstractNum>
-  <w:abstractNum w:abstractNumId="24" w15:restartNumberingAfterBreak="0">
+  <w:abstractNum w:abstractNumId="25" w15:restartNumberingAfterBreak="0">
     <w:nsid w:val="7DB43C88"/>
     <w:multiLevelType w:val="hybridMultilevel"/>
     <w:tmpl w:val="67CC8AE4"/>
@@ -20672,7 +22664,7 @@
     </w:lvl>
   </w:abstractNum>
   <w:num w:numId="1">
-    <w:abstractNumId w:val="18"/>
+    <w:abstractNumId w:val="19"/>
   </w:num>
   <w:num w:numId="2">
     <w:abstractNumId w:val="6"/>
@@ -20681,22 +22673,22 @@
     <w:abstractNumId w:val="10"/>
   </w:num>
   <w:num w:numId="4">
-    <w:abstractNumId w:val="15"/>
+    <w:abstractNumId w:val="16"/>
   </w:num>
   <w:num w:numId="5">
     <w:abstractNumId w:val="7"/>
   </w:num>
   <w:num w:numId="6">
-    <w:abstractNumId w:val="14"/>
+    <w:abstractNumId w:val="15"/>
   </w:num>
   <w:num w:numId="7">
     <w:abstractNumId w:val="13"/>
   </w:num>
   <w:num w:numId="8">
-    <w:abstractNumId w:val="20"/>
+    <w:abstractNumId w:val="21"/>
   </w:num>
   <w:num w:numId="9">
-    <w:abstractNumId w:val="16"/>
+    <w:abstractNumId w:val="17"/>
   </w:num>
   <w:num w:numId="10">
     <w:abstractNumId w:val="12"/>
@@ -20708,7 +22700,7 @@
     <w:abstractNumId w:val="3"/>
   </w:num>
   <w:num w:numId="13">
-    <w:abstractNumId w:val="17"/>
+    <w:abstractNumId w:val="18"/>
   </w:num>
   <w:num w:numId="14">
     <w:abstractNumId w:val="0"/>
@@ -20717,25 +22709,25 @@
     <w:abstractNumId w:val="1"/>
   </w:num>
   <w:num w:numId="16">
-    <w:abstractNumId w:val="22"/>
+    <w:abstractNumId w:val="23"/>
   </w:num>
   <w:num w:numId="17">
-    <w:abstractNumId w:val="23"/>
+    <w:abstractNumId w:val="24"/>
   </w:num>
   <w:num w:numId="18">
     <w:abstractNumId w:val="4"/>
   </w:num>
   <w:num w:numId="19">
-    <w:abstractNumId w:val="24"/>
+    <w:abstractNumId w:val="25"/>
   </w:num>
   <w:num w:numId="20">
     <w:abstractNumId w:val="11"/>
   </w:num>
   <w:num w:numId="21">
-    <w:abstractNumId w:val="19"/>
+    <w:abstractNumId w:val="20"/>
   </w:num>
   <w:num w:numId="22">
-    <w:abstractNumId w:val="21"/>
+    <w:abstractNumId w:val="22"/>
   </w:num>
   <w:num w:numId="23">
     <w:abstractNumId w:val="5"/>
@@ -20745,6 +22737,9 @@
   </w:num>
   <w:num w:numId="25">
     <w:abstractNumId w:val="2"/>
+  </w:num>
+  <w:num w:numId="26">
+    <w:abstractNumId w:val="14"/>
   </w:num>
 </w:numbering>
 </file>

</xml_diff>

<commit_message>
Data de admissão padrão e validação
Adicione a função auxiliar `getTodayDateString` e use-a para definir o valor padrão de `dataAdmissao` para novos funcionários e ao redefinir o formulário. Ajuste a validação para tratar uma data de admissão vazia como a data atual (mas ainda impeça datas futuras), assegure que a carga útil salva inclua a data padrão caso ela seja omitida e desabilite o campo de data ao criar um novo funcionário, atualizando o rótulo para indicar que ele é preenchido automaticamente na criação. Faça uma pequena limpeza no formulário/validação relacionada ao tratamento da data de admissão.
</commit_message>
<xml_diff>
--- a/Documentação/ERS.docx
+++ b/Documentação/ERS.docx
@@ -1,6 +1,6 @@
 
 <file path=word/document.xml><?xml version="1.0" encoding="utf-8"?>
-<w:document xmlns:wpc="http://schemas.microsoft.com/office/word/2010/wordprocessingCanvas" xmlns:cx="http://schemas.microsoft.com/office/drawing/2014/chartex" xmlns:cx1="http://schemas.microsoft.com/office/drawing/2015/9/8/chartex" xmlns:cx2="http://schemas.microsoft.com/office/drawing/2015/10/21/chartex" xmlns:cx3="http://schemas.microsoft.com/office/drawing/2016/5/9/chartex" xmlns:cx4="http://schemas.microsoft.com/office/drawing/2016/5/10/chartex" xmlns:cx5="http://schemas.microsoft.com/office/drawing/2016/5/11/chartex" xmlns:cx6="http://schemas.microsoft.com/office/drawing/2016/5/12/chartex" xmlns:cx7="http://schemas.microsoft.com/office/drawing/2016/5/13/chartex" xmlns:cx8="http://schemas.microsoft.com/office/drawing/2016/5/14/chartex" xmlns:mc="http://schemas.openxmlformats.org/markup-compatibility/2006" xmlns:aink="http://schemas.microsoft.com/office/drawing/2016/ink" xmlns:am3d="http://schemas.microsoft.com/office/drawing/2017/model3d" xmlns:o="urn:schemas-microsoft-com:office:office" xmlns:r="http://schemas.openxmlformats.org/officeDocument/2006/relationships" xmlns:m="http://schemas.openxmlformats.org/officeDocument/2006/math" xmlns:v="urn:schemas-microsoft-com:vml" xmlns:wp14="http://schemas.microsoft.com/office/word/2010/wordprocessingDrawing" xmlns:wp="http://schemas.openxmlformats.org/drawingml/2006/wordprocessingDrawing" xmlns:w10="urn:schemas-microsoft-com:office:word" xmlns:w="http://schemas.openxmlformats.org/wordprocessingml/2006/main" xmlns:w14="http://schemas.microsoft.com/office/word/2010/wordml" xmlns:w15="http://schemas.microsoft.com/office/word/2012/wordml" xmlns:w16cex="http://schemas.microsoft.com/office/word/2018/wordml/cex" xmlns:w16cid="http://schemas.microsoft.com/office/word/2016/wordml/cid" xmlns:w16="http://schemas.microsoft.com/office/word/2018/wordml" xmlns:w16sdtdh="http://schemas.microsoft.com/office/word/2020/wordml/sdtdatahash" xmlns:w16se="http://schemas.microsoft.com/office/word/2015/wordml/symex" xmlns:wpg="http://schemas.microsoft.com/office/word/2010/wordprocessingGroup" xmlns:wpi="http://schemas.microsoft.com/office/word/2010/wordprocessingInk" xmlns:wne="http://schemas.microsoft.com/office/word/2006/wordml" xmlns:wps="http://schemas.microsoft.com/office/word/2010/wordprocessingShape" mc:Ignorable="w14 w15 w16se w16cid w16 w16cex w16sdtdh wp14">
+<w:document xmlns:wpc="http://schemas.microsoft.com/office/word/2010/wordprocessingCanvas" xmlns:cx="http://schemas.microsoft.com/office/drawing/2014/chartex" xmlns:cx1="http://schemas.microsoft.com/office/drawing/2015/9/8/chartex" xmlns:mc="http://schemas.openxmlformats.org/markup-compatibility/2006" xmlns:o="urn:schemas-microsoft-com:office:office" xmlns:r="http://schemas.openxmlformats.org/officeDocument/2006/relationships" xmlns:m="http://schemas.openxmlformats.org/officeDocument/2006/math" xmlns:v="urn:schemas-microsoft-com:vml" xmlns:wp14="http://schemas.microsoft.com/office/word/2010/wordprocessingDrawing" xmlns:wp="http://schemas.openxmlformats.org/drawingml/2006/wordprocessingDrawing" xmlns:w10="urn:schemas-microsoft-com:office:word" xmlns:w="http://schemas.openxmlformats.org/wordprocessingml/2006/main" xmlns:w14="http://schemas.microsoft.com/office/word/2010/wordml" xmlns:w15="http://schemas.microsoft.com/office/word/2012/wordml" xmlns:w16se="http://schemas.microsoft.com/office/word/2015/wordml/symex" xmlns:wpg="http://schemas.microsoft.com/office/word/2010/wordprocessingGroup" xmlns:wpi="http://schemas.microsoft.com/office/word/2010/wordprocessingInk" xmlns:wne="http://schemas.microsoft.com/office/word/2006/wordml" xmlns:wps="http://schemas.microsoft.com/office/word/2010/wordprocessingShape" mc:Ignorable="w14 w15 w16se wp14">
   <w:body>
     <w:tbl>
       <w:tblPr>
@@ -20,6 +20,8 @@
             <w:tcW w:w="5046" w:type="dxa"/>
           </w:tcPr>
           <w:p>
+            <w:bookmarkStart w:id="0" w:name="_GoBack"/>
+            <w:bookmarkEnd w:id="0"/>
             <w:r>
               <w:rPr>
                 <w:noProof/>
@@ -174,13 +176,45 @@
     <w:p>
       <w:pPr>
         <w:jc w:val="center"/>
-      </w:pPr>
+        <w:rPr>
+          <w:lang w:val="en-US"/>
+        </w:rPr>
+      </w:pPr>
+      <w:proofErr w:type="gramStart"/>
       <w:r>
         <w:rPr>
           <w:sz w:val="32"/>
           <w:szCs w:val="28"/>
+          <w:lang w:val="en-US"/>
         </w:rPr>
-        <w:t>2º Semestre/2025</w:t>
+        <w:t>2</w:t>
+      </w:r>
+      <w:proofErr w:type="gramEnd"/>
+      <w:r>
+        <w:rPr>
+          <w:sz w:val="32"/>
+          <w:szCs w:val="28"/>
+          <w:lang w:val="en-US"/>
+        </w:rPr>
+        <w:t xml:space="preserve">º </w:t>
+      </w:r>
+      <w:proofErr w:type="spellStart"/>
+      <w:r>
+        <w:rPr>
+          <w:sz w:val="32"/>
+          <w:szCs w:val="28"/>
+          <w:lang w:val="en-US"/>
+        </w:rPr>
+        <w:t>Semestre</w:t>
+      </w:r>
+      <w:proofErr w:type="spellEnd"/>
+      <w:r>
+        <w:rPr>
+          <w:sz w:val="32"/>
+          <w:szCs w:val="28"/>
+          <w:lang w:val="en-US"/>
+        </w:rPr>
+        <w:t>/2025</w:t>
       </w:r>
     </w:p>
     <w:p>
@@ -189,12 +223,14 @@
         <w:rPr>
           <w:sz w:val="28"/>
           <w:szCs w:val="24"/>
+          <w:lang w:val="en-US"/>
         </w:rPr>
       </w:pPr>
       <w:r>
         <w:rPr>
           <w:sz w:val="28"/>
           <w:szCs w:val="24"/>
+          <w:lang w:val="en-US"/>
         </w:rPr>
         <w:t>Always System Manager</w:t>
       </w:r>
@@ -205,24 +241,17 @@
         <w:rPr>
           <w:sz w:val="28"/>
           <w:szCs w:val="24"/>
+          <w:lang w:val="en-US"/>
         </w:rPr>
       </w:pPr>
       <w:r>
         <w:rPr>
           <w:sz w:val="28"/>
           <w:szCs w:val="24"/>
+          <w:lang w:val="en-US"/>
         </w:rPr>
-        <w:t xml:space="preserve">ASM </w:t>
+        <w:t>ASM Tasks</w:t>
       </w:r>
-      <w:proofErr w:type="spellStart"/>
-      <w:r>
-        <w:rPr>
-          <w:sz w:val="28"/>
-          <w:szCs w:val="24"/>
-        </w:rPr>
-        <w:t>Tasks</w:t>
-      </w:r>
-      <w:proofErr w:type="spellEnd"/>
     </w:p>
     <w:p>
       <w:pPr>
@@ -230,6 +259,7 @@
         <w:rPr>
           <w:sz w:val="28"/>
           <w:szCs w:val="24"/>
+          <w:lang w:val="en-US"/>
         </w:rPr>
       </w:pPr>
     </w:p>
@@ -239,6 +269,7 @@
         <w:rPr>
           <w:sz w:val="28"/>
           <w:szCs w:val="24"/>
+          <w:lang w:val="en-US"/>
         </w:rPr>
       </w:pPr>
     </w:p>
@@ -248,6 +279,7 @@
         <w:rPr>
           <w:sz w:val="28"/>
           <w:szCs w:val="24"/>
+          <w:lang w:val="en-US"/>
         </w:rPr>
       </w:pPr>
     </w:p>
@@ -1117,7 +1149,7 @@
                 <w:noProof/>
                 <w:webHidden/>
               </w:rPr>
-              <w:t>6</w:t>
+              <w:t>5</w:t>
             </w:r>
             <w:r>
               <w:rPr>
@@ -1188,7 +1220,7 @@
                 <w:noProof/>
                 <w:webHidden/>
               </w:rPr>
-              <w:t>6</w:t>
+              <w:t>5</w:t>
             </w:r>
             <w:r>
               <w:rPr>
@@ -1259,7 +1291,7 @@
                 <w:noProof/>
                 <w:webHidden/>
               </w:rPr>
-              <w:t>7</w:t>
+              <w:t>6</w:t>
             </w:r>
             <w:r>
               <w:rPr>
@@ -1401,7 +1433,7 @@
                 <w:noProof/>
                 <w:webHidden/>
               </w:rPr>
-              <w:t>10</w:t>
+              <w:t>43</w:t>
             </w:r>
             <w:r>
               <w:rPr>
@@ -1472,7 +1504,7 @@
                 <w:noProof/>
                 <w:webHidden/>
               </w:rPr>
-              <w:t>10</w:t>
+              <w:t>46</w:t>
             </w:r>
             <w:r>
               <w:rPr>
@@ -1543,7 +1575,7 @@
                 <w:noProof/>
                 <w:webHidden/>
               </w:rPr>
-              <w:t>10</w:t>
+              <w:t>46</w:t>
             </w:r>
             <w:r>
               <w:rPr>
@@ -1614,7 +1646,7 @@
                 <w:noProof/>
                 <w:webHidden/>
               </w:rPr>
-              <w:t>12</w:t>
+              <w:t>48</w:t>
             </w:r>
             <w:r>
               <w:rPr>
@@ -1685,7 +1717,7 @@
                 <w:noProof/>
                 <w:webHidden/>
               </w:rPr>
-              <w:t>13</w:t>
+              <w:t>49</w:t>
             </w:r>
             <w:r>
               <w:rPr>
@@ -1722,22 +1754,22 @@
       <w:pPr>
         <w:pStyle w:val="Ttulo1"/>
       </w:pPr>
-      <w:bookmarkStart w:id="0" w:name="_Toc209377788"/>
+      <w:bookmarkStart w:id="1" w:name="_Toc209377788"/>
       <w:r>
         <w:lastRenderedPageBreak/>
         <w:t>1. INTRODUÇÃO</w:t>
       </w:r>
-      <w:bookmarkEnd w:id="0"/>
+      <w:bookmarkEnd w:id="1"/>
     </w:p>
     <w:p>
       <w:pPr>
         <w:pStyle w:val="Ttulo2"/>
       </w:pPr>
-      <w:bookmarkStart w:id="1" w:name="_Toc209377789"/>
+      <w:bookmarkStart w:id="2" w:name="_Toc209377789"/>
       <w:r>
         <w:t>1.1 Objetivo</w:t>
       </w:r>
-      <w:bookmarkEnd w:id="1"/>
+      <w:bookmarkEnd w:id="2"/>
     </w:p>
     <w:p>
       <w:r>
@@ -1762,11 +1794,11 @@
       <w:pPr>
         <w:pStyle w:val="Ttulo2"/>
       </w:pPr>
-      <w:bookmarkStart w:id="2" w:name="_Toc209377790"/>
+      <w:bookmarkStart w:id="3" w:name="_Toc209377790"/>
       <w:r>
         <w:t>1.2 Escopo</w:t>
       </w:r>
-      <w:bookmarkEnd w:id="2"/>
+      <w:bookmarkEnd w:id="3"/>
     </w:p>
     <w:p>
       <w:r>
@@ -1876,12 +1908,12 @@
       <w:pPr>
         <w:pStyle w:val="Ttulo2"/>
       </w:pPr>
-      <w:bookmarkStart w:id="3" w:name="_Toc209377791"/>
+      <w:bookmarkStart w:id="4" w:name="_Toc209377791"/>
       <w:r>
         <w:lastRenderedPageBreak/>
         <w:t>1.3 Definições, Siglas e Abreviações</w:t>
       </w:r>
-      <w:bookmarkEnd w:id="3"/>
+      <w:bookmarkEnd w:id="4"/>
     </w:p>
     <w:p>
       <w:pPr>
@@ -1977,11 +2009,11 @@
       <w:pPr>
         <w:pStyle w:val="Ttulo2"/>
       </w:pPr>
-      <w:bookmarkStart w:id="4" w:name="_Toc209377792"/>
+      <w:bookmarkStart w:id="5" w:name="_Toc209377792"/>
       <w:r>
         <w:t>1.4 Referências</w:t>
       </w:r>
-      <w:bookmarkEnd w:id="4"/>
+      <w:bookmarkEnd w:id="5"/>
     </w:p>
     <w:tbl>
       <w:tblPr>
@@ -2294,21 +2326,21 @@
       <w:pPr>
         <w:pStyle w:val="Ttulo2"/>
       </w:pPr>
-      <w:bookmarkStart w:id="5" w:name="_Toc209377793"/>
+      <w:bookmarkStart w:id="6" w:name="_Toc209377793"/>
       <w:r>
         <w:t>1.5 Informações Adicionais</w:t>
       </w:r>
-      <w:bookmarkEnd w:id="5"/>
+      <w:bookmarkEnd w:id="6"/>
     </w:p>
     <w:p>
       <w:pPr>
         <w:pStyle w:val="Ttulo3"/>
       </w:pPr>
-      <w:bookmarkStart w:id="6" w:name="_Toc209377794"/>
+      <w:bookmarkStart w:id="7" w:name="_Toc209377794"/>
       <w:r>
         <w:t>1.5.1 Dados da Instituição</w:t>
       </w:r>
-      <w:bookmarkEnd w:id="6"/>
+      <w:bookmarkEnd w:id="7"/>
     </w:p>
     <w:p>
       <w:r>
@@ -2364,11 +2396,11 @@
       <w:pPr>
         <w:pStyle w:val="Ttulo3"/>
       </w:pPr>
-      <w:bookmarkStart w:id="7" w:name="_Toc209377795"/>
+      <w:bookmarkStart w:id="8" w:name="_Toc209377795"/>
       <w:r>
         <w:t>1.5.2 Dados da Empresa</w:t>
       </w:r>
-      <w:bookmarkEnd w:id="7"/>
+      <w:bookmarkEnd w:id="8"/>
     </w:p>
     <w:p>
       <w:r>
@@ -2512,11 +2544,11 @@
       <w:pPr>
         <w:pStyle w:val="Ttulo2"/>
       </w:pPr>
-      <w:bookmarkStart w:id="8" w:name="_Toc209377796"/>
+      <w:bookmarkStart w:id="9" w:name="_Toc209377796"/>
       <w:r>
         <w:t>1.6 Visão Geral</w:t>
       </w:r>
-      <w:bookmarkEnd w:id="8"/>
+      <w:bookmarkEnd w:id="9"/>
     </w:p>
     <w:p>
       <w:r>
@@ -2530,22 +2562,22 @@
       <w:pPr>
         <w:pStyle w:val="Ttulo1"/>
       </w:pPr>
-      <w:bookmarkStart w:id="9" w:name="_Toc209377797"/>
+      <w:bookmarkStart w:id="10" w:name="_Toc209377797"/>
       <w:r>
         <w:lastRenderedPageBreak/>
         <w:t>2. REQUISITOS DE SOFTWARE</w:t>
       </w:r>
-      <w:bookmarkEnd w:id="9"/>
+      <w:bookmarkEnd w:id="10"/>
     </w:p>
     <w:p>
       <w:pPr>
         <w:pStyle w:val="Ttulo2"/>
       </w:pPr>
-      <w:bookmarkStart w:id="10" w:name="_Toc209377798"/>
+      <w:bookmarkStart w:id="11" w:name="_Toc209377798"/>
       <w:r>
         <w:t>2.1 Lista de Funções/Estórias de Usuários</w:t>
       </w:r>
-      <w:bookmarkEnd w:id="10"/>
+      <w:bookmarkEnd w:id="11"/>
     </w:p>
     <w:tbl>
       <w:tblPr>
@@ -2884,12 +2916,21 @@
           </w:tcPr>
           <w:p>
             <w:pPr>
-              <w:rPr>
-                <w:rFonts w:eastAsia="Calibri"/>
-                <w:sz w:val="18"/>
-                <w:szCs w:val="18"/>
-              </w:rPr>
-            </w:pPr>
+              <w:jc w:val="center"/>
+              <w:rPr>
+                <w:rFonts w:eastAsia="Calibri"/>
+                <w:sz w:val="18"/>
+                <w:szCs w:val="18"/>
+              </w:rPr>
+            </w:pPr>
+            <w:r>
+              <w:rPr>
+                <w:rFonts w:eastAsia="Calibri"/>
+                <w:sz w:val="18"/>
+                <w:szCs w:val="18"/>
+              </w:rPr>
+              <w:t>Avaliado e Finalizado</w:t>
+            </w:r>
           </w:p>
         </w:tc>
       </w:tr>
@@ -3060,11 +3101,19 @@
           </w:tcPr>
           <w:p>
             <w:pPr>
-              <w:rPr>
-                <w:sz w:val="18"/>
-                <w:szCs w:val="18"/>
-              </w:rPr>
-            </w:pPr>
+              <w:jc w:val="center"/>
+              <w:rPr>
+                <w:sz w:val="18"/>
+                <w:szCs w:val="18"/>
+              </w:rPr>
+            </w:pPr>
+            <w:r>
+              <w:rPr>
+                <w:sz w:val="18"/>
+                <w:szCs w:val="18"/>
+              </w:rPr>
+              <w:t>Avaliado e Finalizado</w:t>
+            </w:r>
           </w:p>
         </w:tc>
       </w:tr>
@@ -3235,11 +3284,19 @@
           </w:tcPr>
           <w:p>
             <w:pPr>
-              <w:rPr>
-                <w:sz w:val="18"/>
-                <w:szCs w:val="18"/>
-              </w:rPr>
-            </w:pPr>
+              <w:jc w:val="center"/>
+              <w:rPr>
+                <w:sz w:val="18"/>
+                <w:szCs w:val="18"/>
+              </w:rPr>
+            </w:pPr>
+            <w:r>
+              <w:rPr>
+                <w:sz w:val="18"/>
+                <w:szCs w:val="18"/>
+              </w:rPr>
+              <w:t>Avaliado e Finalizado</w:t>
+            </w:r>
           </w:p>
         </w:tc>
       </w:tr>
@@ -3424,11 +3481,19 @@
           </w:tcPr>
           <w:p>
             <w:pPr>
-              <w:rPr>
-                <w:sz w:val="18"/>
-                <w:szCs w:val="18"/>
-              </w:rPr>
-            </w:pPr>
+              <w:jc w:val="center"/>
+              <w:rPr>
+                <w:sz w:val="18"/>
+                <w:szCs w:val="18"/>
+              </w:rPr>
+            </w:pPr>
+            <w:r>
+              <w:rPr>
+                <w:sz w:val="18"/>
+                <w:szCs w:val="18"/>
+              </w:rPr>
+              <w:t>Avaliado e Finalizado</w:t>
+            </w:r>
           </w:p>
         </w:tc>
       </w:tr>
@@ -3598,11 +3663,19 @@
           </w:tcPr>
           <w:p>
             <w:pPr>
-              <w:rPr>
-                <w:sz w:val="18"/>
-                <w:szCs w:val="18"/>
-              </w:rPr>
-            </w:pPr>
+              <w:jc w:val="center"/>
+              <w:rPr>
+                <w:sz w:val="18"/>
+                <w:szCs w:val="18"/>
+              </w:rPr>
+            </w:pPr>
+            <w:r>
+              <w:rPr>
+                <w:sz w:val="18"/>
+                <w:szCs w:val="18"/>
+              </w:rPr>
+              <w:t>Avaliado e Finalizado</w:t>
+            </w:r>
           </w:p>
         </w:tc>
       </w:tr>
@@ -3789,11 +3862,19 @@
           </w:tcPr>
           <w:p>
             <w:pPr>
-              <w:rPr>
-                <w:sz w:val="18"/>
-                <w:szCs w:val="18"/>
-              </w:rPr>
-            </w:pPr>
+              <w:jc w:val="center"/>
+              <w:rPr>
+                <w:sz w:val="18"/>
+                <w:szCs w:val="18"/>
+              </w:rPr>
+            </w:pPr>
+            <w:r>
+              <w:rPr>
+                <w:sz w:val="18"/>
+                <w:szCs w:val="18"/>
+              </w:rPr>
+              <w:t>Avaliado e Finalizado</w:t>
+            </w:r>
           </w:p>
         </w:tc>
       </w:tr>
@@ -3948,6 +4029,7 @@
           </w:tcPr>
           <w:p>
             <w:pPr>
+              <w:jc w:val="center"/>
               <w:rPr>
                 <w:sz w:val="18"/>
                 <w:szCs w:val="18"/>
@@ -4107,6 +4189,7 @@
           </w:tcPr>
           <w:p>
             <w:pPr>
+              <w:jc w:val="center"/>
               <w:rPr>
                 <w:sz w:val="18"/>
                 <w:szCs w:val="18"/>
@@ -4266,6 +4349,7 @@
           </w:tcPr>
           <w:p>
             <w:pPr>
+              <w:jc w:val="center"/>
               <w:rPr>
                 <w:sz w:val="18"/>
                 <w:szCs w:val="18"/>
@@ -4426,6 +4510,7 @@
           </w:tcPr>
           <w:p>
             <w:pPr>
+              <w:jc w:val="center"/>
               <w:rPr>
                 <w:sz w:val="18"/>
                 <w:szCs w:val="18"/>
@@ -4584,6 +4669,7 @@
           </w:tcPr>
           <w:p>
             <w:pPr>
+              <w:jc w:val="center"/>
               <w:rPr>
                 <w:sz w:val="18"/>
                 <w:szCs w:val="18"/>
@@ -4742,6 +4828,7 @@
           </w:tcPr>
           <w:p>
             <w:pPr>
+              <w:jc w:val="center"/>
               <w:rPr>
                 <w:sz w:val="18"/>
                 <w:szCs w:val="18"/>
@@ -4902,6 +4989,7 @@
           </w:tcPr>
           <w:p>
             <w:pPr>
+              <w:jc w:val="center"/>
               <w:rPr>
                 <w:sz w:val="18"/>
                 <w:szCs w:val="18"/>
@@ -5061,6 +5149,7 @@
           </w:tcPr>
           <w:p>
             <w:pPr>
+              <w:jc w:val="center"/>
               <w:rPr>
                 <w:sz w:val="18"/>
                 <w:szCs w:val="18"/>
@@ -5226,11 +5315,19 @@
           </w:tcPr>
           <w:p>
             <w:pPr>
-              <w:rPr>
-                <w:sz w:val="18"/>
-                <w:szCs w:val="18"/>
-              </w:rPr>
-            </w:pPr>
+              <w:jc w:val="center"/>
+              <w:rPr>
+                <w:sz w:val="18"/>
+                <w:szCs w:val="18"/>
+              </w:rPr>
+            </w:pPr>
+            <w:r>
+              <w:rPr>
+                <w:sz w:val="18"/>
+                <w:szCs w:val="18"/>
+              </w:rPr>
+              <w:t>Avaliado e Finalizado</w:t>
+            </w:r>
           </w:p>
         </w:tc>
       </w:tr>
@@ -5399,11 +5496,19 @@
           </w:tcPr>
           <w:p>
             <w:pPr>
-              <w:rPr>
-                <w:sz w:val="18"/>
-                <w:szCs w:val="18"/>
-              </w:rPr>
-            </w:pPr>
+              <w:jc w:val="center"/>
+              <w:rPr>
+                <w:sz w:val="18"/>
+                <w:szCs w:val="18"/>
+              </w:rPr>
+            </w:pPr>
+            <w:r>
+              <w:rPr>
+                <w:sz w:val="18"/>
+                <w:szCs w:val="18"/>
+              </w:rPr>
+              <w:t>Avaliado e Finalizado</w:t>
+            </w:r>
           </w:p>
         </w:tc>
       </w:tr>
@@ -5582,6 +5687,7 @@
           </w:tcPr>
           <w:p>
             <w:pPr>
+              <w:jc w:val="center"/>
               <w:rPr>
                 <w:sz w:val="18"/>
                 <w:szCs w:val="18"/>
@@ -5765,6 +5871,7 @@
           </w:tcPr>
           <w:p>
             <w:pPr>
+              <w:jc w:val="center"/>
               <w:rPr>
                 <w:sz w:val="18"/>
                 <w:szCs w:val="18"/>
@@ -5783,11 +5890,11 @@
       <w:pPr>
         <w:pStyle w:val="Ttulo2"/>
       </w:pPr>
-      <w:bookmarkStart w:id="11" w:name="_Toc209377799"/>
+      <w:bookmarkStart w:id="12" w:name="_Toc209377799"/>
       <w:r>
         <w:t>2.2 Modelo Conceitual de Classes</w:t>
       </w:r>
-      <w:bookmarkEnd w:id="11"/>
+      <w:bookmarkEnd w:id="12"/>
     </w:p>
     <w:p>
       <w:r>
@@ -5850,12 +5957,12 @@
           <w:u w:val="single"/>
         </w:rPr>
       </w:pPr>
-      <w:bookmarkStart w:id="12" w:name="_Toc209377800"/>
+      <w:bookmarkStart w:id="13" w:name="_Toc209377800"/>
       <w:r>
         <w:lastRenderedPageBreak/>
         <w:t>2.3 Especificação das Estórias de Usuário</w:t>
       </w:r>
-      <w:bookmarkEnd w:id="12"/>
+      <w:bookmarkEnd w:id="13"/>
     </w:p>
     <w:tbl>
       <w:tblPr>
@@ -17393,23 +17500,7 @@
                 <w:sz w:val="20"/>
                 <w:szCs w:val="16"/>
               </w:rPr>
-              <w:t xml:space="preserve"> (</w:t>
-            </w:r>
-            <w:r>
-              <w:rPr>
-                <w:rFonts w:eastAsia="Courier New" w:cs="Arial"/>
-                <w:sz w:val="20"/>
-                <w:szCs w:val="16"/>
-              </w:rPr>
-              <w:t xml:space="preserve">somente no </w:t>
-            </w:r>
-            <w:r>
-              <w:rPr>
-                <w:rFonts w:eastAsia="Courier New" w:cs="Arial"/>
-                <w:sz w:val="20"/>
-                <w:szCs w:val="16"/>
-              </w:rPr>
-              <w:t>PDF)</w:t>
+              <w:t xml:space="preserve"> (somente no PDF)</w:t>
             </w:r>
           </w:p>
           <w:p>
@@ -17874,7 +17965,7 @@
       <w:pPr>
         <w:pStyle w:val="Ttulo1"/>
       </w:pPr>
-      <w:bookmarkStart w:id="13" w:name="_Toc209377801"/>
+      <w:bookmarkStart w:id="14" w:name="_Toc209377801"/>
     </w:p>
     <w:p>
       <w:pPr>
@@ -18110,15 +18201,7 @@
                 <w:sz w:val="20"/>
                 <w:szCs w:val="16"/>
               </w:rPr>
-              <w:t>CPF/CNPJ</w:t>
-            </w:r>
-            <w:r>
-              <w:rPr>
-                <w:rFonts w:eastAsia="Courier New" w:cs="Arial"/>
-                <w:sz w:val="20"/>
-                <w:szCs w:val="16"/>
-              </w:rPr>
-              <w:t xml:space="preserve"> </w:t>
+              <w:t xml:space="preserve">CPF/CNPJ </w:t>
             </w:r>
             <w:r>
               <w:rPr>
@@ -19442,7 +19525,7 @@
         <w:lastRenderedPageBreak/>
         <w:t>3. PROJETO DE SOFTWARE</w:t>
       </w:r>
-      <w:bookmarkEnd w:id="13"/>
+      <w:bookmarkEnd w:id="14"/>
     </w:p>
     <w:p>
       <w:r>
@@ -19472,11 +19555,11 @@
       <w:pPr>
         <w:pStyle w:val="Ttulo2"/>
       </w:pPr>
-      <w:bookmarkStart w:id="14" w:name="_Toc209377802"/>
+      <w:bookmarkStart w:id="15" w:name="_Toc209377802"/>
       <w:r>
         <w:t>3.1 Diagrama de Classes Final</w:t>
       </w:r>
-      <w:bookmarkEnd w:id="14"/>
+      <w:bookmarkEnd w:id="15"/>
     </w:p>
     <w:p>
       <w:r>
@@ -19547,11 +19630,11 @@
       <w:pPr>
         <w:pStyle w:val="Ttulo2"/>
       </w:pPr>
-      <w:bookmarkStart w:id="15" w:name="_Toc209377803"/>
+      <w:bookmarkStart w:id="16" w:name="_Toc209377803"/>
       <w:r>
         <w:t>3.2 Diagrama Entidade-Relacionamento Final</w:t>
       </w:r>
-      <w:bookmarkEnd w:id="15"/>
+      <w:bookmarkEnd w:id="16"/>
     </w:p>
     <w:p>
       <w:r>
@@ -19643,12 +19726,12 @@
       <w:pPr>
         <w:pStyle w:val="Ttulo1"/>
       </w:pPr>
-      <w:bookmarkStart w:id="16" w:name="_Toc209377804"/>
+      <w:bookmarkStart w:id="17" w:name="_Toc209377804"/>
       <w:r>
         <w:lastRenderedPageBreak/>
         <w:t>4. PROCEDIMENTOS DE INSTALAÇÃO</w:t>
       </w:r>
-      <w:bookmarkEnd w:id="16"/>
+      <w:bookmarkEnd w:id="17"/>
     </w:p>
     <w:p>
       <w:r>
@@ -19684,12 +19767,12 @@
       <w:pPr>
         <w:pStyle w:val="Ttulo1"/>
       </w:pPr>
-      <w:bookmarkStart w:id="17" w:name="_Toc209377805"/>
+      <w:bookmarkStart w:id="18" w:name="_Toc209377805"/>
       <w:r>
         <w:lastRenderedPageBreak/>
         <w:t>5. REFERÊNCIAS</w:t>
       </w:r>
-      <w:bookmarkEnd w:id="17"/>
+      <w:bookmarkEnd w:id="18"/>
     </w:p>
     <w:p>
       <w:pPr>
@@ -19882,7 +19965,7 @@
 </file>
 
 <file path=word/endnotes.xml><?xml version="1.0" encoding="utf-8"?>
-<w:endnotes xmlns:wpc="http://schemas.microsoft.com/office/word/2010/wordprocessingCanvas" xmlns:cx="http://schemas.microsoft.com/office/drawing/2014/chartex" xmlns:cx1="http://schemas.microsoft.com/office/drawing/2015/9/8/chartex" xmlns:cx2="http://schemas.microsoft.com/office/drawing/2015/10/21/chartex" xmlns:cx3="http://schemas.microsoft.com/office/drawing/2016/5/9/chartex" xmlns:cx4="http://schemas.microsoft.com/office/drawing/2016/5/10/chartex" xmlns:cx5="http://schemas.microsoft.com/office/drawing/2016/5/11/chartex" xmlns:cx6="http://schemas.microsoft.com/office/drawing/2016/5/12/chartex" xmlns:cx7="http://schemas.microsoft.com/office/drawing/2016/5/13/chartex" xmlns:cx8="http://schemas.microsoft.com/office/drawing/2016/5/14/chartex" xmlns:mc="http://schemas.openxmlformats.org/markup-compatibility/2006" xmlns:aink="http://schemas.microsoft.com/office/drawing/2016/ink" xmlns:am3d="http://schemas.microsoft.com/office/drawing/2017/model3d" xmlns:o="urn:schemas-microsoft-com:office:office" xmlns:r="http://schemas.openxmlformats.org/officeDocument/2006/relationships" xmlns:m="http://schemas.openxmlformats.org/officeDocument/2006/math" xmlns:v="urn:schemas-microsoft-com:vml" xmlns:wp14="http://schemas.microsoft.com/office/word/2010/wordprocessingDrawing" xmlns:wp="http://schemas.openxmlformats.org/drawingml/2006/wordprocessingDrawing" xmlns:w10="urn:schemas-microsoft-com:office:word" xmlns:w="http://schemas.openxmlformats.org/wordprocessingml/2006/main" xmlns:w14="http://schemas.microsoft.com/office/word/2010/wordml" xmlns:w15="http://schemas.microsoft.com/office/word/2012/wordml" xmlns:w16cex="http://schemas.microsoft.com/office/word/2018/wordml/cex" xmlns:w16cid="http://schemas.microsoft.com/office/word/2016/wordml/cid" xmlns:w16="http://schemas.microsoft.com/office/word/2018/wordml" xmlns:w16sdtdh="http://schemas.microsoft.com/office/word/2020/wordml/sdtdatahash" xmlns:w16se="http://schemas.microsoft.com/office/word/2015/wordml/symex" xmlns:wpg="http://schemas.microsoft.com/office/word/2010/wordprocessingGroup" xmlns:wpi="http://schemas.microsoft.com/office/word/2010/wordprocessingInk" xmlns:wne="http://schemas.microsoft.com/office/word/2006/wordml" xmlns:wps="http://schemas.microsoft.com/office/word/2010/wordprocessingShape" mc:Ignorable="w14 w15 w16se w16cid w16 w16cex w16sdtdh wp14">
+<w:endnotes xmlns:wpc="http://schemas.microsoft.com/office/word/2010/wordprocessingCanvas" xmlns:cx="http://schemas.microsoft.com/office/drawing/2014/chartex" xmlns:cx1="http://schemas.microsoft.com/office/drawing/2015/9/8/chartex" xmlns:mc="http://schemas.openxmlformats.org/markup-compatibility/2006" xmlns:o="urn:schemas-microsoft-com:office:office" xmlns:r="http://schemas.openxmlformats.org/officeDocument/2006/relationships" xmlns:m="http://schemas.openxmlformats.org/officeDocument/2006/math" xmlns:v="urn:schemas-microsoft-com:vml" xmlns:wp14="http://schemas.microsoft.com/office/word/2010/wordprocessingDrawing" xmlns:wp="http://schemas.openxmlformats.org/drawingml/2006/wordprocessingDrawing" xmlns:w10="urn:schemas-microsoft-com:office:word" xmlns:w="http://schemas.openxmlformats.org/wordprocessingml/2006/main" xmlns:w14="http://schemas.microsoft.com/office/word/2010/wordml" xmlns:w15="http://schemas.microsoft.com/office/word/2012/wordml" xmlns:w16se="http://schemas.microsoft.com/office/word/2015/wordml/symex" xmlns:wpg="http://schemas.microsoft.com/office/word/2010/wordprocessingGroup" xmlns:wpi="http://schemas.microsoft.com/office/word/2010/wordprocessingInk" xmlns:wne="http://schemas.microsoft.com/office/word/2006/wordml" xmlns:wps="http://schemas.microsoft.com/office/word/2010/wordprocessingShape" mc:Ignorable="w14 w15 w16se wp14">
   <w:endnote w:type="separator" w:id="-1">
     <w:p>
       <w:r>
@@ -19901,27 +19984,27 @@
 </file>
 
 <file path=word/footer1.xml><?xml version="1.0" encoding="utf-8"?>
-<w:ftr xmlns:wpc="http://schemas.microsoft.com/office/word/2010/wordprocessingCanvas" xmlns:cx="http://schemas.microsoft.com/office/drawing/2014/chartex" xmlns:cx1="http://schemas.microsoft.com/office/drawing/2015/9/8/chartex" xmlns:cx2="http://schemas.microsoft.com/office/drawing/2015/10/21/chartex" xmlns:cx3="http://schemas.microsoft.com/office/drawing/2016/5/9/chartex" xmlns:cx4="http://schemas.microsoft.com/office/drawing/2016/5/10/chartex" xmlns:cx5="http://schemas.microsoft.com/office/drawing/2016/5/11/chartex" xmlns:cx6="http://schemas.microsoft.com/office/drawing/2016/5/12/chartex" xmlns:cx7="http://schemas.microsoft.com/office/drawing/2016/5/13/chartex" xmlns:cx8="http://schemas.microsoft.com/office/drawing/2016/5/14/chartex" xmlns:mc="http://schemas.openxmlformats.org/markup-compatibility/2006" xmlns:aink="http://schemas.microsoft.com/office/drawing/2016/ink" xmlns:am3d="http://schemas.microsoft.com/office/drawing/2017/model3d" xmlns:o="urn:schemas-microsoft-com:office:office" xmlns:r="http://schemas.openxmlformats.org/officeDocument/2006/relationships" xmlns:m="http://schemas.openxmlformats.org/officeDocument/2006/math" xmlns:v="urn:schemas-microsoft-com:vml" xmlns:wp14="http://schemas.microsoft.com/office/word/2010/wordprocessingDrawing" xmlns:wp="http://schemas.openxmlformats.org/drawingml/2006/wordprocessingDrawing" xmlns:w10="urn:schemas-microsoft-com:office:word" xmlns:w="http://schemas.openxmlformats.org/wordprocessingml/2006/main" xmlns:w14="http://schemas.microsoft.com/office/word/2010/wordml" xmlns:w15="http://schemas.microsoft.com/office/word/2012/wordml" xmlns:w16cex="http://schemas.microsoft.com/office/word/2018/wordml/cex" xmlns:w16cid="http://schemas.microsoft.com/office/word/2016/wordml/cid" xmlns:w16="http://schemas.microsoft.com/office/word/2018/wordml" xmlns:w16sdtdh="http://schemas.microsoft.com/office/word/2020/wordml/sdtdatahash" xmlns:w16se="http://schemas.microsoft.com/office/word/2015/wordml/symex" xmlns:wpg="http://schemas.microsoft.com/office/word/2010/wordprocessingGroup" xmlns:wpi="http://schemas.microsoft.com/office/word/2010/wordprocessingInk" xmlns:wne="http://schemas.microsoft.com/office/word/2006/wordml" xmlns:wps="http://schemas.microsoft.com/office/word/2010/wordprocessingShape" mc:Ignorable="w14 w15 w16se w16cid w16 w16cex w16sdtdh wp14">
+<w:ftr xmlns:wpc="http://schemas.microsoft.com/office/word/2010/wordprocessingCanvas" xmlns:cx="http://schemas.microsoft.com/office/drawing/2014/chartex" xmlns:cx1="http://schemas.microsoft.com/office/drawing/2015/9/8/chartex" xmlns:mc="http://schemas.openxmlformats.org/markup-compatibility/2006" xmlns:o="urn:schemas-microsoft-com:office:office" xmlns:r="http://schemas.openxmlformats.org/officeDocument/2006/relationships" xmlns:m="http://schemas.openxmlformats.org/officeDocument/2006/math" xmlns:v="urn:schemas-microsoft-com:vml" xmlns:wp14="http://schemas.microsoft.com/office/word/2010/wordprocessingDrawing" xmlns:wp="http://schemas.openxmlformats.org/drawingml/2006/wordprocessingDrawing" xmlns:w10="urn:schemas-microsoft-com:office:word" xmlns:w="http://schemas.openxmlformats.org/wordprocessingml/2006/main" xmlns:w14="http://schemas.microsoft.com/office/word/2010/wordml" xmlns:w15="http://schemas.microsoft.com/office/word/2012/wordml" xmlns:w16se="http://schemas.microsoft.com/office/word/2015/wordml/symex" xmlns:wpg="http://schemas.microsoft.com/office/word/2010/wordprocessingGroup" xmlns:wpi="http://schemas.microsoft.com/office/word/2010/wordprocessingInk" xmlns:wne="http://schemas.microsoft.com/office/word/2006/wordml" xmlns:wps="http://schemas.microsoft.com/office/word/2010/wordprocessingShape" mc:Ignorable="w14 w15 w16se wp14">
   <w:p/>
   <w:p/>
 </w:ftr>
 </file>
 
 <file path=word/footer2.xml><?xml version="1.0" encoding="utf-8"?>
-<w:ftr xmlns:wpc="http://schemas.microsoft.com/office/word/2010/wordprocessingCanvas" xmlns:cx="http://schemas.microsoft.com/office/drawing/2014/chartex" xmlns:cx1="http://schemas.microsoft.com/office/drawing/2015/9/8/chartex" xmlns:cx2="http://schemas.microsoft.com/office/drawing/2015/10/21/chartex" xmlns:cx3="http://schemas.microsoft.com/office/drawing/2016/5/9/chartex" xmlns:cx4="http://schemas.microsoft.com/office/drawing/2016/5/10/chartex" xmlns:cx5="http://schemas.microsoft.com/office/drawing/2016/5/11/chartex" xmlns:cx6="http://schemas.microsoft.com/office/drawing/2016/5/12/chartex" xmlns:cx7="http://schemas.microsoft.com/office/drawing/2016/5/13/chartex" xmlns:cx8="http://schemas.microsoft.com/office/drawing/2016/5/14/chartex" xmlns:mc="http://schemas.openxmlformats.org/markup-compatibility/2006" xmlns:aink="http://schemas.microsoft.com/office/drawing/2016/ink" xmlns:am3d="http://schemas.microsoft.com/office/drawing/2017/model3d" xmlns:o="urn:schemas-microsoft-com:office:office" xmlns:r="http://schemas.openxmlformats.org/officeDocument/2006/relationships" xmlns:m="http://schemas.openxmlformats.org/officeDocument/2006/math" xmlns:v="urn:schemas-microsoft-com:vml" xmlns:wp14="http://schemas.microsoft.com/office/word/2010/wordprocessingDrawing" xmlns:wp="http://schemas.openxmlformats.org/drawingml/2006/wordprocessingDrawing" xmlns:w10="urn:schemas-microsoft-com:office:word" xmlns:w="http://schemas.openxmlformats.org/wordprocessingml/2006/main" xmlns:w14="http://schemas.microsoft.com/office/word/2010/wordml" xmlns:w15="http://schemas.microsoft.com/office/word/2012/wordml" xmlns:w16cex="http://schemas.microsoft.com/office/word/2018/wordml/cex" xmlns:w16cid="http://schemas.microsoft.com/office/word/2016/wordml/cid" xmlns:w16="http://schemas.microsoft.com/office/word/2018/wordml" xmlns:w16sdtdh="http://schemas.microsoft.com/office/word/2020/wordml/sdtdatahash" xmlns:w16se="http://schemas.microsoft.com/office/word/2015/wordml/symex" xmlns:wpg="http://schemas.microsoft.com/office/word/2010/wordprocessingGroup" xmlns:wpi="http://schemas.microsoft.com/office/word/2010/wordprocessingInk" xmlns:wne="http://schemas.microsoft.com/office/word/2006/wordml" xmlns:wps="http://schemas.microsoft.com/office/word/2010/wordprocessingShape" mc:Ignorable="w14 w15 w16se w16cid w16 w16cex w16sdtdh wp14">
+<w:ftr xmlns:wpc="http://schemas.microsoft.com/office/word/2010/wordprocessingCanvas" xmlns:cx="http://schemas.microsoft.com/office/drawing/2014/chartex" xmlns:cx1="http://schemas.microsoft.com/office/drawing/2015/9/8/chartex" xmlns:mc="http://schemas.openxmlformats.org/markup-compatibility/2006" xmlns:o="urn:schemas-microsoft-com:office:office" xmlns:r="http://schemas.openxmlformats.org/officeDocument/2006/relationships" xmlns:m="http://schemas.openxmlformats.org/officeDocument/2006/math" xmlns:v="urn:schemas-microsoft-com:vml" xmlns:wp14="http://schemas.microsoft.com/office/word/2010/wordprocessingDrawing" xmlns:wp="http://schemas.openxmlformats.org/drawingml/2006/wordprocessingDrawing" xmlns:w10="urn:schemas-microsoft-com:office:word" xmlns:w="http://schemas.openxmlformats.org/wordprocessingml/2006/main" xmlns:w14="http://schemas.microsoft.com/office/word/2010/wordml" xmlns:w15="http://schemas.microsoft.com/office/word/2012/wordml" xmlns:w16se="http://schemas.microsoft.com/office/word/2015/wordml/symex" xmlns:wpg="http://schemas.microsoft.com/office/word/2010/wordprocessingGroup" xmlns:wpi="http://schemas.microsoft.com/office/word/2010/wordprocessingInk" xmlns:wne="http://schemas.microsoft.com/office/word/2006/wordml" xmlns:wps="http://schemas.microsoft.com/office/word/2010/wordprocessingShape" mc:Ignorable="w14 w15 w16se wp14">
   <w:p/>
   <w:p/>
 </w:ftr>
 </file>
 
 <file path=word/footer3.xml><?xml version="1.0" encoding="utf-8"?>
-<w:ftr xmlns:wpc="http://schemas.microsoft.com/office/word/2010/wordprocessingCanvas" xmlns:cx="http://schemas.microsoft.com/office/drawing/2014/chartex" xmlns:cx1="http://schemas.microsoft.com/office/drawing/2015/9/8/chartex" xmlns:cx2="http://schemas.microsoft.com/office/drawing/2015/10/21/chartex" xmlns:cx3="http://schemas.microsoft.com/office/drawing/2016/5/9/chartex" xmlns:cx4="http://schemas.microsoft.com/office/drawing/2016/5/10/chartex" xmlns:cx5="http://schemas.microsoft.com/office/drawing/2016/5/11/chartex" xmlns:cx6="http://schemas.microsoft.com/office/drawing/2016/5/12/chartex" xmlns:cx7="http://schemas.microsoft.com/office/drawing/2016/5/13/chartex" xmlns:cx8="http://schemas.microsoft.com/office/drawing/2016/5/14/chartex" xmlns:mc="http://schemas.openxmlformats.org/markup-compatibility/2006" xmlns:aink="http://schemas.microsoft.com/office/drawing/2016/ink" xmlns:am3d="http://schemas.microsoft.com/office/drawing/2017/model3d" xmlns:o="urn:schemas-microsoft-com:office:office" xmlns:r="http://schemas.openxmlformats.org/officeDocument/2006/relationships" xmlns:m="http://schemas.openxmlformats.org/officeDocument/2006/math" xmlns:v="urn:schemas-microsoft-com:vml" xmlns:wp14="http://schemas.microsoft.com/office/word/2010/wordprocessingDrawing" xmlns:wp="http://schemas.openxmlformats.org/drawingml/2006/wordprocessingDrawing" xmlns:w10="urn:schemas-microsoft-com:office:word" xmlns:w="http://schemas.openxmlformats.org/wordprocessingml/2006/main" xmlns:w14="http://schemas.microsoft.com/office/word/2010/wordml" xmlns:w15="http://schemas.microsoft.com/office/word/2012/wordml" xmlns:w16cex="http://schemas.microsoft.com/office/word/2018/wordml/cex" xmlns:w16cid="http://schemas.microsoft.com/office/word/2016/wordml/cid" xmlns:w16="http://schemas.microsoft.com/office/word/2018/wordml" xmlns:w16sdtdh="http://schemas.microsoft.com/office/word/2020/wordml/sdtdatahash" xmlns:w16se="http://schemas.microsoft.com/office/word/2015/wordml/symex" xmlns:wpg="http://schemas.microsoft.com/office/word/2010/wordprocessingGroup" xmlns:wpi="http://schemas.microsoft.com/office/word/2010/wordprocessingInk" xmlns:wne="http://schemas.microsoft.com/office/word/2006/wordml" xmlns:wps="http://schemas.microsoft.com/office/word/2010/wordprocessingShape" mc:Ignorable="w14 w15 w16se w16cid w16 w16cex w16sdtdh wp14">
+<w:ftr xmlns:wpc="http://schemas.microsoft.com/office/word/2010/wordprocessingCanvas" xmlns:cx="http://schemas.microsoft.com/office/drawing/2014/chartex" xmlns:cx1="http://schemas.microsoft.com/office/drawing/2015/9/8/chartex" xmlns:mc="http://schemas.openxmlformats.org/markup-compatibility/2006" xmlns:o="urn:schemas-microsoft-com:office:office" xmlns:r="http://schemas.openxmlformats.org/officeDocument/2006/relationships" xmlns:m="http://schemas.openxmlformats.org/officeDocument/2006/math" xmlns:v="urn:schemas-microsoft-com:vml" xmlns:wp14="http://schemas.microsoft.com/office/word/2010/wordprocessingDrawing" xmlns:wp="http://schemas.openxmlformats.org/drawingml/2006/wordprocessingDrawing" xmlns:w10="urn:schemas-microsoft-com:office:word" xmlns:w="http://schemas.openxmlformats.org/wordprocessingml/2006/main" xmlns:w14="http://schemas.microsoft.com/office/word/2010/wordml" xmlns:w15="http://schemas.microsoft.com/office/word/2012/wordml" xmlns:w16se="http://schemas.microsoft.com/office/word/2015/wordml/symex" xmlns:wpg="http://schemas.microsoft.com/office/word/2010/wordprocessingGroup" xmlns:wpi="http://schemas.microsoft.com/office/word/2010/wordprocessingInk" xmlns:wne="http://schemas.microsoft.com/office/word/2006/wordml" xmlns:wps="http://schemas.microsoft.com/office/word/2010/wordprocessingShape" mc:Ignorable="w14 w15 w16se wp14">
   <w:p/>
 </w:ftr>
 </file>
 
 <file path=word/footnotes.xml><?xml version="1.0" encoding="utf-8"?>
-<w:footnotes xmlns:wpc="http://schemas.microsoft.com/office/word/2010/wordprocessingCanvas" xmlns:cx="http://schemas.microsoft.com/office/drawing/2014/chartex" xmlns:cx1="http://schemas.microsoft.com/office/drawing/2015/9/8/chartex" xmlns:cx2="http://schemas.microsoft.com/office/drawing/2015/10/21/chartex" xmlns:cx3="http://schemas.microsoft.com/office/drawing/2016/5/9/chartex" xmlns:cx4="http://schemas.microsoft.com/office/drawing/2016/5/10/chartex" xmlns:cx5="http://schemas.microsoft.com/office/drawing/2016/5/11/chartex" xmlns:cx6="http://schemas.microsoft.com/office/drawing/2016/5/12/chartex" xmlns:cx7="http://schemas.microsoft.com/office/drawing/2016/5/13/chartex" xmlns:cx8="http://schemas.microsoft.com/office/drawing/2016/5/14/chartex" xmlns:mc="http://schemas.openxmlformats.org/markup-compatibility/2006" xmlns:aink="http://schemas.microsoft.com/office/drawing/2016/ink" xmlns:am3d="http://schemas.microsoft.com/office/drawing/2017/model3d" xmlns:o="urn:schemas-microsoft-com:office:office" xmlns:r="http://schemas.openxmlformats.org/officeDocument/2006/relationships" xmlns:m="http://schemas.openxmlformats.org/officeDocument/2006/math" xmlns:v="urn:schemas-microsoft-com:vml" xmlns:wp14="http://schemas.microsoft.com/office/word/2010/wordprocessingDrawing" xmlns:wp="http://schemas.openxmlformats.org/drawingml/2006/wordprocessingDrawing" xmlns:w10="urn:schemas-microsoft-com:office:word" xmlns:w="http://schemas.openxmlformats.org/wordprocessingml/2006/main" xmlns:w14="http://schemas.microsoft.com/office/word/2010/wordml" xmlns:w15="http://schemas.microsoft.com/office/word/2012/wordml" xmlns:w16cex="http://schemas.microsoft.com/office/word/2018/wordml/cex" xmlns:w16cid="http://schemas.microsoft.com/office/word/2016/wordml/cid" xmlns:w16="http://schemas.microsoft.com/office/word/2018/wordml" xmlns:w16sdtdh="http://schemas.microsoft.com/office/word/2020/wordml/sdtdatahash" xmlns:w16se="http://schemas.microsoft.com/office/word/2015/wordml/symex" xmlns:wpg="http://schemas.microsoft.com/office/word/2010/wordprocessingGroup" xmlns:wpi="http://schemas.microsoft.com/office/word/2010/wordprocessingInk" xmlns:wne="http://schemas.microsoft.com/office/word/2006/wordml" xmlns:wps="http://schemas.microsoft.com/office/word/2010/wordprocessingShape" mc:Ignorable="w14 w15 w16se w16cid w16 w16cex w16sdtdh wp14">
+<w:footnotes xmlns:wpc="http://schemas.microsoft.com/office/word/2010/wordprocessingCanvas" xmlns:cx="http://schemas.microsoft.com/office/drawing/2014/chartex" xmlns:cx1="http://schemas.microsoft.com/office/drawing/2015/9/8/chartex" xmlns:mc="http://schemas.openxmlformats.org/markup-compatibility/2006" xmlns:o="urn:schemas-microsoft-com:office:office" xmlns:r="http://schemas.openxmlformats.org/officeDocument/2006/relationships" xmlns:m="http://schemas.openxmlformats.org/officeDocument/2006/math" xmlns:v="urn:schemas-microsoft-com:vml" xmlns:wp14="http://schemas.microsoft.com/office/word/2010/wordprocessingDrawing" xmlns:wp="http://schemas.openxmlformats.org/drawingml/2006/wordprocessingDrawing" xmlns:w10="urn:schemas-microsoft-com:office:word" xmlns:w="http://schemas.openxmlformats.org/wordprocessingml/2006/main" xmlns:w14="http://schemas.microsoft.com/office/word/2010/wordml" xmlns:w15="http://schemas.microsoft.com/office/word/2012/wordml" xmlns:w16se="http://schemas.microsoft.com/office/word/2015/wordml/symex" xmlns:wpg="http://schemas.microsoft.com/office/word/2010/wordprocessingGroup" xmlns:wpi="http://schemas.microsoft.com/office/word/2010/wordprocessingInk" xmlns:wne="http://schemas.microsoft.com/office/word/2006/wordml" xmlns:wps="http://schemas.microsoft.com/office/word/2010/wordprocessingShape" mc:Ignorable="w14 w15 w16se wp14">
   <w:footnote w:type="separator" w:id="-1">
     <w:p>
       <w:r>
@@ -19940,7 +20023,7 @@
 </file>
 
 <file path=word/numbering.xml><?xml version="1.0" encoding="utf-8"?>
-<w:numbering xmlns:wpc="http://schemas.microsoft.com/office/word/2010/wordprocessingCanvas" xmlns:cx="http://schemas.microsoft.com/office/drawing/2014/chartex" xmlns:cx1="http://schemas.microsoft.com/office/drawing/2015/9/8/chartex" xmlns:cx2="http://schemas.microsoft.com/office/drawing/2015/10/21/chartex" xmlns:cx3="http://schemas.microsoft.com/office/drawing/2016/5/9/chartex" xmlns:cx4="http://schemas.microsoft.com/office/drawing/2016/5/10/chartex" xmlns:cx5="http://schemas.microsoft.com/office/drawing/2016/5/11/chartex" xmlns:cx6="http://schemas.microsoft.com/office/drawing/2016/5/12/chartex" xmlns:cx7="http://schemas.microsoft.com/office/drawing/2016/5/13/chartex" xmlns:cx8="http://schemas.microsoft.com/office/drawing/2016/5/14/chartex" xmlns:mc="http://schemas.openxmlformats.org/markup-compatibility/2006" xmlns:aink="http://schemas.microsoft.com/office/drawing/2016/ink" xmlns:am3d="http://schemas.microsoft.com/office/drawing/2017/model3d" xmlns:o="urn:schemas-microsoft-com:office:office" xmlns:r="http://schemas.openxmlformats.org/officeDocument/2006/relationships" xmlns:m="http://schemas.openxmlformats.org/officeDocument/2006/math" xmlns:v="urn:schemas-microsoft-com:vml" xmlns:wp14="http://schemas.microsoft.com/office/word/2010/wordprocessingDrawing" xmlns:wp="http://schemas.openxmlformats.org/drawingml/2006/wordprocessingDrawing" xmlns:w10="urn:schemas-microsoft-com:office:word" xmlns:w="http://schemas.openxmlformats.org/wordprocessingml/2006/main" xmlns:w14="http://schemas.microsoft.com/office/word/2010/wordml" xmlns:w15="http://schemas.microsoft.com/office/word/2012/wordml" xmlns:w16cex="http://schemas.microsoft.com/office/word/2018/wordml/cex" xmlns:w16cid="http://schemas.microsoft.com/office/word/2016/wordml/cid" xmlns:w16="http://schemas.microsoft.com/office/word/2018/wordml" xmlns:w16sdtdh="http://schemas.microsoft.com/office/word/2020/wordml/sdtdatahash" xmlns:w16se="http://schemas.microsoft.com/office/word/2015/wordml/symex" xmlns:wpg="http://schemas.microsoft.com/office/word/2010/wordprocessingGroup" xmlns:wpi="http://schemas.microsoft.com/office/word/2010/wordprocessingInk" xmlns:wne="http://schemas.microsoft.com/office/word/2006/wordml" xmlns:wps="http://schemas.microsoft.com/office/word/2010/wordprocessingShape" mc:Ignorable="w14 w15 w16se w16cid w16 w16cex w16sdtdh wp14">
+<w:numbering xmlns:wpc="http://schemas.microsoft.com/office/word/2010/wordprocessingCanvas" xmlns:cx="http://schemas.microsoft.com/office/drawing/2014/chartex" xmlns:cx1="http://schemas.microsoft.com/office/drawing/2015/9/8/chartex" xmlns:mc="http://schemas.openxmlformats.org/markup-compatibility/2006" xmlns:o="urn:schemas-microsoft-com:office:office" xmlns:r="http://schemas.openxmlformats.org/officeDocument/2006/relationships" xmlns:m="http://schemas.openxmlformats.org/officeDocument/2006/math" xmlns:v="urn:schemas-microsoft-com:vml" xmlns:wp14="http://schemas.microsoft.com/office/word/2010/wordprocessingDrawing" xmlns:wp="http://schemas.openxmlformats.org/drawingml/2006/wordprocessingDrawing" xmlns:w10="urn:schemas-microsoft-com:office:word" xmlns:w="http://schemas.openxmlformats.org/wordprocessingml/2006/main" xmlns:w14="http://schemas.microsoft.com/office/word/2010/wordml" xmlns:w15="http://schemas.microsoft.com/office/word/2012/wordml" xmlns:w16se="http://schemas.microsoft.com/office/word/2015/wordml/symex" xmlns:wpg="http://schemas.microsoft.com/office/word/2010/wordprocessingGroup" xmlns:wpi="http://schemas.microsoft.com/office/word/2010/wordprocessingInk" xmlns:wne="http://schemas.microsoft.com/office/word/2006/wordml" xmlns:wps="http://schemas.microsoft.com/office/word/2010/wordprocessingShape" mc:Ignorable="w14 w15 w16se wp14">
   <w:abstractNum w:abstractNumId="0" w15:restartNumberingAfterBreak="0">
     <w:nsid w:val="08782360"/>
     <w:multiLevelType w:val="hybridMultilevel"/>
@@ -22745,7 +22828,7 @@
 </file>
 
 <file path=word/styles.xml><?xml version="1.0" encoding="utf-8"?>
-<w:styles xmlns:mc="http://schemas.openxmlformats.org/markup-compatibility/2006" xmlns:r="http://schemas.openxmlformats.org/officeDocument/2006/relationships" xmlns:w="http://schemas.openxmlformats.org/wordprocessingml/2006/main" xmlns:w14="http://schemas.microsoft.com/office/word/2010/wordml" xmlns:w15="http://schemas.microsoft.com/office/word/2012/wordml" xmlns:w16cex="http://schemas.microsoft.com/office/word/2018/wordml/cex" xmlns:w16cid="http://schemas.microsoft.com/office/word/2016/wordml/cid" xmlns:w16="http://schemas.microsoft.com/office/word/2018/wordml" xmlns:w16sdtdh="http://schemas.microsoft.com/office/word/2020/wordml/sdtdatahash" xmlns:w16se="http://schemas.microsoft.com/office/word/2015/wordml/symex" mc:Ignorable="w14 w15 w16se w16cid w16 w16cex w16sdtdh">
+<w:styles xmlns:mc="http://schemas.openxmlformats.org/markup-compatibility/2006" xmlns:r="http://schemas.openxmlformats.org/officeDocument/2006/relationships" xmlns:w="http://schemas.openxmlformats.org/wordprocessingml/2006/main" xmlns:w14="http://schemas.microsoft.com/office/word/2010/wordml" xmlns:w15="http://schemas.microsoft.com/office/word/2012/wordml" xmlns:w16se="http://schemas.microsoft.com/office/word/2015/wordml/symex" mc:Ignorable="w14 w15 w16se">
   <w:docDefaults>
     <w:rPrDefault>
       <w:rPr>
@@ -22762,7 +22845,7 @@
       </w:pPr>
     </w:pPrDefault>
   </w:docDefaults>
-  <w:latentStyles w:defLockedState="0" w:defUIPriority="99" w:defSemiHidden="0" w:defUnhideWhenUsed="0" w:defQFormat="0" w:count="376">
+  <w:latentStyles w:defLockedState="0" w:defUIPriority="99" w:defSemiHidden="0" w:defUnhideWhenUsed="0" w:defQFormat="0" w:count="371">
     <w:lsdException w:name="Normal" w:uiPriority="0" w:qFormat="1"/>
     <w:lsdException w:name="heading 1" w:uiPriority="9" w:qFormat="1"/>
     <w:lsdException w:name="heading 2" w:semiHidden="1" w:uiPriority="9" w:unhideWhenUsed="1" w:qFormat="1"/>
@@ -23134,11 +23217,6 @@
     <w:lsdException w:name="List Table 5 Dark Accent 6" w:uiPriority="50"/>
     <w:lsdException w:name="List Table 6 Colorful Accent 6" w:uiPriority="51"/>
     <w:lsdException w:name="List Table 7 Colorful Accent 6" w:uiPriority="52"/>
-    <w:lsdException w:name="Mention" w:semiHidden="1" w:unhideWhenUsed="1"/>
-    <w:lsdException w:name="Smart Hyperlink" w:semiHidden="1" w:unhideWhenUsed="1"/>
-    <w:lsdException w:name="Hashtag" w:semiHidden="1" w:unhideWhenUsed="1"/>
-    <w:lsdException w:name="Unresolved Mention" w:semiHidden="1" w:unhideWhenUsed="1"/>
-    <w:lsdException w:name="Smart Link" w:semiHidden="1" w:unhideWhenUsed="1"/>
   </w:latentStyles>
   <w:style w:type="paragraph" w:default="1" w:styleId="Normal">
     <w:name w:val="Normal"/>
@@ -23563,7 +23641,7 @@
       <w:u w:val="single"/>
     </w:rPr>
   </w:style>
-  <w:style w:type="character" w:styleId="MenoPendente">
+  <w:style w:type="character" w:customStyle="1" w:styleId="UnresolvedMention">
     <w:name w:val="Unresolved Mention"/>
     <w:basedOn w:val="Fontepargpadro"/>
     <w:uiPriority w:val="99"/>
@@ -23903,7 +23981,7 @@
 </file>
 
 <file path=customXml/itemProps1.xml><?xml version="1.0" encoding="utf-8"?>
-<ds:datastoreItem xmlns:ds="http://schemas.openxmlformats.org/officeDocument/2006/customXml" ds:itemID="{98CFFBE1-417B-4F0E-9A4C-4662BEB2D901}">
+<ds:datastoreItem xmlns:ds="http://schemas.openxmlformats.org/officeDocument/2006/customXml" ds:itemID="{3F35ED60-EB3C-46AE-BC21-DD5C93B2482E}">
   <ds:schemaRefs>
     <ds:schemaRef ds:uri="http://schemas.openxmlformats.org/officeDocument/2006/bibliography"/>
   </ds:schemaRefs>

</xml_diff>

<commit_message>
Adicionando indicadores de tarefa ativa e removendo a responsabilidade do setor.
Introduzidas as flags 'PossuiTasksAtivas' em todos os DTOs e controladores para representar se as entidades têm tarefas ativas e expostas ao frontend (mapeadas para hasActiveTasks / hasActiveCollaborators). Adicionado Cargo.VerificarColaboradoresAtivosAsync e integrado às respostas do Cargo. Removido o tratamento de responsabilidades de setor: removido ResponsavelId dos DTOs, modelo e DAO do Setor (criar/atualizar/selecionar), removido as verificações de responsabilidade do Colaborador e o método DAO relacionado VerificarResponsavelSetorAsync e atualizado as validações de acordo. Ajustado os formulários e diálogos do frontend para parar de exibir/validar a seleção de responsabilidade de setor e para usar as novas flags de tarefa/atividade.
</commit_message>
<xml_diff>
--- a/Documentação/ERS.docx
+++ b/Documentação/ERS.docx
@@ -1,6 +1,6 @@
 
 <file path=word/document.xml><?xml version="1.0" encoding="utf-8"?>
-<w:document xmlns:wpc="http://schemas.microsoft.com/office/word/2010/wordprocessingCanvas" xmlns:cx="http://schemas.microsoft.com/office/drawing/2014/chartex" xmlns:cx1="http://schemas.microsoft.com/office/drawing/2015/9/8/chartex" xmlns:mc="http://schemas.openxmlformats.org/markup-compatibility/2006" xmlns:o="urn:schemas-microsoft-com:office:office" xmlns:r="http://schemas.openxmlformats.org/officeDocument/2006/relationships" xmlns:m="http://schemas.openxmlformats.org/officeDocument/2006/math" xmlns:v="urn:schemas-microsoft-com:vml" xmlns:wp14="http://schemas.microsoft.com/office/word/2010/wordprocessingDrawing" xmlns:wp="http://schemas.openxmlformats.org/drawingml/2006/wordprocessingDrawing" xmlns:w10="urn:schemas-microsoft-com:office:word" xmlns:w="http://schemas.openxmlformats.org/wordprocessingml/2006/main" xmlns:w14="http://schemas.microsoft.com/office/word/2010/wordml" xmlns:w15="http://schemas.microsoft.com/office/word/2012/wordml" xmlns:w16se="http://schemas.microsoft.com/office/word/2015/wordml/symex" xmlns:wpg="http://schemas.microsoft.com/office/word/2010/wordprocessingGroup" xmlns:wpi="http://schemas.microsoft.com/office/word/2010/wordprocessingInk" xmlns:wne="http://schemas.microsoft.com/office/word/2006/wordml" xmlns:wps="http://schemas.microsoft.com/office/word/2010/wordprocessingShape" mc:Ignorable="w14 w15 w16se wp14">
+<w:document xmlns:wpc="http://schemas.microsoft.com/office/word/2010/wordprocessingCanvas" xmlns:cx="http://schemas.microsoft.com/office/drawing/2014/chartex" xmlns:cx1="http://schemas.microsoft.com/office/drawing/2015/9/8/chartex" xmlns:cx2="http://schemas.microsoft.com/office/drawing/2015/10/21/chartex" xmlns:cx3="http://schemas.microsoft.com/office/drawing/2016/5/9/chartex" xmlns:cx4="http://schemas.microsoft.com/office/drawing/2016/5/10/chartex" xmlns:cx5="http://schemas.microsoft.com/office/drawing/2016/5/11/chartex" xmlns:cx6="http://schemas.microsoft.com/office/drawing/2016/5/12/chartex" xmlns:cx7="http://schemas.microsoft.com/office/drawing/2016/5/13/chartex" xmlns:cx8="http://schemas.microsoft.com/office/drawing/2016/5/14/chartex" xmlns:mc="http://schemas.openxmlformats.org/markup-compatibility/2006" xmlns:aink="http://schemas.microsoft.com/office/drawing/2016/ink" xmlns:am3d="http://schemas.microsoft.com/office/drawing/2017/model3d" xmlns:o="urn:schemas-microsoft-com:office:office" xmlns:r="http://schemas.openxmlformats.org/officeDocument/2006/relationships" xmlns:m="http://schemas.openxmlformats.org/officeDocument/2006/math" xmlns:v="urn:schemas-microsoft-com:vml" xmlns:wp14="http://schemas.microsoft.com/office/word/2010/wordprocessingDrawing" xmlns:wp="http://schemas.openxmlformats.org/drawingml/2006/wordprocessingDrawing" xmlns:w10="urn:schemas-microsoft-com:office:word" xmlns:w="http://schemas.openxmlformats.org/wordprocessingml/2006/main" xmlns:w14="http://schemas.microsoft.com/office/word/2010/wordml" xmlns:w15="http://schemas.microsoft.com/office/word/2012/wordml" xmlns:w16cex="http://schemas.microsoft.com/office/word/2018/wordml/cex" xmlns:w16cid="http://schemas.microsoft.com/office/word/2016/wordml/cid" xmlns:w16="http://schemas.microsoft.com/office/word/2018/wordml" xmlns:w16sdtdh="http://schemas.microsoft.com/office/word/2020/wordml/sdtdatahash" xmlns:w16se="http://schemas.microsoft.com/office/word/2015/wordml/symex" xmlns:wpg="http://schemas.microsoft.com/office/word/2010/wordprocessingGroup" xmlns:wpi="http://schemas.microsoft.com/office/word/2010/wordprocessingInk" xmlns:wne="http://schemas.microsoft.com/office/word/2006/wordml" xmlns:wps="http://schemas.microsoft.com/office/word/2010/wordprocessingShape" mc:Ignorable="w14 w15 w16se w16cid w16 w16cex w16sdtdh wp14">
   <w:body>
     <w:tbl>
       <w:tblPr>
@@ -20,8 +20,6 @@
             <w:tcW w:w="5046" w:type="dxa"/>
           </w:tcPr>
           <w:p>
-            <w:bookmarkStart w:id="0" w:name="_GoBack"/>
-            <w:bookmarkEnd w:id="0"/>
             <w:r>
               <w:rPr>
                 <w:noProof/>
@@ -180,23 +178,13 @@
           <w:lang w:val="en-US"/>
         </w:rPr>
       </w:pPr>
-      <w:proofErr w:type="gramStart"/>
       <w:r>
         <w:rPr>
           <w:sz w:val="32"/>
           <w:szCs w:val="28"/>
           <w:lang w:val="en-US"/>
         </w:rPr>
-        <w:t>2</w:t>
-      </w:r>
-      <w:proofErr w:type="gramEnd"/>
-      <w:r>
-        <w:rPr>
-          <w:sz w:val="32"/>
-          <w:szCs w:val="28"/>
-          <w:lang w:val="en-US"/>
-        </w:rPr>
-        <w:t xml:space="preserve">º </w:t>
+        <w:t xml:space="preserve">2º </w:t>
       </w:r>
       <w:proofErr w:type="spellStart"/>
       <w:r>
@@ -1754,22 +1742,22 @@
       <w:pPr>
         <w:pStyle w:val="Ttulo1"/>
       </w:pPr>
-      <w:bookmarkStart w:id="1" w:name="_Toc209377788"/>
+      <w:bookmarkStart w:id="0" w:name="_Toc209377788"/>
       <w:r>
         <w:lastRenderedPageBreak/>
         <w:t>1. INTRODUÇÃO</w:t>
       </w:r>
-      <w:bookmarkEnd w:id="1"/>
+      <w:bookmarkEnd w:id="0"/>
     </w:p>
     <w:p>
       <w:pPr>
         <w:pStyle w:val="Ttulo2"/>
       </w:pPr>
-      <w:bookmarkStart w:id="2" w:name="_Toc209377789"/>
+      <w:bookmarkStart w:id="1" w:name="_Toc209377789"/>
       <w:r>
         <w:t>1.1 Objetivo</w:t>
       </w:r>
-      <w:bookmarkEnd w:id="2"/>
+      <w:bookmarkEnd w:id="1"/>
     </w:p>
     <w:p>
       <w:r>
@@ -1794,11 +1782,11 @@
       <w:pPr>
         <w:pStyle w:val="Ttulo2"/>
       </w:pPr>
-      <w:bookmarkStart w:id="3" w:name="_Toc209377790"/>
+      <w:bookmarkStart w:id="2" w:name="_Toc209377790"/>
       <w:r>
         <w:t>1.2 Escopo</w:t>
       </w:r>
-      <w:bookmarkEnd w:id="3"/>
+      <w:bookmarkEnd w:id="2"/>
     </w:p>
     <w:p>
       <w:r>
@@ -1908,12 +1896,12 @@
       <w:pPr>
         <w:pStyle w:val="Ttulo2"/>
       </w:pPr>
-      <w:bookmarkStart w:id="4" w:name="_Toc209377791"/>
+      <w:bookmarkStart w:id="3" w:name="_Toc209377791"/>
       <w:r>
         <w:lastRenderedPageBreak/>
         <w:t>1.3 Definições, Siglas e Abreviações</w:t>
       </w:r>
-      <w:bookmarkEnd w:id="4"/>
+      <w:bookmarkEnd w:id="3"/>
     </w:p>
     <w:p>
       <w:pPr>
@@ -2009,11 +1997,11 @@
       <w:pPr>
         <w:pStyle w:val="Ttulo2"/>
       </w:pPr>
-      <w:bookmarkStart w:id="5" w:name="_Toc209377792"/>
+      <w:bookmarkStart w:id="4" w:name="_Toc209377792"/>
       <w:r>
         <w:t>1.4 Referências</w:t>
       </w:r>
-      <w:bookmarkEnd w:id="5"/>
+      <w:bookmarkEnd w:id="4"/>
     </w:p>
     <w:tbl>
       <w:tblPr>
@@ -2326,21 +2314,21 @@
       <w:pPr>
         <w:pStyle w:val="Ttulo2"/>
       </w:pPr>
-      <w:bookmarkStart w:id="6" w:name="_Toc209377793"/>
+      <w:bookmarkStart w:id="5" w:name="_Toc209377793"/>
       <w:r>
         <w:t>1.5 Informações Adicionais</w:t>
       </w:r>
-      <w:bookmarkEnd w:id="6"/>
+      <w:bookmarkEnd w:id="5"/>
     </w:p>
     <w:p>
       <w:pPr>
         <w:pStyle w:val="Ttulo3"/>
       </w:pPr>
-      <w:bookmarkStart w:id="7" w:name="_Toc209377794"/>
+      <w:bookmarkStart w:id="6" w:name="_Toc209377794"/>
       <w:r>
         <w:t>1.5.1 Dados da Instituição</w:t>
       </w:r>
-      <w:bookmarkEnd w:id="7"/>
+      <w:bookmarkEnd w:id="6"/>
     </w:p>
     <w:p>
       <w:r>
@@ -2396,11 +2384,11 @@
       <w:pPr>
         <w:pStyle w:val="Ttulo3"/>
       </w:pPr>
-      <w:bookmarkStart w:id="8" w:name="_Toc209377795"/>
+      <w:bookmarkStart w:id="7" w:name="_Toc209377795"/>
       <w:r>
         <w:t>1.5.2 Dados da Empresa</w:t>
       </w:r>
-      <w:bookmarkEnd w:id="8"/>
+      <w:bookmarkEnd w:id="7"/>
     </w:p>
     <w:p>
       <w:r>
@@ -2544,11 +2532,11 @@
       <w:pPr>
         <w:pStyle w:val="Ttulo2"/>
       </w:pPr>
-      <w:bookmarkStart w:id="9" w:name="_Toc209377796"/>
+      <w:bookmarkStart w:id="8" w:name="_Toc209377796"/>
       <w:r>
         <w:t>1.6 Visão Geral</w:t>
       </w:r>
-      <w:bookmarkEnd w:id="9"/>
+      <w:bookmarkEnd w:id="8"/>
     </w:p>
     <w:p>
       <w:r>
@@ -2562,22 +2550,22 @@
       <w:pPr>
         <w:pStyle w:val="Ttulo1"/>
       </w:pPr>
-      <w:bookmarkStart w:id="10" w:name="_Toc209377797"/>
+      <w:bookmarkStart w:id="9" w:name="_Toc209377797"/>
       <w:r>
         <w:lastRenderedPageBreak/>
         <w:t>2. REQUISITOS DE SOFTWARE</w:t>
       </w:r>
-      <w:bookmarkEnd w:id="10"/>
+      <w:bookmarkEnd w:id="9"/>
     </w:p>
     <w:p>
       <w:pPr>
         <w:pStyle w:val="Ttulo2"/>
       </w:pPr>
-      <w:bookmarkStart w:id="11" w:name="_Toc209377798"/>
+      <w:bookmarkStart w:id="10" w:name="_Toc209377798"/>
       <w:r>
         <w:t>2.1 Lista de Funções/Estórias de Usuários</w:t>
       </w:r>
-      <w:bookmarkEnd w:id="11"/>
+      <w:bookmarkEnd w:id="10"/>
     </w:p>
     <w:tbl>
       <w:tblPr>
@@ -5890,11 +5878,11 @@
       <w:pPr>
         <w:pStyle w:val="Ttulo2"/>
       </w:pPr>
-      <w:bookmarkStart w:id="12" w:name="_Toc209377799"/>
+      <w:bookmarkStart w:id="11" w:name="_Toc209377799"/>
       <w:r>
         <w:t>2.2 Modelo Conceitual de Classes</w:t>
       </w:r>
-      <w:bookmarkEnd w:id="12"/>
+      <w:bookmarkEnd w:id="11"/>
     </w:p>
     <w:p>
       <w:r>
@@ -5957,12 +5945,12 @@
           <w:u w:val="single"/>
         </w:rPr>
       </w:pPr>
-      <w:bookmarkStart w:id="13" w:name="_Toc209377800"/>
+      <w:bookmarkStart w:id="12" w:name="_Toc209377800"/>
       <w:r>
         <w:lastRenderedPageBreak/>
         <w:t>2.3 Especificação das Estórias de Usuário</w:t>
       </w:r>
-      <w:bookmarkEnd w:id="13"/>
+      <w:bookmarkEnd w:id="12"/>
     </w:p>
     <w:tbl>
       <w:tblPr>
@@ -6103,7 +6091,7 @@
                 <w:sz w:val="20"/>
                 <w:szCs w:val="16"/>
               </w:rPr>
-              <w:t>, descrição ou nome do responsável</w:t>
+              <w:t>, descrição</w:t>
             </w:r>
             <w:r>
               <w:rPr>
@@ -6200,46 +6188,38 @@
             <w:pPr>
               <w:pStyle w:val="PargrafodaLista"/>
               <w:numPr>
-                <w:ilvl w:val="1"/>
+                <w:ilvl w:val="0"/>
                 <w:numId w:val="1"/>
               </w:numPr>
               <w:rPr>
-                <w:rFonts w:ascii="Courier New" w:eastAsia="Courier New" w:hAnsi="Courier New" w:cs="Courier New"/>
-                <w:sz w:val="20"/>
-                <w:szCs w:val="16"/>
-              </w:rPr>
-            </w:pPr>
-            <w:r>
-              <w:rPr>
-                <w:rFonts w:eastAsia="Calibri"/>
-                <w:sz w:val="20"/>
-                <w:szCs w:val="16"/>
-              </w:rPr>
-              <w:t>Responsável do Setor (FK de Colaborador</w:t>
-            </w:r>
-            <w:r>
-              <w:rPr>
-                <w:rFonts w:eastAsia="Calibri"/>
-                <w:sz w:val="20"/>
-                <w:szCs w:val="16"/>
-              </w:rPr>
-              <w:t xml:space="preserve"> </w:t>
-            </w:r>
-            <w:r>
-              <w:rPr>
-                <w:rFonts w:eastAsia="Calibri"/>
-                <w:sz w:val="20"/>
-                <w:szCs w:val="16"/>
-              </w:rPr>
-              <w:t>e não ser vazio</w:t>
-            </w:r>
-            <w:r>
-              <w:rPr>
-                <w:rFonts w:eastAsia="Calibri"/>
-                <w:sz w:val="20"/>
-                <w:szCs w:val="16"/>
-              </w:rPr>
-              <w:t>)</w:t>
+                <w:rFonts w:ascii="Noto Sans Symbols" w:eastAsia="Noto Sans Symbols" w:hAnsi="Noto Sans Symbols" w:cs="Noto Sans Symbols"/>
+                <w:sz w:val="20"/>
+                <w:szCs w:val="16"/>
+              </w:rPr>
+            </w:pPr>
+            <w:r>
+              <w:rPr>
+                <w:rFonts w:eastAsia="Calibri"/>
+                <w:sz w:val="20"/>
+                <w:szCs w:val="16"/>
+              </w:rPr>
+              <w:t>O sistema deve permitir alterar os dados de um setor já existente</w:t>
+            </w:r>
+            <w:r>
+              <w:rPr>
+                <w:rFonts w:eastAsia="Calibri"/>
+                <w:sz w:val="20"/>
+                <w:szCs w:val="16"/>
+              </w:rPr>
+              <w:t>, observando as validações indicadas no item anterior</w:t>
+            </w:r>
+            <w:r>
+              <w:rPr>
+                <w:rFonts w:eastAsia="Calibri"/>
+                <w:sz w:val="20"/>
+                <w:szCs w:val="16"/>
+              </w:rPr>
+              <w:t>.</w:t>
             </w:r>
           </w:p>
           <w:p>
@@ -6261,23 +6241,7 @@
                 <w:sz w:val="20"/>
                 <w:szCs w:val="16"/>
               </w:rPr>
-              <w:t>O sistema deve permitir alterar os dados de um setor já existente</w:t>
-            </w:r>
-            <w:r>
-              <w:rPr>
-                <w:rFonts w:eastAsia="Calibri"/>
-                <w:sz w:val="20"/>
-                <w:szCs w:val="16"/>
-              </w:rPr>
-              <w:t>, observando as validações indicadas no item anterior</w:t>
-            </w:r>
-            <w:r>
-              <w:rPr>
-                <w:rFonts w:eastAsia="Calibri"/>
-                <w:sz w:val="20"/>
-                <w:szCs w:val="16"/>
-              </w:rPr>
-              <w:t>.</w:t>
+              <w:t>A exclusão de um setor deve ser apenas lógica (inativação), para preservar o histórico de tarefas vinculadas.</w:t>
             </w:r>
           </w:p>
           <w:p>
@@ -6299,7 +6263,59 @@
                 <w:sz w:val="20"/>
                 <w:szCs w:val="16"/>
               </w:rPr>
-              <w:t>A exclusão de um setor deve ser apenas lógica (inativação), para preservar o histórico de tarefas vinculadas.</w:t>
+              <w:t>Ao tentar excluir (inativar) um setor, o sistema deve impedir a operação e exibir uma mensagem de alerta ao usuário caso qualquer uma das seguintes dependências ativas seja encontrada</w:t>
+            </w:r>
+            <w:r>
+              <w:rPr>
+                <w:rFonts w:eastAsia="Calibri"/>
+                <w:sz w:val="20"/>
+                <w:szCs w:val="16"/>
+              </w:rPr>
+              <w:t>:</w:t>
+            </w:r>
+          </w:p>
+          <w:p>
+            <w:pPr>
+              <w:pStyle w:val="PargrafodaLista"/>
+              <w:numPr>
+                <w:ilvl w:val="0"/>
+                <w:numId w:val="13"/>
+              </w:numPr>
+              <w:rPr>
+                <w:rFonts w:eastAsia="Noto Sans Symbols" w:cs="Arial"/>
+                <w:sz w:val="20"/>
+                <w:szCs w:val="16"/>
+              </w:rPr>
+            </w:pPr>
+            <w:r>
+              <w:rPr>
+                <w:rFonts w:eastAsia="Noto Sans Symbols" w:cs="Arial"/>
+                <w:sz w:val="20"/>
+                <w:szCs w:val="16"/>
+              </w:rPr>
+              <w:t>Tarefas em Andamento: Se o setor possuir tarefas com status em andamento diretamente vinculadas a ele</w:t>
+            </w:r>
+          </w:p>
+          <w:p>
+            <w:pPr>
+              <w:pStyle w:val="PargrafodaLista"/>
+              <w:numPr>
+                <w:ilvl w:val="0"/>
+                <w:numId w:val="13"/>
+              </w:numPr>
+              <w:rPr>
+                <w:rFonts w:eastAsia="Noto Sans Symbols" w:cs="Arial"/>
+                <w:sz w:val="20"/>
+                <w:szCs w:val="16"/>
+              </w:rPr>
+            </w:pPr>
+            <w:r>
+              <w:rPr>
+                <w:rFonts w:eastAsia="Noto Sans Symbols" w:cs="Arial"/>
+                <w:sz w:val="20"/>
+                <w:szCs w:val="16"/>
+              </w:rPr>
+              <w:t>Colaboradores Ativos Vinculados: Se houver colaboradores com status ativo no sistema que ainda estejam com a FK de Setor apontando para o setor a ser inativado.</w:t>
             </w:r>
           </w:p>
           <w:p>
@@ -6321,80 +6337,6 @@
                 <w:sz w:val="20"/>
                 <w:szCs w:val="16"/>
               </w:rPr>
-              <w:t>Ao tentar excluir (inativar) um setor, o sistema deve impedir a operação e exibir uma mensagem de alerta ao usuário caso qualquer uma das seguintes dependências ativas seja encontrada</w:t>
-            </w:r>
-            <w:r>
-              <w:rPr>
-                <w:rFonts w:eastAsia="Calibri"/>
-                <w:sz w:val="20"/>
-                <w:szCs w:val="16"/>
-              </w:rPr>
-              <w:t>:</w:t>
-            </w:r>
-          </w:p>
-          <w:p>
-            <w:pPr>
-              <w:pStyle w:val="PargrafodaLista"/>
-              <w:numPr>
-                <w:ilvl w:val="0"/>
-                <w:numId w:val="13"/>
-              </w:numPr>
-              <w:rPr>
-                <w:rFonts w:eastAsia="Noto Sans Symbols" w:cs="Arial"/>
-                <w:sz w:val="20"/>
-                <w:szCs w:val="16"/>
-              </w:rPr>
-            </w:pPr>
-            <w:r>
-              <w:rPr>
-                <w:rFonts w:eastAsia="Noto Sans Symbols" w:cs="Arial"/>
-                <w:sz w:val="20"/>
-                <w:szCs w:val="16"/>
-              </w:rPr>
-              <w:t>Tarefas em Andamento: Se o setor possuir tarefas com status em andamento diretamente vinculadas a ele</w:t>
-            </w:r>
-          </w:p>
-          <w:p>
-            <w:pPr>
-              <w:pStyle w:val="PargrafodaLista"/>
-              <w:numPr>
-                <w:ilvl w:val="0"/>
-                <w:numId w:val="13"/>
-              </w:numPr>
-              <w:rPr>
-                <w:rFonts w:eastAsia="Noto Sans Symbols" w:cs="Arial"/>
-                <w:sz w:val="20"/>
-                <w:szCs w:val="16"/>
-              </w:rPr>
-            </w:pPr>
-            <w:r>
-              <w:rPr>
-                <w:rFonts w:eastAsia="Noto Sans Symbols" w:cs="Arial"/>
-                <w:sz w:val="20"/>
-                <w:szCs w:val="16"/>
-              </w:rPr>
-              <w:t>Colaboradores Ativos Vinculados: Se houver colaboradores com status ativo no sistema que ainda estejam com a FK de Setor apontando para o setor a ser inativado.</w:t>
-            </w:r>
-          </w:p>
-          <w:p>
-            <w:pPr>
-              <w:pStyle w:val="PargrafodaLista"/>
-              <w:numPr>
-                <w:ilvl w:val="0"/>
-                <w:numId w:val="1"/>
-              </w:numPr>
-              <w:rPr>
-                <w:rFonts w:ascii="Noto Sans Symbols" w:eastAsia="Noto Sans Symbols" w:hAnsi="Noto Sans Symbols" w:cs="Noto Sans Symbols"/>
-                <w:sz w:val="20"/>
-                <w:szCs w:val="16"/>
-              </w:rPr>
-            </w:pPr>
-            <w:r>
-              <w:rPr>
-                <w:rFonts w:eastAsia="Calibri"/>
-                <w:sz w:val="20"/>
-                <w:szCs w:val="16"/>
-              </w:rPr>
               <w:t>A interface deve conter:</w:t>
             </w:r>
           </w:p>
@@ -6592,6 +6534,15 @@
           <w:p>
             <w:pPr>
               <w:rPr>
+                <w:rFonts w:ascii="Courier New" w:eastAsia="Courier New" w:hAnsi="Courier New" w:cs="Courier New"/>
+                <w:sz w:val="20"/>
+                <w:szCs w:val="16"/>
+              </w:rPr>
+            </w:pPr>
+          </w:p>
+          <w:p>
+            <w:pPr>
+              <w:rPr>
                 <w:rFonts w:eastAsia="Calibri"/>
                 <w:b/>
                 <w:bCs/>
@@ -6624,17 +6575,17 @@
             </w:pPr>
             <w:r>
               <w:rPr>
+                <w:rFonts w:eastAsia="Calibri"/>
                 <w:b/>
                 <w:bCs/>
-                <w:noProof/>
                 <w:sz w:val="20"/>
                 <w:szCs w:val="16"/>
               </w:rPr>
               <w:drawing>
-                <wp:inline distT="0" distB="0" distL="0" distR="0" wp14:anchorId="702F03ED" wp14:editId="372002C2">
-                  <wp:extent cx="5112000" cy="3596400"/>
-                  <wp:effectExtent l="0" t="0" r="0" b="4445"/>
-                  <wp:docPr id="2" name="Imagem 2"/>
+                <wp:inline distT="0" distB="0" distL="0" distR="0" wp14:anchorId="23AB80C2" wp14:editId="4F3BAB5A">
+                  <wp:extent cx="5400000" cy="2898000"/>
+                  <wp:effectExtent l="0" t="0" r="0" b="0"/>
+                  <wp:docPr id="44" name="Imagem 44"/>
                   <wp:cNvGraphicFramePr>
                     <a:graphicFrameLocks xmlns:a="http://schemas.openxmlformats.org/drawingml/2006/main" noChangeAspect="1"/>
                   </wp:cNvGraphicFramePr>
@@ -6654,7 +6605,7 @@
                         <pic:spPr>
                           <a:xfrm>
                             <a:off x="0" y="0"/>
-                            <a:ext cx="5112000" cy="3596400"/>
+                            <a:ext cx="5400000" cy="2898000"/>
                           </a:xfrm>
                           <a:prstGeom prst="rect">
                             <a:avLst/>
@@ -6804,7 +6755,6 @@
                 <w:sz w:val="20"/>
                 <w:szCs w:val="16"/>
               </w:rPr>
-              <w:lastRenderedPageBreak/>
               <w:t>Detalhamento com protótipo</w:t>
             </w:r>
           </w:p>
@@ -6847,6 +6797,7 @@
                 <w:sz w:val="20"/>
                 <w:szCs w:val="16"/>
               </w:rPr>
+              <w:lastRenderedPageBreak/>
               <w:drawing>
                 <wp:inline distT="0" distB="0" distL="0" distR="0" wp14:anchorId="49CEDFF7" wp14:editId="7069265E">
                   <wp:extent cx="5367600" cy="2613600"/>
@@ -7144,7 +7095,6 @@
                 <w:sz w:val="20"/>
                 <w:szCs w:val="16"/>
               </w:rPr>
-              <w:lastRenderedPageBreak/>
               <w:t>Modal de cadastro do setor</w:t>
             </w:r>
           </w:p>
@@ -7167,6 +7117,7 @@
                 <w:sz w:val="20"/>
                 <w:szCs w:val="16"/>
               </w:rPr>
+              <w:lastRenderedPageBreak/>
               <w:drawing>
                 <wp:inline distT="0" distB="0" distL="0" distR="0" wp14:anchorId="5E9DB6E2" wp14:editId="1B8F6938">
                   <wp:extent cx="3682800" cy="3585600"/>
@@ -7360,7 +7311,6 @@
                 <w:sz w:val="20"/>
                 <w:szCs w:val="16"/>
               </w:rPr>
-              <w:lastRenderedPageBreak/>
               <w:t>Modal de alteração do cadastro do setor</w:t>
             </w:r>
           </w:p>
@@ -7383,6 +7333,7 @@
                 <w:sz w:val="20"/>
                 <w:szCs w:val="16"/>
               </w:rPr>
+              <w:lastRenderedPageBreak/>
               <w:drawing>
                 <wp:inline distT="0" distB="0" distL="0" distR="0" wp14:anchorId="3E82E30A" wp14:editId="382D2A53">
                   <wp:extent cx="3682800" cy="3567600"/>
@@ -7639,27 +7590,27 @@
                 <w:sz w:val="20"/>
                 <w:szCs w:val="16"/>
               </w:rPr>
+              <w:t>Modal de mensagem caso tente excluir um setor atribuído a uma tarefa ativa</w:t>
+            </w:r>
+          </w:p>
+          <w:p>
+            <w:pPr>
+              <w:pStyle w:val="PargrafodaLista"/>
+              <w:jc w:val="center"/>
+              <w:rPr>
+                <w:rFonts w:eastAsia="Noto Sans Symbols"/>
+                <w:sz w:val="20"/>
+                <w:szCs w:val="16"/>
+              </w:rPr>
+            </w:pPr>
+            <w:r>
+              <w:rPr>
+                <w:rFonts w:eastAsia="Noto Sans Symbols"/>
+                <w:noProof/>
+                <w:sz w:val="20"/>
+                <w:szCs w:val="16"/>
+              </w:rPr>
               <w:lastRenderedPageBreak/>
-              <w:t>Modal de mensagem caso tente excluir um setor atribuído a uma tarefa ativa</w:t>
-            </w:r>
-          </w:p>
-          <w:p>
-            <w:pPr>
-              <w:pStyle w:val="PargrafodaLista"/>
-              <w:jc w:val="center"/>
-              <w:rPr>
-                <w:rFonts w:eastAsia="Noto Sans Symbols"/>
-                <w:sz w:val="20"/>
-                <w:szCs w:val="16"/>
-              </w:rPr>
-            </w:pPr>
-            <w:r>
-              <w:rPr>
-                <w:rFonts w:eastAsia="Noto Sans Symbols"/>
-                <w:noProof/>
-                <w:sz w:val="20"/>
-                <w:szCs w:val="16"/>
-              </w:rPr>
               <w:drawing>
                 <wp:inline distT="0" distB="0" distL="0" distR="0" wp14:anchorId="546F0FFB" wp14:editId="75BCE98E">
                   <wp:extent cx="5320800" cy="3589200"/>
@@ -13121,28 +13072,6 @@
             </w:pPr>
             <w:r>
               <w:rPr>
-                <w:rFonts w:eastAsia="Calibri"/>
-                <w:sz w:val="20"/>
-                <w:szCs w:val="16"/>
-              </w:rPr>
-              <w:t>Caso o colaborador seja responsável por um setor ativo, o sistema deve impedir a inativação, exibindo uma mensagem de alerta informando que é necessário transferir essa responsabilidade antes de prosseguir.</w:t>
-            </w:r>
-          </w:p>
-          <w:p>
-            <w:pPr>
-              <w:pStyle w:val="PargrafodaLista"/>
-              <w:numPr>
-                <w:ilvl w:val="0"/>
-                <w:numId w:val="1"/>
-              </w:numPr>
-              <w:rPr>
-                <w:rFonts w:eastAsia="Courier New" w:cs="Arial"/>
-                <w:sz w:val="20"/>
-                <w:szCs w:val="16"/>
-              </w:rPr>
-            </w:pPr>
-            <w:r>
-              <w:rPr>
                 <w:rFonts w:eastAsia="Courier New" w:cs="Arial"/>
                 <w:sz w:val="20"/>
                 <w:szCs w:val="16"/>
@@ -13308,7 +13237,6 @@
                 <w:sz w:val="20"/>
                 <w:szCs w:val="16"/>
               </w:rPr>
-              <w:lastRenderedPageBreak/>
               <w:t>Diagrama de Classe do Contexto</w:t>
             </w:r>
           </w:p>
@@ -13331,6 +13259,7 @@
                 <w:sz w:val="20"/>
                 <w:szCs w:val="16"/>
               </w:rPr>
+              <w:lastRenderedPageBreak/>
               <w:drawing>
                 <wp:inline distT="0" distB="0" distL="0" distR="0" wp14:anchorId="3059082D" wp14:editId="629B69C8">
                   <wp:extent cx="3870000" cy="3592800"/>
@@ -13559,7 +13488,6 @@
                 <w:sz w:val="20"/>
                 <w:szCs w:val="16"/>
               </w:rPr>
-              <w:lastRenderedPageBreak/>
               <w:t>Detalhamento com protótipo</w:t>
             </w:r>
           </w:p>
@@ -13583,6 +13511,7 @@
                 <w:sz w:val="20"/>
                 <w:szCs w:val="16"/>
               </w:rPr>
+              <w:lastRenderedPageBreak/>
               <w:t xml:space="preserve">Listagem de </w:t>
             </w:r>
             <w:r>
@@ -13925,34 +13854,34 @@
                 <w:sz w:val="20"/>
                 <w:szCs w:val="16"/>
               </w:rPr>
+              <w:t>Modal de cadastro d</w:t>
+            </w:r>
+            <w:r>
+              <w:rPr>
+                <w:rFonts w:eastAsia="Noto Sans Symbols"/>
+                <w:sz w:val="20"/>
+                <w:szCs w:val="16"/>
+              </w:rPr>
+              <w:t>o colaborador</w:t>
+            </w:r>
+          </w:p>
+          <w:p>
+            <w:pPr>
+              <w:jc w:val="center"/>
+              <w:rPr>
+                <w:rFonts w:eastAsia="Noto Sans Symbols"/>
+                <w:sz w:val="20"/>
+                <w:szCs w:val="16"/>
+              </w:rPr>
+            </w:pPr>
+            <w:r>
+              <w:rPr>
+                <w:rFonts w:eastAsia="Noto Sans Symbols"/>
+                <w:noProof/>
+                <w:sz w:val="20"/>
+                <w:szCs w:val="16"/>
+              </w:rPr>
               <w:lastRenderedPageBreak/>
-              <w:t>Modal de cadastro d</w:t>
-            </w:r>
-            <w:r>
-              <w:rPr>
-                <w:rFonts w:eastAsia="Noto Sans Symbols"/>
-                <w:sz w:val="20"/>
-                <w:szCs w:val="16"/>
-              </w:rPr>
-              <w:t>o colaborador</w:t>
-            </w:r>
-          </w:p>
-          <w:p>
-            <w:pPr>
-              <w:jc w:val="center"/>
-              <w:rPr>
-                <w:rFonts w:eastAsia="Noto Sans Symbols"/>
-                <w:sz w:val="20"/>
-                <w:szCs w:val="16"/>
-              </w:rPr>
-            </w:pPr>
-            <w:r>
-              <w:rPr>
-                <w:rFonts w:eastAsia="Noto Sans Symbols"/>
-                <w:noProof/>
-                <w:sz w:val="20"/>
-                <w:szCs w:val="16"/>
-              </w:rPr>
               <w:drawing>
                 <wp:inline distT="0" distB="0" distL="0" distR="0" wp14:anchorId="17333814" wp14:editId="22FB02E0">
                   <wp:extent cx="2595600" cy="3560400"/>
@@ -14150,34 +14079,34 @@
                 <w:sz w:val="20"/>
                 <w:szCs w:val="16"/>
               </w:rPr>
+              <w:t>Modal de alteração do cadastro d</w:t>
+            </w:r>
+            <w:r>
+              <w:rPr>
+                <w:rFonts w:eastAsia="Noto Sans Symbols"/>
+                <w:sz w:val="20"/>
+                <w:szCs w:val="16"/>
+              </w:rPr>
+              <w:t>o colaborador</w:t>
+            </w:r>
+          </w:p>
+          <w:p>
+            <w:pPr>
+              <w:jc w:val="center"/>
+              <w:rPr>
+                <w:rFonts w:eastAsia="Noto Sans Symbols"/>
+                <w:sz w:val="20"/>
+                <w:szCs w:val="16"/>
+              </w:rPr>
+            </w:pPr>
+            <w:r>
+              <w:rPr>
+                <w:rFonts w:eastAsia="Noto Sans Symbols"/>
+                <w:noProof/>
+                <w:sz w:val="20"/>
+                <w:szCs w:val="16"/>
+              </w:rPr>
               <w:lastRenderedPageBreak/>
-              <w:t>Modal de alteração do cadastro d</w:t>
-            </w:r>
-            <w:r>
-              <w:rPr>
-                <w:rFonts w:eastAsia="Noto Sans Symbols"/>
-                <w:sz w:val="20"/>
-                <w:szCs w:val="16"/>
-              </w:rPr>
-              <w:t>o colaborador</w:t>
-            </w:r>
-          </w:p>
-          <w:p>
-            <w:pPr>
-              <w:jc w:val="center"/>
-              <w:rPr>
-                <w:rFonts w:eastAsia="Noto Sans Symbols"/>
-                <w:sz w:val="20"/>
-                <w:szCs w:val="16"/>
-              </w:rPr>
-            </w:pPr>
-            <w:r>
-              <w:rPr>
-                <w:rFonts w:eastAsia="Noto Sans Symbols"/>
-                <w:noProof/>
-                <w:sz w:val="20"/>
-                <w:szCs w:val="16"/>
-              </w:rPr>
               <w:drawing>
                 <wp:inline distT="0" distB="0" distL="0" distR="0" wp14:anchorId="0DC5FC06" wp14:editId="7F623011">
                   <wp:extent cx="2577600" cy="3560400"/>
@@ -14409,66 +14338,66 @@
                 <w:sz w:val="20"/>
                 <w:szCs w:val="16"/>
               </w:rPr>
+              <w:t>Modal de mensagem caso tente excluir um</w:t>
+            </w:r>
+            <w:r>
+              <w:rPr>
+                <w:rFonts w:eastAsia="Noto Sans Symbols"/>
+                <w:sz w:val="20"/>
+                <w:szCs w:val="16"/>
+              </w:rPr>
+              <w:t xml:space="preserve"> colaborador </w:t>
+            </w:r>
+            <w:r>
+              <w:rPr>
+                <w:rFonts w:eastAsia="Noto Sans Symbols"/>
+                <w:sz w:val="20"/>
+                <w:szCs w:val="16"/>
+              </w:rPr>
+              <w:t>atribuíd</w:t>
+            </w:r>
+            <w:r>
+              <w:rPr>
+                <w:rFonts w:eastAsia="Noto Sans Symbols"/>
+                <w:sz w:val="20"/>
+                <w:szCs w:val="16"/>
+              </w:rPr>
+              <w:t>o</w:t>
+            </w:r>
+            <w:r>
+              <w:rPr>
+                <w:rFonts w:eastAsia="Noto Sans Symbols"/>
+                <w:sz w:val="20"/>
+                <w:szCs w:val="16"/>
+              </w:rPr>
+              <w:t xml:space="preserve"> a uma tarefa ativa</w:t>
+            </w:r>
+            <w:r>
+              <w:rPr>
+                <w:rFonts w:eastAsia="Noto Sans Symbols"/>
+                <w:sz w:val="20"/>
+                <w:szCs w:val="16"/>
+              </w:rPr>
+              <w:t>.</w:t>
+            </w:r>
+          </w:p>
+          <w:p>
+            <w:pPr>
+              <w:jc w:val="center"/>
+              <w:rPr>
+                <w:rFonts w:eastAsia="Noto Sans Symbols"/>
+                <w:sz w:val="20"/>
+                <w:szCs w:val="16"/>
+              </w:rPr>
+            </w:pPr>
+            <w:r>
+              <w:rPr>
+                <w:rFonts w:eastAsia="Noto Sans Symbols"/>
+                <w:noProof/>
+                <w:sz w:val="20"/>
+                <w:szCs w:val="16"/>
+              </w:rPr>
               <w:lastRenderedPageBreak/>
-              <w:t>Modal de mensagem caso tente excluir um</w:t>
-            </w:r>
-            <w:r>
-              <w:rPr>
-                <w:rFonts w:eastAsia="Noto Sans Symbols"/>
-                <w:sz w:val="20"/>
-                <w:szCs w:val="16"/>
-              </w:rPr>
-              <w:t xml:space="preserve"> colaborador </w:t>
-            </w:r>
-            <w:r>
-              <w:rPr>
-                <w:rFonts w:eastAsia="Noto Sans Symbols"/>
-                <w:sz w:val="20"/>
-                <w:szCs w:val="16"/>
-              </w:rPr>
-              <w:t>atribuíd</w:t>
-            </w:r>
-            <w:r>
-              <w:rPr>
-                <w:rFonts w:eastAsia="Noto Sans Symbols"/>
-                <w:sz w:val="20"/>
-                <w:szCs w:val="16"/>
-              </w:rPr>
-              <w:t>o</w:t>
-            </w:r>
-            <w:r>
-              <w:rPr>
-                <w:rFonts w:eastAsia="Noto Sans Symbols"/>
-                <w:sz w:val="20"/>
-                <w:szCs w:val="16"/>
-              </w:rPr>
-              <w:t xml:space="preserve"> a uma tarefa ativa</w:t>
-            </w:r>
-            <w:r>
-              <w:rPr>
-                <w:rFonts w:eastAsia="Noto Sans Symbols"/>
-                <w:sz w:val="20"/>
-                <w:szCs w:val="16"/>
-              </w:rPr>
-              <w:t xml:space="preserve"> ou responsável por um setor</w:t>
-            </w:r>
-          </w:p>
-          <w:p>
-            <w:pPr>
-              <w:jc w:val="center"/>
-              <w:rPr>
-                <w:rFonts w:eastAsia="Noto Sans Symbols"/>
-                <w:sz w:val="20"/>
-                <w:szCs w:val="16"/>
-              </w:rPr>
-            </w:pPr>
-            <w:r>
-              <w:rPr>
-                <w:rFonts w:eastAsia="Noto Sans Symbols"/>
-                <w:noProof/>
-                <w:sz w:val="20"/>
-                <w:szCs w:val="16"/>
-              </w:rPr>
               <w:drawing>
                 <wp:inline distT="0" distB="0" distL="0" distR="0" wp14:anchorId="346DA403" wp14:editId="6D39DEE7">
                   <wp:extent cx="5378400" cy="3589200"/>
@@ -17965,7 +17894,7 @@
       <w:pPr>
         <w:pStyle w:val="Ttulo1"/>
       </w:pPr>
-      <w:bookmarkStart w:id="14" w:name="_Toc209377801"/>
+      <w:bookmarkStart w:id="13" w:name="_Toc209377801"/>
     </w:p>
     <w:p>
       <w:pPr>
@@ -19525,7 +19454,7 @@
         <w:lastRenderedPageBreak/>
         <w:t>3. PROJETO DE SOFTWARE</w:t>
       </w:r>
-      <w:bookmarkEnd w:id="14"/>
+      <w:bookmarkEnd w:id="13"/>
     </w:p>
     <w:p>
       <w:r>
@@ -19555,11 +19484,11 @@
       <w:pPr>
         <w:pStyle w:val="Ttulo2"/>
       </w:pPr>
-      <w:bookmarkStart w:id="15" w:name="_Toc209377802"/>
+      <w:bookmarkStart w:id="14" w:name="_Toc209377802"/>
       <w:r>
         <w:t>3.1 Diagrama de Classes Final</w:t>
       </w:r>
-      <w:bookmarkEnd w:id="15"/>
+      <w:bookmarkEnd w:id="14"/>
     </w:p>
     <w:p>
       <w:r>
@@ -19630,11 +19559,11 @@
       <w:pPr>
         <w:pStyle w:val="Ttulo2"/>
       </w:pPr>
-      <w:bookmarkStart w:id="16" w:name="_Toc209377803"/>
+      <w:bookmarkStart w:id="15" w:name="_Toc209377803"/>
       <w:r>
         <w:t>3.2 Diagrama Entidade-Relacionamento Final</w:t>
       </w:r>
-      <w:bookmarkEnd w:id="16"/>
+      <w:bookmarkEnd w:id="15"/>
     </w:p>
     <w:p>
       <w:r>
@@ -19726,12 +19655,12 @@
       <w:pPr>
         <w:pStyle w:val="Ttulo1"/>
       </w:pPr>
-      <w:bookmarkStart w:id="17" w:name="_Toc209377804"/>
+      <w:bookmarkStart w:id="16" w:name="_Toc209377804"/>
       <w:r>
         <w:lastRenderedPageBreak/>
         <w:t>4. PROCEDIMENTOS DE INSTALAÇÃO</w:t>
       </w:r>
-      <w:bookmarkEnd w:id="17"/>
+      <w:bookmarkEnd w:id="16"/>
     </w:p>
     <w:p>
       <w:r>
@@ -19767,12 +19696,12 @@
       <w:pPr>
         <w:pStyle w:val="Ttulo1"/>
       </w:pPr>
-      <w:bookmarkStart w:id="18" w:name="_Toc209377805"/>
+      <w:bookmarkStart w:id="17" w:name="_Toc209377805"/>
       <w:r>
         <w:lastRenderedPageBreak/>
         <w:t>5. REFERÊNCIAS</w:t>
       </w:r>
-      <w:bookmarkEnd w:id="18"/>
+      <w:bookmarkEnd w:id="17"/>
     </w:p>
     <w:p>
       <w:pPr>
@@ -19965,7 +19894,7 @@
 </file>
 
 <file path=word/endnotes.xml><?xml version="1.0" encoding="utf-8"?>
-<w:endnotes xmlns:wpc="http://schemas.microsoft.com/office/word/2010/wordprocessingCanvas" xmlns:cx="http://schemas.microsoft.com/office/drawing/2014/chartex" xmlns:cx1="http://schemas.microsoft.com/office/drawing/2015/9/8/chartex" xmlns:mc="http://schemas.openxmlformats.org/markup-compatibility/2006" xmlns:o="urn:schemas-microsoft-com:office:office" xmlns:r="http://schemas.openxmlformats.org/officeDocument/2006/relationships" xmlns:m="http://schemas.openxmlformats.org/officeDocument/2006/math" xmlns:v="urn:schemas-microsoft-com:vml" xmlns:wp14="http://schemas.microsoft.com/office/word/2010/wordprocessingDrawing" xmlns:wp="http://schemas.openxmlformats.org/drawingml/2006/wordprocessingDrawing" xmlns:w10="urn:schemas-microsoft-com:office:word" xmlns:w="http://schemas.openxmlformats.org/wordprocessingml/2006/main" xmlns:w14="http://schemas.microsoft.com/office/word/2010/wordml" xmlns:w15="http://schemas.microsoft.com/office/word/2012/wordml" xmlns:w16se="http://schemas.microsoft.com/office/word/2015/wordml/symex" xmlns:wpg="http://schemas.microsoft.com/office/word/2010/wordprocessingGroup" xmlns:wpi="http://schemas.microsoft.com/office/word/2010/wordprocessingInk" xmlns:wne="http://schemas.microsoft.com/office/word/2006/wordml" xmlns:wps="http://schemas.microsoft.com/office/word/2010/wordprocessingShape" mc:Ignorable="w14 w15 w16se wp14">
+<w:endnotes xmlns:wpc="http://schemas.microsoft.com/office/word/2010/wordprocessingCanvas" xmlns:cx="http://schemas.microsoft.com/office/drawing/2014/chartex" xmlns:cx1="http://schemas.microsoft.com/office/drawing/2015/9/8/chartex" xmlns:cx2="http://schemas.microsoft.com/office/drawing/2015/10/21/chartex" xmlns:cx3="http://schemas.microsoft.com/office/drawing/2016/5/9/chartex" xmlns:cx4="http://schemas.microsoft.com/office/drawing/2016/5/10/chartex" xmlns:cx5="http://schemas.microsoft.com/office/drawing/2016/5/11/chartex" xmlns:cx6="http://schemas.microsoft.com/office/drawing/2016/5/12/chartex" xmlns:cx7="http://schemas.microsoft.com/office/drawing/2016/5/13/chartex" xmlns:cx8="http://schemas.microsoft.com/office/drawing/2016/5/14/chartex" xmlns:mc="http://schemas.openxmlformats.org/markup-compatibility/2006" xmlns:aink="http://schemas.microsoft.com/office/drawing/2016/ink" xmlns:am3d="http://schemas.microsoft.com/office/drawing/2017/model3d" xmlns:o="urn:schemas-microsoft-com:office:office" xmlns:r="http://schemas.openxmlformats.org/officeDocument/2006/relationships" xmlns:m="http://schemas.openxmlformats.org/officeDocument/2006/math" xmlns:v="urn:schemas-microsoft-com:vml" xmlns:wp14="http://schemas.microsoft.com/office/word/2010/wordprocessingDrawing" xmlns:wp="http://schemas.openxmlformats.org/drawingml/2006/wordprocessingDrawing" xmlns:w10="urn:schemas-microsoft-com:office:word" xmlns:w="http://schemas.openxmlformats.org/wordprocessingml/2006/main" xmlns:w14="http://schemas.microsoft.com/office/word/2010/wordml" xmlns:w15="http://schemas.microsoft.com/office/word/2012/wordml" xmlns:w16cex="http://schemas.microsoft.com/office/word/2018/wordml/cex" xmlns:w16cid="http://schemas.microsoft.com/office/word/2016/wordml/cid" xmlns:w16="http://schemas.microsoft.com/office/word/2018/wordml" xmlns:w16sdtdh="http://schemas.microsoft.com/office/word/2020/wordml/sdtdatahash" xmlns:w16se="http://schemas.microsoft.com/office/word/2015/wordml/symex" xmlns:wpg="http://schemas.microsoft.com/office/word/2010/wordprocessingGroup" xmlns:wpi="http://schemas.microsoft.com/office/word/2010/wordprocessingInk" xmlns:wne="http://schemas.microsoft.com/office/word/2006/wordml" xmlns:wps="http://schemas.microsoft.com/office/word/2010/wordprocessingShape" mc:Ignorable="w14 w15 w16se w16cid w16 w16cex w16sdtdh wp14">
   <w:endnote w:type="separator" w:id="-1">
     <w:p>
       <w:r>
@@ -19984,27 +19913,27 @@
 </file>
 
 <file path=word/footer1.xml><?xml version="1.0" encoding="utf-8"?>
-<w:ftr xmlns:wpc="http://schemas.microsoft.com/office/word/2010/wordprocessingCanvas" xmlns:cx="http://schemas.microsoft.com/office/drawing/2014/chartex" xmlns:cx1="http://schemas.microsoft.com/office/drawing/2015/9/8/chartex" xmlns:mc="http://schemas.openxmlformats.org/markup-compatibility/2006" xmlns:o="urn:schemas-microsoft-com:office:office" xmlns:r="http://schemas.openxmlformats.org/officeDocument/2006/relationships" xmlns:m="http://schemas.openxmlformats.org/officeDocument/2006/math" xmlns:v="urn:schemas-microsoft-com:vml" xmlns:wp14="http://schemas.microsoft.com/office/word/2010/wordprocessingDrawing" xmlns:wp="http://schemas.openxmlformats.org/drawingml/2006/wordprocessingDrawing" xmlns:w10="urn:schemas-microsoft-com:office:word" xmlns:w="http://schemas.openxmlformats.org/wordprocessingml/2006/main" xmlns:w14="http://schemas.microsoft.com/office/word/2010/wordml" xmlns:w15="http://schemas.microsoft.com/office/word/2012/wordml" xmlns:w16se="http://schemas.microsoft.com/office/word/2015/wordml/symex" xmlns:wpg="http://schemas.microsoft.com/office/word/2010/wordprocessingGroup" xmlns:wpi="http://schemas.microsoft.com/office/word/2010/wordprocessingInk" xmlns:wne="http://schemas.microsoft.com/office/word/2006/wordml" xmlns:wps="http://schemas.microsoft.com/office/word/2010/wordprocessingShape" mc:Ignorable="w14 w15 w16se wp14">
+<w:ftr xmlns:wpc="http://schemas.microsoft.com/office/word/2010/wordprocessingCanvas" xmlns:cx="http://schemas.microsoft.com/office/drawing/2014/chartex" xmlns:cx1="http://schemas.microsoft.com/office/drawing/2015/9/8/chartex" xmlns:cx2="http://schemas.microsoft.com/office/drawing/2015/10/21/chartex" xmlns:cx3="http://schemas.microsoft.com/office/drawing/2016/5/9/chartex" xmlns:cx4="http://schemas.microsoft.com/office/drawing/2016/5/10/chartex" xmlns:cx5="http://schemas.microsoft.com/office/drawing/2016/5/11/chartex" xmlns:cx6="http://schemas.microsoft.com/office/drawing/2016/5/12/chartex" xmlns:cx7="http://schemas.microsoft.com/office/drawing/2016/5/13/chartex" xmlns:cx8="http://schemas.microsoft.com/office/drawing/2016/5/14/chartex" xmlns:mc="http://schemas.openxmlformats.org/markup-compatibility/2006" xmlns:aink="http://schemas.microsoft.com/office/drawing/2016/ink" xmlns:am3d="http://schemas.microsoft.com/office/drawing/2017/model3d" xmlns:o="urn:schemas-microsoft-com:office:office" xmlns:r="http://schemas.openxmlformats.org/officeDocument/2006/relationships" xmlns:m="http://schemas.openxmlformats.org/officeDocument/2006/math" xmlns:v="urn:schemas-microsoft-com:vml" xmlns:wp14="http://schemas.microsoft.com/office/word/2010/wordprocessingDrawing" xmlns:wp="http://schemas.openxmlformats.org/drawingml/2006/wordprocessingDrawing" xmlns:w10="urn:schemas-microsoft-com:office:word" xmlns:w="http://schemas.openxmlformats.org/wordprocessingml/2006/main" xmlns:w14="http://schemas.microsoft.com/office/word/2010/wordml" xmlns:w15="http://schemas.microsoft.com/office/word/2012/wordml" xmlns:w16cex="http://schemas.microsoft.com/office/word/2018/wordml/cex" xmlns:w16cid="http://schemas.microsoft.com/office/word/2016/wordml/cid" xmlns:w16="http://schemas.microsoft.com/office/word/2018/wordml" xmlns:w16sdtdh="http://schemas.microsoft.com/office/word/2020/wordml/sdtdatahash" xmlns:w16se="http://schemas.microsoft.com/office/word/2015/wordml/symex" xmlns:wpg="http://schemas.microsoft.com/office/word/2010/wordprocessingGroup" xmlns:wpi="http://schemas.microsoft.com/office/word/2010/wordprocessingInk" xmlns:wne="http://schemas.microsoft.com/office/word/2006/wordml" xmlns:wps="http://schemas.microsoft.com/office/word/2010/wordprocessingShape" mc:Ignorable="w14 w15 w16se w16cid w16 w16cex w16sdtdh wp14">
   <w:p/>
   <w:p/>
 </w:ftr>
 </file>
 
 <file path=word/footer2.xml><?xml version="1.0" encoding="utf-8"?>
-<w:ftr xmlns:wpc="http://schemas.microsoft.com/office/word/2010/wordprocessingCanvas" xmlns:cx="http://schemas.microsoft.com/office/drawing/2014/chartex" xmlns:cx1="http://schemas.microsoft.com/office/drawing/2015/9/8/chartex" xmlns:mc="http://schemas.openxmlformats.org/markup-compatibility/2006" xmlns:o="urn:schemas-microsoft-com:office:office" xmlns:r="http://schemas.openxmlformats.org/officeDocument/2006/relationships" xmlns:m="http://schemas.openxmlformats.org/officeDocument/2006/math" xmlns:v="urn:schemas-microsoft-com:vml" xmlns:wp14="http://schemas.microsoft.com/office/word/2010/wordprocessingDrawing" xmlns:wp="http://schemas.openxmlformats.org/drawingml/2006/wordprocessingDrawing" xmlns:w10="urn:schemas-microsoft-com:office:word" xmlns:w="http://schemas.openxmlformats.org/wordprocessingml/2006/main" xmlns:w14="http://schemas.microsoft.com/office/word/2010/wordml" xmlns:w15="http://schemas.microsoft.com/office/word/2012/wordml" xmlns:w16se="http://schemas.microsoft.com/office/word/2015/wordml/symex" xmlns:wpg="http://schemas.microsoft.com/office/word/2010/wordprocessingGroup" xmlns:wpi="http://schemas.microsoft.com/office/word/2010/wordprocessingInk" xmlns:wne="http://schemas.microsoft.com/office/word/2006/wordml" xmlns:wps="http://schemas.microsoft.com/office/word/2010/wordprocessingShape" mc:Ignorable="w14 w15 w16se wp14">
+<w:ftr xmlns:wpc="http://schemas.microsoft.com/office/word/2010/wordprocessingCanvas" xmlns:cx="http://schemas.microsoft.com/office/drawing/2014/chartex" xmlns:cx1="http://schemas.microsoft.com/office/drawing/2015/9/8/chartex" xmlns:cx2="http://schemas.microsoft.com/office/drawing/2015/10/21/chartex" xmlns:cx3="http://schemas.microsoft.com/office/drawing/2016/5/9/chartex" xmlns:cx4="http://schemas.microsoft.com/office/drawing/2016/5/10/chartex" xmlns:cx5="http://schemas.microsoft.com/office/drawing/2016/5/11/chartex" xmlns:cx6="http://schemas.microsoft.com/office/drawing/2016/5/12/chartex" xmlns:cx7="http://schemas.microsoft.com/office/drawing/2016/5/13/chartex" xmlns:cx8="http://schemas.microsoft.com/office/drawing/2016/5/14/chartex" xmlns:mc="http://schemas.openxmlformats.org/markup-compatibility/2006" xmlns:aink="http://schemas.microsoft.com/office/drawing/2016/ink" xmlns:am3d="http://schemas.microsoft.com/office/drawing/2017/model3d" xmlns:o="urn:schemas-microsoft-com:office:office" xmlns:r="http://schemas.openxmlformats.org/officeDocument/2006/relationships" xmlns:m="http://schemas.openxmlformats.org/officeDocument/2006/math" xmlns:v="urn:schemas-microsoft-com:vml" xmlns:wp14="http://schemas.microsoft.com/office/word/2010/wordprocessingDrawing" xmlns:wp="http://schemas.openxmlformats.org/drawingml/2006/wordprocessingDrawing" xmlns:w10="urn:schemas-microsoft-com:office:word" xmlns:w="http://schemas.openxmlformats.org/wordprocessingml/2006/main" xmlns:w14="http://schemas.microsoft.com/office/word/2010/wordml" xmlns:w15="http://schemas.microsoft.com/office/word/2012/wordml" xmlns:w16cex="http://schemas.microsoft.com/office/word/2018/wordml/cex" xmlns:w16cid="http://schemas.microsoft.com/office/word/2016/wordml/cid" xmlns:w16="http://schemas.microsoft.com/office/word/2018/wordml" xmlns:w16sdtdh="http://schemas.microsoft.com/office/word/2020/wordml/sdtdatahash" xmlns:w16se="http://schemas.microsoft.com/office/word/2015/wordml/symex" xmlns:wpg="http://schemas.microsoft.com/office/word/2010/wordprocessingGroup" xmlns:wpi="http://schemas.microsoft.com/office/word/2010/wordprocessingInk" xmlns:wne="http://schemas.microsoft.com/office/word/2006/wordml" xmlns:wps="http://schemas.microsoft.com/office/word/2010/wordprocessingShape" mc:Ignorable="w14 w15 w16se w16cid w16 w16cex w16sdtdh wp14">
   <w:p/>
   <w:p/>
 </w:ftr>
 </file>
 
 <file path=word/footer3.xml><?xml version="1.0" encoding="utf-8"?>
-<w:ftr xmlns:wpc="http://schemas.microsoft.com/office/word/2010/wordprocessingCanvas" xmlns:cx="http://schemas.microsoft.com/office/drawing/2014/chartex" xmlns:cx1="http://schemas.microsoft.com/office/drawing/2015/9/8/chartex" xmlns:mc="http://schemas.openxmlformats.org/markup-compatibility/2006" xmlns:o="urn:schemas-microsoft-com:office:office" xmlns:r="http://schemas.openxmlformats.org/officeDocument/2006/relationships" xmlns:m="http://schemas.openxmlformats.org/officeDocument/2006/math" xmlns:v="urn:schemas-microsoft-com:vml" xmlns:wp14="http://schemas.microsoft.com/office/word/2010/wordprocessingDrawing" xmlns:wp="http://schemas.openxmlformats.org/drawingml/2006/wordprocessingDrawing" xmlns:w10="urn:schemas-microsoft-com:office:word" xmlns:w="http://schemas.openxmlformats.org/wordprocessingml/2006/main" xmlns:w14="http://schemas.microsoft.com/office/word/2010/wordml" xmlns:w15="http://schemas.microsoft.com/office/word/2012/wordml" xmlns:w16se="http://schemas.microsoft.com/office/word/2015/wordml/symex" xmlns:wpg="http://schemas.microsoft.com/office/word/2010/wordprocessingGroup" xmlns:wpi="http://schemas.microsoft.com/office/word/2010/wordprocessingInk" xmlns:wne="http://schemas.microsoft.com/office/word/2006/wordml" xmlns:wps="http://schemas.microsoft.com/office/word/2010/wordprocessingShape" mc:Ignorable="w14 w15 w16se wp14">
+<w:ftr xmlns:wpc="http://schemas.microsoft.com/office/word/2010/wordprocessingCanvas" xmlns:cx="http://schemas.microsoft.com/office/drawing/2014/chartex" xmlns:cx1="http://schemas.microsoft.com/office/drawing/2015/9/8/chartex" xmlns:cx2="http://schemas.microsoft.com/office/drawing/2015/10/21/chartex" xmlns:cx3="http://schemas.microsoft.com/office/drawing/2016/5/9/chartex" xmlns:cx4="http://schemas.microsoft.com/office/drawing/2016/5/10/chartex" xmlns:cx5="http://schemas.microsoft.com/office/drawing/2016/5/11/chartex" xmlns:cx6="http://schemas.microsoft.com/office/drawing/2016/5/12/chartex" xmlns:cx7="http://schemas.microsoft.com/office/drawing/2016/5/13/chartex" xmlns:cx8="http://schemas.microsoft.com/office/drawing/2016/5/14/chartex" xmlns:mc="http://schemas.openxmlformats.org/markup-compatibility/2006" xmlns:aink="http://schemas.microsoft.com/office/drawing/2016/ink" xmlns:am3d="http://schemas.microsoft.com/office/drawing/2017/model3d" xmlns:o="urn:schemas-microsoft-com:office:office" xmlns:r="http://schemas.openxmlformats.org/officeDocument/2006/relationships" xmlns:m="http://schemas.openxmlformats.org/officeDocument/2006/math" xmlns:v="urn:schemas-microsoft-com:vml" xmlns:wp14="http://schemas.microsoft.com/office/word/2010/wordprocessingDrawing" xmlns:wp="http://schemas.openxmlformats.org/drawingml/2006/wordprocessingDrawing" xmlns:w10="urn:schemas-microsoft-com:office:word" xmlns:w="http://schemas.openxmlformats.org/wordprocessingml/2006/main" xmlns:w14="http://schemas.microsoft.com/office/word/2010/wordml" xmlns:w15="http://schemas.microsoft.com/office/word/2012/wordml" xmlns:w16cex="http://schemas.microsoft.com/office/word/2018/wordml/cex" xmlns:w16cid="http://schemas.microsoft.com/office/word/2016/wordml/cid" xmlns:w16="http://schemas.microsoft.com/office/word/2018/wordml" xmlns:w16sdtdh="http://schemas.microsoft.com/office/word/2020/wordml/sdtdatahash" xmlns:w16se="http://schemas.microsoft.com/office/word/2015/wordml/symex" xmlns:wpg="http://schemas.microsoft.com/office/word/2010/wordprocessingGroup" xmlns:wpi="http://schemas.microsoft.com/office/word/2010/wordprocessingInk" xmlns:wne="http://schemas.microsoft.com/office/word/2006/wordml" xmlns:wps="http://schemas.microsoft.com/office/word/2010/wordprocessingShape" mc:Ignorable="w14 w15 w16se w16cid w16 w16cex w16sdtdh wp14">
   <w:p/>
 </w:ftr>
 </file>
 
 <file path=word/footnotes.xml><?xml version="1.0" encoding="utf-8"?>
-<w:footnotes xmlns:wpc="http://schemas.microsoft.com/office/word/2010/wordprocessingCanvas" xmlns:cx="http://schemas.microsoft.com/office/drawing/2014/chartex" xmlns:cx1="http://schemas.microsoft.com/office/drawing/2015/9/8/chartex" xmlns:mc="http://schemas.openxmlformats.org/markup-compatibility/2006" xmlns:o="urn:schemas-microsoft-com:office:office" xmlns:r="http://schemas.openxmlformats.org/officeDocument/2006/relationships" xmlns:m="http://schemas.openxmlformats.org/officeDocument/2006/math" xmlns:v="urn:schemas-microsoft-com:vml" xmlns:wp14="http://schemas.microsoft.com/office/word/2010/wordprocessingDrawing" xmlns:wp="http://schemas.openxmlformats.org/drawingml/2006/wordprocessingDrawing" xmlns:w10="urn:schemas-microsoft-com:office:word" xmlns:w="http://schemas.openxmlformats.org/wordprocessingml/2006/main" xmlns:w14="http://schemas.microsoft.com/office/word/2010/wordml" xmlns:w15="http://schemas.microsoft.com/office/word/2012/wordml" xmlns:w16se="http://schemas.microsoft.com/office/word/2015/wordml/symex" xmlns:wpg="http://schemas.microsoft.com/office/word/2010/wordprocessingGroup" xmlns:wpi="http://schemas.microsoft.com/office/word/2010/wordprocessingInk" xmlns:wne="http://schemas.microsoft.com/office/word/2006/wordml" xmlns:wps="http://schemas.microsoft.com/office/word/2010/wordprocessingShape" mc:Ignorable="w14 w15 w16se wp14">
+<w:footnotes xmlns:wpc="http://schemas.microsoft.com/office/word/2010/wordprocessingCanvas" xmlns:cx="http://schemas.microsoft.com/office/drawing/2014/chartex" xmlns:cx1="http://schemas.microsoft.com/office/drawing/2015/9/8/chartex" xmlns:cx2="http://schemas.microsoft.com/office/drawing/2015/10/21/chartex" xmlns:cx3="http://schemas.microsoft.com/office/drawing/2016/5/9/chartex" xmlns:cx4="http://schemas.microsoft.com/office/drawing/2016/5/10/chartex" xmlns:cx5="http://schemas.microsoft.com/office/drawing/2016/5/11/chartex" xmlns:cx6="http://schemas.microsoft.com/office/drawing/2016/5/12/chartex" xmlns:cx7="http://schemas.microsoft.com/office/drawing/2016/5/13/chartex" xmlns:cx8="http://schemas.microsoft.com/office/drawing/2016/5/14/chartex" xmlns:mc="http://schemas.openxmlformats.org/markup-compatibility/2006" xmlns:aink="http://schemas.microsoft.com/office/drawing/2016/ink" xmlns:am3d="http://schemas.microsoft.com/office/drawing/2017/model3d" xmlns:o="urn:schemas-microsoft-com:office:office" xmlns:r="http://schemas.openxmlformats.org/officeDocument/2006/relationships" xmlns:m="http://schemas.openxmlformats.org/officeDocument/2006/math" xmlns:v="urn:schemas-microsoft-com:vml" xmlns:wp14="http://schemas.microsoft.com/office/word/2010/wordprocessingDrawing" xmlns:wp="http://schemas.openxmlformats.org/drawingml/2006/wordprocessingDrawing" xmlns:w10="urn:schemas-microsoft-com:office:word" xmlns:w="http://schemas.openxmlformats.org/wordprocessingml/2006/main" xmlns:w14="http://schemas.microsoft.com/office/word/2010/wordml" xmlns:w15="http://schemas.microsoft.com/office/word/2012/wordml" xmlns:w16cex="http://schemas.microsoft.com/office/word/2018/wordml/cex" xmlns:w16cid="http://schemas.microsoft.com/office/word/2016/wordml/cid" xmlns:w16="http://schemas.microsoft.com/office/word/2018/wordml" xmlns:w16sdtdh="http://schemas.microsoft.com/office/word/2020/wordml/sdtdatahash" xmlns:w16se="http://schemas.microsoft.com/office/word/2015/wordml/symex" xmlns:wpg="http://schemas.microsoft.com/office/word/2010/wordprocessingGroup" xmlns:wpi="http://schemas.microsoft.com/office/word/2010/wordprocessingInk" xmlns:wne="http://schemas.microsoft.com/office/word/2006/wordml" xmlns:wps="http://schemas.microsoft.com/office/word/2010/wordprocessingShape" mc:Ignorable="w14 w15 w16se w16cid w16 w16cex w16sdtdh wp14">
   <w:footnote w:type="separator" w:id="-1">
     <w:p>
       <w:r>
@@ -20023,7 +19952,7 @@
 </file>
 
 <file path=word/numbering.xml><?xml version="1.0" encoding="utf-8"?>
-<w:numbering xmlns:wpc="http://schemas.microsoft.com/office/word/2010/wordprocessingCanvas" xmlns:cx="http://schemas.microsoft.com/office/drawing/2014/chartex" xmlns:cx1="http://schemas.microsoft.com/office/drawing/2015/9/8/chartex" xmlns:mc="http://schemas.openxmlformats.org/markup-compatibility/2006" xmlns:o="urn:schemas-microsoft-com:office:office" xmlns:r="http://schemas.openxmlformats.org/officeDocument/2006/relationships" xmlns:m="http://schemas.openxmlformats.org/officeDocument/2006/math" xmlns:v="urn:schemas-microsoft-com:vml" xmlns:wp14="http://schemas.microsoft.com/office/word/2010/wordprocessingDrawing" xmlns:wp="http://schemas.openxmlformats.org/drawingml/2006/wordprocessingDrawing" xmlns:w10="urn:schemas-microsoft-com:office:word" xmlns:w="http://schemas.openxmlformats.org/wordprocessingml/2006/main" xmlns:w14="http://schemas.microsoft.com/office/word/2010/wordml" xmlns:w15="http://schemas.microsoft.com/office/word/2012/wordml" xmlns:w16se="http://schemas.microsoft.com/office/word/2015/wordml/symex" xmlns:wpg="http://schemas.microsoft.com/office/word/2010/wordprocessingGroup" xmlns:wpi="http://schemas.microsoft.com/office/word/2010/wordprocessingInk" xmlns:wne="http://schemas.microsoft.com/office/word/2006/wordml" xmlns:wps="http://schemas.microsoft.com/office/word/2010/wordprocessingShape" mc:Ignorable="w14 w15 w16se wp14">
+<w:numbering xmlns:wpc="http://schemas.microsoft.com/office/word/2010/wordprocessingCanvas" xmlns:cx="http://schemas.microsoft.com/office/drawing/2014/chartex" xmlns:cx1="http://schemas.microsoft.com/office/drawing/2015/9/8/chartex" xmlns:cx2="http://schemas.microsoft.com/office/drawing/2015/10/21/chartex" xmlns:cx3="http://schemas.microsoft.com/office/drawing/2016/5/9/chartex" xmlns:cx4="http://schemas.microsoft.com/office/drawing/2016/5/10/chartex" xmlns:cx5="http://schemas.microsoft.com/office/drawing/2016/5/11/chartex" xmlns:cx6="http://schemas.microsoft.com/office/drawing/2016/5/12/chartex" xmlns:cx7="http://schemas.microsoft.com/office/drawing/2016/5/13/chartex" xmlns:cx8="http://schemas.microsoft.com/office/drawing/2016/5/14/chartex" xmlns:mc="http://schemas.openxmlformats.org/markup-compatibility/2006" xmlns:aink="http://schemas.microsoft.com/office/drawing/2016/ink" xmlns:am3d="http://schemas.microsoft.com/office/drawing/2017/model3d" xmlns:o="urn:schemas-microsoft-com:office:office" xmlns:r="http://schemas.openxmlformats.org/officeDocument/2006/relationships" xmlns:m="http://schemas.openxmlformats.org/officeDocument/2006/math" xmlns:v="urn:schemas-microsoft-com:vml" xmlns:wp14="http://schemas.microsoft.com/office/word/2010/wordprocessingDrawing" xmlns:wp="http://schemas.openxmlformats.org/drawingml/2006/wordprocessingDrawing" xmlns:w10="urn:schemas-microsoft-com:office:word" xmlns:w="http://schemas.openxmlformats.org/wordprocessingml/2006/main" xmlns:w14="http://schemas.microsoft.com/office/word/2010/wordml" xmlns:w15="http://schemas.microsoft.com/office/word/2012/wordml" xmlns:w16cex="http://schemas.microsoft.com/office/word/2018/wordml/cex" xmlns:w16cid="http://schemas.microsoft.com/office/word/2016/wordml/cid" xmlns:w16="http://schemas.microsoft.com/office/word/2018/wordml" xmlns:w16sdtdh="http://schemas.microsoft.com/office/word/2020/wordml/sdtdatahash" xmlns:w16se="http://schemas.microsoft.com/office/word/2015/wordml/symex" xmlns:wpg="http://schemas.microsoft.com/office/word/2010/wordprocessingGroup" xmlns:wpi="http://schemas.microsoft.com/office/word/2010/wordprocessingInk" xmlns:wne="http://schemas.microsoft.com/office/word/2006/wordml" xmlns:wps="http://schemas.microsoft.com/office/word/2010/wordprocessingShape" mc:Ignorable="w14 w15 w16se w16cid w16 w16cex w16sdtdh wp14">
   <w:abstractNum w:abstractNumId="0" w15:restartNumberingAfterBreak="0">
     <w:nsid w:val="08782360"/>
     <w:multiLevelType w:val="hybridMultilevel"/>
@@ -22828,7 +22757,7 @@
 </file>
 
 <file path=word/styles.xml><?xml version="1.0" encoding="utf-8"?>
-<w:styles xmlns:mc="http://schemas.openxmlformats.org/markup-compatibility/2006" xmlns:r="http://schemas.openxmlformats.org/officeDocument/2006/relationships" xmlns:w="http://schemas.openxmlformats.org/wordprocessingml/2006/main" xmlns:w14="http://schemas.microsoft.com/office/word/2010/wordml" xmlns:w15="http://schemas.microsoft.com/office/word/2012/wordml" xmlns:w16se="http://schemas.microsoft.com/office/word/2015/wordml/symex" mc:Ignorable="w14 w15 w16se">
+<w:styles xmlns:mc="http://schemas.openxmlformats.org/markup-compatibility/2006" xmlns:r="http://schemas.openxmlformats.org/officeDocument/2006/relationships" xmlns:w="http://schemas.openxmlformats.org/wordprocessingml/2006/main" xmlns:w14="http://schemas.microsoft.com/office/word/2010/wordml" xmlns:w15="http://schemas.microsoft.com/office/word/2012/wordml" xmlns:w16cex="http://schemas.microsoft.com/office/word/2018/wordml/cex" xmlns:w16cid="http://schemas.microsoft.com/office/word/2016/wordml/cid" xmlns:w16="http://schemas.microsoft.com/office/word/2018/wordml" xmlns:w16sdtdh="http://schemas.microsoft.com/office/word/2020/wordml/sdtdatahash" xmlns:w16se="http://schemas.microsoft.com/office/word/2015/wordml/symex" mc:Ignorable="w14 w15 w16se w16cid w16 w16cex w16sdtdh">
   <w:docDefaults>
     <w:rPrDefault>
       <w:rPr>
@@ -22845,7 +22774,7 @@
       </w:pPr>
     </w:pPrDefault>
   </w:docDefaults>
-  <w:latentStyles w:defLockedState="0" w:defUIPriority="99" w:defSemiHidden="0" w:defUnhideWhenUsed="0" w:defQFormat="0" w:count="371">
+  <w:latentStyles w:defLockedState="0" w:defUIPriority="99" w:defSemiHidden="0" w:defUnhideWhenUsed="0" w:defQFormat="0" w:count="376">
     <w:lsdException w:name="Normal" w:uiPriority="0" w:qFormat="1"/>
     <w:lsdException w:name="heading 1" w:uiPriority="9" w:qFormat="1"/>
     <w:lsdException w:name="heading 2" w:semiHidden="1" w:uiPriority="9" w:unhideWhenUsed="1" w:qFormat="1"/>
@@ -22951,7 +22880,6 @@
     <w:lsdException w:name="HTML Sample" w:semiHidden="1" w:unhideWhenUsed="1"/>
     <w:lsdException w:name="HTML Typewriter" w:semiHidden="1" w:unhideWhenUsed="1"/>
     <w:lsdException w:name="HTML Variable" w:semiHidden="1" w:unhideWhenUsed="1"/>
-    <w:lsdException w:name="Normal Table" w:semiHidden="1" w:unhideWhenUsed="1"/>
     <w:lsdException w:name="annotation subject" w:semiHidden="1" w:unhideWhenUsed="1"/>
     <w:lsdException w:name="No List" w:semiHidden="1" w:unhideWhenUsed="1"/>
     <w:lsdException w:name="Outline List 1" w:semiHidden="1" w:unhideWhenUsed="1"/>
@@ -22994,11 +22922,8 @@
     <w:lsdException w:name="Table Contemporary" w:semiHidden="1" w:unhideWhenUsed="1"/>
     <w:lsdException w:name="Table Elegant" w:semiHidden="1" w:unhideWhenUsed="1"/>
     <w:lsdException w:name="Table Professional" w:semiHidden="1" w:unhideWhenUsed="1"/>
-    <w:lsdException w:name="Table Subtle 1" w:semiHidden="1" w:unhideWhenUsed="1"/>
     <w:lsdException w:name="Table Subtle 2" w:semiHidden="1" w:unhideWhenUsed="1"/>
     <w:lsdException w:name="Table Web 1" w:semiHidden="1" w:unhideWhenUsed="1"/>
-    <w:lsdException w:name="Table Web 2" w:semiHidden="1" w:unhideWhenUsed="1"/>
-    <w:lsdException w:name="Table Web 3" w:semiHidden="1" w:unhideWhenUsed="1"/>
     <w:lsdException w:name="Balloon Text" w:semiHidden="1" w:unhideWhenUsed="1"/>
     <w:lsdException w:name="Table Grid" w:uiPriority="39"/>
     <w:lsdException w:name="Table Theme" w:semiHidden="1" w:unhideWhenUsed="1"/>
@@ -23217,6 +23142,11 @@
     <w:lsdException w:name="List Table 5 Dark Accent 6" w:uiPriority="50"/>
     <w:lsdException w:name="List Table 6 Colorful Accent 6" w:uiPriority="51"/>
     <w:lsdException w:name="List Table 7 Colorful Accent 6" w:uiPriority="52"/>
+    <w:lsdException w:name="Mention" w:semiHidden="1" w:unhideWhenUsed="1"/>
+    <w:lsdException w:name="Smart Hyperlink" w:semiHidden="1" w:unhideWhenUsed="1"/>
+    <w:lsdException w:name="Hashtag" w:semiHidden="1" w:unhideWhenUsed="1"/>
+    <w:lsdException w:name="Unresolved Mention" w:semiHidden="1" w:unhideWhenUsed="1"/>
+    <w:lsdException w:name="Smart Link" w:semiHidden="1" w:unhideWhenUsed="1"/>
   </w:latentStyles>
   <w:style w:type="paragraph" w:default="1" w:styleId="Normal">
     <w:name w:val="Normal"/>
@@ -23641,8 +23571,8 @@
       <w:u w:val="single"/>
     </w:rPr>
   </w:style>
-  <w:style w:type="character" w:customStyle="1" w:styleId="UnresolvedMention">
-    <w:name w:val="Unresolved Mention"/>
+  <w:style w:type="character" w:customStyle="1" w:styleId="MenoPendente1">
+    <w:name w:val="Menção Pendente1"/>
     <w:basedOn w:val="Fontepargpadro"/>
     <w:uiPriority w:val="99"/>
     <w:semiHidden/>

</xml_diff>